<commit_message>
modularized code a bit
</commit_message>
<xml_diff>
--- a/Source_Code/Reports/Sample499/FindingsReportTest.docx
+++ b/Source_Code/Reports/Sample499/FindingsReportTest.docx
@@ -5613,6 +5613,1117 @@
         <w:t>Automated Testing ACtivity</w:t>
       </w:r>
       <w:bookmarkEnd w:id="10"/>
+    </w:p>
+    <w:p>
+      <w:pPr>
+        <w:pStyle w:val="ActivityBullet"/>
+      </w:pPr>
+      <w:r>
+        <w:rPr>
+          <w:sz w:val="17"/>
+        </w:rPr>
+        <w:t>2026-01-29 13:52:47-0500PM ET exposurescout Initiating ExposureScout module.</w:t>
+      </w:r>
+    </w:p>
+    <w:p>
+      <w:pPr>
+        <w:pStyle w:val="ActivityBullet"/>
+      </w:pPr>
+      <w:r>
+        <w:rPr>
+          <w:sz w:val="17"/>
+        </w:rPr>
+        <w:t>2026-01-29 13:52:59-0500PM ET exposurescout Enumerating subdomains from one (1) domain.</w:t>
+      </w:r>
+    </w:p>
+    <w:p>
+      <w:pPr>
+        <w:pStyle w:val="ActivityBullet"/>
+      </w:pPr>
+      <w:r>
+        <w:rPr>
+          <w:sz w:val="17"/>
+        </w:rPr>
+        <w:t>2026-01-29 13:54:13-0500PM ET exposurescout Completed subdomain enumeration.</w:t>
+      </w:r>
+    </w:p>
+    <w:p>
+      <w:pPr>
+        <w:pStyle w:val="ActivityBullet"/>
+      </w:pPr>
+      <w:r>
+        <w:rPr>
+          <w:sz w:val="17"/>
+        </w:rPr>
+        <w:t>2026-01-29 13:54:13-0500PM ET exposurescout Beginning DNS enumeration.</w:t>
+      </w:r>
+    </w:p>
+    <w:p>
+      <w:pPr>
+        <w:pStyle w:val="ActivityBullet"/>
+      </w:pPr>
+      <w:r>
+        <w:rPr>
+          <w:sz w:val="17"/>
+        </w:rPr>
+        <w:t>2026-01-29 13:55:18-0500PM ET exposurescout Completed DNS enumeration.</w:t>
+      </w:r>
+    </w:p>
+    <w:p>
+      <w:pPr>
+        <w:pStyle w:val="ActivityBullet"/>
+      </w:pPr>
+      <w:r>
+        <w:rPr>
+          <w:sz w:val="17"/>
+        </w:rPr>
+        <w:t>2026-01-29 13:55:18-0500PM ET exposurescout Enumerating doppelganger domains for one (1) domain.</w:t>
+      </w:r>
+    </w:p>
+    <w:p>
+      <w:pPr>
+        <w:pStyle w:val="ActivityBullet"/>
+      </w:pPr>
+      <w:r>
+        <w:rPr>
+          <w:sz w:val="17"/>
+        </w:rPr>
+        <w:t>2026-01-29 13:56:28-0500PM ET exposurescout Ten (10) new doppelganger domains discovered.</w:t>
+      </w:r>
+    </w:p>
+    <w:p>
+      <w:pPr>
+        <w:pStyle w:val="ActivityBullet"/>
+      </w:pPr>
+      <w:r>
+        <w:rPr>
+          <w:sz w:val="17"/>
+        </w:rPr>
+        <w:t>2026-01-29 13:56:28-0500PM ET exposurescout Completed doppelganger domain enumeration.</w:t>
+      </w:r>
+    </w:p>
+    <w:p>
+      <w:pPr>
+        <w:pStyle w:val="ActivityBullet"/>
+      </w:pPr>
+      <w:r>
+        <w:rPr>
+          <w:sz w:val="17"/>
+        </w:rPr>
+        <w:t>2026-01-29 13:56:28-0500PM ET exposurescout Running WHOIS commands on eight (8) domains.</w:t>
+      </w:r>
+    </w:p>
+    <w:p>
+      <w:pPr>
+        <w:pStyle w:val="ActivityBullet"/>
+      </w:pPr>
+      <w:r>
+        <w:rPr>
+          <w:sz w:val="17"/>
+        </w:rPr>
+        <w:t>2026-01-29 13:57:33-0500PM ET exposurescout Importing eight (8) WHOIS results into the database.</w:t>
+      </w:r>
+    </w:p>
+    <w:p>
+      <w:pPr>
+        <w:pStyle w:val="ActivityBullet"/>
+      </w:pPr>
+      <w:r>
+        <w:rPr>
+          <w:sz w:val="17"/>
+        </w:rPr>
+        <w:t>2026-01-29 13:57:34-0500PM ET exposurescout Completed recursive WHOIS lookups</w:t>
+      </w:r>
+    </w:p>
+    <w:p>
+      <w:pPr>
+        <w:pStyle w:val="ActivityBullet"/>
+      </w:pPr>
+      <w:r>
+        <w:rPr>
+          <w:sz w:val="17"/>
+        </w:rPr>
+        <w:t>2026-01-29 13:57:34-0500PM ET exposurescout Email scraping module started.</w:t>
+      </w:r>
+    </w:p>
+    <w:p>
+      <w:pPr>
+        <w:pStyle w:val="ActivityBullet"/>
+      </w:pPr>
+      <w:r>
+        <w:rPr>
+          <w:sz w:val="17"/>
+        </w:rPr>
+        <w:t>2026-01-29 13:58:40-0500PM ET exposurescout Completed email scraping.</w:t>
+      </w:r>
+    </w:p>
+    <w:p>
+      <w:pPr>
+        <w:pStyle w:val="ActivityBullet"/>
+      </w:pPr>
+      <w:r>
+        <w:rPr>
+          <w:sz w:val="17"/>
+        </w:rPr>
+        <w:t>2026-01-29 13:58:40-0500PM ET exposurescout Scanning subdomains for subdomain takeover vulnerability.</w:t>
+      </w:r>
+    </w:p>
+    <w:p>
+      <w:pPr>
+        <w:pStyle w:val="ActivityBullet"/>
+      </w:pPr>
+      <w:r>
+        <w:rPr>
+          <w:sz w:val="17"/>
+        </w:rPr>
+        <w:t>2026-01-29 13:59:44-0500PM ET exposurescout Found 1 domain vulnerable to subdomain takeover.</w:t>
+      </w:r>
+    </w:p>
+    <w:p>
+      <w:pPr>
+        <w:pStyle w:val="ActivityBullet"/>
+      </w:pPr>
+      <w:r>
+        <w:rPr>
+          <w:sz w:val="17"/>
+        </w:rPr>
+        <w:t>2026-01-29 13:59:44-0500PM ET exposurescout Completed subdomain takeover checks.</w:t>
+      </w:r>
+    </w:p>
+    <w:p>
+      <w:pPr>
+        <w:pStyle w:val="ActivityBullet"/>
+      </w:pPr>
+      <w:r>
+        <w:rPr>
+          <w:sz w:val="17"/>
+        </w:rPr>
+        <w:t>2026-01-29 13:59:44-0500PM ET exposurescout ExposureScout module completed.</w:t>
+      </w:r>
+    </w:p>
+    <w:p>
+      <w:pPr>
+        <w:pStyle w:val="ActivityBullet"/>
+      </w:pPr>
+      <w:r>
+        <w:rPr>
+          <w:sz w:val="17"/>
+        </w:rPr>
+        <w:t>2026-01-29 13:59:44-0500PM ET host discovery Performing DNS resolution for 1 DNS name.</w:t>
+      </w:r>
+    </w:p>
+    <w:p>
+      <w:pPr>
+        <w:pStyle w:val="ActivityBullet"/>
+      </w:pPr>
+      <w:r>
+        <w:rPr>
+          <w:sz w:val="17"/>
+        </w:rPr>
+        <w:t>2026-01-29 14:00:50-0500PM ET host discovery DNS resolution complete.</w:t>
+      </w:r>
+    </w:p>
+    <w:p>
+      <w:pPr>
+        <w:pStyle w:val="ActivityBullet"/>
+      </w:pPr>
+      <w:r>
+        <w:rPr>
+          <w:sz w:val="17"/>
+        </w:rPr>
+        <w:t>2026-01-29 14:00:50-0500PM ET host discovery Port scan module initialized.</w:t>
+      </w:r>
+    </w:p>
+    <w:p>
+      <w:pPr>
+        <w:pStyle w:val="ActivityBullet"/>
+      </w:pPr>
+      <w:r>
+        <w:rPr>
+          <w:sz w:val="17"/>
+        </w:rPr>
+        <w:t>2026-01-29 14:00:53-0500PM ET host discovery Conducting port scan against in-scope systems.</w:t>
+      </w:r>
+    </w:p>
+    <w:p>
+      <w:pPr>
+        <w:pStyle w:val="ActivityBullet"/>
+      </w:pPr>
+      <w:r>
+        <w:rPr>
+          <w:sz w:val="17"/>
+        </w:rPr>
+        <w:t>2026-01-29 14:00:57-0500PM ET host discovery Running nmap port scans.</w:t>
+      </w:r>
+    </w:p>
+    <w:p>
+      <w:pPr>
+        <w:pStyle w:val="ActivityBullet"/>
+      </w:pPr>
+      <w:r>
+        <w:rPr>
+          <w:sz w:val="17"/>
+        </w:rPr>
+        <w:t>2026-01-29 14:02:01-0500PM ET host discovery Completed nmap port scans.</w:t>
+      </w:r>
+    </w:p>
+    <w:p>
+      <w:pPr>
+        <w:pStyle w:val="ActivityBullet"/>
+      </w:pPr>
+      <w:r>
+        <w:rPr>
+          <w:sz w:val="17"/>
+        </w:rPr>
+        <w:t>2026-01-29 14:02:01-0500PM ET host discovery Port scans completed successfully.</w:t>
+      </w:r>
+    </w:p>
+    <w:p>
+      <w:pPr>
+        <w:pStyle w:val="ActivityBullet"/>
+      </w:pPr>
+      <w:r>
+        <w:rPr>
+          <w:sz w:val="17"/>
+        </w:rPr>
+        <w:t>2026-01-29 14:02:02-0500PM ET host discovery Parsing results for alive systems.</w:t>
+      </w:r>
+    </w:p>
+    <w:p>
+      <w:pPr>
+        <w:pStyle w:val="ActivityBullet"/>
+      </w:pPr>
+      <w:r>
+        <w:rPr>
+          <w:sz w:val="17"/>
+        </w:rPr>
+        <w:t>2026-01-29 14:02:02-0500PM ET host discovery Completed parsing Nmap results. 1 new IP addresses discovered and imported into DB.</w:t>
+      </w:r>
+    </w:p>
+    <w:p>
+      <w:pPr>
+        <w:pStyle w:val="ActivityBullet"/>
+      </w:pPr>
+      <w:r>
+        <w:rPr>
+          <w:sz w:val="17"/>
+        </w:rPr>
+        <w:t>2026-01-29 14:02:02-0500PM ET host discovery Parsing nmap port scans.</w:t>
+      </w:r>
+    </w:p>
+    <w:p>
+      <w:pPr>
+        <w:pStyle w:val="ActivityBullet"/>
+      </w:pPr>
+      <w:r>
+        <w:rPr>
+          <w:sz w:val="17"/>
+        </w:rPr>
+        <w:t>2026-01-29 14:02:02-0500PM ET host discovery Completed parsing port scans. Imported 3 new ports.</w:t>
+      </w:r>
+    </w:p>
+    <w:p>
+      <w:pPr>
+        <w:pStyle w:val="ActivityBullet"/>
+      </w:pPr>
+      <w:r>
+        <w:rPr>
+          <w:sz w:val="17"/>
+        </w:rPr>
+        <w:t>2026-01-29 14:02:02-0500PM ET host discovery Port scan module completed.</w:t>
+      </w:r>
+    </w:p>
+    <w:p>
+      <w:pPr>
+        <w:pStyle w:val="ActivityBullet"/>
+      </w:pPr>
+      <w:r>
+        <w:rPr>
+          <w:sz w:val="17"/>
+        </w:rPr>
+        <w:t>2026-01-29 14:02:03-0500PM ET host discovery Discovery module completed.</w:t>
+      </w:r>
+    </w:p>
+    <w:p>
+      <w:pPr>
+        <w:pStyle w:val="ActivityBullet"/>
+      </w:pPr>
+      <w:r>
+        <w:rPr>
+          <w:sz w:val="17"/>
+        </w:rPr>
+        <w:t>2026-01-29 14:02:27-0500PM ET host discovery Running nmap port version scans.</w:t>
+      </w:r>
+    </w:p>
+    <w:p>
+      <w:pPr>
+        <w:pStyle w:val="ActivityBullet"/>
+      </w:pPr>
+      <w:r>
+        <w:rPr>
+          <w:sz w:val="17"/>
+        </w:rPr>
+        <w:t>2026-01-29 14:03:30-0500PM ET host discovery Completed nmap port version scans.</w:t>
+      </w:r>
+    </w:p>
+    <w:p>
+      <w:pPr>
+        <w:pStyle w:val="ActivityBullet"/>
+      </w:pPr>
+      <w:r>
+        <w:rPr>
+          <w:sz w:val="17"/>
+        </w:rPr>
+        <w:t>2026-01-29 14:03:35-0500PM ET enumeration Enumeration module initialized.</w:t>
+      </w:r>
+    </w:p>
+    <w:p>
+      <w:pPr>
+        <w:pStyle w:val="ActivityBullet"/>
+      </w:pPr>
+      <w:r>
+        <w:rPr>
+          <w:sz w:val="17"/>
+        </w:rPr>
+        <w:t>2026-01-29 14:04:43-0500PM ET enumeration Enumerating HTTP services.</w:t>
+      </w:r>
+    </w:p>
+    <w:p>
+      <w:pPr>
+        <w:pStyle w:val="ActivityBullet"/>
+      </w:pPr>
+      <w:r>
+        <w:rPr>
+          <w:sz w:val="17"/>
+        </w:rPr>
+        <w:t>2026-01-29 14:04:43-0500PM ET enumeration Enumerating HTTPS services.</w:t>
+      </w:r>
+    </w:p>
+    <w:p>
+      <w:pPr>
+        <w:pStyle w:val="ActivityBullet"/>
+      </w:pPr>
+      <w:r>
+        <w:rPr>
+          <w:sz w:val="17"/>
+        </w:rPr>
+        <w:t>2026-01-29 14:04:43-0500PM ET enumeration Enumerating SSH services.</w:t>
+      </w:r>
+    </w:p>
+    <w:p>
+      <w:pPr>
+        <w:pStyle w:val="ActivityBullet"/>
+      </w:pPr>
+      <w:r>
+        <w:rPr>
+          <w:sz w:val="17"/>
+        </w:rPr>
+        <w:t>2026-01-29 14:04:47-0500PM ET enumeration Running nmap script scan using script: http-headers.</w:t>
+      </w:r>
+    </w:p>
+    <w:p>
+      <w:pPr>
+        <w:pStyle w:val="ActivityBullet"/>
+      </w:pPr>
+      <w:r>
+        <w:rPr>
+          <w:sz w:val="17"/>
+        </w:rPr>
+        <w:t>2026-01-29 14:04:47-0500PM ET enumeration Running nmap script scan using script: http-methods.</w:t>
+      </w:r>
+    </w:p>
+    <w:p>
+      <w:pPr>
+        <w:pStyle w:val="ActivityBullet"/>
+      </w:pPr>
+      <w:r>
+        <w:rPr>
+          <w:sz w:val="17"/>
+        </w:rPr>
+        <w:t>2026-01-29 14:04:47-0500PM ET enumeration Running nmap script scan using script: http-headers.</w:t>
+      </w:r>
+    </w:p>
+    <w:p>
+      <w:pPr>
+        <w:pStyle w:val="ActivityBullet"/>
+      </w:pPr>
+      <w:r>
+        <w:rPr>
+          <w:sz w:val="17"/>
+        </w:rPr>
+        <w:t>2026-01-29 14:04:47-0500PM ET enumeration Running nmap script scan using script: http-robots.txt.</w:t>
+      </w:r>
+    </w:p>
+    <w:p>
+      <w:pPr>
+        <w:pStyle w:val="ActivityBullet"/>
+      </w:pPr>
+      <w:r>
+        <w:rPr>
+          <w:sz w:val="17"/>
+        </w:rPr>
+        <w:t>2026-01-29 14:04:47-0500PM ET enumeration Running nmap script scan using script: http-robots.txt.</w:t>
+      </w:r>
+    </w:p>
+    <w:p>
+      <w:pPr>
+        <w:pStyle w:val="ActivityBullet"/>
+      </w:pPr>
+      <w:r>
+        <w:rPr>
+          <w:sz w:val="17"/>
+        </w:rPr>
+        <w:t>2026-01-29 14:04:47-0500PM ET enumeration Running nmap script scan using script: http-put.</w:t>
+      </w:r>
+    </w:p>
+    <w:p>
+      <w:pPr>
+        <w:pStyle w:val="ActivityBullet"/>
+      </w:pPr>
+      <w:r>
+        <w:rPr>
+          <w:sz w:val="17"/>
+        </w:rPr>
+        <w:t>2026-01-29 14:04:47-0500PM ET enumeration Running nmap script scan using script: http-title.</w:t>
+      </w:r>
+    </w:p>
+    <w:p>
+      <w:pPr>
+        <w:pStyle w:val="ActivityBullet"/>
+      </w:pPr>
+      <w:r>
+        <w:rPr>
+          <w:sz w:val="17"/>
+        </w:rPr>
+        <w:t>2026-01-29 14:04:47-0500PM ET enumeration Running nmap script scan using script: http-shellshock.</w:t>
+      </w:r>
+    </w:p>
+    <w:p>
+      <w:pPr>
+        <w:pStyle w:val="ActivityBullet"/>
+      </w:pPr>
+      <w:r>
+        <w:rPr>
+          <w:sz w:val="17"/>
+        </w:rPr>
+        <w:t>2026-01-29 14:04:47-0500PM ET enumeration Running nmap script scan using script: http-methods.</w:t>
+      </w:r>
+    </w:p>
+    <w:p>
+      <w:pPr>
+        <w:pStyle w:val="ActivityBullet"/>
+      </w:pPr>
+      <w:r>
+        <w:rPr>
+          <w:sz w:val="17"/>
+        </w:rPr>
+        <w:t>2026-01-29 14:04:47-0500PM ET enumeration Running nmap script scan using script: sslv2.</w:t>
+      </w:r>
+    </w:p>
+    <w:p>
+      <w:pPr>
+        <w:pStyle w:val="ActivityBullet"/>
+      </w:pPr>
+      <w:r>
+        <w:rPr>
+          <w:sz w:val="17"/>
+        </w:rPr>
+        <w:t>2026-01-29 14:04:47-0500PM ET enumeration Running nmap script scan using script: ssl-cert.</w:t>
+      </w:r>
+    </w:p>
+    <w:p>
+      <w:pPr>
+        <w:pStyle w:val="ActivityBullet"/>
+      </w:pPr>
+      <w:r>
+        <w:rPr>
+          <w:sz w:val="17"/>
+        </w:rPr>
+        <w:t>2026-01-29 14:04:47-0500PM ET enumeration Running nmap script scan using script: ssl-enum-ciphers.</w:t>
+      </w:r>
+    </w:p>
+    <w:p>
+      <w:pPr>
+        <w:pStyle w:val="ActivityBullet"/>
+      </w:pPr>
+      <w:r>
+        <w:rPr>
+          <w:sz w:val="17"/>
+        </w:rPr>
+        <w:t>2026-01-29 14:04:47-0500PM ET enumeration Running nmap script scan using script: http-shellshock.</w:t>
+      </w:r>
+    </w:p>
+    <w:p>
+      <w:pPr>
+        <w:pStyle w:val="ActivityBullet"/>
+      </w:pPr>
+      <w:r>
+        <w:rPr>
+          <w:sz w:val="17"/>
+        </w:rPr>
+        <w:t>2026-01-29 14:04:47-0500PM ET enumeration Running nmap script scan using script: ssl-poodle.</w:t>
+      </w:r>
+    </w:p>
+    <w:p>
+      <w:pPr>
+        <w:pStyle w:val="ActivityBullet"/>
+      </w:pPr>
+      <w:r>
+        <w:rPr>
+          <w:sz w:val="17"/>
+        </w:rPr>
+        <w:t>2026-01-29 14:04:47-0500PM ET enumeration Running nmap script scan using script: http-put.</w:t>
+      </w:r>
+    </w:p>
+    <w:p>
+      <w:pPr>
+        <w:pStyle w:val="ActivityBullet"/>
+      </w:pPr>
+      <w:r>
+        <w:rPr>
+          <w:sz w:val="17"/>
+        </w:rPr>
+        <w:t>2026-01-29 14:04:47-0500PM ET enumeration Running nmap script scan using script: ssl-heartbleed.</w:t>
+      </w:r>
+    </w:p>
+    <w:p>
+      <w:pPr>
+        <w:pStyle w:val="ActivityBullet"/>
+      </w:pPr>
+      <w:r>
+        <w:rPr>
+          <w:sz w:val="17"/>
+        </w:rPr>
+        <w:t>2026-01-29 14:04:47-0500PM ET enumeration Running nmap script scan using script: http-title.</w:t>
+      </w:r>
+    </w:p>
+    <w:p>
+      <w:pPr>
+        <w:pStyle w:val="ActivityBullet"/>
+      </w:pPr>
+      <w:r>
+        <w:rPr>
+          <w:sz w:val="17"/>
+        </w:rPr>
+        <w:t>2026-01-29 14:04:47-0500PM ET enumeration Running nmap script scan using script: ssl-date.</w:t>
+      </w:r>
+    </w:p>
+    <w:p>
+      <w:pPr>
+        <w:pStyle w:val="ActivityBullet"/>
+      </w:pPr>
+      <w:r>
+        <w:rPr>
+          <w:sz w:val="17"/>
+        </w:rPr>
+        <w:t>2026-01-29 14:04:47-0500PM ET enumeration Queuing up MSF module: auxiliary/scanner/ssh/ssh_version.</w:t>
+      </w:r>
+    </w:p>
+    <w:p>
+      <w:pPr>
+        <w:pStyle w:val="ActivityBullet"/>
+      </w:pPr>
+      <w:r>
+        <w:rPr>
+          <w:sz w:val="17"/>
+        </w:rPr>
+        <w:t>2026-01-29 14:05:50-0500PM ET enumeration Completed MSF module: auxiliary/scanner/ssh/ssh_version.</w:t>
+      </w:r>
+    </w:p>
+    <w:p>
+      <w:pPr>
+        <w:pStyle w:val="ActivityBullet"/>
+      </w:pPr>
+      <w:r>
+        <w:rPr>
+          <w:sz w:val="17"/>
+        </w:rPr>
+        <w:t>2026-01-29 14:05:50-0500PM ET enumeration Completed nmap script scan using script: http-methods.</w:t>
+      </w:r>
+    </w:p>
+    <w:p>
+      <w:pPr>
+        <w:pStyle w:val="ActivityBullet"/>
+      </w:pPr>
+      <w:r>
+        <w:rPr>
+          <w:sz w:val="17"/>
+        </w:rPr>
+        <w:t>2026-01-29 14:05:50-0500PM ET enumeration Completed nmap script scan using script: ssl-enum-ciphers.</w:t>
+      </w:r>
+    </w:p>
+    <w:p>
+      <w:pPr>
+        <w:pStyle w:val="ActivityBullet"/>
+      </w:pPr>
+      <w:r>
+        <w:rPr>
+          <w:sz w:val="17"/>
+        </w:rPr>
+        <w:t>2026-01-29 14:05:50-0500PM ET enumeration Completed nmap script scan using script: http-put.</w:t>
+      </w:r>
+    </w:p>
+    <w:p>
+      <w:pPr>
+        <w:pStyle w:val="ActivityBullet"/>
+      </w:pPr>
+      <w:r>
+        <w:rPr>
+          <w:sz w:val="17"/>
+        </w:rPr>
+        <w:t>2026-01-29 14:05:50-0500PM ET enumeration Completed nmap script scan using script: http-robots.txt.</w:t>
+      </w:r>
+    </w:p>
+    <w:p>
+      <w:pPr>
+        <w:pStyle w:val="ActivityBullet"/>
+      </w:pPr>
+      <w:r>
+        <w:rPr>
+          <w:sz w:val="17"/>
+        </w:rPr>
+        <w:t>2026-01-29 14:05:50-0500PM ET enumeration Completed nmap script scan using script: ssl-heartbleed.</w:t>
+      </w:r>
+    </w:p>
+    <w:p>
+      <w:pPr>
+        <w:pStyle w:val="ActivityBullet"/>
+      </w:pPr>
+      <w:r>
+        <w:rPr>
+          <w:sz w:val="17"/>
+        </w:rPr>
+        <w:t>2026-01-29 14:05:50-0500PM ET enumeration Completed nmap script scan using script: http-shellshock.</w:t>
+      </w:r>
+    </w:p>
+    <w:p>
+      <w:pPr>
+        <w:pStyle w:val="ActivityBullet"/>
+      </w:pPr>
+      <w:r>
+        <w:rPr>
+          <w:sz w:val="17"/>
+        </w:rPr>
+        <w:t>2026-01-29 14:05:50-0500PM ET enumeration Completed nmap script scan using script: http-robots.txt.</w:t>
+      </w:r>
+    </w:p>
+    <w:p>
+      <w:pPr>
+        <w:pStyle w:val="ActivityBullet"/>
+      </w:pPr>
+      <w:r>
+        <w:rPr>
+          <w:sz w:val="17"/>
+        </w:rPr>
+        <w:t>2026-01-29 14:05:51-0500PM ET enumeration Completed nmap script scan using script: http-put.</w:t>
+      </w:r>
+    </w:p>
+    <w:p>
+      <w:pPr>
+        <w:pStyle w:val="ActivityBullet"/>
+      </w:pPr>
+      <w:r>
+        <w:rPr>
+          <w:sz w:val="17"/>
+        </w:rPr>
+        <w:t>2026-01-29 14:05:51-0500PM ET enumeration Completed nmap script scan using script: http-headers.</w:t>
+      </w:r>
+    </w:p>
+    <w:p>
+      <w:pPr>
+        <w:pStyle w:val="ActivityBullet"/>
+      </w:pPr>
+      <w:r>
+        <w:rPr>
+          <w:sz w:val="17"/>
+        </w:rPr>
+        <w:t>2026-01-29 14:05:51-0500PM ET enumeration Completed nmap script scan using script: http-methods.</w:t>
+      </w:r>
+    </w:p>
+    <w:p>
+      <w:pPr>
+        <w:pStyle w:val="ActivityBullet"/>
+      </w:pPr>
+      <w:r>
+        <w:rPr>
+          <w:sz w:val="17"/>
+        </w:rPr>
+        <w:t>2026-01-29 14:05:51-0500PM ET enumeration Completed nmap script scan using script: ssl-date.</w:t>
+      </w:r>
+    </w:p>
+    <w:p>
+      <w:pPr>
+        <w:pStyle w:val="ActivityBullet"/>
+      </w:pPr>
+      <w:r>
+        <w:rPr>
+          <w:sz w:val="17"/>
+        </w:rPr>
+        <w:t>2026-01-29 14:05:51-0500PM ET enumeration Completed nmap script scan using script: http-title.</w:t>
+      </w:r>
+    </w:p>
+    <w:p>
+      <w:pPr>
+        <w:pStyle w:val="ActivityBullet"/>
+      </w:pPr>
+      <w:r>
+        <w:rPr>
+          <w:sz w:val="17"/>
+        </w:rPr>
+        <w:t>2026-01-29 14:05:51-0500PM ET enumeration Completed nmap script scan using script: http-shellshock.</w:t>
+      </w:r>
+    </w:p>
+    <w:p>
+      <w:pPr>
+        <w:pStyle w:val="ActivityBullet"/>
+      </w:pPr>
+      <w:r>
+        <w:rPr>
+          <w:sz w:val="17"/>
+        </w:rPr>
+        <w:t>2026-01-29 14:05:51-0500PM ET enumeration Completed nmap script scan using script: http-headers.</w:t>
+      </w:r>
+    </w:p>
+    <w:p>
+      <w:pPr>
+        <w:pStyle w:val="ActivityBullet"/>
+      </w:pPr>
+      <w:r>
+        <w:rPr>
+          <w:sz w:val="17"/>
+        </w:rPr>
+        <w:t>2026-01-29 14:05:51-0500PM ET enumeration Completed nmap script scan using script: ssl-poodle.</w:t>
+      </w:r>
+    </w:p>
+    <w:p>
+      <w:pPr>
+        <w:pStyle w:val="ActivityBullet"/>
+      </w:pPr>
+      <w:r>
+        <w:rPr>
+          <w:sz w:val="17"/>
+        </w:rPr>
+        <w:t>2026-01-29 14:05:51-0500PM ET enumeration Completed nmap script scan using script: ssl-cert.</w:t>
+      </w:r>
+    </w:p>
+    <w:p>
+      <w:pPr>
+        <w:pStyle w:val="ActivityBullet"/>
+      </w:pPr>
+      <w:r>
+        <w:rPr>
+          <w:sz w:val="17"/>
+        </w:rPr>
+        <w:t>2026-01-29 14:05:51-0500PM ET enumeration Completed nmap script scan using script: sslv2.</w:t>
+      </w:r>
+    </w:p>
+    <w:p>
+      <w:pPr>
+        <w:pStyle w:val="ActivityBullet"/>
+      </w:pPr>
+      <w:r>
+        <w:rPr>
+          <w:sz w:val="17"/>
+        </w:rPr>
+        <w:t>2026-01-29 14:05:51-0500PM ET enumeration Completed nmap script scan using script: http-title.</w:t>
+      </w:r>
+    </w:p>
+    <w:p>
+      <w:pPr>
+        <w:pStyle w:val="ActivityBullet"/>
+      </w:pPr>
+      <w:r>
+        <w:rPr>
+          <w:sz w:val="17"/>
+        </w:rPr>
+        <w:t>2026-01-29 14:05:51-0500PM ET enumeration Peforming a hidden directory enumeration attack on 80/tcp.</w:t>
+      </w:r>
+    </w:p>
+    <w:p>
+      <w:pPr>
+        <w:pStyle w:val="ActivityBullet"/>
+      </w:pPr>
+      <w:r>
+        <w:rPr>
+          <w:sz w:val="17"/>
+        </w:rPr>
+        <w:t>2026-01-29 14:05:54-0500PM ET enumeration Running nmap script scan using script: sshv1.</w:t>
+      </w:r>
+    </w:p>
+    <w:p>
+      <w:pPr>
+        <w:pStyle w:val="ActivityBullet"/>
+      </w:pPr>
+      <w:r>
+        <w:rPr>
+          <w:sz w:val="17"/>
+        </w:rPr>
+        <w:t>2026-01-29 14:05:54-0500PM ET enumeration Running nmap script scan using script: ssh2-enum-algos.</w:t>
+      </w:r>
+    </w:p>
+    <w:p>
+      <w:pPr>
+        <w:pStyle w:val="ActivityBullet"/>
+      </w:pPr>
+      <w:r>
+        <w:rPr>
+          <w:sz w:val="17"/>
+        </w:rPr>
+        <w:t>2026-01-29 14:05:54-0500PM ET enumeration Running nmap script scan using script: ssh-auth-methods.</w:t>
+      </w:r>
+    </w:p>
+    <w:p>
+      <w:pPr>
+        <w:pStyle w:val="ActivityBullet"/>
+      </w:pPr>
+      <w:r>
+        <w:rPr>
+          <w:sz w:val="17"/>
+        </w:rPr>
+        <w:t>2026-01-29 14:05:54-0500PM ET enumeration Analyzing SSL/TLS protocols on port 443/tcp.</w:t>
+      </w:r>
+    </w:p>
+    <w:p>
+      <w:pPr>
+        <w:pStyle w:val="ActivityBullet"/>
+      </w:pPr>
+      <w:r>
+        <w:rPr>
+          <w:sz w:val="17"/>
+        </w:rPr>
+        <w:t>2026-01-29 14:06:55-0500PM ET enumeration Completed SSL/TLS analysis on ports 443/tcp.</w:t>
+      </w:r>
+    </w:p>
+    <w:p>
+      <w:pPr>
+        <w:pStyle w:val="ActivityBullet"/>
+      </w:pPr>
+      <w:r>
+        <w:rPr>
+          <w:sz w:val="17"/>
+        </w:rPr>
+        <w:t>2026-01-29 14:06:55-0500PM ET enumeration Completed hidden directory enumeration scan.</w:t>
+      </w:r>
+    </w:p>
+    <w:p>
+      <w:pPr>
+        <w:pStyle w:val="ActivityBullet"/>
+      </w:pPr>
+      <w:r>
+        <w:rPr>
+          <w:sz w:val="17"/>
+        </w:rPr>
+        <w:t>2026-01-29 14:06:55-0500PM ET enumeration Peforming a hidden directory enumeration attack on 443/tcp.</w:t>
+      </w:r>
+    </w:p>
+    <w:p>
+      <w:pPr>
+        <w:pStyle w:val="ActivityBullet"/>
+      </w:pPr>
+      <w:r>
+        <w:rPr>
+          <w:sz w:val="17"/>
+        </w:rPr>
+        <w:t>2026-01-29 14:06:55-0500PM ET enumeration Completed nmap script scan using script: ssh2-enum-algos.</w:t>
+      </w:r>
+    </w:p>
+    <w:p>
+      <w:pPr>
+        <w:pStyle w:val="ActivityBullet"/>
+      </w:pPr>
+      <w:r>
+        <w:rPr>
+          <w:sz w:val="17"/>
+        </w:rPr>
+        <w:t>2026-01-29 14:06:55-0500PM ET enumeration Completed nmap script scan using script: ssh-auth-methods.</w:t>
+      </w:r>
+    </w:p>
+    <w:p>
+      <w:pPr>
+        <w:pStyle w:val="ActivityBullet"/>
+      </w:pPr>
+      <w:r>
+        <w:rPr>
+          <w:sz w:val="17"/>
+        </w:rPr>
+        <w:t>2026-01-29 14:06:55-0500PM ET enumeration Completed nmap script scan using script: sshv1.</w:t>
+      </w:r>
+    </w:p>
+    <w:p>
+      <w:pPr>
+        <w:pStyle w:val="ActivityBullet"/>
+      </w:pPr>
+      <w:r>
+        <w:rPr>
+          <w:sz w:val="17"/>
+        </w:rPr>
+        <w:t>2026-01-29 14:06:55-0500PM ET enumeration Completed enumerating SSH services.</w:t>
+      </w:r>
+    </w:p>
+    <w:p>
+      <w:pPr>
+        <w:pStyle w:val="ActivityBullet"/>
+      </w:pPr>
+      <w:r>
+        <w:rPr>
+          <w:sz w:val="17"/>
+        </w:rPr>
+        <w:t>2026-01-29 14:06:58-0500PM ET enumeration Analyzing web services running on port 80/tcp.</w:t>
+      </w:r>
+    </w:p>
+    <w:p>
+      <w:pPr>
+        <w:pStyle w:val="ActivityBullet"/>
+      </w:pPr>
+      <w:r>
+        <w:rPr>
+          <w:sz w:val="17"/>
+        </w:rPr>
+        <w:t>2026-01-29 14:08:10-0500PM ET enumeration Completed analyzing web services running on port 80/tcp.</w:t>
+      </w:r>
+    </w:p>
+    <w:p>
+      <w:pPr>
+        <w:pStyle w:val="ActivityBullet"/>
+      </w:pPr>
+      <w:r>
+        <w:rPr>
+          <w:sz w:val="17"/>
+        </w:rPr>
+        <w:t>2026-01-29 14:08:10-0500PM ET enumeration Completed hidden directory enumeration scan.</w:t>
+      </w:r>
+    </w:p>
+    <w:p>
+      <w:pPr>
+        <w:pStyle w:val="ActivityBullet"/>
+      </w:pPr>
+      <w:r>
+        <w:rPr>
+          <w:sz w:val="17"/>
+        </w:rPr>
+        <w:t>2026-01-29 14:08:10-0500PM ET enumeration Completed analyzing web services running on port 80/tcp.</w:t>
+      </w:r>
+    </w:p>
+    <w:p>
+      <w:pPr>
+        <w:pStyle w:val="ActivityBullet"/>
+      </w:pPr>
+      <w:r>
+        <w:rPr>
+          <w:sz w:val="17"/>
+        </w:rPr>
+        <w:t>2026-01-29 14:08:10-0500PM ET enumeration Completed enumerating HTTP services.</w:t>
+      </w:r>
+    </w:p>
+    <w:p>
+      <w:pPr>
+        <w:pStyle w:val="ActivityBullet"/>
+      </w:pPr>
+      <w:r>
+        <w:rPr>
+          <w:sz w:val="17"/>
+        </w:rPr>
+        <w:t>2026-01-29 14:08:13-0500PM ET enumeration Analyzing web services running on port 443/tcp.</w:t>
+      </w:r>
+    </w:p>
+    <w:p>
+      <w:pPr>
+        <w:pStyle w:val="ActivityBullet"/>
+      </w:pPr>
+      <w:r>
+        <w:rPr>
+          <w:sz w:val="17"/>
+        </w:rPr>
+        <w:t>2026-01-29 14:09:15-0500PM ET enumeration Completed analyzing web services running on port 443/tcp.</w:t>
+      </w:r>
+    </w:p>
+    <w:p>
+      <w:pPr>
+        <w:pStyle w:val="ActivityBullet"/>
+      </w:pPr>
+      <w:r>
+        <w:rPr>
+          <w:sz w:val="17"/>
+        </w:rPr>
+        <w:t>2026-01-29 14:09:15-0500PM ET enumeration Completed analyzing web services running on port 443/tcp.</w:t>
+      </w:r>
+    </w:p>
+    <w:p>
+      <w:pPr>
+        <w:pStyle w:val="ActivityBullet"/>
+      </w:pPr>
+      <w:r>
+        <w:rPr>
+          <w:sz w:val="17"/>
+        </w:rPr>
+        <w:t>2026-01-29 14:09:16-0500PM ET enumeration Completed enumerating HTTPS services.</w:t>
+      </w:r>
+    </w:p>
+    <w:p>
+      <w:pPr>
+        <w:pStyle w:val="ActivityBullet"/>
+      </w:pPr>
+      <w:r>
+        <w:rPr>
+          <w:sz w:val="17"/>
+        </w:rPr>
+        <w:t>2026-01-29 14:09:45-0500PM ET enumeration Enumeration module completed.</w:t>
+      </w:r>
+    </w:p>
+    <w:p>
+      <w:pPr>
+        <w:pStyle w:val="ActivityBullet"/>
+      </w:pPr>
+      <w:r>
+        <w:rPr>
+          <w:sz w:val="17"/>
+        </w:rPr>
+        <w:t>2026-01-29 14:10:06-0500PM ET exploit Launching exploit module.</w:t>
+      </w:r>
+    </w:p>
+    <w:p>
+      <w:pPr>
+        <w:pStyle w:val="ActivityBullet"/>
+      </w:pPr>
+      <w:r>
+        <w:rPr>
+          <w:sz w:val="17"/>
+        </w:rPr>
+        <w:t>2026-01-29 14:10:11-0500PM ET exploit Queuing up hydra attack: SSH password attack.</w:t>
+      </w:r>
+    </w:p>
+    <w:p>
+      <w:pPr>
+        <w:pStyle w:val="ActivityBullet"/>
+      </w:pPr>
+      <w:r>
+        <w:rPr>
+          <w:sz w:val="17"/>
+        </w:rPr>
+        <w:t>2026-01-29 14:11:16-0500PM ET exploit Completed hydra attack: SSH password attack.</w:t>
+      </w:r>
+    </w:p>
+    <w:p>
+      <w:pPr>
+        <w:pStyle w:val="ActivityBullet"/>
+      </w:pPr>
+      <w:r>
+        <w:rPr>
+          <w:sz w:val="17"/>
+        </w:rPr>
+        <w:t>2026-01-29 14:11:16-0500PM ET exploit Completed SSH password attack.</w:t>
+      </w:r>
+    </w:p>
+    <w:p>
+      <w:pPr>
+        <w:pStyle w:val="ActivityBullet"/>
+      </w:pPr>
+      <w:r>
+        <w:rPr>
+          <w:sz w:val="17"/>
+        </w:rPr>
+        <w:t>2026-01-29 14:11:49-0500PM ET exploit Completed exploit module.</w:t>
+      </w:r>
     </w:p>
     <w:p>
       <w:pPr>

</xml_diff>

<commit_message>
fixed read pdf error
</commit_message>
<xml_diff>
--- a/Source_Code/Reports/Sample499/FindingsReportTest.docx
+++ b/Source_Code/Reports/Sample499/FindingsReportTest.docx
@@ -5613,6 +5613,1117 @@
         <w:t>Automated Testing ACtivity</w:t>
       </w:r>
       <w:bookmarkEnd w:id="10"/>
+    </w:p>
+    <w:p>
+      <w:pPr>
+        <w:pStyle w:val="ActivityBullet"/>
+      </w:pPr>
+      <w:r>
+        <w:rPr>
+          <w:sz w:val="17"/>
+        </w:rPr>
+        <w:t>2026-01-29 13:52:47-0500PM ET exposurescout Initiating ExposureScout module.</w:t>
+      </w:r>
+    </w:p>
+    <w:p>
+      <w:pPr>
+        <w:pStyle w:val="ActivityBullet"/>
+      </w:pPr>
+      <w:r>
+        <w:rPr>
+          <w:sz w:val="17"/>
+        </w:rPr>
+        <w:t>2026-01-29 13:52:59-0500PM ET exposurescout Enumerating subdomains from one (1) domain.</w:t>
+      </w:r>
+    </w:p>
+    <w:p>
+      <w:pPr>
+        <w:pStyle w:val="ActivityBullet"/>
+      </w:pPr>
+      <w:r>
+        <w:rPr>
+          <w:sz w:val="17"/>
+        </w:rPr>
+        <w:t>2026-01-29 13:54:13-0500PM ET exposurescout Completed subdomain enumeration.</w:t>
+      </w:r>
+    </w:p>
+    <w:p>
+      <w:pPr>
+        <w:pStyle w:val="ActivityBullet"/>
+      </w:pPr>
+      <w:r>
+        <w:rPr>
+          <w:sz w:val="17"/>
+        </w:rPr>
+        <w:t>2026-01-29 13:54:13-0500PM ET exposurescout Beginning DNS enumeration.</w:t>
+      </w:r>
+    </w:p>
+    <w:p>
+      <w:pPr>
+        <w:pStyle w:val="ActivityBullet"/>
+      </w:pPr>
+      <w:r>
+        <w:rPr>
+          <w:sz w:val="17"/>
+        </w:rPr>
+        <w:t>2026-01-29 13:55:18-0500PM ET exposurescout Completed DNS enumeration.</w:t>
+      </w:r>
+    </w:p>
+    <w:p>
+      <w:pPr>
+        <w:pStyle w:val="ActivityBullet"/>
+      </w:pPr>
+      <w:r>
+        <w:rPr>
+          <w:sz w:val="17"/>
+        </w:rPr>
+        <w:t>2026-01-29 13:55:18-0500PM ET exposurescout Enumerating doppelganger domains for one (1) domain.</w:t>
+      </w:r>
+    </w:p>
+    <w:p>
+      <w:pPr>
+        <w:pStyle w:val="ActivityBullet"/>
+      </w:pPr>
+      <w:r>
+        <w:rPr>
+          <w:sz w:val="17"/>
+        </w:rPr>
+        <w:t>2026-01-29 13:56:28-0500PM ET exposurescout Ten (10) new doppelganger domains discovered.</w:t>
+      </w:r>
+    </w:p>
+    <w:p>
+      <w:pPr>
+        <w:pStyle w:val="ActivityBullet"/>
+      </w:pPr>
+      <w:r>
+        <w:rPr>
+          <w:sz w:val="17"/>
+        </w:rPr>
+        <w:t>2026-01-29 13:56:28-0500PM ET exposurescout Completed doppelganger domain enumeration.</w:t>
+      </w:r>
+    </w:p>
+    <w:p>
+      <w:pPr>
+        <w:pStyle w:val="ActivityBullet"/>
+      </w:pPr>
+      <w:r>
+        <w:rPr>
+          <w:sz w:val="17"/>
+        </w:rPr>
+        <w:t>2026-01-29 13:56:28-0500PM ET exposurescout Running WHOIS commands on eight (8) domains.</w:t>
+      </w:r>
+    </w:p>
+    <w:p>
+      <w:pPr>
+        <w:pStyle w:val="ActivityBullet"/>
+      </w:pPr>
+      <w:r>
+        <w:rPr>
+          <w:sz w:val="17"/>
+        </w:rPr>
+        <w:t>2026-01-29 13:57:33-0500PM ET exposurescout Importing eight (8) WHOIS results into the database.</w:t>
+      </w:r>
+    </w:p>
+    <w:p>
+      <w:pPr>
+        <w:pStyle w:val="ActivityBullet"/>
+      </w:pPr>
+      <w:r>
+        <w:rPr>
+          <w:sz w:val="17"/>
+        </w:rPr>
+        <w:t>2026-01-29 13:57:34-0500PM ET exposurescout Completed recursive WHOIS lookups</w:t>
+      </w:r>
+    </w:p>
+    <w:p>
+      <w:pPr>
+        <w:pStyle w:val="ActivityBullet"/>
+      </w:pPr>
+      <w:r>
+        <w:rPr>
+          <w:sz w:val="17"/>
+        </w:rPr>
+        <w:t>2026-01-29 13:57:34-0500PM ET exposurescout Email scraping module started.</w:t>
+      </w:r>
+    </w:p>
+    <w:p>
+      <w:pPr>
+        <w:pStyle w:val="ActivityBullet"/>
+      </w:pPr>
+      <w:r>
+        <w:rPr>
+          <w:sz w:val="17"/>
+        </w:rPr>
+        <w:t>2026-01-29 13:58:40-0500PM ET exposurescout Completed email scraping.</w:t>
+      </w:r>
+    </w:p>
+    <w:p>
+      <w:pPr>
+        <w:pStyle w:val="ActivityBullet"/>
+      </w:pPr>
+      <w:r>
+        <w:rPr>
+          <w:sz w:val="17"/>
+        </w:rPr>
+        <w:t>2026-01-29 13:58:40-0500PM ET exposurescout Scanning subdomains for subdomain takeover vulnerability.</w:t>
+      </w:r>
+    </w:p>
+    <w:p>
+      <w:pPr>
+        <w:pStyle w:val="ActivityBullet"/>
+      </w:pPr>
+      <w:r>
+        <w:rPr>
+          <w:sz w:val="17"/>
+        </w:rPr>
+        <w:t>2026-01-29 13:59:44-0500PM ET exposurescout Found 1 domain vulnerable to subdomain takeover.</w:t>
+      </w:r>
+    </w:p>
+    <w:p>
+      <w:pPr>
+        <w:pStyle w:val="ActivityBullet"/>
+      </w:pPr>
+      <w:r>
+        <w:rPr>
+          <w:sz w:val="17"/>
+        </w:rPr>
+        <w:t>2026-01-29 13:59:44-0500PM ET exposurescout Completed subdomain takeover checks.</w:t>
+      </w:r>
+    </w:p>
+    <w:p>
+      <w:pPr>
+        <w:pStyle w:val="ActivityBullet"/>
+      </w:pPr>
+      <w:r>
+        <w:rPr>
+          <w:sz w:val="17"/>
+        </w:rPr>
+        <w:t>2026-01-29 13:59:44-0500PM ET exposurescout ExposureScout module completed.</w:t>
+      </w:r>
+    </w:p>
+    <w:p>
+      <w:pPr>
+        <w:pStyle w:val="ActivityBullet"/>
+      </w:pPr>
+      <w:r>
+        <w:rPr>
+          <w:sz w:val="17"/>
+        </w:rPr>
+        <w:t>2026-01-29 13:59:44-0500PM ET host discovery Performing DNS resolution for 1 DNS name.</w:t>
+      </w:r>
+    </w:p>
+    <w:p>
+      <w:pPr>
+        <w:pStyle w:val="ActivityBullet"/>
+      </w:pPr>
+      <w:r>
+        <w:rPr>
+          <w:sz w:val="17"/>
+        </w:rPr>
+        <w:t>2026-01-29 14:00:50-0500PM ET host discovery DNS resolution complete.</w:t>
+      </w:r>
+    </w:p>
+    <w:p>
+      <w:pPr>
+        <w:pStyle w:val="ActivityBullet"/>
+      </w:pPr>
+      <w:r>
+        <w:rPr>
+          <w:sz w:val="17"/>
+        </w:rPr>
+        <w:t>2026-01-29 14:00:50-0500PM ET host discovery Port scan module initialized.</w:t>
+      </w:r>
+    </w:p>
+    <w:p>
+      <w:pPr>
+        <w:pStyle w:val="ActivityBullet"/>
+      </w:pPr>
+      <w:r>
+        <w:rPr>
+          <w:sz w:val="17"/>
+        </w:rPr>
+        <w:t>2026-01-29 14:00:53-0500PM ET host discovery Conducting port scan against in-scope systems.</w:t>
+      </w:r>
+    </w:p>
+    <w:p>
+      <w:pPr>
+        <w:pStyle w:val="ActivityBullet"/>
+      </w:pPr>
+      <w:r>
+        <w:rPr>
+          <w:sz w:val="17"/>
+        </w:rPr>
+        <w:t>2026-01-29 14:00:57-0500PM ET host discovery Running nmap port scans.</w:t>
+      </w:r>
+    </w:p>
+    <w:p>
+      <w:pPr>
+        <w:pStyle w:val="ActivityBullet"/>
+      </w:pPr>
+      <w:r>
+        <w:rPr>
+          <w:sz w:val="17"/>
+        </w:rPr>
+        <w:t>2026-01-29 14:02:01-0500PM ET host discovery Completed nmap port scans.</w:t>
+      </w:r>
+    </w:p>
+    <w:p>
+      <w:pPr>
+        <w:pStyle w:val="ActivityBullet"/>
+      </w:pPr>
+      <w:r>
+        <w:rPr>
+          <w:sz w:val="17"/>
+        </w:rPr>
+        <w:t>2026-01-29 14:02:01-0500PM ET host discovery Port scans completed successfully.</w:t>
+      </w:r>
+    </w:p>
+    <w:p>
+      <w:pPr>
+        <w:pStyle w:val="ActivityBullet"/>
+      </w:pPr>
+      <w:r>
+        <w:rPr>
+          <w:sz w:val="17"/>
+        </w:rPr>
+        <w:t>2026-01-29 14:02:02-0500PM ET host discovery Parsing results for alive systems.</w:t>
+      </w:r>
+    </w:p>
+    <w:p>
+      <w:pPr>
+        <w:pStyle w:val="ActivityBullet"/>
+      </w:pPr>
+      <w:r>
+        <w:rPr>
+          <w:sz w:val="17"/>
+        </w:rPr>
+        <w:t>2026-01-29 14:02:02-0500PM ET host discovery Completed parsing Nmap results. 1 new IP addresses discovered and imported into DB.</w:t>
+      </w:r>
+    </w:p>
+    <w:p>
+      <w:pPr>
+        <w:pStyle w:val="ActivityBullet"/>
+      </w:pPr>
+      <w:r>
+        <w:rPr>
+          <w:sz w:val="17"/>
+        </w:rPr>
+        <w:t>2026-01-29 14:02:02-0500PM ET host discovery Parsing nmap port scans.</w:t>
+      </w:r>
+    </w:p>
+    <w:p>
+      <w:pPr>
+        <w:pStyle w:val="ActivityBullet"/>
+      </w:pPr>
+      <w:r>
+        <w:rPr>
+          <w:sz w:val="17"/>
+        </w:rPr>
+        <w:t>2026-01-29 14:02:02-0500PM ET host discovery Completed parsing port scans. Imported 3 new ports.</w:t>
+      </w:r>
+    </w:p>
+    <w:p>
+      <w:pPr>
+        <w:pStyle w:val="ActivityBullet"/>
+      </w:pPr>
+      <w:r>
+        <w:rPr>
+          <w:sz w:val="17"/>
+        </w:rPr>
+        <w:t>2026-01-29 14:02:02-0500PM ET host discovery Port scan module completed.</w:t>
+      </w:r>
+    </w:p>
+    <w:p>
+      <w:pPr>
+        <w:pStyle w:val="ActivityBullet"/>
+      </w:pPr>
+      <w:r>
+        <w:rPr>
+          <w:sz w:val="17"/>
+        </w:rPr>
+        <w:t>2026-01-29 14:02:03-0500PM ET host discovery Discovery module completed.</w:t>
+      </w:r>
+    </w:p>
+    <w:p>
+      <w:pPr>
+        <w:pStyle w:val="ActivityBullet"/>
+      </w:pPr>
+      <w:r>
+        <w:rPr>
+          <w:sz w:val="17"/>
+        </w:rPr>
+        <w:t>2026-01-29 14:02:27-0500PM ET host discovery Running nmap port version scans.</w:t>
+      </w:r>
+    </w:p>
+    <w:p>
+      <w:pPr>
+        <w:pStyle w:val="ActivityBullet"/>
+      </w:pPr>
+      <w:r>
+        <w:rPr>
+          <w:sz w:val="17"/>
+        </w:rPr>
+        <w:t>2026-01-29 14:03:30-0500PM ET host discovery Completed nmap port version scans.</w:t>
+      </w:r>
+    </w:p>
+    <w:p>
+      <w:pPr>
+        <w:pStyle w:val="ActivityBullet"/>
+      </w:pPr>
+      <w:r>
+        <w:rPr>
+          <w:sz w:val="17"/>
+        </w:rPr>
+        <w:t>2026-01-29 14:03:35-0500PM ET enumeration Enumeration module initialized.</w:t>
+      </w:r>
+    </w:p>
+    <w:p>
+      <w:pPr>
+        <w:pStyle w:val="ActivityBullet"/>
+      </w:pPr>
+      <w:r>
+        <w:rPr>
+          <w:sz w:val="17"/>
+        </w:rPr>
+        <w:t>2026-01-29 14:04:43-0500PM ET enumeration Enumerating HTTP services.</w:t>
+      </w:r>
+    </w:p>
+    <w:p>
+      <w:pPr>
+        <w:pStyle w:val="ActivityBullet"/>
+      </w:pPr>
+      <w:r>
+        <w:rPr>
+          <w:sz w:val="17"/>
+        </w:rPr>
+        <w:t>2026-01-29 14:04:43-0500PM ET enumeration Enumerating HTTPS services.</w:t>
+      </w:r>
+    </w:p>
+    <w:p>
+      <w:pPr>
+        <w:pStyle w:val="ActivityBullet"/>
+      </w:pPr>
+      <w:r>
+        <w:rPr>
+          <w:sz w:val="17"/>
+        </w:rPr>
+        <w:t>2026-01-29 14:04:43-0500PM ET enumeration Enumerating SSH services.</w:t>
+      </w:r>
+    </w:p>
+    <w:p>
+      <w:pPr>
+        <w:pStyle w:val="ActivityBullet"/>
+      </w:pPr>
+      <w:r>
+        <w:rPr>
+          <w:sz w:val="17"/>
+        </w:rPr>
+        <w:t>2026-01-29 14:04:47-0500PM ET enumeration Running nmap script scan using script: http-headers.</w:t>
+      </w:r>
+    </w:p>
+    <w:p>
+      <w:pPr>
+        <w:pStyle w:val="ActivityBullet"/>
+      </w:pPr>
+      <w:r>
+        <w:rPr>
+          <w:sz w:val="17"/>
+        </w:rPr>
+        <w:t>2026-01-29 14:04:47-0500PM ET enumeration Running nmap script scan using script: http-methods.</w:t>
+      </w:r>
+    </w:p>
+    <w:p>
+      <w:pPr>
+        <w:pStyle w:val="ActivityBullet"/>
+      </w:pPr>
+      <w:r>
+        <w:rPr>
+          <w:sz w:val="17"/>
+        </w:rPr>
+        <w:t>2026-01-29 14:04:47-0500PM ET enumeration Running nmap script scan using script: http-headers.</w:t>
+      </w:r>
+    </w:p>
+    <w:p>
+      <w:pPr>
+        <w:pStyle w:val="ActivityBullet"/>
+      </w:pPr>
+      <w:r>
+        <w:rPr>
+          <w:sz w:val="17"/>
+        </w:rPr>
+        <w:t>2026-01-29 14:04:47-0500PM ET enumeration Running nmap script scan using script: http-robots.txt.</w:t>
+      </w:r>
+    </w:p>
+    <w:p>
+      <w:pPr>
+        <w:pStyle w:val="ActivityBullet"/>
+      </w:pPr>
+      <w:r>
+        <w:rPr>
+          <w:sz w:val="17"/>
+        </w:rPr>
+        <w:t>2026-01-29 14:04:47-0500PM ET enumeration Running nmap script scan using script: http-robots.txt.</w:t>
+      </w:r>
+    </w:p>
+    <w:p>
+      <w:pPr>
+        <w:pStyle w:val="ActivityBullet"/>
+      </w:pPr>
+      <w:r>
+        <w:rPr>
+          <w:sz w:val="17"/>
+        </w:rPr>
+        <w:t>2026-01-29 14:04:47-0500PM ET enumeration Running nmap script scan using script: http-put.</w:t>
+      </w:r>
+    </w:p>
+    <w:p>
+      <w:pPr>
+        <w:pStyle w:val="ActivityBullet"/>
+      </w:pPr>
+      <w:r>
+        <w:rPr>
+          <w:sz w:val="17"/>
+        </w:rPr>
+        <w:t>2026-01-29 14:04:47-0500PM ET enumeration Running nmap script scan using script: http-title.</w:t>
+      </w:r>
+    </w:p>
+    <w:p>
+      <w:pPr>
+        <w:pStyle w:val="ActivityBullet"/>
+      </w:pPr>
+      <w:r>
+        <w:rPr>
+          <w:sz w:val="17"/>
+        </w:rPr>
+        <w:t>2026-01-29 14:04:47-0500PM ET enumeration Running nmap script scan using script: http-shellshock.</w:t>
+      </w:r>
+    </w:p>
+    <w:p>
+      <w:pPr>
+        <w:pStyle w:val="ActivityBullet"/>
+      </w:pPr>
+      <w:r>
+        <w:rPr>
+          <w:sz w:val="17"/>
+        </w:rPr>
+        <w:t>2026-01-29 14:04:47-0500PM ET enumeration Running nmap script scan using script: http-methods.</w:t>
+      </w:r>
+    </w:p>
+    <w:p>
+      <w:pPr>
+        <w:pStyle w:val="ActivityBullet"/>
+      </w:pPr>
+      <w:r>
+        <w:rPr>
+          <w:sz w:val="17"/>
+        </w:rPr>
+        <w:t>2026-01-29 14:04:47-0500PM ET enumeration Running nmap script scan using script: sslv2.</w:t>
+      </w:r>
+    </w:p>
+    <w:p>
+      <w:pPr>
+        <w:pStyle w:val="ActivityBullet"/>
+      </w:pPr>
+      <w:r>
+        <w:rPr>
+          <w:sz w:val="17"/>
+        </w:rPr>
+        <w:t>2026-01-29 14:04:47-0500PM ET enumeration Running nmap script scan using script: ssl-cert.</w:t>
+      </w:r>
+    </w:p>
+    <w:p>
+      <w:pPr>
+        <w:pStyle w:val="ActivityBullet"/>
+      </w:pPr>
+      <w:r>
+        <w:rPr>
+          <w:sz w:val="17"/>
+        </w:rPr>
+        <w:t>2026-01-29 14:04:47-0500PM ET enumeration Running nmap script scan using script: ssl-enum-ciphers.</w:t>
+      </w:r>
+    </w:p>
+    <w:p>
+      <w:pPr>
+        <w:pStyle w:val="ActivityBullet"/>
+      </w:pPr>
+      <w:r>
+        <w:rPr>
+          <w:sz w:val="17"/>
+        </w:rPr>
+        <w:t>2026-01-29 14:04:47-0500PM ET enumeration Running nmap script scan using script: http-shellshock.</w:t>
+      </w:r>
+    </w:p>
+    <w:p>
+      <w:pPr>
+        <w:pStyle w:val="ActivityBullet"/>
+      </w:pPr>
+      <w:r>
+        <w:rPr>
+          <w:sz w:val="17"/>
+        </w:rPr>
+        <w:t>2026-01-29 14:04:47-0500PM ET enumeration Running nmap script scan using script: ssl-poodle.</w:t>
+      </w:r>
+    </w:p>
+    <w:p>
+      <w:pPr>
+        <w:pStyle w:val="ActivityBullet"/>
+      </w:pPr>
+      <w:r>
+        <w:rPr>
+          <w:sz w:val="17"/>
+        </w:rPr>
+        <w:t>2026-01-29 14:04:47-0500PM ET enumeration Running nmap script scan using script: http-put.</w:t>
+      </w:r>
+    </w:p>
+    <w:p>
+      <w:pPr>
+        <w:pStyle w:val="ActivityBullet"/>
+      </w:pPr>
+      <w:r>
+        <w:rPr>
+          <w:sz w:val="17"/>
+        </w:rPr>
+        <w:t>2026-01-29 14:04:47-0500PM ET enumeration Running nmap script scan using script: ssl-heartbleed.</w:t>
+      </w:r>
+    </w:p>
+    <w:p>
+      <w:pPr>
+        <w:pStyle w:val="ActivityBullet"/>
+      </w:pPr>
+      <w:r>
+        <w:rPr>
+          <w:sz w:val="17"/>
+        </w:rPr>
+        <w:t>2026-01-29 14:04:47-0500PM ET enumeration Running nmap script scan using script: http-title.</w:t>
+      </w:r>
+    </w:p>
+    <w:p>
+      <w:pPr>
+        <w:pStyle w:val="ActivityBullet"/>
+      </w:pPr>
+      <w:r>
+        <w:rPr>
+          <w:sz w:val="17"/>
+        </w:rPr>
+        <w:t>2026-01-29 14:04:47-0500PM ET enumeration Running nmap script scan using script: ssl-date.</w:t>
+      </w:r>
+    </w:p>
+    <w:p>
+      <w:pPr>
+        <w:pStyle w:val="ActivityBullet"/>
+      </w:pPr>
+      <w:r>
+        <w:rPr>
+          <w:sz w:val="17"/>
+        </w:rPr>
+        <w:t>2026-01-29 14:04:47-0500PM ET enumeration Queuing up MSF module: auxiliary/scanner/ssh/ssh_version.</w:t>
+      </w:r>
+    </w:p>
+    <w:p>
+      <w:pPr>
+        <w:pStyle w:val="ActivityBullet"/>
+      </w:pPr>
+      <w:r>
+        <w:rPr>
+          <w:sz w:val="17"/>
+        </w:rPr>
+        <w:t>2026-01-29 14:05:50-0500PM ET enumeration Completed MSF module: auxiliary/scanner/ssh/ssh_version.</w:t>
+      </w:r>
+    </w:p>
+    <w:p>
+      <w:pPr>
+        <w:pStyle w:val="ActivityBullet"/>
+      </w:pPr>
+      <w:r>
+        <w:rPr>
+          <w:sz w:val="17"/>
+        </w:rPr>
+        <w:t>2026-01-29 14:05:50-0500PM ET enumeration Completed nmap script scan using script: http-methods.</w:t>
+      </w:r>
+    </w:p>
+    <w:p>
+      <w:pPr>
+        <w:pStyle w:val="ActivityBullet"/>
+      </w:pPr>
+      <w:r>
+        <w:rPr>
+          <w:sz w:val="17"/>
+        </w:rPr>
+        <w:t>2026-01-29 14:05:50-0500PM ET enumeration Completed nmap script scan using script: ssl-enum-ciphers.</w:t>
+      </w:r>
+    </w:p>
+    <w:p>
+      <w:pPr>
+        <w:pStyle w:val="ActivityBullet"/>
+      </w:pPr>
+      <w:r>
+        <w:rPr>
+          <w:sz w:val="17"/>
+        </w:rPr>
+        <w:t>2026-01-29 14:05:50-0500PM ET enumeration Completed nmap script scan using script: http-put.</w:t>
+      </w:r>
+    </w:p>
+    <w:p>
+      <w:pPr>
+        <w:pStyle w:val="ActivityBullet"/>
+      </w:pPr>
+      <w:r>
+        <w:rPr>
+          <w:sz w:val="17"/>
+        </w:rPr>
+        <w:t>2026-01-29 14:05:50-0500PM ET enumeration Completed nmap script scan using script: http-robots.txt.</w:t>
+      </w:r>
+    </w:p>
+    <w:p>
+      <w:pPr>
+        <w:pStyle w:val="ActivityBullet"/>
+      </w:pPr>
+      <w:r>
+        <w:rPr>
+          <w:sz w:val="17"/>
+        </w:rPr>
+        <w:t>2026-01-29 14:05:50-0500PM ET enumeration Completed nmap script scan using script: ssl-heartbleed.</w:t>
+      </w:r>
+    </w:p>
+    <w:p>
+      <w:pPr>
+        <w:pStyle w:val="ActivityBullet"/>
+      </w:pPr>
+      <w:r>
+        <w:rPr>
+          <w:sz w:val="17"/>
+        </w:rPr>
+        <w:t>2026-01-29 14:05:50-0500PM ET enumeration Completed nmap script scan using script: http-shellshock.</w:t>
+      </w:r>
+    </w:p>
+    <w:p>
+      <w:pPr>
+        <w:pStyle w:val="ActivityBullet"/>
+      </w:pPr>
+      <w:r>
+        <w:rPr>
+          <w:sz w:val="17"/>
+        </w:rPr>
+        <w:t>2026-01-29 14:05:50-0500PM ET enumeration Completed nmap script scan using script: http-robots.txt.</w:t>
+      </w:r>
+    </w:p>
+    <w:p>
+      <w:pPr>
+        <w:pStyle w:val="ActivityBullet"/>
+      </w:pPr>
+      <w:r>
+        <w:rPr>
+          <w:sz w:val="17"/>
+        </w:rPr>
+        <w:t>2026-01-29 14:05:51-0500PM ET enumeration Completed nmap script scan using script: http-put.</w:t>
+      </w:r>
+    </w:p>
+    <w:p>
+      <w:pPr>
+        <w:pStyle w:val="ActivityBullet"/>
+      </w:pPr>
+      <w:r>
+        <w:rPr>
+          <w:sz w:val="17"/>
+        </w:rPr>
+        <w:t>2026-01-29 14:05:51-0500PM ET enumeration Completed nmap script scan using script: http-headers.</w:t>
+      </w:r>
+    </w:p>
+    <w:p>
+      <w:pPr>
+        <w:pStyle w:val="ActivityBullet"/>
+      </w:pPr>
+      <w:r>
+        <w:rPr>
+          <w:sz w:val="17"/>
+        </w:rPr>
+        <w:t>2026-01-29 14:05:51-0500PM ET enumeration Completed nmap script scan using script: http-methods.</w:t>
+      </w:r>
+    </w:p>
+    <w:p>
+      <w:pPr>
+        <w:pStyle w:val="ActivityBullet"/>
+      </w:pPr>
+      <w:r>
+        <w:rPr>
+          <w:sz w:val="17"/>
+        </w:rPr>
+        <w:t>2026-01-29 14:05:51-0500PM ET enumeration Completed nmap script scan using script: ssl-date.</w:t>
+      </w:r>
+    </w:p>
+    <w:p>
+      <w:pPr>
+        <w:pStyle w:val="ActivityBullet"/>
+      </w:pPr>
+      <w:r>
+        <w:rPr>
+          <w:sz w:val="17"/>
+        </w:rPr>
+        <w:t>2026-01-29 14:05:51-0500PM ET enumeration Completed nmap script scan using script: http-title.</w:t>
+      </w:r>
+    </w:p>
+    <w:p>
+      <w:pPr>
+        <w:pStyle w:val="ActivityBullet"/>
+      </w:pPr>
+      <w:r>
+        <w:rPr>
+          <w:sz w:val="17"/>
+        </w:rPr>
+        <w:t>2026-01-29 14:05:51-0500PM ET enumeration Completed nmap script scan using script: http-shellshock.</w:t>
+      </w:r>
+    </w:p>
+    <w:p>
+      <w:pPr>
+        <w:pStyle w:val="ActivityBullet"/>
+      </w:pPr>
+      <w:r>
+        <w:rPr>
+          <w:sz w:val="17"/>
+        </w:rPr>
+        <w:t>2026-01-29 14:05:51-0500PM ET enumeration Completed nmap script scan using script: http-headers.</w:t>
+      </w:r>
+    </w:p>
+    <w:p>
+      <w:pPr>
+        <w:pStyle w:val="ActivityBullet"/>
+      </w:pPr>
+      <w:r>
+        <w:rPr>
+          <w:sz w:val="17"/>
+        </w:rPr>
+        <w:t>2026-01-29 14:05:51-0500PM ET enumeration Completed nmap script scan using script: ssl-poodle.</w:t>
+      </w:r>
+    </w:p>
+    <w:p>
+      <w:pPr>
+        <w:pStyle w:val="ActivityBullet"/>
+      </w:pPr>
+      <w:r>
+        <w:rPr>
+          <w:sz w:val="17"/>
+        </w:rPr>
+        <w:t>2026-01-29 14:05:51-0500PM ET enumeration Completed nmap script scan using script: ssl-cert.</w:t>
+      </w:r>
+    </w:p>
+    <w:p>
+      <w:pPr>
+        <w:pStyle w:val="ActivityBullet"/>
+      </w:pPr>
+      <w:r>
+        <w:rPr>
+          <w:sz w:val="17"/>
+        </w:rPr>
+        <w:t>2026-01-29 14:05:51-0500PM ET enumeration Completed nmap script scan using script: sslv2.</w:t>
+      </w:r>
+    </w:p>
+    <w:p>
+      <w:pPr>
+        <w:pStyle w:val="ActivityBullet"/>
+      </w:pPr>
+      <w:r>
+        <w:rPr>
+          <w:sz w:val="17"/>
+        </w:rPr>
+        <w:t>2026-01-29 14:05:51-0500PM ET enumeration Completed nmap script scan using script: http-title.</w:t>
+      </w:r>
+    </w:p>
+    <w:p>
+      <w:pPr>
+        <w:pStyle w:val="ActivityBullet"/>
+      </w:pPr>
+      <w:r>
+        <w:rPr>
+          <w:sz w:val="17"/>
+        </w:rPr>
+        <w:t>2026-01-29 14:05:51-0500PM ET enumeration Peforming a hidden directory enumeration attack on 80/tcp.</w:t>
+      </w:r>
+    </w:p>
+    <w:p>
+      <w:pPr>
+        <w:pStyle w:val="ActivityBullet"/>
+      </w:pPr>
+      <w:r>
+        <w:rPr>
+          <w:sz w:val="17"/>
+        </w:rPr>
+        <w:t>2026-01-29 14:05:54-0500PM ET enumeration Running nmap script scan using script: sshv1.</w:t>
+      </w:r>
+    </w:p>
+    <w:p>
+      <w:pPr>
+        <w:pStyle w:val="ActivityBullet"/>
+      </w:pPr>
+      <w:r>
+        <w:rPr>
+          <w:sz w:val="17"/>
+        </w:rPr>
+        <w:t>2026-01-29 14:05:54-0500PM ET enumeration Running nmap script scan using script: ssh2-enum-algos.</w:t>
+      </w:r>
+    </w:p>
+    <w:p>
+      <w:pPr>
+        <w:pStyle w:val="ActivityBullet"/>
+      </w:pPr>
+      <w:r>
+        <w:rPr>
+          <w:sz w:val="17"/>
+        </w:rPr>
+        <w:t>2026-01-29 14:05:54-0500PM ET enumeration Running nmap script scan using script: ssh-auth-methods.</w:t>
+      </w:r>
+    </w:p>
+    <w:p>
+      <w:pPr>
+        <w:pStyle w:val="ActivityBullet"/>
+      </w:pPr>
+      <w:r>
+        <w:rPr>
+          <w:sz w:val="17"/>
+        </w:rPr>
+        <w:t>2026-01-29 14:05:54-0500PM ET enumeration Analyzing SSL/TLS protocols on port 443/tcp.</w:t>
+      </w:r>
+    </w:p>
+    <w:p>
+      <w:pPr>
+        <w:pStyle w:val="ActivityBullet"/>
+      </w:pPr>
+      <w:r>
+        <w:rPr>
+          <w:sz w:val="17"/>
+        </w:rPr>
+        <w:t>2026-01-29 14:06:55-0500PM ET enumeration Completed SSL/TLS analysis on ports 443/tcp.</w:t>
+      </w:r>
+    </w:p>
+    <w:p>
+      <w:pPr>
+        <w:pStyle w:val="ActivityBullet"/>
+      </w:pPr>
+      <w:r>
+        <w:rPr>
+          <w:sz w:val="17"/>
+        </w:rPr>
+        <w:t>2026-01-29 14:06:55-0500PM ET enumeration Completed hidden directory enumeration scan.</w:t>
+      </w:r>
+    </w:p>
+    <w:p>
+      <w:pPr>
+        <w:pStyle w:val="ActivityBullet"/>
+      </w:pPr>
+      <w:r>
+        <w:rPr>
+          <w:sz w:val="17"/>
+        </w:rPr>
+        <w:t>2026-01-29 14:06:55-0500PM ET enumeration Peforming a hidden directory enumeration attack on 443/tcp.</w:t>
+      </w:r>
+    </w:p>
+    <w:p>
+      <w:pPr>
+        <w:pStyle w:val="ActivityBullet"/>
+      </w:pPr>
+      <w:r>
+        <w:rPr>
+          <w:sz w:val="17"/>
+        </w:rPr>
+        <w:t>2026-01-29 14:06:55-0500PM ET enumeration Completed nmap script scan using script: ssh2-enum-algos.</w:t>
+      </w:r>
+    </w:p>
+    <w:p>
+      <w:pPr>
+        <w:pStyle w:val="ActivityBullet"/>
+      </w:pPr>
+      <w:r>
+        <w:rPr>
+          <w:sz w:val="17"/>
+        </w:rPr>
+        <w:t>2026-01-29 14:06:55-0500PM ET enumeration Completed nmap script scan using script: ssh-auth-methods.</w:t>
+      </w:r>
+    </w:p>
+    <w:p>
+      <w:pPr>
+        <w:pStyle w:val="ActivityBullet"/>
+      </w:pPr>
+      <w:r>
+        <w:rPr>
+          <w:sz w:val="17"/>
+        </w:rPr>
+        <w:t>2026-01-29 14:06:55-0500PM ET enumeration Completed nmap script scan using script: sshv1.</w:t>
+      </w:r>
+    </w:p>
+    <w:p>
+      <w:pPr>
+        <w:pStyle w:val="ActivityBullet"/>
+      </w:pPr>
+      <w:r>
+        <w:rPr>
+          <w:sz w:val="17"/>
+        </w:rPr>
+        <w:t>2026-01-29 14:06:55-0500PM ET enumeration Completed enumerating SSH services.</w:t>
+      </w:r>
+    </w:p>
+    <w:p>
+      <w:pPr>
+        <w:pStyle w:val="ActivityBullet"/>
+      </w:pPr>
+      <w:r>
+        <w:rPr>
+          <w:sz w:val="17"/>
+        </w:rPr>
+        <w:t>2026-01-29 14:06:58-0500PM ET enumeration Analyzing web services running on port 80/tcp.</w:t>
+      </w:r>
+    </w:p>
+    <w:p>
+      <w:pPr>
+        <w:pStyle w:val="ActivityBullet"/>
+      </w:pPr>
+      <w:r>
+        <w:rPr>
+          <w:sz w:val="17"/>
+        </w:rPr>
+        <w:t>2026-01-29 14:08:10-0500PM ET enumeration Completed analyzing web services running on port 80/tcp.</w:t>
+      </w:r>
+    </w:p>
+    <w:p>
+      <w:pPr>
+        <w:pStyle w:val="ActivityBullet"/>
+      </w:pPr>
+      <w:r>
+        <w:rPr>
+          <w:sz w:val="17"/>
+        </w:rPr>
+        <w:t>2026-01-29 14:08:10-0500PM ET enumeration Completed hidden directory enumeration scan.</w:t>
+      </w:r>
+    </w:p>
+    <w:p>
+      <w:pPr>
+        <w:pStyle w:val="ActivityBullet"/>
+      </w:pPr>
+      <w:r>
+        <w:rPr>
+          <w:sz w:val="17"/>
+        </w:rPr>
+        <w:t>2026-01-29 14:08:10-0500PM ET enumeration Completed analyzing web services running on port 80/tcp.</w:t>
+      </w:r>
+    </w:p>
+    <w:p>
+      <w:pPr>
+        <w:pStyle w:val="ActivityBullet"/>
+      </w:pPr>
+      <w:r>
+        <w:rPr>
+          <w:sz w:val="17"/>
+        </w:rPr>
+        <w:t>2026-01-29 14:08:10-0500PM ET enumeration Completed enumerating HTTP services.</w:t>
+      </w:r>
+    </w:p>
+    <w:p>
+      <w:pPr>
+        <w:pStyle w:val="ActivityBullet"/>
+      </w:pPr>
+      <w:r>
+        <w:rPr>
+          <w:sz w:val="17"/>
+        </w:rPr>
+        <w:t>2026-01-29 14:08:13-0500PM ET enumeration Analyzing web services running on port 443/tcp.</w:t>
+      </w:r>
+    </w:p>
+    <w:p>
+      <w:pPr>
+        <w:pStyle w:val="ActivityBullet"/>
+      </w:pPr>
+      <w:r>
+        <w:rPr>
+          <w:sz w:val="17"/>
+        </w:rPr>
+        <w:t>2026-01-29 14:09:15-0500PM ET enumeration Completed analyzing web services running on port 443/tcp.</w:t>
+      </w:r>
+    </w:p>
+    <w:p>
+      <w:pPr>
+        <w:pStyle w:val="ActivityBullet"/>
+      </w:pPr>
+      <w:r>
+        <w:rPr>
+          <w:sz w:val="17"/>
+        </w:rPr>
+        <w:t>2026-01-29 14:09:15-0500PM ET enumeration Completed analyzing web services running on port 443/tcp.</w:t>
+      </w:r>
+    </w:p>
+    <w:p>
+      <w:pPr>
+        <w:pStyle w:val="ActivityBullet"/>
+      </w:pPr>
+      <w:r>
+        <w:rPr>
+          <w:sz w:val="17"/>
+        </w:rPr>
+        <w:t>2026-01-29 14:09:16-0500PM ET enumeration Completed enumerating HTTPS services.</w:t>
+      </w:r>
+    </w:p>
+    <w:p>
+      <w:pPr>
+        <w:pStyle w:val="ActivityBullet"/>
+      </w:pPr>
+      <w:r>
+        <w:rPr>
+          <w:sz w:val="17"/>
+        </w:rPr>
+        <w:t>2026-01-29 14:09:45-0500PM ET enumeration Enumeration module completed.</w:t>
+      </w:r>
+    </w:p>
+    <w:p>
+      <w:pPr>
+        <w:pStyle w:val="ActivityBullet"/>
+      </w:pPr>
+      <w:r>
+        <w:rPr>
+          <w:sz w:val="17"/>
+        </w:rPr>
+        <w:t>2026-01-29 14:10:06-0500PM ET exploit Launching exploit module.</w:t>
+      </w:r>
+    </w:p>
+    <w:p>
+      <w:pPr>
+        <w:pStyle w:val="ActivityBullet"/>
+      </w:pPr>
+      <w:r>
+        <w:rPr>
+          <w:sz w:val="17"/>
+        </w:rPr>
+        <w:t>2026-01-29 14:10:11-0500PM ET exploit Queuing up hydra attack: SSH password attack.</w:t>
+      </w:r>
+    </w:p>
+    <w:p>
+      <w:pPr>
+        <w:pStyle w:val="ActivityBullet"/>
+      </w:pPr>
+      <w:r>
+        <w:rPr>
+          <w:sz w:val="17"/>
+        </w:rPr>
+        <w:t>2026-01-29 14:11:16-0500PM ET exploit Completed hydra attack: SSH password attack.</w:t>
+      </w:r>
+    </w:p>
+    <w:p>
+      <w:pPr>
+        <w:pStyle w:val="ActivityBullet"/>
+      </w:pPr>
+      <w:r>
+        <w:rPr>
+          <w:sz w:val="17"/>
+        </w:rPr>
+        <w:t>2026-01-29 14:11:16-0500PM ET exploit Completed SSH password attack.</w:t>
+      </w:r>
+    </w:p>
+    <w:p>
+      <w:pPr>
+        <w:pStyle w:val="ActivityBullet"/>
+      </w:pPr>
+      <w:r>
+        <w:rPr>
+          <w:sz w:val="17"/>
+        </w:rPr>
+        <w:t>2026-01-29 14:11:49-0500PM ET exploit Completed exploit module.</w:t>
+      </w:r>
     </w:p>
     <w:p>
       <w:pPr>

</xml_diff>

<commit_message>
Added Assessment Results and Recommendations to system.
</commit_message>
<xml_diff>
--- a/Source_Code/Reports/Sample499/FindingsReportTest.docx
+++ b/Source_Code/Reports/Sample499/FindingsReportTest.docx
@@ -19,7 +19,7 @@
         <mc:AlternateContent>
           <mc:Choice Requires="wps">
             <w:drawing>
-              <wp:anchor distT="0" distB="0" distL="114300" distR="114300" simplePos="0" relativeHeight="251663360" behindDoc="1" locked="0" layoutInCell="1" allowOverlap="1" wp14:anchorId="11680C66" wp14:editId="5FB06963">
+              <wp:anchor distT="0" distB="0" distL="114300" distR="114300" simplePos="0" relativeHeight="251663360" behindDoc="1" locked="0" layoutInCell="1" allowOverlap="1" wp14:anchorId="123CD770" wp14:editId="4321AE51">
                 <wp:simplePos x="0" y="0"/>
                 <wp:positionH relativeFrom="margin">
                   <wp:posOffset>-1010031</wp:posOffset>
@@ -79,7 +79,7 @@
           </mc:Choice>
           <mc:Fallback>
             <w:pict>
-              <v:rect w14:anchorId="11680C66" id="Rectangle 355773799" o:spid="_x0000_s1026" style="position:absolute;left:0;text-align:left;margin-left:-79.55pt;margin-top:0;width:617.25pt;height:791.25pt;z-index:-251653120;visibility:visible;mso-wrap-style:square;mso-width-percent:0;mso-height-percent:0;mso-wrap-distance-left:9pt;mso-wrap-distance-top:0;mso-wrap-distance-right:9pt;mso-wrap-distance-bottom:0;mso-position-horizontal:absolute;mso-position-horizontal-relative:margin;mso-position-vertical:top;mso-position-vertical-relative:page;mso-width-percent:0;mso-height-percent:0;mso-width-relative:margin;mso-height-relative:margin;v-text-anchor:middle" o:gfxdata="UEsDBBQABgAIAAAAIQC2gziS/gAAAOEBAAATAAAAW0NvbnRlbnRfVHlwZXNdLnhtbJSRQU7DMBBF&#10;90jcwfIWJU67QAgl6YK0S0CoHGBkTxKLZGx5TGhvj5O2G0SRWNoz/78nu9wcxkFMGNg6quQqL6RA&#10;0s5Y6ir5vt9lD1JwBDIwOMJKHpHlpr69KfdHjyxSmriSfYz+USnWPY7AufNIadK6MEJMx9ApD/oD&#10;OlTrorhX2lFEilmcO2RdNtjC5xDF9pCuTyYBB5bi6bQ4syoJ3g9WQ0ymaiLzg5KdCXlKLjvcW893&#10;SUOqXwnz5DrgnHtJTxOsQfEKIT7DmDSUCaxw7Rqn8787ZsmRM9e2VmPeBN4uqYvTtW7jvijg9N/y&#10;JsXecLq0q+WD6m8AAAD//wMAUEsDBBQABgAIAAAAIQA4/SH/1gAAAJQBAAALAAAAX3JlbHMvLnJl&#10;bHOkkMFqwzAMhu+DvYPRfXGawxijTi+j0GvpHsDYimMaW0Yy2fr2M4PBMnrbUb/Q94l/f/hMi1qR&#10;JVI2sOt6UJgd+ZiDgffL8ekFlFSbvV0oo4EbChzGx4f9GRdb25HMsYhqlCwG5lrLq9biZkxWOiqY&#10;22YiTra2kYMu1l1tQD30/bPm3wwYN0x18gb45AdQl1tp5j/sFB2T0FQ7R0nTNEV3j6o9feQzro1i&#10;OWA14Fm+Q8a1a8+Bvu/d/dMb2JY5uiPbhG/ktn4cqGU/er3pcvwCAAD//wMAUEsDBBQABgAIAAAA&#10;IQAsNozUXAIAAK8EAAAOAAAAZHJzL2Uyb0RvYy54bWysVNtu2zAMfR+wfxD0vtq5dEmDOkXQyzCg&#10;aAu0Q58VWYoNSKJGKbG7rx8lu9ftaVgeFNKkecijQ5+e9dawg8LQgqv45KjkTDkJdet2Ff/xcPVl&#10;yVmIwtXCgFMVf1KBn60/fzrt/EpNoQFTK2RUxIVV5yvexOhXRRFko6wIR+CVo6AGtCKSi7uiRtFR&#10;dWuKaVl+LTrA2iNIFQI9vRiCfJ3ra61kvNU6qMhMxam3mE/M5zadxfpUrHYofNPKsQ3xD11Y0ToC&#10;fSl1IaJge2z/KGVbiRBAxyMJtgCtW6nyDDTNpPwwzX0jvMqzEDnBv9AU/l9ZeXO493dINHQ+rAKZ&#10;aYpeo03/1B/rM1lPL2SpPjJJDxfL2Um5OOZMUmxSlvPlkjwqVLy+7zHEbwosS0bFka4jsyQO1yEO&#10;qc8pCS6Aaeur1pjs4G57bpAdBF3d7HI2m16O1d+lGcc6wp8uSrpeKUhC2ohIpvV1xYPbcSbMjrQp&#10;I2ZsBwkh33vCvhChGTBy2UEQto2kStPaii/L9BuRjUudqayrcYJX2pIV+20/crmF+ukOGcKgueDl&#10;VUt41yLEO4EkMuqXFife0qEN0BAwWpw1gL/+9jzl091TlLOOREsD/twLVJyZ745UcTKZz5PKszM/&#10;XkzJwbeR7duI29tzIHIntKJeZjPlR/NsagT7SPu1SagUEk4S9kDl6JzHYZloQ6XabHIaKduLeO3u&#10;vUzFE2WJ6Yf+UaAfpRBJRjfwLHCx+qCIITe96WCzj6DbLJdE8cArySw5tBVZcOMGp7V76+es1+/M&#10;+jcAAAD//wMAUEsDBBQABgAIAAAAIQDxl1Oj3wAAAAsBAAAPAAAAZHJzL2Rvd25yZXYueG1sTI/B&#10;TsMwEETvSP0Haytxa51UBEqIU1UgBEgcIOUD3HiJo8brJHbb8PdsT3Db0Yxm3xSbyXXihGNoPSlI&#10;lwkIpNqblhoFX7vnxRpEiJqM7jyhgh8MsClnV4XOjT/TJ56q2AguoZBrBTbGPpcy1BadDkvfI7H3&#10;7UenI8uxkWbUZy53nVwlya10uiX+YHWPjxbrQ3V0Curd+4cdzBC8fY0vxg7h6a0KSl3Pp+0DiIhT&#10;/AvDBZ/RoWSmvT+SCaJTsEiz+5SzCnjSxU/ushsQe76y9SoDWRby/4byFwAA//8DAFBLAQItABQA&#10;BgAIAAAAIQC2gziS/gAAAOEBAAATAAAAAAAAAAAAAAAAAAAAAABbQ29udGVudF9UeXBlc10ueG1s&#10;UEsBAi0AFAAGAAgAAAAhADj9If/WAAAAlAEAAAsAAAAAAAAAAAAAAAAALwEAAF9yZWxzLy5yZWxz&#10;UEsBAi0AFAAGAAgAAAAhACw2jNRcAgAArwQAAA4AAAAAAAAAAAAAAAAALgIAAGRycy9lMm9Eb2Mu&#10;eG1sUEsBAi0AFAAGAAgAAAAhAPGXU6PfAAAACwEAAA8AAAAAAAAAAAAAAAAAtgQAAGRycy9kb3du&#10;cmV2LnhtbFBLBQYAAAAABAAEAPMAAADCBQAAAAA=&#10;" fillcolor="#3e332e" stroked="f" strokeweight="1pt">
+              <v:rect w14:anchorId="123CD770" id="Rectangle 355773799" o:spid="_x0000_s1026" style="position:absolute;left:0;text-align:left;margin-left:-79.55pt;margin-top:0;width:617.25pt;height:791.25pt;z-index:-251653120;visibility:visible;mso-wrap-style:square;mso-width-percent:0;mso-height-percent:0;mso-wrap-distance-left:9pt;mso-wrap-distance-top:0;mso-wrap-distance-right:9pt;mso-wrap-distance-bottom:0;mso-position-horizontal:absolute;mso-position-horizontal-relative:margin;mso-position-vertical:top;mso-position-vertical-relative:page;mso-width-percent:0;mso-height-percent:0;mso-width-relative:margin;mso-height-relative:margin;v-text-anchor:middle" o:gfxdata="UEsDBBQABgAIAAAAIQC2gziS/gAAAOEBAAATAAAAW0NvbnRlbnRfVHlwZXNdLnhtbJSRQU7DMBBF&#10;90jcwfIWJU67QAgl6YK0S0CoHGBkTxKLZGx5TGhvj5O2G0SRWNoz/78nu9wcxkFMGNg6quQqL6RA&#10;0s5Y6ir5vt9lD1JwBDIwOMJKHpHlpr69KfdHjyxSmriSfYz+USnWPY7AufNIadK6MEJMx9ApD/oD&#10;OlTrorhX2lFEilmcO2RdNtjC5xDF9pCuTyYBB5bi6bQ4syoJ3g9WQ0ymaiLzg5KdCXlKLjvcW893&#10;SUOqXwnz5DrgnHtJTxOsQfEKIT7DmDSUCaxw7Rqn8787ZsmRM9e2VmPeBN4uqYvTtW7jvijg9N/y&#10;JsXecLq0q+WD6m8AAAD//wMAUEsDBBQABgAIAAAAIQA4/SH/1gAAAJQBAAALAAAAX3JlbHMvLnJl&#10;bHOkkMFqwzAMhu+DvYPRfXGawxijTi+j0GvpHsDYimMaW0Yy2fr2M4PBMnrbUb/Q94l/f/hMi1qR&#10;JVI2sOt6UJgd+ZiDgffL8ekFlFSbvV0oo4EbChzGx4f9GRdb25HMsYhqlCwG5lrLq9biZkxWOiqY&#10;22YiTra2kYMu1l1tQD30/bPm3wwYN0x18gb45AdQl1tp5j/sFB2T0FQ7R0nTNEV3j6o9feQzro1i&#10;OWA14Fm+Q8a1a8+Bvu/d/dMb2JY5uiPbhG/ktn4cqGU/er3pcvwCAAD//wMAUEsDBBQABgAIAAAA&#10;IQAsNozUXAIAAK8EAAAOAAAAZHJzL2Uyb0RvYy54bWysVNtu2zAMfR+wfxD0vtq5dEmDOkXQyzCg&#10;aAu0Q58VWYoNSKJGKbG7rx8lu9ftaVgeFNKkecijQ5+e9dawg8LQgqv45KjkTDkJdet2Ff/xcPVl&#10;yVmIwtXCgFMVf1KBn60/fzrt/EpNoQFTK2RUxIVV5yvexOhXRRFko6wIR+CVo6AGtCKSi7uiRtFR&#10;dWuKaVl+LTrA2iNIFQI9vRiCfJ3ra61kvNU6qMhMxam3mE/M5zadxfpUrHYofNPKsQ3xD11Y0ToC&#10;fSl1IaJge2z/KGVbiRBAxyMJtgCtW6nyDDTNpPwwzX0jvMqzEDnBv9AU/l9ZeXO493dINHQ+rAKZ&#10;aYpeo03/1B/rM1lPL2SpPjJJDxfL2Um5OOZMUmxSlvPlkjwqVLy+7zHEbwosS0bFka4jsyQO1yEO&#10;qc8pCS6Aaeur1pjs4G57bpAdBF3d7HI2m16O1d+lGcc6wp8uSrpeKUhC2ohIpvV1xYPbcSbMjrQp&#10;I2ZsBwkh33vCvhChGTBy2UEQto2kStPaii/L9BuRjUudqayrcYJX2pIV+20/crmF+ukOGcKgueDl&#10;VUt41yLEO4EkMuqXFife0qEN0BAwWpw1gL/+9jzl091TlLOOREsD/twLVJyZ745UcTKZz5PKszM/&#10;XkzJwbeR7duI29tzIHIntKJeZjPlR/NsagT7SPu1SagUEk4S9kDl6JzHYZloQ6XabHIaKduLeO3u&#10;vUzFE2WJ6Yf+UaAfpRBJRjfwLHCx+qCIITe96WCzj6DbLJdE8cArySw5tBVZcOMGp7V76+es1+/M&#10;+jcAAAD//wMAUEsDBBQABgAIAAAAIQDxl1Oj3wAAAAsBAAAPAAAAZHJzL2Rvd25yZXYueG1sTI/B&#10;TsMwEETvSP0Haytxa51UBEqIU1UgBEgcIOUD3HiJo8brJHbb8PdsT3Db0Yxm3xSbyXXihGNoPSlI&#10;lwkIpNqblhoFX7vnxRpEiJqM7jyhgh8MsClnV4XOjT/TJ56q2AguoZBrBTbGPpcy1BadDkvfI7H3&#10;7UenI8uxkWbUZy53nVwlya10uiX+YHWPjxbrQ3V0Curd+4cdzBC8fY0vxg7h6a0KSl3Pp+0DiIhT&#10;/AvDBZ/RoWSmvT+SCaJTsEiz+5SzCnjSxU/ushsQe76y9SoDWRby/4byFwAA//8DAFBLAQItABQA&#10;BgAIAAAAIQC2gziS/gAAAOEBAAATAAAAAAAAAAAAAAAAAAAAAABbQ29udGVudF9UeXBlc10ueG1s&#10;UEsBAi0AFAAGAAgAAAAhADj9If/WAAAAlAEAAAsAAAAAAAAAAAAAAAAALwEAAF9yZWxzLy5yZWxz&#10;UEsBAi0AFAAGAAgAAAAhACw2jNRcAgAArwQAAA4AAAAAAAAAAAAAAAAALgIAAGRycy9lMm9Eb2Mu&#10;eG1sUEsBAi0AFAAGAAgAAAAhAPGXU6PfAAAACwEAAA8AAAAAAAAAAAAAAAAAtgQAAGRycy9kb3du&#10;cmV2LnhtbFBLBQYAAAAABAAEAPMAAADCBQAAAAA=&#10;" fillcolor="#3e332e" stroked="f" strokeweight="1pt">
                 <v:textbox>
                   <w:txbxContent>
                     <w:p/>
@@ -113,7 +113,7 @@
           <w14:ligatures w14:val="none"/>
         </w:rPr>
         <w:drawing>
-          <wp:anchor distT="0" distB="0" distL="114300" distR="114300" simplePos="0" relativeHeight="251661312" behindDoc="0" locked="0" layoutInCell="1" allowOverlap="1" wp14:anchorId="0DC7EDFC" wp14:editId="4A01890E">
+          <wp:anchor distT="0" distB="0" distL="114300" distR="114300" simplePos="0" relativeHeight="251661312" behindDoc="0" locked="0" layoutInCell="1" allowOverlap="1" wp14:anchorId="7E292FF7" wp14:editId="0D220F12">
             <wp:simplePos x="0" y="0"/>
             <wp:positionH relativeFrom="margin">
               <wp:posOffset>1861820</wp:posOffset>
@@ -187,7 +187,7 @@
         <mc:AlternateContent>
           <mc:Choice Requires="wps">
             <w:drawing>
-              <wp:anchor distT="0" distB="0" distL="114300" distR="114300" simplePos="0" relativeHeight="251659264" behindDoc="1" locked="0" layoutInCell="1" allowOverlap="1" wp14:anchorId="37F3B3E1" wp14:editId="1B4897C1">
+              <wp:anchor distT="0" distB="0" distL="114300" distR="114300" simplePos="0" relativeHeight="251659264" behindDoc="1" locked="0" layoutInCell="1" allowOverlap="1" wp14:anchorId="6EA8CE39" wp14:editId="5CFC52BF">
                 <wp:simplePos x="0" y="0"/>
                 <wp:positionH relativeFrom="margin">
                   <wp:align>center</wp:align>
@@ -251,7 +251,7 @@
           </mc:Choice>
           <mc:Fallback>
             <w:pict>
-              <v:rect w14:anchorId="37F3B3E1" id="Rectangle 1" o:spid="_x0000_s1027" style="position:absolute;margin-left:0;margin-top:-.05pt;width:617.25pt;height:791.25pt;z-index:-251657216;visibility:visible;mso-wrap-style:square;mso-width-percent:0;mso-height-percent:0;mso-wrap-distance-left:9pt;mso-wrap-distance-top:0;mso-wrap-distance-right:9pt;mso-wrap-distance-bottom:0;mso-position-horizontal:center;mso-position-horizontal-relative:margin;mso-position-vertical:absolute;mso-position-vertical-relative:page;mso-width-percent:0;mso-height-percent:0;mso-width-relative:margin;mso-height-relative:margin;v-text-anchor:middle" o:gfxdata="UEsDBBQABgAIAAAAIQC2gziS/gAAAOEBAAATAAAAW0NvbnRlbnRfVHlwZXNdLnhtbJSRQU7DMBBF&#10;90jcwfIWJU67QAgl6YK0S0CoHGBkTxKLZGx5TGhvj5O2G0SRWNoz/78nu9wcxkFMGNg6quQqL6RA&#10;0s5Y6ir5vt9lD1JwBDIwOMJKHpHlpr69KfdHjyxSmriSfYz+USnWPY7AufNIadK6MEJMx9ApD/oD&#10;OlTrorhX2lFEilmcO2RdNtjC5xDF9pCuTyYBB5bi6bQ4syoJ3g9WQ0ymaiLzg5KdCXlKLjvcW893&#10;SUOqXwnz5DrgnHtJTxOsQfEKIT7DmDSUCaxw7Rqn8787ZsmRM9e2VmPeBN4uqYvTtW7jvijg9N/y&#10;JsXecLq0q+WD6m8AAAD//wMAUEsDBBQABgAIAAAAIQA4/SH/1gAAAJQBAAALAAAAX3JlbHMvLnJl&#10;bHOkkMFqwzAMhu+DvYPRfXGawxijTi+j0GvpHsDYimMaW0Yy2fr2M4PBMnrbUb/Q94l/f/hMi1qR&#10;JVI2sOt6UJgd+ZiDgffL8ekFlFSbvV0oo4EbChzGx4f9GRdb25HMsYhqlCwG5lrLq9biZkxWOiqY&#10;22YiTra2kYMu1l1tQD30/bPm3wwYN0x18gb45AdQl1tp5j/sFB2T0FQ7R0nTNEV3j6o9feQzro1i&#10;OWA14Fm+Q8a1a8+Bvu/d/dMb2JY5uiPbhG/ktn4cqGU/er3pcvwCAAD//wMAUEsDBBQABgAIAAAA&#10;IQBFth+PYAIAALYEAAAOAAAAZHJzL2Uyb0RvYy54bWysVE1v2zAMvQ/YfxB0X+18dEmDOkXQj2FA&#10;sRZoh54VWY4FSKJGKbG7Xz9Kdpuu22lYDgopUnzi06PPL3pr2EFh0OAqPjkpOVNOQq3druLfH28+&#10;LTkLUbhaGHCq4s8q8Iv1xw/nnV+pKbRgaoWMiriw6nzF2xj9qiiCbJUV4QS8chRsAK2I5OKuqFF0&#10;VN2aYlqWn4sOsPYIUoVAu1dDkK9z/aZRMt41TVCRmYrT3WJeMa/btBbrc7HaofCtluM1xD/cwgrt&#10;CPS11JWIgu1R/1HKaokQoIknEmwBTaOlyj1QN5PyXTcPrfAq90LkBP9KU/h/ZeW3w4O/R6Kh82EV&#10;yExd9A3a9E/3Y30m6/mVLNVHJmlzsZydlYtTziTFJmU5Xy7Jo0LF8bzHEL8osCwZFUd6jsySONyG&#10;OKS+pCS4AEbXN9qY7OBue2mQHQQ93ex6Nptej9V/SzOOdYQ/XZT0vFKQhBojIpnW1xUPbseZMDvS&#10;poyYsR0khPzuCftKhHbAyGUHQVgdSZVG24ovy/QbkY1LN1NZV2MHR9qSFfttzzQBT9KJtLOF+vke&#10;GcIgveDljSbYWxHivUDSGl2b5ife0dIYoF5gtDhrAX/+bT/lkwQoyllH2qU+f+wFKs7MV0fiOJvM&#10;50ns2ZmfLqbk4NvI9m3E7e0lEMcTmlQvs5nyo3kxGwT7RGO2SagUEk4S9sDo6FzGYaZoUKXabHIa&#10;CdyLeOsevEzFE3OJ8Mf+SaAfFRFJTd/gRedi9U4YQ2466WCzj9DorJojr6S25NBwZN2Ng5ym762f&#10;s46fm/UvAAAA//8DAFBLAwQUAAYACAAAACEAB/BzJ94AAAAIAQAADwAAAGRycy9kb3ducmV2Lnht&#10;bEyPwW7CMBBE75X4B2sr9QYOKVQoxEGoVdUi9dCGfoCJlzhqvE6yBtK/x5za26xmNfMm34yuFWcc&#10;uPGkYD5LQCBV3jRUK/jev05XIDhoMrr1hAp+kWFTTO5ynRl/oS88l6EWMYQ40wpsCF0mJVcWneaZ&#10;75Cid/SD0yGeQy3NoC8x3LUyTZIn6XRDscHqDp8tVj/lySmo9h+ftjc9e/se3ozt+WVXslIP9+N2&#10;DSLgGP6e4YYf0aGITAd/IsOiVRCHBAXTOYibmT4uliAOUS1X6QJkkcv/A4orAAAA//8DAFBLAQIt&#10;ABQABgAIAAAAIQC2gziS/gAAAOEBAAATAAAAAAAAAAAAAAAAAAAAAABbQ29udGVudF9UeXBlc10u&#10;eG1sUEsBAi0AFAAGAAgAAAAhADj9If/WAAAAlAEAAAsAAAAAAAAAAAAAAAAALwEAAF9yZWxzLy5y&#10;ZWxzUEsBAi0AFAAGAAgAAAAhAEW2H49gAgAAtgQAAA4AAAAAAAAAAAAAAAAALgIAAGRycy9lMm9E&#10;b2MueG1sUEsBAi0AFAAGAAgAAAAhAAfwcyfeAAAACAEAAA8AAAAAAAAAAAAAAAAAugQAAGRycy9k&#10;b3ducmV2LnhtbFBLBQYAAAAABAAEAPMAAADFBQAAAAA=&#10;" fillcolor="#3e332e" stroked="f" strokeweight="1pt">
+              <v:rect w14:anchorId="6EA8CE39" id="Rectangle 1" o:spid="_x0000_s1027" style="position:absolute;margin-left:0;margin-top:-.05pt;width:617.25pt;height:791.25pt;z-index:-251657216;visibility:visible;mso-wrap-style:square;mso-width-percent:0;mso-height-percent:0;mso-wrap-distance-left:9pt;mso-wrap-distance-top:0;mso-wrap-distance-right:9pt;mso-wrap-distance-bottom:0;mso-position-horizontal:center;mso-position-horizontal-relative:margin;mso-position-vertical:absolute;mso-position-vertical-relative:page;mso-width-percent:0;mso-height-percent:0;mso-width-relative:margin;mso-height-relative:margin;v-text-anchor:middle" o:gfxdata="UEsDBBQABgAIAAAAIQC2gziS/gAAAOEBAAATAAAAW0NvbnRlbnRfVHlwZXNdLnhtbJSRQU7DMBBF&#10;90jcwfIWJU67QAgl6YK0S0CoHGBkTxKLZGx5TGhvj5O2G0SRWNoz/78nu9wcxkFMGNg6quQqL6RA&#10;0s5Y6ir5vt9lD1JwBDIwOMJKHpHlpr69KfdHjyxSmriSfYz+USnWPY7AufNIadK6MEJMx9ApD/oD&#10;OlTrorhX2lFEilmcO2RdNtjC5xDF9pCuTyYBB5bi6bQ4syoJ3g9WQ0ymaiLzg5KdCXlKLjvcW893&#10;SUOqXwnz5DrgnHtJTxOsQfEKIT7DmDSUCaxw7Rqn8787ZsmRM9e2VmPeBN4uqYvTtW7jvijg9N/y&#10;JsXecLq0q+WD6m8AAAD//wMAUEsDBBQABgAIAAAAIQA4/SH/1gAAAJQBAAALAAAAX3JlbHMvLnJl&#10;bHOkkMFqwzAMhu+DvYPRfXGawxijTi+j0GvpHsDYimMaW0Yy2fr2M4PBMnrbUb/Q94l/f/hMi1qR&#10;JVI2sOt6UJgd+ZiDgffL8ekFlFSbvV0oo4EbChzGx4f9GRdb25HMsYhqlCwG5lrLq9biZkxWOiqY&#10;22YiTra2kYMu1l1tQD30/bPm3wwYN0x18gb45AdQl1tp5j/sFB2T0FQ7R0nTNEV3j6o9feQzro1i&#10;OWA14Fm+Q8a1a8+Bvu/d/dMb2JY5uiPbhG/ktn4cqGU/er3pcvwCAAD//wMAUEsDBBQABgAIAAAA&#10;IQBFth+PYAIAALYEAAAOAAAAZHJzL2Uyb0RvYy54bWysVE1v2zAMvQ/YfxB0X+18dEmDOkXQj2FA&#10;sRZoh54VWY4FSKJGKbG7Xz9Kdpuu22lYDgopUnzi06PPL3pr2EFh0OAqPjkpOVNOQq3druLfH28+&#10;LTkLUbhaGHCq4s8q8Iv1xw/nnV+pKbRgaoWMiriw6nzF2xj9qiiCbJUV4QS8chRsAK2I5OKuqFF0&#10;VN2aYlqWn4sOsPYIUoVAu1dDkK9z/aZRMt41TVCRmYrT3WJeMa/btBbrc7HaofCtluM1xD/cwgrt&#10;CPS11JWIgu1R/1HKaokQoIknEmwBTaOlyj1QN5PyXTcPrfAq90LkBP9KU/h/ZeW3w4O/R6Kh82EV&#10;yExd9A3a9E/3Y30m6/mVLNVHJmlzsZydlYtTziTFJmU5Xy7Jo0LF8bzHEL8osCwZFUd6jsySONyG&#10;OKS+pCS4AEbXN9qY7OBue2mQHQQ93ex6Nptej9V/SzOOdYQ/XZT0vFKQhBojIpnW1xUPbseZMDvS&#10;poyYsR0khPzuCftKhHbAyGUHQVgdSZVG24ovy/QbkY1LN1NZV2MHR9qSFfttzzQBT9KJtLOF+vke&#10;GcIgveDljSbYWxHivUDSGl2b5ife0dIYoF5gtDhrAX/+bT/lkwQoyllH2qU+f+wFKs7MV0fiOJvM&#10;50ns2ZmfLqbk4NvI9m3E7e0lEMcTmlQvs5nyo3kxGwT7RGO2SagUEk4S9sDo6FzGYaZoUKXabHIa&#10;CdyLeOsevEzFE3OJ8Mf+SaAfFRFJTd/gRedi9U4YQ2466WCzj9DorJojr6S25NBwZN2Ng5ym762f&#10;s46fm/UvAAAA//8DAFBLAwQUAAYACAAAACEAB/BzJ94AAAAIAQAADwAAAGRycy9kb3ducmV2Lnht&#10;bEyPwW7CMBBE75X4B2sr9QYOKVQoxEGoVdUi9dCGfoCJlzhqvE6yBtK/x5za26xmNfMm34yuFWcc&#10;uPGkYD5LQCBV3jRUK/jev05XIDhoMrr1hAp+kWFTTO5ynRl/oS88l6EWMYQ40wpsCF0mJVcWneaZ&#10;75Cid/SD0yGeQy3NoC8x3LUyTZIn6XRDscHqDp8tVj/lySmo9h+ftjc9e/se3ozt+WVXslIP9+N2&#10;DSLgGP6e4YYf0aGITAd/IsOiVRCHBAXTOYibmT4uliAOUS1X6QJkkcv/A4orAAAA//8DAFBLAQIt&#10;ABQABgAIAAAAIQC2gziS/gAAAOEBAAATAAAAAAAAAAAAAAAAAAAAAABbQ29udGVudF9UeXBlc10u&#10;eG1sUEsBAi0AFAAGAAgAAAAhADj9If/WAAAAlAEAAAsAAAAAAAAAAAAAAAAALwEAAF9yZWxzLy5y&#10;ZWxzUEsBAi0AFAAGAAgAAAAhAEW2H49gAgAAtgQAAA4AAAAAAAAAAAAAAAAALgIAAGRycy9lMm9E&#10;b2MueG1sUEsBAi0AFAAGAAgAAAAhAAfwcyfeAAAACAEAAA8AAAAAAAAAAAAAAAAAugQAAGRycy9k&#10;b3ducmV2LnhtbFBLBQYAAAAABAAEAPMAAADFBQAAAAA=&#10;" fillcolor="#3e332e" stroked="f" strokeweight="1pt">
                 <v:textbox>
                   <w:txbxContent>
                     <w:p>
@@ -601,7 +601,7 @@
           <w14:ligatures w14:val="none"/>
         </w:rPr>
         <w:drawing>
-          <wp:anchor distT="0" distB="0" distL="114300" distR="114300" simplePos="0" relativeHeight="251662336" behindDoc="0" locked="0" layoutInCell="1" allowOverlap="1" wp14:anchorId="4AF298DC" wp14:editId="3CA1DD00">
+          <wp:anchor distT="0" distB="0" distL="114300" distR="114300" simplePos="0" relativeHeight="251662336" behindDoc="0" locked="0" layoutInCell="1" allowOverlap="1" wp14:anchorId="56FF54E8" wp14:editId="15D39BE8">
             <wp:simplePos x="0" y="0"/>
             <wp:positionH relativeFrom="margin">
               <wp:posOffset>1163955</wp:posOffset>
@@ -669,7 +669,7 @@
         <mc:AlternateContent>
           <mc:Choice Requires="wps">
             <w:drawing>
-              <wp:anchor distT="45720" distB="45720" distL="114300" distR="114300" simplePos="0" relativeHeight="251660288" behindDoc="0" locked="0" layoutInCell="1" allowOverlap="1" wp14:anchorId="23806443" wp14:editId="0F932A78">
+              <wp:anchor distT="45720" distB="45720" distL="114300" distR="114300" simplePos="0" relativeHeight="251660288" behindDoc="0" locked="0" layoutInCell="1" allowOverlap="1" wp14:anchorId="0C11C59D" wp14:editId="20D6CB97">
                 <wp:simplePos x="0" y="0"/>
                 <wp:positionH relativeFrom="page">
                   <wp:posOffset>2536825</wp:posOffset>
@@ -823,7 +823,7 @@
           </mc:Choice>
           <mc:Fallback>
             <w:pict>
-              <v:shapetype w14:anchorId="23806443" id="_x0000_t202" coordsize="21600,21600" o:spt="202" path="m,l,21600r21600,l21600,xe">
+              <v:shapetype w14:anchorId="0C11C59D" id="_x0000_t202" coordsize="21600,21600" o:spt="202" path="m,l,21600r21600,l21600,xe">
                 <v:stroke joinstyle="miter"/>
                 <v:path gradientshapeok="t" o:connecttype="rect"/>
               </v:shapetype>
@@ -4043,7 +4043,7 @@
           <w14:ligatures w14:val="none"/>
         </w:rPr>
         <w:drawing>
-          <wp:inline distT="0" distB="0" distL="0" distR="0" wp14:anchorId="1BD1060D" wp14:editId="3CE1ED00">
+          <wp:inline distT="0" distB="0" distL="0" distR="0" wp14:anchorId="6B4D1221" wp14:editId="06BD77A0">
             <wp:extent cx="5486400" cy="2743200"/>
             <wp:effectExtent l="0" t="0" r="0" b="0"/>
             <wp:docPr id="13" name="Chart 13"/>
@@ -4106,7 +4106,7 @@
           <w14:ligatures w14:val="none"/>
         </w:rPr>
         <w:drawing>
-          <wp:inline distT="0" distB="0" distL="0" distR="0" wp14:anchorId="424DEF64" wp14:editId="42E5B9BA">
+          <wp:inline distT="0" distB="0" distL="0" distR="0" wp14:anchorId="2DA2DD83" wp14:editId="5C18C0C2">
             <wp:extent cx="5486400" cy="3200400"/>
             <wp:effectExtent l="0" t="0" r="0" b="0"/>
             <wp:docPr id="1278438351" name="Chart 4"/>
@@ -4173,35 +4173,75 @@
         </w:rPr>
         <w:t>To summarize the results of this assessment, OrbitalFire has grouped all findings from the penetration test into rollup findings. These rollup findings can be used to quickly determine the root cause of all issues identified in this assessment. It is highly recommended to implement a remediation strategy based on the rollup findings below to enhance security posture and overall defensibility.</w:t>
       </w:r>
-      <w:r>
-        <w:rPr>
-          <w:rFonts w:ascii="Corbel" w:eastAsia="Calibri" w:hAnsi="Corbel" w:cs="Arial"/>
-          <w:color w:val="404040"/>
-          <w:kern w:val="0"/>
-          <w:szCs w:val="22"/>
-          <w14:ligatures w14:val="none"/>
-        </w:rPr>
-        <w:br w:type="page"/>
-      </w:r>
-    </w:p>
-    <w:p>
-      <w:pPr/>
+    </w:p>
+    <w:p>
       <w:r>
         <w:rPr>
           <w:rFonts w:ascii="Corbel" w:hAnsi="Corbel"/>
           <w:b/>
           <w:sz w:val="26"/>
         </w:rPr>
-        <w:t>Configuration Deficiencies</w:t>
+        <w:t>CONFIGURATION DEFICIENCIES</w:t>
       </w:r>
     </w:p>
     <w:p>
       <w:r>
         <w:rPr>
           <w:rFonts w:ascii="Corbel" w:hAnsi="Corbel"/>
-          <w:sz w:val="24"/>
         </w:rPr>
         <w:t>Configuration weaknesses were identified that could potentially lead to a successful compromise of systems and/or data within the tested environment. Although some of the configuration weaknesses may be exploitable in limited circumstances, the potential impact of a successful attack could be relatively high.</w:t>
+      </w:r>
+    </w:p>
+    <w:p>
+      <w:r>
+        <w:rPr>
+          <w:rFonts w:ascii="Corbel" w:hAnsi="Corbel"/>
+          <w:b/>
+          <w:sz w:val="26"/>
+        </w:rPr>
+        <w:t>INGRESS FILTERING DEFICIENCIES</w:t>
+      </w:r>
+    </w:p>
+    <w:p>
+      <w:r>
+        <w:rPr>
+          <w:rFonts w:ascii="Corbel" w:hAnsi="Corbel"/>
+        </w:rPr>
+        <w:t>The organization's network firewalls allow an excessive amount of access to services within the internal, trusted network environment. This excessive access could potentially expose the organization to attacks that are accessible due to unnecessary or misconfigured access. Services on the internal network should only be accessible to individuals and computer systems that are considered "trusted" such as through a Virtual Private Network (VPN) along with appropriate access controls.</w:t>
+      </w:r>
+    </w:p>
+    <w:p>
+      <w:pPr>
+        <w:spacing w:line="259" w:lineRule="auto"/>
+        <w:rPr>
+          <w:rFonts w:ascii="Corbel" w:eastAsia="Calibri" w:hAnsi="Corbel" w:cs="Arial"/>
+          <w:color w:val="404040"/>
+          <w:kern w:val="0"/>
+          <w:szCs w:val="22"/>
+          <w14:ligatures w14:val="none"/>
+        </w:rPr>
+      </w:pPr>
+    </w:p>
+    <w:p>
+      <w:pPr>
+        <w:spacing w:line="259" w:lineRule="auto"/>
+        <w:rPr>
+          <w:rFonts w:ascii="Corbel" w:eastAsia="Calibri" w:hAnsi="Corbel" w:cs="Arial"/>
+          <w:color w:val="404040"/>
+          <w:kern w:val="0"/>
+          <w:szCs w:val="22"/>
+          <w14:ligatures w14:val="none"/>
+        </w:rPr>
+      </w:pPr>
+      <w:r>
+        <w:rPr>
+          <w:rFonts w:ascii="Corbel" w:eastAsia="Calibri" w:hAnsi="Corbel" w:cs="Arial"/>
+          <w:color w:val="404040"/>
+          <w:kern w:val="0"/>
+          <w:szCs w:val="22"/>
+          <w14:ligatures w14:val="none"/>
+        </w:rPr>
+        <w:br w:type="page"/>
       </w:r>
     </w:p>
     <w:p>
@@ -4449,7 +4489,7 @@
           <w14:ligatures w14:val="none"/>
         </w:rPr>
         <w:drawing>
-          <wp:inline distT="0" distB="0" distL="0" distR="0" wp14:anchorId="0212EBB7" wp14:editId="2AE98879">
+          <wp:inline distT="0" distB="0" distL="0" distR="0" wp14:anchorId="3CA7A7F8" wp14:editId="06E3B89A">
             <wp:extent cx="5650861" cy="1682504"/>
             <wp:effectExtent l="0" t="0" r="7620" b="0"/>
             <wp:docPr id="292149150" name="Picture 1"/>
@@ -4530,7 +4570,7 @@
           <w14:ligatures w14:val="none"/>
         </w:rPr>
         <w:drawing>
-          <wp:inline distT="0" distB="0" distL="0" distR="0" wp14:anchorId="5C255E41" wp14:editId="209DBB5B">
+          <wp:inline distT="0" distB="0" distL="0" distR="0" wp14:anchorId="692DA7D0" wp14:editId="178BB56D">
             <wp:extent cx="5631126" cy="2463539"/>
             <wp:effectExtent l="0" t="0" r="8255" b="0"/>
             <wp:docPr id="1553660219" name="Picture 4"/>
@@ -5455,6 +5495,7 @@
         <w:rPr>
           <w:sz w:val="17"/>
         </w:rPr>
+        <w:lastRenderedPageBreak/>
         <w:t>2026-01-29 14:02:03-0500PM ET host discovery Discovery module completed.</w:t>
       </w:r>
     </w:p>
@@ -5796,6 +5837,7 @@
         <w:rPr>
           <w:sz w:val="17"/>
         </w:rPr>
+        <w:lastRenderedPageBreak/>
         <w:t>2026-01-29 14:05:50-0500PM ET enumeration Completed nmap script scan using script: ssl-heartbleed.</w:t>
       </w:r>
     </w:p>
@@ -6137,6 +6179,7 @@
         <w:rPr>
           <w:sz w:val="17"/>
         </w:rPr>
+        <w:lastRenderedPageBreak/>
         <w:t>2026-01-29 14:08:13-0500PM ET enumeration Analyzing web services running on port 443/tcp.</w:t>
       </w:r>
     </w:p>
@@ -6351,7 +6394,7 @@
           <w14:ligatures w14:val="none"/>
         </w:rPr>
         <w:drawing>
-          <wp:inline distT="0" distB="0" distL="0" distR="0" wp14:anchorId="5E29606F" wp14:editId="74655C03">
+          <wp:inline distT="0" distB="0" distL="0" distR="0" wp14:anchorId="65BBC86C" wp14:editId="7004CF6B">
             <wp:extent cx="152400" cy="152400"/>
             <wp:effectExtent l="0" t="0" r="0" b="0"/>
             <wp:docPr id="89909448" name="Picture 89909448" descr="Fire with solid fill"/>
@@ -6434,7 +6477,7 @@
           <w14:ligatures w14:val="none"/>
         </w:rPr>
         <w:drawing>
-          <wp:inline distT="0" distB="0" distL="0" distR="0" wp14:anchorId="6F87C930" wp14:editId="4F564BAC">
+          <wp:inline distT="0" distB="0" distL="0" distR="0" wp14:anchorId="03962334" wp14:editId="74A26A44">
             <wp:extent cx="152400" cy="152400"/>
             <wp:effectExtent l="0" t="0" r="0" b="0"/>
             <wp:docPr id="2011428596" name="Picture 2011428596" descr="Fire with solid fill"/>
@@ -6539,10 +6582,282 @@
     </w:p>
     <w:p>
       <w:pPr>
-        <w:numPr>
-          <w:ilvl w:val="0"/>
-          <w:numId w:val="14"/>
-        </w:numPr>
+        <w:spacing w:after="0"/>
+        <w:ind w:left="576" w:hanging="288"/>
+      </w:pPr>
+      <w:r>
+        <w:rPr>
+          <w:rFonts w:ascii="Corbel" w:hAnsi="Corbel"/>
+        </w:rPr>
+        <w:t>1. Remediate Subdomain Takeover Exposure – Identify and remove misconfigured or stale DNS records that reference unclaimed or deprovisioned third-party services. Conduct a comprehensive review of all DNS entries to ensure they accurately map to active, authorized resources, and implement continuous monitoring to detect future misconfigurations. Where applicable, apply DNS security best practices such as DNSSEC and maintain proper lifecycle management of external service integrations to prevent unauthorized subdomain claims.</w:t>
+      </w:r>
+    </w:p>
+    <w:p>
+      <w:pPr>
+        <w:spacing w:after="120"/>
+        <w:ind w:left="576"/>
+      </w:pPr>
+      <w:r>
+        <w:rPr>
+          <w:rFonts w:ascii="Corbel" w:hAnsi="Corbel"/>
+          <w:u w:val="single"/>
+        </w:rPr>
+        <w:t>Refer to High Finding 1</w:t>
+      </w:r>
+    </w:p>
+    <w:p>
+      <w:pPr>
+        <w:spacing w:after="0"/>
+        <w:ind w:left="576" w:hanging="288"/>
+      </w:pPr>
+      <w:r>
+        <w:rPr>
+          <w:rFonts w:ascii="Corbel" w:hAnsi="Corbel"/>
+        </w:rPr>
+        <w:t>2. Disable or Restrice Access to Services - Disable the specified services on the public internet in favor of a Virtual Private Network (VPN) solution that requires two-factor authentication (2FA). If services are absolutely required for business operations, then it is recommended to restrict access to specific IP addresses whilst implementing whitelist configurations.</w:t>
+      </w:r>
+    </w:p>
+    <w:p>
+      <w:pPr>
+        <w:spacing w:after="120"/>
+        <w:ind w:left="576"/>
+      </w:pPr>
+      <w:r>
+        <w:rPr>
+          <w:rFonts w:ascii="Corbel" w:hAnsi="Corbel"/>
+          <w:u w:val="single"/>
+        </w:rPr>
+        <w:t>Refer to High Finding 2</w:t>
+      </w:r>
+    </w:p>
+    <w:p>
+      <w:pPr>
+        <w:spacing w:after="0"/>
+        <w:ind w:left="576" w:hanging="288"/>
+      </w:pPr>
+      <w:r>
+        <w:rPr>
+          <w:rFonts w:ascii="Corbel" w:hAnsi="Corbel"/>
+        </w:rPr>
+        <w:t>3. Disable or Restrice Access to Services - Disable the specified services on the public internet in favor of a Virtual Private Network (VPN) solution that requires two-factor authentication (2FA). If services are absolutely required for business operations, then it is recommended to restrict access to specific IP addresses whilst implementing whitelist configurations.</w:t>
+      </w:r>
+    </w:p>
+    <w:p>
+      <w:pPr>
+        <w:spacing w:after="120"/>
+        <w:ind w:left="576"/>
+      </w:pPr>
+      <w:r>
+        <w:rPr>
+          <w:rFonts w:ascii="Corbel" w:hAnsi="Corbel"/>
+          <w:u w:val="single"/>
+        </w:rPr>
+        <w:t>Refer to High Finding 3</w:t>
+      </w:r>
+    </w:p>
+    <w:p>
+      <w:pPr>
+        <w:spacing w:after="0"/>
+        <w:ind w:left="576" w:hanging="288"/>
+      </w:pPr>
+      <w:r>
+        <w:rPr>
+          <w:rFonts w:ascii="Corbel" w:hAnsi="Corbel"/>
+        </w:rPr>
+        <w:t>4. Disable or Replace SMTP – Disable the SMTP service if it is not required for business operations. If email transmission is necessary, replace or configure SMTP to use a secure alternative such as SMTPS (SMTP over SSL/TLS) or STARTTLS to ensure that user credentials and email content are encrypted during transmission.</w:t>
+      </w:r>
+    </w:p>
+    <w:p>
+      <w:pPr>
+        <w:spacing w:after="120"/>
+        <w:ind w:left="576"/>
+      </w:pPr>
+      <w:r>
+        <w:rPr>
+          <w:rFonts w:ascii="Corbel" w:hAnsi="Corbel"/>
+          <w:u w:val="single"/>
+        </w:rPr>
+        <w:t>Refer to Medium Finding 4</w:t>
+      </w:r>
+    </w:p>
+    <w:p>
+      <w:pPr>
+        <w:spacing w:after="0"/>
+        <w:ind w:left="576" w:hanging="288"/>
+      </w:pPr>
+      <w:r>
+        <w:rPr>
+          <w:rFonts w:ascii="Corbel" w:hAnsi="Corbel"/>
+        </w:rPr>
+        <w:lastRenderedPageBreak/>
+        <w:t>5. Establish DMARC Record – Create and publish a properly configured DMARC record for all organizational domains. The policy should be explicitly defined and initially set to “none” for monitoring purposes, then transitioned to “quarantine” or “reject” once SPF and DKIM are validated.</w:t>
+      </w:r>
+    </w:p>
+    <w:p>
+      <w:pPr>
+        <w:spacing w:after="120"/>
+        <w:ind w:left="576"/>
+      </w:pPr>
+      <w:r>
+        <w:rPr>
+          <w:rFonts w:ascii="Corbel" w:hAnsi="Corbel"/>
+          <w:u w:val="single"/>
+        </w:rPr>
+        <w:t>Refer to Medium Finding 5</w:t>
+      </w:r>
+    </w:p>
+    <w:p>
+      <w:pPr>
+        <w:spacing w:after="0"/>
+        <w:ind w:left="576" w:hanging="288"/>
+      </w:pPr>
+      <w:r>
+        <w:rPr>
+          <w:rFonts w:ascii="Corbel" w:hAnsi="Corbel"/>
+        </w:rPr>
+        <w:t>6. Reconfigure DMARC Record –  Review and rectify the current DMARC record configuration. The DMARC policy should be explicitly defined, ideally set to "quarantine" or "reject," which directs receiving mail servers on the proper handling of unauthenticated messages.</w:t>
+      </w:r>
+    </w:p>
+    <w:p>
+      <w:pPr>
+        <w:spacing w:after="120"/>
+        <w:ind w:left="576"/>
+      </w:pPr>
+      <w:r>
+        <w:rPr>
+          <w:rFonts w:ascii="Corbel" w:hAnsi="Corbel"/>
+          <w:u w:val="single"/>
+        </w:rPr>
+        <w:t>Refer to Medium Finding 6</w:t>
+      </w:r>
+    </w:p>
+    <w:p>
+      <w:pPr>
+        <w:spacing w:after="0"/>
+        <w:ind w:left="576" w:hanging="288"/>
+      </w:pPr>
+      <w:r>
+        <w:rPr>
+          <w:rFonts w:ascii="Corbel" w:hAnsi="Corbel"/>
+        </w:rPr>
+        <w:t>7. Restrict Access to Remote SSH – Restrict access from the public Internet. Ensure that the Remote SSH service is only reachable through secure environments, such as a Virtual Private Network (VPN) or specific authorized IP address configurations.</w:t>
+      </w:r>
+    </w:p>
+    <w:p>
+      <w:pPr>
+        <w:spacing w:after="120"/>
+        <w:ind w:left="576"/>
+      </w:pPr>
+      <w:r>
+        <w:rPr>
+          <w:rFonts w:ascii="Corbel" w:hAnsi="Corbel"/>
+          <w:u w:val="single"/>
+        </w:rPr>
+        <w:t>Refer to Medium Finding 7</w:t>
+      </w:r>
+    </w:p>
+    <w:p>
+      <w:pPr>
+        <w:spacing w:after="0"/>
+        <w:ind w:left="576" w:hanging="288"/>
+      </w:pPr>
+      <w:r>
+        <w:rPr>
+          <w:rFonts w:ascii="Corbel" w:hAnsi="Corbel"/>
+        </w:rPr>
+        <w:t>8. Restrict Public Access to FortiGate Management Interface – Remove Internet-facing access to the FortiGate login interface and restrict management access to trusted networks only. Implement controls such as VPN access, IP allowlisting, and multi-factor authentication (MFA) to secure administrative access.</w:t>
+      </w:r>
+    </w:p>
+    <w:p>
+      <w:pPr>
+        <w:spacing w:after="120"/>
+        <w:ind w:left="576"/>
+      </w:pPr>
+      <w:r>
+        <w:rPr>
+          <w:rFonts w:ascii="Corbel" w:hAnsi="Corbel"/>
+          <w:u w:val="single"/>
+        </w:rPr>
+        <w:t>Refer to Medium Finding 8</w:t>
+      </w:r>
+    </w:p>
+    <w:p>
+      <w:pPr>
+        <w:spacing w:after="0"/>
+        <w:ind w:left="576" w:hanging="288"/>
+      </w:pPr>
+      <w:r>
+        <w:rPr>
+          <w:rFonts w:ascii="Corbel" w:hAnsi="Corbel"/>
+        </w:rPr>
+        <w:t>9. Disable or Replace File Transfer Protocol (FTP) - Disable File Transfer Protocol (FTP) if it is not required for business operations. If transferring files is necessary, consider implementing Secure File Transfer Protocol (SFTP) which uses encryption during communications to/from SFTP clients.</w:t>
+      </w:r>
+    </w:p>
+    <w:p>
+      <w:pPr>
+        <w:spacing w:after="120"/>
+        <w:ind w:left="576"/>
+      </w:pPr>
+      <w:r>
+        <w:rPr>
+          <w:rFonts w:ascii="Corbel" w:hAnsi="Corbel"/>
+          <w:u w:val="single"/>
+        </w:rPr>
+        <w:t>Refer to Medium Finding 9</w:t>
+      </w:r>
+    </w:p>
+    <w:p>
+      <w:pPr>
+        <w:spacing w:after="0"/>
+        <w:ind w:left="576" w:hanging="288"/>
+      </w:pPr>
+      <w:r>
+        <w:rPr>
+          <w:rFonts w:ascii="Corbel" w:hAnsi="Corbel"/>
+        </w:rPr>
+        <w:t>10. Disable or Replace Post Office Protocol (POP3) – Disable Post Office Protocol (POP3) if it is not required for business operations. If transferring files is necessary, consider implementing Secure POP3 (POP3S) which uses encryption during communications to/from email clients.</w:t>
+      </w:r>
+    </w:p>
+    <w:p>
+      <w:pPr>
+        <w:spacing w:after="120"/>
+        <w:ind w:left="576"/>
+      </w:pPr>
+      <w:r>
+        <w:rPr>
+          <w:rFonts w:ascii="Corbel" w:hAnsi="Corbel"/>
+          <w:u w:val="single"/>
+        </w:rPr>
+        <w:t>Refer to Medium Finding 10</w:t>
+      </w:r>
+    </w:p>
+    <w:p>
+      <w:pPr>
+        <w:spacing w:after="0"/>
+        <w:ind w:left="576" w:hanging="288"/>
+      </w:pPr>
+      <w:r>
+        <w:rPr>
+          <w:rFonts w:ascii="Corbel" w:hAnsi="Corbel"/>
+        </w:rPr>
+        <w:t>11. Enforce SSL/TLS – Enforce SSL/TLS when accepting authentication credentials.</w:t>
+      </w:r>
+    </w:p>
+    <w:p>
+      <w:pPr>
+        <w:spacing w:after="120"/>
+        <w:ind w:left="576"/>
+      </w:pPr>
+      <w:r>
+        <w:rPr>
+          <w:rFonts w:ascii="Corbel" w:hAnsi="Corbel"/>
+          <w:u w:val="single"/>
+        </w:rPr>
+        <w:t>Refer to Medium Finding 11</w:t>
+      </w:r>
+    </w:p>
+    <w:p>
+      <w:pPr>
         <w:spacing w:line="259" w:lineRule="auto"/>
         <w:contextualSpacing/>
         <w:rPr>
@@ -6553,111 +6868,6 @@
           <w14:ligatures w14:val="none"/>
         </w:rPr>
       </w:pPr>
-      <w:r>
-        <w:rPr>
-          <w:rFonts w:ascii="Corbel" w:eastAsia="Calibri" w:hAnsi="Corbel" w:cs="Arial"/>
-          <w:b/>
-          <w:bCs/>
-          <w:noProof/>
-          <w:color w:val="404040"/>
-          <w:kern w:val="0"/>
-          <w:szCs w:val="22"/>
-          <w:highlight w:val="yellow"/>
-          <w14:ligatures w14:val="none"/>
-        </w:rPr>
-        <w:drawing>
-          <wp:inline distT="0" distB="0" distL="0" distR="0" wp14:anchorId="342E3817" wp14:editId="6C2AA41E">
-            <wp:extent cx="152400" cy="152400"/>
-            <wp:effectExtent l="0" t="0" r="0" b="0"/>
-            <wp:docPr id="1539496457" name="Picture 4"/>
-            <wp:cNvGraphicFramePr>
-              <a:graphicFrameLocks xmlns:a="http://schemas.openxmlformats.org/drawingml/2006/main" noChangeAspect="1"/>
-            </wp:cNvGraphicFramePr>
-            <a:graphic xmlns:a="http://schemas.openxmlformats.org/drawingml/2006/main">
-              <a:graphicData uri="http://schemas.openxmlformats.org/drawingml/2006/picture">
-                <pic:pic xmlns:pic="http://schemas.openxmlformats.org/drawingml/2006/picture">
-                  <pic:nvPicPr>
-                    <pic:cNvPr id="0" name="Picture 2"/>
-                    <pic:cNvPicPr>
-                      <a:picLocks noChangeAspect="1" noChangeArrowheads="1"/>
-                    </pic:cNvPicPr>
-                  </pic:nvPicPr>
-                  <pic:blipFill>
-                    <a:blip r:embed="rId19">
-                      <a:extLst>
-                        <a:ext uri="{28A0092B-C50C-407E-A947-70E740481C1C}">
-                          <a14:useLocalDpi xmlns:a14="http://schemas.microsoft.com/office/drawing/2010/main" val="0"/>
-                        </a:ext>
-                      </a:extLst>
-                    </a:blip>
-                    <a:srcRect/>
-                    <a:stretch>
-                      <a:fillRect/>
-                    </a:stretch>
-                  </pic:blipFill>
-                  <pic:spPr bwMode="auto">
-                    <a:xfrm>
-                      <a:off x="0" y="0"/>
-                      <a:ext cx="152400" cy="152400"/>
-                    </a:xfrm>
-                    <a:prstGeom prst="rect">
-                      <a:avLst/>
-                    </a:prstGeom>
-                    <a:noFill/>
-                  </pic:spPr>
-                </pic:pic>
-              </a:graphicData>
-            </a:graphic>
-          </wp:inline>
-        </w:drawing>
-      </w:r>
-      <w:r>
-        <w:rPr>
-          <w:rFonts w:ascii="Corbel" w:eastAsia="Calibri" w:hAnsi="Corbel" w:cs="Arial"/>
-          <w:b/>
-          <w:bCs/>
-          <w:color w:val="404040"/>
-          <w:kern w:val="0"/>
-          <w:szCs w:val="22"/>
-          <w:highlight w:val="yellow"/>
-          <w14:ligatures w14:val="none"/>
-        </w:rPr>
-        <w:t xml:space="preserve"> Disable SMB Service –</w:t>
-      </w:r>
-      <w:r>
-        <w:rPr>
-          <w:rFonts w:ascii="Corbel" w:eastAsia="Calibri" w:hAnsi="Corbel" w:cs="Arial"/>
-          <w:color w:val="404040"/>
-          <w:kern w:val="0"/>
-          <w:szCs w:val="22"/>
-          <w:highlight w:val="yellow"/>
-          <w14:ligatures w14:val="none"/>
-        </w:rPr>
-        <w:t xml:space="preserve"> Disable SMB service if not required for business operations. If SMB service is necessary, disable NULL session authentication and enforce a robust authentication mechanism that utilizes complex passwords to strengthen access controls.</w:t>
-      </w:r>
-      <w:r>
-        <w:rPr>
-          <w:rFonts w:ascii="Corbel" w:eastAsia="Calibri" w:hAnsi="Corbel" w:cs="Arial"/>
-          <w:color w:val="404040"/>
-          <w:kern w:val="0"/>
-          <w:szCs w:val="22"/>
-          <w:highlight w:val="yellow"/>
-          <w14:ligatures w14:val="none"/>
-        </w:rPr>
-        <w:br/>
-      </w:r>
-      <w:r>
-        <w:rPr>
-          <w:rFonts w:ascii="Corbel" w:eastAsia="Calibri" w:hAnsi="Corbel" w:cs="Arial"/>
-          <w:color w:val="404040"/>
-          <w:kern w:val="0"/>
-          <w:szCs w:val="22"/>
-          <w:highlight w:val="yellow"/>
-          <w:u w:val="single"/>
-          <w14:ligatures w14:val="none"/>
-        </w:rPr>
-        <w:t>Refer to Medium Finding 1</w:t>
-      </w:r>
       <w:r>
         <w:rPr>
           <w:rFonts w:ascii="Corbel" w:eastAsia="Calibri" w:hAnsi="Corbel" w:cs="Arial"/>
@@ -6994,7 +7204,7 @@
             <w:color w:val="A6A6A6"/>
             <w:spacing w:val="60"/>
           </w:rPr>
-          <w:pict w14:anchorId="533686E0">
+          <w:pict w14:anchorId="7F64FCCE">
             <v:shapetype id="_x0000_t136" coordsize="21600,21600" o:spt="136" adj="10800" path="m@7,l@8,m@5,21600l@6,21600e">
               <v:formulas>
                 <v:f eqn="sum #0 0 10800"/>

</xml_diff>

<commit_message>
Updated GUI to include new functionalities such as Assessment Results and Recommendations
</commit_message>
<xml_diff>
--- a/Source_Code/Reports/Sample499/FindingsReportTest.docx
+++ b/Source_Code/Reports/Sample499/FindingsReportTest.docx
@@ -601,7 +601,7 @@
           <w14:ligatures w14:val="none"/>
         </w:rPr>
         <w:drawing>
-          <wp:anchor distT="0" distB="0" distL="114300" distR="114300" simplePos="0" relativeHeight="251662336" behindDoc="0" locked="0" layoutInCell="1" allowOverlap="1" wp14:anchorId="56FF54E8" wp14:editId="15D39BE8">
+          <wp:anchor distT="0" distB="0" distL="114300" distR="114300" simplePos="0" relativeHeight="251662336" behindDoc="0" locked="0" layoutInCell="1" allowOverlap="1" wp14:anchorId="56FF54E8" wp14:editId="33191126">
             <wp:simplePos x="0" y="0"/>
             <wp:positionH relativeFrom="margin">
               <wp:posOffset>1163955</wp:posOffset>
@@ -1125,7 +1125,31 @@
           <w:szCs w:val="22"/>
           <w14:ligatures w14:val="none"/>
         </w:rPr>
-        <w:t>contained in this document is confidential and proprietary. It is intended for the exclusive use of OrbitalFire, LLC and the Customer entity named in this document.</w:t>
+        <w:t xml:space="preserve">contained in this document is confidential and proprietary. It is intended for the exclusive use of </w:t>
+      </w:r>
+      <w:proofErr w:type="spellStart"/>
+      <w:r>
+        <w:rPr>
+          <w:rFonts w:ascii="Corbel" w:eastAsia="Calibri" w:hAnsi="Corbel" w:cs="Arial"/>
+          <w:snapToGrid w:val="0"/>
+          <w:color w:val="404040"/>
+          <w:kern w:val="0"/>
+          <w:szCs w:val="22"/>
+          <w14:ligatures w14:val="none"/>
+        </w:rPr>
+        <w:t>OrbitalFire</w:t>
+      </w:r>
+      <w:proofErr w:type="spellEnd"/>
+      <w:r>
+        <w:rPr>
+          <w:rFonts w:ascii="Corbel" w:eastAsia="Calibri" w:hAnsi="Corbel" w:cs="Arial"/>
+          <w:snapToGrid w:val="0"/>
+          <w:color w:val="404040"/>
+          <w:kern w:val="0"/>
+          <w:szCs w:val="22"/>
+          <w14:ligatures w14:val="none"/>
+        </w:rPr>
+        <w:t>, LLC and the Customer entity named in this document.</w:t>
       </w:r>
     </w:p>
     <w:p>
@@ -1945,7 +1969,51 @@
           <w:szCs w:val="22"/>
           <w14:ligatures w14:val="none"/>
         </w:rPr>
-        <w:t>In 2015, Ponemon Institute conducted a study on the cost of data breaches that surveyed 350 organizations from 11 different countries that had suffered some type of cybercrime. Nearly half of said these incidents (47%) were the result of malicious actors who were able to compromise company networks to steal money, intellectual property or other protected data.</w:t>
+        <w:t xml:space="preserve">In 2015, </w:t>
+      </w:r>
+      <w:proofErr w:type="spellStart"/>
+      <w:r>
+        <w:rPr>
+          <w:rFonts w:ascii="Corbel" w:eastAsia="Calibri" w:hAnsi="Corbel" w:cs="Arial"/>
+          <w:color w:val="404040"/>
+          <w:kern w:val="0"/>
+          <w:szCs w:val="22"/>
+          <w14:ligatures w14:val="none"/>
+        </w:rPr>
+        <w:t>Ponemon</w:t>
+      </w:r>
+      <w:proofErr w:type="spellEnd"/>
+      <w:r>
+        <w:rPr>
+          <w:rFonts w:ascii="Corbel" w:eastAsia="Calibri" w:hAnsi="Corbel" w:cs="Arial"/>
+          <w:color w:val="404040"/>
+          <w:kern w:val="0"/>
+          <w:szCs w:val="22"/>
+          <w14:ligatures w14:val="none"/>
+        </w:rPr>
+        <w:t xml:space="preserve"> Institute conducted a study on the cost of data breaches that surveyed 350 organizations from 11 different countries that had suffered some type of cybercrime. Nearly half </w:t>
+      </w:r>
+      <w:proofErr w:type="gramStart"/>
+      <w:r>
+        <w:rPr>
+          <w:rFonts w:ascii="Corbel" w:eastAsia="Calibri" w:hAnsi="Corbel" w:cs="Arial"/>
+          <w:color w:val="404040"/>
+          <w:kern w:val="0"/>
+          <w:szCs w:val="22"/>
+          <w14:ligatures w14:val="none"/>
+        </w:rPr>
+        <w:t>of</w:t>
+      </w:r>
+      <w:proofErr w:type="gramEnd"/>
+      <w:r>
+        <w:rPr>
+          <w:rFonts w:ascii="Corbel" w:eastAsia="Calibri" w:hAnsi="Corbel" w:cs="Arial"/>
+          <w:color w:val="404040"/>
+          <w:kern w:val="0"/>
+          <w:szCs w:val="22"/>
+          <w14:ligatures w14:val="none"/>
+        </w:rPr>
+        <w:t xml:space="preserve"> said these incidents (47%) were the result of malicious actors who were able to compromise company networks to steal money, intellectual property or other protected data.</w:t>
       </w:r>
     </w:p>
     <w:p>
@@ -3673,7 +3741,29 @@
           <w:szCs w:val="22"/>
           <w14:ligatures w14:val="none"/>
         </w:rPr>
-        <w:t xml:space="preserve"> that was provided as part of scope, OrbitalFire was able to identify a total of </w:t>
+        <w:t xml:space="preserve"> that was provided as part of scope, </w:t>
+      </w:r>
+      <w:proofErr w:type="spellStart"/>
+      <w:r>
+        <w:rPr>
+          <w:rFonts w:ascii="Corbel" w:eastAsia="Calibri" w:hAnsi="Corbel" w:cs="Arial"/>
+          <w:color w:val="404040"/>
+          <w:kern w:val="0"/>
+          <w:szCs w:val="22"/>
+          <w14:ligatures w14:val="none"/>
+        </w:rPr>
+        <w:t>OrbitalFire</w:t>
+      </w:r>
+      <w:proofErr w:type="spellEnd"/>
+      <w:r>
+        <w:rPr>
+          <w:rFonts w:ascii="Corbel" w:eastAsia="Calibri" w:hAnsi="Corbel" w:cs="Arial"/>
+          <w:color w:val="404040"/>
+          <w:kern w:val="0"/>
+          <w:szCs w:val="22"/>
+          <w14:ligatures w14:val="none"/>
+        </w:rPr>
+        <w:t xml:space="preserve"> was able to identify a total of </w:t>
       </w:r>
       <w:r>
         <w:rPr>
@@ -3715,7 +3805,29 @@
           <w:szCs w:val="22"/>
           <w14:ligatures w14:val="none"/>
         </w:rPr>
-        <w:t xml:space="preserve"> addresses that were scanned, OrbitalFire found </w:t>
+        <w:t xml:space="preserve"> addresses that were scanned, </w:t>
+      </w:r>
+      <w:proofErr w:type="spellStart"/>
+      <w:r>
+        <w:rPr>
+          <w:rFonts w:ascii="Corbel" w:eastAsia="Calibri" w:hAnsi="Corbel" w:cs="Arial"/>
+          <w:color w:val="404040"/>
+          <w:kern w:val="0"/>
+          <w:szCs w:val="22"/>
+          <w14:ligatures w14:val="none"/>
+        </w:rPr>
+        <w:t>OrbitalFire</w:t>
+      </w:r>
+      <w:proofErr w:type="spellEnd"/>
+      <w:r>
+        <w:rPr>
+          <w:rFonts w:ascii="Corbel" w:eastAsia="Calibri" w:hAnsi="Corbel" w:cs="Arial"/>
+          <w:color w:val="404040"/>
+          <w:kern w:val="0"/>
+          <w:szCs w:val="22"/>
+          <w14:ligatures w14:val="none"/>
+        </w:rPr>
+        <w:t xml:space="preserve"> found </w:t>
       </w:r>
       <w:r>
         <w:rPr>
@@ -3781,7 +3893,29 @@
           <w:szCs w:val="22"/>
           <w14:ligatures w14:val="none"/>
         </w:rPr>
-        <w:t>After the identification of all available hosts within the network, OrbitalFire then conducted enumeration. Enumeration during this assessment consisted of scanning the identified ports to determine which services are running (if any). Additional scans were then performed based on running services to attempt enumerating information (if possible).</w:t>
+        <w:t xml:space="preserve">After the identification of all available hosts within the network, </w:t>
+      </w:r>
+      <w:proofErr w:type="spellStart"/>
+      <w:r>
+        <w:rPr>
+          <w:rFonts w:ascii="Corbel" w:eastAsia="Calibri" w:hAnsi="Corbel" w:cs="Arial"/>
+          <w:color w:val="404040"/>
+          <w:kern w:val="0"/>
+          <w:szCs w:val="22"/>
+          <w14:ligatures w14:val="none"/>
+        </w:rPr>
+        <w:t>OrbitalFire</w:t>
+      </w:r>
+      <w:proofErr w:type="spellEnd"/>
+      <w:r>
+        <w:rPr>
+          <w:rFonts w:ascii="Corbel" w:eastAsia="Calibri" w:hAnsi="Corbel" w:cs="Arial"/>
+          <w:color w:val="404040"/>
+          <w:kern w:val="0"/>
+          <w:szCs w:val="22"/>
+          <w14:ligatures w14:val="none"/>
+        </w:rPr>
+        <w:t xml:space="preserve"> then conducted enumeration. Enumeration during this assessment consisted of scanning the identified ports to determine which services are running (if any). Additional scans were then performed based on running services to attempt enumerating information (if possible).</w:t>
       </w:r>
       <w:r>
         <w:rPr>
@@ -3835,7 +3969,51 @@
           <w:szCs w:val="22"/>
           <w14:ligatures w14:val="none"/>
         </w:rPr>
-        <w:t xml:space="preserve">Post enumeration, OrbitalFire focused strictly on the exploitation of any/all running services that were previously discovered. OrbitalFire used a comprehensive set of tools, custom scripts, and manual techniques to thoroughly identify possible threats to </w:t>
+        <w:t xml:space="preserve">Post enumeration, </w:t>
+      </w:r>
+      <w:proofErr w:type="spellStart"/>
+      <w:r>
+        <w:rPr>
+          <w:rFonts w:ascii="Corbel" w:eastAsia="Calibri" w:hAnsi="Corbel" w:cs="Arial"/>
+          <w:color w:val="404040"/>
+          <w:kern w:val="0"/>
+          <w:szCs w:val="22"/>
+          <w14:ligatures w14:val="none"/>
+        </w:rPr>
+        <w:t>OrbitalFire</w:t>
+      </w:r>
+      <w:proofErr w:type="spellEnd"/>
+      <w:r>
+        <w:rPr>
+          <w:rFonts w:ascii="Corbel" w:eastAsia="Calibri" w:hAnsi="Corbel" w:cs="Arial"/>
+          <w:color w:val="404040"/>
+          <w:kern w:val="0"/>
+          <w:szCs w:val="22"/>
+          <w14:ligatures w14:val="none"/>
+        </w:rPr>
+        <w:t xml:space="preserve"> focused strictly on the exploitation of any/all running services that were previously discovered. </w:t>
+      </w:r>
+      <w:proofErr w:type="spellStart"/>
+      <w:r>
+        <w:rPr>
+          <w:rFonts w:ascii="Corbel" w:eastAsia="Calibri" w:hAnsi="Corbel" w:cs="Arial"/>
+          <w:color w:val="404040"/>
+          <w:kern w:val="0"/>
+          <w:szCs w:val="22"/>
+          <w14:ligatures w14:val="none"/>
+        </w:rPr>
+        <w:t>OrbitalFire</w:t>
+      </w:r>
+      <w:proofErr w:type="spellEnd"/>
+      <w:r>
+        <w:rPr>
+          <w:rFonts w:ascii="Corbel" w:eastAsia="Calibri" w:hAnsi="Corbel" w:cs="Arial"/>
+          <w:color w:val="404040"/>
+          <w:kern w:val="0"/>
+          <w:szCs w:val="22"/>
+          <w14:ligatures w14:val="none"/>
+        </w:rPr>
+        <w:t xml:space="preserve"> used a comprehensive set of tools, custom scripts, and manual techniques to thoroughly identify possible threats to </w:t>
       </w:r>
       <w:r>
         <w:rPr>
@@ -3910,7 +4088,29 @@
           <w:szCs w:val="22"/>
           <w14:ligatures w14:val="none"/>
         </w:rPr>
-        <w:t>Once the exploitation phase was complete, OrbitalFire then tested and validated all identified threats to evaluate the depth of compromise.</w:t>
+        <w:t xml:space="preserve">Once the exploitation phase was complete, </w:t>
+      </w:r>
+      <w:proofErr w:type="spellStart"/>
+      <w:r>
+        <w:rPr>
+          <w:rFonts w:ascii="Corbel" w:eastAsia="Calibri" w:hAnsi="Corbel" w:cs="Arial"/>
+          <w:color w:val="404040"/>
+          <w:kern w:val="0"/>
+          <w:szCs w:val="22"/>
+          <w14:ligatures w14:val="none"/>
+        </w:rPr>
+        <w:t>OrbitalFire</w:t>
+      </w:r>
+      <w:proofErr w:type="spellEnd"/>
+      <w:r>
+        <w:rPr>
+          <w:rFonts w:ascii="Corbel" w:eastAsia="Calibri" w:hAnsi="Corbel" w:cs="Arial"/>
+          <w:color w:val="404040"/>
+          <w:kern w:val="0"/>
+          <w:szCs w:val="22"/>
+          <w14:ligatures w14:val="none"/>
+        </w:rPr>
+        <w:t xml:space="preserve"> then tested and validated all identified threats to evaluate the depth of compromise.</w:t>
       </w:r>
       <w:r>
         <w:rPr>
@@ -4171,7 +4371,29 @@
           <w:szCs w:val="22"/>
           <w14:ligatures w14:val="none"/>
         </w:rPr>
-        <w:t>To summarize the results of this assessment, OrbitalFire has grouped all findings from the penetration test into rollup findings. These rollup findings can be used to quickly determine the root cause of all issues identified in this assessment. It is highly recommended to implement a remediation strategy based on the rollup findings below to enhance security posture and overall defensibility.</w:t>
+        <w:t xml:space="preserve">To summarize the results of this assessment, </w:t>
+      </w:r>
+      <w:proofErr w:type="spellStart"/>
+      <w:r>
+        <w:rPr>
+          <w:rFonts w:ascii="Corbel" w:eastAsia="Calibri" w:hAnsi="Corbel" w:cs="Arial"/>
+          <w:color w:val="404040"/>
+          <w:kern w:val="0"/>
+          <w:szCs w:val="22"/>
+          <w14:ligatures w14:val="none"/>
+        </w:rPr>
+        <w:t>OrbitalFire</w:t>
+      </w:r>
+      <w:proofErr w:type="spellEnd"/>
+      <w:r>
+        <w:rPr>
+          <w:rFonts w:ascii="Corbel" w:eastAsia="Calibri" w:hAnsi="Corbel" w:cs="Arial"/>
+          <w:color w:val="404040"/>
+          <w:kern w:val="0"/>
+          <w:szCs w:val="22"/>
+          <w14:ligatures w14:val="none"/>
+        </w:rPr>
+        <w:t xml:space="preserve"> has grouped all findings from the penetration test into rollup findings. These rollup findings can be used to quickly determine the root cause of all issues identified in this assessment. It is highly recommended to implement a remediation strategy based on the rollup findings below to enhance security posture and overall defensibility.</w:t>
       </w:r>
     </w:p>
     <w:p>
@@ -5153,7 +5375,1189 @@
         <w:t>Automated Testing ACtivity</w:t>
       </w:r>
       <w:bookmarkEnd w:id="10"/>
-      <w:r>
+    </w:p>
+    <w:p>
+      <w:pPr>
+        <w:pStyle w:val="ActivityBullet"/>
+        <w:rPr>
+          <w:lang w:val="fr-FR"/>
+        </w:rPr>
+      </w:pPr>
+      <w:r>
+        <w:rPr>
+          <w:sz w:val="17"/>
+          <w:lang w:val="fr-FR"/>
+        </w:rPr>
+        <w:t>2026-01-29 13:52:47-0500PM ET exposurescout Initiating ExposureScout module.</w:t>
+      </w:r>
+    </w:p>
+    <w:p>
+      <w:pPr>
+        <w:pStyle w:val="ActivityBullet"/>
+      </w:pPr>
+      <w:r>
+        <w:rPr>
+          <w:sz w:val="17"/>
+        </w:rPr>
+        <w:t>2026-01-29 13:52:59-0500PM ET exposurescout Enumerating subdomains from one (1) domain.</w:t>
+      </w:r>
+    </w:p>
+    <w:p>
+      <w:pPr>
+        <w:pStyle w:val="ActivityBullet"/>
+        <w:rPr>
+          <w:lang w:val="fr-FR"/>
+        </w:rPr>
+      </w:pPr>
+      <w:r>
+        <w:rPr>
+          <w:sz w:val="17"/>
+          <w:lang w:val="fr-FR"/>
+        </w:rPr>
+        <w:t>2026-01-29 13:54:13-0500PM ET exposurescout Completed subdomain enumeration.</w:t>
+      </w:r>
+    </w:p>
+    <w:p>
+      <w:pPr>
+        <w:pStyle w:val="ActivityBullet"/>
+      </w:pPr>
+      <w:r>
+        <w:rPr>
+          <w:sz w:val="17"/>
+        </w:rPr>
+        <w:t>2026-01-29 13:54:13-0500PM ET exposurescout Beginning DNS enumeration.</w:t>
+      </w:r>
+    </w:p>
+    <w:p>
+      <w:pPr>
+        <w:pStyle w:val="ActivityBullet"/>
+        <w:rPr>
+          <w:lang w:val="fr-FR"/>
+        </w:rPr>
+      </w:pPr>
+      <w:r>
+        <w:rPr>
+          <w:sz w:val="17"/>
+          <w:lang w:val="fr-FR"/>
+        </w:rPr>
+        <w:t>2026-01-29 13:55:18-0500PM ET exposurescout Completed DNS enumeration.</w:t>
+      </w:r>
+    </w:p>
+    <w:p>
+      <w:pPr>
+        <w:pStyle w:val="ActivityBullet"/>
+      </w:pPr>
+      <w:r>
+        <w:rPr>
+          <w:sz w:val="17"/>
+        </w:rPr>
+        <w:t>2026-01-29 13:55:18-0500PM ET exposurescout Enumerating doppelganger domains for one (1) domain.</w:t>
+      </w:r>
+    </w:p>
+    <w:p>
+      <w:pPr>
+        <w:pStyle w:val="ActivityBullet"/>
+        <w:rPr>
+          <w:lang w:val="fr-FR"/>
+        </w:rPr>
+      </w:pPr>
+      <w:r>
+        <w:rPr>
+          <w:sz w:val="17"/>
+          <w:lang w:val="fr-FR"/>
+        </w:rPr>
+        <w:t>2026-01-29 13:56:28-0500PM ET exposurescout Ten (10) new doppelganger domains discovered.</w:t>
+      </w:r>
+    </w:p>
+    <w:p>
+      <w:pPr>
+        <w:pStyle w:val="ActivityBullet"/>
+        <w:rPr>
+          <w:lang w:val="fr-FR"/>
+        </w:rPr>
+      </w:pPr>
+      <w:r>
+        <w:rPr>
+          <w:sz w:val="17"/>
+          <w:lang w:val="fr-FR"/>
+        </w:rPr>
+        <w:t>2026-01-29 13:56:28-0500PM ET exposurescout Completed doppelganger domain enumeration.</w:t>
+      </w:r>
+    </w:p>
+    <w:p>
+      <w:pPr>
+        <w:pStyle w:val="ActivityBullet"/>
+      </w:pPr>
+      <w:r>
+        <w:rPr>
+          <w:sz w:val="17"/>
+        </w:rPr>
+        <w:t>2026-01-29 13:56:28-0500PM ET exposurescout Running WHOIS commands on eight (8) domains.</w:t>
+      </w:r>
+    </w:p>
+    <w:p>
+      <w:pPr>
+        <w:pStyle w:val="ActivityBullet"/>
+      </w:pPr>
+      <w:r>
+        <w:rPr>
+          <w:sz w:val="17"/>
+        </w:rPr>
+        <w:t>2026-01-29 13:57:33-0500PM ET exposurescout Importing eight (8) WHOIS results into the database.</w:t>
+      </w:r>
+    </w:p>
+    <w:p>
+      <w:pPr>
+        <w:pStyle w:val="ActivityBullet"/>
+      </w:pPr>
+      <w:r>
+        <w:rPr>
+          <w:sz w:val="17"/>
+        </w:rPr>
+        <w:t>2026-01-29 13:57:34-0500PM ET exposurescout Completed recursive WHOIS lookups</w:t>
+      </w:r>
+    </w:p>
+    <w:p>
+      <w:pPr>
+        <w:pStyle w:val="ActivityBullet"/>
+      </w:pPr>
+      <w:r>
+        <w:rPr>
+          <w:sz w:val="17"/>
+        </w:rPr>
+        <w:t>2026-01-29 13:57:34-0500PM ET exposurescout Email scraping module started.</w:t>
+      </w:r>
+    </w:p>
+    <w:p>
+      <w:pPr>
+        <w:pStyle w:val="ActivityBullet"/>
+      </w:pPr>
+      <w:r>
+        <w:rPr>
+          <w:sz w:val="17"/>
+        </w:rPr>
+        <w:t>2026-01-29 13:58:40-0500PM ET exposurescout Completed email scraping.</w:t>
+      </w:r>
+    </w:p>
+    <w:p>
+      <w:pPr>
+        <w:pStyle w:val="ActivityBullet"/>
+      </w:pPr>
+      <w:r>
+        <w:rPr>
+          <w:sz w:val="17"/>
+        </w:rPr>
+        <w:t>2026-01-29 13:58:40-0500PM ET exposurescout Scanning subdomains for subdomain takeover vulnerability.</w:t>
+      </w:r>
+    </w:p>
+    <w:p>
+      <w:pPr>
+        <w:pStyle w:val="ActivityBullet"/>
+      </w:pPr>
+      <w:r>
+        <w:rPr>
+          <w:sz w:val="17"/>
+        </w:rPr>
+        <w:t>2026-01-29 13:59:44-0500PM ET exposurescout Found 1 domain vulnerable to subdomain takeover.</w:t>
+      </w:r>
+    </w:p>
+    <w:p>
+      <w:pPr>
+        <w:pStyle w:val="ActivityBullet"/>
+      </w:pPr>
+      <w:r>
+        <w:rPr>
+          <w:sz w:val="17"/>
+        </w:rPr>
+        <w:t>2026-01-29 13:59:44-0500PM ET exposurescout Completed subdomain takeover checks.</w:t>
+      </w:r>
+    </w:p>
+    <w:p>
+      <w:pPr>
+        <w:pStyle w:val="ActivityBullet"/>
+        <w:rPr>
+          <w:lang w:val="fr-FR"/>
+        </w:rPr>
+      </w:pPr>
+      <w:r>
+        <w:rPr>
+          <w:sz w:val="17"/>
+          <w:lang w:val="fr-FR"/>
+        </w:rPr>
+        <w:t>2026-01-29 13:59:44-0500PM ET exposurescout ExposureScout module completed.</w:t>
+      </w:r>
+    </w:p>
+    <w:p>
+      <w:pPr>
+        <w:pStyle w:val="ActivityBullet"/>
+      </w:pPr>
+      <w:r>
+        <w:rPr>
+          <w:sz w:val="17"/>
+        </w:rPr>
+        <w:t>2026-01-29 13:59:44-0500PM ET host discovery Performing DNS resolution for 1 DNS name.</w:t>
+      </w:r>
+    </w:p>
+    <w:p>
+      <w:pPr>
+        <w:pStyle w:val="ActivityBullet"/>
+      </w:pPr>
+      <w:r>
+        <w:rPr>
+          <w:sz w:val="17"/>
+        </w:rPr>
+        <w:t>2026-01-29 14:00:50-0500PM ET host discovery DNS resolution complete.</w:t>
+      </w:r>
+    </w:p>
+    <w:p>
+      <w:pPr>
+        <w:pStyle w:val="ActivityBullet"/>
+      </w:pPr>
+      <w:r>
+        <w:rPr>
+          <w:sz w:val="17"/>
+        </w:rPr>
+        <w:t>2026-01-29 14:00:50-0500PM ET host discovery Port scan module initialized.</w:t>
+      </w:r>
+    </w:p>
+    <w:p>
+      <w:pPr>
+        <w:pStyle w:val="ActivityBullet"/>
+      </w:pPr>
+      <w:r>
+        <w:rPr>
+          <w:sz w:val="17"/>
+        </w:rPr>
+        <w:t>2026-01-29 14:00:53-0500PM ET host discovery Conducting port scan against in-scope systems.</w:t>
+      </w:r>
+    </w:p>
+    <w:p>
+      <w:pPr>
+        <w:pStyle w:val="ActivityBullet"/>
+      </w:pPr>
+      <w:r>
+        <w:rPr>
+          <w:sz w:val="17"/>
+        </w:rPr>
+        <w:t>2026-01-29 14:00:57-0500PM ET host discovery Running nmap port scans.</w:t>
+      </w:r>
+    </w:p>
+    <w:p>
+      <w:pPr>
+        <w:pStyle w:val="ActivityBullet"/>
+      </w:pPr>
+      <w:r>
+        <w:rPr>
+          <w:sz w:val="17"/>
+        </w:rPr>
+        <w:t>2026-01-29 14:02:01-0500PM ET host discovery Completed nmap port scans.</w:t>
+      </w:r>
+    </w:p>
+    <w:p>
+      <w:pPr>
+        <w:pStyle w:val="ActivityBullet"/>
+      </w:pPr>
+      <w:r>
+        <w:rPr>
+          <w:sz w:val="17"/>
+        </w:rPr>
+        <w:t>2026-01-29 14:02:01-0500PM ET host discovery Port scans completed successfully.</w:t>
+      </w:r>
+    </w:p>
+    <w:p>
+      <w:pPr>
+        <w:pStyle w:val="ActivityBullet"/>
+      </w:pPr>
+      <w:r>
+        <w:rPr>
+          <w:sz w:val="17"/>
+        </w:rPr>
+        <w:t>2026-01-29 14:02:02-0500PM ET host discovery Parsing results for alive systems.</w:t>
+      </w:r>
+    </w:p>
+    <w:p>
+      <w:pPr>
+        <w:pStyle w:val="ActivityBullet"/>
+      </w:pPr>
+      <w:r>
+        <w:rPr>
+          <w:sz w:val="17"/>
+        </w:rPr>
+        <w:t>2026-01-29 14:02:02-0500PM ET host discovery Completed parsing Nmap results. 1 new IP addresses discovered and imported into DB.</w:t>
+      </w:r>
+    </w:p>
+    <w:p>
+      <w:pPr>
+        <w:pStyle w:val="ActivityBullet"/>
+      </w:pPr>
+      <w:r>
+        <w:rPr>
+          <w:sz w:val="17"/>
+        </w:rPr>
+        <w:t>2026-01-29 14:02:02-0500PM ET host discovery Parsing nmap port scans.</w:t>
+      </w:r>
+    </w:p>
+    <w:p>
+      <w:pPr>
+        <w:pStyle w:val="ActivityBullet"/>
+      </w:pPr>
+      <w:r>
+        <w:rPr>
+          <w:sz w:val="17"/>
+        </w:rPr>
+        <w:t>2026-01-29 14:02:02-0500PM ET host discovery Completed parsing port scans. Imported 3 new ports.</w:t>
+      </w:r>
+    </w:p>
+    <w:p>
+      <w:pPr>
+        <w:pStyle w:val="ActivityBullet"/>
+      </w:pPr>
+      <w:r>
+        <w:rPr>
+          <w:sz w:val="17"/>
+        </w:rPr>
+        <w:t>2026-01-29 14:02:02-0500PM ET host discovery Port scan module completed.</w:t>
+      </w:r>
+    </w:p>
+    <w:p>
+      <w:pPr>
+        <w:pStyle w:val="ActivityBullet"/>
+      </w:pPr>
+      <w:r>
+        <w:rPr>
+          <w:sz w:val="17"/>
+        </w:rPr>
+        <w:lastRenderedPageBreak/>
+        <w:t>2026-01-29 14:02:03-0500PM ET host discovery Discovery module completed.</w:t>
+      </w:r>
+    </w:p>
+    <w:p>
+      <w:pPr>
+        <w:pStyle w:val="ActivityBullet"/>
+      </w:pPr>
+      <w:r>
+        <w:rPr>
+          <w:sz w:val="17"/>
+        </w:rPr>
+        <w:t>2026-01-29 14:02:27-0500PM ET host discovery Running nmap port version scans.</w:t>
+      </w:r>
+    </w:p>
+    <w:p>
+      <w:pPr>
+        <w:pStyle w:val="ActivityBullet"/>
+      </w:pPr>
+      <w:r>
+        <w:rPr>
+          <w:sz w:val="17"/>
+        </w:rPr>
+        <w:t>2026-01-29 14:03:30-0500PM ET host discovery Completed nmap port version scans.</w:t>
+      </w:r>
+    </w:p>
+    <w:p>
+      <w:pPr>
+        <w:pStyle w:val="ActivityBullet"/>
+      </w:pPr>
+      <w:r>
+        <w:rPr>
+          <w:sz w:val="17"/>
+        </w:rPr>
+        <w:t>2026-01-29 14:03:35-0500PM ET enumeration Enumeration module initialized.</w:t>
+      </w:r>
+    </w:p>
+    <w:p>
+      <w:pPr>
+        <w:pStyle w:val="ActivityBullet"/>
+      </w:pPr>
+      <w:r>
+        <w:rPr>
+          <w:sz w:val="17"/>
+        </w:rPr>
+        <w:t>2026-01-29 14:04:43-0500PM ET enumeration Enumerating HTTP services.</w:t>
+      </w:r>
+    </w:p>
+    <w:p>
+      <w:pPr>
+        <w:pStyle w:val="ActivityBullet"/>
+      </w:pPr>
+      <w:r>
+        <w:rPr>
+          <w:sz w:val="17"/>
+        </w:rPr>
+        <w:t>2026-01-29 14:04:43-0500PM ET enumeration Enumerating HTTPS services.</w:t>
+      </w:r>
+    </w:p>
+    <w:p>
+      <w:pPr>
+        <w:pStyle w:val="ActivityBullet"/>
+      </w:pPr>
+      <w:r>
+        <w:rPr>
+          <w:sz w:val="17"/>
+        </w:rPr>
+        <w:t>2026-01-29 14:04:43-0500PM ET enumeration Enumerating SSH services.</w:t>
+      </w:r>
+    </w:p>
+    <w:p>
+      <w:pPr>
+        <w:pStyle w:val="ActivityBullet"/>
+      </w:pPr>
+      <w:r>
+        <w:rPr>
+          <w:sz w:val="17"/>
+        </w:rPr>
+        <w:t>2026-01-29 14:04:47-0500PM ET enumeration Running nmap script scan using script: http-headers.</w:t>
+      </w:r>
+    </w:p>
+    <w:p>
+      <w:pPr>
+        <w:pStyle w:val="ActivityBullet"/>
+      </w:pPr>
+      <w:r>
+        <w:rPr>
+          <w:sz w:val="17"/>
+        </w:rPr>
+        <w:t>2026-01-29 14:04:47-0500PM ET enumeration Running nmap script scan using script: http-methods.</w:t>
+      </w:r>
+    </w:p>
+    <w:p>
+      <w:pPr>
+        <w:pStyle w:val="ActivityBullet"/>
+      </w:pPr>
+      <w:r>
+        <w:rPr>
+          <w:sz w:val="17"/>
+        </w:rPr>
+        <w:t>2026-01-29 14:04:47-0500PM ET enumeration Running nmap script scan using script: http-headers.</w:t>
+      </w:r>
+    </w:p>
+    <w:p>
+      <w:pPr>
+        <w:pStyle w:val="ActivityBullet"/>
+      </w:pPr>
+      <w:r>
+        <w:rPr>
+          <w:sz w:val="17"/>
+        </w:rPr>
+        <w:t>2026-01-29 14:04:47-0500PM ET enumeration Running nmap script scan using script: http-robots.txt.</w:t>
+      </w:r>
+    </w:p>
+    <w:p>
+      <w:pPr>
+        <w:pStyle w:val="ActivityBullet"/>
+      </w:pPr>
+      <w:r>
+        <w:rPr>
+          <w:sz w:val="17"/>
+        </w:rPr>
+        <w:t>2026-01-29 14:04:47-0500PM ET enumeration Running nmap script scan using script: http-robots.txt.</w:t>
+      </w:r>
+    </w:p>
+    <w:p>
+      <w:pPr>
+        <w:pStyle w:val="ActivityBullet"/>
+      </w:pPr>
+      <w:r>
+        <w:rPr>
+          <w:sz w:val="17"/>
+        </w:rPr>
+        <w:t>2026-01-29 14:04:47-0500PM ET enumeration Running nmap script scan using script: http-put.</w:t>
+      </w:r>
+    </w:p>
+    <w:p>
+      <w:pPr>
+        <w:pStyle w:val="ActivityBullet"/>
+      </w:pPr>
+      <w:r>
+        <w:rPr>
+          <w:sz w:val="17"/>
+        </w:rPr>
+        <w:t>2026-01-29 14:04:47-0500PM ET enumeration Running nmap script scan using script: http-title.</w:t>
+      </w:r>
+    </w:p>
+    <w:p>
+      <w:pPr>
+        <w:pStyle w:val="ActivityBullet"/>
+      </w:pPr>
+      <w:r>
+        <w:rPr>
+          <w:sz w:val="17"/>
+        </w:rPr>
+        <w:t>2026-01-29 14:04:47-0500PM ET enumeration Running nmap script scan using script: http-shellshock.</w:t>
+      </w:r>
+    </w:p>
+    <w:p>
+      <w:pPr>
+        <w:pStyle w:val="ActivityBullet"/>
+      </w:pPr>
+      <w:r>
+        <w:rPr>
+          <w:sz w:val="17"/>
+        </w:rPr>
+        <w:t>2026-01-29 14:04:47-0500PM ET enumeration Running nmap script scan using script: http-methods.</w:t>
+      </w:r>
+    </w:p>
+    <w:p>
+      <w:pPr>
+        <w:pStyle w:val="ActivityBullet"/>
+      </w:pPr>
+      <w:r>
+        <w:rPr>
+          <w:sz w:val="17"/>
+        </w:rPr>
+        <w:t>2026-01-29 14:04:47-0500PM ET enumeration Running nmap script scan using script: sslv2.</w:t>
+      </w:r>
+    </w:p>
+    <w:p>
+      <w:pPr>
+        <w:pStyle w:val="ActivityBullet"/>
+      </w:pPr>
+      <w:r>
+        <w:rPr>
+          <w:sz w:val="17"/>
+        </w:rPr>
+        <w:t>2026-01-29 14:04:47-0500PM ET enumeration Running nmap script scan using script: ssl-cert.</w:t>
+      </w:r>
+    </w:p>
+    <w:p>
+      <w:pPr>
+        <w:pStyle w:val="ActivityBullet"/>
+      </w:pPr>
+      <w:r>
+        <w:rPr>
+          <w:sz w:val="17"/>
+        </w:rPr>
+        <w:t>2026-01-29 14:04:47-0500PM ET enumeration Running nmap script scan using script: ssl-enum-ciphers.</w:t>
+      </w:r>
+    </w:p>
+    <w:p>
+      <w:pPr>
+        <w:pStyle w:val="ActivityBullet"/>
+      </w:pPr>
+      <w:r>
+        <w:rPr>
+          <w:sz w:val="17"/>
+        </w:rPr>
+        <w:t>2026-01-29 14:04:47-0500PM ET enumeration Running nmap script scan using script: http-shellshock.</w:t>
+      </w:r>
+    </w:p>
+    <w:p>
+      <w:pPr>
+        <w:pStyle w:val="ActivityBullet"/>
+      </w:pPr>
+      <w:r>
+        <w:rPr>
+          <w:sz w:val="17"/>
+        </w:rPr>
+        <w:t>2026-01-29 14:04:47-0500PM ET enumeration Running nmap script scan using script: ssl-poodle.</w:t>
+      </w:r>
+    </w:p>
+    <w:p>
+      <w:pPr>
+        <w:pStyle w:val="ActivityBullet"/>
+      </w:pPr>
+      <w:r>
+        <w:rPr>
+          <w:sz w:val="17"/>
+        </w:rPr>
+        <w:t>2026-01-29 14:04:47-0500PM ET enumeration Running nmap script scan using script: http-put.</w:t>
+      </w:r>
+    </w:p>
+    <w:p>
+      <w:pPr>
+        <w:pStyle w:val="ActivityBullet"/>
+      </w:pPr>
+      <w:r>
+        <w:rPr>
+          <w:sz w:val="17"/>
+        </w:rPr>
+        <w:t>2026-01-29 14:04:47-0500PM ET enumeration Running nmap script scan using script: ssl-heartbleed.</w:t>
+      </w:r>
+    </w:p>
+    <w:p>
+      <w:pPr>
+        <w:pStyle w:val="ActivityBullet"/>
+      </w:pPr>
+      <w:r>
+        <w:rPr>
+          <w:sz w:val="17"/>
+        </w:rPr>
+        <w:t>2026-01-29 14:04:47-0500PM ET enumeration Running nmap script scan using script: http-title.</w:t>
+      </w:r>
+    </w:p>
+    <w:p>
+      <w:pPr>
+        <w:pStyle w:val="ActivityBullet"/>
+      </w:pPr>
+      <w:r>
+        <w:rPr>
+          <w:sz w:val="17"/>
+        </w:rPr>
+        <w:t>2026-01-29 14:04:47-0500PM ET enumeration Running nmap script scan using script: ssl-date.</w:t>
+      </w:r>
+    </w:p>
+    <w:p>
+      <w:pPr>
+        <w:pStyle w:val="ActivityBullet"/>
+      </w:pPr>
+      <w:r>
+        <w:rPr>
+          <w:sz w:val="17"/>
+        </w:rPr>
+        <w:t>2026-01-29 14:04:47-0500PM ET enumeration Queuing up MSF module: auxiliary/scanner/ssh/ssh_version.</w:t>
+      </w:r>
+    </w:p>
+    <w:p>
+      <w:pPr>
+        <w:pStyle w:val="ActivityBullet"/>
+      </w:pPr>
+      <w:r>
+        <w:rPr>
+          <w:sz w:val="17"/>
+        </w:rPr>
+        <w:t>2026-01-29 14:05:50-0500PM ET enumeration Completed MSF module: auxiliary/scanner/ssh/ssh_version.</w:t>
+      </w:r>
+    </w:p>
+    <w:p>
+      <w:pPr>
+        <w:pStyle w:val="ActivityBullet"/>
+      </w:pPr>
+      <w:r>
+        <w:rPr>
+          <w:sz w:val="17"/>
+        </w:rPr>
+        <w:t>2026-01-29 14:05:50-0500PM ET enumeration Completed nmap script scan using script: http-methods.</w:t>
+      </w:r>
+    </w:p>
+    <w:p>
+      <w:pPr>
+        <w:pStyle w:val="ActivityBullet"/>
+      </w:pPr>
+      <w:r>
+        <w:rPr>
+          <w:sz w:val="17"/>
+        </w:rPr>
+        <w:t>2026-01-29 14:05:50-0500PM ET enumeration Completed nmap script scan using script: ssl-enum-ciphers.</w:t>
+      </w:r>
+    </w:p>
+    <w:p>
+      <w:pPr>
+        <w:pStyle w:val="ActivityBullet"/>
+      </w:pPr>
+      <w:r>
+        <w:rPr>
+          <w:sz w:val="17"/>
+        </w:rPr>
+        <w:t>2026-01-29 14:05:50-0500PM ET enumeration Completed nmap script scan using script: http-put.</w:t>
+      </w:r>
+    </w:p>
+    <w:p>
+      <w:pPr>
+        <w:pStyle w:val="ActivityBullet"/>
+      </w:pPr>
+      <w:r>
+        <w:rPr>
+          <w:sz w:val="17"/>
+        </w:rPr>
+        <w:t>2026-01-29 14:05:50-0500PM ET enumeration Completed nmap script scan using script: http-robots.txt.</w:t>
+      </w:r>
+    </w:p>
+    <w:p>
+      <w:pPr>
+        <w:pStyle w:val="ActivityBullet"/>
+      </w:pPr>
+      <w:r>
+        <w:rPr>
+          <w:sz w:val="17"/>
+        </w:rPr>
+        <w:lastRenderedPageBreak/>
+        <w:t>2026-01-29 14:05:50-0500PM ET enumeration Completed nmap script scan using script: ssl-heartbleed.</w:t>
+      </w:r>
+    </w:p>
+    <w:p>
+      <w:pPr>
+        <w:pStyle w:val="ActivityBullet"/>
+      </w:pPr>
+      <w:r>
+        <w:rPr>
+          <w:sz w:val="17"/>
+        </w:rPr>
+        <w:t>2026-01-29 14:05:50-0500PM ET enumeration Completed nmap script scan using script: http-shellshock.</w:t>
+      </w:r>
+    </w:p>
+    <w:p>
+      <w:pPr>
+        <w:pStyle w:val="ActivityBullet"/>
+      </w:pPr>
+      <w:r>
+        <w:rPr>
+          <w:sz w:val="17"/>
+        </w:rPr>
+        <w:t>2026-01-29 14:05:50-0500PM ET enumeration Completed nmap script scan using script: http-robots.txt.</w:t>
+      </w:r>
+    </w:p>
+    <w:p>
+      <w:pPr>
+        <w:pStyle w:val="ActivityBullet"/>
+      </w:pPr>
+      <w:r>
+        <w:rPr>
+          <w:sz w:val="17"/>
+        </w:rPr>
+        <w:t>2026-01-29 14:05:51-0500PM ET enumeration Completed nmap script scan using script: http-put.</w:t>
+      </w:r>
+    </w:p>
+    <w:p>
+      <w:pPr>
+        <w:pStyle w:val="ActivityBullet"/>
+      </w:pPr>
+      <w:r>
+        <w:rPr>
+          <w:sz w:val="17"/>
+        </w:rPr>
+        <w:t>2026-01-29 14:05:51-0500PM ET enumeration Completed nmap script scan using script: http-headers.</w:t>
+      </w:r>
+    </w:p>
+    <w:p>
+      <w:pPr>
+        <w:pStyle w:val="ActivityBullet"/>
+      </w:pPr>
+      <w:r>
+        <w:rPr>
+          <w:sz w:val="17"/>
+        </w:rPr>
+        <w:t>2026-01-29 14:05:51-0500PM ET enumeration Completed nmap script scan using script: http-methods.</w:t>
+      </w:r>
+    </w:p>
+    <w:p>
+      <w:pPr>
+        <w:pStyle w:val="ActivityBullet"/>
+      </w:pPr>
+      <w:r>
+        <w:rPr>
+          <w:sz w:val="17"/>
+        </w:rPr>
+        <w:t>2026-01-29 14:05:51-0500PM ET enumeration Completed nmap script scan using script: ssl-date.</w:t>
+      </w:r>
+    </w:p>
+    <w:p>
+      <w:pPr>
+        <w:pStyle w:val="ActivityBullet"/>
+      </w:pPr>
+      <w:r>
+        <w:rPr>
+          <w:sz w:val="17"/>
+        </w:rPr>
+        <w:t>2026-01-29 14:05:51-0500PM ET enumeration Completed nmap script scan using script: http-title.</w:t>
+      </w:r>
+    </w:p>
+    <w:p>
+      <w:pPr>
+        <w:pStyle w:val="ActivityBullet"/>
+      </w:pPr>
+      <w:r>
+        <w:rPr>
+          <w:sz w:val="17"/>
+        </w:rPr>
+        <w:t>2026-01-29 14:05:51-0500PM ET enumeration Completed nmap script scan using script: http-shellshock.</w:t>
+      </w:r>
+    </w:p>
+    <w:p>
+      <w:pPr>
+        <w:pStyle w:val="ActivityBullet"/>
+      </w:pPr>
+      <w:r>
+        <w:rPr>
+          <w:sz w:val="17"/>
+        </w:rPr>
+        <w:t>2026-01-29 14:05:51-0500PM ET enumeration Completed nmap script scan using script: http-headers.</w:t>
+      </w:r>
+    </w:p>
+    <w:p>
+      <w:pPr>
+        <w:pStyle w:val="ActivityBullet"/>
+      </w:pPr>
+      <w:r>
+        <w:rPr>
+          <w:sz w:val="17"/>
+        </w:rPr>
+        <w:t>2026-01-29 14:05:51-0500PM ET enumeration Completed nmap script scan using script: ssl-poodle.</w:t>
+      </w:r>
+    </w:p>
+    <w:p>
+      <w:pPr>
+        <w:pStyle w:val="ActivityBullet"/>
+      </w:pPr>
+      <w:r>
+        <w:rPr>
+          <w:sz w:val="17"/>
+        </w:rPr>
+        <w:t>2026-01-29 14:05:51-0500PM ET enumeration Completed nmap script scan using script: ssl-cert.</w:t>
+      </w:r>
+    </w:p>
+    <w:p>
+      <w:pPr>
+        <w:pStyle w:val="ActivityBullet"/>
+      </w:pPr>
+      <w:r>
+        <w:rPr>
+          <w:sz w:val="17"/>
+        </w:rPr>
+        <w:t>2026-01-29 14:05:51-0500PM ET enumeration Completed nmap script scan using script: sslv2.</w:t>
+      </w:r>
+    </w:p>
+    <w:p>
+      <w:pPr>
+        <w:pStyle w:val="ActivityBullet"/>
+      </w:pPr>
+      <w:r>
+        <w:rPr>
+          <w:sz w:val="17"/>
+        </w:rPr>
+        <w:t>2026-01-29 14:05:51-0500PM ET enumeration Completed nmap script scan using script: http-title.</w:t>
+      </w:r>
+    </w:p>
+    <w:p>
+      <w:pPr>
+        <w:pStyle w:val="ActivityBullet"/>
+      </w:pPr>
+      <w:r>
+        <w:rPr>
+          <w:sz w:val="17"/>
+        </w:rPr>
+        <w:t>2026-01-29 14:05:51-0500PM ET enumeration Peforming a hidden directory enumeration attack on 80/tcp.</w:t>
+      </w:r>
+    </w:p>
+    <w:p>
+      <w:pPr>
+        <w:pStyle w:val="ActivityBullet"/>
+      </w:pPr>
+      <w:r>
+        <w:rPr>
+          <w:sz w:val="17"/>
+        </w:rPr>
+        <w:t>2026-01-29 14:05:54-0500PM ET enumeration Running nmap script scan using script: sshv1.</w:t>
+      </w:r>
+    </w:p>
+    <w:p>
+      <w:pPr>
+        <w:pStyle w:val="ActivityBullet"/>
+      </w:pPr>
+      <w:r>
+        <w:rPr>
+          <w:sz w:val="17"/>
+        </w:rPr>
+        <w:t>2026-01-29 14:05:54-0500PM ET enumeration Running nmap script scan using script: ssh2-enum-algos.</w:t>
+      </w:r>
+    </w:p>
+    <w:p>
+      <w:pPr>
+        <w:pStyle w:val="ActivityBullet"/>
+      </w:pPr>
+      <w:r>
+        <w:rPr>
+          <w:sz w:val="17"/>
+        </w:rPr>
+        <w:t>2026-01-29 14:05:54-0500PM ET enumeration Running nmap script scan using script: ssh-auth-methods.</w:t>
+      </w:r>
+    </w:p>
+    <w:p>
+      <w:pPr>
+        <w:pStyle w:val="ActivityBullet"/>
+        <w:rPr>
+          <w:lang w:val="fr-FR"/>
+        </w:rPr>
+      </w:pPr>
+      <w:r>
+        <w:rPr>
+          <w:sz w:val="17"/>
+          <w:lang w:val="fr-FR"/>
+        </w:rPr>
+        <w:t>2026-01-29 14:05:54-0500PM ET enumeration Analyzing SSL/TLS protocols on port 443/tcp.</w:t>
+      </w:r>
+    </w:p>
+    <w:p>
+      <w:pPr>
+        <w:pStyle w:val="ActivityBullet"/>
+      </w:pPr>
+      <w:r>
+        <w:rPr>
+          <w:sz w:val="17"/>
+        </w:rPr>
+        <w:t>2026-01-29 14:06:55-0500PM ET enumeration Completed SSL/TLS analysis on ports 443/tcp.</w:t>
+      </w:r>
+    </w:p>
+    <w:p>
+      <w:pPr>
+        <w:pStyle w:val="ActivityBullet"/>
+      </w:pPr>
+      <w:r>
+        <w:rPr>
+          <w:sz w:val="17"/>
+        </w:rPr>
+        <w:t>2026-01-29 14:06:55-0500PM ET enumeration Completed hidden directory enumeration scan.</w:t>
+      </w:r>
+    </w:p>
+    <w:p>
+      <w:pPr>
+        <w:pStyle w:val="ActivityBullet"/>
+      </w:pPr>
+      <w:r>
+        <w:rPr>
+          <w:sz w:val="17"/>
+        </w:rPr>
+        <w:t>2026-01-29 14:06:55-0500PM ET enumeration Peforming a hidden directory enumeration attack on 443/tcp.</w:t>
+      </w:r>
+    </w:p>
+    <w:p>
+      <w:pPr>
+        <w:pStyle w:val="ActivityBullet"/>
+      </w:pPr>
+      <w:r>
+        <w:rPr>
+          <w:sz w:val="17"/>
+        </w:rPr>
+        <w:t>2026-01-29 14:06:55-0500PM ET enumeration Completed nmap script scan using script: ssh2-enum-algos.</w:t>
+      </w:r>
+    </w:p>
+    <w:p>
+      <w:pPr>
+        <w:pStyle w:val="ActivityBullet"/>
+      </w:pPr>
+      <w:r>
+        <w:rPr>
+          <w:sz w:val="17"/>
+        </w:rPr>
+        <w:t>2026-01-29 14:06:55-0500PM ET enumeration Completed nmap script scan using script: ssh-auth-methods.</w:t>
+      </w:r>
+    </w:p>
+    <w:p>
+      <w:pPr>
+        <w:pStyle w:val="ActivityBullet"/>
+      </w:pPr>
+      <w:r>
+        <w:rPr>
+          <w:sz w:val="17"/>
+        </w:rPr>
+        <w:t>2026-01-29 14:06:55-0500PM ET enumeration Completed nmap script scan using script: sshv1.</w:t>
+      </w:r>
+    </w:p>
+    <w:p>
+      <w:pPr>
+        <w:pStyle w:val="ActivityBullet"/>
+      </w:pPr>
+      <w:r>
+        <w:rPr>
+          <w:sz w:val="17"/>
+        </w:rPr>
+        <w:t>2026-01-29 14:06:55-0500PM ET enumeration Completed enumerating SSH services.</w:t>
+      </w:r>
+    </w:p>
+    <w:p>
+      <w:pPr>
+        <w:pStyle w:val="ActivityBullet"/>
+      </w:pPr>
+      <w:r>
+        <w:rPr>
+          <w:sz w:val="17"/>
+        </w:rPr>
+        <w:t>2026-01-29 14:06:58-0500PM ET enumeration Analyzing web services running on port 80/tcp.</w:t>
+      </w:r>
+    </w:p>
+    <w:p>
+      <w:pPr>
+        <w:pStyle w:val="ActivityBullet"/>
+      </w:pPr>
+      <w:r>
+        <w:rPr>
+          <w:sz w:val="17"/>
+        </w:rPr>
+        <w:t>2026-01-29 14:08:10-0500PM ET enumeration Completed analyzing web services running on port 80/tcp.</w:t>
+      </w:r>
+    </w:p>
+    <w:p>
+      <w:pPr>
+        <w:pStyle w:val="ActivityBullet"/>
+      </w:pPr>
+      <w:r>
+        <w:rPr>
+          <w:sz w:val="17"/>
+        </w:rPr>
+        <w:t>2026-01-29 14:08:10-0500PM ET enumeration Completed hidden directory enumeration scan.</w:t>
+      </w:r>
+    </w:p>
+    <w:p>
+      <w:pPr>
+        <w:pStyle w:val="ActivityBullet"/>
+      </w:pPr>
+      <w:r>
+        <w:rPr>
+          <w:sz w:val="17"/>
+        </w:rPr>
+        <w:t>2026-01-29 14:08:10-0500PM ET enumeration Completed analyzing web services running on port 80/tcp.</w:t>
+      </w:r>
+    </w:p>
+    <w:p>
+      <w:pPr>
+        <w:pStyle w:val="ActivityBullet"/>
+      </w:pPr>
+      <w:r>
+        <w:rPr>
+          <w:sz w:val="17"/>
+        </w:rPr>
+        <w:t>2026-01-29 14:08:10-0500PM ET enumeration Completed enumerating HTTP services.</w:t>
+      </w:r>
+    </w:p>
+    <w:p>
+      <w:pPr>
+        <w:pStyle w:val="ActivityBullet"/>
+      </w:pPr>
+      <w:r>
+        <w:rPr>
+          <w:sz w:val="17"/>
+        </w:rPr>
+        <w:lastRenderedPageBreak/>
+        <w:t>2026-01-29 14:08:13-0500PM ET enumeration Analyzing web services running on port 443/tcp.</w:t>
+      </w:r>
+    </w:p>
+    <w:p>
+      <w:pPr>
+        <w:pStyle w:val="ActivityBullet"/>
+      </w:pPr>
+      <w:r>
+        <w:rPr>
+          <w:sz w:val="17"/>
+        </w:rPr>
+        <w:t>2026-01-29 14:09:15-0500PM ET enumeration Completed analyzing web services running on port 443/tcp.</w:t>
+      </w:r>
+    </w:p>
+    <w:p>
+      <w:pPr>
+        <w:pStyle w:val="ActivityBullet"/>
+      </w:pPr>
+      <w:r>
+        <w:rPr>
+          <w:sz w:val="17"/>
+        </w:rPr>
+        <w:t>2026-01-29 14:09:15-0500PM ET enumeration Completed analyzing web services running on port 443/tcp.</w:t>
+      </w:r>
+    </w:p>
+    <w:p>
+      <w:pPr>
+        <w:pStyle w:val="ActivityBullet"/>
+      </w:pPr>
+      <w:r>
+        <w:rPr>
+          <w:sz w:val="17"/>
+        </w:rPr>
+        <w:t>2026-01-29 14:09:16-0500PM ET enumeration Completed enumerating HTTPS services.</w:t>
+      </w:r>
+    </w:p>
+    <w:p>
+      <w:pPr>
+        <w:pStyle w:val="ActivityBullet"/>
+      </w:pPr>
+      <w:r>
+        <w:rPr>
+          <w:sz w:val="17"/>
+        </w:rPr>
+        <w:t>2026-01-29 14:09:45-0500PM ET enumeration Enumeration module completed.</w:t>
+      </w:r>
+    </w:p>
+    <w:p>
+      <w:pPr>
+        <w:pStyle w:val="ActivityBullet"/>
+        <w:rPr>
+          <w:lang w:val="fr-FR"/>
+        </w:rPr>
+      </w:pPr>
+      <w:r>
+        <w:rPr>
+          <w:sz w:val="17"/>
+          <w:lang w:val="fr-FR"/>
+        </w:rPr>
+        <w:t>2026-01-29 14:10:06-0500PM ET exploit Launching exploit module.</w:t>
+      </w:r>
+    </w:p>
+    <w:p>
+      <w:pPr>
+        <w:pStyle w:val="ActivityBullet"/>
+      </w:pPr>
+      <w:r>
+        <w:rPr>
+          <w:sz w:val="17"/>
+        </w:rPr>
+        <w:t>2026-01-29 14:10:11-0500PM ET exploit Queuing up hydra attack: SSH password attack.</w:t>
+      </w:r>
+    </w:p>
+    <w:p>
+      <w:pPr>
+        <w:pStyle w:val="ActivityBullet"/>
+      </w:pPr>
+      <w:r>
+        <w:rPr>
+          <w:sz w:val="17"/>
+        </w:rPr>
+        <w:t>2026-01-29 14:11:16-0500PM ET exploit Completed hydra attack: SSH password attack.</w:t>
+      </w:r>
+    </w:p>
+    <w:p>
+      <w:pPr>
+        <w:pStyle w:val="ActivityBullet"/>
+      </w:pPr>
+      <w:r>
+        <w:rPr>
+          <w:sz w:val="17"/>
+        </w:rPr>
+        <w:t>2026-01-29 14:11:16-0500PM ET exploit Completed SSH password attack.</w:t>
+      </w:r>
+    </w:p>
+    <w:p>
+      <w:pPr>
+        <w:pStyle w:val="ActivityBullet"/>
+        <w:rPr>
+          <w:lang w:val="fr-FR"/>
+        </w:rPr>
+      </w:pPr>
+      <w:r>
+        <w:rPr>
+          <w:sz w:val="17"/>
+          <w:lang w:val="fr-FR"/>
+        </w:rPr>
+        <w:t>2026-01-29 14:11:49-0500PM ET exploit Completed exploit module.</w:t>
+      </w:r>
+    </w:p>
+    <w:p>
+      <w:pPr>
+        <w:spacing w:line="259" w:lineRule="auto"/>
+        <w:contextualSpacing/>
+        <w:rPr>
+          <w:rFonts w:ascii="Corbel" w:eastAsia="Calibri" w:hAnsi="Corbel" w:cs="Arial"/>
+          <w:color w:val="404040"/>
+          <w:kern w:val="0"/>
+          <w:sz w:val="18"/>
+          <w:szCs w:val="18"/>
+          <w:lang w:val="fr-FR"/>
+          <w14:ligatures w14:val="none"/>
+        </w:rPr>
+      </w:pPr>
+      <w:r>
+        <w:rPr>
+          <w:rFonts w:ascii="Corbel" w:eastAsia="Calibri" w:hAnsi="Corbel" w:cs="Arial"/>
+          <w:color w:val="404040"/>
+          <w:kern w:val="0"/>
+          <w:szCs w:val="22"/>
+          <w:lang w:val="fr-FR"/>
+          <w14:ligatures w14:val="none"/>
+        </w:rPr>
+        <w:br w:type="page"/>
+      </w:r>
+    </w:p>
+    <w:p>
+      <w:pPr>
+        <w:keepNext/>
+        <w:keepLines/>
+        <w:spacing w:before="360" w:after="120" w:line="259" w:lineRule="auto"/>
+        <w:outlineLvl w:val="0"/>
         <w:rPr>
           <w:rFonts w:ascii="Handel Gothic D" w:eastAsia="DengXian Light" w:hAnsi="Handel Gothic D" w:cs="Times New Roman"/>
           <w:b/>
@@ -5162,1162 +6566,11 @@
           <w:kern w:val="0"/>
           <w:sz w:val="44"/>
           <w:szCs w:val="32"/>
-          <w:highlight w:val="yellow"/>
-          <w14:ligatures w14:val="none"/>
-        </w:rPr>
-        <w:tab/>
-      </w:r>
-    </w:p>
-    <w:p>
-      <w:pPr>
-        <w:pStyle w:val="ActivityBullet"/>
-      </w:pPr>
-      <w:r>
-        <w:rPr>
-          <w:sz w:val="17"/>
-        </w:rPr>
-        <w:t>2026-01-29 13:52:47-0500PM ET exposurescout Initiating ExposureScout module.</w:t>
-      </w:r>
-    </w:p>
-    <w:p>
-      <w:pPr>
-        <w:pStyle w:val="ActivityBullet"/>
-      </w:pPr>
-      <w:r>
-        <w:rPr>
-          <w:sz w:val="17"/>
-        </w:rPr>
-        <w:t>2026-01-29 13:52:59-0500PM ET exposurescout Enumerating subdomains from one (1) domain.</w:t>
-      </w:r>
-    </w:p>
-    <w:p>
-      <w:pPr>
-        <w:pStyle w:val="ActivityBullet"/>
-      </w:pPr>
-      <w:r>
-        <w:rPr>
-          <w:sz w:val="17"/>
-        </w:rPr>
-        <w:t>2026-01-29 13:54:13-0500PM ET exposurescout Completed subdomain enumeration.</w:t>
-      </w:r>
-    </w:p>
-    <w:p>
-      <w:pPr>
-        <w:pStyle w:val="ActivityBullet"/>
-      </w:pPr>
-      <w:r>
-        <w:rPr>
-          <w:sz w:val="17"/>
-        </w:rPr>
-        <w:t>2026-01-29 13:54:13-0500PM ET exposurescout Beginning DNS enumeration.</w:t>
-      </w:r>
-    </w:p>
-    <w:p>
-      <w:pPr>
-        <w:pStyle w:val="ActivityBullet"/>
-      </w:pPr>
-      <w:r>
-        <w:rPr>
-          <w:sz w:val="17"/>
-        </w:rPr>
-        <w:t>2026-01-29 13:55:18-0500PM ET exposurescout Completed DNS enumeration.</w:t>
-      </w:r>
-    </w:p>
-    <w:p>
-      <w:pPr>
-        <w:pStyle w:val="ActivityBullet"/>
-      </w:pPr>
-      <w:r>
-        <w:rPr>
-          <w:sz w:val="17"/>
-        </w:rPr>
-        <w:t>2026-01-29 13:55:18-0500PM ET exposurescout Enumerating doppelganger domains for one (1) domain.</w:t>
-      </w:r>
-    </w:p>
-    <w:p>
-      <w:pPr>
-        <w:pStyle w:val="ActivityBullet"/>
-      </w:pPr>
-      <w:r>
-        <w:rPr>
-          <w:sz w:val="17"/>
-        </w:rPr>
-        <w:t>2026-01-29 13:56:28-0500PM ET exposurescout Ten (10) new doppelganger domains discovered.</w:t>
-      </w:r>
-    </w:p>
-    <w:p>
-      <w:pPr>
-        <w:pStyle w:val="ActivityBullet"/>
-      </w:pPr>
-      <w:r>
-        <w:rPr>
-          <w:sz w:val="17"/>
-        </w:rPr>
-        <w:t>2026-01-29 13:56:28-0500PM ET exposurescout Completed doppelganger domain enumeration.</w:t>
-      </w:r>
-    </w:p>
-    <w:p>
-      <w:pPr>
-        <w:pStyle w:val="ActivityBullet"/>
-      </w:pPr>
-      <w:r>
-        <w:rPr>
-          <w:sz w:val="17"/>
-        </w:rPr>
-        <w:t>2026-01-29 13:56:28-0500PM ET exposurescout Running WHOIS commands on eight (8) domains.</w:t>
-      </w:r>
-    </w:p>
-    <w:p>
-      <w:pPr>
-        <w:pStyle w:val="ActivityBullet"/>
-      </w:pPr>
-      <w:r>
-        <w:rPr>
-          <w:sz w:val="17"/>
-        </w:rPr>
-        <w:t>2026-01-29 13:57:33-0500PM ET exposurescout Importing eight (8) WHOIS results into the database.</w:t>
-      </w:r>
-    </w:p>
-    <w:p>
-      <w:pPr>
-        <w:pStyle w:val="ActivityBullet"/>
-      </w:pPr>
-      <w:r>
-        <w:rPr>
-          <w:sz w:val="17"/>
-        </w:rPr>
-        <w:t>2026-01-29 13:57:34-0500PM ET exposurescout Completed recursive WHOIS lookups</w:t>
-      </w:r>
-    </w:p>
-    <w:p>
-      <w:pPr>
-        <w:pStyle w:val="ActivityBullet"/>
-      </w:pPr>
-      <w:r>
-        <w:rPr>
-          <w:sz w:val="17"/>
-        </w:rPr>
-        <w:t>2026-01-29 13:57:34-0500PM ET exposurescout Email scraping module started.</w:t>
-      </w:r>
-    </w:p>
-    <w:p>
-      <w:pPr>
-        <w:pStyle w:val="ActivityBullet"/>
-      </w:pPr>
-      <w:r>
-        <w:rPr>
-          <w:sz w:val="17"/>
-        </w:rPr>
-        <w:t>2026-01-29 13:58:40-0500PM ET exposurescout Completed email scraping.</w:t>
-      </w:r>
-    </w:p>
-    <w:p>
-      <w:pPr>
-        <w:pStyle w:val="ActivityBullet"/>
-      </w:pPr>
-      <w:r>
-        <w:rPr>
-          <w:sz w:val="17"/>
-        </w:rPr>
-        <w:t>2026-01-29 13:58:40-0500PM ET exposurescout Scanning subdomains for subdomain takeover vulnerability.</w:t>
-      </w:r>
-    </w:p>
-    <w:p>
-      <w:pPr>
-        <w:pStyle w:val="ActivityBullet"/>
-      </w:pPr>
-      <w:r>
-        <w:rPr>
-          <w:sz w:val="17"/>
-        </w:rPr>
-        <w:t>2026-01-29 13:59:44-0500PM ET exposurescout Found 1 domain vulnerable to subdomain takeover.</w:t>
-      </w:r>
-    </w:p>
-    <w:p>
-      <w:pPr>
-        <w:pStyle w:val="ActivityBullet"/>
-      </w:pPr>
-      <w:r>
-        <w:rPr>
-          <w:sz w:val="17"/>
-        </w:rPr>
-        <w:t>2026-01-29 13:59:44-0500PM ET exposurescout Completed subdomain takeover checks.</w:t>
-      </w:r>
-    </w:p>
-    <w:p>
-      <w:pPr>
-        <w:pStyle w:val="ActivityBullet"/>
-      </w:pPr>
-      <w:r>
-        <w:rPr>
-          <w:sz w:val="17"/>
-        </w:rPr>
-        <w:t>2026-01-29 13:59:44-0500PM ET exposurescout ExposureScout module completed.</w:t>
-      </w:r>
-    </w:p>
-    <w:p>
-      <w:pPr>
-        <w:pStyle w:val="ActivityBullet"/>
-      </w:pPr>
-      <w:r>
-        <w:rPr>
-          <w:sz w:val="17"/>
-        </w:rPr>
-        <w:t>2026-01-29 13:59:44-0500PM ET host discovery Performing DNS resolution for 1 DNS name.</w:t>
-      </w:r>
-    </w:p>
-    <w:p>
-      <w:pPr>
-        <w:pStyle w:val="ActivityBullet"/>
-      </w:pPr>
-      <w:r>
-        <w:rPr>
-          <w:sz w:val="17"/>
-        </w:rPr>
-        <w:t>2026-01-29 14:00:50-0500PM ET host discovery DNS resolution complete.</w:t>
-      </w:r>
-    </w:p>
-    <w:p>
-      <w:pPr>
-        <w:pStyle w:val="ActivityBullet"/>
-      </w:pPr>
-      <w:r>
-        <w:rPr>
-          <w:sz w:val="17"/>
-        </w:rPr>
-        <w:t>2026-01-29 14:00:50-0500PM ET host discovery Port scan module initialized.</w:t>
-      </w:r>
-    </w:p>
-    <w:p>
-      <w:pPr>
-        <w:pStyle w:val="ActivityBullet"/>
-      </w:pPr>
-      <w:r>
-        <w:rPr>
-          <w:sz w:val="17"/>
-        </w:rPr>
-        <w:t>2026-01-29 14:00:53-0500PM ET host discovery Conducting port scan against in-scope systems.</w:t>
-      </w:r>
-    </w:p>
-    <w:p>
-      <w:pPr>
-        <w:pStyle w:val="ActivityBullet"/>
-      </w:pPr>
-      <w:r>
-        <w:rPr>
-          <w:sz w:val="17"/>
-        </w:rPr>
-        <w:t>2026-01-29 14:00:57-0500PM ET host discovery Running nmap port scans.</w:t>
-      </w:r>
-    </w:p>
-    <w:p>
-      <w:pPr>
-        <w:pStyle w:val="ActivityBullet"/>
-      </w:pPr>
-      <w:r>
-        <w:rPr>
-          <w:sz w:val="17"/>
-        </w:rPr>
-        <w:t>2026-01-29 14:02:01-0500PM ET host discovery Completed nmap port scans.</w:t>
-      </w:r>
-    </w:p>
-    <w:p>
-      <w:pPr>
-        <w:pStyle w:val="ActivityBullet"/>
-      </w:pPr>
-      <w:r>
-        <w:rPr>
-          <w:sz w:val="17"/>
-        </w:rPr>
-        <w:t>2026-01-29 14:02:01-0500PM ET host discovery Port scans completed successfully.</w:t>
-      </w:r>
-    </w:p>
-    <w:p>
-      <w:pPr>
-        <w:pStyle w:val="ActivityBullet"/>
-      </w:pPr>
-      <w:r>
-        <w:rPr>
-          <w:sz w:val="17"/>
-        </w:rPr>
-        <w:t>2026-01-29 14:02:02-0500PM ET host discovery Parsing results for alive systems.</w:t>
-      </w:r>
-    </w:p>
-    <w:p>
-      <w:pPr>
-        <w:pStyle w:val="ActivityBullet"/>
-      </w:pPr>
-      <w:r>
-        <w:rPr>
-          <w:sz w:val="17"/>
-        </w:rPr>
-        <w:t>2026-01-29 14:02:02-0500PM ET host discovery Completed parsing Nmap results. 1 new IP addresses discovered and imported into DB.</w:t>
-      </w:r>
-    </w:p>
-    <w:p>
-      <w:pPr>
-        <w:pStyle w:val="ActivityBullet"/>
-      </w:pPr>
-      <w:r>
-        <w:rPr>
-          <w:sz w:val="17"/>
-        </w:rPr>
-        <w:t>2026-01-29 14:02:02-0500PM ET host discovery Parsing nmap port scans.</w:t>
-      </w:r>
-    </w:p>
-    <w:p>
-      <w:pPr>
-        <w:pStyle w:val="ActivityBullet"/>
-      </w:pPr>
-      <w:r>
-        <w:rPr>
-          <w:sz w:val="17"/>
-        </w:rPr>
-        <w:t>2026-01-29 14:02:02-0500PM ET host discovery Completed parsing port scans. Imported 3 new ports.</w:t>
-      </w:r>
-    </w:p>
-    <w:p>
-      <w:pPr>
-        <w:pStyle w:val="ActivityBullet"/>
-      </w:pPr>
-      <w:r>
-        <w:rPr>
-          <w:sz w:val="17"/>
-        </w:rPr>
-        <w:t>2026-01-29 14:02:02-0500PM ET host discovery Port scan module completed.</w:t>
-      </w:r>
-    </w:p>
-    <w:p>
-      <w:pPr>
-        <w:pStyle w:val="ActivityBullet"/>
-      </w:pPr>
-      <w:r>
-        <w:rPr>
-          <w:sz w:val="17"/>
-        </w:rPr>
-        <w:lastRenderedPageBreak/>
-        <w:t>2026-01-29 14:02:03-0500PM ET host discovery Discovery module completed.</w:t>
-      </w:r>
-    </w:p>
-    <w:p>
-      <w:pPr>
-        <w:pStyle w:val="ActivityBullet"/>
-      </w:pPr>
-      <w:r>
-        <w:rPr>
-          <w:sz w:val="17"/>
-        </w:rPr>
-        <w:t>2026-01-29 14:02:27-0500PM ET host discovery Running nmap port version scans.</w:t>
-      </w:r>
-    </w:p>
-    <w:p>
-      <w:pPr>
-        <w:pStyle w:val="ActivityBullet"/>
-      </w:pPr>
-      <w:r>
-        <w:rPr>
-          <w:sz w:val="17"/>
-        </w:rPr>
-        <w:t>2026-01-29 14:03:30-0500PM ET host discovery Completed nmap port version scans.</w:t>
-      </w:r>
-    </w:p>
-    <w:p>
-      <w:pPr>
-        <w:pStyle w:val="ActivityBullet"/>
-      </w:pPr>
-      <w:r>
-        <w:rPr>
-          <w:sz w:val="17"/>
-        </w:rPr>
-        <w:t>2026-01-29 14:03:35-0500PM ET enumeration Enumeration module initialized.</w:t>
-      </w:r>
-    </w:p>
-    <w:p>
-      <w:pPr>
-        <w:pStyle w:val="ActivityBullet"/>
-      </w:pPr>
-      <w:r>
-        <w:rPr>
-          <w:sz w:val="17"/>
-        </w:rPr>
-        <w:t>2026-01-29 14:04:43-0500PM ET enumeration Enumerating HTTP services.</w:t>
-      </w:r>
-    </w:p>
-    <w:p>
-      <w:pPr>
-        <w:pStyle w:val="ActivityBullet"/>
-      </w:pPr>
-      <w:r>
-        <w:rPr>
-          <w:sz w:val="17"/>
-        </w:rPr>
-        <w:t>2026-01-29 14:04:43-0500PM ET enumeration Enumerating HTTPS services.</w:t>
-      </w:r>
-    </w:p>
-    <w:p>
-      <w:pPr>
-        <w:pStyle w:val="ActivityBullet"/>
-      </w:pPr>
-      <w:r>
-        <w:rPr>
-          <w:sz w:val="17"/>
-        </w:rPr>
-        <w:t>2026-01-29 14:04:43-0500PM ET enumeration Enumerating SSH services.</w:t>
-      </w:r>
-    </w:p>
-    <w:p>
-      <w:pPr>
-        <w:pStyle w:val="ActivityBullet"/>
-      </w:pPr>
-      <w:r>
-        <w:rPr>
-          <w:sz w:val="17"/>
-        </w:rPr>
-        <w:t>2026-01-29 14:04:47-0500PM ET enumeration Running nmap script scan using script: http-headers.</w:t>
-      </w:r>
-    </w:p>
-    <w:p>
-      <w:pPr>
-        <w:pStyle w:val="ActivityBullet"/>
-      </w:pPr>
-      <w:r>
-        <w:rPr>
-          <w:sz w:val="17"/>
-        </w:rPr>
-        <w:t>2026-01-29 14:04:47-0500PM ET enumeration Running nmap script scan using script: http-methods.</w:t>
-      </w:r>
-    </w:p>
-    <w:p>
-      <w:pPr>
-        <w:pStyle w:val="ActivityBullet"/>
-      </w:pPr>
-      <w:r>
-        <w:rPr>
-          <w:sz w:val="17"/>
-        </w:rPr>
-        <w:t>2026-01-29 14:04:47-0500PM ET enumeration Running nmap script scan using script: http-headers.</w:t>
-      </w:r>
-    </w:p>
-    <w:p>
-      <w:pPr>
-        <w:pStyle w:val="ActivityBullet"/>
-      </w:pPr>
-      <w:r>
-        <w:rPr>
-          <w:sz w:val="17"/>
-        </w:rPr>
-        <w:t>2026-01-29 14:04:47-0500PM ET enumeration Running nmap script scan using script: http-robots.txt.</w:t>
-      </w:r>
-    </w:p>
-    <w:p>
-      <w:pPr>
-        <w:pStyle w:val="ActivityBullet"/>
-      </w:pPr>
-      <w:r>
-        <w:rPr>
-          <w:sz w:val="17"/>
-        </w:rPr>
-        <w:t>2026-01-29 14:04:47-0500PM ET enumeration Running nmap script scan using script: http-robots.txt.</w:t>
-      </w:r>
-    </w:p>
-    <w:p>
-      <w:pPr>
-        <w:pStyle w:val="ActivityBullet"/>
-      </w:pPr>
-      <w:r>
-        <w:rPr>
-          <w:sz w:val="17"/>
-        </w:rPr>
-        <w:t>2026-01-29 14:04:47-0500PM ET enumeration Running nmap script scan using script: http-put.</w:t>
-      </w:r>
-    </w:p>
-    <w:p>
-      <w:pPr>
-        <w:pStyle w:val="ActivityBullet"/>
-      </w:pPr>
-      <w:r>
-        <w:rPr>
-          <w:sz w:val="17"/>
-        </w:rPr>
-        <w:t>2026-01-29 14:04:47-0500PM ET enumeration Running nmap script scan using script: http-title.</w:t>
-      </w:r>
-    </w:p>
-    <w:p>
-      <w:pPr>
-        <w:pStyle w:val="ActivityBullet"/>
-      </w:pPr>
-      <w:r>
-        <w:rPr>
-          <w:sz w:val="17"/>
-        </w:rPr>
-        <w:t>2026-01-29 14:04:47-0500PM ET enumeration Running nmap script scan using script: http-shellshock.</w:t>
-      </w:r>
-    </w:p>
-    <w:p>
-      <w:pPr>
-        <w:pStyle w:val="ActivityBullet"/>
-      </w:pPr>
-      <w:r>
-        <w:rPr>
-          <w:sz w:val="17"/>
-        </w:rPr>
-        <w:t>2026-01-29 14:04:47-0500PM ET enumeration Running nmap script scan using script: http-methods.</w:t>
-      </w:r>
-    </w:p>
-    <w:p>
-      <w:pPr>
-        <w:pStyle w:val="ActivityBullet"/>
-      </w:pPr>
-      <w:r>
-        <w:rPr>
-          <w:sz w:val="17"/>
-        </w:rPr>
-        <w:t>2026-01-29 14:04:47-0500PM ET enumeration Running nmap script scan using script: sslv2.</w:t>
-      </w:r>
-    </w:p>
-    <w:p>
-      <w:pPr>
-        <w:pStyle w:val="ActivityBullet"/>
-      </w:pPr>
-      <w:r>
-        <w:rPr>
-          <w:sz w:val="17"/>
-        </w:rPr>
-        <w:t>2026-01-29 14:04:47-0500PM ET enumeration Running nmap script scan using script: ssl-cert.</w:t>
-      </w:r>
-    </w:p>
-    <w:p>
-      <w:pPr>
-        <w:pStyle w:val="ActivityBullet"/>
-      </w:pPr>
-      <w:r>
-        <w:rPr>
-          <w:sz w:val="17"/>
-        </w:rPr>
-        <w:t>2026-01-29 14:04:47-0500PM ET enumeration Running nmap script scan using script: ssl-enum-ciphers.</w:t>
-      </w:r>
-    </w:p>
-    <w:p>
-      <w:pPr>
-        <w:pStyle w:val="ActivityBullet"/>
-      </w:pPr>
-      <w:r>
-        <w:rPr>
-          <w:sz w:val="17"/>
-        </w:rPr>
-        <w:t>2026-01-29 14:04:47-0500PM ET enumeration Running nmap script scan using script: http-shellshock.</w:t>
-      </w:r>
-    </w:p>
-    <w:p>
-      <w:pPr>
-        <w:pStyle w:val="ActivityBullet"/>
-      </w:pPr>
-      <w:r>
-        <w:rPr>
-          <w:sz w:val="17"/>
-        </w:rPr>
-        <w:t>2026-01-29 14:04:47-0500PM ET enumeration Running nmap script scan using script: ssl-poodle.</w:t>
-      </w:r>
-    </w:p>
-    <w:p>
-      <w:pPr>
-        <w:pStyle w:val="ActivityBullet"/>
-      </w:pPr>
-      <w:r>
-        <w:rPr>
-          <w:sz w:val="17"/>
-        </w:rPr>
-        <w:t>2026-01-29 14:04:47-0500PM ET enumeration Running nmap script scan using script: http-put.</w:t>
-      </w:r>
-    </w:p>
-    <w:p>
-      <w:pPr>
-        <w:pStyle w:val="ActivityBullet"/>
-      </w:pPr>
-      <w:r>
-        <w:rPr>
-          <w:sz w:val="17"/>
-        </w:rPr>
-        <w:t>2026-01-29 14:04:47-0500PM ET enumeration Running nmap script scan using script: ssl-heartbleed.</w:t>
-      </w:r>
-    </w:p>
-    <w:p>
-      <w:pPr>
-        <w:pStyle w:val="ActivityBullet"/>
-      </w:pPr>
-      <w:r>
-        <w:rPr>
-          <w:sz w:val="17"/>
-        </w:rPr>
-        <w:t>2026-01-29 14:04:47-0500PM ET enumeration Running nmap script scan using script: http-title.</w:t>
-      </w:r>
-    </w:p>
-    <w:p>
-      <w:pPr>
-        <w:pStyle w:val="ActivityBullet"/>
-      </w:pPr>
-      <w:r>
-        <w:rPr>
-          <w:sz w:val="17"/>
-        </w:rPr>
-        <w:t>2026-01-29 14:04:47-0500PM ET enumeration Running nmap script scan using script: ssl-date.</w:t>
-      </w:r>
-    </w:p>
-    <w:p>
-      <w:pPr>
-        <w:pStyle w:val="ActivityBullet"/>
-      </w:pPr>
-      <w:r>
-        <w:rPr>
-          <w:sz w:val="17"/>
-        </w:rPr>
-        <w:t>2026-01-29 14:04:47-0500PM ET enumeration Queuing up MSF module: auxiliary/scanner/ssh/ssh_version.</w:t>
-      </w:r>
-    </w:p>
-    <w:p>
-      <w:pPr>
-        <w:pStyle w:val="ActivityBullet"/>
-      </w:pPr>
-      <w:r>
-        <w:rPr>
-          <w:sz w:val="17"/>
-        </w:rPr>
-        <w:t>2026-01-29 14:05:50-0500PM ET enumeration Completed MSF module: auxiliary/scanner/ssh/ssh_version.</w:t>
-      </w:r>
-    </w:p>
-    <w:p>
-      <w:pPr>
-        <w:pStyle w:val="ActivityBullet"/>
-      </w:pPr>
-      <w:r>
-        <w:rPr>
-          <w:sz w:val="17"/>
-        </w:rPr>
-        <w:t>2026-01-29 14:05:50-0500PM ET enumeration Completed nmap script scan using script: http-methods.</w:t>
-      </w:r>
-    </w:p>
-    <w:p>
-      <w:pPr>
-        <w:pStyle w:val="ActivityBullet"/>
-      </w:pPr>
-      <w:r>
-        <w:rPr>
-          <w:sz w:val="17"/>
-        </w:rPr>
-        <w:t>2026-01-29 14:05:50-0500PM ET enumeration Completed nmap script scan using script: ssl-enum-ciphers.</w:t>
-      </w:r>
-    </w:p>
-    <w:p>
-      <w:pPr>
-        <w:pStyle w:val="ActivityBullet"/>
-      </w:pPr>
-      <w:r>
-        <w:rPr>
-          <w:sz w:val="17"/>
-        </w:rPr>
-        <w:t>2026-01-29 14:05:50-0500PM ET enumeration Completed nmap script scan using script: http-put.</w:t>
-      </w:r>
-    </w:p>
-    <w:p>
-      <w:pPr>
-        <w:pStyle w:val="ActivityBullet"/>
-      </w:pPr>
-      <w:r>
-        <w:rPr>
-          <w:sz w:val="17"/>
-        </w:rPr>
-        <w:t>2026-01-29 14:05:50-0500PM ET enumeration Completed nmap script scan using script: http-robots.txt.</w:t>
-      </w:r>
-    </w:p>
-    <w:p>
-      <w:pPr>
-        <w:pStyle w:val="ActivityBullet"/>
-      </w:pPr>
-      <w:r>
-        <w:rPr>
-          <w:sz w:val="17"/>
-        </w:rPr>
-        <w:lastRenderedPageBreak/>
-        <w:t>2026-01-29 14:05:50-0500PM ET enumeration Completed nmap script scan using script: ssl-heartbleed.</w:t>
-      </w:r>
-    </w:p>
-    <w:p>
-      <w:pPr>
-        <w:pStyle w:val="ActivityBullet"/>
-      </w:pPr>
-      <w:r>
-        <w:rPr>
-          <w:sz w:val="17"/>
-        </w:rPr>
-        <w:t>2026-01-29 14:05:50-0500PM ET enumeration Completed nmap script scan using script: http-shellshock.</w:t>
-      </w:r>
-    </w:p>
-    <w:p>
-      <w:pPr>
-        <w:pStyle w:val="ActivityBullet"/>
-      </w:pPr>
-      <w:r>
-        <w:rPr>
-          <w:sz w:val="17"/>
-        </w:rPr>
-        <w:t>2026-01-29 14:05:50-0500PM ET enumeration Completed nmap script scan using script: http-robots.txt.</w:t>
-      </w:r>
-    </w:p>
-    <w:p>
-      <w:pPr>
-        <w:pStyle w:val="ActivityBullet"/>
-      </w:pPr>
-      <w:r>
-        <w:rPr>
-          <w:sz w:val="17"/>
-        </w:rPr>
-        <w:t>2026-01-29 14:05:51-0500PM ET enumeration Completed nmap script scan using script: http-put.</w:t>
-      </w:r>
-    </w:p>
-    <w:p>
-      <w:pPr>
-        <w:pStyle w:val="ActivityBullet"/>
-      </w:pPr>
-      <w:r>
-        <w:rPr>
-          <w:sz w:val="17"/>
-        </w:rPr>
-        <w:t>2026-01-29 14:05:51-0500PM ET enumeration Completed nmap script scan using script: http-headers.</w:t>
-      </w:r>
-    </w:p>
-    <w:p>
-      <w:pPr>
-        <w:pStyle w:val="ActivityBullet"/>
-      </w:pPr>
-      <w:r>
-        <w:rPr>
-          <w:sz w:val="17"/>
-        </w:rPr>
-        <w:t>2026-01-29 14:05:51-0500PM ET enumeration Completed nmap script scan using script: http-methods.</w:t>
-      </w:r>
-    </w:p>
-    <w:p>
-      <w:pPr>
-        <w:pStyle w:val="ActivityBullet"/>
-      </w:pPr>
-      <w:r>
-        <w:rPr>
-          <w:sz w:val="17"/>
-        </w:rPr>
-        <w:t>2026-01-29 14:05:51-0500PM ET enumeration Completed nmap script scan using script: ssl-date.</w:t>
-      </w:r>
-    </w:p>
-    <w:p>
-      <w:pPr>
-        <w:pStyle w:val="ActivityBullet"/>
-      </w:pPr>
-      <w:r>
-        <w:rPr>
-          <w:sz w:val="17"/>
-        </w:rPr>
-        <w:t>2026-01-29 14:05:51-0500PM ET enumeration Completed nmap script scan using script: http-title.</w:t>
-      </w:r>
-    </w:p>
-    <w:p>
-      <w:pPr>
-        <w:pStyle w:val="ActivityBullet"/>
-      </w:pPr>
-      <w:r>
-        <w:rPr>
-          <w:sz w:val="17"/>
-        </w:rPr>
-        <w:t>2026-01-29 14:05:51-0500PM ET enumeration Completed nmap script scan using script: http-shellshock.</w:t>
-      </w:r>
-    </w:p>
-    <w:p>
-      <w:pPr>
-        <w:pStyle w:val="ActivityBullet"/>
-      </w:pPr>
-      <w:r>
-        <w:rPr>
-          <w:sz w:val="17"/>
-        </w:rPr>
-        <w:t>2026-01-29 14:05:51-0500PM ET enumeration Completed nmap script scan using script: http-headers.</w:t>
-      </w:r>
-    </w:p>
-    <w:p>
-      <w:pPr>
-        <w:pStyle w:val="ActivityBullet"/>
-      </w:pPr>
-      <w:r>
-        <w:rPr>
-          <w:sz w:val="17"/>
-        </w:rPr>
-        <w:t>2026-01-29 14:05:51-0500PM ET enumeration Completed nmap script scan using script: ssl-poodle.</w:t>
-      </w:r>
-    </w:p>
-    <w:p>
-      <w:pPr>
-        <w:pStyle w:val="ActivityBullet"/>
-      </w:pPr>
-      <w:r>
-        <w:rPr>
-          <w:sz w:val="17"/>
-        </w:rPr>
-        <w:t>2026-01-29 14:05:51-0500PM ET enumeration Completed nmap script scan using script: ssl-cert.</w:t>
-      </w:r>
-    </w:p>
-    <w:p>
-      <w:pPr>
-        <w:pStyle w:val="ActivityBullet"/>
-      </w:pPr>
-      <w:r>
-        <w:rPr>
-          <w:sz w:val="17"/>
-        </w:rPr>
-        <w:t>2026-01-29 14:05:51-0500PM ET enumeration Completed nmap script scan using script: sslv2.</w:t>
-      </w:r>
-    </w:p>
-    <w:p>
-      <w:pPr>
-        <w:pStyle w:val="ActivityBullet"/>
-      </w:pPr>
-      <w:r>
-        <w:rPr>
-          <w:sz w:val="17"/>
-        </w:rPr>
-        <w:t>2026-01-29 14:05:51-0500PM ET enumeration Completed nmap script scan using script: http-title.</w:t>
-      </w:r>
-    </w:p>
-    <w:p>
-      <w:pPr>
-        <w:pStyle w:val="ActivityBullet"/>
-      </w:pPr>
-      <w:r>
-        <w:rPr>
-          <w:sz w:val="17"/>
-        </w:rPr>
-        <w:t>2026-01-29 14:05:51-0500PM ET enumeration Peforming a hidden directory enumeration attack on 80/tcp.</w:t>
-      </w:r>
-    </w:p>
-    <w:p>
-      <w:pPr>
-        <w:pStyle w:val="ActivityBullet"/>
-      </w:pPr>
-      <w:r>
-        <w:rPr>
-          <w:sz w:val="17"/>
-        </w:rPr>
-        <w:t>2026-01-29 14:05:54-0500PM ET enumeration Running nmap script scan using script: sshv1.</w:t>
-      </w:r>
-    </w:p>
-    <w:p>
-      <w:pPr>
-        <w:pStyle w:val="ActivityBullet"/>
-      </w:pPr>
-      <w:r>
-        <w:rPr>
-          <w:sz w:val="17"/>
-        </w:rPr>
-        <w:t>2026-01-29 14:05:54-0500PM ET enumeration Running nmap script scan using script: ssh2-enum-algos.</w:t>
-      </w:r>
-    </w:p>
-    <w:p>
-      <w:pPr>
-        <w:pStyle w:val="ActivityBullet"/>
-      </w:pPr>
-      <w:r>
-        <w:rPr>
-          <w:sz w:val="17"/>
-        </w:rPr>
-        <w:t>2026-01-29 14:05:54-0500PM ET enumeration Running nmap script scan using script: ssh-auth-methods.</w:t>
-      </w:r>
-    </w:p>
-    <w:p>
-      <w:pPr>
-        <w:pStyle w:val="ActivityBullet"/>
-      </w:pPr>
-      <w:r>
-        <w:rPr>
-          <w:sz w:val="17"/>
-        </w:rPr>
-        <w:t>2026-01-29 14:05:54-0500PM ET enumeration Analyzing SSL/TLS protocols on port 443/tcp.</w:t>
-      </w:r>
-    </w:p>
-    <w:p>
-      <w:pPr>
-        <w:pStyle w:val="ActivityBullet"/>
-      </w:pPr>
-      <w:r>
-        <w:rPr>
-          <w:sz w:val="17"/>
-        </w:rPr>
-        <w:t>2026-01-29 14:06:55-0500PM ET enumeration Completed SSL/TLS analysis on ports 443/tcp.</w:t>
-      </w:r>
-    </w:p>
-    <w:p>
-      <w:pPr>
-        <w:pStyle w:val="ActivityBullet"/>
-      </w:pPr>
-      <w:r>
-        <w:rPr>
-          <w:sz w:val="17"/>
-        </w:rPr>
-        <w:t>2026-01-29 14:06:55-0500PM ET enumeration Completed hidden directory enumeration scan.</w:t>
-      </w:r>
-    </w:p>
-    <w:p>
-      <w:pPr>
-        <w:pStyle w:val="ActivityBullet"/>
-      </w:pPr>
-      <w:r>
-        <w:rPr>
-          <w:sz w:val="17"/>
-        </w:rPr>
-        <w:t>2026-01-29 14:06:55-0500PM ET enumeration Peforming a hidden directory enumeration attack on 443/tcp.</w:t>
-      </w:r>
-    </w:p>
-    <w:p>
-      <w:pPr>
-        <w:pStyle w:val="ActivityBullet"/>
-      </w:pPr>
-      <w:r>
-        <w:rPr>
-          <w:sz w:val="17"/>
-        </w:rPr>
-        <w:t>2026-01-29 14:06:55-0500PM ET enumeration Completed nmap script scan using script: ssh2-enum-algos.</w:t>
-      </w:r>
-    </w:p>
-    <w:p>
-      <w:pPr>
-        <w:pStyle w:val="ActivityBullet"/>
-      </w:pPr>
-      <w:r>
-        <w:rPr>
-          <w:sz w:val="17"/>
-        </w:rPr>
-        <w:t>2026-01-29 14:06:55-0500PM ET enumeration Completed nmap script scan using script: ssh-auth-methods.</w:t>
-      </w:r>
-    </w:p>
-    <w:p>
-      <w:pPr>
-        <w:pStyle w:val="ActivityBullet"/>
-      </w:pPr>
-      <w:r>
-        <w:rPr>
-          <w:sz w:val="17"/>
-        </w:rPr>
-        <w:t>2026-01-29 14:06:55-0500PM ET enumeration Completed nmap script scan using script: sshv1.</w:t>
-      </w:r>
-    </w:p>
-    <w:p>
-      <w:pPr>
-        <w:pStyle w:val="ActivityBullet"/>
-      </w:pPr>
-      <w:r>
-        <w:rPr>
-          <w:sz w:val="17"/>
-        </w:rPr>
-        <w:t>2026-01-29 14:06:55-0500PM ET enumeration Completed enumerating SSH services.</w:t>
-      </w:r>
-    </w:p>
-    <w:p>
-      <w:pPr>
-        <w:pStyle w:val="ActivityBullet"/>
-      </w:pPr>
-      <w:r>
-        <w:rPr>
-          <w:sz w:val="17"/>
-        </w:rPr>
-        <w:t>2026-01-29 14:06:58-0500PM ET enumeration Analyzing web services running on port 80/tcp.</w:t>
-      </w:r>
-    </w:p>
-    <w:p>
-      <w:pPr>
-        <w:pStyle w:val="ActivityBullet"/>
-      </w:pPr>
-      <w:r>
-        <w:rPr>
-          <w:sz w:val="17"/>
-        </w:rPr>
-        <w:t>2026-01-29 14:08:10-0500PM ET enumeration Completed analyzing web services running on port 80/tcp.</w:t>
-      </w:r>
-    </w:p>
-    <w:p>
-      <w:pPr>
-        <w:pStyle w:val="ActivityBullet"/>
-      </w:pPr>
-      <w:r>
-        <w:rPr>
-          <w:sz w:val="17"/>
-        </w:rPr>
-        <w:t>2026-01-29 14:08:10-0500PM ET enumeration Completed hidden directory enumeration scan.</w:t>
-      </w:r>
-    </w:p>
-    <w:p>
-      <w:pPr>
-        <w:pStyle w:val="ActivityBullet"/>
-      </w:pPr>
-      <w:r>
-        <w:rPr>
-          <w:sz w:val="17"/>
-        </w:rPr>
-        <w:t>2026-01-29 14:08:10-0500PM ET enumeration Completed analyzing web services running on port 80/tcp.</w:t>
-      </w:r>
-    </w:p>
-    <w:p>
-      <w:pPr>
-        <w:pStyle w:val="ActivityBullet"/>
-      </w:pPr>
-      <w:r>
-        <w:rPr>
-          <w:sz w:val="17"/>
-        </w:rPr>
-        <w:t>2026-01-29 14:08:10-0500PM ET enumeration Completed enumerating HTTP services.</w:t>
-      </w:r>
-    </w:p>
-    <w:p>
-      <w:pPr>
-        <w:pStyle w:val="ActivityBullet"/>
-      </w:pPr>
-      <w:r>
-        <w:rPr>
-          <w:sz w:val="17"/>
-        </w:rPr>
-        <w:lastRenderedPageBreak/>
-        <w:t>2026-01-29 14:08:13-0500PM ET enumeration Analyzing web services running on port 443/tcp.</w:t>
-      </w:r>
-    </w:p>
-    <w:p>
-      <w:pPr>
-        <w:pStyle w:val="ActivityBullet"/>
-      </w:pPr>
-      <w:r>
-        <w:rPr>
-          <w:sz w:val="17"/>
-        </w:rPr>
-        <w:t>2026-01-29 14:09:15-0500PM ET enumeration Completed analyzing web services running on port 443/tcp.</w:t>
-      </w:r>
-    </w:p>
-    <w:p>
-      <w:pPr>
-        <w:pStyle w:val="ActivityBullet"/>
-      </w:pPr>
-      <w:r>
-        <w:rPr>
-          <w:sz w:val="17"/>
-        </w:rPr>
-        <w:t>2026-01-29 14:09:15-0500PM ET enumeration Completed analyzing web services running on port 443/tcp.</w:t>
-      </w:r>
-    </w:p>
-    <w:p>
-      <w:pPr>
-        <w:pStyle w:val="ActivityBullet"/>
-      </w:pPr>
-      <w:r>
-        <w:rPr>
-          <w:sz w:val="17"/>
-        </w:rPr>
-        <w:t>2026-01-29 14:09:16-0500PM ET enumeration Completed enumerating HTTPS services.</w:t>
-      </w:r>
-    </w:p>
-    <w:p>
-      <w:pPr>
-        <w:pStyle w:val="ActivityBullet"/>
-      </w:pPr>
-      <w:r>
-        <w:rPr>
-          <w:sz w:val="17"/>
-        </w:rPr>
-        <w:t>2026-01-29 14:09:45-0500PM ET enumeration Enumeration module completed.</w:t>
-      </w:r>
-    </w:p>
-    <w:p>
-      <w:pPr>
-        <w:pStyle w:val="ActivityBullet"/>
-      </w:pPr>
-      <w:r>
-        <w:rPr>
-          <w:sz w:val="17"/>
-        </w:rPr>
-        <w:t>2026-01-29 14:10:06-0500PM ET exploit Launching exploit module.</w:t>
-      </w:r>
-    </w:p>
-    <w:p>
-      <w:pPr>
-        <w:pStyle w:val="ActivityBullet"/>
-      </w:pPr>
-      <w:r>
-        <w:rPr>
-          <w:sz w:val="17"/>
-        </w:rPr>
-        <w:t>2026-01-29 14:10:11-0500PM ET exploit Queuing up hydra attack: SSH password attack.</w:t>
-      </w:r>
-    </w:p>
-    <w:p>
-      <w:pPr>
-        <w:pStyle w:val="ActivityBullet"/>
-      </w:pPr>
-      <w:r>
-        <w:rPr>
-          <w:sz w:val="17"/>
-        </w:rPr>
-        <w:t>2026-01-29 14:11:16-0500PM ET exploit Completed hydra attack: SSH password attack.</w:t>
-      </w:r>
-    </w:p>
-    <w:p>
-      <w:pPr>
-        <w:pStyle w:val="ActivityBullet"/>
-      </w:pPr>
-      <w:r>
-        <w:rPr>
-          <w:sz w:val="17"/>
-        </w:rPr>
-        <w:t>2026-01-29 14:11:16-0500PM ET exploit Completed SSH password attack.</w:t>
-      </w:r>
-    </w:p>
-    <w:p>
-      <w:pPr>
-        <w:pStyle w:val="ActivityBullet"/>
-      </w:pPr>
-      <w:r>
-        <w:rPr>
-          <w:sz w:val="17"/>
-        </w:rPr>
-        <w:t>2026-01-29 14:11:49-0500PM ET exploit Completed exploit module.</w:t>
-      </w:r>
-    </w:p>
-    <w:p>
-      <w:pPr>
-        <w:numPr>
-          <w:ilvl w:val="0"/>
-          <w:numId w:val="10"/>
-        </w:numPr>
-        <w:spacing w:line="259" w:lineRule="auto"/>
-        <w:contextualSpacing/>
-        <w:rPr>
-          <w:rFonts w:ascii="Corbel" w:eastAsia="Calibri" w:hAnsi="Corbel" w:cs="Arial"/>
-          <w:color w:val="404040"/>
-          <w:kern w:val="0"/>
-          <w:sz w:val="18"/>
-          <w:szCs w:val="18"/>
-          <w:lang w:val="fr-FR"/>
-          <w14:ligatures w14:val="none"/>
-        </w:rPr>
-      </w:pPr>
-      <w:r>
-        <w:rPr>
-          <w:rFonts w:ascii="Corbel" w:eastAsia="Calibri" w:hAnsi="Corbel" w:cs="Arial"/>
-          <w:color w:val="404040"/>
-          <w:kern w:val="0"/>
-          <w:szCs w:val="22"/>
-          <w:lang w:val="fr-FR"/>
-          <w14:ligatures w14:val="none"/>
-        </w:rPr>
-        <w:br w:type="page"/>
-      </w:r>
-    </w:p>
-    <w:p>
-      <w:pPr>
-        <w:keepNext/>
-        <w:keepLines/>
-        <w:spacing w:before="360" w:after="120" w:line="259" w:lineRule="auto"/>
-        <w:outlineLvl w:val="0"/>
+          <w14:ligatures w14:val="none"/>
+        </w:rPr>
+      </w:pPr>
+      <w:bookmarkStart w:id="15" w:name="_Toc190866256"/>
+      <w:r>
         <w:rPr>
           <w:rFonts w:ascii="Handel Gothic D" w:eastAsia="DengXian Light" w:hAnsi="Handel Gothic D" w:cs="Times New Roman"/>
           <w:b/>
@@ -6326,19 +6579,6 @@
           <w:kern w:val="0"/>
           <w:sz w:val="44"/>
           <w:szCs w:val="32"/>
-          <w14:ligatures w14:val="none"/>
-        </w:rPr>
-      </w:pPr>
-      <w:bookmarkStart w:id="15" w:name="_Toc190866256"/>
-      <w:r>
-        <w:rPr>
-          <w:rFonts w:ascii="Handel Gothic D" w:eastAsia="DengXian Light" w:hAnsi="Handel Gothic D" w:cs="Times New Roman"/>
-          <w:b/>
-          <w:caps/>
-          <w:color w:val="FF6633"/>
-          <w:kern w:val="0"/>
-          <w:sz w:val="44"/>
-          <w:szCs w:val="32"/>
           <w:highlight w:val="yellow"/>
           <w14:ligatures w14:val="none"/>
         </w:rPr>
@@ -6367,7 +6607,29 @@
           <w:szCs w:val="22"/>
           <w14:ligatures w14:val="none"/>
         </w:rPr>
-        <w:t>The following items are the highest priority recommendations to help improve compliance, defensibility and resilience. These items may not be fully inclusive of all discovered deficiencies and reflect OrbitalFire’s expert opinion regarding return on investment.</w:t>
+        <w:t xml:space="preserve">The following items are the highest priority recommendations to help improve compliance, defensibility and resilience. These items may not be fully inclusive of all discovered deficiencies and reflect </w:t>
+      </w:r>
+      <w:proofErr w:type="spellStart"/>
+      <w:r>
+        <w:rPr>
+          <w:rFonts w:ascii="Corbel" w:eastAsia="Calibri" w:hAnsi="Corbel" w:cs="Arial"/>
+          <w:color w:val="404040"/>
+          <w:kern w:val="0"/>
+          <w:szCs w:val="22"/>
+          <w14:ligatures w14:val="none"/>
+        </w:rPr>
+        <w:t>OrbitalFire’s</w:t>
+      </w:r>
+      <w:proofErr w:type="spellEnd"/>
+      <w:r>
+        <w:rPr>
+          <w:rFonts w:ascii="Corbel" w:eastAsia="Calibri" w:hAnsi="Corbel" w:cs="Arial"/>
+          <w:color w:val="404040"/>
+          <w:kern w:val="0"/>
+          <w:szCs w:val="22"/>
+          <w14:ligatures w14:val="none"/>
+        </w:rPr>
+        <w:t xml:space="preserve"> expert opinion regarding return on investment.</w:t>
       </w:r>
     </w:p>
     <w:p>
@@ -6450,7 +6712,29 @@
           <w:szCs w:val="22"/>
           <w14:ligatures w14:val="none"/>
         </w:rPr>
-        <w:t xml:space="preserve"> – OrbitalFire can provide complete remediation</w:t>
+        <w:t xml:space="preserve"> – </w:t>
+      </w:r>
+      <w:proofErr w:type="spellStart"/>
+      <w:r>
+        <w:rPr>
+          <w:rFonts w:ascii="Corbel" w:eastAsia="Calibri" w:hAnsi="Corbel" w:cs="Arial"/>
+          <w:color w:val="404040"/>
+          <w:kern w:val="0"/>
+          <w:szCs w:val="22"/>
+          <w14:ligatures w14:val="none"/>
+        </w:rPr>
+        <w:t>OrbitalFire</w:t>
+      </w:r>
+      <w:proofErr w:type="spellEnd"/>
+      <w:r>
+        <w:rPr>
+          <w:rFonts w:ascii="Corbel" w:eastAsia="Calibri" w:hAnsi="Corbel" w:cs="Arial"/>
+          <w:color w:val="404040"/>
+          <w:kern w:val="0"/>
+          <w:szCs w:val="22"/>
+          <w14:ligatures w14:val="none"/>
+        </w:rPr>
+        <w:t xml:space="preserve"> can provide complete remediation</w:t>
       </w:r>
     </w:p>
     <w:p>
@@ -6477,7 +6761,7 @@
           <w14:ligatures w14:val="none"/>
         </w:rPr>
         <w:drawing>
-          <wp:inline distT="0" distB="0" distL="0" distR="0" wp14:anchorId="03962334" wp14:editId="74A26A44">
+          <wp:inline distT="0" distB="0" distL="0" distR="0" wp14:anchorId="03962334" wp14:editId="4315B6F8">
             <wp:extent cx="152400" cy="152400"/>
             <wp:effectExtent l="0" t="0" r="0" b="0"/>
             <wp:docPr id="2011428596" name="Picture 2011428596" descr="Fire with solid fill"/>
@@ -6542,7 +6826,29 @@
           <w:szCs w:val="22"/>
           <w14:ligatures w14:val="none"/>
         </w:rPr>
-        <w:t xml:space="preserve"> – OrbitalFire can assist with remediation</w:t>
+        <w:t xml:space="preserve"> – </w:t>
+      </w:r>
+      <w:proofErr w:type="spellStart"/>
+      <w:r>
+        <w:rPr>
+          <w:rFonts w:ascii="Corbel" w:eastAsia="Calibri" w:hAnsi="Corbel" w:cs="Arial"/>
+          <w:color w:val="404040"/>
+          <w:kern w:val="0"/>
+          <w:szCs w:val="22"/>
+          <w14:ligatures w14:val="none"/>
+        </w:rPr>
+        <w:t>OrbitalFire</w:t>
+      </w:r>
+      <w:proofErr w:type="spellEnd"/>
+      <w:r>
+        <w:rPr>
+          <w:rFonts w:ascii="Corbel" w:eastAsia="Calibri" w:hAnsi="Corbel" w:cs="Arial"/>
+          <w:color w:val="404040"/>
+          <w:kern w:val="0"/>
+          <w:szCs w:val="22"/>
+          <w14:ligatures w14:val="none"/>
+        </w:rPr>
+        <w:t xml:space="preserve"> can assist with remediation</w:t>
       </w:r>
       <w:bookmarkStart w:id="16" w:name="_Hlk194407007"/>
     </w:p>

</xml_diff>

<commit_message>
Added functionality to populate Appendix
</commit_message>
<xml_diff>
--- a/Source_Code/Reports/Sample499/FindingsReportTest.docx
+++ b/Source_Code/Reports/Sample499/FindingsReportTest.docx
@@ -601,7 +601,7 @@
           <w14:ligatures w14:val="none"/>
         </w:rPr>
         <w:drawing>
-          <wp:anchor distT="0" distB="0" distL="114300" distR="114300" simplePos="0" relativeHeight="251662336" behindDoc="0" locked="0" layoutInCell="1" allowOverlap="1" wp14:anchorId="56FF54E8" wp14:editId="1688AA83">
+          <wp:anchor distT="0" distB="0" distL="114300" distR="114300" simplePos="0" relativeHeight="251662336" behindDoc="0" locked="0" layoutInCell="1" allowOverlap="1" wp14:anchorId="56FF54E8" wp14:editId="56DD4328">
             <wp:simplePos x="0" y="0"/>
             <wp:positionH relativeFrom="margin">
               <wp:posOffset>1163955</wp:posOffset>
@@ -5546,7 +5546,35 @@
         <w:rPr>
           <w:lang w:val="fr-FR"/>
         </w:rPr>
-        <w:t>47-0500PM ET exposurescout Initiating ExposureScout module.</w:t>
+        <w:t xml:space="preserve">47-0500PM ET </w:t>
+      </w:r>
+      <w:proofErr w:type="spellStart"/>
+      <w:r>
+        <w:rPr>
+          <w:lang w:val="fr-FR"/>
+        </w:rPr>
+        <w:t>exposurescout</w:t>
+      </w:r>
+      <w:proofErr w:type="spellEnd"/>
+      <w:r>
+        <w:rPr>
+          <w:lang w:val="fr-FR"/>
+        </w:rPr>
+        <w:t xml:space="preserve"> Initiating </w:t>
+      </w:r>
+      <w:proofErr w:type="spellStart"/>
+      <w:r>
+        <w:rPr>
+          <w:lang w:val="fr-FR"/>
+        </w:rPr>
+        <w:t>ExposureScout</w:t>
+      </w:r>
+      <w:proofErr w:type="spellEnd"/>
+      <w:r>
+        <w:rPr>
+          <w:lang w:val="fr-FR"/>
+        </w:rPr>
+        <w:t xml:space="preserve"> module.</w:t>
       </w:r>
     </w:p>
     <w:p>
@@ -5590,7 +5618,63 @@
         <w:rPr>
           <w:lang w:val="fr-FR"/>
         </w:rPr>
-        <w:t>13-0500PM ET exposurescout Completed subdomain enumeration.</w:t>
+        <w:t xml:space="preserve">13-0500PM ET </w:t>
+      </w:r>
+      <w:proofErr w:type="spellStart"/>
+      <w:r>
+        <w:rPr>
+          <w:lang w:val="fr-FR"/>
+        </w:rPr>
+        <w:t>exposurescout</w:t>
+      </w:r>
+      <w:proofErr w:type="spellEnd"/>
+      <w:r>
+        <w:rPr>
+          <w:lang w:val="fr-FR"/>
+        </w:rPr>
+        <w:t xml:space="preserve"> </w:t>
+      </w:r>
+      <w:proofErr w:type="spellStart"/>
+      <w:r>
+        <w:rPr>
+          <w:lang w:val="fr-FR"/>
+        </w:rPr>
+        <w:t>Completed</w:t>
+      </w:r>
+      <w:proofErr w:type="spellEnd"/>
+      <w:r>
+        <w:rPr>
+          <w:lang w:val="fr-FR"/>
+        </w:rPr>
+        <w:t xml:space="preserve"> </w:t>
+      </w:r>
+      <w:proofErr w:type="spellStart"/>
+      <w:r>
+        <w:rPr>
+          <w:lang w:val="fr-FR"/>
+        </w:rPr>
+        <w:t>subdomain</w:t>
+      </w:r>
+      <w:proofErr w:type="spellEnd"/>
+      <w:r>
+        <w:rPr>
+          <w:lang w:val="fr-FR"/>
+        </w:rPr>
+        <w:t xml:space="preserve"> </w:t>
+      </w:r>
+      <w:proofErr w:type="spellStart"/>
+      <w:r>
+        <w:rPr>
+          <w:lang w:val="fr-FR"/>
+        </w:rPr>
+        <w:t>enumeration</w:t>
+      </w:r>
+      <w:proofErr w:type="spellEnd"/>
+      <w:r>
+        <w:rPr>
+          <w:lang w:val="fr-FR"/>
+        </w:rPr>
+        <w:t>.</w:t>
       </w:r>
     </w:p>
     <w:p>
@@ -5634,7 +5718,49 @@
         <w:rPr>
           <w:lang w:val="fr-FR"/>
         </w:rPr>
-        <w:t>18-0500PM ET exposurescout Completed DNS enumeration.</w:t>
+        <w:t xml:space="preserve">18-0500PM ET </w:t>
+      </w:r>
+      <w:proofErr w:type="spellStart"/>
+      <w:r>
+        <w:rPr>
+          <w:lang w:val="fr-FR"/>
+        </w:rPr>
+        <w:t>exposurescout</w:t>
+      </w:r>
+      <w:proofErr w:type="spellEnd"/>
+      <w:r>
+        <w:rPr>
+          <w:lang w:val="fr-FR"/>
+        </w:rPr>
+        <w:t xml:space="preserve"> </w:t>
+      </w:r>
+      <w:proofErr w:type="spellStart"/>
+      <w:r>
+        <w:rPr>
+          <w:lang w:val="fr-FR"/>
+        </w:rPr>
+        <w:t>Completed</w:t>
+      </w:r>
+      <w:proofErr w:type="spellEnd"/>
+      <w:r>
+        <w:rPr>
+          <w:lang w:val="fr-FR"/>
+        </w:rPr>
+        <w:t xml:space="preserve"> DNS </w:t>
+      </w:r>
+      <w:proofErr w:type="spellStart"/>
+      <w:r>
+        <w:rPr>
+          <w:lang w:val="fr-FR"/>
+        </w:rPr>
+        <w:t>enumeration</w:t>
+      </w:r>
+      <w:proofErr w:type="spellEnd"/>
+      <w:r>
+        <w:rPr>
+          <w:lang w:val="fr-FR"/>
+        </w:rPr>
+        <w:t>.</w:t>
       </w:r>
     </w:p>
     <w:p>
@@ -5678,7 +5804,63 @@
         <w:rPr>
           <w:lang w:val="fr-FR"/>
         </w:rPr>
-        <w:t>28-0500PM ET exposurescout Ten (10) new doppelganger domains discovered.</w:t>
+        <w:t xml:space="preserve">28-0500PM ET </w:t>
+      </w:r>
+      <w:proofErr w:type="spellStart"/>
+      <w:r>
+        <w:rPr>
+          <w:lang w:val="fr-FR"/>
+        </w:rPr>
+        <w:t>exposurescout</w:t>
+      </w:r>
+      <w:proofErr w:type="spellEnd"/>
+      <w:r>
+        <w:rPr>
+          <w:lang w:val="fr-FR"/>
+        </w:rPr>
+        <w:t xml:space="preserve"> Ten (10) new </w:t>
+      </w:r>
+      <w:proofErr w:type="spellStart"/>
+      <w:r>
+        <w:rPr>
+          <w:lang w:val="fr-FR"/>
+        </w:rPr>
+        <w:t>doppelganger</w:t>
+      </w:r>
+      <w:proofErr w:type="spellEnd"/>
+      <w:r>
+        <w:rPr>
+          <w:lang w:val="fr-FR"/>
+        </w:rPr>
+        <w:t xml:space="preserve"> </w:t>
+      </w:r>
+      <w:proofErr w:type="spellStart"/>
+      <w:r>
+        <w:rPr>
+          <w:lang w:val="fr-FR"/>
+        </w:rPr>
+        <w:t>domains</w:t>
+      </w:r>
+      <w:proofErr w:type="spellEnd"/>
+      <w:r>
+        <w:rPr>
+          <w:lang w:val="fr-FR"/>
+        </w:rPr>
+        <w:t xml:space="preserve"> </w:t>
+      </w:r>
+      <w:proofErr w:type="spellStart"/>
+      <w:r>
+        <w:rPr>
+          <w:lang w:val="fr-FR"/>
+        </w:rPr>
+        <w:t>discovered</w:t>
+      </w:r>
+      <w:proofErr w:type="spellEnd"/>
+      <w:r>
+        <w:rPr>
+          <w:lang w:val="fr-FR"/>
+        </w:rPr>
+        <w:t>.</w:t>
       </w:r>
     </w:p>
     <w:p>
@@ -5706,7 +5888,77 @@
         <w:rPr>
           <w:lang w:val="fr-FR"/>
         </w:rPr>
-        <w:t>28-0500PM ET exposurescout Completed doppelganger domain enumeration.</w:t>
+        <w:t xml:space="preserve">28-0500PM ET </w:t>
+      </w:r>
+      <w:proofErr w:type="spellStart"/>
+      <w:r>
+        <w:rPr>
+          <w:lang w:val="fr-FR"/>
+        </w:rPr>
+        <w:t>exposurescout</w:t>
+      </w:r>
+      <w:proofErr w:type="spellEnd"/>
+      <w:r>
+        <w:rPr>
+          <w:lang w:val="fr-FR"/>
+        </w:rPr>
+        <w:t xml:space="preserve"> </w:t>
+      </w:r>
+      <w:proofErr w:type="spellStart"/>
+      <w:r>
+        <w:rPr>
+          <w:lang w:val="fr-FR"/>
+        </w:rPr>
+        <w:t>Completed</w:t>
+      </w:r>
+      <w:proofErr w:type="spellEnd"/>
+      <w:r>
+        <w:rPr>
+          <w:lang w:val="fr-FR"/>
+        </w:rPr>
+        <w:t xml:space="preserve"> </w:t>
+      </w:r>
+      <w:proofErr w:type="spellStart"/>
+      <w:r>
+        <w:rPr>
+          <w:lang w:val="fr-FR"/>
+        </w:rPr>
+        <w:t>doppelganger</w:t>
+      </w:r>
+      <w:proofErr w:type="spellEnd"/>
+      <w:r>
+        <w:rPr>
+          <w:lang w:val="fr-FR"/>
+        </w:rPr>
+        <w:t xml:space="preserve"> </w:t>
+      </w:r>
+      <w:proofErr w:type="spellStart"/>
+      <w:r>
+        <w:rPr>
+          <w:lang w:val="fr-FR"/>
+        </w:rPr>
+        <w:t>domain</w:t>
+      </w:r>
+      <w:proofErr w:type="spellEnd"/>
+      <w:r>
+        <w:rPr>
+          <w:lang w:val="fr-FR"/>
+        </w:rPr>
+        <w:t xml:space="preserve"> </w:t>
+      </w:r>
+      <w:proofErr w:type="spellStart"/>
+      <w:r>
+        <w:rPr>
+          <w:lang w:val="fr-FR"/>
+        </w:rPr>
+        <w:t>enumeration</w:t>
+      </w:r>
+      <w:proofErr w:type="spellEnd"/>
+      <w:r>
+        <w:rPr>
+          <w:lang w:val="fr-FR"/>
+        </w:rPr>
+        <w:t>.</w:t>
       </w:r>
     </w:p>
     <w:p>
@@ -5862,7 +6114,49 @@
         <w:rPr>
           <w:lang w:val="fr-FR"/>
         </w:rPr>
-        <w:t>44-0500PM ET exposurescout ExposureScout module completed.</w:t>
+        <w:t xml:space="preserve">44-0500PM ET </w:t>
+      </w:r>
+      <w:proofErr w:type="spellStart"/>
+      <w:r>
+        <w:rPr>
+          <w:lang w:val="fr-FR"/>
+        </w:rPr>
+        <w:t>exposurescout</w:t>
+      </w:r>
+      <w:proofErr w:type="spellEnd"/>
+      <w:r>
+        <w:rPr>
+          <w:lang w:val="fr-FR"/>
+        </w:rPr>
+        <w:t xml:space="preserve"> </w:t>
+      </w:r>
+      <w:proofErr w:type="spellStart"/>
+      <w:r>
+        <w:rPr>
+          <w:lang w:val="fr-FR"/>
+        </w:rPr>
+        <w:t>ExposureScout</w:t>
+      </w:r>
+      <w:proofErr w:type="spellEnd"/>
+      <w:r>
+        <w:rPr>
+          <w:lang w:val="fr-FR"/>
+        </w:rPr>
+        <w:t xml:space="preserve"> module </w:t>
+      </w:r>
+      <w:proofErr w:type="spellStart"/>
+      <w:r>
+        <w:rPr>
+          <w:lang w:val="fr-FR"/>
+        </w:rPr>
+        <w:t>completed</w:t>
+      </w:r>
+      <w:proofErr w:type="spellEnd"/>
+      <w:r>
+        <w:rPr>
+          <w:lang w:val="fr-FR"/>
+        </w:rPr>
+        <w:t>.</w:t>
       </w:r>
     </w:p>
     <w:p>
@@ -6939,7 +7233,63 @@
         <w:rPr>
           <w:lang w:val="fr-FR"/>
         </w:rPr>
-        <w:t>54-0500PM ET enumeration Analyzing SSL/TLS protocols on port 443/tcp.</w:t>
+        <w:t xml:space="preserve">54-0500PM ET </w:t>
+      </w:r>
+      <w:proofErr w:type="spellStart"/>
+      <w:r>
+        <w:rPr>
+          <w:lang w:val="fr-FR"/>
+        </w:rPr>
+        <w:t>enumeration</w:t>
+      </w:r>
+      <w:proofErr w:type="spellEnd"/>
+      <w:r>
+        <w:rPr>
+          <w:lang w:val="fr-FR"/>
+        </w:rPr>
+        <w:t xml:space="preserve"> </w:t>
+      </w:r>
+      <w:proofErr w:type="spellStart"/>
+      <w:r>
+        <w:rPr>
+          <w:lang w:val="fr-FR"/>
+        </w:rPr>
+        <w:t>Analyzing</w:t>
+      </w:r>
+      <w:proofErr w:type="spellEnd"/>
+      <w:r>
+        <w:rPr>
+          <w:lang w:val="fr-FR"/>
+        </w:rPr>
+        <w:t xml:space="preserve"> SSL/TLS </w:t>
+      </w:r>
+      <w:proofErr w:type="spellStart"/>
+      <w:r>
+        <w:rPr>
+          <w:lang w:val="fr-FR"/>
+        </w:rPr>
+        <w:t>protocols</w:t>
+      </w:r>
+      <w:proofErr w:type="spellEnd"/>
+      <w:r>
+        <w:rPr>
+          <w:lang w:val="fr-FR"/>
+        </w:rPr>
+        <w:t xml:space="preserve"> on port 443/</w:t>
+      </w:r>
+      <w:proofErr w:type="spellStart"/>
+      <w:r>
+        <w:rPr>
+          <w:lang w:val="fr-FR"/>
+        </w:rPr>
+        <w:t>tcp</w:t>
+      </w:r>
+      <w:proofErr w:type="spellEnd"/>
+      <w:r>
+        <w:rPr>
+          <w:lang w:val="fr-FR"/>
+        </w:rPr>
+        <w:t>.</w:t>
       </w:r>
     </w:p>
     <w:p>
@@ -7279,7 +7629,21 @@
         <w:rPr>
           <w:lang w:val="fr-FR"/>
         </w:rPr>
-        <w:t>06-0500PM ET exploit Launching exploit module.</w:t>
+        <w:t xml:space="preserve">06-0500PM ET exploit </w:t>
+      </w:r>
+      <w:proofErr w:type="spellStart"/>
+      <w:r>
+        <w:rPr>
+          <w:lang w:val="fr-FR"/>
+        </w:rPr>
+        <w:t>Launching</w:t>
+      </w:r>
+      <w:proofErr w:type="spellEnd"/>
+      <w:r>
+        <w:rPr>
+          <w:lang w:val="fr-FR"/>
+        </w:rPr>
+        <w:t xml:space="preserve"> exploit module.</w:t>
       </w:r>
     </w:p>
     <w:p>
@@ -7331,7 +7695,21 @@
         <w:rPr>
           <w:lang w:val="fr-FR"/>
         </w:rPr>
-        <w:t>49-0500PM ET exploit Completed exploit module.</w:t>
+        <w:t xml:space="preserve">49-0500PM ET exploit </w:t>
+      </w:r>
+      <w:proofErr w:type="spellStart"/>
+      <w:r>
+        <w:rPr>
+          <w:lang w:val="fr-FR"/>
+        </w:rPr>
+        <w:t>Completed</w:t>
+      </w:r>
+      <w:proofErr w:type="spellEnd"/>
+      <w:r>
+        <w:rPr>
+          <w:lang w:val="fr-FR"/>
+        </w:rPr>
+        <w:t xml:space="preserve"> exploit module.</w:t>
       </w:r>
     </w:p>
     <w:p>
@@ -7591,7 +7969,7 @@
           <w14:ligatures w14:val="none"/>
         </w:rPr>
         <w:drawing>
-          <wp:inline distT="0" distB="0" distL="0" distR="0" wp14:anchorId="03962334" wp14:editId="74204F21">
+          <wp:inline distT="0" distB="0" distL="0" distR="0" wp14:anchorId="03962334" wp14:editId="19C287B7">
             <wp:extent cx="152400" cy="152400"/>
             <wp:effectExtent l="0" t="0" r="0" b="0"/>
             <wp:docPr id="2011428596" name="Picture 2011428596" descr="Fire with solid fill"/>
@@ -7903,7 +8281,100 @@
         <w:t>Screenshot of Open PORTS TABLE</w:t>
       </w:r>
     </w:p>
-    <w:p/>
+    <w:p>
+      <w:pPr>
+        <w:spacing w:after="120"/>
+      </w:pPr>
+      <w:r>
+        <w:rPr>
+          <w:noProof/>
+        </w:rPr>
+        <w:drawing>
+          <wp:inline distT="0" distB="0" distL="0" distR="0" wp14:anchorId="4E859D90" wp14:editId="76FA8A08">
+            <wp:extent cx="5943600" cy="830317"/>
+            <wp:effectExtent l="0" t="0" r="0" b="0"/>
+            <wp:docPr id="2011428597" name="Picture 2011428597"/>
+            <wp:cNvGraphicFramePr>
+              <a:graphicFrameLocks xmlns:a="http://schemas.openxmlformats.org/drawingml/2006/main" noChangeAspect="1"/>
+            </wp:cNvGraphicFramePr>
+            <a:graphic xmlns:a="http://schemas.openxmlformats.org/drawingml/2006/main">
+              <a:graphicData uri="http://schemas.openxmlformats.org/drawingml/2006/picture">
+                <pic:pic xmlns:pic="http://schemas.openxmlformats.org/drawingml/2006/picture">
+                  <pic:nvPicPr>
+                    <pic:cNvPr id="0" name="OPEN_PORTS.PNG"/>
+                    <pic:cNvPicPr/>
+                  </pic:nvPicPr>
+                  <pic:blipFill>
+                    <a:blip r:embed="rId19"/>
+                    <a:stretch>
+                      <a:fillRect/>
+                    </a:stretch>
+                  </pic:blipFill>
+                  <pic:spPr>
+                    <a:xfrm>
+                      <a:off x="0" y="0"/>
+                      <a:ext cx="5943600" cy="830317"/>
+                    </a:xfrm>
+                    <a:prstGeom prst="rect">
+                      <a:avLst/>
+                    </a:prstGeom>
+                  </pic:spPr>
+                </pic:pic>
+              </a:graphicData>
+            </a:graphic>
+          </wp:inline>
+        </w:drawing>
+      </w:r>
+    </w:p>
+    <w:p>
+      <w:pPr>
+        <w:keepNext/>
+        <w:keepLines/>
+        <w:spacing w:after="120" w:line="259" w:lineRule="auto"/>
+        <w:outlineLvl w:val="1"/>
+        <w:rPr>
+          <w:rFonts w:ascii="Handel Gothic D" w:eastAsia="DengXian Light" w:hAnsi="Handel Gothic D" w:cs="Times New Roman"/>
+          <w:b/>
+          <w:caps/>
+          <w:color w:val="FF6633"/>
+          <w:kern w:val="0"/>
+          <w:sz w:val="32"/>
+          <w:szCs w:val="26"/>
+          <w14:ligatures w14:val="none"/>
+        </w:rPr>
+      </w:pPr>
+    </w:p>
+    <w:p>
+      <w:pPr>
+        <w:keepNext/>
+        <w:keepLines/>
+        <w:spacing w:before="240" w:after="120" w:line="259" w:lineRule="auto"/>
+        <w:outlineLvl w:val="1"/>
+        <w:rPr>
+          <w:rFonts w:ascii="Handel Gothic D" w:eastAsia="DengXian Light" w:hAnsi="Handel Gothic D" w:cs="Times New Roman"/>
+          <w:b/>
+          <w:caps/>
+          <w:color w:val="FF6633"/>
+          <w:kern w:val="0"/>
+          <w:sz w:val="32"/>
+          <w:szCs w:val="26"/>
+          <w14:ligatures w14:val="none"/>
+        </w:rPr>
+      </w:pPr>
+      <w:r>
+        <w:rPr>
+          <w:rFonts w:ascii="Handel Gothic D" w:eastAsia="DengXian Light" w:hAnsi="Handel Gothic D" w:cs="Times New Roman"/>
+          <w:b/>
+          <w:caps/>
+          <w:color w:val="FF6633"/>
+          <w:kern w:val="0"/>
+          <w:sz w:val="32"/>
+          <w:szCs w:val="26"/>
+          <w14:ligatures w14:val="none"/>
+        </w:rPr>
+        <w:br/>
+      </w:r>
+    </w:p>
     <w:sectPr>
       <w:type w:val="continuous"/>
       <w:pgSz w:w="12240" w:h="15840"/>

</xml_diff>

<commit_message>
Updated GUI to include Appendix method
</commit_message>
<xml_diff>
--- a/Source_Code/Reports/Sample499/FindingsReportTest.docx
+++ b/Source_Code/Reports/Sample499/FindingsReportTest.docx
@@ -601,7 +601,7 @@
           <w14:ligatures w14:val="none"/>
         </w:rPr>
         <w:drawing>
-          <wp:anchor distT="0" distB="0" distL="114300" distR="114300" simplePos="0" relativeHeight="251662336" behindDoc="0" locked="0" layoutInCell="1" allowOverlap="1" wp14:anchorId="56FF54E8" wp14:editId="56DD4328">
+          <wp:anchor distT="0" distB="0" distL="114300" distR="114300" simplePos="0" relativeHeight="251662336" behindDoc="0" locked="0" layoutInCell="1" allowOverlap="1" wp14:anchorId="56FF54E8" wp14:editId="7E6CABB1">
             <wp:simplePos x="0" y="0"/>
             <wp:positionH relativeFrom="margin">
               <wp:posOffset>1163955</wp:posOffset>
@@ -5546,617 +5546,253 @@
         <w:rPr>
           <w:lang w:val="fr-FR"/>
         </w:rPr>
-        <w:t xml:space="preserve">47-0500PM ET </w:t>
+        <w:t>47-0500PM ET exposurescout Initiating ExposureScout module.</w:t>
+      </w:r>
+    </w:p>
+    <w:p>
+      <w:pPr>
+        <w:pStyle w:val="ActivityBullet"/>
+      </w:pPr>
+      <w:r>
+        <w:t xml:space="preserve">2026-01-29 13:52:59-0500PM ET </w:t>
       </w:r>
       <w:proofErr w:type="spellStart"/>
       <w:r>
+        <w:t>exposurescout</w:t>
+      </w:r>
+      <w:proofErr w:type="spellEnd"/>
+      <w:r>
+        <w:t xml:space="preserve"> Enumerating subdomains from one (1) domain.</w:t>
+      </w:r>
+    </w:p>
+    <w:p>
+      <w:pPr>
+        <w:pStyle w:val="ActivityBullet"/>
         <w:rPr>
           <w:lang w:val="fr-FR"/>
         </w:rPr>
+      </w:pPr>
+      <w:r>
+        <w:rPr>
+          <w:lang w:val="fr-FR"/>
+        </w:rPr>
+        <w:t>2026-01-29 13:54:13-0500PM ET exposurescout Completed subdomain enumeration.</w:t>
+      </w:r>
+    </w:p>
+    <w:p>
+      <w:pPr>
+        <w:pStyle w:val="ActivityBullet"/>
+      </w:pPr>
+      <w:r>
+        <w:t xml:space="preserve">2026-01-29 13:54:13-0500PM ET </w:t>
+      </w:r>
+      <w:proofErr w:type="spellStart"/>
+      <w:r>
         <w:t>exposurescout</w:t>
       </w:r>
       <w:proofErr w:type="spellEnd"/>
       <w:r>
+        <w:t xml:space="preserve"> Beginning DNS enumeration.</w:t>
+      </w:r>
+    </w:p>
+    <w:p>
+      <w:pPr>
+        <w:pStyle w:val="ActivityBullet"/>
         <w:rPr>
           <w:lang w:val="fr-FR"/>
         </w:rPr>
-        <w:t xml:space="preserve"> Initiating </w:t>
+      </w:pPr>
+      <w:r>
+        <w:rPr>
+          <w:lang w:val="fr-FR"/>
+        </w:rPr>
+        <w:t>2026-01-29 13:55:18-0500PM ET exposurescout Completed DNS enumeration.</w:t>
+      </w:r>
+    </w:p>
+    <w:p>
+      <w:pPr>
+        <w:pStyle w:val="ActivityBullet"/>
+      </w:pPr>
+      <w:r>
+        <w:t xml:space="preserve">2026-01-29 13:55:18-0500PM ET </w:t>
       </w:r>
       <w:proofErr w:type="spellStart"/>
       <w:r>
+        <w:t>exposurescout</w:t>
+      </w:r>
+      <w:proofErr w:type="spellEnd"/>
+      <w:r>
+        <w:t xml:space="preserve"> Enumerating doppelganger domains for one (1) domain.</w:t>
+      </w:r>
+    </w:p>
+    <w:p>
+      <w:pPr>
+        <w:pStyle w:val="ActivityBullet"/>
         <w:rPr>
           <w:lang w:val="fr-FR"/>
         </w:rPr>
-        <w:t>ExposureScout</w:t>
+      </w:pPr>
+      <w:r>
+        <w:rPr>
+          <w:lang w:val="fr-FR"/>
+        </w:rPr>
+        <w:t>2026-01-29 13:56:28-0500PM ET exposurescout Ten (10) new doppelganger domains discovered.</w:t>
+      </w:r>
+    </w:p>
+    <w:p>
+      <w:pPr>
+        <w:pStyle w:val="ActivityBullet"/>
+        <w:rPr>
+          <w:lang w:val="fr-FR"/>
+        </w:rPr>
+      </w:pPr>
+      <w:r>
+        <w:rPr>
+          <w:lang w:val="fr-FR"/>
+        </w:rPr>
+        <w:t>2026-01-29 13:56:28-0500PM ET exposurescout Completed doppelganger domain enumeration.</w:t>
+      </w:r>
+    </w:p>
+    <w:p>
+      <w:pPr>
+        <w:pStyle w:val="ActivityBullet"/>
+      </w:pPr>
+      <w:r>
+        <w:t xml:space="preserve">2026-01-29 13:56:28-0500PM ET </w:t>
+      </w:r>
+      <w:proofErr w:type="spellStart"/>
+      <w:r>
+        <w:t>exposurescout</w:t>
       </w:r>
       <w:proofErr w:type="spellEnd"/>
       <w:r>
+        <w:t xml:space="preserve"> Running WHOIS commands on eight (8) domains.</w:t>
+      </w:r>
+    </w:p>
+    <w:p>
+      <w:pPr>
+        <w:pStyle w:val="ActivityBullet"/>
+      </w:pPr>
+      <w:r>
+        <w:t xml:space="preserve">2026-01-29 13:57:33-0500PM ET </w:t>
+      </w:r>
+      <w:proofErr w:type="spellStart"/>
+      <w:r>
+        <w:t>exposurescout</w:t>
+      </w:r>
+      <w:proofErr w:type="spellEnd"/>
+      <w:r>
+        <w:t xml:space="preserve"> Importing eight (8) WHOIS results into the database.</w:t>
+      </w:r>
+    </w:p>
+    <w:p>
+      <w:pPr>
+        <w:pStyle w:val="ActivityBullet"/>
+      </w:pPr>
+      <w:r>
+        <w:t xml:space="preserve">2026-01-29 13:57:34-0500PM ET </w:t>
+      </w:r>
+      <w:proofErr w:type="spellStart"/>
+      <w:r>
+        <w:t>exposurescout</w:t>
+      </w:r>
+      <w:proofErr w:type="spellEnd"/>
+      <w:r>
+        <w:t xml:space="preserve"> Completed recursive WHOIS lookups</w:t>
+      </w:r>
+    </w:p>
+    <w:p>
+      <w:pPr>
+        <w:pStyle w:val="ActivityBullet"/>
+      </w:pPr>
+      <w:r>
+        <w:t xml:space="preserve">2026-01-29 13:57:34-0500PM ET </w:t>
+      </w:r>
+      <w:proofErr w:type="spellStart"/>
+      <w:r>
+        <w:t>exposurescout</w:t>
+      </w:r>
+      <w:proofErr w:type="spellEnd"/>
+      <w:r>
+        <w:t xml:space="preserve"> Email scraping module started.</w:t>
+      </w:r>
+    </w:p>
+    <w:p>
+      <w:pPr>
+        <w:pStyle w:val="ActivityBullet"/>
+      </w:pPr>
+      <w:r>
+        <w:t xml:space="preserve">2026-01-29 13:58:40-0500PM ET </w:t>
+      </w:r>
+      <w:proofErr w:type="spellStart"/>
+      <w:r>
+        <w:t>exposurescout</w:t>
+      </w:r>
+      <w:proofErr w:type="spellEnd"/>
+      <w:r>
+        <w:t xml:space="preserve"> Completed email scraping.</w:t>
+      </w:r>
+    </w:p>
+    <w:p>
+      <w:pPr>
+        <w:pStyle w:val="ActivityBullet"/>
+      </w:pPr>
+      <w:r>
+        <w:t xml:space="preserve">2026-01-29 13:58:40-0500PM ET </w:t>
+      </w:r>
+      <w:proofErr w:type="spellStart"/>
+      <w:r>
+        <w:t>exposurescout</w:t>
+      </w:r>
+      <w:proofErr w:type="spellEnd"/>
+      <w:r>
+        <w:t xml:space="preserve"> Scanning subdomains for subdomain takeover vulnerability.</w:t>
+      </w:r>
+    </w:p>
+    <w:p>
+      <w:pPr>
+        <w:pStyle w:val="ActivityBullet"/>
+      </w:pPr>
+      <w:r>
+        <w:t xml:space="preserve">2026-01-29 13:59:44-0500PM ET </w:t>
+      </w:r>
+      <w:proofErr w:type="spellStart"/>
+      <w:r>
+        <w:t>exposurescout</w:t>
+      </w:r>
+      <w:proofErr w:type="spellEnd"/>
+      <w:r>
+        <w:t xml:space="preserve"> Found 1 domain vulnerable to subdomain takeover.</w:t>
+      </w:r>
+    </w:p>
+    <w:p>
+      <w:pPr>
+        <w:pStyle w:val="ActivityBullet"/>
+      </w:pPr>
+      <w:r>
+        <w:t xml:space="preserve">2026-01-29 13:59:44-0500PM ET </w:t>
+      </w:r>
+      <w:proofErr w:type="spellStart"/>
+      <w:r>
+        <w:t>exposurescout</w:t>
+      </w:r>
+      <w:proofErr w:type="spellEnd"/>
+      <w:r>
+        <w:t xml:space="preserve"> Completed subdomain takeover checks.</w:t>
+      </w:r>
+    </w:p>
+    <w:p>
+      <w:pPr>
+        <w:pStyle w:val="ActivityBullet"/>
         <w:rPr>
           <w:lang w:val="fr-FR"/>
         </w:rPr>
-        <w:t xml:space="preserve"> module.</w:t>
-      </w:r>
-    </w:p>
-    <w:p>
-      <w:pPr>
-        <w:pStyle w:val="ActivityBullet"/>
-      </w:pPr>
-      <w:r>
-        <w:t xml:space="preserve">2026-01-29 13:52:59-0500PM ET </w:t>
-      </w:r>
-      <w:proofErr w:type="spellStart"/>
-      <w:r>
-        <w:t>exposurescout</w:t>
-      </w:r>
-      <w:proofErr w:type="spellEnd"/>
-      <w:r>
-        <w:t xml:space="preserve"> Enumerating subdomains from one (1) domain.</w:t>
-      </w:r>
-    </w:p>
-    <w:p>
-      <w:pPr>
-        <w:pStyle w:val="ActivityBullet"/>
+      </w:pPr>
+      <w:r>
         <w:rPr>
           <w:lang w:val="fr-FR"/>
         </w:rPr>
-      </w:pPr>
-      <w:r>
-        <w:rPr>
-          <w:lang w:val="fr-FR"/>
-        </w:rPr>
-        <w:t xml:space="preserve">2026-01-29 </w:t>
-      </w:r>
-      <w:proofErr w:type="gramStart"/>
-      <w:r>
-        <w:rPr>
-          <w:lang w:val="fr-FR"/>
-        </w:rPr>
-        <w:t>13:54:</w:t>
-      </w:r>
-      <w:proofErr w:type="gramEnd"/>
-      <w:r>
-        <w:rPr>
-          <w:lang w:val="fr-FR"/>
-        </w:rPr>
-        <w:t xml:space="preserve">13-0500PM ET </w:t>
-      </w:r>
-      <w:proofErr w:type="spellStart"/>
-      <w:r>
-        <w:rPr>
-          <w:lang w:val="fr-FR"/>
-        </w:rPr>
-        <w:t>exposurescout</w:t>
-      </w:r>
-      <w:proofErr w:type="spellEnd"/>
-      <w:r>
-        <w:rPr>
-          <w:lang w:val="fr-FR"/>
-        </w:rPr>
-        <w:t xml:space="preserve"> </w:t>
-      </w:r>
-      <w:proofErr w:type="spellStart"/>
-      <w:r>
-        <w:rPr>
-          <w:lang w:val="fr-FR"/>
-        </w:rPr>
-        <w:t>Completed</w:t>
-      </w:r>
-      <w:proofErr w:type="spellEnd"/>
-      <w:r>
-        <w:rPr>
-          <w:lang w:val="fr-FR"/>
-        </w:rPr>
-        <w:t xml:space="preserve"> </w:t>
-      </w:r>
-      <w:proofErr w:type="spellStart"/>
-      <w:r>
-        <w:rPr>
-          <w:lang w:val="fr-FR"/>
-        </w:rPr>
-        <w:t>subdomain</w:t>
-      </w:r>
-      <w:proofErr w:type="spellEnd"/>
-      <w:r>
-        <w:rPr>
-          <w:lang w:val="fr-FR"/>
-        </w:rPr>
-        <w:t xml:space="preserve"> </w:t>
-      </w:r>
-      <w:proofErr w:type="spellStart"/>
-      <w:r>
-        <w:rPr>
-          <w:lang w:val="fr-FR"/>
-        </w:rPr>
-        <w:t>enumeration</w:t>
-      </w:r>
-      <w:proofErr w:type="spellEnd"/>
-      <w:r>
-        <w:rPr>
-          <w:lang w:val="fr-FR"/>
-        </w:rPr>
-        <w:t>.</w:t>
-      </w:r>
-    </w:p>
-    <w:p>
-      <w:pPr>
-        <w:pStyle w:val="ActivityBullet"/>
-      </w:pPr>
-      <w:r>
-        <w:t xml:space="preserve">2026-01-29 13:54:13-0500PM ET </w:t>
-      </w:r>
-      <w:proofErr w:type="spellStart"/>
-      <w:r>
-        <w:t>exposurescout</w:t>
-      </w:r>
-      <w:proofErr w:type="spellEnd"/>
-      <w:r>
-        <w:t xml:space="preserve"> Beginning DNS enumeration.</w:t>
-      </w:r>
-    </w:p>
-    <w:p>
-      <w:pPr>
-        <w:pStyle w:val="ActivityBullet"/>
-        <w:rPr>
-          <w:lang w:val="fr-FR"/>
-        </w:rPr>
-      </w:pPr>
-      <w:r>
-        <w:rPr>
-          <w:lang w:val="fr-FR"/>
-        </w:rPr>
-        <w:t xml:space="preserve">2026-01-29 </w:t>
-      </w:r>
-      <w:proofErr w:type="gramStart"/>
-      <w:r>
-        <w:rPr>
-          <w:lang w:val="fr-FR"/>
-        </w:rPr>
-        <w:t>13:55:</w:t>
-      </w:r>
-      <w:proofErr w:type="gramEnd"/>
-      <w:r>
-        <w:rPr>
-          <w:lang w:val="fr-FR"/>
-        </w:rPr>
-        <w:t xml:space="preserve">18-0500PM ET </w:t>
-      </w:r>
-      <w:proofErr w:type="spellStart"/>
-      <w:r>
-        <w:rPr>
-          <w:lang w:val="fr-FR"/>
-        </w:rPr>
-        <w:t>exposurescout</w:t>
-      </w:r>
-      <w:proofErr w:type="spellEnd"/>
-      <w:r>
-        <w:rPr>
-          <w:lang w:val="fr-FR"/>
-        </w:rPr>
-        <w:t xml:space="preserve"> </w:t>
-      </w:r>
-      <w:proofErr w:type="spellStart"/>
-      <w:r>
-        <w:rPr>
-          <w:lang w:val="fr-FR"/>
-        </w:rPr>
-        <w:t>Completed</w:t>
-      </w:r>
-      <w:proofErr w:type="spellEnd"/>
-      <w:r>
-        <w:rPr>
-          <w:lang w:val="fr-FR"/>
-        </w:rPr>
-        <w:t xml:space="preserve"> DNS </w:t>
-      </w:r>
-      <w:proofErr w:type="spellStart"/>
-      <w:r>
-        <w:rPr>
-          <w:lang w:val="fr-FR"/>
-        </w:rPr>
-        <w:t>enumeration</w:t>
-      </w:r>
-      <w:proofErr w:type="spellEnd"/>
-      <w:r>
-        <w:rPr>
-          <w:lang w:val="fr-FR"/>
-        </w:rPr>
-        <w:t>.</w:t>
-      </w:r>
-    </w:p>
-    <w:p>
-      <w:pPr>
-        <w:pStyle w:val="ActivityBullet"/>
-      </w:pPr>
-      <w:r>
-        <w:t xml:space="preserve">2026-01-29 13:55:18-0500PM ET </w:t>
-      </w:r>
-      <w:proofErr w:type="spellStart"/>
-      <w:r>
-        <w:t>exposurescout</w:t>
-      </w:r>
-      <w:proofErr w:type="spellEnd"/>
-      <w:r>
-        <w:t xml:space="preserve"> Enumerating doppelganger domains for one (1) domain.</w:t>
-      </w:r>
-    </w:p>
-    <w:p>
-      <w:pPr>
-        <w:pStyle w:val="ActivityBullet"/>
-        <w:rPr>
-          <w:lang w:val="fr-FR"/>
-        </w:rPr>
-      </w:pPr>
-      <w:r>
-        <w:rPr>
-          <w:lang w:val="fr-FR"/>
-        </w:rPr>
-        <w:t xml:space="preserve">2026-01-29 </w:t>
-      </w:r>
-      <w:proofErr w:type="gramStart"/>
-      <w:r>
-        <w:rPr>
-          <w:lang w:val="fr-FR"/>
-        </w:rPr>
-        <w:t>13:56:</w:t>
-      </w:r>
-      <w:proofErr w:type="gramEnd"/>
-      <w:r>
-        <w:rPr>
-          <w:lang w:val="fr-FR"/>
-        </w:rPr>
-        <w:t xml:space="preserve">28-0500PM ET </w:t>
-      </w:r>
-      <w:proofErr w:type="spellStart"/>
-      <w:r>
-        <w:rPr>
-          <w:lang w:val="fr-FR"/>
-        </w:rPr>
-        <w:t>exposurescout</w:t>
-      </w:r>
-      <w:proofErr w:type="spellEnd"/>
-      <w:r>
-        <w:rPr>
-          <w:lang w:val="fr-FR"/>
-        </w:rPr>
-        <w:t xml:space="preserve"> Ten (10) new </w:t>
-      </w:r>
-      <w:proofErr w:type="spellStart"/>
-      <w:r>
-        <w:rPr>
-          <w:lang w:val="fr-FR"/>
-        </w:rPr>
-        <w:t>doppelganger</w:t>
-      </w:r>
-      <w:proofErr w:type="spellEnd"/>
-      <w:r>
-        <w:rPr>
-          <w:lang w:val="fr-FR"/>
-        </w:rPr>
-        <w:t xml:space="preserve"> </w:t>
-      </w:r>
-      <w:proofErr w:type="spellStart"/>
-      <w:r>
-        <w:rPr>
-          <w:lang w:val="fr-FR"/>
-        </w:rPr>
-        <w:t>domains</w:t>
-      </w:r>
-      <w:proofErr w:type="spellEnd"/>
-      <w:r>
-        <w:rPr>
-          <w:lang w:val="fr-FR"/>
-        </w:rPr>
-        <w:t xml:space="preserve"> </w:t>
-      </w:r>
-      <w:proofErr w:type="spellStart"/>
-      <w:r>
-        <w:rPr>
-          <w:lang w:val="fr-FR"/>
-        </w:rPr>
-        <w:t>discovered</w:t>
-      </w:r>
-      <w:proofErr w:type="spellEnd"/>
-      <w:r>
-        <w:rPr>
-          <w:lang w:val="fr-FR"/>
-        </w:rPr>
-        <w:t>.</w:t>
-      </w:r>
-    </w:p>
-    <w:p>
-      <w:pPr>
-        <w:pStyle w:val="ActivityBullet"/>
-        <w:rPr>
-          <w:lang w:val="fr-FR"/>
-        </w:rPr>
-      </w:pPr>
-      <w:r>
-        <w:rPr>
-          <w:lang w:val="fr-FR"/>
-        </w:rPr>
-        <w:t xml:space="preserve">2026-01-29 </w:t>
-      </w:r>
-      <w:proofErr w:type="gramStart"/>
-      <w:r>
-        <w:rPr>
-          <w:lang w:val="fr-FR"/>
-        </w:rPr>
-        <w:t>13:56:</w:t>
-      </w:r>
-      <w:proofErr w:type="gramEnd"/>
-      <w:r>
-        <w:rPr>
-          <w:lang w:val="fr-FR"/>
-        </w:rPr>
-        <w:t xml:space="preserve">28-0500PM ET </w:t>
-      </w:r>
-      <w:proofErr w:type="spellStart"/>
-      <w:r>
-        <w:rPr>
-          <w:lang w:val="fr-FR"/>
-        </w:rPr>
-        <w:t>exposurescout</w:t>
-      </w:r>
-      <w:proofErr w:type="spellEnd"/>
-      <w:r>
-        <w:rPr>
-          <w:lang w:val="fr-FR"/>
-        </w:rPr>
-        <w:t xml:space="preserve"> </w:t>
-      </w:r>
-      <w:proofErr w:type="spellStart"/>
-      <w:r>
-        <w:rPr>
-          <w:lang w:val="fr-FR"/>
-        </w:rPr>
-        <w:t>Completed</w:t>
-      </w:r>
-      <w:proofErr w:type="spellEnd"/>
-      <w:r>
-        <w:rPr>
-          <w:lang w:val="fr-FR"/>
-        </w:rPr>
-        <w:t xml:space="preserve"> </w:t>
-      </w:r>
-      <w:proofErr w:type="spellStart"/>
-      <w:r>
-        <w:rPr>
-          <w:lang w:val="fr-FR"/>
-        </w:rPr>
-        <w:t>doppelganger</w:t>
-      </w:r>
-      <w:proofErr w:type="spellEnd"/>
-      <w:r>
-        <w:rPr>
-          <w:lang w:val="fr-FR"/>
-        </w:rPr>
-        <w:t xml:space="preserve"> </w:t>
-      </w:r>
-      <w:proofErr w:type="spellStart"/>
-      <w:r>
-        <w:rPr>
-          <w:lang w:val="fr-FR"/>
-        </w:rPr>
-        <w:t>domain</w:t>
-      </w:r>
-      <w:proofErr w:type="spellEnd"/>
-      <w:r>
-        <w:rPr>
-          <w:lang w:val="fr-FR"/>
-        </w:rPr>
-        <w:t xml:space="preserve"> </w:t>
-      </w:r>
-      <w:proofErr w:type="spellStart"/>
-      <w:r>
-        <w:rPr>
-          <w:lang w:val="fr-FR"/>
-        </w:rPr>
-        <w:t>enumeration</w:t>
-      </w:r>
-      <w:proofErr w:type="spellEnd"/>
-      <w:r>
-        <w:rPr>
-          <w:lang w:val="fr-FR"/>
-        </w:rPr>
-        <w:t>.</w:t>
-      </w:r>
-    </w:p>
-    <w:p>
-      <w:pPr>
-        <w:pStyle w:val="ActivityBullet"/>
-      </w:pPr>
-      <w:r>
-        <w:t xml:space="preserve">2026-01-29 13:56:28-0500PM ET </w:t>
-      </w:r>
-      <w:proofErr w:type="spellStart"/>
-      <w:r>
-        <w:t>exposurescout</w:t>
-      </w:r>
-      <w:proofErr w:type="spellEnd"/>
-      <w:r>
-        <w:t xml:space="preserve"> Running WHOIS commands on eight (8) domains.</w:t>
-      </w:r>
-    </w:p>
-    <w:p>
-      <w:pPr>
-        <w:pStyle w:val="ActivityBullet"/>
-      </w:pPr>
-      <w:r>
-        <w:t xml:space="preserve">2026-01-29 13:57:33-0500PM ET </w:t>
-      </w:r>
-      <w:proofErr w:type="spellStart"/>
-      <w:r>
-        <w:t>exposurescout</w:t>
-      </w:r>
-      <w:proofErr w:type="spellEnd"/>
-      <w:r>
-        <w:t xml:space="preserve"> Importing eight (8) WHOIS results into the database.</w:t>
-      </w:r>
-    </w:p>
-    <w:p>
-      <w:pPr>
-        <w:pStyle w:val="ActivityBullet"/>
-      </w:pPr>
-      <w:r>
-        <w:t xml:space="preserve">2026-01-29 13:57:34-0500PM ET </w:t>
-      </w:r>
-      <w:proofErr w:type="spellStart"/>
-      <w:r>
-        <w:t>exposurescout</w:t>
-      </w:r>
-      <w:proofErr w:type="spellEnd"/>
-      <w:r>
-        <w:t xml:space="preserve"> Completed recursive WHOIS lookups</w:t>
-      </w:r>
-    </w:p>
-    <w:p>
-      <w:pPr>
-        <w:pStyle w:val="ActivityBullet"/>
-      </w:pPr>
-      <w:r>
-        <w:t xml:space="preserve">2026-01-29 13:57:34-0500PM ET </w:t>
-      </w:r>
-      <w:proofErr w:type="spellStart"/>
-      <w:r>
-        <w:t>exposurescout</w:t>
-      </w:r>
-      <w:proofErr w:type="spellEnd"/>
-      <w:r>
-        <w:t xml:space="preserve"> Email scraping module started.</w:t>
-      </w:r>
-    </w:p>
-    <w:p>
-      <w:pPr>
-        <w:pStyle w:val="ActivityBullet"/>
-      </w:pPr>
-      <w:r>
-        <w:t xml:space="preserve">2026-01-29 13:58:40-0500PM ET </w:t>
-      </w:r>
-      <w:proofErr w:type="spellStart"/>
-      <w:r>
-        <w:t>exposurescout</w:t>
-      </w:r>
-      <w:proofErr w:type="spellEnd"/>
-      <w:r>
-        <w:t xml:space="preserve"> Completed email scraping.</w:t>
-      </w:r>
-    </w:p>
-    <w:p>
-      <w:pPr>
-        <w:pStyle w:val="ActivityBullet"/>
-      </w:pPr>
-      <w:r>
-        <w:t xml:space="preserve">2026-01-29 13:58:40-0500PM ET </w:t>
-      </w:r>
-      <w:proofErr w:type="spellStart"/>
-      <w:r>
-        <w:t>exposurescout</w:t>
-      </w:r>
-      <w:proofErr w:type="spellEnd"/>
-      <w:r>
-        <w:t xml:space="preserve"> Scanning subdomains for subdomain takeover vulnerability.</w:t>
-      </w:r>
-    </w:p>
-    <w:p>
-      <w:pPr>
-        <w:pStyle w:val="ActivityBullet"/>
-      </w:pPr>
-      <w:r>
-        <w:t xml:space="preserve">2026-01-29 13:59:44-0500PM ET </w:t>
-      </w:r>
-      <w:proofErr w:type="spellStart"/>
-      <w:r>
-        <w:t>exposurescout</w:t>
-      </w:r>
-      <w:proofErr w:type="spellEnd"/>
-      <w:r>
-        <w:t xml:space="preserve"> Found 1 domain vulnerable to subdomain takeover.</w:t>
-      </w:r>
-    </w:p>
-    <w:p>
-      <w:pPr>
-        <w:pStyle w:val="ActivityBullet"/>
-      </w:pPr>
-      <w:r>
-        <w:t xml:space="preserve">2026-01-29 13:59:44-0500PM ET </w:t>
-      </w:r>
-      <w:proofErr w:type="spellStart"/>
-      <w:r>
-        <w:t>exposurescout</w:t>
-      </w:r>
-      <w:proofErr w:type="spellEnd"/>
-      <w:r>
-        <w:t xml:space="preserve"> Completed subdomain takeover checks.</w:t>
-      </w:r>
-    </w:p>
-    <w:p>
-      <w:pPr>
-        <w:pStyle w:val="ActivityBullet"/>
-        <w:rPr>
-          <w:lang w:val="fr-FR"/>
-        </w:rPr>
-      </w:pPr>
-      <w:r>
-        <w:rPr>
-          <w:lang w:val="fr-FR"/>
-        </w:rPr>
-        <w:t xml:space="preserve">2026-01-29 </w:t>
-      </w:r>
-      <w:proofErr w:type="gramStart"/>
-      <w:r>
-        <w:rPr>
-          <w:lang w:val="fr-FR"/>
-        </w:rPr>
-        <w:t>13:59:</w:t>
-      </w:r>
-      <w:proofErr w:type="gramEnd"/>
-      <w:r>
-        <w:rPr>
-          <w:lang w:val="fr-FR"/>
-        </w:rPr>
-        <w:t xml:space="preserve">44-0500PM ET </w:t>
-      </w:r>
-      <w:proofErr w:type="spellStart"/>
-      <w:r>
-        <w:rPr>
-          <w:lang w:val="fr-FR"/>
-        </w:rPr>
-        <w:t>exposurescout</w:t>
-      </w:r>
-      <w:proofErr w:type="spellEnd"/>
-      <w:r>
-        <w:rPr>
-          <w:lang w:val="fr-FR"/>
-        </w:rPr>
-        <w:t xml:space="preserve"> </w:t>
-      </w:r>
-      <w:proofErr w:type="spellStart"/>
-      <w:r>
-        <w:rPr>
-          <w:lang w:val="fr-FR"/>
-        </w:rPr>
-        <w:t>ExposureScout</w:t>
-      </w:r>
-      <w:proofErr w:type="spellEnd"/>
-      <w:r>
-        <w:rPr>
-          <w:lang w:val="fr-FR"/>
-        </w:rPr>
-        <w:t xml:space="preserve"> module </w:t>
-      </w:r>
-      <w:proofErr w:type="spellStart"/>
-      <w:r>
-        <w:rPr>
-          <w:lang w:val="fr-FR"/>
-        </w:rPr>
-        <w:t>completed</w:t>
-      </w:r>
-      <w:proofErr w:type="spellEnd"/>
-      <w:r>
-        <w:rPr>
-          <w:lang w:val="fr-FR"/>
-        </w:rPr>
-        <w:t>.</w:t>
+        <w:t>2026-01-29 13:59:44-0500PM ET exposurescout ExposureScout module completed.</w:t>
       </w:r>
     </w:p>
     <w:p>
@@ -7233,483 +6869,371 @@
         <w:rPr>
           <w:lang w:val="fr-FR"/>
         </w:rPr>
-        <w:t xml:space="preserve">54-0500PM ET </w:t>
+        <w:t>54-0500PM ET enumeration Analyzing SSL/TLS protocols on port 443/tcp.</w:t>
+      </w:r>
+    </w:p>
+    <w:p>
+      <w:pPr>
+        <w:pStyle w:val="ActivityBullet"/>
+      </w:pPr>
+      <w:r>
+        <w:t>2026-01-29 14:06:55-0500PM ET enumeration Completed SSL/TLS analysis on ports 443/</w:t>
       </w:r>
       <w:proofErr w:type="spellStart"/>
       <w:r>
+        <w:t>tcp</w:t>
+      </w:r>
+      <w:proofErr w:type="spellEnd"/>
+      <w:r>
+        <w:t>.</w:t>
+      </w:r>
+    </w:p>
+    <w:p>
+      <w:pPr>
+        <w:pStyle w:val="ActivityBullet"/>
+      </w:pPr>
+      <w:r>
+        <w:t>2026-01-29 14:06:55-0500PM ET enumeration Completed hidden directory enumeration scan.</w:t>
+      </w:r>
+    </w:p>
+    <w:p>
+      <w:pPr>
+        <w:pStyle w:val="ActivityBullet"/>
+      </w:pPr>
+      <w:r>
+        <w:t xml:space="preserve">2026-01-29 14:06:55-0500PM ET enumeration </w:t>
+      </w:r>
+      <w:proofErr w:type="spellStart"/>
+      <w:r>
+        <w:t>Peforming</w:t>
+      </w:r>
+      <w:proofErr w:type="spellEnd"/>
+      <w:r>
+        <w:t xml:space="preserve"> a hidden directory enumeration attack on 443/</w:t>
+      </w:r>
+      <w:proofErr w:type="spellStart"/>
+      <w:r>
+        <w:t>tcp</w:t>
+      </w:r>
+      <w:proofErr w:type="spellEnd"/>
+      <w:r>
+        <w:t>.</w:t>
+      </w:r>
+    </w:p>
+    <w:p>
+      <w:pPr>
+        <w:pStyle w:val="ActivityBullet"/>
+      </w:pPr>
+      <w:r>
+        <w:t xml:space="preserve">2026-01-29 14:06:55-0500PM ET enumeration Completed </w:t>
+      </w:r>
+      <w:proofErr w:type="spellStart"/>
+      <w:r>
+        <w:t>nmap</w:t>
+      </w:r>
+      <w:proofErr w:type="spellEnd"/>
+      <w:r>
+        <w:t xml:space="preserve"> script scan using script: ssh2-enum-algos.</w:t>
+      </w:r>
+    </w:p>
+    <w:p>
+      <w:pPr>
+        <w:pStyle w:val="ActivityBullet"/>
+      </w:pPr>
+      <w:r>
+        <w:t xml:space="preserve">2026-01-29 14:06:55-0500PM ET enumeration Completed </w:t>
+      </w:r>
+      <w:proofErr w:type="spellStart"/>
+      <w:r>
+        <w:t>nmap</w:t>
+      </w:r>
+      <w:proofErr w:type="spellEnd"/>
+      <w:r>
+        <w:t xml:space="preserve"> script scan using script: ssh-auth-methods.</w:t>
+      </w:r>
+    </w:p>
+    <w:p>
+      <w:pPr>
+        <w:pStyle w:val="ActivityBullet"/>
+      </w:pPr>
+      <w:r>
+        <w:t xml:space="preserve">2026-01-29 14:06:55-0500PM ET enumeration Completed </w:t>
+      </w:r>
+      <w:proofErr w:type="spellStart"/>
+      <w:r>
+        <w:t>nmap</w:t>
+      </w:r>
+      <w:proofErr w:type="spellEnd"/>
+      <w:r>
+        <w:t xml:space="preserve"> script scan using script: sshv1.</w:t>
+      </w:r>
+    </w:p>
+    <w:p>
+      <w:pPr>
+        <w:pStyle w:val="ActivityBullet"/>
+      </w:pPr>
+      <w:r>
+        <w:t xml:space="preserve">2026-01-29 14:06:55-0500PM ET </w:t>
+      </w:r>
+      <w:proofErr w:type="gramStart"/>
+      <w:r>
+        <w:t>enumeration</w:t>
+      </w:r>
+      <w:proofErr w:type="gramEnd"/>
+      <w:r>
+        <w:t xml:space="preserve"> Completed </w:t>
+      </w:r>
+      <w:proofErr w:type="gramStart"/>
+      <w:r>
+        <w:t>enumerating</w:t>
+      </w:r>
+      <w:proofErr w:type="gramEnd"/>
+      <w:r>
+        <w:t xml:space="preserve"> SSH services.</w:t>
+      </w:r>
+    </w:p>
+    <w:p>
+      <w:pPr>
+        <w:pStyle w:val="ActivityBullet"/>
+      </w:pPr>
+      <w:r>
+        <w:t>2026-01-29 14:06:58-0500PM ET enumeration Analyzing web services running on port 80/</w:t>
+      </w:r>
+      <w:proofErr w:type="spellStart"/>
+      <w:r>
+        <w:t>tcp</w:t>
+      </w:r>
+      <w:proofErr w:type="spellEnd"/>
+      <w:r>
+        <w:t>.</w:t>
+      </w:r>
+    </w:p>
+    <w:p>
+      <w:pPr>
+        <w:pStyle w:val="ActivityBullet"/>
+      </w:pPr>
+      <w:r>
+        <w:t>2026-01-29 14:08:10-0500PM ET enumeration Completed analyzing web services running on port 80/</w:t>
+      </w:r>
+      <w:proofErr w:type="spellStart"/>
+      <w:r>
+        <w:t>tcp</w:t>
+      </w:r>
+      <w:proofErr w:type="spellEnd"/>
+      <w:r>
+        <w:t>.</w:t>
+      </w:r>
+    </w:p>
+    <w:p>
+      <w:pPr>
+        <w:pStyle w:val="ActivityBullet"/>
+      </w:pPr>
+      <w:r>
+        <w:t xml:space="preserve">2026-01-29 14:08:10-0500PM ET </w:t>
+      </w:r>
+      <w:proofErr w:type="gramStart"/>
+      <w:r>
+        <w:t>enumeration</w:t>
+      </w:r>
+      <w:proofErr w:type="gramEnd"/>
+      <w:r>
+        <w:t xml:space="preserve"> Completed </w:t>
+      </w:r>
+      <w:proofErr w:type="gramStart"/>
+      <w:r>
+        <w:t>hidden directory enumeration scan</w:t>
+      </w:r>
+      <w:proofErr w:type="gramEnd"/>
+      <w:r>
+        <w:t>.</w:t>
+      </w:r>
+    </w:p>
+    <w:p>
+      <w:pPr>
+        <w:pStyle w:val="ActivityBullet"/>
+      </w:pPr>
+      <w:r>
+        <w:t>2026-01-29 14:08:10-0500PM ET enumeration Completed analyzing web services running on port 80/</w:t>
+      </w:r>
+      <w:proofErr w:type="spellStart"/>
+      <w:r>
+        <w:t>tcp</w:t>
+      </w:r>
+      <w:proofErr w:type="spellEnd"/>
+      <w:r>
+        <w:t>.</w:t>
+      </w:r>
+    </w:p>
+    <w:p>
+      <w:pPr>
+        <w:pStyle w:val="ActivityBullet"/>
+      </w:pPr>
+      <w:r>
+        <w:t xml:space="preserve">2026-01-29 14:08:10-0500PM ET </w:t>
+      </w:r>
+      <w:proofErr w:type="gramStart"/>
+      <w:r>
+        <w:t>enumeration</w:t>
+      </w:r>
+      <w:proofErr w:type="gramEnd"/>
+      <w:r>
+        <w:t xml:space="preserve"> Completed </w:t>
+      </w:r>
+      <w:proofErr w:type="gramStart"/>
+      <w:r>
+        <w:t>enumerating</w:t>
+      </w:r>
+      <w:proofErr w:type="gramEnd"/>
+      <w:r>
+        <w:t xml:space="preserve"> HTTP services.</w:t>
+      </w:r>
+    </w:p>
+    <w:p>
+      <w:pPr>
+        <w:pStyle w:val="ActivityBullet"/>
+      </w:pPr>
+      <w:r>
+        <w:t>2026-01-29 14:08:13-0500PM ET enumeration Analyzing web services running on port 443/</w:t>
+      </w:r>
+      <w:proofErr w:type="spellStart"/>
+      <w:r>
+        <w:t>tcp</w:t>
+      </w:r>
+      <w:proofErr w:type="spellEnd"/>
+      <w:r>
+        <w:t>.</w:t>
+      </w:r>
+    </w:p>
+    <w:p>
+      <w:pPr>
+        <w:pStyle w:val="ActivityBullet"/>
+      </w:pPr>
+      <w:r>
+        <w:t xml:space="preserve">2026-01-29 14:09:15-0500PM ET </w:t>
+      </w:r>
+      <w:proofErr w:type="gramStart"/>
+      <w:r>
+        <w:t>enumeration</w:t>
+      </w:r>
+      <w:proofErr w:type="gramEnd"/>
+      <w:r>
+        <w:t xml:space="preserve"> Completed analyzing web services running on port 443/</w:t>
+      </w:r>
+      <w:proofErr w:type="spellStart"/>
+      <w:r>
+        <w:t>tcp</w:t>
+      </w:r>
+      <w:proofErr w:type="spellEnd"/>
+      <w:r>
+        <w:t>.</w:t>
+      </w:r>
+    </w:p>
+    <w:p>
+      <w:pPr>
+        <w:pStyle w:val="ActivityBullet"/>
+      </w:pPr>
+      <w:r>
+        <w:t xml:space="preserve">2026-01-29 14:09:15-0500PM ET </w:t>
+      </w:r>
+      <w:proofErr w:type="gramStart"/>
+      <w:r>
+        <w:t>enumeration</w:t>
+      </w:r>
+      <w:proofErr w:type="gramEnd"/>
+      <w:r>
+        <w:t xml:space="preserve"> Completed analyzing web services running on port 443/</w:t>
+      </w:r>
+      <w:proofErr w:type="spellStart"/>
+      <w:r>
+        <w:t>tcp</w:t>
+      </w:r>
+      <w:proofErr w:type="spellEnd"/>
+      <w:r>
+        <w:t>.</w:t>
+      </w:r>
+    </w:p>
+    <w:p>
+      <w:pPr>
+        <w:pStyle w:val="ActivityBullet"/>
+      </w:pPr>
+      <w:r>
+        <w:t>2026-01-29 14:09:16-0500PM ET enumeration Completed enumerating HTTPS services.</w:t>
+      </w:r>
+    </w:p>
+    <w:p>
+      <w:pPr>
+        <w:pStyle w:val="ActivityBullet"/>
+      </w:pPr>
+      <w:r>
+        <w:t xml:space="preserve">2026-01-29 14:09:45-0500PM ET </w:t>
+      </w:r>
+      <w:proofErr w:type="gramStart"/>
+      <w:r>
+        <w:t>enumeration</w:t>
+      </w:r>
+      <w:proofErr w:type="gramEnd"/>
+      <w:r>
+        <w:t xml:space="preserve"> </w:t>
+      </w:r>
+      <w:proofErr w:type="spellStart"/>
+      <w:r>
+        <w:t>Enumeration</w:t>
+      </w:r>
+      <w:proofErr w:type="spellEnd"/>
+      <w:r>
+        <w:t xml:space="preserve"> module completed.</w:t>
+      </w:r>
+    </w:p>
+    <w:p>
+      <w:pPr>
+        <w:pStyle w:val="ActivityBullet"/>
         <w:rPr>
           <w:lang w:val="fr-FR"/>
         </w:rPr>
-        <w:t>enumeration</w:t>
-      </w:r>
-      <w:proofErr w:type="spellEnd"/>
+      </w:pPr>
       <w:r>
         <w:rPr>
           <w:lang w:val="fr-FR"/>
         </w:rPr>
-        <w:t xml:space="preserve"> </w:t>
-      </w:r>
-      <w:proofErr w:type="spellStart"/>
-      <w:r>
+        <w:t>2026-01-29 14:10:06-0500PM ET exploit Launching exploit module.</w:t>
+      </w:r>
+    </w:p>
+    <w:p>
+      <w:pPr>
+        <w:pStyle w:val="ActivityBullet"/>
+      </w:pPr>
+      <w:r>
+        <w:t>2026-01-29 14:10:11-0500PM ET exploit Queuing up hydra attack: SSH password attack.</w:t>
+      </w:r>
+    </w:p>
+    <w:p>
+      <w:pPr>
+        <w:pStyle w:val="ActivityBullet"/>
+      </w:pPr>
+      <w:r>
+        <w:t>2026-01-29 14:11:16-0500PM ET exploit Completed hydra attack: SSH password attack.</w:t>
+      </w:r>
+    </w:p>
+    <w:p>
+      <w:pPr>
+        <w:pStyle w:val="ActivityBullet"/>
+      </w:pPr>
+      <w:r>
+        <w:t>2026-01-29 14:11:16-0500PM ET exploit Completed SSH password attack.</w:t>
+      </w:r>
+    </w:p>
+    <w:p>
+      <w:pPr>
+        <w:pStyle w:val="ActivityBullet"/>
         <w:rPr>
           <w:lang w:val="fr-FR"/>
         </w:rPr>
-        <w:t>Analyzing</w:t>
-      </w:r>
-      <w:proofErr w:type="spellEnd"/>
+      </w:pPr>
       <w:r>
         <w:rPr>
           <w:lang w:val="fr-FR"/>
         </w:rPr>
-        <w:t xml:space="preserve"> SSL/TLS </w:t>
-      </w:r>
-      <w:proofErr w:type="spellStart"/>
-      <w:r>
-        <w:rPr>
-          <w:lang w:val="fr-FR"/>
-        </w:rPr>
-        <w:t>protocols</w:t>
-      </w:r>
-      <w:proofErr w:type="spellEnd"/>
-      <w:r>
-        <w:rPr>
-          <w:lang w:val="fr-FR"/>
-        </w:rPr>
-        <w:t xml:space="preserve"> on port 443/</w:t>
-      </w:r>
-      <w:proofErr w:type="spellStart"/>
-      <w:r>
-        <w:rPr>
-          <w:lang w:val="fr-FR"/>
-        </w:rPr>
-        <w:t>tcp</w:t>
-      </w:r>
-      <w:proofErr w:type="spellEnd"/>
-      <w:r>
-        <w:rPr>
-          <w:lang w:val="fr-FR"/>
-        </w:rPr>
-        <w:t>.</w:t>
-      </w:r>
-    </w:p>
-    <w:p>
-      <w:pPr>
-        <w:pStyle w:val="ActivityBullet"/>
-      </w:pPr>
-      <w:r>
-        <w:t>2026-01-29 14:06:55-0500PM ET enumeration Completed SSL/TLS analysis on ports 443/</w:t>
-      </w:r>
-      <w:proofErr w:type="spellStart"/>
-      <w:r>
-        <w:t>tcp</w:t>
-      </w:r>
-      <w:proofErr w:type="spellEnd"/>
-      <w:r>
-        <w:t>.</w:t>
-      </w:r>
-    </w:p>
-    <w:p>
-      <w:pPr>
-        <w:pStyle w:val="ActivityBullet"/>
-      </w:pPr>
-      <w:r>
-        <w:t>2026-01-29 14:06:55-0500PM ET enumeration Completed hidden directory enumeration scan.</w:t>
-      </w:r>
-    </w:p>
-    <w:p>
-      <w:pPr>
-        <w:pStyle w:val="ActivityBullet"/>
-      </w:pPr>
-      <w:r>
-        <w:t xml:space="preserve">2026-01-29 14:06:55-0500PM ET enumeration </w:t>
-      </w:r>
-      <w:proofErr w:type="spellStart"/>
-      <w:r>
-        <w:t>Peforming</w:t>
-      </w:r>
-      <w:proofErr w:type="spellEnd"/>
-      <w:r>
-        <w:t xml:space="preserve"> a hidden directory enumeration attack on 443/</w:t>
-      </w:r>
-      <w:proofErr w:type="spellStart"/>
-      <w:r>
-        <w:t>tcp</w:t>
-      </w:r>
-      <w:proofErr w:type="spellEnd"/>
-      <w:r>
-        <w:t>.</w:t>
-      </w:r>
-    </w:p>
-    <w:p>
-      <w:pPr>
-        <w:pStyle w:val="ActivityBullet"/>
-      </w:pPr>
-      <w:r>
-        <w:t xml:space="preserve">2026-01-29 14:06:55-0500PM ET enumeration Completed </w:t>
-      </w:r>
-      <w:proofErr w:type="spellStart"/>
-      <w:r>
-        <w:t>nmap</w:t>
-      </w:r>
-      <w:proofErr w:type="spellEnd"/>
-      <w:r>
-        <w:t xml:space="preserve"> script scan using script: ssh2-enum-algos.</w:t>
-      </w:r>
-    </w:p>
-    <w:p>
-      <w:pPr>
-        <w:pStyle w:val="ActivityBullet"/>
-      </w:pPr>
-      <w:r>
-        <w:t xml:space="preserve">2026-01-29 14:06:55-0500PM ET enumeration Completed </w:t>
-      </w:r>
-      <w:proofErr w:type="spellStart"/>
-      <w:r>
-        <w:t>nmap</w:t>
-      </w:r>
-      <w:proofErr w:type="spellEnd"/>
-      <w:r>
-        <w:t xml:space="preserve"> script scan using script: ssh-auth-methods.</w:t>
-      </w:r>
-    </w:p>
-    <w:p>
-      <w:pPr>
-        <w:pStyle w:val="ActivityBullet"/>
-      </w:pPr>
-      <w:r>
-        <w:t xml:space="preserve">2026-01-29 14:06:55-0500PM ET enumeration Completed </w:t>
-      </w:r>
-      <w:proofErr w:type="spellStart"/>
-      <w:r>
-        <w:t>nmap</w:t>
-      </w:r>
-      <w:proofErr w:type="spellEnd"/>
-      <w:r>
-        <w:t xml:space="preserve"> script scan using script: sshv1.</w:t>
-      </w:r>
-    </w:p>
-    <w:p>
-      <w:pPr>
-        <w:pStyle w:val="ActivityBullet"/>
-      </w:pPr>
-      <w:r>
-        <w:t xml:space="preserve">2026-01-29 14:06:55-0500PM ET </w:t>
-      </w:r>
-      <w:proofErr w:type="gramStart"/>
-      <w:r>
-        <w:t>enumeration</w:t>
-      </w:r>
-      <w:proofErr w:type="gramEnd"/>
-      <w:r>
-        <w:t xml:space="preserve"> Completed </w:t>
-      </w:r>
-      <w:proofErr w:type="gramStart"/>
-      <w:r>
-        <w:t>enumerating</w:t>
-      </w:r>
-      <w:proofErr w:type="gramEnd"/>
-      <w:r>
-        <w:t xml:space="preserve"> SSH services.</w:t>
-      </w:r>
-    </w:p>
-    <w:p>
-      <w:pPr>
-        <w:pStyle w:val="ActivityBullet"/>
-      </w:pPr>
-      <w:r>
-        <w:t>2026-01-29 14:06:58-0500PM ET enumeration Analyzing web services running on port 80/</w:t>
-      </w:r>
-      <w:proofErr w:type="spellStart"/>
-      <w:r>
-        <w:t>tcp</w:t>
-      </w:r>
-      <w:proofErr w:type="spellEnd"/>
-      <w:r>
-        <w:t>.</w:t>
-      </w:r>
-    </w:p>
-    <w:p>
-      <w:pPr>
-        <w:pStyle w:val="ActivityBullet"/>
-      </w:pPr>
-      <w:r>
-        <w:t>2026-01-29 14:08:10-0500PM ET enumeration Completed analyzing web services running on port 80/</w:t>
-      </w:r>
-      <w:proofErr w:type="spellStart"/>
-      <w:r>
-        <w:t>tcp</w:t>
-      </w:r>
-      <w:proofErr w:type="spellEnd"/>
-      <w:r>
-        <w:t>.</w:t>
-      </w:r>
-    </w:p>
-    <w:p>
-      <w:pPr>
-        <w:pStyle w:val="ActivityBullet"/>
-      </w:pPr>
-      <w:r>
-        <w:t xml:space="preserve">2026-01-29 14:08:10-0500PM ET </w:t>
-      </w:r>
-      <w:proofErr w:type="gramStart"/>
-      <w:r>
-        <w:t>enumeration</w:t>
-      </w:r>
-      <w:proofErr w:type="gramEnd"/>
-      <w:r>
-        <w:t xml:space="preserve"> Completed </w:t>
-      </w:r>
-      <w:proofErr w:type="gramStart"/>
-      <w:r>
-        <w:t>hidden directory enumeration scan</w:t>
-      </w:r>
-      <w:proofErr w:type="gramEnd"/>
-      <w:r>
-        <w:t>.</w:t>
-      </w:r>
-    </w:p>
-    <w:p>
-      <w:pPr>
-        <w:pStyle w:val="ActivityBullet"/>
-      </w:pPr>
-      <w:r>
-        <w:t>2026-01-29 14:08:10-0500PM ET enumeration Completed analyzing web services running on port 80/</w:t>
-      </w:r>
-      <w:proofErr w:type="spellStart"/>
-      <w:r>
-        <w:t>tcp</w:t>
-      </w:r>
-      <w:proofErr w:type="spellEnd"/>
-      <w:r>
-        <w:t>.</w:t>
-      </w:r>
-    </w:p>
-    <w:p>
-      <w:pPr>
-        <w:pStyle w:val="ActivityBullet"/>
-      </w:pPr>
-      <w:r>
-        <w:t xml:space="preserve">2026-01-29 14:08:10-0500PM ET </w:t>
-      </w:r>
-      <w:proofErr w:type="gramStart"/>
-      <w:r>
-        <w:t>enumeration</w:t>
-      </w:r>
-      <w:proofErr w:type="gramEnd"/>
-      <w:r>
-        <w:t xml:space="preserve"> Completed </w:t>
-      </w:r>
-      <w:proofErr w:type="gramStart"/>
-      <w:r>
-        <w:t>enumerating</w:t>
-      </w:r>
-      <w:proofErr w:type="gramEnd"/>
-      <w:r>
-        <w:t xml:space="preserve"> HTTP services.</w:t>
-      </w:r>
-    </w:p>
-    <w:p>
-      <w:pPr>
-        <w:pStyle w:val="ActivityBullet"/>
-      </w:pPr>
-      <w:r>
-        <w:t>2026-01-29 14:08:13-0500PM ET enumeration Analyzing web services running on port 443/</w:t>
-      </w:r>
-      <w:proofErr w:type="spellStart"/>
-      <w:r>
-        <w:t>tcp</w:t>
-      </w:r>
-      <w:proofErr w:type="spellEnd"/>
-      <w:r>
-        <w:t>.</w:t>
-      </w:r>
-    </w:p>
-    <w:p>
-      <w:pPr>
-        <w:pStyle w:val="ActivityBullet"/>
-      </w:pPr>
-      <w:r>
-        <w:t xml:space="preserve">2026-01-29 14:09:15-0500PM ET </w:t>
-      </w:r>
-      <w:proofErr w:type="gramStart"/>
-      <w:r>
-        <w:t>enumeration</w:t>
-      </w:r>
-      <w:proofErr w:type="gramEnd"/>
-      <w:r>
-        <w:t xml:space="preserve"> Completed analyzing web services running on port 443/</w:t>
-      </w:r>
-      <w:proofErr w:type="spellStart"/>
-      <w:r>
-        <w:t>tcp</w:t>
-      </w:r>
-      <w:proofErr w:type="spellEnd"/>
-      <w:r>
-        <w:t>.</w:t>
-      </w:r>
-    </w:p>
-    <w:p>
-      <w:pPr>
-        <w:pStyle w:val="ActivityBullet"/>
-      </w:pPr>
-      <w:r>
-        <w:t xml:space="preserve">2026-01-29 14:09:15-0500PM ET </w:t>
-      </w:r>
-      <w:proofErr w:type="gramStart"/>
-      <w:r>
-        <w:t>enumeration</w:t>
-      </w:r>
-      <w:proofErr w:type="gramEnd"/>
-      <w:r>
-        <w:t xml:space="preserve"> Completed analyzing web services running on port 443/</w:t>
-      </w:r>
-      <w:proofErr w:type="spellStart"/>
-      <w:r>
-        <w:t>tcp</w:t>
-      </w:r>
-      <w:proofErr w:type="spellEnd"/>
-      <w:r>
-        <w:t>.</w:t>
-      </w:r>
-    </w:p>
-    <w:p>
-      <w:pPr>
-        <w:pStyle w:val="ActivityBullet"/>
-      </w:pPr>
-      <w:r>
-        <w:t>2026-01-29 14:09:16-0500PM ET enumeration Completed enumerating HTTPS services.</w:t>
-      </w:r>
-    </w:p>
-    <w:p>
-      <w:pPr>
-        <w:pStyle w:val="ActivityBullet"/>
-      </w:pPr>
-      <w:r>
-        <w:t xml:space="preserve">2026-01-29 14:09:45-0500PM ET </w:t>
-      </w:r>
-      <w:proofErr w:type="gramStart"/>
-      <w:r>
-        <w:t>enumeration</w:t>
-      </w:r>
-      <w:proofErr w:type="gramEnd"/>
-      <w:r>
-        <w:t xml:space="preserve"> </w:t>
-      </w:r>
-      <w:proofErr w:type="spellStart"/>
-      <w:r>
-        <w:t>Enumeration</w:t>
-      </w:r>
-      <w:proofErr w:type="spellEnd"/>
-      <w:r>
-        <w:t xml:space="preserve"> module completed.</w:t>
-      </w:r>
-    </w:p>
-    <w:p>
-      <w:pPr>
-        <w:pStyle w:val="ActivityBullet"/>
-        <w:rPr>
-          <w:lang w:val="fr-FR"/>
-        </w:rPr>
-      </w:pPr>
-      <w:r>
-        <w:rPr>
-          <w:lang w:val="fr-FR"/>
-        </w:rPr>
-        <w:t xml:space="preserve">2026-01-29 </w:t>
-      </w:r>
-      <w:proofErr w:type="gramStart"/>
-      <w:r>
-        <w:rPr>
-          <w:lang w:val="fr-FR"/>
-        </w:rPr>
-        <w:t>14:10:</w:t>
-      </w:r>
-      <w:proofErr w:type="gramEnd"/>
-      <w:r>
-        <w:rPr>
-          <w:lang w:val="fr-FR"/>
-        </w:rPr>
-        <w:t xml:space="preserve">06-0500PM ET exploit </w:t>
-      </w:r>
-      <w:proofErr w:type="spellStart"/>
-      <w:r>
-        <w:rPr>
-          <w:lang w:val="fr-FR"/>
-        </w:rPr>
-        <w:t>Launching</w:t>
-      </w:r>
-      <w:proofErr w:type="spellEnd"/>
-      <w:r>
-        <w:rPr>
-          <w:lang w:val="fr-FR"/>
-        </w:rPr>
-        <w:t xml:space="preserve"> exploit module.</w:t>
-      </w:r>
-    </w:p>
-    <w:p>
-      <w:pPr>
-        <w:pStyle w:val="ActivityBullet"/>
-      </w:pPr>
-      <w:r>
-        <w:t>2026-01-29 14:10:11-0500PM ET exploit Queuing up hydra attack: SSH password attack.</w:t>
-      </w:r>
-    </w:p>
-    <w:p>
-      <w:pPr>
-        <w:pStyle w:val="ActivityBullet"/>
-      </w:pPr>
-      <w:r>
-        <w:t>2026-01-29 14:11:16-0500PM ET exploit Completed hydra attack: SSH password attack.</w:t>
-      </w:r>
-    </w:p>
-    <w:p>
-      <w:pPr>
-        <w:pStyle w:val="ActivityBullet"/>
-      </w:pPr>
-      <w:r>
-        <w:t>2026-01-29 14:11:16-0500PM ET exploit Completed SSH password attack.</w:t>
-      </w:r>
-    </w:p>
-    <w:p>
-      <w:pPr>
-        <w:pStyle w:val="ActivityBullet"/>
-        <w:rPr>
-          <w:lang w:val="fr-FR"/>
-        </w:rPr>
-      </w:pPr>
-      <w:r>
-        <w:rPr>
-          <w:lang w:val="fr-FR"/>
-        </w:rPr>
-        <w:t xml:space="preserve">2026-01-29 </w:t>
-      </w:r>
-      <w:proofErr w:type="gramStart"/>
-      <w:r>
-        <w:rPr>
-          <w:lang w:val="fr-FR"/>
-        </w:rPr>
-        <w:t>14:11:</w:t>
-      </w:r>
-      <w:proofErr w:type="gramEnd"/>
-      <w:r>
-        <w:rPr>
-          <w:lang w:val="fr-FR"/>
-        </w:rPr>
-        <w:t xml:space="preserve">49-0500PM ET exploit </w:t>
-      </w:r>
-      <w:proofErr w:type="spellStart"/>
-      <w:r>
-        <w:rPr>
-          <w:lang w:val="fr-FR"/>
-        </w:rPr>
-        <w:t>Completed</w:t>
-      </w:r>
-      <w:proofErr w:type="spellEnd"/>
-      <w:r>
-        <w:rPr>
-          <w:lang w:val="fr-FR"/>
-        </w:rPr>
-        <w:t xml:space="preserve"> exploit module.</w:t>
+        <w:t>2026-01-29 14:11:49-0500PM ET exploit Completed exploit module.</w:t>
       </w:r>
     </w:p>
     <w:p>
@@ -7969,7 +7493,7 @@
           <w14:ligatures w14:val="none"/>
         </w:rPr>
         <w:drawing>
-          <wp:inline distT="0" distB="0" distL="0" distR="0" wp14:anchorId="03962334" wp14:editId="19C287B7">
+          <wp:inline distT="0" distB="0" distL="0" distR="0" wp14:anchorId="03962334" wp14:editId="0CF06C05">
             <wp:extent cx="152400" cy="152400"/>
             <wp:effectExtent l="0" t="0" r="0" b="0"/>
             <wp:docPr id="2011428596" name="Picture 2011428596" descr="Fire with solid fill"/>
@@ -8290,7 +7814,7 @@
           <w:noProof/>
         </w:rPr>
         <w:drawing>
-          <wp:inline distT="0" distB="0" distL="0" distR="0" wp14:anchorId="4E859D90" wp14:editId="76FA8A08">
+          <wp:inline distT="0" distB="0" distL="0" distR="0" wp14:anchorId="35BBA538" wp14:editId="7ABE292F">
             <wp:extent cx="5943600" cy="830317"/>
             <wp:effectExtent l="0" t="0" r="0" b="0"/>
             <wp:docPr id="2011428597" name="Picture 2011428597"/>
@@ -8325,6 +7849,11 @@
           </wp:inline>
         </w:drawing>
       </w:r>
+    </w:p>
+    <w:p>
+      <w:pPr>
+        <w:spacing w:after="120"/>
+      </w:pPr>
     </w:p>
     <w:p>
       <w:pPr>

</xml_diff>

<commit_message>
Updates with Findings Details: Needs to be modified further
</commit_message>
<xml_diff>
--- a/Source_Code/Reports/Sample499/FindingsReportTest.docx
+++ b/Source_Code/Reports/Sample499/FindingsReportTest.docx
@@ -601,7 +601,7 @@
           <w14:ligatures w14:val="none"/>
         </w:rPr>
         <w:drawing>
-          <wp:anchor distT="0" distB="0" distL="114300" distR="114300" simplePos="0" relativeHeight="251662336" behindDoc="0" locked="0" layoutInCell="1" allowOverlap="1" wp14:anchorId="56FF54E8" wp14:editId="7E6CABB1">
+          <wp:anchor distT="0" distB="0" distL="114300" distR="114300" simplePos="0" relativeHeight="251662336" behindDoc="0" locked="0" layoutInCell="1" allowOverlap="1" wp14:anchorId="56FF54E8" wp14:editId="7CC950C4">
             <wp:simplePos x="0" y="0"/>
             <wp:positionH relativeFrom="margin">
               <wp:posOffset>1163955</wp:posOffset>
@@ -4634,6 +4634,191 @@
       <w:bookmarkEnd w:id="7"/>
     </w:p>
     <w:p>
+      <w:r>
+        <w:rPr>
+          <w:b/>
+          <w:sz w:val="26"/>
+        </w:rPr>
+        <w:t>Remote SSH Service Exposed to Public Internet</w:t>
+      </w:r>
+    </w:p>
+    <w:p>
+      <w:r>
+        <w:rPr>
+          <w:b/>
+          <w:sz w:val="22"/>
+        </w:rPr>
+        <w:t>Risk Level: Medium</w:t>
+      </w:r>
+    </w:p>
+    <w:p>
+      <w:r>
+        <w:rPr>
+          <w:b/>
+        </w:rPr>
+        <w:t xml:space="preserve">Finding Description: </w:t>
+      </w:r>
+      <w:r>
+        <w:t>During testing, OrbitalFire identified that remote administration services, including SSH, were exposed to the public internet. This exposure is often the result of misconfiguration or insufficient access controls, which significantly increase the attack surface. Publicly accessible SSH services are susceptible to brute-force and password-guessing attacks, which may lead to unauthorized system access. Additionally, newly disclosed vulnerabilities, including zero-day exploits, could be leveraged by threat actors to further compromise exposed systems.</w:t>
+      </w:r>
+    </w:p>
+    <w:p>
+      <w:r>
+        <w:rPr>
+          <w:b/>
+        </w:rPr>
+        <w:t xml:space="preserve">Recommendation: </w:t>
+      </w:r>
+      <w:r>
+        <w:t>Restrict Access to Remote SSH – Restrict access from the public Internet. Ensure that the Remote SSH service is only reachable through secure environments, such as a Virtual Private Network (VPN) or specific authorized IP address configurations.</w:t>
+      </w:r>
+    </w:p>
+    <w:p/>
+    <w:p>
+      <w:r>
+        <w:rPr>
+          <w:b/>
+          <w:sz w:val="26"/>
+        </w:rPr>
+        <w:t>Misconfigured DMARC Record</w:t>
+      </w:r>
+    </w:p>
+    <w:p>
+      <w:r>
+        <w:rPr>
+          <w:b/>
+          <w:sz w:val="22"/>
+        </w:rPr>
+        <w:t>Risk Level: Medium</w:t>
+      </w:r>
+    </w:p>
+    <w:p>
+      <w:r>
+        <w:rPr>
+          <w:b/>
+        </w:rPr>
+        <w:t xml:space="preserve">Finding Description: </w:t>
+      </w:r>
+      <w:r>
+        <w:t xml:space="preserve">During testing, OrbitalFire identified that [CUSTOMER NAME] has a misconfigured DMARC (Domain-based Message Authentication, Reporting, and Conformance) record for one or more of their </w:t>
+      </w:r>
+      <w:proofErr w:type="gramStart"/>
+      <w:r>
+        <w:t>domain</w:t>
+      </w:r>
+      <w:proofErr w:type="gramEnd"/>
+      <w:r>
+        <w:t>(s). DMARC is critical for verifying the authenticity of emails sent from the organization, serving as a vital barrier against email spoofing and phishing attacks. Without proper configuration, DMARC fails to instruct receiving mail servers on how to treat email messages from the organization's domain, thereby increasing vulnerability to attack.</w:t>
+      </w:r>
+    </w:p>
+    <w:p>
+      <w:r>
+        <w:rPr>
+          <w:b/>
+        </w:rPr>
+        <w:t xml:space="preserve">Recommendation: </w:t>
+      </w:r>
+      <w:r>
+        <w:t xml:space="preserve">Reconfigure DMARC Record </w:t>
+      </w:r>
+      <w:proofErr w:type="gramStart"/>
+      <w:r>
+        <w:t>–  Review</w:t>
+      </w:r>
+      <w:proofErr w:type="gramEnd"/>
+      <w:r>
+        <w:t xml:space="preserve"> and rectify the current DMARC record configuration. The DMARC policy should be explicitly defined, ideally set to "quarantine" or "reject," which directs receiving mail servers on the proper handling of unauthenticated messages.</w:t>
+      </w:r>
+    </w:p>
+    <w:p/>
+    <w:p>
+      <w:r>
+        <w:rPr>
+          <w:b/>
+          <w:sz w:val="26"/>
+        </w:rPr>
+        <w:t>Subdomain Takeover Vulnerability</w:t>
+      </w:r>
+    </w:p>
+    <w:p>
+      <w:r>
+        <w:rPr>
+          <w:b/>
+          <w:sz w:val="22"/>
+        </w:rPr>
+        <w:t>Risk Level: High</w:t>
+      </w:r>
+    </w:p>
+    <w:p>
+      <w:r>
+        <w:rPr>
+          <w:b/>
+        </w:rPr>
+        <w:lastRenderedPageBreak/>
+        <w:t xml:space="preserve">Finding Description: </w:t>
+      </w:r>
+      <w:r>
+        <w:t>During testing, OrbitalFire identified a potential subdomain takeover vulnerability affecting one or more domains owned by [CUSTOMER NAME]. This issue typically results from misconfigured DNS records that reference unclaimed or deprovisioned third-party services, allowing an attacker to register the external resource and gain control of the associated subdomain. If exploited, an attacker could host malicious content, impersonate the organization, conduct phishing campaigns, or collect user data, posing a significant risk to brand reputation, user trust, and overall security posture.</w:t>
+      </w:r>
+    </w:p>
+    <w:p>
+      <w:r>
+        <w:rPr>
+          <w:b/>
+        </w:rPr>
+        <w:t xml:space="preserve">Recommendation: </w:t>
+      </w:r>
+      <w:r>
+        <w:t>Remediate Subdomain Takeover Exposure – Identify and remove misconfigured or stale DNS records that reference unclaimed or deprovisioned third-party services. Conduct a comprehensive review of all DNS entries to ensure they accurately map to active, authorized resources, and implement continuous monitoring to detect future misconfigurations. Where applicable, apply DNS security best practices such as DNSSEC and maintain proper lifecycle management of external service integrations to prevent unauthorized subdomain claims.</w:t>
+      </w:r>
+    </w:p>
+    <w:p/>
+    <w:p>
+      <w:pPr>
+        <w:spacing w:line="259" w:lineRule="auto"/>
+        <w:contextualSpacing/>
+        <w:rPr>
+          <w:rFonts w:ascii="Corbel" w:eastAsia="Calibri" w:hAnsi="Corbel" w:cs="Arial"/>
+          <w:color w:val="404040"/>
+          <w:kern w:val="0"/>
+          <w:szCs w:val="22"/>
+          <w14:ligatures w14:val="none"/>
+        </w:rPr>
+      </w:pPr>
+      <w:r>
+        <w:rPr>
+          <w:rFonts w:ascii="Corbel" w:eastAsia="Calibri" w:hAnsi="Corbel" w:cs="Arial"/>
+          <w:color w:val="404040"/>
+          <w:kern w:val="0"/>
+          <w:szCs w:val="22"/>
+          <w14:ligatures w14:val="none"/>
+        </w:rPr>
+        <w:br/>
+      </w:r>
+    </w:p>
+    <w:p>
+      <w:pPr>
+        <w:spacing w:line="259" w:lineRule="auto"/>
+        <w:rPr>
+          <w:rFonts w:ascii="Corbel" w:eastAsia="Calibri" w:hAnsi="Corbel" w:cs="Arial"/>
+          <w:color w:val="404040"/>
+          <w:kern w:val="0"/>
+          <w:szCs w:val="22"/>
+          <w14:ligatures w14:val="none"/>
+        </w:rPr>
+      </w:pPr>
+      <w:r>
+        <w:rPr>
+          <w:rFonts w:ascii="Corbel" w:eastAsia="Calibri" w:hAnsi="Corbel" w:cs="Arial"/>
+          <w:color w:val="404040"/>
+          <w:kern w:val="0"/>
+          <w:szCs w:val="22"/>
+          <w14:ligatures w14:val="none"/>
+        </w:rPr>
+        <w:br w:type="page"/>
+      </w:r>
+    </w:p>
+    <w:p>
       <w:pPr>
         <w:keepNext/>
         <w:keepLines/>
@@ -4650,6 +4835,8 @@
           <w14:ligatures w14:val="none"/>
         </w:rPr>
       </w:pPr>
+      <w:bookmarkStart w:id="8" w:name="_Hlk190857538"/>
+      <w:bookmarkStart w:id="9" w:name="_Hlk190857520"/>
       <w:r>
         <w:rPr>
           <w:rFonts w:ascii="Handel Gothic D" w:eastAsia="DengXian Light" w:hAnsi="Handel Gothic D" w:cs="Times New Roman"/>
@@ -4662,441 +4849,10 @@
           <w:highlight w:val="yellow"/>
           <w14:ligatures w14:val="none"/>
         </w:rPr>
-        <w:t>Critical</w:t>
-      </w:r>
-    </w:p>
-    <w:p>
-      <w:pPr>
-        <w:numPr>
-          <w:ilvl w:val="0"/>
-          <w:numId w:val="11"/>
-        </w:numPr>
-        <w:spacing w:line="259" w:lineRule="auto"/>
-        <w:contextualSpacing/>
-        <w:rPr>
-          <w:rFonts w:ascii="Corbel" w:eastAsia="Calibri" w:hAnsi="Corbel" w:cs="Arial"/>
-          <w:color w:val="404040"/>
-          <w:kern w:val="0"/>
-          <w:szCs w:val="22"/>
-          <w14:ligatures w14:val="none"/>
-        </w:rPr>
-      </w:pPr>
-      <w:r>
-        <w:rPr>
-          <w:rFonts w:ascii="Corbel" w:eastAsia="Calibri" w:hAnsi="Corbel" w:cs="Arial"/>
-          <w:color w:val="404040"/>
-          <w:kern w:val="0"/>
-          <w:szCs w:val="22"/>
-          <w14:ligatures w14:val="none"/>
-        </w:rPr>
-        <w:t>None</w:t>
-      </w:r>
-    </w:p>
-    <w:p>
-      <w:pPr>
-        <w:keepNext/>
-        <w:keepLines/>
-        <w:spacing w:before="240" w:after="120" w:line="259" w:lineRule="auto"/>
-        <w:outlineLvl w:val="1"/>
-        <w:rPr>
-          <w:rFonts w:ascii="Handel Gothic D" w:eastAsia="DengXian Light" w:hAnsi="Handel Gothic D" w:cs="Times New Roman"/>
-          <w:b/>
-          <w:caps/>
-          <w:color w:val="FF6633"/>
-          <w:kern w:val="0"/>
-          <w:sz w:val="32"/>
-          <w:szCs w:val="26"/>
-          <w14:ligatures w14:val="none"/>
-        </w:rPr>
-      </w:pPr>
-      <w:r>
-        <w:rPr>
-          <w:rFonts w:ascii="Handel Gothic D" w:eastAsia="DengXian Light" w:hAnsi="Handel Gothic D" w:cs="Times New Roman"/>
-          <w:b/>
-          <w:caps/>
-          <w:color w:val="FF6633"/>
-          <w:kern w:val="0"/>
-          <w:sz w:val="32"/>
-          <w:szCs w:val="26"/>
-          <w:highlight w:val="yellow"/>
-          <w14:ligatures w14:val="none"/>
-        </w:rPr>
-        <w:t>High</w:t>
-      </w:r>
-    </w:p>
-    <w:p>
-      <w:pPr>
-        <w:numPr>
-          <w:ilvl w:val="0"/>
-          <w:numId w:val="12"/>
-        </w:numPr>
-        <w:spacing w:line="259" w:lineRule="auto"/>
-        <w:contextualSpacing/>
-        <w:rPr>
-          <w:rFonts w:ascii="Corbel" w:eastAsia="Calibri" w:hAnsi="Corbel" w:cs="Arial"/>
-          <w:color w:val="404040"/>
-          <w:kern w:val="0"/>
-          <w:szCs w:val="22"/>
-          <w14:ligatures w14:val="none"/>
-        </w:rPr>
-      </w:pPr>
-      <w:bookmarkStart w:id="8" w:name="_Hlk206664222"/>
-      <w:r>
-        <w:rPr>
-          <w:rFonts w:ascii="Corbel" w:eastAsia="Calibri" w:hAnsi="Corbel" w:cs="Arial"/>
-          <w:color w:val="404040"/>
-          <w:kern w:val="0"/>
-          <w:szCs w:val="22"/>
-          <w14:ligatures w14:val="none"/>
-        </w:rPr>
-        <w:t>None</w:t>
-      </w:r>
-    </w:p>
-    <w:bookmarkEnd w:id="8"/>
-    <w:p>
-      <w:pPr>
-        <w:keepNext/>
-        <w:keepLines/>
-        <w:spacing w:before="240" w:after="120" w:line="259" w:lineRule="auto"/>
-        <w:outlineLvl w:val="1"/>
-        <w:rPr>
-          <w:rFonts w:ascii="Handel Gothic D" w:eastAsia="DengXian Light" w:hAnsi="Handel Gothic D" w:cs="Times New Roman"/>
-          <w:b/>
-          <w:caps/>
-          <w:color w:val="FF6633"/>
-          <w:kern w:val="0"/>
-          <w:sz w:val="32"/>
-          <w:szCs w:val="26"/>
-          <w14:ligatures w14:val="none"/>
-        </w:rPr>
-      </w:pPr>
-      <w:r>
-        <w:rPr>
-          <w:rFonts w:ascii="Handel Gothic D" w:eastAsia="DengXian Light" w:hAnsi="Handel Gothic D" w:cs="Times New Roman"/>
-          <w:b/>
-          <w:caps/>
-          <w:color w:val="FF6633"/>
-          <w:kern w:val="0"/>
-          <w:sz w:val="32"/>
-          <w:szCs w:val="26"/>
-          <w:highlight w:val="yellow"/>
-          <w14:ligatures w14:val="none"/>
-        </w:rPr>
-        <w:t>Medium</w:t>
-      </w:r>
-    </w:p>
-    <w:p>
-      <w:pPr>
-        <w:numPr>
-          <w:ilvl w:val="0"/>
-          <w:numId w:val="15"/>
-        </w:numPr>
-        <w:spacing w:line="259" w:lineRule="auto"/>
-        <w:contextualSpacing/>
-        <w:rPr>
-          <w:rFonts w:ascii="Corbel" w:eastAsia="Calibri" w:hAnsi="Corbel" w:cs="Arial"/>
-          <w:color w:val="404040"/>
-          <w:kern w:val="0"/>
-          <w:szCs w:val="22"/>
-          <w14:ligatures w14:val="none"/>
-        </w:rPr>
-      </w:pPr>
-      <w:r>
-        <w:rPr>
-          <w:rFonts w:ascii="Corbel" w:eastAsia="Calibri" w:hAnsi="Corbel" w:cs="Arial"/>
-          <w:b/>
-          <w:bCs/>
-          <w:color w:val="404040"/>
-          <w:kern w:val="0"/>
-          <w:szCs w:val="22"/>
-          <w14:ligatures w14:val="none"/>
-        </w:rPr>
-        <w:t>SMB NULL Session Authentication –</w:t>
-      </w:r>
-      <w:r>
-        <w:rPr>
-          <w:rFonts w:ascii="Corbel" w:eastAsia="Calibri" w:hAnsi="Corbel" w:cs="Arial"/>
-          <w:color w:val="404040"/>
-          <w:kern w:val="0"/>
-          <w:szCs w:val="22"/>
-          <w14:ligatures w14:val="none"/>
-        </w:rPr>
-        <w:t xml:space="preserve"> The Server Message Block (SMB) protocol provides functionality for shared access to files and printers across networks. However, it is vulnerable to NULL session authentication, which permits unauthenticated access without requiring a username or password.</w:t>
-      </w:r>
-      <w:r>
-        <w:rPr>
-          <w:rFonts w:ascii="Corbel" w:eastAsia="Calibri" w:hAnsi="Corbel" w:cs="Arial"/>
-          <w:color w:val="404040"/>
-          <w:kern w:val="0"/>
-          <w:szCs w:val="22"/>
-          <w14:ligatures w14:val="none"/>
-        </w:rPr>
-        <w:br/>
-      </w:r>
-      <w:r>
-        <w:rPr>
-          <w:rFonts w:ascii="Corbel" w:eastAsia="Calibri" w:hAnsi="Corbel" w:cs="Arial"/>
-          <w:noProof/>
-          <w:color w:val="404040"/>
-          <w:kern w:val="0"/>
-          <w:szCs w:val="22"/>
-          <w14:ligatures w14:val="none"/>
-        </w:rPr>
-        <w:drawing>
-          <wp:inline distT="0" distB="0" distL="0" distR="0" wp14:anchorId="3CA7A7F8" wp14:editId="06E3B89A">
-            <wp:extent cx="5650861" cy="1682504"/>
-            <wp:effectExtent l="0" t="0" r="7620" b="0"/>
-            <wp:docPr id="292149150" name="Picture 1"/>
-            <wp:cNvGraphicFramePr>
-              <a:graphicFrameLocks xmlns:a="http://schemas.openxmlformats.org/drawingml/2006/main" noChangeAspect="1"/>
-            </wp:cNvGraphicFramePr>
-            <a:graphic xmlns:a="http://schemas.openxmlformats.org/drawingml/2006/main">
-              <a:graphicData uri="http://schemas.openxmlformats.org/drawingml/2006/picture">
-                <pic:pic xmlns:pic="http://schemas.openxmlformats.org/drawingml/2006/picture">
-                  <pic:nvPicPr>
-                    <pic:cNvPr id="292149150" name=""/>
-                    <pic:cNvPicPr/>
-                  </pic:nvPicPr>
-                  <pic:blipFill>
-                    <a:blip r:embed="rId14"/>
-                    <a:stretch>
-                      <a:fillRect/>
-                    </a:stretch>
-                  </pic:blipFill>
-                  <pic:spPr>
-                    <a:xfrm>
-                      <a:off x="0" y="0"/>
-                      <a:ext cx="5664067" cy="1686436"/>
-                    </a:xfrm>
-                    <a:prstGeom prst="rect">
-                      <a:avLst/>
-                    </a:prstGeom>
-                  </pic:spPr>
-                </pic:pic>
-              </a:graphicData>
-            </a:graphic>
-          </wp:inline>
-        </w:drawing>
-      </w:r>
-      <w:r>
-        <w:rPr>
-          <w:rFonts w:ascii="Corbel" w:eastAsia="Calibri" w:hAnsi="Corbel" w:cs="Arial"/>
-          <w:color w:val="404040"/>
-          <w:kern w:val="0"/>
-          <w:szCs w:val="22"/>
-          <w14:ligatures w14:val="none"/>
-        </w:rPr>
-        <w:br/>
-      </w:r>
-      <w:r>
-        <w:rPr>
-          <w:rFonts w:ascii="Corbel" w:eastAsia="Calibri" w:hAnsi="Corbel" w:cs="Arial"/>
-          <w:i/>
-          <w:iCs/>
-          <w:color w:val="404040"/>
-          <w:kern w:val="0"/>
-          <w:szCs w:val="22"/>
-          <w14:ligatures w14:val="none"/>
-        </w:rPr>
-        <w:t>Evidence:</w:t>
-      </w:r>
-      <w:r>
-        <w:rPr>
-          <w:rFonts w:ascii="Corbel" w:eastAsia="Calibri" w:hAnsi="Corbel" w:cs="Arial"/>
-          <w:i/>
-          <w:iCs/>
-          <w:color w:val="404040"/>
-          <w:kern w:val="0"/>
-          <w:szCs w:val="22"/>
-          <w14:ligatures w14:val="none"/>
-        </w:rPr>
-        <w:br/>
-      </w:r>
-      <w:r>
-        <w:rPr>
-          <w:rFonts w:ascii="Corbel" w:eastAsia="Calibri" w:hAnsi="Corbel" w:cs="Arial"/>
-          <w:i/>
-          <w:iCs/>
-          <w:noProof/>
-          <w:color w:val="404040"/>
-          <w:kern w:val="0"/>
-          <w:szCs w:val="22"/>
-          <w14:ligatures w14:val="none"/>
-        </w:rPr>
-        <w:drawing>
-          <wp:inline distT="0" distB="0" distL="0" distR="0" wp14:anchorId="692DA7D0" wp14:editId="178BB56D">
-            <wp:extent cx="5631126" cy="2463539"/>
-            <wp:effectExtent l="0" t="0" r="8255" b="0"/>
-            <wp:docPr id="1553660219" name="Picture 4"/>
-            <wp:cNvGraphicFramePr>
-              <a:graphicFrameLocks xmlns:a="http://schemas.openxmlformats.org/drawingml/2006/main" noChangeAspect="1"/>
-            </wp:cNvGraphicFramePr>
-            <a:graphic xmlns:a="http://schemas.openxmlformats.org/drawingml/2006/main">
-              <a:graphicData uri="http://schemas.openxmlformats.org/drawingml/2006/picture">
-                <pic:pic xmlns:pic="http://schemas.openxmlformats.org/drawingml/2006/picture">
-                  <pic:nvPicPr>
-                    <pic:cNvPr id="0" name="Picture 2"/>
-                    <pic:cNvPicPr>
-                      <a:picLocks noChangeAspect="1" noChangeArrowheads="1"/>
-                    </pic:cNvPicPr>
-                  </pic:nvPicPr>
-                  <pic:blipFill>
-                    <a:blip r:embed="rId15">
-                      <a:extLst>
-                        <a:ext uri="{28A0092B-C50C-407E-A947-70E740481C1C}">
-                          <a14:useLocalDpi xmlns:a14="http://schemas.microsoft.com/office/drawing/2010/main" val="0"/>
-                        </a:ext>
-                      </a:extLst>
-                    </a:blip>
-                    <a:srcRect/>
-                    <a:stretch>
-                      <a:fillRect/>
-                    </a:stretch>
-                  </pic:blipFill>
-                  <pic:spPr bwMode="auto">
-                    <a:xfrm>
-                      <a:off x="0" y="0"/>
-                      <a:ext cx="5643467" cy="2468938"/>
-                    </a:xfrm>
-                    <a:prstGeom prst="rect">
-                      <a:avLst/>
-                    </a:prstGeom>
-                    <a:noFill/>
-                  </pic:spPr>
-                </pic:pic>
-              </a:graphicData>
-            </a:graphic>
-          </wp:inline>
-        </w:drawing>
-      </w:r>
-    </w:p>
-    <w:p>
-      <w:pPr>
-        <w:keepNext/>
-        <w:keepLines/>
-        <w:spacing w:before="240" w:after="120" w:line="259" w:lineRule="auto"/>
-        <w:outlineLvl w:val="1"/>
-        <w:rPr>
-          <w:rFonts w:ascii="Handel Gothic D" w:eastAsia="DengXian Light" w:hAnsi="Handel Gothic D" w:cs="Times New Roman"/>
-          <w:b/>
-          <w:caps/>
-          <w:color w:val="FF6633"/>
-          <w:kern w:val="0"/>
-          <w:sz w:val="32"/>
-          <w:szCs w:val="26"/>
-          <w14:ligatures w14:val="none"/>
-        </w:rPr>
-      </w:pPr>
-      <w:r>
-        <w:rPr>
-          <w:rFonts w:ascii="Handel Gothic D" w:eastAsia="DengXian Light" w:hAnsi="Handel Gothic D" w:cs="Times New Roman"/>
-          <w:b/>
-          <w:caps/>
-          <w:color w:val="FF6633"/>
-          <w:kern w:val="0"/>
-          <w:sz w:val="32"/>
-          <w:szCs w:val="26"/>
-          <w:highlight w:val="yellow"/>
-          <w14:ligatures w14:val="none"/>
-        </w:rPr>
-        <w:lastRenderedPageBreak/>
-        <w:t>Low</w:t>
-      </w:r>
-    </w:p>
-    <w:p>
-      <w:pPr>
-        <w:numPr>
-          <w:ilvl w:val="0"/>
-          <w:numId w:val="11"/>
-        </w:numPr>
-        <w:spacing w:line="259" w:lineRule="auto"/>
-        <w:contextualSpacing/>
-        <w:rPr>
-          <w:rFonts w:ascii="Corbel" w:eastAsia="Calibri" w:hAnsi="Corbel" w:cs="Arial"/>
-          <w:color w:val="404040"/>
-          <w:kern w:val="0"/>
-          <w:szCs w:val="22"/>
-          <w14:ligatures w14:val="none"/>
-        </w:rPr>
-      </w:pPr>
-      <w:r>
-        <w:rPr>
-          <w:rFonts w:ascii="Corbel" w:eastAsia="Calibri" w:hAnsi="Corbel" w:cs="Arial"/>
-          <w:color w:val="404040"/>
-          <w:kern w:val="0"/>
-          <w:szCs w:val="22"/>
-          <w14:ligatures w14:val="none"/>
-        </w:rPr>
-        <w:t>None</w:t>
-      </w:r>
-      <w:r>
-        <w:rPr>
-          <w:rFonts w:ascii="Corbel" w:eastAsia="Calibri" w:hAnsi="Corbel" w:cs="Arial"/>
-          <w:color w:val="404040"/>
-          <w:kern w:val="0"/>
-          <w:szCs w:val="22"/>
-          <w14:ligatures w14:val="none"/>
-        </w:rPr>
-        <w:br/>
-      </w:r>
-    </w:p>
-    <w:p>
-      <w:pPr>
-        <w:spacing w:line="259" w:lineRule="auto"/>
-        <w:rPr>
-          <w:rFonts w:ascii="Corbel" w:eastAsia="Calibri" w:hAnsi="Corbel" w:cs="Arial"/>
-          <w:color w:val="404040"/>
-          <w:kern w:val="0"/>
-          <w:szCs w:val="22"/>
-          <w14:ligatures w14:val="none"/>
-        </w:rPr>
-      </w:pPr>
-      <w:r>
-        <w:rPr>
-          <w:rFonts w:ascii="Corbel" w:eastAsia="Calibri" w:hAnsi="Corbel" w:cs="Arial"/>
-          <w:color w:val="404040"/>
-          <w:kern w:val="0"/>
-          <w:szCs w:val="22"/>
-          <w14:ligatures w14:val="none"/>
-        </w:rPr>
-        <w:br w:type="page"/>
-      </w:r>
-    </w:p>
-    <w:p>
-      <w:pPr>
-        <w:keepNext/>
-        <w:keepLines/>
-        <w:spacing w:before="240" w:after="120" w:line="259" w:lineRule="auto"/>
-        <w:outlineLvl w:val="1"/>
-        <w:rPr>
-          <w:rFonts w:ascii="Handel Gothic D" w:eastAsia="DengXian Light" w:hAnsi="Handel Gothic D" w:cs="Times New Roman"/>
-          <w:b/>
-          <w:caps/>
-          <w:color w:val="FF6633"/>
-          <w:kern w:val="0"/>
-          <w:sz w:val="32"/>
-          <w:szCs w:val="26"/>
-          <w14:ligatures w14:val="none"/>
-        </w:rPr>
-      </w:pPr>
-      <w:bookmarkStart w:id="9" w:name="_Hlk190857538"/>
-      <w:bookmarkStart w:id="10" w:name="_Hlk190857520"/>
-      <w:r>
-        <w:rPr>
-          <w:rFonts w:ascii="Handel Gothic D" w:eastAsia="DengXian Light" w:hAnsi="Handel Gothic D" w:cs="Times New Roman"/>
-          <w:b/>
-          <w:caps/>
-          <w:color w:val="FF6633"/>
-          <w:kern w:val="0"/>
-          <w:sz w:val="32"/>
-          <w:szCs w:val="26"/>
-          <w:highlight w:val="yellow"/>
-          <w14:ligatures w14:val="none"/>
-        </w:rPr>
         <w:lastRenderedPageBreak/>
         <w:t>Informational</w:t>
       </w:r>
-      <w:bookmarkEnd w:id="9"/>
+      <w:bookmarkEnd w:id="8"/>
     </w:p>
     <w:p>
       <w:pPr>
@@ -5114,7 +4870,7 @@
           <w14:ligatures w14:val="none"/>
         </w:rPr>
       </w:pPr>
-      <w:bookmarkStart w:id="11" w:name="_Hlk201240797"/>
+      <w:bookmarkStart w:id="10" w:name="_Hlk201240797"/>
       <w:r>
         <w:rPr>
           <w:rFonts w:ascii="Corbel" w:eastAsia="Calibri" w:hAnsi="Corbel" w:cs="Arial"/>
@@ -5127,7 +4883,7 @@
         </w:rPr>
         <w:t xml:space="preserve">Doppelganger Domains </w:t>
       </w:r>
-      <w:bookmarkStart w:id="12" w:name="_Hlk207017175"/>
+      <w:bookmarkStart w:id="11" w:name="_Hlk207017175"/>
       <w:r>
         <w:rPr>
           <w:rFonts w:ascii="Corbel" w:eastAsia="Calibri" w:hAnsi="Corbel" w:cs="Arial"/>
@@ -5150,92 +4906,92 @@
         </w:rPr>
         <w:t xml:space="preserve"> </w:t>
       </w:r>
+      <w:bookmarkEnd w:id="11"/>
+      <w:r>
+        <w:rPr>
+          <w:rFonts w:ascii="Corbel" w:eastAsia="Calibri" w:hAnsi="Corbel" w:cs="Arial"/>
+          <w:color w:val="404040"/>
+          <w:kern w:val="0"/>
+          <w14:ligatures w14:val="none"/>
+        </w:rPr>
+        <w:t>A Doppelganger domain is a registered domain that could</w:t>
+      </w:r>
+      <w:r>
+        <w:rPr>
+          <w:rFonts w:ascii="Corbel" w:eastAsia="Calibri" w:hAnsi="Corbel" w:cs="Arial"/>
+          <w:color w:val="404040"/>
+          <w:kern w:val="0"/>
+          <w:szCs w:val="22"/>
+          <w14:ligatures w14:val="none"/>
+        </w:rPr>
+        <w:br/>
+      </w:r>
+      <w:r>
+        <w:rPr>
+          <w:rFonts w:ascii="Corbel" w:eastAsia="Calibri" w:hAnsi="Corbel" w:cs="Arial"/>
+          <w:color w:val="404040"/>
+          <w:kern w:val="0"/>
+          <w14:ligatures w14:val="none"/>
+        </w:rPr>
+        <w:t>potentially take advantage of common typing mistakes or browser assumptions.</w:t>
+      </w:r>
+      <w:r>
+        <w:rPr>
+          <w:rFonts w:ascii="Corbel" w:eastAsia="Calibri" w:hAnsi="Corbel" w:cs="Arial"/>
+          <w:color w:val="404040"/>
+          <w:kern w:val="0"/>
+          <w:szCs w:val="22"/>
+          <w14:ligatures w14:val="none"/>
+        </w:rPr>
+        <w:t xml:space="preserve"> During </w:t>
+      </w:r>
+      <w:bookmarkEnd w:id="10"/>
+      <w:r>
+        <w:rPr>
+          <w:rFonts w:ascii="Corbel" w:eastAsia="Calibri" w:hAnsi="Corbel" w:cs="Arial"/>
+          <w:color w:val="404040"/>
+          <w:kern w:val="0"/>
+          <w:szCs w:val="22"/>
+          <w14:ligatures w14:val="none"/>
+        </w:rPr>
+        <w:t xml:space="preserve">testing against targeted domains, </w:t>
+      </w:r>
+      <w:bookmarkStart w:id="12" w:name="_Hlk212473705"/>
+      <w:proofErr w:type="gramStart"/>
+      <w:r>
+        <w:rPr>
+          <w:rFonts w:ascii="Corbel" w:eastAsia="Calibri" w:hAnsi="Corbel" w:cs="Arial"/>
+          <w:color w:val="404040"/>
+          <w:kern w:val="0"/>
+          <w:szCs w:val="22"/>
+          <w:highlight w:val="yellow"/>
+          <w14:ligatures w14:val="none"/>
+        </w:rPr>
+        <w:t>NUMBER (#</w:t>
+      </w:r>
+      <w:proofErr w:type="gramEnd"/>
+      <w:r>
+        <w:rPr>
+          <w:rFonts w:ascii="Corbel" w:eastAsia="Calibri" w:hAnsi="Corbel" w:cs="Arial"/>
+          <w:color w:val="404040"/>
+          <w:kern w:val="0"/>
+          <w:szCs w:val="22"/>
+          <w:highlight w:val="yellow"/>
+          <w14:ligatures w14:val="none"/>
+        </w:rPr>
+        <w:t>)</w:t>
+      </w:r>
+      <w:r>
+        <w:rPr>
+          <w:rFonts w:ascii="Corbel" w:eastAsia="Calibri" w:hAnsi="Corbel" w:cs="Arial"/>
+          <w:color w:val="404040"/>
+          <w:kern w:val="0"/>
+          <w:szCs w:val="22"/>
+          <w14:ligatures w14:val="none"/>
+        </w:rPr>
+        <w:t xml:space="preserve"> </w:t>
+      </w:r>
       <w:bookmarkEnd w:id="12"/>
-      <w:r>
-        <w:rPr>
-          <w:rFonts w:ascii="Corbel" w:eastAsia="Calibri" w:hAnsi="Corbel" w:cs="Arial"/>
-          <w:color w:val="404040"/>
-          <w:kern w:val="0"/>
-          <w14:ligatures w14:val="none"/>
-        </w:rPr>
-        <w:t>A Doppelganger domain is a registered domain that could</w:t>
-      </w:r>
-      <w:r>
-        <w:rPr>
-          <w:rFonts w:ascii="Corbel" w:eastAsia="Calibri" w:hAnsi="Corbel" w:cs="Arial"/>
-          <w:color w:val="404040"/>
-          <w:kern w:val="0"/>
-          <w:szCs w:val="22"/>
-          <w14:ligatures w14:val="none"/>
-        </w:rPr>
-        <w:br/>
-      </w:r>
-      <w:r>
-        <w:rPr>
-          <w:rFonts w:ascii="Corbel" w:eastAsia="Calibri" w:hAnsi="Corbel" w:cs="Arial"/>
-          <w:color w:val="404040"/>
-          <w:kern w:val="0"/>
-          <w14:ligatures w14:val="none"/>
-        </w:rPr>
-        <w:t>potentially take advantage of common typing mistakes or browser assumptions.</w:t>
-      </w:r>
-      <w:r>
-        <w:rPr>
-          <w:rFonts w:ascii="Corbel" w:eastAsia="Calibri" w:hAnsi="Corbel" w:cs="Arial"/>
-          <w:color w:val="404040"/>
-          <w:kern w:val="0"/>
-          <w:szCs w:val="22"/>
-          <w14:ligatures w14:val="none"/>
-        </w:rPr>
-        <w:t xml:space="preserve"> During </w:t>
-      </w:r>
-      <w:bookmarkEnd w:id="11"/>
-      <w:r>
-        <w:rPr>
-          <w:rFonts w:ascii="Corbel" w:eastAsia="Calibri" w:hAnsi="Corbel" w:cs="Arial"/>
-          <w:color w:val="404040"/>
-          <w:kern w:val="0"/>
-          <w:szCs w:val="22"/>
-          <w14:ligatures w14:val="none"/>
-        </w:rPr>
-        <w:t xml:space="preserve">testing against targeted domains, </w:t>
-      </w:r>
-      <w:bookmarkStart w:id="13" w:name="_Hlk212473705"/>
-      <w:proofErr w:type="gramStart"/>
-      <w:r>
-        <w:rPr>
-          <w:rFonts w:ascii="Corbel" w:eastAsia="Calibri" w:hAnsi="Corbel" w:cs="Arial"/>
-          <w:color w:val="404040"/>
-          <w:kern w:val="0"/>
-          <w:szCs w:val="22"/>
-          <w:highlight w:val="yellow"/>
-          <w14:ligatures w14:val="none"/>
-        </w:rPr>
-        <w:t>NUMBER (#</w:t>
-      </w:r>
-      <w:proofErr w:type="gramEnd"/>
-      <w:r>
-        <w:rPr>
-          <w:rFonts w:ascii="Corbel" w:eastAsia="Calibri" w:hAnsi="Corbel" w:cs="Arial"/>
-          <w:color w:val="404040"/>
-          <w:kern w:val="0"/>
-          <w:szCs w:val="22"/>
-          <w:highlight w:val="yellow"/>
-          <w14:ligatures w14:val="none"/>
-        </w:rPr>
-        <w:t>)</w:t>
-      </w:r>
-      <w:r>
-        <w:rPr>
-          <w:rFonts w:ascii="Corbel" w:eastAsia="Calibri" w:hAnsi="Corbel" w:cs="Arial"/>
-          <w:color w:val="404040"/>
-          <w:kern w:val="0"/>
-          <w:szCs w:val="22"/>
-          <w14:ligatures w14:val="none"/>
-        </w:rPr>
-        <w:t xml:space="preserve"> </w:t>
-      </w:r>
-      <w:bookmarkEnd w:id="13"/>
       <w:r>
         <w:rPr>
           <w:rFonts w:ascii="Corbel" w:eastAsia="Calibri" w:hAnsi="Corbel" w:cs="Arial"/>
@@ -5415,7 +5171,7 @@
         </w:rPr>
         <w:br/>
       </w:r>
-      <w:bookmarkStart w:id="14" w:name="_Hlk212031658"/>
+      <w:bookmarkStart w:id="13" w:name="_Hlk212031658"/>
       <w:r>
         <w:rPr>
           <w:rFonts w:ascii="Corbel" w:eastAsia="Calibri" w:hAnsi="Corbel" w:cs="Arial"/>
@@ -5450,7 +5206,7 @@
         </w:rPr>
         <w:t>DNS RECORD(S) TABLE</w:t>
       </w:r>
-      <w:bookmarkEnd w:id="14"/>
+      <w:bookmarkEnd w:id="13"/>
       <w:r>
         <w:rPr>
           <w:rFonts w:ascii="Corbel" w:eastAsia="Calibri" w:hAnsi="Corbel" w:cs="Arial"/>
@@ -5519,34 +5275,14 @@
         <w:lastRenderedPageBreak/>
         <w:t>Automated Testing ACtivity</w:t>
       </w:r>
-      <w:bookmarkEnd w:id="10"/>
+      <w:bookmarkEnd w:id="9"/>
     </w:p>
     <w:p>
       <w:pPr>
         <w:pStyle w:val="ActivityBullet"/>
-        <w:rPr>
-          <w:lang w:val="fr-FR"/>
-        </w:rPr>
-      </w:pPr>
-      <w:r>
-        <w:rPr>
-          <w:lang w:val="fr-FR"/>
-        </w:rPr>
-        <w:t xml:space="preserve">2026-01-29 </w:t>
-      </w:r>
-      <w:proofErr w:type="gramStart"/>
-      <w:r>
-        <w:rPr>
-          <w:lang w:val="fr-FR"/>
-        </w:rPr>
-        <w:t>13:52:</w:t>
-      </w:r>
-      <w:proofErr w:type="gramEnd"/>
-      <w:r>
-        <w:rPr>
-          <w:lang w:val="fr-FR"/>
-        </w:rPr>
-        <w:t>47-0500PM ET exposurescout Initiating ExposureScout module.</w:t>
+      </w:pPr>
+      <w:r>
+        <w:t>2026-01-29 13:52:47-0500PM ET exposurescout Initiating ExposureScout module.</w:t>
       </w:r>
     </w:p>
     <w:p>
@@ -5554,28 +5290,14 @@
         <w:pStyle w:val="ActivityBullet"/>
       </w:pPr>
       <w:r>
-        <w:t xml:space="preserve">2026-01-29 13:52:59-0500PM ET </w:t>
-      </w:r>
-      <w:proofErr w:type="spellStart"/>
-      <w:r>
-        <w:t>exposurescout</w:t>
-      </w:r>
-      <w:proofErr w:type="spellEnd"/>
-      <w:r>
-        <w:t xml:space="preserve"> Enumerating subdomains from one (1) domain.</w:t>
+        <w:t>2026-01-29 13:52:59-0500PM ET exposurescout Enumerating subdomains from one (1) domain.</w:t>
       </w:r>
     </w:p>
     <w:p>
       <w:pPr>
         <w:pStyle w:val="ActivityBullet"/>
-        <w:rPr>
-          <w:lang w:val="fr-FR"/>
-        </w:rPr>
-      </w:pPr>
-      <w:r>
-        <w:rPr>
-          <w:lang w:val="fr-FR"/>
-        </w:rPr>
+      </w:pPr>
+      <w:r>
         <w:t>2026-01-29 13:54:13-0500PM ET exposurescout Completed subdomain enumeration.</w:t>
       </w:r>
     </w:p>
@@ -5584,28 +5306,14 @@
         <w:pStyle w:val="ActivityBullet"/>
       </w:pPr>
       <w:r>
-        <w:t xml:space="preserve">2026-01-29 13:54:13-0500PM ET </w:t>
-      </w:r>
-      <w:proofErr w:type="spellStart"/>
-      <w:r>
-        <w:t>exposurescout</w:t>
-      </w:r>
-      <w:proofErr w:type="spellEnd"/>
-      <w:r>
-        <w:t xml:space="preserve"> Beginning DNS enumeration.</w:t>
+        <w:t>2026-01-29 13:54:13-0500PM ET exposurescout Beginning DNS enumeration.</w:t>
       </w:r>
     </w:p>
     <w:p>
       <w:pPr>
         <w:pStyle w:val="ActivityBullet"/>
-        <w:rPr>
-          <w:lang w:val="fr-FR"/>
-        </w:rPr>
-      </w:pPr>
-      <w:r>
-        <w:rPr>
-          <w:lang w:val="fr-FR"/>
-        </w:rPr>
+      </w:pPr>
+      <w:r>
         <w:t>2026-01-29 13:55:18-0500PM ET exposurescout Completed DNS enumeration.</w:t>
       </w:r>
     </w:p>
@@ -5614,42 +5322,22 @@
         <w:pStyle w:val="ActivityBullet"/>
       </w:pPr>
       <w:r>
-        <w:t xml:space="preserve">2026-01-29 13:55:18-0500PM ET </w:t>
-      </w:r>
-      <w:proofErr w:type="spellStart"/>
-      <w:r>
-        <w:t>exposurescout</w:t>
-      </w:r>
-      <w:proofErr w:type="spellEnd"/>
-      <w:r>
-        <w:t xml:space="preserve"> Enumerating doppelganger domains for one (1) domain.</w:t>
+        <w:t>2026-01-29 13:55:18-0500PM ET exposurescout Enumerating doppelganger domains for one (1) domain.</w:t>
       </w:r>
     </w:p>
     <w:p>
       <w:pPr>
         <w:pStyle w:val="ActivityBullet"/>
-        <w:rPr>
-          <w:lang w:val="fr-FR"/>
-        </w:rPr>
-      </w:pPr>
-      <w:r>
-        <w:rPr>
-          <w:lang w:val="fr-FR"/>
-        </w:rPr>
+      </w:pPr>
+      <w:r>
         <w:t>2026-01-29 13:56:28-0500PM ET exposurescout Ten (10) new doppelganger domains discovered.</w:t>
       </w:r>
     </w:p>
     <w:p>
       <w:pPr>
         <w:pStyle w:val="ActivityBullet"/>
-        <w:rPr>
-          <w:lang w:val="fr-FR"/>
-        </w:rPr>
-      </w:pPr>
-      <w:r>
-        <w:rPr>
-          <w:lang w:val="fr-FR"/>
-        </w:rPr>
+      </w:pPr>
+      <w:r>
         <w:t>2026-01-29 13:56:28-0500PM ET exposurescout Completed doppelganger domain enumeration.</w:t>
       </w:r>
     </w:p>
@@ -5658,15 +5346,7 @@
         <w:pStyle w:val="ActivityBullet"/>
       </w:pPr>
       <w:r>
-        <w:t xml:space="preserve">2026-01-29 13:56:28-0500PM ET </w:t>
-      </w:r>
-      <w:proofErr w:type="spellStart"/>
-      <w:r>
-        <w:t>exposurescout</w:t>
-      </w:r>
-      <w:proofErr w:type="spellEnd"/>
-      <w:r>
-        <w:t xml:space="preserve"> Running WHOIS commands on eight (8) domains.</w:t>
+        <w:t>2026-01-29 13:56:28-0500PM ET exposurescout Running WHOIS commands on eight (8) domains.</w:t>
       </w:r>
     </w:p>
     <w:p>
@@ -5674,15 +5354,7 @@
         <w:pStyle w:val="ActivityBullet"/>
       </w:pPr>
       <w:r>
-        <w:t xml:space="preserve">2026-01-29 13:57:33-0500PM ET </w:t>
-      </w:r>
-      <w:proofErr w:type="spellStart"/>
-      <w:r>
-        <w:t>exposurescout</w:t>
-      </w:r>
-      <w:proofErr w:type="spellEnd"/>
-      <w:r>
-        <w:t xml:space="preserve"> Importing eight (8) WHOIS results into the database.</w:t>
+        <w:t>2026-01-29 13:57:33-0500PM ET exposurescout Importing eight (8) WHOIS results into the database.</w:t>
       </w:r>
     </w:p>
     <w:p>
@@ -5690,15 +5362,7 @@
         <w:pStyle w:val="ActivityBullet"/>
       </w:pPr>
       <w:r>
-        <w:t xml:space="preserve">2026-01-29 13:57:34-0500PM ET </w:t>
-      </w:r>
-      <w:proofErr w:type="spellStart"/>
-      <w:r>
-        <w:t>exposurescout</w:t>
-      </w:r>
-      <w:proofErr w:type="spellEnd"/>
-      <w:r>
-        <w:t xml:space="preserve"> Completed recursive WHOIS lookups</w:t>
+        <w:t>2026-01-29 13:57:34-0500PM ET exposurescout Completed recursive WHOIS lookups</w:t>
       </w:r>
     </w:p>
     <w:p>
@@ -5706,15 +5370,7 @@
         <w:pStyle w:val="ActivityBullet"/>
       </w:pPr>
       <w:r>
-        <w:t xml:space="preserve">2026-01-29 13:57:34-0500PM ET </w:t>
-      </w:r>
-      <w:proofErr w:type="spellStart"/>
-      <w:r>
-        <w:t>exposurescout</w:t>
-      </w:r>
-      <w:proofErr w:type="spellEnd"/>
-      <w:r>
-        <w:t xml:space="preserve"> Email scraping module started.</w:t>
+        <w:t>2026-01-29 13:57:34-0500PM ET exposurescout Email scraping module started.</w:t>
       </w:r>
     </w:p>
     <w:p>
@@ -5722,15 +5378,7 @@
         <w:pStyle w:val="ActivityBullet"/>
       </w:pPr>
       <w:r>
-        <w:t xml:space="preserve">2026-01-29 13:58:40-0500PM ET </w:t>
-      </w:r>
-      <w:proofErr w:type="spellStart"/>
-      <w:r>
-        <w:t>exposurescout</w:t>
-      </w:r>
-      <w:proofErr w:type="spellEnd"/>
-      <w:r>
-        <w:t xml:space="preserve"> Completed email scraping.</w:t>
+        <w:t>2026-01-29 13:58:40-0500PM ET exposurescout Completed email scraping.</w:t>
       </w:r>
     </w:p>
     <w:p>
@@ -5738,15 +5386,7 @@
         <w:pStyle w:val="ActivityBullet"/>
       </w:pPr>
       <w:r>
-        <w:t xml:space="preserve">2026-01-29 13:58:40-0500PM ET </w:t>
-      </w:r>
-      <w:proofErr w:type="spellStart"/>
-      <w:r>
-        <w:t>exposurescout</w:t>
-      </w:r>
-      <w:proofErr w:type="spellEnd"/>
-      <w:r>
-        <w:t xml:space="preserve"> Scanning subdomains for subdomain takeover vulnerability.</w:t>
+        <w:t>2026-01-29 13:58:40-0500PM ET exposurescout Scanning subdomains for subdomain takeover vulnerability.</w:t>
       </w:r>
     </w:p>
     <w:p>
@@ -5754,15 +5394,7 @@
         <w:pStyle w:val="ActivityBullet"/>
       </w:pPr>
       <w:r>
-        <w:t xml:space="preserve">2026-01-29 13:59:44-0500PM ET </w:t>
-      </w:r>
-      <w:proofErr w:type="spellStart"/>
-      <w:r>
-        <w:t>exposurescout</w:t>
-      </w:r>
-      <w:proofErr w:type="spellEnd"/>
-      <w:r>
-        <w:t xml:space="preserve"> Found 1 domain vulnerable to subdomain takeover.</w:t>
+        <w:t>2026-01-29 13:59:44-0500PM ET exposurescout Found 1 domain vulnerable to subdomain takeover.</w:t>
       </w:r>
     </w:p>
     <w:p>
@@ -5770,28 +5402,14 @@
         <w:pStyle w:val="ActivityBullet"/>
       </w:pPr>
       <w:r>
-        <w:t xml:space="preserve">2026-01-29 13:59:44-0500PM ET </w:t>
-      </w:r>
-      <w:proofErr w:type="spellStart"/>
-      <w:r>
-        <w:t>exposurescout</w:t>
-      </w:r>
-      <w:proofErr w:type="spellEnd"/>
-      <w:r>
-        <w:t xml:space="preserve"> Completed subdomain takeover checks.</w:t>
+        <w:t>2026-01-29 13:59:44-0500PM ET exposurescout Completed subdomain takeover checks.</w:t>
       </w:r>
     </w:p>
     <w:p>
       <w:pPr>
         <w:pStyle w:val="ActivityBullet"/>
-        <w:rPr>
-          <w:lang w:val="fr-FR"/>
-        </w:rPr>
-      </w:pPr>
-      <w:r>
-        <w:rPr>
-          <w:lang w:val="fr-FR"/>
-        </w:rPr>
+      </w:pPr>
+      <w:r>
         <w:t>2026-01-29 13:59:44-0500PM ET exposurescout ExposureScout module completed.</w:t>
       </w:r>
     </w:p>
@@ -5832,15 +5450,7 @@
         <w:pStyle w:val="ActivityBullet"/>
       </w:pPr>
       <w:r>
-        <w:t xml:space="preserve">2026-01-29 14:00:57-0500PM ET host discovery Running </w:t>
-      </w:r>
-      <w:proofErr w:type="spellStart"/>
-      <w:r>
-        <w:t>nmap</w:t>
-      </w:r>
-      <w:proofErr w:type="spellEnd"/>
-      <w:r>
-        <w:t xml:space="preserve"> port scans.</w:t>
+        <w:t>2026-01-29 14:00:57-0500PM ET host discovery Running nmap port scans.</w:t>
       </w:r>
     </w:p>
     <w:p>
@@ -5848,15 +5458,7 @@
         <w:pStyle w:val="ActivityBullet"/>
       </w:pPr>
       <w:r>
-        <w:t xml:space="preserve">2026-01-29 14:02:01-0500PM ET host discovery Completed </w:t>
-      </w:r>
-      <w:proofErr w:type="spellStart"/>
-      <w:r>
-        <w:t>nmap</w:t>
-      </w:r>
-      <w:proofErr w:type="spellEnd"/>
-      <w:r>
-        <w:t xml:space="preserve"> port scans.</w:t>
+        <w:t>2026-01-29 14:02:01-0500PM ET host discovery Completed nmap port scans.</w:t>
       </w:r>
     </w:p>
     <w:p>
@@ -5888,15 +5490,7 @@
         <w:pStyle w:val="ActivityBullet"/>
       </w:pPr>
       <w:r>
-        <w:t xml:space="preserve">2026-01-29 14:02:02-0500PM ET host discovery Parsing </w:t>
-      </w:r>
-      <w:proofErr w:type="spellStart"/>
-      <w:r>
-        <w:t>nmap</w:t>
-      </w:r>
-      <w:proofErr w:type="spellEnd"/>
-      <w:r>
-        <w:t xml:space="preserve"> port scans.</w:t>
+        <w:t>2026-01-29 14:02:02-0500PM ET host discovery Parsing nmap port scans.</w:t>
       </w:r>
     </w:p>
     <w:p>
@@ -5904,15 +5498,7 @@
         <w:pStyle w:val="ActivityBullet"/>
       </w:pPr>
       <w:r>
-        <w:t xml:space="preserve">2026-01-29 14:02:02-0500PM ET </w:t>
-      </w:r>
-      <w:proofErr w:type="gramStart"/>
-      <w:r>
-        <w:t>host discovery</w:t>
-      </w:r>
-      <w:proofErr w:type="gramEnd"/>
-      <w:r>
-        <w:t xml:space="preserve"> Completed parsing port scans. Imported 3 new ports.</w:t>
+        <w:t>2026-01-29 14:02:02-0500PM ET host discovery Completed parsing port scans. Imported 3 new ports.</w:t>
       </w:r>
     </w:p>
     <w:p>
@@ -5928,15 +5514,7 @@
         <w:pStyle w:val="ActivityBullet"/>
       </w:pPr>
       <w:r>
-        <w:t xml:space="preserve">2026-01-29 14:02:03-0500PM ET host discovery </w:t>
-      </w:r>
-      <w:proofErr w:type="spellStart"/>
-      <w:r>
-        <w:t>Discovery</w:t>
-      </w:r>
-      <w:proofErr w:type="spellEnd"/>
-      <w:r>
-        <w:t xml:space="preserve"> module completed.</w:t>
+        <w:t>2026-01-29 14:02:03-0500PM ET host discovery Discovery module completed.</w:t>
       </w:r>
     </w:p>
     <w:p>
@@ -5944,15 +5522,7 @@
         <w:pStyle w:val="ActivityBullet"/>
       </w:pPr>
       <w:r>
-        <w:t xml:space="preserve">2026-01-29 14:02:27-0500PM ET host discovery Running </w:t>
-      </w:r>
-      <w:proofErr w:type="spellStart"/>
-      <w:r>
-        <w:t>nmap</w:t>
-      </w:r>
-      <w:proofErr w:type="spellEnd"/>
-      <w:r>
-        <w:t xml:space="preserve"> port version scans.</w:t>
+        <w:t>2026-01-29 14:02:27-0500PM ET host discovery Running nmap port version scans.</w:t>
       </w:r>
     </w:p>
     <w:p>
@@ -5960,15 +5530,7 @@
         <w:pStyle w:val="ActivityBullet"/>
       </w:pPr>
       <w:r>
-        <w:t xml:space="preserve">2026-01-29 14:03:30-0500PM ET host discovery Completed </w:t>
-      </w:r>
-      <w:proofErr w:type="spellStart"/>
-      <w:r>
-        <w:t>nmap</w:t>
-      </w:r>
-      <w:proofErr w:type="spellEnd"/>
-      <w:r>
-        <w:t xml:space="preserve"> port version scans.</w:t>
+        <w:t>2026-01-29 14:03:30-0500PM ET host discovery Completed nmap port version scans.</w:t>
       </w:r>
     </w:p>
     <w:p>
@@ -5976,31 +5538,7 @@
         <w:pStyle w:val="ActivityBullet"/>
       </w:pPr>
       <w:r>
-        <w:t xml:space="preserve">2026-01-29 14:03:35-0500PM ET </w:t>
-      </w:r>
-      <w:proofErr w:type="gramStart"/>
-      <w:r>
-        <w:t>enumeration</w:t>
-      </w:r>
-      <w:proofErr w:type="gramEnd"/>
-      <w:r>
-        <w:t xml:space="preserve"> </w:t>
-      </w:r>
-      <w:proofErr w:type="spellStart"/>
-      <w:r>
-        <w:t>Enumeration</w:t>
-      </w:r>
-      <w:proofErr w:type="spellEnd"/>
-      <w:r>
-        <w:t xml:space="preserve"> </w:t>
-      </w:r>
-      <w:proofErr w:type="gramStart"/>
-      <w:r>
-        <w:t>module</w:t>
-      </w:r>
-      <w:proofErr w:type="gramEnd"/>
-      <w:r>
-        <w:t xml:space="preserve"> initialized.</w:t>
+        <w:t>2026-01-29 14:03:35-0500PM ET enumeration Enumeration module initialized.</w:t>
       </w:r>
     </w:p>
     <w:p>
@@ -6008,15 +5546,7 @@
         <w:pStyle w:val="ActivityBullet"/>
       </w:pPr>
       <w:r>
-        <w:t xml:space="preserve">2026-01-29 14:04:43-0500PM ET </w:t>
-      </w:r>
-      <w:proofErr w:type="gramStart"/>
-      <w:r>
-        <w:t>enumeration</w:t>
-      </w:r>
-      <w:proofErr w:type="gramEnd"/>
-      <w:r>
-        <w:t xml:space="preserve"> Enumerating HTTP services.</w:t>
+        <w:t>2026-01-29 14:04:43-0500PM ET enumeration Enumerating HTTP services.</w:t>
       </w:r>
     </w:p>
     <w:p>
@@ -6024,15 +5554,7 @@
         <w:pStyle w:val="ActivityBullet"/>
       </w:pPr>
       <w:r>
-        <w:t xml:space="preserve">2026-01-29 14:04:43-0500PM ET </w:t>
-      </w:r>
-      <w:proofErr w:type="gramStart"/>
-      <w:r>
-        <w:t>enumeration</w:t>
-      </w:r>
-      <w:proofErr w:type="gramEnd"/>
-      <w:r>
-        <w:t xml:space="preserve"> Enumerating HTTPS services.</w:t>
+        <w:t>2026-01-29 14:04:43-0500PM ET enumeration Enumerating HTTPS services.</w:t>
       </w:r>
     </w:p>
     <w:p>
@@ -6048,15 +5570,7 @@
         <w:pStyle w:val="ActivityBullet"/>
       </w:pPr>
       <w:r>
-        <w:t xml:space="preserve">2026-01-29 14:04:47-0500PM ET enumeration Running </w:t>
-      </w:r>
-      <w:proofErr w:type="spellStart"/>
-      <w:r>
-        <w:t>nmap</w:t>
-      </w:r>
-      <w:proofErr w:type="spellEnd"/>
-      <w:r>
-        <w:t xml:space="preserve"> script scan using script: http-headers.</w:t>
+        <w:t>2026-01-29 14:04:47-0500PM ET enumeration Running nmap script scan using script: http-headers.</w:t>
       </w:r>
     </w:p>
     <w:p>
@@ -6064,15 +5578,7 @@
         <w:pStyle w:val="ActivityBullet"/>
       </w:pPr>
       <w:r>
-        <w:t xml:space="preserve">2026-01-29 14:04:47-0500PM ET enumeration Running </w:t>
-      </w:r>
-      <w:proofErr w:type="spellStart"/>
-      <w:r>
-        <w:t>nmap</w:t>
-      </w:r>
-      <w:proofErr w:type="spellEnd"/>
-      <w:r>
-        <w:t xml:space="preserve"> script scan using script: http-methods.</w:t>
+        <w:t>2026-01-29 14:04:47-0500PM ET enumeration Running nmap script scan using script: http-methods.</w:t>
       </w:r>
     </w:p>
     <w:p>
@@ -6080,15 +5586,7 @@
         <w:pStyle w:val="ActivityBullet"/>
       </w:pPr>
       <w:r>
-        <w:t xml:space="preserve">2026-01-29 14:04:47-0500PM ET enumeration Running </w:t>
-      </w:r>
-      <w:proofErr w:type="spellStart"/>
-      <w:r>
-        <w:t>nmap</w:t>
-      </w:r>
-      <w:proofErr w:type="spellEnd"/>
-      <w:r>
-        <w:t xml:space="preserve"> script scan using script: http-headers.</w:t>
+        <w:t>2026-01-29 14:04:47-0500PM ET enumeration Running nmap script scan using script: http-headers.</w:t>
       </w:r>
     </w:p>
     <w:p>
@@ -6096,15 +5594,7 @@
         <w:pStyle w:val="ActivityBullet"/>
       </w:pPr>
       <w:r>
-        <w:t xml:space="preserve">2026-01-29 14:04:47-0500PM ET enumeration Running </w:t>
-      </w:r>
-      <w:proofErr w:type="spellStart"/>
-      <w:r>
-        <w:t>nmap</w:t>
-      </w:r>
-      <w:proofErr w:type="spellEnd"/>
-      <w:r>
-        <w:t xml:space="preserve"> script scan using script: http-robots.txt.</w:t>
+        <w:t>2026-01-29 14:04:47-0500PM ET enumeration Running nmap script scan using script: http-robots.txt.</w:t>
       </w:r>
     </w:p>
     <w:p>
@@ -6112,15 +5602,7 @@
         <w:pStyle w:val="ActivityBullet"/>
       </w:pPr>
       <w:r>
-        <w:t xml:space="preserve">2026-01-29 14:04:47-0500PM ET enumeration Running </w:t>
-      </w:r>
-      <w:proofErr w:type="spellStart"/>
-      <w:r>
-        <w:t>nmap</w:t>
-      </w:r>
-      <w:proofErr w:type="spellEnd"/>
-      <w:r>
-        <w:t xml:space="preserve"> script scan using script: http-robots.txt.</w:t>
+        <w:t>2026-01-29 14:04:47-0500PM ET enumeration Running nmap script scan using script: http-robots.txt.</w:t>
       </w:r>
     </w:p>
     <w:p>
@@ -6128,15 +5610,7 @@
         <w:pStyle w:val="ActivityBullet"/>
       </w:pPr>
       <w:r>
-        <w:t xml:space="preserve">2026-01-29 14:04:47-0500PM ET enumeration Running </w:t>
-      </w:r>
-      <w:proofErr w:type="spellStart"/>
-      <w:r>
-        <w:t>nmap</w:t>
-      </w:r>
-      <w:proofErr w:type="spellEnd"/>
-      <w:r>
-        <w:t xml:space="preserve"> script scan using script: http-put.</w:t>
+        <w:t>2026-01-29 14:04:47-0500PM ET enumeration Running nmap script scan using script: http-put.</w:t>
       </w:r>
     </w:p>
     <w:p>
@@ -6144,15 +5618,7 @@
         <w:pStyle w:val="ActivityBullet"/>
       </w:pPr>
       <w:r>
-        <w:t xml:space="preserve">2026-01-29 14:04:47-0500PM ET enumeration Running </w:t>
-      </w:r>
-      <w:proofErr w:type="spellStart"/>
-      <w:r>
-        <w:t>nmap</w:t>
-      </w:r>
-      <w:proofErr w:type="spellEnd"/>
-      <w:r>
-        <w:t xml:space="preserve"> script scan using script: http-title.</w:t>
+        <w:t>2026-01-29 14:04:47-0500PM ET enumeration Running nmap script scan using script: http-title.</w:t>
       </w:r>
     </w:p>
     <w:p>
@@ -6160,15 +5626,7 @@
         <w:pStyle w:val="ActivityBullet"/>
       </w:pPr>
       <w:r>
-        <w:t xml:space="preserve">2026-01-29 14:04:47-0500PM ET enumeration Running </w:t>
-      </w:r>
-      <w:proofErr w:type="spellStart"/>
-      <w:r>
-        <w:t>nmap</w:t>
-      </w:r>
-      <w:proofErr w:type="spellEnd"/>
-      <w:r>
-        <w:t xml:space="preserve"> script scan using script: http-shellshock.</w:t>
+        <w:t>2026-01-29 14:04:47-0500PM ET enumeration Running nmap script scan using script: http-shellshock.</w:t>
       </w:r>
     </w:p>
     <w:p>
@@ -6176,15 +5634,7 @@
         <w:pStyle w:val="ActivityBullet"/>
       </w:pPr>
       <w:r>
-        <w:t xml:space="preserve">2026-01-29 14:04:47-0500PM ET enumeration Running </w:t>
-      </w:r>
-      <w:proofErr w:type="spellStart"/>
-      <w:r>
-        <w:t>nmap</w:t>
-      </w:r>
-      <w:proofErr w:type="spellEnd"/>
-      <w:r>
-        <w:t xml:space="preserve"> script scan using script: http-methods.</w:t>
+        <w:t>2026-01-29 14:04:47-0500PM ET enumeration Running nmap script scan using script: http-methods.</w:t>
       </w:r>
     </w:p>
     <w:p>
@@ -6192,15 +5642,7 @@
         <w:pStyle w:val="ActivityBullet"/>
       </w:pPr>
       <w:r>
-        <w:t xml:space="preserve">2026-01-29 14:04:47-0500PM ET enumeration Running </w:t>
-      </w:r>
-      <w:proofErr w:type="spellStart"/>
-      <w:r>
-        <w:t>nmap</w:t>
-      </w:r>
-      <w:proofErr w:type="spellEnd"/>
-      <w:r>
-        <w:t xml:space="preserve"> script scan using script: sslv2.</w:t>
+        <w:t>2026-01-29 14:04:47-0500PM ET enumeration Running nmap script scan using script: sslv2.</w:t>
       </w:r>
     </w:p>
     <w:p>
@@ -6208,23 +5650,7 @@
         <w:pStyle w:val="ActivityBullet"/>
       </w:pPr>
       <w:r>
-        <w:t xml:space="preserve">2026-01-29 14:04:47-0500PM ET enumeration Running </w:t>
-      </w:r>
-      <w:proofErr w:type="spellStart"/>
-      <w:r>
-        <w:t>nmap</w:t>
-      </w:r>
-      <w:proofErr w:type="spellEnd"/>
-      <w:r>
-        <w:t xml:space="preserve"> script scan using script: </w:t>
-      </w:r>
-      <w:proofErr w:type="spellStart"/>
-      <w:r>
-        <w:t>ssl</w:t>
-      </w:r>
-      <w:proofErr w:type="spellEnd"/>
-      <w:r>
-        <w:t>-cert.</w:t>
+        <w:t>2026-01-29 14:04:47-0500PM ET enumeration Running nmap script scan using script: ssl-cert.</w:t>
       </w:r>
     </w:p>
     <w:p>
@@ -6232,31 +5658,7 @@
         <w:pStyle w:val="ActivityBullet"/>
       </w:pPr>
       <w:r>
-        <w:t xml:space="preserve">2026-01-29 14:04:47-0500PM ET enumeration Running </w:t>
-      </w:r>
-      <w:proofErr w:type="spellStart"/>
-      <w:r>
-        <w:t>nmap</w:t>
-      </w:r>
-      <w:proofErr w:type="spellEnd"/>
-      <w:r>
-        <w:t xml:space="preserve"> script scan using script: </w:t>
-      </w:r>
-      <w:proofErr w:type="spellStart"/>
-      <w:r>
-        <w:t>ssl</w:t>
-      </w:r>
-      <w:proofErr w:type="spellEnd"/>
-      <w:r>
-        <w:t>-</w:t>
-      </w:r>
-      <w:proofErr w:type="spellStart"/>
-      <w:r>
-        <w:t>enum</w:t>
-      </w:r>
-      <w:proofErr w:type="spellEnd"/>
-      <w:r>
-        <w:t>-ciphers.</w:t>
+        <w:t>2026-01-29 14:04:47-0500PM ET enumeration Running nmap script scan using script: ssl-enum-ciphers.</w:t>
       </w:r>
     </w:p>
     <w:p>
@@ -6264,15 +5666,7 @@
         <w:pStyle w:val="ActivityBullet"/>
       </w:pPr>
       <w:r>
-        <w:t xml:space="preserve">2026-01-29 14:04:47-0500PM ET enumeration Running </w:t>
-      </w:r>
-      <w:proofErr w:type="spellStart"/>
-      <w:r>
-        <w:t>nmap</w:t>
-      </w:r>
-      <w:proofErr w:type="spellEnd"/>
-      <w:r>
-        <w:t xml:space="preserve"> script scan using script: http-shellshock.</w:t>
+        <w:t>2026-01-29 14:04:47-0500PM ET enumeration Running nmap script scan using script: http-shellshock.</w:t>
       </w:r>
     </w:p>
     <w:p>
@@ -6280,23 +5674,7 @@
         <w:pStyle w:val="ActivityBullet"/>
       </w:pPr>
       <w:r>
-        <w:t xml:space="preserve">2026-01-29 14:04:47-0500PM ET enumeration Running </w:t>
-      </w:r>
-      <w:proofErr w:type="spellStart"/>
-      <w:r>
-        <w:t>nmap</w:t>
-      </w:r>
-      <w:proofErr w:type="spellEnd"/>
-      <w:r>
-        <w:t xml:space="preserve"> script scan using script: </w:t>
-      </w:r>
-      <w:proofErr w:type="spellStart"/>
-      <w:r>
-        <w:t>ssl</w:t>
-      </w:r>
-      <w:proofErr w:type="spellEnd"/>
-      <w:r>
-        <w:t>-poodle.</w:t>
+        <w:t>2026-01-29 14:04:47-0500PM ET enumeration Running nmap script scan using script: ssl-poodle.</w:t>
       </w:r>
     </w:p>
     <w:p>
@@ -6304,15 +5682,7 @@
         <w:pStyle w:val="ActivityBullet"/>
       </w:pPr>
       <w:r>
-        <w:t xml:space="preserve">2026-01-29 14:04:47-0500PM ET enumeration Running </w:t>
-      </w:r>
-      <w:proofErr w:type="spellStart"/>
-      <w:r>
-        <w:t>nmap</w:t>
-      </w:r>
-      <w:proofErr w:type="spellEnd"/>
-      <w:r>
-        <w:t xml:space="preserve"> script scan using script: http-put.</w:t>
+        <w:t>2026-01-29 14:04:47-0500PM ET enumeration Running nmap script scan using script: http-put.</w:t>
       </w:r>
     </w:p>
     <w:p>
@@ -6320,23 +5690,7 @@
         <w:pStyle w:val="ActivityBullet"/>
       </w:pPr>
       <w:r>
-        <w:t xml:space="preserve">2026-01-29 14:04:47-0500PM ET enumeration Running </w:t>
-      </w:r>
-      <w:proofErr w:type="spellStart"/>
-      <w:r>
-        <w:t>nmap</w:t>
-      </w:r>
-      <w:proofErr w:type="spellEnd"/>
-      <w:r>
-        <w:t xml:space="preserve"> script scan using script: </w:t>
-      </w:r>
-      <w:proofErr w:type="spellStart"/>
-      <w:r>
-        <w:t>ssl-heartbleed</w:t>
-      </w:r>
-      <w:proofErr w:type="spellEnd"/>
-      <w:r>
-        <w:t>.</w:t>
+        <w:t>2026-01-29 14:04:47-0500PM ET enumeration Running nmap script scan using script: ssl-heartbleed.</w:t>
       </w:r>
     </w:p>
     <w:p>
@@ -6344,15 +5698,7 @@
         <w:pStyle w:val="ActivityBullet"/>
       </w:pPr>
       <w:r>
-        <w:t xml:space="preserve">2026-01-29 14:04:47-0500PM ET enumeration Running </w:t>
-      </w:r>
-      <w:proofErr w:type="spellStart"/>
-      <w:r>
-        <w:t>nmap</w:t>
-      </w:r>
-      <w:proofErr w:type="spellEnd"/>
-      <w:r>
-        <w:t xml:space="preserve"> script scan using script: http-title.</w:t>
+        <w:t>2026-01-29 14:04:47-0500PM ET enumeration Running nmap script scan using script: http-title.</w:t>
       </w:r>
     </w:p>
     <w:p>
@@ -6360,23 +5706,7 @@
         <w:pStyle w:val="ActivityBullet"/>
       </w:pPr>
       <w:r>
-        <w:t xml:space="preserve">2026-01-29 14:04:47-0500PM ET enumeration Running </w:t>
-      </w:r>
-      <w:proofErr w:type="spellStart"/>
-      <w:r>
-        <w:t>nmap</w:t>
-      </w:r>
-      <w:proofErr w:type="spellEnd"/>
-      <w:r>
-        <w:t xml:space="preserve"> script scan using script: </w:t>
-      </w:r>
-      <w:proofErr w:type="spellStart"/>
-      <w:r>
-        <w:t>ssl</w:t>
-      </w:r>
-      <w:proofErr w:type="spellEnd"/>
-      <w:r>
-        <w:t>-date.</w:t>
+        <w:t>2026-01-29 14:04:47-0500PM ET enumeration Running nmap script scan using script: ssl-date.</w:t>
       </w:r>
     </w:p>
     <w:p>
@@ -6384,15 +5714,7 @@
         <w:pStyle w:val="ActivityBullet"/>
       </w:pPr>
       <w:r>
-        <w:t>2026-01-29 14:04:47-0500PM ET enumeration Queuing up MSF module: auxiliary/scanner/ssh/</w:t>
-      </w:r>
-      <w:proofErr w:type="spellStart"/>
-      <w:r>
-        <w:t>ssh_version</w:t>
-      </w:r>
-      <w:proofErr w:type="spellEnd"/>
-      <w:r>
-        <w:t>.</w:t>
+        <w:t>2026-01-29 14:04:47-0500PM ET enumeration Queuing up MSF module: auxiliary/scanner/ssh/ssh_version.</w:t>
       </w:r>
     </w:p>
     <w:p>
@@ -6400,23 +5722,7 @@
         <w:pStyle w:val="ActivityBullet"/>
       </w:pPr>
       <w:r>
-        <w:t xml:space="preserve">2026-01-29 14:05:50-0500PM ET enumeration Completed MSF module: </w:t>
-      </w:r>
-      <w:proofErr w:type="gramStart"/>
-      <w:r>
-        <w:t>auxiliary/scanner</w:t>
-      </w:r>
-      <w:proofErr w:type="gramEnd"/>
-      <w:r>
-        <w:t>/ssh/</w:t>
-      </w:r>
-      <w:proofErr w:type="spellStart"/>
-      <w:r>
-        <w:t>ssh_version</w:t>
-      </w:r>
-      <w:proofErr w:type="spellEnd"/>
-      <w:r>
-        <w:t>.</w:t>
+        <w:t>2026-01-29 14:05:50-0500PM ET enumeration Completed MSF module: auxiliary/scanner/ssh/ssh_version.</w:t>
       </w:r>
     </w:p>
     <w:p>
@@ -6425,15 +5731,7 @@
       </w:pPr>
       <w:r>
         <w:lastRenderedPageBreak/>
-        <w:t xml:space="preserve">2026-01-29 14:05:50-0500PM ET enumeration Completed </w:t>
-      </w:r>
-      <w:proofErr w:type="spellStart"/>
-      <w:r>
-        <w:t>nmap</w:t>
-      </w:r>
-      <w:proofErr w:type="spellEnd"/>
-      <w:r>
-        <w:t xml:space="preserve"> script scan using script: http-methods.</w:t>
+        <w:t>2026-01-29 14:05:50-0500PM ET enumeration Completed nmap script scan using script: http-methods.</w:t>
       </w:r>
     </w:p>
     <w:p>
@@ -6441,31 +5739,7 @@
         <w:pStyle w:val="ActivityBullet"/>
       </w:pPr>
       <w:r>
-        <w:t xml:space="preserve">2026-01-29 14:05:50-0500PM ET enumeration Completed </w:t>
-      </w:r>
-      <w:proofErr w:type="spellStart"/>
-      <w:r>
-        <w:t>nmap</w:t>
-      </w:r>
-      <w:proofErr w:type="spellEnd"/>
-      <w:r>
-        <w:t xml:space="preserve"> script scan using script: </w:t>
-      </w:r>
-      <w:proofErr w:type="spellStart"/>
-      <w:r>
-        <w:t>ssl</w:t>
-      </w:r>
-      <w:proofErr w:type="spellEnd"/>
-      <w:r>
-        <w:t>-</w:t>
-      </w:r>
-      <w:proofErr w:type="spellStart"/>
-      <w:r>
-        <w:t>enum</w:t>
-      </w:r>
-      <w:proofErr w:type="spellEnd"/>
-      <w:r>
-        <w:t>-ciphers.</w:t>
+        <w:t>2026-01-29 14:05:50-0500PM ET enumeration Completed nmap script scan using script: ssl-enum-ciphers.</w:t>
       </w:r>
     </w:p>
     <w:p>
@@ -6473,15 +5747,7 @@
         <w:pStyle w:val="ActivityBullet"/>
       </w:pPr>
       <w:r>
-        <w:t xml:space="preserve">2026-01-29 14:05:50-0500PM ET enumeration Completed </w:t>
-      </w:r>
-      <w:proofErr w:type="spellStart"/>
-      <w:r>
-        <w:t>nmap</w:t>
-      </w:r>
-      <w:proofErr w:type="spellEnd"/>
-      <w:r>
-        <w:t xml:space="preserve"> script scan using script: http-put.</w:t>
+        <w:t>2026-01-29 14:05:50-0500PM ET enumeration Completed nmap script scan using script: http-put.</w:t>
       </w:r>
     </w:p>
     <w:p>
@@ -6489,15 +5755,7 @@
         <w:pStyle w:val="ActivityBullet"/>
       </w:pPr>
       <w:r>
-        <w:t xml:space="preserve">2026-01-29 14:05:50-0500PM ET enumeration Completed </w:t>
-      </w:r>
-      <w:proofErr w:type="spellStart"/>
-      <w:r>
-        <w:t>nmap</w:t>
-      </w:r>
-      <w:proofErr w:type="spellEnd"/>
-      <w:r>
-        <w:t xml:space="preserve"> script scan using script: http-robots.txt.</w:t>
+        <w:t>2026-01-29 14:05:50-0500PM ET enumeration Completed nmap script scan using script: http-robots.txt.</w:t>
       </w:r>
     </w:p>
     <w:p>
@@ -6505,23 +5763,7 @@
         <w:pStyle w:val="ActivityBullet"/>
       </w:pPr>
       <w:r>
-        <w:t xml:space="preserve">2026-01-29 14:05:50-0500PM ET enumeration Completed </w:t>
-      </w:r>
-      <w:proofErr w:type="spellStart"/>
-      <w:r>
-        <w:t>nmap</w:t>
-      </w:r>
-      <w:proofErr w:type="spellEnd"/>
-      <w:r>
-        <w:t xml:space="preserve"> script scan using script: </w:t>
-      </w:r>
-      <w:proofErr w:type="spellStart"/>
-      <w:r>
-        <w:t>ssl-heartbleed</w:t>
-      </w:r>
-      <w:proofErr w:type="spellEnd"/>
-      <w:r>
-        <w:t>.</w:t>
+        <w:t>2026-01-29 14:05:50-0500PM ET enumeration Completed nmap script scan using script: ssl-heartbleed.</w:t>
       </w:r>
     </w:p>
     <w:p>
@@ -6529,15 +5771,7 @@
         <w:pStyle w:val="ActivityBullet"/>
       </w:pPr>
       <w:r>
-        <w:t xml:space="preserve">2026-01-29 14:05:50-0500PM ET enumeration Completed </w:t>
-      </w:r>
-      <w:proofErr w:type="spellStart"/>
-      <w:r>
-        <w:t>nmap</w:t>
-      </w:r>
-      <w:proofErr w:type="spellEnd"/>
-      <w:r>
-        <w:t xml:space="preserve"> script scan using script: http-shellshock.</w:t>
+        <w:t>2026-01-29 14:05:50-0500PM ET enumeration Completed nmap script scan using script: http-shellshock.</w:t>
       </w:r>
     </w:p>
     <w:p>
@@ -6545,15 +5779,7 @@
         <w:pStyle w:val="ActivityBullet"/>
       </w:pPr>
       <w:r>
-        <w:t xml:space="preserve">2026-01-29 14:05:50-0500PM ET enumeration Completed </w:t>
-      </w:r>
-      <w:proofErr w:type="spellStart"/>
-      <w:r>
-        <w:t>nmap</w:t>
-      </w:r>
-      <w:proofErr w:type="spellEnd"/>
-      <w:r>
-        <w:t xml:space="preserve"> script scan using script: http-robots.txt.</w:t>
+        <w:t>2026-01-29 14:05:50-0500PM ET enumeration Completed nmap script scan using script: http-robots.txt.</w:t>
       </w:r>
     </w:p>
     <w:p>
@@ -6561,15 +5787,7 @@
         <w:pStyle w:val="ActivityBullet"/>
       </w:pPr>
       <w:r>
-        <w:t xml:space="preserve">2026-01-29 14:05:51-0500PM ET enumeration Completed </w:t>
-      </w:r>
-      <w:proofErr w:type="spellStart"/>
-      <w:r>
-        <w:t>nmap</w:t>
-      </w:r>
-      <w:proofErr w:type="spellEnd"/>
-      <w:r>
-        <w:t xml:space="preserve"> script scan using script: http-put.</w:t>
+        <w:t>2026-01-29 14:05:51-0500PM ET enumeration Completed nmap script scan using script: http-put.</w:t>
       </w:r>
     </w:p>
     <w:p>
@@ -6577,15 +5795,7 @@
         <w:pStyle w:val="ActivityBullet"/>
       </w:pPr>
       <w:r>
-        <w:t xml:space="preserve">2026-01-29 14:05:51-0500PM ET enumeration Completed </w:t>
-      </w:r>
-      <w:proofErr w:type="spellStart"/>
-      <w:r>
-        <w:t>nmap</w:t>
-      </w:r>
-      <w:proofErr w:type="spellEnd"/>
-      <w:r>
-        <w:t xml:space="preserve"> script scan using script: http-headers.</w:t>
+        <w:t>2026-01-29 14:05:51-0500PM ET enumeration Completed nmap script scan using script: http-headers.</w:t>
       </w:r>
     </w:p>
     <w:p>
@@ -6593,15 +5803,7 @@
         <w:pStyle w:val="ActivityBullet"/>
       </w:pPr>
       <w:r>
-        <w:t xml:space="preserve">2026-01-29 14:05:51-0500PM ET enumeration Completed </w:t>
-      </w:r>
-      <w:proofErr w:type="spellStart"/>
-      <w:r>
-        <w:t>nmap</w:t>
-      </w:r>
-      <w:proofErr w:type="spellEnd"/>
-      <w:r>
-        <w:t xml:space="preserve"> script scan using script: http-methods.</w:t>
+        <w:t>2026-01-29 14:05:51-0500PM ET enumeration Completed nmap script scan using script: http-methods.</w:t>
       </w:r>
     </w:p>
     <w:p>
@@ -6609,23 +5811,7 @@
         <w:pStyle w:val="ActivityBullet"/>
       </w:pPr>
       <w:r>
-        <w:t xml:space="preserve">2026-01-29 14:05:51-0500PM ET enumeration Completed </w:t>
-      </w:r>
-      <w:proofErr w:type="spellStart"/>
-      <w:r>
-        <w:t>nmap</w:t>
-      </w:r>
-      <w:proofErr w:type="spellEnd"/>
-      <w:r>
-        <w:t xml:space="preserve"> script scan using script: </w:t>
-      </w:r>
-      <w:proofErr w:type="spellStart"/>
-      <w:r>
-        <w:t>ssl</w:t>
-      </w:r>
-      <w:proofErr w:type="spellEnd"/>
-      <w:r>
-        <w:t>-date.</w:t>
+        <w:t>2026-01-29 14:05:51-0500PM ET enumeration Completed nmap script scan using script: ssl-date.</w:t>
       </w:r>
     </w:p>
     <w:p>
@@ -6633,15 +5819,7 @@
         <w:pStyle w:val="ActivityBullet"/>
       </w:pPr>
       <w:r>
-        <w:t xml:space="preserve">2026-01-29 14:05:51-0500PM ET enumeration Completed </w:t>
-      </w:r>
-      <w:proofErr w:type="spellStart"/>
-      <w:r>
-        <w:t>nmap</w:t>
-      </w:r>
-      <w:proofErr w:type="spellEnd"/>
-      <w:r>
-        <w:t xml:space="preserve"> script scan using script: http-title.</w:t>
+        <w:t>2026-01-29 14:05:51-0500PM ET enumeration Completed nmap script scan using script: http-title.</w:t>
       </w:r>
     </w:p>
     <w:p>
@@ -6649,23 +5827,7 @@
         <w:pStyle w:val="ActivityBullet"/>
       </w:pPr>
       <w:r>
-        <w:t xml:space="preserve">2026-01-29 14:05:51-0500PM ET </w:t>
-      </w:r>
-      <w:proofErr w:type="gramStart"/>
-      <w:r>
-        <w:t>enumeration</w:t>
-      </w:r>
-      <w:proofErr w:type="gramEnd"/>
-      <w:r>
-        <w:t xml:space="preserve"> Completed </w:t>
-      </w:r>
-      <w:proofErr w:type="spellStart"/>
-      <w:r>
-        <w:t>nmap</w:t>
-      </w:r>
-      <w:proofErr w:type="spellEnd"/>
-      <w:r>
-        <w:t xml:space="preserve"> script scan using script: http-shellshock.</w:t>
+        <w:t>2026-01-29 14:05:51-0500PM ET enumeration Completed nmap script scan using script: http-shellshock.</w:t>
       </w:r>
     </w:p>
     <w:p>
@@ -6673,15 +5835,7 @@
         <w:pStyle w:val="ActivityBullet"/>
       </w:pPr>
       <w:r>
-        <w:t xml:space="preserve">2026-01-29 14:05:51-0500PM ET enumeration Completed </w:t>
-      </w:r>
-      <w:proofErr w:type="spellStart"/>
-      <w:r>
-        <w:t>nmap</w:t>
-      </w:r>
-      <w:proofErr w:type="spellEnd"/>
-      <w:r>
-        <w:t xml:space="preserve"> script scan using script: http-headers.</w:t>
+        <w:t>2026-01-29 14:05:51-0500PM ET enumeration Completed nmap script scan using script: http-headers.</w:t>
       </w:r>
     </w:p>
     <w:p>
@@ -6689,31 +5843,7 @@
         <w:pStyle w:val="ActivityBullet"/>
       </w:pPr>
       <w:r>
-        <w:t xml:space="preserve">2026-01-29 14:05:51-0500PM ET </w:t>
-      </w:r>
-      <w:proofErr w:type="gramStart"/>
-      <w:r>
-        <w:t>enumeration</w:t>
-      </w:r>
-      <w:proofErr w:type="gramEnd"/>
-      <w:r>
-        <w:t xml:space="preserve"> Completed </w:t>
-      </w:r>
-      <w:proofErr w:type="spellStart"/>
-      <w:r>
-        <w:t>nmap</w:t>
-      </w:r>
-      <w:proofErr w:type="spellEnd"/>
-      <w:r>
-        <w:t xml:space="preserve"> script scan using script: </w:t>
-      </w:r>
-      <w:proofErr w:type="spellStart"/>
-      <w:r>
-        <w:t>ssl</w:t>
-      </w:r>
-      <w:proofErr w:type="spellEnd"/>
-      <w:r>
-        <w:t>-poodle.</w:t>
+        <w:t>2026-01-29 14:05:51-0500PM ET enumeration Completed nmap script scan using script: ssl-poodle.</w:t>
       </w:r>
     </w:p>
     <w:p>
@@ -6721,23 +5851,7 @@
         <w:pStyle w:val="ActivityBullet"/>
       </w:pPr>
       <w:r>
-        <w:t xml:space="preserve">2026-01-29 14:05:51-0500PM ET enumeration Completed </w:t>
-      </w:r>
-      <w:proofErr w:type="spellStart"/>
-      <w:r>
-        <w:t>nmap</w:t>
-      </w:r>
-      <w:proofErr w:type="spellEnd"/>
-      <w:r>
-        <w:t xml:space="preserve"> script scan using script: </w:t>
-      </w:r>
-      <w:proofErr w:type="spellStart"/>
-      <w:r>
-        <w:t>ssl</w:t>
-      </w:r>
-      <w:proofErr w:type="spellEnd"/>
-      <w:r>
-        <w:t>-cert.</w:t>
+        <w:t>2026-01-29 14:05:51-0500PM ET enumeration Completed nmap script scan using script: ssl-cert.</w:t>
       </w:r>
     </w:p>
     <w:p>
@@ -6745,15 +5859,7 @@
         <w:pStyle w:val="ActivityBullet"/>
       </w:pPr>
       <w:r>
-        <w:t xml:space="preserve">2026-01-29 14:05:51-0500PM ET enumeration Completed </w:t>
-      </w:r>
-      <w:proofErr w:type="spellStart"/>
-      <w:r>
-        <w:t>nmap</w:t>
-      </w:r>
-      <w:proofErr w:type="spellEnd"/>
-      <w:r>
-        <w:t xml:space="preserve"> script scan using script: sslv2.</w:t>
+        <w:t>2026-01-29 14:05:51-0500PM ET enumeration Completed nmap script scan using script: sslv2.</w:t>
       </w:r>
     </w:p>
     <w:p>
@@ -6761,15 +5867,7 @@
         <w:pStyle w:val="ActivityBullet"/>
       </w:pPr>
       <w:r>
-        <w:t xml:space="preserve">2026-01-29 14:05:51-0500PM ET enumeration Completed </w:t>
-      </w:r>
-      <w:proofErr w:type="spellStart"/>
-      <w:r>
-        <w:t>nmap</w:t>
-      </w:r>
-      <w:proofErr w:type="spellEnd"/>
-      <w:r>
-        <w:t xml:space="preserve"> script scan using script: http-title.</w:t>
+        <w:t>2026-01-29 14:05:51-0500PM ET enumeration Completed nmap script scan using script: http-title.</w:t>
       </w:r>
     </w:p>
     <w:p>
@@ -6777,23 +5875,7 @@
         <w:pStyle w:val="ActivityBullet"/>
       </w:pPr>
       <w:r>
-        <w:t xml:space="preserve">2026-01-29 14:05:51-0500PM ET enumeration </w:t>
-      </w:r>
-      <w:proofErr w:type="spellStart"/>
-      <w:r>
-        <w:t>Peforming</w:t>
-      </w:r>
-      <w:proofErr w:type="spellEnd"/>
-      <w:r>
-        <w:t xml:space="preserve"> a hidden directory enumeration attack on 80/</w:t>
-      </w:r>
-      <w:proofErr w:type="spellStart"/>
-      <w:r>
-        <w:t>tcp</w:t>
-      </w:r>
-      <w:proofErr w:type="spellEnd"/>
-      <w:r>
-        <w:t>.</w:t>
+        <w:t>2026-01-29 14:05:51-0500PM ET enumeration Peforming a hidden directory enumeration attack on 80/tcp.</w:t>
       </w:r>
     </w:p>
     <w:p>
@@ -6801,15 +5883,7 @@
         <w:pStyle w:val="ActivityBullet"/>
       </w:pPr>
       <w:r>
-        <w:t xml:space="preserve">2026-01-29 14:05:54-0500PM ET enumeration Running </w:t>
-      </w:r>
-      <w:proofErr w:type="spellStart"/>
-      <w:r>
-        <w:t>nmap</w:t>
-      </w:r>
-      <w:proofErr w:type="spellEnd"/>
-      <w:r>
-        <w:t xml:space="preserve"> script scan using script: sshv1.</w:t>
+        <w:t>2026-01-29 14:05:54-0500PM ET enumeration Running nmap script scan using script: sshv1.</w:t>
       </w:r>
     </w:p>
     <w:p>
@@ -6817,15 +5891,7 @@
         <w:pStyle w:val="ActivityBullet"/>
       </w:pPr>
       <w:r>
-        <w:t xml:space="preserve">2026-01-29 14:05:54-0500PM ET enumeration Running </w:t>
-      </w:r>
-      <w:proofErr w:type="spellStart"/>
-      <w:r>
-        <w:t>nmap</w:t>
-      </w:r>
-      <w:proofErr w:type="spellEnd"/>
-      <w:r>
-        <w:t xml:space="preserve"> script scan using script: ssh2-enum-algos.</w:t>
+        <w:t>2026-01-29 14:05:54-0500PM ET enumeration Running nmap script scan using script: ssh2-enum-algos.</w:t>
       </w:r>
     </w:p>
     <w:p>
@@ -6833,43 +5899,15 @@
         <w:pStyle w:val="ActivityBullet"/>
       </w:pPr>
       <w:r>
-        <w:t xml:space="preserve">2026-01-29 14:05:54-0500PM ET enumeration Running </w:t>
-      </w:r>
-      <w:proofErr w:type="spellStart"/>
-      <w:r>
-        <w:t>nmap</w:t>
-      </w:r>
-      <w:proofErr w:type="spellEnd"/>
-      <w:r>
-        <w:t xml:space="preserve"> script scan using script: ssh-auth-methods.</w:t>
+        <w:t>2026-01-29 14:05:54-0500PM ET enumeration Running nmap script scan using script: ssh-auth-methods.</w:t>
       </w:r>
     </w:p>
     <w:p>
       <w:pPr>
         <w:pStyle w:val="ActivityBullet"/>
-        <w:rPr>
-          <w:lang w:val="fr-FR"/>
-        </w:rPr>
-      </w:pPr>
-      <w:r>
-        <w:rPr>
-          <w:lang w:val="fr-FR"/>
-        </w:rPr>
-        <w:t xml:space="preserve">2026-01-29 </w:t>
-      </w:r>
-      <w:proofErr w:type="gramStart"/>
-      <w:r>
-        <w:rPr>
-          <w:lang w:val="fr-FR"/>
-        </w:rPr>
-        <w:t>14:05:</w:t>
-      </w:r>
-      <w:proofErr w:type="gramEnd"/>
-      <w:r>
-        <w:rPr>
-          <w:lang w:val="fr-FR"/>
-        </w:rPr>
-        <w:t>54-0500PM ET enumeration Analyzing SSL/TLS protocols on port 443/tcp.</w:t>
+      </w:pPr>
+      <w:r>
+        <w:t>2026-01-29 14:05:54-0500PM ET enumeration Analyzing SSL/TLS protocols on port 443/tcp.</w:t>
       </w:r>
     </w:p>
     <w:p>
@@ -6877,15 +5915,7 @@
         <w:pStyle w:val="ActivityBullet"/>
       </w:pPr>
       <w:r>
-        <w:t>2026-01-29 14:06:55-0500PM ET enumeration Completed SSL/TLS analysis on ports 443/</w:t>
-      </w:r>
-      <w:proofErr w:type="spellStart"/>
-      <w:r>
-        <w:t>tcp</w:t>
-      </w:r>
-      <w:proofErr w:type="spellEnd"/>
-      <w:r>
-        <w:t>.</w:t>
+        <w:t>2026-01-29 14:06:55-0500PM ET enumeration Completed SSL/TLS analysis on ports 443/tcp.</w:t>
       </w:r>
     </w:p>
     <w:p>
@@ -6901,23 +5931,7 @@
         <w:pStyle w:val="ActivityBullet"/>
       </w:pPr>
       <w:r>
-        <w:t xml:space="preserve">2026-01-29 14:06:55-0500PM ET enumeration </w:t>
-      </w:r>
-      <w:proofErr w:type="spellStart"/>
-      <w:r>
-        <w:t>Peforming</w:t>
-      </w:r>
-      <w:proofErr w:type="spellEnd"/>
-      <w:r>
-        <w:t xml:space="preserve"> a hidden directory enumeration attack on 443/</w:t>
-      </w:r>
-      <w:proofErr w:type="spellStart"/>
-      <w:r>
-        <w:t>tcp</w:t>
-      </w:r>
-      <w:proofErr w:type="spellEnd"/>
-      <w:r>
-        <w:t>.</w:t>
+        <w:t>2026-01-29 14:06:55-0500PM ET enumeration Peforming a hidden directory enumeration attack on 443/tcp.</w:t>
       </w:r>
     </w:p>
     <w:p>
@@ -6925,15 +5939,7 @@
         <w:pStyle w:val="ActivityBullet"/>
       </w:pPr>
       <w:r>
-        <w:t xml:space="preserve">2026-01-29 14:06:55-0500PM ET enumeration Completed </w:t>
-      </w:r>
-      <w:proofErr w:type="spellStart"/>
-      <w:r>
-        <w:t>nmap</w:t>
-      </w:r>
-      <w:proofErr w:type="spellEnd"/>
-      <w:r>
-        <w:t xml:space="preserve"> script scan using script: ssh2-enum-algos.</w:t>
+        <w:t>2026-01-29 14:06:55-0500PM ET enumeration Completed nmap script scan using script: ssh2-enum-algos.</w:t>
       </w:r>
     </w:p>
     <w:p>
@@ -6941,15 +5947,7 @@
         <w:pStyle w:val="ActivityBullet"/>
       </w:pPr>
       <w:r>
-        <w:t xml:space="preserve">2026-01-29 14:06:55-0500PM ET enumeration Completed </w:t>
-      </w:r>
-      <w:proofErr w:type="spellStart"/>
-      <w:r>
-        <w:t>nmap</w:t>
-      </w:r>
-      <w:proofErr w:type="spellEnd"/>
-      <w:r>
-        <w:t xml:space="preserve"> script scan using script: ssh-auth-methods.</w:t>
+        <w:t>2026-01-29 14:06:55-0500PM ET enumeration Completed nmap script scan using script: ssh-auth-methods.</w:t>
       </w:r>
     </w:p>
     <w:p>
@@ -6957,15 +5955,7 @@
         <w:pStyle w:val="ActivityBullet"/>
       </w:pPr>
       <w:r>
-        <w:t xml:space="preserve">2026-01-29 14:06:55-0500PM ET enumeration Completed </w:t>
-      </w:r>
-      <w:proofErr w:type="spellStart"/>
-      <w:r>
-        <w:t>nmap</w:t>
-      </w:r>
-      <w:proofErr w:type="spellEnd"/>
-      <w:r>
-        <w:t xml:space="preserve"> script scan using script: sshv1.</w:t>
+        <w:t>2026-01-29 14:06:55-0500PM ET enumeration Completed nmap script scan using script: sshv1.</w:t>
       </w:r>
     </w:p>
     <w:p>
@@ -6973,23 +5963,7 @@
         <w:pStyle w:val="ActivityBullet"/>
       </w:pPr>
       <w:r>
-        <w:t xml:space="preserve">2026-01-29 14:06:55-0500PM ET </w:t>
-      </w:r>
-      <w:proofErr w:type="gramStart"/>
-      <w:r>
-        <w:t>enumeration</w:t>
-      </w:r>
-      <w:proofErr w:type="gramEnd"/>
-      <w:r>
-        <w:t xml:space="preserve"> Completed </w:t>
-      </w:r>
-      <w:proofErr w:type="gramStart"/>
-      <w:r>
-        <w:t>enumerating</w:t>
-      </w:r>
-      <w:proofErr w:type="gramEnd"/>
-      <w:r>
-        <w:t xml:space="preserve"> SSH services.</w:t>
+        <w:t>2026-01-29 14:06:55-0500PM ET enumeration Completed enumerating SSH services.</w:t>
       </w:r>
     </w:p>
     <w:p>
@@ -6997,15 +5971,7 @@
         <w:pStyle w:val="ActivityBullet"/>
       </w:pPr>
       <w:r>
-        <w:t>2026-01-29 14:06:58-0500PM ET enumeration Analyzing web services running on port 80/</w:t>
-      </w:r>
-      <w:proofErr w:type="spellStart"/>
-      <w:r>
-        <w:t>tcp</w:t>
-      </w:r>
-      <w:proofErr w:type="spellEnd"/>
-      <w:r>
-        <w:t>.</w:t>
+        <w:t>2026-01-29 14:06:58-0500PM ET enumeration Analyzing web services running on port 80/tcp.</w:t>
       </w:r>
     </w:p>
     <w:p>
@@ -7013,15 +5979,7 @@
         <w:pStyle w:val="ActivityBullet"/>
       </w:pPr>
       <w:r>
-        <w:t>2026-01-29 14:08:10-0500PM ET enumeration Completed analyzing web services running on port 80/</w:t>
-      </w:r>
-      <w:proofErr w:type="spellStart"/>
-      <w:r>
-        <w:t>tcp</w:t>
-      </w:r>
-      <w:proofErr w:type="spellEnd"/>
-      <w:r>
-        <w:t>.</w:t>
+        <w:t>2026-01-29 14:08:10-0500PM ET enumeration Completed analyzing web services running on port 80/tcp.</w:t>
       </w:r>
     </w:p>
     <w:p>
@@ -7029,23 +5987,7 @@
         <w:pStyle w:val="ActivityBullet"/>
       </w:pPr>
       <w:r>
-        <w:t xml:space="preserve">2026-01-29 14:08:10-0500PM ET </w:t>
-      </w:r>
-      <w:proofErr w:type="gramStart"/>
-      <w:r>
-        <w:t>enumeration</w:t>
-      </w:r>
-      <w:proofErr w:type="gramEnd"/>
-      <w:r>
-        <w:t xml:space="preserve"> Completed </w:t>
-      </w:r>
-      <w:proofErr w:type="gramStart"/>
-      <w:r>
-        <w:t>hidden directory enumeration scan</w:t>
-      </w:r>
-      <w:proofErr w:type="gramEnd"/>
-      <w:r>
-        <w:t>.</w:t>
+        <w:t>2026-01-29 14:08:10-0500PM ET enumeration Completed hidden directory enumeration scan.</w:t>
       </w:r>
     </w:p>
     <w:p>
@@ -7053,15 +5995,7 @@
         <w:pStyle w:val="ActivityBullet"/>
       </w:pPr>
       <w:r>
-        <w:t>2026-01-29 14:08:10-0500PM ET enumeration Completed analyzing web services running on port 80/</w:t>
-      </w:r>
-      <w:proofErr w:type="spellStart"/>
-      <w:r>
-        <w:t>tcp</w:t>
-      </w:r>
-      <w:proofErr w:type="spellEnd"/>
-      <w:r>
-        <w:t>.</w:t>
+        <w:t>2026-01-29 14:08:10-0500PM ET enumeration Completed analyzing web services running on port 80/tcp.</w:t>
       </w:r>
     </w:p>
     <w:p>
@@ -7069,23 +6003,7 @@
         <w:pStyle w:val="ActivityBullet"/>
       </w:pPr>
       <w:r>
-        <w:t xml:space="preserve">2026-01-29 14:08:10-0500PM ET </w:t>
-      </w:r>
-      <w:proofErr w:type="gramStart"/>
-      <w:r>
-        <w:t>enumeration</w:t>
-      </w:r>
-      <w:proofErr w:type="gramEnd"/>
-      <w:r>
-        <w:t xml:space="preserve"> Completed </w:t>
-      </w:r>
-      <w:proofErr w:type="gramStart"/>
-      <w:r>
-        <w:t>enumerating</w:t>
-      </w:r>
-      <w:proofErr w:type="gramEnd"/>
-      <w:r>
-        <w:t xml:space="preserve"> HTTP services.</w:t>
+        <w:t>2026-01-29 14:08:10-0500PM ET enumeration Completed enumerating HTTP services.</w:t>
       </w:r>
     </w:p>
     <w:p>
@@ -7093,15 +6011,7 @@
         <w:pStyle w:val="ActivityBullet"/>
       </w:pPr>
       <w:r>
-        <w:t>2026-01-29 14:08:13-0500PM ET enumeration Analyzing web services running on port 443/</w:t>
-      </w:r>
-      <w:proofErr w:type="spellStart"/>
-      <w:r>
-        <w:t>tcp</w:t>
-      </w:r>
-      <w:proofErr w:type="spellEnd"/>
-      <w:r>
-        <w:t>.</w:t>
+        <w:t>2026-01-29 14:08:13-0500PM ET enumeration Analyzing web services running on port 443/tcp.</w:t>
       </w:r>
     </w:p>
     <w:p>
@@ -7109,23 +6019,7 @@
         <w:pStyle w:val="ActivityBullet"/>
       </w:pPr>
       <w:r>
-        <w:t xml:space="preserve">2026-01-29 14:09:15-0500PM ET </w:t>
-      </w:r>
-      <w:proofErr w:type="gramStart"/>
-      <w:r>
-        <w:t>enumeration</w:t>
-      </w:r>
-      <w:proofErr w:type="gramEnd"/>
-      <w:r>
-        <w:t xml:space="preserve"> Completed analyzing web services running on port 443/</w:t>
-      </w:r>
-      <w:proofErr w:type="spellStart"/>
-      <w:r>
-        <w:t>tcp</w:t>
-      </w:r>
-      <w:proofErr w:type="spellEnd"/>
-      <w:r>
-        <w:t>.</w:t>
+        <w:t>2026-01-29 14:09:15-0500PM ET enumeration Completed analyzing web services running on port 443/tcp.</w:t>
       </w:r>
     </w:p>
     <w:p>
@@ -7133,23 +6027,7 @@
         <w:pStyle w:val="ActivityBullet"/>
       </w:pPr>
       <w:r>
-        <w:t xml:space="preserve">2026-01-29 14:09:15-0500PM ET </w:t>
-      </w:r>
-      <w:proofErr w:type="gramStart"/>
-      <w:r>
-        <w:t>enumeration</w:t>
-      </w:r>
-      <w:proofErr w:type="gramEnd"/>
-      <w:r>
-        <w:t xml:space="preserve"> Completed analyzing web services running on port 443/</w:t>
-      </w:r>
-      <w:proofErr w:type="spellStart"/>
-      <w:r>
-        <w:t>tcp</w:t>
-      </w:r>
-      <w:proofErr w:type="spellEnd"/>
-      <w:r>
-        <w:t>.</w:t>
+        <w:t>2026-01-29 14:09:15-0500PM ET enumeration Completed analyzing web services running on port 443/tcp.</w:t>
       </w:r>
     </w:p>
     <w:p>
@@ -7165,36 +6043,14 @@
         <w:pStyle w:val="ActivityBullet"/>
       </w:pPr>
       <w:r>
-        <w:t xml:space="preserve">2026-01-29 14:09:45-0500PM ET </w:t>
-      </w:r>
-      <w:proofErr w:type="gramStart"/>
-      <w:r>
-        <w:t>enumeration</w:t>
-      </w:r>
-      <w:proofErr w:type="gramEnd"/>
-      <w:r>
-        <w:t xml:space="preserve"> </w:t>
-      </w:r>
-      <w:proofErr w:type="spellStart"/>
-      <w:r>
-        <w:t>Enumeration</w:t>
-      </w:r>
-      <w:proofErr w:type="spellEnd"/>
-      <w:r>
-        <w:t xml:space="preserve"> module completed.</w:t>
+        <w:t>2026-01-29 14:09:45-0500PM ET enumeration Enumeration module completed.</w:t>
       </w:r>
     </w:p>
     <w:p>
       <w:pPr>
         <w:pStyle w:val="ActivityBullet"/>
-        <w:rPr>
-          <w:lang w:val="fr-FR"/>
-        </w:rPr>
-      </w:pPr>
-      <w:r>
-        <w:rPr>
-          <w:lang w:val="fr-FR"/>
-        </w:rPr>
+      </w:pPr>
+      <w:r>
         <w:t>2026-01-29 14:10:06-0500PM ET exploit Launching exploit module.</w:t>
       </w:r>
     </w:p>
@@ -7225,14 +6081,8 @@
     <w:p>
       <w:pPr>
         <w:pStyle w:val="ActivityBullet"/>
-        <w:rPr>
-          <w:lang w:val="fr-FR"/>
-        </w:rPr>
-      </w:pPr>
-      <w:r>
-        <w:rPr>
-          <w:lang w:val="fr-FR"/>
-        </w:rPr>
+      </w:pPr>
+      <w:r>
         <w:t>2026-01-29 14:11:49-0500PM ET exploit Completed exploit module.</w:t>
       </w:r>
     </w:p>
@@ -7279,7 +6129,7 @@
           <w14:ligatures w14:val="none"/>
         </w:rPr>
       </w:pPr>
-      <w:bookmarkStart w:id="15" w:name="_Toc190866256"/>
+      <w:bookmarkStart w:id="14" w:name="_Toc190866256"/>
       <w:r>
         <w:rPr>
           <w:rFonts w:ascii="Handel Gothic D" w:eastAsia="DengXian Light" w:hAnsi="Handel Gothic D" w:cs="Times New Roman"/>
@@ -7295,7 +6145,7 @@
         <w:lastRenderedPageBreak/>
         <w:t>Recommendations</w:t>
       </w:r>
-      <w:bookmarkEnd w:id="15"/>
+      <w:bookmarkEnd w:id="14"/>
     </w:p>
     <w:p>
       <w:pPr>
@@ -7405,7 +6255,7 @@
                     </pic:cNvPicPr>
                   </pic:nvPicPr>
                   <pic:blipFill>
-                    <a:blip r:embed="rId16" cstate="print">
+                    <a:blip r:embed="rId14" cstate="print">
                       <a:extLst>
                         <a:ext uri="{28A0092B-C50C-407E-A947-70E740481C1C}">
                           <a14:useLocalDpi xmlns:a14="http://schemas.microsoft.com/office/drawing/2010/main" val="0"/>
@@ -7493,7 +6343,7 @@
           <w14:ligatures w14:val="none"/>
         </w:rPr>
         <w:drawing>
-          <wp:inline distT="0" distB="0" distL="0" distR="0" wp14:anchorId="03962334" wp14:editId="0CF06C05">
+          <wp:inline distT="0" distB="0" distL="0" distR="0" wp14:anchorId="03962334" wp14:editId="3E91DC9D">
             <wp:extent cx="152400" cy="152400"/>
             <wp:effectExtent l="0" t="0" r="0" b="0"/>
             <wp:docPr id="2011428596" name="Picture 2011428596" descr="Fire with solid fill"/>
@@ -7510,11 +6360,11 @@
                     </pic:cNvPicPr>
                   </pic:nvPicPr>
                   <pic:blipFill>
-                    <a:blip r:embed="rId17" cstate="print">
+                    <a:blip r:embed="rId15" cstate="print">
                       <a:extLst>
                         <a:ext uri="{BEBA8EAE-BF5A-486C-A8C5-ECC9F3942E4B}">
                           <a14:imgProps xmlns:a14="http://schemas.microsoft.com/office/drawing/2010/main">
-                            <a14:imgLayer r:embed="rId18">
+                            <a14:imgLayer r:embed="rId16">
                               <a14:imgEffect>
                                 <a14:saturation sat="0"/>
                               </a14:imgEffect>
@@ -7582,9 +6432,9 @@
         </w:rPr>
         <w:t xml:space="preserve"> can assist with remediation</w:t>
       </w:r>
-      <w:bookmarkStart w:id="16" w:name="_Hlk194407007"/>
-    </w:p>
-    <w:bookmarkEnd w:id="16"/>
+      <w:bookmarkStart w:id="15" w:name="_Hlk194407007"/>
+    </w:p>
+    <w:bookmarkEnd w:id="15"/>
     <w:p>
       <w:pPr>
         <w:keepNext/>
@@ -7624,6 +6474,49 @@
       </w:pPr>
       <w:r>
         <w:rPr>
+          <w:noProof/>
+        </w:rPr>
+        <w:drawing>
+          <wp:inline distT="0" distB="0" distL="0" distR="0" wp14:anchorId="2F2087C7" wp14:editId="0E05B0B1">
+            <wp:extent cx="152400" cy="152400"/>
+            <wp:effectExtent l="0" t="0" r="0" b="0"/>
+            <wp:docPr id="2011428597" name="Picture 2011428597"/>
+            <wp:cNvGraphicFramePr>
+              <a:graphicFrameLocks xmlns:a="http://schemas.openxmlformats.org/drawingml/2006/main" noChangeAspect="1"/>
+            </wp:cNvGraphicFramePr>
+            <a:graphic xmlns:a="http://schemas.openxmlformats.org/drawingml/2006/main">
+              <a:graphicData uri="http://schemas.openxmlformats.org/drawingml/2006/picture">
+                <pic:pic xmlns:pic="http://schemas.openxmlformats.org/drawingml/2006/picture">
+                  <pic:nvPicPr>
+                    <pic:cNvPr id="0" name="image.png"/>
+                    <pic:cNvPicPr/>
+                  </pic:nvPicPr>
+                  <pic:blipFill>
+                    <a:blip r:embed="rId15"/>
+                    <a:stretch>
+                      <a:fillRect/>
+                    </a:stretch>
+                  </pic:blipFill>
+                  <pic:spPr>
+                    <a:xfrm>
+                      <a:off x="0" y="0"/>
+                      <a:ext cx="152400" cy="152400"/>
+                    </a:xfrm>
+                    <a:prstGeom prst="rect">
+                      <a:avLst/>
+                    </a:prstGeom>
+                  </pic:spPr>
+                </pic:pic>
+              </a:graphicData>
+            </a:graphic>
+          </wp:inline>
+        </w:drawing>
+      </w:r>
+      <w:r>
+        <w:t xml:space="preserve"> </w:t>
+      </w:r>
+      <w:r>
+        <w:rPr>
           <w:b/>
         </w:rPr>
         <w:t>Remediate Subdomain Takeover Exposure</w:t>
@@ -7651,6 +6544,49 @@
       </w:pPr>
       <w:r>
         <w:rPr>
+          <w:noProof/>
+        </w:rPr>
+        <w:drawing>
+          <wp:inline distT="0" distB="0" distL="0" distR="0" wp14:anchorId="0B583026" wp14:editId="513BDDF9">
+            <wp:extent cx="152400" cy="152400"/>
+            <wp:effectExtent l="0" t="0" r="0" b="0"/>
+            <wp:docPr id="2011428598" name="Picture 2011428598"/>
+            <wp:cNvGraphicFramePr>
+              <a:graphicFrameLocks xmlns:a="http://schemas.openxmlformats.org/drawingml/2006/main" noChangeAspect="1"/>
+            </wp:cNvGraphicFramePr>
+            <a:graphic xmlns:a="http://schemas.openxmlformats.org/drawingml/2006/main">
+              <a:graphicData uri="http://schemas.openxmlformats.org/drawingml/2006/picture">
+                <pic:pic xmlns:pic="http://schemas.openxmlformats.org/drawingml/2006/picture">
+                  <pic:nvPicPr>
+                    <pic:cNvPr id="0" name="image.png"/>
+                    <pic:cNvPicPr/>
+                  </pic:nvPicPr>
+                  <pic:blipFill>
+                    <a:blip r:embed="rId15"/>
+                    <a:stretch>
+                      <a:fillRect/>
+                    </a:stretch>
+                  </pic:blipFill>
+                  <pic:spPr>
+                    <a:xfrm>
+                      <a:off x="0" y="0"/>
+                      <a:ext cx="152400" cy="152400"/>
+                    </a:xfrm>
+                    <a:prstGeom prst="rect">
+                      <a:avLst/>
+                    </a:prstGeom>
+                  </pic:spPr>
+                </pic:pic>
+              </a:graphicData>
+            </a:graphic>
+          </wp:inline>
+        </w:drawing>
+      </w:r>
+      <w:r>
+        <w:t xml:space="preserve"> </w:t>
+      </w:r>
+      <w:r>
+        <w:rPr>
           <w:b/>
         </w:rPr>
         <w:t>Reconfigure DMARC Record</w:t>
@@ -7676,6 +6612,49 @@
       <w:pPr>
         <w:pStyle w:val="ListNumber2"/>
       </w:pPr>
+      <w:r>
+        <w:rPr>
+          <w:noProof/>
+        </w:rPr>
+        <w:drawing>
+          <wp:inline distT="0" distB="0" distL="0" distR="0" wp14:anchorId="00BF6DD5" wp14:editId="4AE525B9">
+            <wp:extent cx="152400" cy="152400"/>
+            <wp:effectExtent l="0" t="0" r="0" b="0"/>
+            <wp:docPr id="2011428599" name="Picture 2011428599"/>
+            <wp:cNvGraphicFramePr>
+              <a:graphicFrameLocks xmlns:a="http://schemas.openxmlformats.org/drawingml/2006/main" noChangeAspect="1"/>
+            </wp:cNvGraphicFramePr>
+            <a:graphic xmlns:a="http://schemas.openxmlformats.org/drawingml/2006/main">
+              <a:graphicData uri="http://schemas.openxmlformats.org/drawingml/2006/picture">
+                <pic:pic xmlns:pic="http://schemas.openxmlformats.org/drawingml/2006/picture">
+                  <pic:nvPicPr>
+                    <pic:cNvPr id="0" name="image.png"/>
+                    <pic:cNvPicPr/>
+                  </pic:nvPicPr>
+                  <pic:blipFill>
+                    <a:blip r:embed="rId15"/>
+                    <a:stretch>
+                      <a:fillRect/>
+                    </a:stretch>
+                  </pic:blipFill>
+                  <pic:spPr>
+                    <a:xfrm>
+                      <a:off x="0" y="0"/>
+                      <a:ext cx="152400" cy="152400"/>
+                    </a:xfrm>
+                    <a:prstGeom prst="rect">
+                      <a:avLst/>
+                    </a:prstGeom>
+                  </pic:spPr>
+                </pic:pic>
+              </a:graphicData>
+            </a:graphic>
+          </wp:inline>
+        </w:drawing>
+      </w:r>
+      <w:r>
+        <w:t xml:space="preserve"> </w:t>
+      </w:r>
       <w:r>
         <w:rPr>
           <w:b/>
@@ -7706,7 +6685,6 @@
           <w:ilvl w:val="0"/>
           <w:numId w:val="0"/>
         </w:numPr>
-        <w:ind w:left="720" w:hanging="360"/>
       </w:pPr>
       <w:r>
         <w:br w:type="page"/>
@@ -7729,7 +6707,7 @@
           <w14:ligatures w14:val="none"/>
         </w:rPr>
       </w:pPr>
-      <w:bookmarkStart w:id="17" w:name="_Toc190866257"/>
+      <w:bookmarkStart w:id="16" w:name="_Toc190866257"/>
       <w:r>
         <w:rPr>
           <w:rFonts w:ascii="Handel Gothic D" w:eastAsia="DengXian Light" w:hAnsi="Handel Gothic D" w:cs="Times New Roman"/>
@@ -7745,7 +6723,7 @@
         <w:lastRenderedPageBreak/>
         <w:t>appendix</w:t>
       </w:r>
-      <w:bookmarkEnd w:id="17"/>
+      <w:bookmarkEnd w:id="16"/>
     </w:p>
     <w:p>
       <w:pPr>
@@ -7814,10 +6792,10 @@
           <w:noProof/>
         </w:rPr>
         <w:drawing>
-          <wp:inline distT="0" distB="0" distL="0" distR="0" wp14:anchorId="35BBA538" wp14:editId="7ABE292F">
+          <wp:inline distT="0" distB="0" distL="0" distR="0" wp14:anchorId="53E4FD87" wp14:editId="12DF08C0">
             <wp:extent cx="5943600" cy="830317"/>
             <wp:effectExtent l="0" t="0" r="0" b="0"/>
-            <wp:docPr id="2011428597" name="Picture 2011428597"/>
+            <wp:docPr id="2011428600" name="Picture 2011428600"/>
             <wp:cNvGraphicFramePr>
               <a:graphicFrameLocks xmlns:a="http://schemas.openxmlformats.org/drawingml/2006/main" noChangeAspect="1"/>
             </wp:cNvGraphicFramePr>
@@ -7829,7 +6807,7 @@
                     <pic:cNvPicPr/>
                   </pic:nvPicPr>
                   <pic:blipFill>
-                    <a:blip r:embed="rId19"/>
+                    <a:blip r:embed="rId17"/>
                     <a:stretch>
                       <a:fillRect/>
                     </a:stretch>
@@ -7849,6 +6827,21 @@
           </wp:inline>
         </w:drawing>
       </w:r>
+    </w:p>
+    <w:p>
+      <w:pPr>
+        <w:spacing w:after="120"/>
+      </w:pPr>
+    </w:p>
+    <w:p>
+      <w:pPr>
+        <w:spacing w:after="120"/>
+      </w:pPr>
+    </w:p>
+    <w:p>
+      <w:pPr>
+        <w:spacing w:after="120"/>
+      </w:pPr>
     </w:p>
     <w:p>
       <w:pPr>

</xml_diff>

<commit_message>
Updated GUI to include Findings Details
</commit_message>
<xml_diff>
--- a/Source_Code/Reports/Sample499/FindingsReportTest.docx
+++ b/Source_Code/Reports/Sample499/FindingsReportTest.docx
@@ -601,7 +601,7 @@
           <w14:ligatures w14:val="none"/>
         </w:rPr>
         <w:drawing>
-          <wp:anchor distT="0" distB="0" distL="114300" distR="114300" simplePos="0" relativeHeight="251662336" behindDoc="0" locked="0" layoutInCell="1" allowOverlap="1" wp14:anchorId="56FF54E8" wp14:editId="7CC950C4">
+          <wp:anchor distT="0" distB="0" distL="114300" distR="114300" simplePos="0" relativeHeight="251662336" behindDoc="0" locked="0" layoutInCell="1" allowOverlap="1" wp14:anchorId="56FF54E8" wp14:editId="23AB3865">
             <wp:simplePos x="0" y="0"/>
             <wp:positionH relativeFrom="margin">
               <wp:posOffset>1163955</wp:posOffset>
@@ -1125,31 +1125,7 @@
           <w:szCs w:val="22"/>
           <w14:ligatures w14:val="none"/>
         </w:rPr>
-        <w:t xml:space="preserve">contained in this document is confidential and proprietary. It is intended for the exclusive use of </w:t>
-      </w:r>
-      <w:proofErr w:type="spellStart"/>
-      <w:r>
-        <w:rPr>
-          <w:rFonts w:ascii="Corbel" w:eastAsia="Calibri" w:hAnsi="Corbel" w:cs="Arial"/>
-          <w:snapToGrid w:val="0"/>
-          <w:color w:val="404040"/>
-          <w:kern w:val="0"/>
-          <w:szCs w:val="22"/>
-          <w14:ligatures w14:val="none"/>
-        </w:rPr>
-        <w:t>OrbitalFire</w:t>
-      </w:r>
-      <w:proofErr w:type="spellEnd"/>
-      <w:r>
-        <w:rPr>
-          <w:rFonts w:ascii="Corbel" w:eastAsia="Calibri" w:hAnsi="Corbel" w:cs="Arial"/>
-          <w:snapToGrid w:val="0"/>
-          <w:color w:val="404040"/>
-          <w:kern w:val="0"/>
-          <w:szCs w:val="22"/>
-          <w14:ligatures w14:val="none"/>
-        </w:rPr>
-        <w:t>, LLC and the Customer entity named in this document.</w:t>
+        <w:t>contained in this document is confidential and proprietary. It is intended for the exclusive use of OrbitalFire, LLC and the Customer entity named in this document.</w:t>
       </w:r>
     </w:p>
     <w:p>
@@ -1969,51 +1945,7 @@
           <w:szCs w:val="22"/>
           <w14:ligatures w14:val="none"/>
         </w:rPr>
-        <w:t xml:space="preserve">In 2015, </w:t>
-      </w:r>
-      <w:proofErr w:type="spellStart"/>
-      <w:r>
-        <w:rPr>
-          <w:rFonts w:ascii="Corbel" w:eastAsia="Calibri" w:hAnsi="Corbel" w:cs="Arial"/>
-          <w:color w:val="404040"/>
-          <w:kern w:val="0"/>
-          <w:szCs w:val="22"/>
-          <w14:ligatures w14:val="none"/>
-        </w:rPr>
-        <w:t>Ponemon</w:t>
-      </w:r>
-      <w:proofErr w:type="spellEnd"/>
-      <w:r>
-        <w:rPr>
-          <w:rFonts w:ascii="Corbel" w:eastAsia="Calibri" w:hAnsi="Corbel" w:cs="Arial"/>
-          <w:color w:val="404040"/>
-          <w:kern w:val="0"/>
-          <w:szCs w:val="22"/>
-          <w14:ligatures w14:val="none"/>
-        </w:rPr>
-        <w:t xml:space="preserve"> Institute conducted a study on the cost of data breaches that surveyed 350 organizations from 11 different countries that had suffered some type of cybercrime. Nearly half </w:t>
-      </w:r>
-      <w:proofErr w:type="gramStart"/>
-      <w:r>
-        <w:rPr>
-          <w:rFonts w:ascii="Corbel" w:eastAsia="Calibri" w:hAnsi="Corbel" w:cs="Arial"/>
-          <w:color w:val="404040"/>
-          <w:kern w:val="0"/>
-          <w:szCs w:val="22"/>
-          <w14:ligatures w14:val="none"/>
-        </w:rPr>
-        <w:t>of</w:t>
-      </w:r>
-      <w:proofErr w:type="gramEnd"/>
-      <w:r>
-        <w:rPr>
-          <w:rFonts w:ascii="Corbel" w:eastAsia="Calibri" w:hAnsi="Corbel" w:cs="Arial"/>
-          <w:color w:val="404040"/>
-          <w:kern w:val="0"/>
-          <w:szCs w:val="22"/>
-          <w14:ligatures w14:val="none"/>
-        </w:rPr>
-        <w:t xml:space="preserve"> said these incidents (47%) were the result of malicious actors who were able to compromise company networks to steal money, intellectual property or other protected data.</w:t>
+        <w:t>In 2015, Ponemon Institute conducted a study on the cost of data breaches that surveyed 350 organizations from 11 different countries that had suffered some type of cybercrime. Nearly half of said these incidents (47%) were the result of malicious actors who were able to compromise company networks to steal money, intellectual property or other protected data.</w:t>
       </w:r>
     </w:p>
     <w:p>
@@ -2335,29 +2267,7 @@
           <w:szCs w:val="22"/>
           <w14:ligatures w14:val="none"/>
         </w:rPr>
-        <w:t xml:space="preserve">Without well-defined goals, boundaries and operational guidance, penetration testing can become </w:t>
-      </w:r>
-      <w:proofErr w:type="gramStart"/>
-      <w:r>
-        <w:rPr>
-          <w:rFonts w:ascii="Corbel" w:eastAsia="Calibri" w:hAnsi="Corbel" w:cs="Arial"/>
-          <w:color w:val="404040"/>
-          <w:kern w:val="0"/>
-          <w:szCs w:val="22"/>
-          <w14:ligatures w14:val="none"/>
-        </w:rPr>
-        <w:t>disruptive, or</w:t>
-      </w:r>
-      <w:proofErr w:type="gramEnd"/>
-      <w:r>
-        <w:rPr>
-          <w:rFonts w:ascii="Corbel" w:eastAsia="Calibri" w:hAnsi="Corbel" w:cs="Arial"/>
-          <w:color w:val="404040"/>
-          <w:kern w:val="0"/>
-          <w:szCs w:val="22"/>
-          <w14:ligatures w14:val="none"/>
-        </w:rPr>
-        <w:t xml:space="preserve"> even damaging to the organization undergoing testing. For these reasons these operational guidelines are carefully communicated and resolved.</w:t>
+        <w:t>Without well-defined goals, boundaries and operational guidance, penetration testing can become disruptive, or even damaging to the organization undergoing testing. For these reasons these operational guidelines are carefully communicated and resolved.</w:t>
       </w:r>
     </w:p>
     <w:p>
@@ -3007,51 +2917,7 @@
           <w:szCs w:val="22"/>
           <w14:ligatures w14:val="none"/>
         </w:rPr>
-        <w:t xml:space="preserve">Penetration testing can be </w:t>
-      </w:r>
-      <w:proofErr w:type="gramStart"/>
-      <w:r>
-        <w:rPr>
-          <w:rFonts w:ascii="Corbel" w:eastAsia="Calibri" w:hAnsi="Corbel" w:cs="Arial"/>
-          <w:color w:val="404040"/>
-          <w:kern w:val="0"/>
-          <w:szCs w:val="22"/>
-          <w14:ligatures w14:val="none"/>
-        </w:rPr>
-        <w:t>conducted</w:t>
-      </w:r>
-      <w:proofErr w:type="gramEnd"/>
-      <w:r>
-        <w:rPr>
-          <w:rFonts w:ascii="Corbel" w:eastAsia="Calibri" w:hAnsi="Corbel" w:cs="Arial"/>
-          <w:color w:val="404040"/>
-          <w:kern w:val="0"/>
-          <w:szCs w:val="22"/>
-          <w14:ligatures w14:val="none"/>
-        </w:rPr>
-        <w:t xml:space="preserve"> many </w:t>
-      </w:r>
-      <w:proofErr w:type="gramStart"/>
-      <w:r>
-        <w:rPr>
-          <w:rFonts w:ascii="Corbel" w:eastAsia="Calibri" w:hAnsi="Corbel" w:cs="Arial"/>
-          <w:color w:val="404040"/>
-          <w:kern w:val="0"/>
-          <w:szCs w:val="22"/>
-          <w14:ligatures w14:val="none"/>
-        </w:rPr>
-        <w:t>ways,</w:t>
-      </w:r>
-      <w:proofErr w:type="gramEnd"/>
-      <w:r>
-        <w:rPr>
-          <w:rFonts w:ascii="Corbel" w:eastAsia="Calibri" w:hAnsi="Corbel" w:cs="Arial"/>
-          <w:color w:val="404040"/>
-          <w:kern w:val="0"/>
-          <w:szCs w:val="22"/>
-          <w14:ligatures w14:val="none"/>
-        </w:rPr>
-        <w:t xml:space="preserve"> the following describe the methodologies utilized for this test:</w:t>
+        <w:t>Penetration testing can be conducted many ways, the following describe the methodologies utilized for this test:</w:t>
       </w:r>
     </w:p>
     <w:p>
@@ -3358,27 +3224,15 @@
         </w:rPr>
         <w:t xml:space="preserve"> </w:t>
       </w:r>
-      <w:proofErr w:type="gramStart"/>
-      <w:r>
-        <w:rPr>
-          <w:rFonts w:ascii="Corbel" w:eastAsia="Calibri" w:hAnsi="Corbel" w:cs="Arial"/>
-          <w:color w:val="404040"/>
-          <w:kern w:val="0"/>
-          <w:szCs w:val="22"/>
-          <w14:ligatures w14:val="none"/>
-        </w:rPr>
-        <w:t>–  Findings</w:t>
-      </w:r>
-      <w:proofErr w:type="gramEnd"/>
-      <w:r>
-        <w:rPr>
-          <w:rFonts w:ascii="Corbel" w:eastAsia="Calibri" w:hAnsi="Corbel" w:cs="Arial"/>
-          <w:color w:val="404040"/>
-          <w:kern w:val="0"/>
-          <w:szCs w:val="22"/>
-          <w14:ligatures w14:val="none"/>
-        </w:rPr>
-        <w:t xml:space="preserve"> that have a moderate impact on the security of the system or application and require timely attention</w:t>
+      <w:r>
+        <w:rPr>
+          <w:rFonts w:ascii="Corbel" w:eastAsia="Calibri" w:hAnsi="Corbel" w:cs="Arial"/>
+          <w:color w:val="404040"/>
+          <w:kern w:val="0"/>
+          <w:szCs w:val="22"/>
+          <w14:ligatures w14:val="none"/>
+        </w:rPr>
+        <w:t>–  Findings that have a moderate impact on the security of the system or application and require timely attention</w:t>
       </w:r>
     </w:p>
     <w:p>
@@ -3547,7 +3401,6 @@
         <w:t xml:space="preserve">Start Date: </w:t>
       </w:r>
       <w:bookmarkStart w:id="4" w:name="_Hlk212473124"/>
-      <w:proofErr w:type="gramStart"/>
       <w:r>
         <w:rPr>
           <w:rFonts w:ascii="Corbel" w:eastAsia="Calibri" w:hAnsi="Corbel" w:cs="Arial"/>
@@ -3557,19 +3410,7 @@
           <w:highlight w:val="yellow"/>
           <w14:ligatures w14:val="none"/>
         </w:rPr>
-        <w:t>January,</w:t>
-      </w:r>
-      <w:proofErr w:type="gramEnd"/>
-      <w:r>
-        <w:rPr>
-          <w:rFonts w:ascii="Corbel" w:eastAsia="Calibri" w:hAnsi="Corbel" w:cs="Arial"/>
-          <w:color w:val="FF6633"/>
-          <w:kern w:val="0"/>
-          <w:szCs w:val="22"/>
-          <w:highlight w:val="yellow"/>
-          <w14:ligatures w14:val="none"/>
-        </w:rPr>
-        <w:t xml:space="preserve"> 2026</w:t>
+        <w:t>January, 2026</w:t>
       </w:r>
       <w:bookmarkEnd w:id="4"/>
     </w:p>
@@ -3601,7 +3442,6 @@
         </w:rPr>
         <w:t xml:space="preserve">End Date: </w:t>
       </w:r>
-      <w:proofErr w:type="gramStart"/>
       <w:r>
         <w:rPr>
           <w:rFonts w:ascii="Corbel" w:eastAsia="Calibri" w:hAnsi="Corbel" w:cs="Arial"/>
@@ -3611,19 +3451,7 @@
           <w:highlight w:val="yellow"/>
           <w14:ligatures w14:val="none"/>
         </w:rPr>
-        <w:t>January,</w:t>
-      </w:r>
-      <w:proofErr w:type="gramEnd"/>
-      <w:r>
-        <w:rPr>
-          <w:rFonts w:ascii="Corbel" w:eastAsia="Calibri" w:hAnsi="Corbel" w:cs="Arial"/>
-          <w:color w:val="FF6633"/>
-          <w:kern w:val="0"/>
-          <w:szCs w:val="22"/>
-          <w:highlight w:val="yellow"/>
-          <w14:ligatures w14:val="none"/>
-        </w:rPr>
-        <w:t xml:space="preserve"> 2026</w:t>
+        <w:t>January, 2026</w:t>
       </w:r>
     </w:p>
     <w:p>
@@ -3775,20 +3603,7 @@
           <w14:ligatures w14:val="none"/>
         </w:rPr>
         <w:br/>
-        <w:t xml:space="preserve">HOST </w:t>
-      </w:r>
-      <w:proofErr w:type="gramStart"/>
-      <w:r>
-        <w:rPr>
-          <w:rFonts w:ascii="Corbel" w:eastAsia="Calibri" w:hAnsi="Corbel" w:cs="Arial"/>
-          <w:b/>
-          <w:bCs/>
-          <w:color w:val="404040"/>
-          <w:kern w:val="0"/>
-          <w:szCs w:val="22"/>
-          <w14:ligatures w14:val="none"/>
-        </w:rPr>
-        <w:t xml:space="preserve">DISCOVERY </w:t>
+        <w:t xml:space="preserve">HOST DISCOVERY </w:t>
       </w:r>
       <w:r>
         <w:rPr>
@@ -3815,22 +3630,123 @@
           <w:highlight w:val="yellow"/>
           <w14:ligatures w14:val="none"/>
         </w:rPr>
-        <w:t>INTERNAL</w:t>
-      </w:r>
-      <w:proofErr w:type="gramEnd"/>
+        <w:t>INTERNAL NETWORK ASSESSMENT</w:t>
+      </w:r>
       <w:r>
         <w:rPr>
           <w:rFonts w:ascii="Corbel" w:eastAsia="Calibri" w:hAnsi="Corbel" w:cs="Arial"/>
           <w:b/>
           <w:bCs/>
-          <w:color w:val="F06023"/>
-          <w:kern w:val="0"/>
-          <w:sz w:val="20"/>
-          <w:szCs w:val="20"/>
+          <w:color w:val="404040"/>
+          <w:kern w:val="0"/>
+          <w:szCs w:val="22"/>
+          <w14:ligatures w14:val="none"/>
+        </w:rPr>
+        <w:br/>
+      </w:r>
+      <w:r>
+        <w:rPr>
+          <w:rFonts w:ascii="Corbel" w:eastAsia="Calibri" w:hAnsi="Corbel" w:cs="Arial"/>
+          <w:color w:val="404040"/>
+          <w:kern w:val="0"/>
+          <w:szCs w:val="22"/>
+          <w14:ligatures w14:val="none"/>
+        </w:rPr>
+        <w:t xml:space="preserve">The host discovery phase included port scanning, ping sweeps and more, to identify active systems within the environment. Of the </w:t>
+      </w:r>
+      <w:r>
+        <w:rPr>
+          <w:rFonts w:ascii="Corbel" w:eastAsia="Calibri" w:hAnsi="Corbel" w:cs="Arial"/>
+          <w:color w:val="404040"/>
+          <w:kern w:val="0"/>
+          <w:szCs w:val="22"/>
           <w:highlight w:val="yellow"/>
           <w14:ligatures w14:val="none"/>
         </w:rPr>
-        <w:t xml:space="preserve"> NETWORK ASSESSMENT</w:t>
+        <w:t>one (1) network range</w:t>
+      </w:r>
+      <w:r>
+        <w:rPr>
+          <w:rFonts w:ascii="Corbel" w:eastAsia="Calibri" w:hAnsi="Corbel" w:cs="Arial"/>
+          <w:color w:val="404040"/>
+          <w:kern w:val="0"/>
+          <w:szCs w:val="22"/>
+          <w14:ligatures w14:val="none"/>
+        </w:rPr>
+        <w:t xml:space="preserve"> that was provided as part of scope, OrbitalFire was able to identify a total of </w:t>
+      </w:r>
+      <w:r>
+        <w:rPr>
+          <w:rFonts w:ascii="Corbel" w:eastAsia="Calibri" w:hAnsi="Corbel" w:cs="Arial"/>
+          <w:color w:val="404040"/>
+          <w:kern w:val="0"/>
+          <w:szCs w:val="22"/>
+          <w:highlight w:val="yellow"/>
+          <w14:ligatures w14:val="none"/>
+        </w:rPr>
+        <w:t>one hundred and one (101)</w:t>
+      </w:r>
+      <w:r>
+        <w:rPr>
+          <w:rFonts w:ascii="Corbel" w:eastAsia="Calibri" w:hAnsi="Corbel" w:cs="Arial"/>
+          <w:color w:val="404040"/>
+          <w:kern w:val="0"/>
+          <w:szCs w:val="22"/>
+          <w14:ligatures w14:val="none"/>
+        </w:rPr>
+        <w:t xml:space="preserve"> systems to be active within the targeted environment. In result of the </w:t>
+      </w:r>
+      <w:r>
+        <w:rPr>
+          <w:rFonts w:ascii="Corbel" w:eastAsia="Calibri" w:hAnsi="Corbel" w:cs="Arial"/>
+          <w:color w:val="404040"/>
+          <w:kern w:val="0"/>
+          <w:szCs w:val="22"/>
+          <w:highlight w:val="yellow"/>
+          <w14:ligatures w14:val="none"/>
+        </w:rPr>
+        <w:t>one hundred and one (101)</w:t>
+      </w:r>
+      <w:r>
+        <w:rPr>
+          <w:rFonts w:ascii="Corbel" w:eastAsia="Calibri" w:hAnsi="Corbel" w:cs="Arial"/>
+          <w:color w:val="404040"/>
+          <w:kern w:val="0"/>
+          <w:szCs w:val="22"/>
+          <w14:ligatures w14:val="none"/>
+        </w:rPr>
+        <w:t xml:space="preserve"> addresses that were scanned, OrbitalFire found </w:t>
+      </w:r>
+      <w:r>
+        <w:rPr>
+          <w:rFonts w:ascii="Corbel" w:eastAsia="Calibri" w:hAnsi="Corbel" w:cs="Arial"/>
+          <w:color w:val="404040"/>
+          <w:kern w:val="0"/>
+          <w:szCs w:val="22"/>
+          <w:highlight w:val="yellow"/>
+          <w14:ligatures w14:val="none"/>
+        </w:rPr>
+        <w:t>three hundred and seventy-seven (377)</w:t>
+      </w:r>
+      <w:r>
+        <w:rPr>
+          <w:rFonts w:ascii="Corbel" w:eastAsia="Calibri" w:hAnsi="Corbel" w:cs="Arial"/>
+          <w:color w:val="404040"/>
+          <w:kern w:val="0"/>
+          <w:szCs w:val="22"/>
+          <w14:ligatures w14:val="none"/>
+        </w:rPr>
+        <w:t xml:space="preserve"> open ports.</w:t>
+      </w:r>
+      <w:r>
+        <w:rPr>
+          <w:rFonts w:ascii="Corbel" w:eastAsia="Calibri" w:hAnsi="Corbel" w:cs="Arial"/>
+          <w:color w:val="404040"/>
+          <w:kern w:val="0"/>
+          <w:szCs w:val="22"/>
+          <w14:ligatures w14:val="none"/>
+        </w:rPr>
+        <w:br/>
       </w:r>
       <w:r>
         <w:rPr>
@@ -3843,154 +3759,7 @@
           <w14:ligatures w14:val="none"/>
         </w:rPr>
         <w:br/>
-      </w:r>
-      <w:r>
-        <w:rPr>
-          <w:rFonts w:ascii="Corbel" w:eastAsia="Calibri" w:hAnsi="Corbel" w:cs="Arial"/>
-          <w:color w:val="404040"/>
-          <w:kern w:val="0"/>
-          <w:szCs w:val="22"/>
-          <w14:ligatures w14:val="none"/>
-        </w:rPr>
-        <w:t xml:space="preserve">The host discovery phase included port scanning, ping sweeps and more, to identify active systems within the environment. Of the </w:t>
-      </w:r>
-      <w:r>
-        <w:rPr>
-          <w:rFonts w:ascii="Corbel" w:eastAsia="Calibri" w:hAnsi="Corbel" w:cs="Arial"/>
-          <w:color w:val="404040"/>
-          <w:kern w:val="0"/>
-          <w:szCs w:val="22"/>
-          <w:highlight w:val="yellow"/>
-          <w14:ligatures w14:val="none"/>
-        </w:rPr>
-        <w:t>one (1) network range</w:t>
-      </w:r>
-      <w:r>
-        <w:rPr>
-          <w:rFonts w:ascii="Corbel" w:eastAsia="Calibri" w:hAnsi="Corbel" w:cs="Arial"/>
-          <w:color w:val="404040"/>
-          <w:kern w:val="0"/>
-          <w:szCs w:val="22"/>
-          <w14:ligatures w14:val="none"/>
-        </w:rPr>
-        <w:t xml:space="preserve"> that was provided as part of scope, </w:t>
-      </w:r>
-      <w:proofErr w:type="spellStart"/>
-      <w:r>
-        <w:rPr>
-          <w:rFonts w:ascii="Corbel" w:eastAsia="Calibri" w:hAnsi="Corbel" w:cs="Arial"/>
-          <w:color w:val="404040"/>
-          <w:kern w:val="0"/>
-          <w:szCs w:val="22"/>
-          <w14:ligatures w14:val="none"/>
-        </w:rPr>
-        <w:t>OrbitalFire</w:t>
-      </w:r>
-      <w:proofErr w:type="spellEnd"/>
-      <w:r>
-        <w:rPr>
-          <w:rFonts w:ascii="Corbel" w:eastAsia="Calibri" w:hAnsi="Corbel" w:cs="Arial"/>
-          <w:color w:val="404040"/>
-          <w:kern w:val="0"/>
-          <w:szCs w:val="22"/>
-          <w14:ligatures w14:val="none"/>
-        </w:rPr>
-        <w:t xml:space="preserve"> was able to identify a total of </w:t>
-      </w:r>
-      <w:r>
-        <w:rPr>
-          <w:rFonts w:ascii="Corbel" w:eastAsia="Calibri" w:hAnsi="Corbel" w:cs="Arial"/>
-          <w:color w:val="404040"/>
-          <w:kern w:val="0"/>
-          <w:szCs w:val="22"/>
-          <w:highlight w:val="yellow"/>
-          <w14:ligatures w14:val="none"/>
-        </w:rPr>
-        <w:t>one hundred and one (101)</w:t>
-      </w:r>
-      <w:r>
-        <w:rPr>
-          <w:rFonts w:ascii="Corbel" w:eastAsia="Calibri" w:hAnsi="Corbel" w:cs="Arial"/>
-          <w:color w:val="404040"/>
-          <w:kern w:val="0"/>
-          <w:szCs w:val="22"/>
-          <w14:ligatures w14:val="none"/>
-        </w:rPr>
-        <w:t xml:space="preserve"> systems to be active within the targeted environment. In result of the </w:t>
-      </w:r>
-      <w:r>
-        <w:rPr>
-          <w:rFonts w:ascii="Corbel" w:eastAsia="Calibri" w:hAnsi="Corbel" w:cs="Arial"/>
-          <w:color w:val="404040"/>
-          <w:kern w:val="0"/>
-          <w:szCs w:val="22"/>
-          <w:highlight w:val="yellow"/>
-          <w14:ligatures w14:val="none"/>
-        </w:rPr>
-        <w:t>one hundred and one (101)</w:t>
-      </w:r>
-      <w:r>
-        <w:rPr>
-          <w:rFonts w:ascii="Corbel" w:eastAsia="Calibri" w:hAnsi="Corbel" w:cs="Arial"/>
-          <w:color w:val="404040"/>
-          <w:kern w:val="0"/>
-          <w:szCs w:val="22"/>
-          <w14:ligatures w14:val="none"/>
-        </w:rPr>
-        <w:t xml:space="preserve"> addresses that were scanned, </w:t>
-      </w:r>
-      <w:proofErr w:type="spellStart"/>
-      <w:r>
-        <w:rPr>
-          <w:rFonts w:ascii="Corbel" w:eastAsia="Calibri" w:hAnsi="Corbel" w:cs="Arial"/>
-          <w:color w:val="404040"/>
-          <w:kern w:val="0"/>
-          <w:szCs w:val="22"/>
-          <w14:ligatures w14:val="none"/>
-        </w:rPr>
-        <w:t>OrbitalFire</w:t>
-      </w:r>
-      <w:proofErr w:type="spellEnd"/>
-      <w:r>
-        <w:rPr>
-          <w:rFonts w:ascii="Corbel" w:eastAsia="Calibri" w:hAnsi="Corbel" w:cs="Arial"/>
-          <w:color w:val="404040"/>
-          <w:kern w:val="0"/>
-          <w:szCs w:val="22"/>
-          <w14:ligatures w14:val="none"/>
-        </w:rPr>
-        <w:t xml:space="preserve"> found </w:t>
-      </w:r>
-      <w:r>
-        <w:rPr>
-          <w:rFonts w:ascii="Corbel" w:eastAsia="Calibri" w:hAnsi="Corbel" w:cs="Arial"/>
-          <w:color w:val="404040"/>
-          <w:kern w:val="0"/>
-          <w:szCs w:val="22"/>
-          <w:highlight w:val="yellow"/>
-          <w14:ligatures w14:val="none"/>
-        </w:rPr>
-        <w:t>three hundred and seventy-seven (377)</w:t>
-      </w:r>
-      <w:r>
-        <w:rPr>
-          <w:rFonts w:ascii="Corbel" w:eastAsia="Calibri" w:hAnsi="Corbel" w:cs="Arial"/>
-          <w:color w:val="404040"/>
-          <w:kern w:val="0"/>
-          <w:szCs w:val="22"/>
-          <w14:ligatures w14:val="none"/>
-        </w:rPr>
-        <w:t xml:space="preserve"> open ports.</w:t>
-      </w:r>
-      <w:r>
-        <w:rPr>
-          <w:rFonts w:ascii="Corbel" w:eastAsia="Calibri" w:hAnsi="Corbel" w:cs="Arial"/>
-          <w:color w:val="404040"/>
-          <w:kern w:val="0"/>
-          <w:szCs w:val="22"/>
-          <w14:ligatures w14:val="none"/>
-        </w:rPr>
-        <w:br/>
+        <w:t>ENUMERATION</w:t>
       </w:r>
       <w:r>
         <w:rPr>
@@ -4003,7 +3772,36 @@
           <w14:ligatures w14:val="none"/>
         </w:rPr>
         <w:br/>
-        <w:t>ENUMERATION</w:t>
+      </w:r>
+      <w:r>
+        <w:rPr>
+          <w:rFonts w:ascii="Corbel" w:eastAsia="Calibri" w:hAnsi="Corbel" w:cs="Arial"/>
+          <w:color w:val="404040"/>
+          <w:kern w:val="0"/>
+          <w:szCs w:val="22"/>
+          <w14:ligatures w14:val="none"/>
+        </w:rPr>
+        <w:t>After the identification of all available hosts within the network, OrbitalFire then conducted enumeration. Enumeration during this assessment consisted of scanning the identified ports to determine which services are running (if any). Additional scans were then performed based on running services to attempt enumerating information (if possible).</w:t>
+      </w:r>
+      <w:r>
+        <w:rPr>
+          <w:rFonts w:ascii="Corbel" w:eastAsia="Calibri" w:hAnsi="Corbel" w:cs="Arial"/>
+          <w:color w:val="404040"/>
+          <w:kern w:val="0"/>
+          <w:szCs w:val="22"/>
+          <w14:ligatures w14:val="none"/>
+        </w:rPr>
+        <w:br/>
+      </w:r>
+      <w:r>
+        <w:rPr>
+          <w:rFonts w:ascii="Corbel" w:eastAsia="Calibri" w:hAnsi="Corbel" w:cs="Arial"/>
+          <w:color w:val="404040"/>
+          <w:kern w:val="0"/>
+          <w:szCs w:val="22"/>
+          <w14:ligatures w14:val="none"/>
+        </w:rPr>
+        <w:br/>
       </w:r>
       <w:r>
         <w:rPr>
@@ -4015,59 +3813,7 @@
           <w:szCs w:val="22"/>
           <w14:ligatures w14:val="none"/>
         </w:rPr>
-        <w:br/>
-      </w:r>
-      <w:r>
-        <w:rPr>
-          <w:rFonts w:ascii="Corbel" w:eastAsia="Calibri" w:hAnsi="Corbel" w:cs="Arial"/>
-          <w:color w:val="404040"/>
-          <w:kern w:val="0"/>
-          <w:szCs w:val="22"/>
-          <w14:ligatures w14:val="none"/>
-        </w:rPr>
-        <w:t xml:space="preserve">After the identification of all available hosts within the network, </w:t>
-      </w:r>
-      <w:proofErr w:type="spellStart"/>
-      <w:r>
-        <w:rPr>
-          <w:rFonts w:ascii="Corbel" w:eastAsia="Calibri" w:hAnsi="Corbel" w:cs="Arial"/>
-          <w:color w:val="404040"/>
-          <w:kern w:val="0"/>
-          <w:szCs w:val="22"/>
-          <w14:ligatures w14:val="none"/>
-        </w:rPr>
-        <w:t>OrbitalFire</w:t>
-      </w:r>
-      <w:proofErr w:type="spellEnd"/>
-      <w:r>
-        <w:rPr>
-          <w:rFonts w:ascii="Corbel" w:eastAsia="Calibri" w:hAnsi="Corbel" w:cs="Arial"/>
-          <w:color w:val="404040"/>
-          <w:kern w:val="0"/>
-          <w:szCs w:val="22"/>
-          <w14:ligatures w14:val="none"/>
-        </w:rPr>
-        <w:t xml:space="preserve"> then conducted enumeration. Enumeration during this assessment consisted of scanning the identified ports to determine which services are running (if any). Additional scans were then performed based on running services to attempt enumerating information (if possible).</w:t>
-      </w:r>
-      <w:r>
-        <w:rPr>
-          <w:rFonts w:ascii="Corbel" w:eastAsia="Calibri" w:hAnsi="Corbel" w:cs="Arial"/>
-          <w:color w:val="404040"/>
-          <w:kern w:val="0"/>
-          <w:szCs w:val="22"/>
-          <w14:ligatures w14:val="none"/>
-        </w:rPr>
-        <w:br/>
-      </w:r>
-      <w:r>
-        <w:rPr>
-          <w:rFonts w:ascii="Corbel" w:eastAsia="Calibri" w:hAnsi="Corbel" w:cs="Arial"/>
-          <w:color w:val="404040"/>
-          <w:kern w:val="0"/>
-          <w:szCs w:val="22"/>
-          <w14:ligatures w14:val="none"/>
-        </w:rPr>
-        <w:br/>
+        <w:t>EXPLOITATION</w:t>
       </w:r>
       <w:r>
         <w:rPr>
@@ -4079,7 +3825,58 @@
           <w:szCs w:val="22"/>
           <w14:ligatures w14:val="none"/>
         </w:rPr>
-        <w:t>EXPLOITATION</w:t>
+        <w:br/>
+      </w:r>
+      <w:r>
+        <w:rPr>
+          <w:rFonts w:ascii="Corbel" w:eastAsia="Calibri" w:hAnsi="Corbel" w:cs="Arial"/>
+          <w:color w:val="404040"/>
+          <w:kern w:val="0"/>
+          <w:szCs w:val="22"/>
+          <w14:ligatures w14:val="none"/>
+        </w:rPr>
+        <w:t xml:space="preserve">Post enumeration, OrbitalFire focused strictly on the exploitation of any/all running services that were previously discovered. OrbitalFire used a comprehensive set of tools, custom scripts, and manual techniques to thoroughly identify possible threats to </w:t>
+      </w:r>
+      <w:r>
+        <w:rPr>
+          <w:rFonts w:ascii="Corbel" w:eastAsia="Calibri" w:hAnsi="Corbel" w:cs="Arial"/>
+          <w:color w:val="404040"/>
+          <w:kern w:val="0"/>
+          <w:szCs w:val="22"/>
+          <w:highlight w:val="yellow"/>
+          <w14:ligatures w14:val="none"/>
+        </w:rPr>
+        <w:t>DEMO’s</w:t>
+      </w:r>
+      <w:r>
+        <w:rPr>
+          <w:rFonts w:ascii="Corbel" w:eastAsia="Calibri" w:hAnsi="Corbel" w:cs="Arial"/>
+          <w:color w:val="404040"/>
+          <w:kern w:val="0"/>
+          <w:szCs w:val="22"/>
+          <w14:ligatures w14:val="none"/>
+        </w:rPr>
+        <w:t xml:space="preserve"> environment.</w:t>
+      </w:r>
+      <w:r>
+        <w:rPr>
+          <w:rFonts w:ascii="Corbel" w:eastAsia="Calibri" w:hAnsi="Corbel" w:cs="Arial"/>
+          <w:color w:val="404040"/>
+          <w:kern w:val="0"/>
+          <w:szCs w:val="22"/>
+          <w14:ligatures w14:val="none"/>
+        </w:rPr>
+        <w:br/>
+      </w:r>
+      <w:r>
+        <w:rPr>
+          <w:rFonts w:ascii="Corbel" w:eastAsia="Calibri" w:hAnsi="Corbel" w:cs="Arial"/>
+          <w:color w:val="404040"/>
+          <w:kern w:val="0"/>
+          <w:szCs w:val="22"/>
+          <w14:ligatures w14:val="none"/>
+        </w:rPr>
+        <w:br/>
       </w:r>
       <w:r>
         <w:rPr>
@@ -4091,102 +3888,7 @@
           <w:szCs w:val="22"/>
           <w14:ligatures w14:val="none"/>
         </w:rPr>
-        <w:br/>
-      </w:r>
-      <w:r>
-        <w:rPr>
-          <w:rFonts w:ascii="Corbel" w:eastAsia="Calibri" w:hAnsi="Corbel" w:cs="Arial"/>
-          <w:color w:val="404040"/>
-          <w:kern w:val="0"/>
-          <w:szCs w:val="22"/>
-          <w14:ligatures w14:val="none"/>
-        </w:rPr>
-        <w:t xml:space="preserve">Post enumeration, </w:t>
-      </w:r>
-      <w:proofErr w:type="spellStart"/>
-      <w:r>
-        <w:rPr>
-          <w:rFonts w:ascii="Corbel" w:eastAsia="Calibri" w:hAnsi="Corbel" w:cs="Arial"/>
-          <w:color w:val="404040"/>
-          <w:kern w:val="0"/>
-          <w:szCs w:val="22"/>
-          <w14:ligatures w14:val="none"/>
-        </w:rPr>
-        <w:t>OrbitalFire</w:t>
-      </w:r>
-      <w:proofErr w:type="spellEnd"/>
-      <w:r>
-        <w:rPr>
-          <w:rFonts w:ascii="Corbel" w:eastAsia="Calibri" w:hAnsi="Corbel" w:cs="Arial"/>
-          <w:color w:val="404040"/>
-          <w:kern w:val="0"/>
-          <w:szCs w:val="22"/>
-          <w14:ligatures w14:val="none"/>
-        </w:rPr>
-        <w:t xml:space="preserve"> focused strictly on the exploitation of any/all running services that were previously discovered. </w:t>
-      </w:r>
-      <w:proofErr w:type="spellStart"/>
-      <w:r>
-        <w:rPr>
-          <w:rFonts w:ascii="Corbel" w:eastAsia="Calibri" w:hAnsi="Corbel" w:cs="Arial"/>
-          <w:color w:val="404040"/>
-          <w:kern w:val="0"/>
-          <w:szCs w:val="22"/>
-          <w14:ligatures w14:val="none"/>
-        </w:rPr>
-        <w:t>OrbitalFire</w:t>
-      </w:r>
-      <w:proofErr w:type="spellEnd"/>
-      <w:r>
-        <w:rPr>
-          <w:rFonts w:ascii="Corbel" w:eastAsia="Calibri" w:hAnsi="Corbel" w:cs="Arial"/>
-          <w:color w:val="404040"/>
-          <w:kern w:val="0"/>
-          <w:szCs w:val="22"/>
-          <w14:ligatures w14:val="none"/>
-        </w:rPr>
-        <w:t xml:space="preserve"> used a comprehensive set of tools, custom scripts, and manual techniques to thoroughly identify possible threats to </w:t>
-      </w:r>
-      <w:r>
-        <w:rPr>
-          <w:rFonts w:ascii="Corbel" w:eastAsia="Calibri" w:hAnsi="Corbel" w:cs="Arial"/>
-          <w:color w:val="404040"/>
-          <w:kern w:val="0"/>
-          <w:szCs w:val="22"/>
-          <w:highlight w:val="yellow"/>
-          <w14:ligatures w14:val="none"/>
-        </w:rPr>
-        <w:t>DEMO’s</w:t>
-      </w:r>
-      <w:r>
-        <w:rPr>
-          <w:rFonts w:ascii="Corbel" w:eastAsia="Calibri" w:hAnsi="Corbel" w:cs="Arial"/>
-          <w:color w:val="404040"/>
-          <w:kern w:val="0"/>
-          <w:szCs w:val="22"/>
-          <w14:ligatures w14:val="none"/>
-        </w:rPr>
-        <w:t xml:space="preserve"> environment.</w:t>
-      </w:r>
-      <w:r>
-        <w:rPr>
-          <w:rFonts w:ascii="Corbel" w:eastAsia="Calibri" w:hAnsi="Corbel" w:cs="Arial"/>
-          <w:color w:val="404040"/>
-          <w:kern w:val="0"/>
-          <w:szCs w:val="22"/>
-          <w14:ligatures w14:val="none"/>
-        </w:rPr>
-        <w:br/>
-      </w:r>
-      <w:r>
-        <w:rPr>
-          <w:rFonts w:ascii="Corbel" w:eastAsia="Calibri" w:hAnsi="Corbel" w:cs="Arial"/>
-          <w:color w:val="404040"/>
-          <w:kern w:val="0"/>
-          <w:szCs w:val="22"/>
-          <w14:ligatures w14:val="none"/>
-        </w:rPr>
-        <w:br/>
+        <w:t>POST EXPLOITATION</w:t>
       </w:r>
       <w:r>
         <w:rPr>
@@ -4198,18 +3900,6 @@
           <w:szCs w:val="22"/>
           <w14:ligatures w14:val="none"/>
         </w:rPr>
-        <w:t>POST EXPLOITATION</w:t>
-      </w:r>
-      <w:r>
-        <w:rPr>
-          <w:rFonts w:ascii="Corbel" w:eastAsia="Calibri" w:hAnsi="Corbel" w:cs="Arial"/>
-          <w:b/>
-          <w:bCs/>
-          <w:color w:val="404040"/>
-          <w:kern w:val="0"/>
-          <w:szCs w:val="22"/>
-          <w14:ligatures w14:val="none"/>
-        </w:rPr>
         <w:br/>
       </w:r>
       <w:r>
@@ -4220,29 +3910,7 @@
           <w:szCs w:val="22"/>
           <w14:ligatures w14:val="none"/>
         </w:rPr>
-        <w:t xml:space="preserve">Once the exploitation phase was complete, </w:t>
-      </w:r>
-      <w:proofErr w:type="spellStart"/>
-      <w:r>
-        <w:rPr>
-          <w:rFonts w:ascii="Corbel" w:eastAsia="Calibri" w:hAnsi="Corbel" w:cs="Arial"/>
-          <w:color w:val="404040"/>
-          <w:kern w:val="0"/>
-          <w:szCs w:val="22"/>
-          <w14:ligatures w14:val="none"/>
-        </w:rPr>
-        <w:t>OrbitalFire</w:t>
-      </w:r>
-      <w:proofErr w:type="spellEnd"/>
-      <w:r>
-        <w:rPr>
-          <w:rFonts w:ascii="Corbel" w:eastAsia="Calibri" w:hAnsi="Corbel" w:cs="Arial"/>
-          <w:color w:val="404040"/>
-          <w:kern w:val="0"/>
-          <w:szCs w:val="22"/>
-          <w14:ligatures w14:val="none"/>
-        </w:rPr>
-        <w:t xml:space="preserve"> then tested and validated all identified threats to evaluate the depth of compromise.</w:t>
+        <w:t>Once the exploitation phase was complete, OrbitalFire then tested and validated all identified threats to evaluate the depth of compromise.</w:t>
       </w:r>
       <w:r>
         <w:rPr>
@@ -4503,29 +4171,7 @@
           <w:szCs w:val="22"/>
           <w14:ligatures w14:val="none"/>
         </w:rPr>
-        <w:t xml:space="preserve">To summarize the results of this assessment, </w:t>
-      </w:r>
-      <w:proofErr w:type="spellStart"/>
-      <w:r>
-        <w:rPr>
-          <w:rFonts w:ascii="Corbel" w:eastAsia="Calibri" w:hAnsi="Corbel" w:cs="Arial"/>
-          <w:color w:val="404040"/>
-          <w:kern w:val="0"/>
-          <w:szCs w:val="22"/>
-          <w14:ligatures w14:val="none"/>
-        </w:rPr>
-        <w:t>OrbitalFire</w:t>
-      </w:r>
-      <w:proofErr w:type="spellEnd"/>
-      <w:r>
-        <w:rPr>
-          <w:rFonts w:ascii="Corbel" w:eastAsia="Calibri" w:hAnsi="Corbel" w:cs="Arial"/>
-          <w:color w:val="404040"/>
-          <w:kern w:val="0"/>
-          <w:szCs w:val="22"/>
-          <w14:ligatures w14:val="none"/>
-        </w:rPr>
-        <w:t xml:space="preserve"> has grouped all findings from the penetration test into rollup findings. These rollup findings can be used to quickly determine the root cause of all issues identified in this assessment. It is highly recommended to implement a remediation strategy based on the rollup findings below to enhance security posture and overall defensibility.</w:t>
+        <w:t>To summarize the results of this assessment, OrbitalFire has grouped all findings from the penetration test into rollup findings. These rollup findings can be used to quickly determine the root cause of all issues identified in this assessment. It is highly recommended to implement a remediation strategy based on the rollup findings below to enhance security posture and overall defensibility.</w:t>
       </w:r>
     </w:p>
     <w:p>
@@ -4700,15 +4346,7 @@
         <w:t xml:space="preserve">Finding Description: </w:t>
       </w:r>
       <w:r>
-        <w:t xml:space="preserve">During testing, OrbitalFire identified that [CUSTOMER NAME] has a misconfigured DMARC (Domain-based Message Authentication, Reporting, and Conformance) record for one or more of their </w:t>
-      </w:r>
-      <w:proofErr w:type="gramStart"/>
-      <w:r>
-        <w:t>domain</w:t>
-      </w:r>
-      <w:proofErr w:type="gramEnd"/>
-      <w:r>
-        <w:t>(s). DMARC is critical for verifying the authenticity of emails sent from the organization, serving as a vital barrier against email spoofing and phishing attacks. Without proper configuration, DMARC fails to instruct receiving mail servers on how to treat email messages from the organization's domain, thereby increasing vulnerability to attack.</w:t>
+        <w:t>During testing, OrbitalFire identified that [CUSTOMER NAME] has a misconfigured DMARC (Domain-based Message Authentication, Reporting, and Conformance) record for one or more of their domain(s). DMARC is critical for verifying the authenticity of emails sent from the organization, serving as a vital barrier against email spoofing and phishing attacks. Without proper configuration, DMARC fails to instruct receiving mail servers on how to treat email messages from the organization's domain, thereby increasing vulnerability to attack.</w:t>
       </w:r>
     </w:p>
     <w:p>
@@ -4719,15 +4357,7 @@
         <w:t xml:space="preserve">Recommendation: </w:t>
       </w:r>
       <w:r>
-        <w:t xml:space="preserve">Reconfigure DMARC Record </w:t>
-      </w:r>
-      <w:proofErr w:type="gramStart"/>
-      <w:r>
-        <w:t>–  Review</w:t>
-      </w:r>
-      <w:proofErr w:type="gramEnd"/>
-      <w:r>
-        <w:t xml:space="preserve"> and rectify the current DMARC record configuration. The DMARC policy should be explicitly defined, ideally set to "quarantine" or "reject," which directs receiving mail servers on the proper handling of unauthenticated messages.</w:t>
+        <w:t>Reconfigure DMARC Record –  Review and rectify the current DMARC record configuration. The DMARC policy should be explicitly defined, ideally set to "quarantine" or "reject," which directs receiving mail servers on the proper handling of unauthenticated messages.</w:t>
       </w:r>
     </w:p>
     <w:p/>
@@ -4772,6 +4402,8 @@
         <w:t>Remediate Subdomain Takeover Exposure – Identify and remove misconfigured or stale DNS records that reference unclaimed or deprovisioned third-party services. Conduct a comprehensive review of all DNS entries to ensure they accurately map to active, authorized resources, and implement continuous monitoring to detect future misconfigurations. Where applicable, apply DNS security best practices such as DNSSEC and maintain proper lifecycle management of external service integrations to prevent unauthorized subdomain claims.</w:t>
       </w:r>
     </w:p>
+    <w:p/>
+    <w:p/>
     <w:p/>
     <w:p>
       <w:pPr>
@@ -4957,7 +4589,6 @@
         <w:t xml:space="preserve">testing against targeted domains, </w:t>
       </w:r>
       <w:bookmarkStart w:id="12" w:name="_Hlk212473705"/>
-      <w:proofErr w:type="gramStart"/>
       <w:r>
         <w:rPr>
           <w:rFonts w:ascii="Corbel" w:eastAsia="Calibri" w:hAnsi="Corbel" w:cs="Arial"/>
@@ -4967,19 +4598,7 @@
           <w:highlight w:val="yellow"/>
           <w14:ligatures w14:val="none"/>
         </w:rPr>
-        <w:t>NUMBER (#</w:t>
-      </w:r>
-      <w:proofErr w:type="gramEnd"/>
-      <w:r>
-        <w:rPr>
-          <w:rFonts w:ascii="Corbel" w:eastAsia="Calibri" w:hAnsi="Corbel" w:cs="Arial"/>
-          <w:color w:val="404040"/>
-          <w:kern w:val="0"/>
-          <w:szCs w:val="22"/>
-          <w:highlight w:val="yellow"/>
-          <w14:ligatures w14:val="none"/>
-        </w:rPr>
-        <w:t>)</w:t>
+        <w:t>NUMBER (#)</w:t>
       </w:r>
       <w:r>
         <w:rPr>
@@ -6167,51 +5786,7 @@
           <w:szCs w:val="22"/>
           <w14:ligatures w14:val="none"/>
         </w:rPr>
-        <w:t xml:space="preserve">The following items are the </w:t>
-      </w:r>
-      <w:proofErr w:type="gramStart"/>
-      <w:r>
-        <w:rPr>
-          <w:rFonts w:ascii="Corbel" w:eastAsia="Calibri" w:hAnsi="Corbel" w:cs="Arial"/>
-          <w:color w:val="404040"/>
-          <w:kern w:val="0"/>
-          <w:szCs w:val="22"/>
-          <w14:ligatures w14:val="none"/>
-        </w:rPr>
-        <w:t>highest priority</w:t>
-      </w:r>
-      <w:proofErr w:type="gramEnd"/>
-      <w:r>
-        <w:rPr>
-          <w:rFonts w:ascii="Corbel" w:eastAsia="Calibri" w:hAnsi="Corbel" w:cs="Arial"/>
-          <w:color w:val="404040"/>
-          <w:kern w:val="0"/>
-          <w:szCs w:val="22"/>
-          <w14:ligatures w14:val="none"/>
-        </w:rPr>
-        <w:t xml:space="preserve"> recommendations to help improve compliance, defensibility and resilience. These items may not be fully inclusive of all discovered deficiencies and reflect </w:t>
-      </w:r>
-      <w:proofErr w:type="spellStart"/>
-      <w:r>
-        <w:rPr>
-          <w:rFonts w:ascii="Corbel" w:eastAsia="Calibri" w:hAnsi="Corbel" w:cs="Arial"/>
-          <w:color w:val="404040"/>
-          <w:kern w:val="0"/>
-          <w:szCs w:val="22"/>
-          <w14:ligatures w14:val="none"/>
-        </w:rPr>
-        <w:t>OrbitalFire’s</w:t>
-      </w:r>
-      <w:proofErr w:type="spellEnd"/>
-      <w:r>
-        <w:rPr>
-          <w:rFonts w:ascii="Corbel" w:eastAsia="Calibri" w:hAnsi="Corbel" w:cs="Arial"/>
-          <w:color w:val="404040"/>
-          <w:kern w:val="0"/>
-          <w:szCs w:val="22"/>
-          <w14:ligatures w14:val="none"/>
-        </w:rPr>
-        <w:t xml:space="preserve"> expert opinion regarding return on investment.</w:t>
+        <w:t>The following items are the highest priority recommendations to help improve compliance, defensibility and resilience. These items may not be fully inclusive of all discovered deficiencies and reflect OrbitalFire’s expert opinion regarding return on investment.</w:t>
       </w:r>
     </w:p>
     <w:p>
@@ -6294,29 +5869,7 @@
           <w:szCs w:val="22"/>
           <w14:ligatures w14:val="none"/>
         </w:rPr>
-        <w:t xml:space="preserve"> – </w:t>
-      </w:r>
-      <w:proofErr w:type="spellStart"/>
-      <w:r>
-        <w:rPr>
-          <w:rFonts w:ascii="Corbel" w:eastAsia="Calibri" w:hAnsi="Corbel" w:cs="Arial"/>
-          <w:color w:val="404040"/>
-          <w:kern w:val="0"/>
-          <w:szCs w:val="22"/>
-          <w14:ligatures w14:val="none"/>
-        </w:rPr>
-        <w:t>OrbitalFire</w:t>
-      </w:r>
-      <w:proofErr w:type="spellEnd"/>
-      <w:r>
-        <w:rPr>
-          <w:rFonts w:ascii="Corbel" w:eastAsia="Calibri" w:hAnsi="Corbel" w:cs="Arial"/>
-          <w:color w:val="404040"/>
-          <w:kern w:val="0"/>
-          <w:szCs w:val="22"/>
-          <w14:ligatures w14:val="none"/>
-        </w:rPr>
-        <w:t xml:space="preserve"> can provide complete remediation</w:t>
+        <w:t xml:space="preserve"> – OrbitalFire can provide complete remediation</w:t>
       </w:r>
     </w:p>
     <w:p>
@@ -6343,7 +5896,7 @@
           <w14:ligatures w14:val="none"/>
         </w:rPr>
         <w:drawing>
-          <wp:inline distT="0" distB="0" distL="0" distR="0" wp14:anchorId="03962334" wp14:editId="3E91DC9D">
+          <wp:inline distT="0" distB="0" distL="0" distR="0" wp14:anchorId="03962334" wp14:editId="4A8D2402">
             <wp:extent cx="152400" cy="152400"/>
             <wp:effectExtent l="0" t="0" r="0" b="0"/>
             <wp:docPr id="2011428596" name="Picture 2011428596" descr="Fire with solid fill"/>
@@ -6408,29 +5961,7 @@
           <w:szCs w:val="22"/>
           <w14:ligatures w14:val="none"/>
         </w:rPr>
-        <w:t xml:space="preserve"> – </w:t>
-      </w:r>
-      <w:proofErr w:type="spellStart"/>
-      <w:r>
-        <w:rPr>
-          <w:rFonts w:ascii="Corbel" w:eastAsia="Calibri" w:hAnsi="Corbel" w:cs="Arial"/>
-          <w:color w:val="404040"/>
-          <w:kern w:val="0"/>
-          <w:szCs w:val="22"/>
-          <w14:ligatures w14:val="none"/>
-        </w:rPr>
-        <w:t>OrbitalFire</w:t>
-      </w:r>
-      <w:proofErr w:type="spellEnd"/>
-      <w:r>
-        <w:rPr>
-          <w:rFonts w:ascii="Corbel" w:eastAsia="Calibri" w:hAnsi="Corbel" w:cs="Arial"/>
-          <w:color w:val="404040"/>
-          <w:kern w:val="0"/>
-          <w:szCs w:val="22"/>
-          <w14:ligatures w14:val="none"/>
-        </w:rPr>
-        <w:t xml:space="preserve"> can assist with remediation</w:t>
+        <w:t xml:space="preserve"> – OrbitalFire can assist with remediation</w:t>
       </w:r>
       <w:bookmarkStart w:id="15" w:name="_Hlk194407007"/>
     </w:p>
@@ -6477,7 +6008,7 @@
           <w:noProof/>
         </w:rPr>
         <w:drawing>
-          <wp:inline distT="0" distB="0" distL="0" distR="0" wp14:anchorId="2F2087C7" wp14:editId="0E05B0B1">
+          <wp:inline distT="0" distB="0" distL="0" distR="0" wp14:anchorId="32FE4446" wp14:editId="5F8E08DF">
             <wp:extent cx="152400" cy="152400"/>
             <wp:effectExtent l="0" t="0" r="0" b="0"/>
             <wp:docPr id="2011428597" name="Picture 2011428597"/>
@@ -6547,7 +6078,7 @@
           <w:noProof/>
         </w:rPr>
         <w:drawing>
-          <wp:inline distT="0" distB="0" distL="0" distR="0" wp14:anchorId="0B583026" wp14:editId="513BDDF9">
+          <wp:inline distT="0" distB="0" distL="0" distR="0" wp14:anchorId="66F72BE0" wp14:editId="335B1A8D">
             <wp:extent cx="152400" cy="152400"/>
             <wp:effectExtent l="0" t="0" r="0" b="0"/>
             <wp:docPr id="2011428598" name="Picture 2011428598"/>
@@ -6617,7 +6148,7 @@
           <w:noProof/>
         </w:rPr>
         <w:drawing>
-          <wp:inline distT="0" distB="0" distL="0" distR="0" wp14:anchorId="00BF6DD5" wp14:editId="4AE525B9">
+          <wp:inline distT="0" distB="0" distL="0" distR="0" wp14:anchorId="49165576" wp14:editId="78D95938">
             <wp:extent cx="152400" cy="152400"/>
             <wp:effectExtent l="0" t="0" r="0" b="0"/>
             <wp:docPr id="2011428599" name="Picture 2011428599"/>
@@ -6792,7 +6323,7 @@
           <w:noProof/>
         </w:rPr>
         <w:drawing>
-          <wp:inline distT="0" distB="0" distL="0" distR="0" wp14:anchorId="53E4FD87" wp14:editId="12DF08C0">
+          <wp:inline distT="0" distB="0" distL="0" distR="0" wp14:anchorId="4540B2E1" wp14:editId="5E1B2D31">
             <wp:extent cx="5943600" cy="830317"/>
             <wp:effectExtent l="0" t="0" r="0" b="0"/>
             <wp:docPr id="2011428600" name="Picture 2011428600"/>
@@ -6827,6 +6358,16 @@
           </wp:inline>
         </w:drawing>
       </w:r>
+    </w:p>
+    <w:p>
+      <w:pPr>
+        <w:spacing w:after="120"/>
+      </w:pPr>
+    </w:p>
+    <w:p>
+      <w:pPr>
+        <w:spacing w:after="120"/>
+      </w:pPr>
     </w:p>
     <w:p>
       <w:pPr>

</xml_diff>

<commit_message>
refactored findings reports to be a requirement
</commit_message>
<xml_diff>
--- a/Source_Code/Reports/Sample499/FindingsReportTest.docx
+++ b/Source_Code/Reports/Sample499/FindingsReportTest.docx
@@ -4632,6 +4632,135 @@
         <w:t>findings details</w:t>
       </w:r>
       <w:bookmarkEnd w:id="7"/>
+    </w:p>
+    <w:p>
+      <w:r>
+        <w:rPr>
+          <w:b/>
+          <w:sz w:val="26"/>
+        </w:rPr>
+        <w:t>Remote SSH Service Exposed to Public Internet</w:t>
+      </w:r>
+    </w:p>
+    <w:p>
+      <w:r>
+        <w:rPr>
+          <w:b/>
+          <w:sz w:val="22"/>
+        </w:rPr>
+        <w:t>Risk Level: Medium</w:t>
+      </w:r>
+    </w:p>
+    <w:p>
+      <w:r>
+        <w:rPr>
+          <w:b/>
+        </w:rPr>
+        <w:t xml:space="preserve">Finding Description: </w:t>
+      </w:r>
+      <w:r>
+        <w:t>During testing, OrbitalFire identified that remote administration services, including SSH, were exposed to the public internet. This exposure is often the result of misconfiguration or insufficient access controls, which significantly increase the attack surface. Publicly accessible SSH services are susceptible to brute-force and password-guessing attacks, which may lead to unauthorized system access. Additionally, newly disclosed vulnerabilities, including zero-day exploits, could be leveraged by threat actors to further compromise exposed systems.</w:t>
+      </w:r>
+    </w:p>
+    <w:p>
+      <w:r>
+        <w:rPr>
+          <w:b/>
+        </w:rPr>
+        <w:t xml:space="preserve">Recommendation: </w:t>
+      </w:r>
+      <w:r>
+        <w:t>Restrict Access to Remote SSH – Restrict access from the public Internet. Ensure that the Remote SSH service is only reachable through secure environments, such as a Virtual Private Network (VPN) or specific authorized IP address configurations.</w:t>
+      </w:r>
+    </w:p>
+    <w:p>
+      <w:r/>
+    </w:p>
+    <w:p>
+      <w:r>
+        <w:rPr>
+          <w:b/>
+          <w:sz w:val="26"/>
+        </w:rPr>
+        <w:t>Misconfigured DMARC Record</w:t>
+      </w:r>
+    </w:p>
+    <w:p>
+      <w:r>
+        <w:rPr>
+          <w:b/>
+          <w:sz w:val="22"/>
+        </w:rPr>
+        <w:t>Risk Level: Medium</w:t>
+      </w:r>
+    </w:p>
+    <w:p>
+      <w:r>
+        <w:rPr>
+          <w:b/>
+        </w:rPr>
+        <w:t xml:space="preserve">Finding Description: </w:t>
+      </w:r>
+      <w:r>
+        <w:t>During testing, OrbitalFire identified that [CUSTOMER NAME] has a misconfigured DMARC (Domain-based Message Authentication, Reporting, and Conformance) record for one or more of their domain(s). DMARC is critical for verifying the authenticity of emails sent from the organization, serving as a vital barrier against email spoofing and phishing attacks. Without proper configuration, DMARC fails to instruct receiving mail servers on how to treat email messages from the organization's domain, thereby increasing vulnerability to attack.</w:t>
+      </w:r>
+    </w:p>
+    <w:p>
+      <w:r>
+        <w:rPr>
+          <w:b/>
+        </w:rPr>
+        <w:t xml:space="preserve">Recommendation: </w:t>
+      </w:r>
+      <w:r>
+        <w:t>Reconfigure DMARC Record –  Review and rectify the current DMARC record configuration. The DMARC policy should be explicitly defined, ideally set to "quarantine" or "reject," which directs receiving mail servers on the proper handling of unauthenticated messages.</w:t>
+      </w:r>
+    </w:p>
+    <w:p>
+      <w:r/>
+    </w:p>
+    <w:p>
+      <w:r>
+        <w:rPr>
+          <w:b/>
+          <w:sz w:val="26"/>
+        </w:rPr>
+        <w:t>Subdomain Takeover Vulnerability</w:t>
+      </w:r>
+    </w:p>
+    <w:p>
+      <w:r>
+        <w:rPr>
+          <w:b/>
+          <w:sz w:val="22"/>
+        </w:rPr>
+        <w:t>Risk Level: High</w:t>
+      </w:r>
+    </w:p>
+    <w:p>
+      <w:r>
+        <w:rPr>
+          <w:b/>
+        </w:rPr>
+        <w:t xml:space="preserve">Finding Description: </w:t>
+      </w:r>
+      <w:r>
+        <w:t>During testing, OrbitalFire identified a potential subdomain takeover vulnerability affecting one or more domains owned by [CUSTOMER NAME]. This issue typically results from misconfigured DNS records that reference unclaimed or deprovisioned third-party services, allowing an attacker to register the external resource and gain control of the associated subdomain. If exploited, an attacker could host malicious content, impersonate the organization, conduct phishing campaigns, or collect user data, posing a significant risk to brand reputation, user trust, and overall security posture.</w:t>
+      </w:r>
+    </w:p>
+    <w:p>
+      <w:r>
+        <w:rPr>
+          <w:b/>
+        </w:rPr>
+        <w:t xml:space="preserve">Recommendation: </w:t>
+      </w:r>
+      <w:r>
+        <w:t>Remediate Subdomain Takeover Exposure – Identify and remove misconfigured or stale DNS records that reference unclaimed or deprovisioned third-party services. Conduct a comprehensive review of all DNS entries to ensure they accurately map to active, authorized resources, and implement continuous monitoring to detect future misconfigurations. Where applicable, apply DNS security best practices such as DNSSEC and maintain proper lifecycle management of external service integrations to prevent unauthorized subdomain claims.</w:t>
+      </w:r>
+    </w:p>
+    <w:p>
+      <w:r/>
     </w:p>
     <w:p>
       <w:pPr>

</xml_diff>

<commit_message>
More updates Findings Details
</commit_message>
<xml_diff>
--- a/Source_Code/Reports/Sample499/FindingsReportTest.docx
+++ b/Source_Code/Reports/Sample499/FindingsReportTest.docx
@@ -601,7 +601,7 @@
           <w14:ligatures w14:val="none"/>
         </w:rPr>
         <w:drawing>
-          <wp:anchor distT="0" distB="0" distL="114300" distR="114300" simplePos="0" relativeHeight="251662336" behindDoc="0" locked="0" layoutInCell="1" allowOverlap="1" wp14:anchorId="56FF54E8" wp14:editId="383AEF1B">
+          <wp:anchor distT="0" distB="0" distL="114300" distR="114300" simplePos="0" relativeHeight="251662336" behindDoc="0" locked="0" layoutInCell="1" allowOverlap="1" wp14:anchorId="56FF54E8" wp14:editId="79FCF4B8">
             <wp:simplePos x="0" y="0"/>
             <wp:positionH relativeFrom="margin">
               <wp:posOffset>1163955</wp:posOffset>
@@ -2335,29 +2335,7 @@
           <w:szCs w:val="22"/>
           <w14:ligatures w14:val="none"/>
         </w:rPr>
-        <w:t xml:space="preserve">Without well-defined goals, boundaries and operational guidance, penetration testing can become </w:t>
-      </w:r>
-      <w:proofErr w:type="gramStart"/>
-      <w:r>
-        <w:rPr>
-          <w:rFonts w:ascii="Corbel" w:eastAsia="Calibri" w:hAnsi="Corbel" w:cs="Arial"/>
-          <w:color w:val="404040"/>
-          <w:kern w:val="0"/>
-          <w:szCs w:val="22"/>
-          <w14:ligatures w14:val="none"/>
-        </w:rPr>
-        <w:t>disruptive, or</w:t>
-      </w:r>
-      <w:proofErr w:type="gramEnd"/>
-      <w:r>
-        <w:rPr>
-          <w:rFonts w:ascii="Corbel" w:eastAsia="Calibri" w:hAnsi="Corbel" w:cs="Arial"/>
-          <w:color w:val="404040"/>
-          <w:kern w:val="0"/>
-          <w:szCs w:val="22"/>
-          <w14:ligatures w14:val="none"/>
-        </w:rPr>
-        <w:t xml:space="preserve"> even damaging to the organization undergoing testing. For these reasons these operational guidelines are carefully communicated and resolved.</w:t>
+        <w:t>Without well-defined goals, boundaries and operational guidance, penetration testing can become disruptive, or even damaging to the organization undergoing testing. For these reasons these operational guidelines are carefully communicated and resolved.</w:t>
       </w:r>
     </w:p>
     <w:p>
@@ -3007,51 +2985,7 @@
           <w:szCs w:val="22"/>
           <w14:ligatures w14:val="none"/>
         </w:rPr>
-        <w:t xml:space="preserve">Penetration testing can be </w:t>
-      </w:r>
-      <w:proofErr w:type="gramStart"/>
-      <w:r>
-        <w:rPr>
-          <w:rFonts w:ascii="Corbel" w:eastAsia="Calibri" w:hAnsi="Corbel" w:cs="Arial"/>
-          <w:color w:val="404040"/>
-          <w:kern w:val="0"/>
-          <w:szCs w:val="22"/>
-          <w14:ligatures w14:val="none"/>
-        </w:rPr>
-        <w:t>conducted</w:t>
-      </w:r>
-      <w:proofErr w:type="gramEnd"/>
-      <w:r>
-        <w:rPr>
-          <w:rFonts w:ascii="Corbel" w:eastAsia="Calibri" w:hAnsi="Corbel" w:cs="Arial"/>
-          <w:color w:val="404040"/>
-          <w:kern w:val="0"/>
-          <w:szCs w:val="22"/>
-          <w14:ligatures w14:val="none"/>
-        </w:rPr>
-        <w:t xml:space="preserve"> many </w:t>
-      </w:r>
-      <w:proofErr w:type="gramStart"/>
-      <w:r>
-        <w:rPr>
-          <w:rFonts w:ascii="Corbel" w:eastAsia="Calibri" w:hAnsi="Corbel" w:cs="Arial"/>
-          <w:color w:val="404040"/>
-          <w:kern w:val="0"/>
-          <w:szCs w:val="22"/>
-          <w14:ligatures w14:val="none"/>
-        </w:rPr>
-        <w:t>ways,</w:t>
-      </w:r>
-      <w:proofErr w:type="gramEnd"/>
-      <w:r>
-        <w:rPr>
-          <w:rFonts w:ascii="Corbel" w:eastAsia="Calibri" w:hAnsi="Corbel" w:cs="Arial"/>
-          <w:color w:val="404040"/>
-          <w:kern w:val="0"/>
-          <w:szCs w:val="22"/>
-          <w14:ligatures w14:val="none"/>
-        </w:rPr>
-        <w:t xml:space="preserve"> the following describe the methodologies utilized for this test:</w:t>
+        <w:t>Penetration testing can be conducted many ways, the following describe the methodologies utilized for this test:</w:t>
       </w:r>
     </w:p>
     <w:p>
@@ -3358,27 +3292,15 @@
         </w:rPr>
         <w:t xml:space="preserve"> </w:t>
       </w:r>
-      <w:proofErr w:type="gramStart"/>
-      <w:r>
-        <w:rPr>
-          <w:rFonts w:ascii="Corbel" w:eastAsia="Calibri" w:hAnsi="Corbel" w:cs="Arial"/>
-          <w:color w:val="404040"/>
-          <w:kern w:val="0"/>
-          <w:szCs w:val="22"/>
-          <w14:ligatures w14:val="none"/>
-        </w:rPr>
-        <w:t>–  Findings</w:t>
-      </w:r>
-      <w:proofErr w:type="gramEnd"/>
-      <w:r>
-        <w:rPr>
-          <w:rFonts w:ascii="Corbel" w:eastAsia="Calibri" w:hAnsi="Corbel" w:cs="Arial"/>
-          <w:color w:val="404040"/>
-          <w:kern w:val="0"/>
-          <w:szCs w:val="22"/>
-          <w14:ligatures w14:val="none"/>
-        </w:rPr>
-        <w:t xml:space="preserve"> that have a moderate impact on the security of the system or application and require timely attention</w:t>
+      <w:r>
+        <w:rPr>
+          <w:rFonts w:ascii="Corbel" w:eastAsia="Calibri" w:hAnsi="Corbel" w:cs="Arial"/>
+          <w:color w:val="404040"/>
+          <w:kern w:val="0"/>
+          <w:szCs w:val="22"/>
+          <w14:ligatures w14:val="none"/>
+        </w:rPr>
+        <w:t>–  Findings that have a moderate impact on the security of the system or application and require timely attention</w:t>
       </w:r>
     </w:p>
     <w:p>
@@ -3547,7 +3469,6 @@
         <w:t xml:space="preserve">Start Date: </w:t>
       </w:r>
       <w:bookmarkStart w:id="4" w:name="_Hlk212473124"/>
-      <w:proofErr w:type="gramStart"/>
       <w:r>
         <w:rPr>
           <w:rFonts w:ascii="Corbel" w:eastAsia="Calibri" w:hAnsi="Corbel" w:cs="Arial"/>
@@ -3557,19 +3478,7 @@
           <w:highlight w:val="yellow"/>
           <w14:ligatures w14:val="none"/>
         </w:rPr>
-        <w:t>January,</w:t>
-      </w:r>
-      <w:proofErr w:type="gramEnd"/>
-      <w:r>
-        <w:rPr>
-          <w:rFonts w:ascii="Corbel" w:eastAsia="Calibri" w:hAnsi="Corbel" w:cs="Arial"/>
-          <w:color w:val="FF6633"/>
-          <w:kern w:val="0"/>
-          <w:szCs w:val="22"/>
-          <w:highlight w:val="yellow"/>
-          <w14:ligatures w14:val="none"/>
-        </w:rPr>
-        <w:t xml:space="preserve"> 2026</w:t>
+        <w:t>January, 2026</w:t>
       </w:r>
       <w:bookmarkEnd w:id="4"/>
     </w:p>
@@ -3601,7 +3510,6 @@
         </w:rPr>
         <w:t xml:space="preserve">End Date: </w:t>
       </w:r>
-      <w:proofErr w:type="gramStart"/>
       <w:r>
         <w:rPr>
           <w:rFonts w:ascii="Corbel" w:eastAsia="Calibri" w:hAnsi="Corbel" w:cs="Arial"/>
@@ -3611,19 +3519,7 @@
           <w:highlight w:val="yellow"/>
           <w14:ligatures w14:val="none"/>
         </w:rPr>
-        <w:t>January,</w:t>
-      </w:r>
-      <w:proofErr w:type="gramEnd"/>
-      <w:r>
-        <w:rPr>
-          <w:rFonts w:ascii="Corbel" w:eastAsia="Calibri" w:hAnsi="Corbel" w:cs="Arial"/>
-          <w:color w:val="FF6633"/>
-          <w:kern w:val="0"/>
-          <w:szCs w:val="22"/>
-          <w:highlight w:val="yellow"/>
-          <w14:ligatures w14:val="none"/>
-        </w:rPr>
-        <w:t xml:space="preserve"> 2026</w:t>
+        <w:t>January, 2026</w:t>
       </w:r>
     </w:p>
     <w:p>
@@ -3775,20 +3671,7 @@
           <w14:ligatures w14:val="none"/>
         </w:rPr>
         <w:br/>
-        <w:t xml:space="preserve">HOST </w:t>
-      </w:r>
-      <w:proofErr w:type="gramStart"/>
-      <w:r>
-        <w:rPr>
-          <w:rFonts w:ascii="Corbel" w:eastAsia="Calibri" w:hAnsi="Corbel" w:cs="Arial"/>
-          <w:b/>
-          <w:bCs/>
-          <w:color w:val="404040"/>
-          <w:kern w:val="0"/>
-          <w:szCs w:val="22"/>
-          <w14:ligatures w14:val="none"/>
-        </w:rPr>
-        <w:t xml:space="preserve">DISCOVERY </w:t>
+        <w:t xml:space="preserve">HOST DISCOVERY </w:t>
       </w:r>
       <w:r>
         <w:rPr>
@@ -3815,22 +3698,7 @@
           <w:highlight w:val="yellow"/>
           <w14:ligatures w14:val="none"/>
         </w:rPr>
-        <w:t>INTERNAL</w:t>
-      </w:r>
-      <w:proofErr w:type="gramEnd"/>
-      <w:r>
-        <w:rPr>
-          <w:rFonts w:ascii="Corbel" w:eastAsia="Calibri" w:hAnsi="Corbel" w:cs="Arial"/>
-          <w:b/>
-          <w:bCs/>
-          <w:color w:val="F06023"/>
-          <w:kern w:val="0"/>
-          <w:sz w:val="20"/>
-          <w:szCs w:val="20"/>
-          <w:highlight w:val="yellow"/>
-          <w14:ligatures w14:val="none"/>
-        </w:rPr>
-        <w:t xml:space="preserve"> NETWORK ASSESSMENT</w:t>
+        <w:t>INTERNAL NETWORK ASSESSMENT</w:t>
       </w:r>
       <w:r>
         <w:rPr>
@@ -4759,8 +4627,8 @@
           <w:noProof/>
         </w:rPr>
         <w:drawing>
-          <wp:inline distT="0" distB="0" distL="0" distR="0" wp14:anchorId="0E1982FC" wp14:editId="03C2C81B">
-            <wp:extent cx="5760720" cy="994786"/>
+          <wp:inline distT="0" distB="0" distL="0" distR="0" wp14:anchorId="60C7FF48" wp14:editId="739944D2">
+            <wp:extent cx="4206240" cy="512097"/>
             <wp:effectExtent l="0" t="0" r="0" b="0"/>
             <wp:docPr id="2011428601" name="Picture 2011428601"/>
             <wp:cNvGraphicFramePr>
@@ -4782,7 +4650,7 @@
                   <pic:spPr>
                     <a:xfrm>
                       <a:off x="0" y="0"/>
-                      <a:ext cx="5760720" cy="994786"/>
+                      <a:ext cx="4206240" cy="512097"/>
                     </a:xfrm>
                     <a:prstGeom prst="rect">
                       <a:avLst/>
@@ -4810,8 +4678,8 @@
           <w:noProof/>
         </w:rPr>
         <w:drawing>
-          <wp:inline distT="0" distB="0" distL="0" distR="0" wp14:anchorId="62835D04" wp14:editId="64945EE8">
-            <wp:extent cx="5760720" cy="1258088"/>
+          <wp:inline distT="0" distB="0" distL="0" distR="0" wp14:anchorId="59F21A0F" wp14:editId="37DE8F56">
+            <wp:extent cx="4206240" cy="204497"/>
             <wp:effectExtent l="0" t="0" r="0" b="0"/>
             <wp:docPr id="2011428602" name="Picture 2011428602"/>
             <wp:cNvGraphicFramePr>
@@ -4833,7 +4701,7 @@
                   <pic:spPr>
                     <a:xfrm>
                       <a:off x="0" y="0"/>
-                      <a:ext cx="5760720" cy="1258088"/>
+                      <a:ext cx="4206240" cy="204497"/>
                     </a:xfrm>
                     <a:prstGeom prst="rect">
                       <a:avLst/>
@@ -4905,28 +4773,7 @@
         <w:rPr>
           <w:rFonts w:ascii="Corbel" w:hAnsi="Corbel"/>
         </w:rPr>
-        <w:t xml:space="preserve"> identified that [CUSTOMER NAME] has a misconfigured DMARC (Domain-based Message Authentication, Reporting, and Conformance) record for one or more of their </w:t>
-      </w:r>
-      <w:proofErr w:type="gramStart"/>
-      <w:r>
-        <w:rPr>
-          <w:rFonts w:ascii="Corbel" w:hAnsi="Corbel"/>
-        </w:rPr>
-        <w:t>domain</w:t>
-      </w:r>
-      <w:proofErr w:type="gramEnd"/>
-      <w:r>
-        <w:rPr>
-          <w:rFonts w:ascii="Corbel" w:hAnsi="Corbel"/>
-        </w:rPr>
-        <w:t xml:space="preserve">(s). DMARC is critical for verifying the authenticity of emails sent from the organization, serving as a vital barrier against email spoofing and phishing attacks. Without proper configuration, DMARC fails to instruct </w:t>
-      </w:r>
-      <w:r>
-        <w:rPr>
-          <w:rFonts w:ascii="Corbel" w:hAnsi="Corbel"/>
-        </w:rPr>
-        <w:lastRenderedPageBreak/>
-        <w:t>receiving mail servers on how to treat email messages from the organization's domain, thereby increasing vulnerability to attack.</w:t>
+        <w:t xml:space="preserve"> identified that [CUSTOMER NAME] has a misconfigured DMARC (Domain-based Message Authentication, Reporting, and Conformance) record for one or more of their domain(s). DMARC is critical for verifying the authenticity of emails sent from the organization, serving as a vital barrier against email spoofing and phishing attacks. Without proper configuration, DMARC fails to instruct receiving mail servers on how to treat email messages from the organization's domain, thereby increasing vulnerability to attack.</w:t>
       </w:r>
     </w:p>
     <w:p>
@@ -4935,8 +4782,8 @@
           <w:noProof/>
         </w:rPr>
         <w:drawing>
-          <wp:inline distT="0" distB="0" distL="0" distR="0" wp14:anchorId="2B09DF2C" wp14:editId="34C35C3F">
-            <wp:extent cx="5760720" cy="1003830"/>
+          <wp:inline distT="0" distB="0" distL="0" distR="0" wp14:anchorId="702DA092" wp14:editId="2175E213">
+            <wp:extent cx="4206240" cy="537054"/>
             <wp:effectExtent l="0" t="0" r="0" b="0"/>
             <wp:docPr id="2011428603" name="Picture 2011428603"/>
             <wp:cNvGraphicFramePr>
@@ -4958,7 +4805,7 @@
                   <pic:spPr>
                     <a:xfrm>
                       <a:off x="0" y="0"/>
-                      <a:ext cx="5760720" cy="1003830"/>
+                      <a:ext cx="4206240" cy="537054"/>
                     </a:xfrm>
                     <a:prstGeom prst="rect">
                       <a:avLst/>
@@ -4986,8 +4833,8 @@
           <w:noProof/>
         </w:rPr>
         <w:drawing>
-          <wp:inline distT="0" distB="0" distL="0" distR="0" wp14:anchorId="45B6BEBE" wp14:editId="0EC06168">
-            <wp:extent cx="5760720" cy="275047"/>
+          <wp:inline distT="0" distB="0" distL="0" distR="0" wp14:anchorId="426EAF12" wp14:editId="2B3F19E9">
+            <wp:extent cx="4206240" cy="154757"/>
             <wp:effectExtent l="0" t="0" r="0" b="0"/>
             <wp:docPr id="2011428604" name="Picture 2011428604"/>
             <wp:cNvGraphicFramePr>
@@ -5009,7 +4856,7 @@
                   <pic:spPr>
                     <a:xfrm>
                       <a:off x="0" y="0"/>
-                      <a:ext cx="5760720" cy="275047"/>
+                      <a:ext cx="4206240" cy="154757"/>
                     </a:xfrm>
                     <a:prstGeom prst="rect">
                       <a:avLst/>
@@ -5058,8 +4905,8 @@
           <w:noProof/>
         </w:rPr>
         <w:drawing>
-          <wp:inline distT="0" distB="0" distL="0" distR="0" wp14:anchorId="05659938" wp14:editId="25B3A2EE">
-            <wp:extent cx="5760720" cy="695259"/>
+          <wp:inline distT="0" distB="0" distL="0" distR="0" wp14:anchorId="2ED1C75A" wp14:editId="40D99B04">
+            <wp:extent cx="4206240" cy="659486"/>
             <wp:effectExtent l="0" t="0" r="0" b="0"/>
             <wp:docPr id="2011428605" name="Picture 2011428605"/>
             <wp:cNvGraphicFramePr>
@@ -5081,7 +4928,7 @@
                   <pic:spPr>
                     <a:xfrm>
                       <a:off x="0" y="0"/>
-                      <a:ext cx="5760720" cy="695259"/>
+                      <a:ext cx="4206240" cy="659486"/>
                     </a:xfrm>
                     <a:prstGeom prst="rect">
                       <a:avLst/>
@@ -5109,8 +4956,8 @@
           <w:noProof/>
         </w:rPr>
         <w:drawing>
-          <wp:inline distT="0" distB="0" distL="0" distR="0" wp14:anchorId="777E5707" wp14:editId="44DDAE30">
-            <wp:extent cx="5760720" cy="305240"/>
+          <wp:inline distT="0" distB="0" distL="0" distR="0" wp14:anchorId="771CC1B1" wp14:editId="253F89F4">
+            <wp:extent cx="4206240" cy="206343"/>
             <wp:effectExtent l="0" t="0" r="0" b="0"/>
             <wp:docPr id="2011428606" name="Picture 2011428606"/>
             <wp:cNvGraphicFramePr>
@@ -5132,7 +4979,7 @@
                   <pic:spPr>
                     <a:xfrm>
                       <a:off x="0" y="0"/>
-                      <a:ext cx="5760720" cy="305240"/>
+                      <a:ext cx="4206240" cy="206343"/>
                     </a:xfrm>
                     <a:prstGeom prst="rect">
                       <a:avLst/>
@@ -5238,7 +5085,6 @@
           <w:szCs w:val="22"/>
           <w14:ligatures w14:val="none"/>
         </w:rPr>
-        <w:lastRenderedPageBreak/>
         <w:br/>
       </w:r>
     </w:p>
@@ -8171,7 +8017,7 @@
           <w14:ligatures w14:val="none"/>
         </w:rPr>
         <w:drawing>
-          <wp:inline distT="0" distB="0" distL="0" distR="0" wp14:anchorId="03962334" wp14:editId="0E3F94C5">
+          <wp:inline distT="0" distB="0" distL="0" distR="0" wp14:anchorId="03962334" wp14:editId="06A4C3EC">
             <wp:extent cx="152400" cy="152400"/>
             <wp:effectExtent l="0" t="0" r="0" b="0"/>
             <wp:docPr id="2011428596" name="Picture 2011428596" descr="Fire with solid fill"/>

</xml_diff>

<commit_message>
More updated Findings Details
</commit_message>
<xml_diff>
--- a/Source_Code/Reports/Sample499/FindingsReportTest.docx
+++ b/Source_Code/Reports/Sample499/FindingsReportTest.docx
@@ -601,7 +601,7 @@
           <w14:ligatures w14:val="none"/>
         </w:rPr>
         <w:drawing>
-          <wp:anchor distT="0" distB="0" distL="114300" distR="114300" simplePos="0" relativeHeight="251662336" behindDoc="0" locked="0" layoutInCell="1" allowOverlap="1" wp14:anchorId="56FF54E8" wp14:editId="79FCF4B8">
+          <wp:anchor distT="0" distB="0" distL="114300" distR="114300" simplePos="0" relativeHeight="251662336" behindDoc="0" locked="0" layoutInCell="1" allowOverlap="1" wp14:anchorId="56FF54E8" wp14:editId="61F5A16B">
             <wp:simplePos x="0" y="0"/>
             <wp:positionH relativeFrom="margin">
               <wp:posOffset>1163955</wp:posOffset>
@@ -1125,31 +1125,7 @@
           <w:szCs w:val="22"/>
           <w14:ligatures w14:val="none"/>
         </w:rPr>
-        <w:t xml:space="preserve">contained in this document is confidential and proprietary. It is intended for the exclusive use of </w:t>
-      </w:r>
-      <w:proofErr w:type="spellStart"/>
-      <w:r>
-        <w:rPr>
-          <w:rFonts w:ascii="Corbel" w:eastAsia="Calibri" w:hAnsi="Corbel" w:cs="Arial"/>
-          <w:snapToGrid w:val="0"/>
-          <w:color w:val="404040"/>
-          <w:kern w:val="0"/>
-          <w:szCs w:val="22"/>
-          <w14:ligatures w14:val="none"/>
-        </w:rPr>
-        <w:t>OrbitalFire</w:t>
-      </w:r>
-      <w:proofErr w:type="spellEnd"/>
-      <w:r>
-        <w:rPr>
-          <w:rFonts w:ascii="Corbel" w:eastAsia="Calibri" w:hAnsi="Corbel" w:cs="Arial"/>
-          <w:snapToGrid w:val="0"/>
-          <w:color w:val="404040"/>
-          <w:kern w:val="0"/>
-          <w:szCs w:val="22"/>
-          <w14:ligatures w14:val="none"/>
-        </w:rPr>
-        <w:t>, LLC and the Customer entity named in this document.</w:t>
+        <w:t>contained in this document is confidential and proprietary. It is intended for the exclusive use of OrbitalFire, LLC and the Customer entity named in this document.</w:t>
       </w:r>
     </w:p>
     <w:p>
@@ -1969,51 +1945,7 @@
           <w:szCs w:val="22"/>
           <w14:ligatures w14:val="none"/>
         </w:rPr>
-        <w:t xml:space="preserve">In 2015, </w:t>
-      </w:r>
-      <w:proofErr w:type="spellStart"/>
-      <w:r>
-        <w:rPr>
-          <w:rFonts w:ascii="Corbel" w:eastAsia="Calibri" w:hAnsi="Corbel" w:cs="Arial"/>
-          <w:color w:val="404040"/>
-          <w:kern w:val="0"/>
-          <w:szCs w:val="22"/>
-          <w14:ligatures w14:val="none"/>
-        </w:rPr>
-        <w:t>Ponemon</w:t>
-      </w:r>
-      <w:proofErr w:type="spellEnd"/>
-      <w:r>
-        <w:rPr>
-          <w:rFonts w:ascii="Corbel" w:eastAsia="Calibri" w:hAnsi="Corbel" w:cs="Arial"/>
-          <w:color w:val="404040"/>
-          <w:kern w:val="0"/>
-          <w:szCs w:val="22"/>
-          <w14:ligatures w14:val="none"/>
-        </w:rPr>
-        <w:t xml:space="preserve"> Institute conducted a study on the cost of data breaches that surveyed 350 organizations from 11 different countries that had suffered some type of cybercrime. Nearly half </w:t>
-      </w:r>
-      <w:proofErr w:type="gramStart"/>
-      <w:r>
-        <w:rPr>
-          <w:rFonts w:ascii="Corbel" w:eastAsia="Calibri" w:hAnsi="Corbel" w:cs="Arial"/>
-          <w:color w:val="404040"/>
-          <w:kern w:val="0"/>
-          <w:szCs w:val="22"/>
-          <w14:ligatures w14:val="none"/>
-        </w:rPr>
-        <w:t>of</w:t>
-      </w:r>
-      <w:proofErr w:type="gramEnd"/>
-      <w:r>
-        <w:rPr>
-          <w:rFonts w:ascii="Corbel" w:eastAsia="Calibri" w:hAnsi="Corbel" w:cs="Arial"/>
-          <w:color w:val="404040"/>
-          <w:kern w:val="0"/>
-          <w:szCs w:val="22"/>
-          <w14:ligatures w14:val="none"/>
-        </w:rPr>
-        <w:t xml:space="preserve"> said these incidents (47%) were the result of malicious actors who were able to compromise company networks to steal money, intellectual property or other protected data.</w:t>
+        <w:t>In 2015, Ponemon Institute conducted a study on the cost of data breaches that surveyed 350 organizations from 11 different countries that had suffered some type of cybercrime. Nearly half of said these incidents (47%) were the result of malicious actors who were able to compromise company networks to steal money, intellectual property or other protected data.</w:t>
       </w:r>
     </w:p>
     <w:p>
@@ -3741,29 +3673,7 @@
           <w:szCs w:val="22"/>
           <w14:ligatures w14:val="none"/>
         </w:rPr>
-        <w:t xml:space="preserve"> that was provided as part of scope, </w:t>
-      </w:r>
-      <w:proofErr w:type="spellStart"/>
-      <w:r>
-        <w:rPr>
-          <w:rFonts w:ascii="Corbel" w:eastAsia="Calibri" w:hAnsi="Corbel" w:cs="Arial"/>
-          <w:color w:val="404040"/>
-          <w:kern w:val="0"/>
-          <w:szCs w:val="22"/>
-          <w14:ligatures w14:val="none"/>
-        </w:rPr>
-        <w:t>OrbitalFire</w:t>
-      </w:r>
-      <w:proofErr w:type="spellEnd"/>
-      <w:r>
-        <w:rPr>
-          <w:rFonts w:ascii="Corbel" w:eastAsia="Calibri" w:hAnsi="Corbel" w:cs="Arial"/>
-          <w:color w:val="404040"/>
-          <w:kern w:val="0"/>
-          <w:szCs w:val="22"/>
-          <w14:ligatures w14:val="none"/>
-        </w:rPr>
-        <w:t xml:space="preserve"> was able to identify a total of </w:t>
+        <w:t xml:space="preserve"> that was provided as part of scope, OrbitalFire was able to identify a total of </w:t>
       </w:r>
       <w:r>
         <w:rPr>
@@ -3805,29 +3715,7 @@
           <w:szCs w:val="22"/>
           <w14:ligatures w14:val="none"/>
         </w:rPr>
-        <w:t xml:space="preserve"> addresses that were scanned, </w:t>
-      </w:r>
-      <w:proofErr w:type="spellStart"/>
-      <w:r>
-        <w:rPr>
-          <w:rFonts w:ascii="Corbel" w:eastAsia="Calibri" w:hAnsi="Corbel" w:cs="Arial"/>
-          <w:color w:val="404040"/>
-          <w:kern w:val="0"/>
-          <w:szCs w:val="22"/>
-          <w14:ligatures w14:val="none"/>
-        </w:rPr>
-        <w:t>OrbitalFire</w:t>
-      </w:r>
-      <w:proofErr w:type="spellEnd"/>
-      <w:r>
-        <w:rPr>
-          <w:rFonts w:ascii="Corbel" w:eastAsia="Calibri" w:hAnsi="Corbel" w:cs="Arial"/>
-          <w:color w:val="404040"/>
-          <w:kern w:val="0"/>
-          <w:szCs w:val="22"/>
-          <w14:ligatures w14:val="none"/>
-        </w:rPr>
-        <w:t xml:space="preserve"> found </w:t>
+        <w:t xml:space="preserve"> addresses that were scanned, OrbitalFire found </w:t>
       </w:r>
       <w:r>
         <w:rPr>
@@ -3893,29 +3781,7 @@
           <w:szCs w:val="22"/>
           <w14:ligatures w14:val="none"/>
         </w:rPr>
-        <w:t xml:space="preserve">After the identification of all available hosts within the network, </w:t>
-      </w:r>
-      <w:proofErr w:type="spellStart"/>
-      <w:r>
-        <w:rPr>
-          <w:rFonts w:ascii="Corbel" w:eastAsia="Calibri" w:hAnsi="Corbel" w:cs="Arial"/>
-          <w:color w:val="404040"/>
-          <w:kern w:val="0"/>
-          <w:szCs w:val="22"/>
-          <w14:ligatures w14:val="none"/>
-        </w:rPr>
-        <w:t>OrbitalFire</w:t>
-      </w:r>
-      <w:proofErr w:type="spellEnd"/>
-      <w:r>
-        <w:rPr>
-          <w:rFonts w:ascii="Corbel" w:eastAsia="Calibri" w:hAnsi="Corbel" w:cs="Arial"/>
-          <w:color w:val="404040"/>
-          <w:kern w:val="0"/>
-          <w:szCs w:val="22"/>
-          <w14:ligatures w14:val="none"/>
-        </w:rPr>
-        <w:t xml:space="preserve"> then conducted enumeration. Enumeration during this assessment consisted of scanning the identified ports to determine which services are running (if any). Additional scans were then performed based on running services to attempt enumerating information (if possible).</w:t>
+        <w:t>After the identification of all available hosts within the network, OrbitalFire then conducted enumeration. Enumeration during this assessment consisted of scanning the identified ports to determine which services are running (if any). Additional scans were then performed based on running services to attempt enumerating information (if possible).</w:t>
       </w:r>
       <w:r>
         <w:rPr>
@@ -3969,51 +3835,7 @@
           <w:szCs w:val="22"/>
           <w14:ligatures w14:val="none"/>
         </w:rPr>
-        <w:t xml:space="preserve">Post enumeration, </w:t>
-      </w:r>
-      <w:proofErr w:type="spellStart"/>
-      <w:r>
-        <w:rPr>
-          <w:rFonts w:ascii="Corbel" w:eastAsia="Calibri" w:hAnsi="Corbel" w:cs="Arial"/>
-          <w:color w:val="404040"/>
-          <w:kern w:val="0"/>
-          <w:szCs w:val="22"/>
-          <w14:ligatures w14:val="none"/>
-        </w:rPr>
-        <w:t>OrbitalFire</w:t>
-      </w:r>
-      <w:proofErr w:type="spellEnd"/>
-      <w:r>
-        <w:rPr>
-          <w:rFonts w:ascii="Corbel" w:eastAsia="Calibri" w:hAnsi="Corbel" w:cs="Arial"/>
-          <w:color w:val="404040"/>
-          <w:kern w:val="0"/>
-          <w:szCs w:val="22"/>
-          <w14:ligatures w14:val="none"/>
-        </w:rPr>
-        <w:t xml:space="preserve"> focused strictly on the exploitation of any/all running services that were previously discovered. </w:t>
-      </w:r>
-      <w:proofErr w:type="spellStart"/>
-      <w:r>
-        <w:rPr>
-          <w:rFonts w:ascii="Corbel" w:eastAsia="Calibri" w:hAnsi="Corbel" w:cs="Arial"/>
-          <w:color w:val="404040"/>
-          <w:kern w:val="0"/>
-          <w:szCs w:val="22"/>
-          <w14:ligatures w14:val="none"/>
-        </w:rPr>
-        <w:t>OrbitalFire</w:t>
-      </w:r>
-      <w:proofErr w:type="spellEnd"/>
-      <w:r>
-        <w:rPr>
-          <w:rFonts w:ascii="Corbel" w:eastAsia="Calibri" w:hAnsi="Corbel" w:cs="Arial"/>
-          <w:color w:val="404040"/>
-          <w:kern w:val="0"/>
-          <w:szCs w:val="22"/>
-          <w14:ligatures w14:val="none"/>
-        </w:rPr>
-        <w:t xml:space="preserve"> used a comprehensive set of tools, custom scripts, and manual techniques to thoroughly identify possible threats to </w:t>
+        <w:t xml:space="preserve">Post enumeration, OrbitalFire focused strictly on the exploitation of any/all running services that were previously discovered. OrbitalFire used a comprehensive set of tools, custom scripts, and manual techniques to thoroughly identify possible threats to </w:t>
       </w:r>
       <w:r>
         <w:rPr>
@@ -4088,29 +3910,7 @@
           <w:szCs w:val="22"/>
           <w14:ligatures w14:val="none"/>
         </w:rPr>
-        <w:t xml:space="preserve">Once the exploitation phase was complete, </w:t>
-      </w:r>
-      <w:proofErr w:type="spellStart"/>
-      <w:r>
-        <w:rPr>
-          <w:rFonts w:ascii="Corbel" w:eastAsia="Calibri" w:hAnsi="Corbel" w:cs="Arial"/>
-          <w:color w:val="404040"/>
-          <w:kern w:val="0"/>
-          <w:szCs w:val="22"/>
-          <w14:ligatures w14:val="none"/>
-        </w:rPr>
-        <w:t>OrbitalFire</w:t>
-      </w:r>
-      <w:proofErr w:type="spellEnd"/>
-      <w:r>
-        <w:rPr>
-          <w:rFonts w:ascii="Corbel" w:eastAsia="Calibri" w:hAnsi="Corbel" w:cs="Arial"/>
-          <w:color w:val="404040"/>
-          <w:kern w:val="0"/>
-          <w:szCs w:val="22"/>
-          <w14:ligatures w14:val="none"/>
-        </w:rPr>
-        <w:t xml:space="preserve"> then tested and validated all identified threats to evaluate the depth of compromise.</w:t>
+        <w:t>Once the exploitation phase was complete, OrbitalFire then tested and validated all identified threats to evaluate the depth of compromise.</w:t>
       </w:r>
       <w:r>
         <w:rPr>
@@ -4371,29 +4171,7 @@
           <w:szCs w:val="22"/>
           <w14:ligatures w14:val="none"/>
         </w:rPr>
-        <w:t xml:space="preserve">To summarize the results of this assessment, </w:t>
-      </w:r>
-      <w:proofErr w:type="spellStart"/>
-      <w:r>
-        <w:rPr>
-          <w:rFonts w:ascii="Corbel" w:eastAsia="Calibri" w:hAnsi="Corbel" w:cs="Arial"/>
-          <w:color w:val="404040"/>
-          <w:kern w:val="0"/>
-          <w:szCs w:val="22"/>
-          <w14:ligatures w14:val="none"/>
-        </w:rPr>
-        <w:t>OrbitalFire</w:t>
-      </w:r>
-      <w:proofErr w:type="spellEnd"/>
-      <w:r>
-        <w:rPr>
-          <w:rFonts w:ascii="Corbel" w:eastAsia="Calibri" w:hAnsi="Corbel" w:cs="Arial"/>
-          <w:color w:val="404040"/>
-          <w:kern w:val="0"/>
-          <w:szCs w:val="22"/>
-          <w14:ligatures w14:val="none"/>
-        </w:rPr>
-        <w:t xml:space="preserve"> has grouped all findings from the penetration test into rollup findings. These rollup findings can be used to quickly determine the root cause of all issues identified in this assessment. It is highly recommended to implement a remediation strategy based on the rollup findings below to enhance security posture and overall defensibility.</w:t>
+        <w:t>To summarize the results of this assessment, OrbitalFire has grouped all findings from the penetration test into rollup findings. These rollup findings can be used to quickly determine the root cause of all issues identified in this assessment. It is highly recommended to implement a remediation strategy based on the rollup findings below to enhance security posture and overall defensibility.</w:t>
       </w:r>
     </w:p>
     <w:p>
@@ -4604,21 +4382,7 @@
         <w:rPr>
           <w:rFonts w:ascii="Corbel" w:hAnsi="Corbel"/>
         </w:rPr>
-        <w:t xml:space="preserve">During testing, </w:t>
-      </w:r>
-      <w:proofErr w:type="spellStart"/>
-      <w:r>
-        <w:rPr>
-          <w:rFonts w:ascii="Corbel" w:hAnsi="Corbel"/>
-        </w:rPr>
-        <w:t>OrbitalFire</w:t>
-      </w:r>
-      <w:proofErr w:type="spellEnd"/>
-      <w:r>
-        <w:rPr>
-          <w:rFonts w:ascii="Corbel" w:hAnsi="Corbel"/>
-        </w:rPr>
-        <w:t xml:space="preserve"> identified a potential subdomain takeover vulnerability affecting one or more domains owned by [CUSTOMER NAME]. This issue typically results from misconfigured DNS records that reference unclaimed or deprovisioned third-party services, allowing an attacker to register the external resource and gain control of the associated subdomain. If exploited, an attacker could host malicious content, impersonate the organization, conduct phishing campaigns, or collect user data, posing a significant risk to brand reputation, user trust, and overall security posture.</w:t>
+        <w:t>During testing, OrbitalFire identified a potential subdomain takeover vulnerability affecting one or more domains owned by [CUSTOMER NAME]. This issue typically results from misconfigured DNS records that reference unclaimed or deprovisioned third-party services, allowing an attacker to register the external resource and gain control of the associated subdomain. If exploited, an attacker could host malicious content, impersonate the organization, conduct phishing campaigns, or collect user data, posing a significant risk to brand reputation, user trust, and overall security posture.</w:t>
       </w:r>
     </w:p>
     <w:p>
@@ -4627,8 +4391,8 @@
           <w:noProof/>
         </w:rPr>
         <w:drawing>
-          <wp:inline distT="0" distB="0" distL="0" distR="0" wp14:anchorId="60C7FF48" wp14:editId="739944D2">
-            <wp:extent cx="4206240" cy="512097"/>
+          <wp:inline distT="0" distB="0" distL="0" distR="0" wp14:anchorId="35FB0BE0" wp14:editId="7B036DF5">
+            <wp:extent cx="5303520" cy="604011"/>
             <wp:effectExtent l="0" t="0" r="0" b="0"/>
             <wp:docPr id="2011428601" name="Picture 2011428601"/>
             <wp:cNvGraphicFramePr>
@@ -4650,7 +4414,7 @@
                   <pic:spPr>
                     <a:xfrm>
                       <a:off x="0" y="0"/>
-                      <a:ext cx="4206240" cy="512097"/>
+                      <a:ext cx="5303520" cy="604011"/>
                     </a:xfrm>
                     <a:prstGeom prst="rect">
                       <a:avLst/>
@@ -4678,8 +4442,8 @@
           <w:noProof/>
         </w:rPr>
         <w:drawing>
-          <wp:inline distT="0" distB="0" distL="0" distR="0" wp14:anchorId="59F21A0F" wp14:editId="37DE8F56">
-            <wp:extent cx="4206240" cy="204497"/>
+          <wp:inline distT="0" distB="0" distL="0" distR="0" wp14:anchorId="4D9E4B2F" wp14:editId="4CB73B97">
+            <wp:extent cx="5303520" cy="492760"/>
             <wp:effectExtent l="0" t="0" r="0" b="0"/>
             <wp:docPr id="2011428602" name="Picture 2011428602"/>
             <wp:cNvGraphicFramePr>
@@ -4701,7 +4465,7 @@
                   <pic:spPr>
                     <a:xfrm>
                       <a:off x="0" y="0"/>
-                      <a:ext cx="4206240" cy="204497"/>
+                      <a:ext cx="5303520" cy="492760"/>
                     </a:xfrm>
                     <a:prstGeom prst="rect">
                       <a:avLst/>
@@ -4759,21 +4523,7 @@
         <w:rPr>
           <w:rFonts w:ascii="Corbel" w:hAnsi="Corbel"/>
         </w:rPr>
-        <w:t xml:space="preserve">During testing, </w:t>
-      </w:r>
-      <w:proofErr w:type="spellStart"/>
-      <w:r>
-        <w:rPr>
-          <w:rFonts w:ascii="Corbel" w:hAnsi="Corbel"/>
-        </w:rPr>
-        <w:t>OrbitalFire</w:t>
-      </w:r>
-      <w:proofErr w:type="spellEnd"/>
-      <w:r>
-        <w:rPr>
-          <w:rFonts w:ascii="Corbel" w:hAnsi="Corbel"/>
-        </w:rPr>
-        <w:t xml:space="preserve"> identified that [CUSTOMER NAME] has a misconfigured DMARC (Domain-based Message Authentication, Reporting, and Conformance) record for one or more of their domain(s). DMARC is critical for verifying the authenticity of emails sent from the organization, serving as a vital barrier against email spoofing and phishing attacks. Without proper configuration, DMARC fails to instruct receiving mail servers on how to treat email messages from the organization's domain, thereby increasing vulnerability to attack.</w:t>
+        <w:t>During testing, OrbitalFire identified that [CUSTOMER NAME] has a misconfigured DMARC (Domain-based Message Authentication, Reporting, and Conformance) record for one or more of their domain(s). DMARC is critical for verifying the authenticity of emails sent from the organization, serving as a vital barrier against email spoofing and phishing attacks. Without proper configuration, DMARC fails to instruct receiving mail servers on how to treat email messages from the organization's domain, thereby increasing vulnerability to attack.</w:t>
       </w:r>
     </w:p>
     <w:p>
@@ -4782,8 +4532,8 @@
           <w:noProof/>
         </w:rPr>
         <w:drawing>
-          <wp:inline distT="0" distB="0" distL="0" distR="0" wp14:anchorId="702DA092" wp14:editId="2175E213">
-            <wp:extent cx="4206240" cy="537054"/>
+          <wp:inline distT="0" distB="0" distL="0" distR="0" wp14:anchorId="2C75F0D0" wp14:editId="43A4370D">
+            <wp:extent cx="5303520" cy="604011"/>
             <wp:effectExtent l="0" t="0" r="0" b="0"/>
             <wp:docPr id="2011428603" name="Picture 2011428603"/>
             <wp:cNvGraphicFramePr>
@@ -4805,7 +4555,7 @@
                   <pic:spPr>
                     <a:xfrm>
                       <a:off x="0" y="0"/>
-                      <a:ext cx="4206240" cy="537054"/>
+                      <a:ext cx="5303520" cy="604011"/>
                     </a:xfrm>
                     <a:prstGeom prst="rect">
                       <a:avLst/>
@@ -4832,9 +4582,10 @@
         <w:rPr>
           <w:noProof/>
         </w:rPr>
+        <w:lastRenderedPageBreak/>
         <w:drawing>
-          <wp:inline distT="0" distB="0" distL="0" distR="0" wp14:anchorId="426EAF12" wp14:editId="2B3F19E9">
-            <wp:extent cx="4206240" cy="154757"/>
+          <wp:inline distT="0" distB="0" distL="0" distR="0" wp14:anchorId="0DE0BF3F" wp14:editId="02159F58">
+            <wp:extent cx="5303520" cy="391160"/>
             <wp:effectExtent l="0" t="0" r="0" b="0"/>
             <wp:docPr id="2011428604" name="Picture 2011428604"/>
             <wp:cNvGraphicFramePr>
@@ -4856,7 +4607,7 @@
                   <pic:spPr>
                     <a:xfrm>
                       <a:off x="0" y="0"/>
-                      <a:ext cx="4206240" cy="154757"/>
+                      <a:ext cx="5303520" cy="391160"/>
                     </a:xfrm>
                     <a:prstGeom prst="rect">
                       <a:avLst/>
@@ -4882,21 +4633,7 @@
         <w:rPr>
           <w:rFonts w:ascii="Corbel" w:hAnsi="Corbel"/>
         </w:rPr>
-        <w:t xml:space="preserve">During testing, </w:t>
-      </w:r>
-      <w:proofErr w:type="spellStart"/>
-      <w:r>
-        <w:rPr>
-          <w:rFonts w:ascii="Corbel" w:hAnsi="Corbel"/>
-        </w:rPr>
-        <w:t>OrbitalFire</w:t>
-      </w:r>
-      <w:proofErr w:type="spellEnd"/>
-      <w:r>
-        <w:rPr>
-          <w:rFonts w:ascii="Corbel" w:hAnsi="Corbel"/>
-        </w:rPr>
-        <w:t xml:space="preserve"> identified that remote administration services, including SSH, were exposed to the public internet. This exposure is often the result of misconfiguration or insufficient access controls, which significantly increase the attack surface. Publicly accessible SSH services are susceptible to brute-force and password-guessing attacks, which may lead to unauthorized system access. Additionally, newly disclosed vulnerabilities, including zero-day exploits, could be leveraged by threat actors to further compromise exposed systems.</w:t>
+        <w:t>During testing, OrbitalFire identified that remote administration services, including SSH, were exposed to the public internet. This exposure is often the result of misconfiguration or insufficient access controls, which significantly increase the attack surface. Publicly accessible SSH services are susceptible to brute-force and password-guessing attacks, which may lead to unauthorized system access. Additionally, newly disclosed vulnerabilities, including zero-day exploits, could be leveraged by threat actors to further compromise exposed systems.</w:t>
       </w:r>
     </w:p>
     <w:p>
@@ -4905,8 +4642,8 @@
           <w:noProof/>
         </w:rPr>
         <w:drawing>
-          <wp:inline distT="0" distB="0" distL="0" distR="0" wp14:anchorId="2ED1C75A" wp14:editId="40D99B04">
-            <wp:extent cx="4206240" cy="659486"/>
+          <wp:inline distT="0" distB="0" distL="0" distR="0" wp14:anchorId="128EA313" wp14:editId="0512DAE9">
+            <wp:extent cx="5303520" cy="777583"/>
             <wp:effectExtent l="0" t="0" r="0" b="0"/>
             <wp:docPr id="2011428605" name="Picture 2011428605"/>
             <wp:cNvGraphicFramePr>
@@ -4928,7 +4665,7 @@
                   <pic:spPr>
                     <a:xfrm>
                       <a:off x="0" y="0"/>
-                      <a:ext cx="4206240" cy="659486"/>
+                      <a:ext cx="5303520" cy="777583"/>
                     </a:xfrm>
                     <a:prstGeom prst="rect">
                       <a:avLst/>
@@ -4956,8 +4693,8 @@
           <w:noProof/>
         </w:rPr>
         <w:drawing>
-          <wp:inline distT="0" distB="0" distL="0" distR="0" wp14:anchorId="771CC1B1" wp14:editId="253F89F4">
-            <wp:extent cx="4206240" cy="206343"/>
+          <wp:inline distT="0" distB="0" distL="0" distR="0" wp14:anchorId="3F64E04E" wp14:editId="1BFDEB00">
+            <wp:extent cx="5303520" cy="487680"/>
             <wp:effectExtent l="0" t="0" r="0" b="0"/>
             <wp:docPr id="2011428606" name="Picture 2011428606"/>
             <wp:cNvGraphicFramePr>
@@ -4979,7 +4716,7 @@
                   <pic:spPr>
                     <a:xfrm>
                       <a:off x="0" y="0"/>
-                      <a:ext cx="4206240" cy="206343"/>
+                      <a:ext cx="5303520" cy="487680"/>
                     </a:xfrm>
                     <a:prstGeom prst="rect">
                       <a:avLst/>
@@ -4992,7 +4729,6 @@
         </w:drawing>
       </w:r>
     </w:p>
-    <w:p/>
     <w:p>
       <w:pPr>
         <w:keepNext/>
@@ -5249,7 +4985,6 @@
         <w:t xml:space="preserve">testing against targeted domains, </w:t>
       </w:r>
       <w:bookmarkStart w:id="12" w:name="_Hlk212473705"/>
-      <w:proofErr w:type="gramStart"/>
       <w:r>
         <w:rPr>
           <w:rFonts w:ascii="Corbel" w:eastAsia="Calibri" w:hAnsi="Corbel" w:cs="Arial"/>
@@ -5259,19 +4994,7 @@
           <w:highlight w:val="yellow"/>
           <w14:ligatures w14:val="none"/>
         </w:rPr>
-        <w:t>NUMBER (#</w:t>
-      </w:r>
-      <w:proofErr w:type="gramEnd"/>
-      <w:r>
-        <w:rPr>
-          <w:rFonts w:ascii="Corbel" w:eastAsia="Calibri" w:hAnsi="Corbel" w:cs="Arial"/>
-          <w:color w:val="404040"/>
-          <w:kern w:val="0"/>
-          <w:szCs w:val="22"/>
-          <w:highlight w:val="yellow"/>
-          <w14:ligatures w14:val="none"/>
-        </w:rPr>
-        <w:t>)</w:t>
+        <w:t>NUMBER (#)</w:t>
       </w:r>
       <w:r>
         <w:rPr>
@@ -5580,70 +5303,156 @@
         <w:rPr>
           <w:lang w:val="fr-FR"/>
         </w:rPr>
-        <w:t xml:space="preserve">2026-01-29 </w:t>
-      </w:r>
-      <w:proofErr w:type="gramStart"/>
-      <w:r>
+        <w:t>2026-01-29 13:52:47-0500PM ET exposurescout Initiating ExposureScout module.</w:t>
+      </w:r>
+    </w:p>
+    <w:p>
+      <w:pPr>
+        <w:pStyle w:val="ActivityBullet"/>
+      </w:pPr>
+      <w:r>
+        <w:t>2026-01-29 13:52:59-0500PM ET exposurescout Enumerating subdomains from one (1) domain.</w:t>
+      </w:r>
+    </w:p>
+    <w:p>
+      <w:pPr>
+        <w:pStyle w:val="ActivityBullet"/>
         <w:rPr>
           <w:lang w:val="fr-FR"/>
         </w:rPr>
-        <w:t>13:52:</w:t>
-      </w:r>
-      <w:proofErr w:type="gramEnd"/>
+      </w:pPr>
       <w:r>
         <w:rPr>
           <w:lang w:val="fr-FR"/>
         </w:rPr>
-        <w:t xml:space="preserve">47-0500PM ET </w:t>
-      </w:r>
-      <w:proofErr w:type="spellStart"/>
-      <w:r>
+        <w:t>2026-01-29 13:54:13-0500PM ET exposurescout Completed subdomain enumeration.</w:t>
+      </w:r>
+    </w:p>
+    <w:p>
+      <w:pPr>
+        <w:pStyle w:val="ActivityBullet"/>
+      </w:pPr>
+      <w:r>
+        <w:t>2026-01-29 13:54:13-0500PM ET exposurescout Beginning DNS enumeration.</w:t>
+      </w:r>
+    </w:p>
+    <w:p>
+      <w:pPr>
+        <w:pStyle w:val="ActivityBullet"/>
         <w:rPr>
           <w:lang w:val="fr-FR"/>
         </w:rPr>
-        <w:t>exposurescout</w:t>
-      </w:r>
-      <w:proofErr w:type="spellEnd"/>
+      </w:pPr>
       <w:r>
         <w:rPr>
           <w:lang w:val="fr-FR"/>
         </w:rPr>
-        <w:t xml:space="preserve"> Initiating </w:t>
-      </w:r>
-      <w:proofErr w:type="spellStart"/>
-      <w:r>
+        <w:t>2026-01-29 13:55:18-0500PM ET exposurescout Completed DNS enumeration.</w:t>
+      </w:r>
+    </w:p>
+    <w:p>
+      <w:pPr>
+        <w:pStyle w:val="ActivityBullet"/>
+      </w:pPr>
+      <w:r>
+        <w:t>2026-01-29 13:55:18-0500PM ET exposurescout Enumerating doppelganger domains for one (1) domain.</w:t>
+      </w:r>
+    </w:p>
+    <w:p>
+      <w:pPr>
+        <w:pStyle w:val="ActivityBullet"/>
         <w:rPr>
           <w:lang w:val="fr-FR"/>
         </w:rPr>
-        <w:t>ExposureScout</w:t>
-      </w:r>
-      <w:proofErr w:type="spellEnd"/>
+      </w:pPr>
       <w:r>
         <w:rPr>
           <w:lang w:val="fr-FR"/>
         </w:rPr>
-        <w:t xml:space="preserve"> module.</w:t>
+        <w:t>2026-01-29 13:56:28-0500PM ET exposurescout Ten (10) new doppelganger domains discovered.</w:t>
       </w:r>
     </w:p>
     <w:p>
       <w:pPr>
         <w:pStyle w:val="ActivityBullet"/>
-      </w:pPr>
-      <w:r>
-        <w:t xml:space="preserve">2026-01-29 13:52:59-0500PM ET </w:t>
-      </w:r>
-      <w:proofErr w:type="spellStart"/>
-      <w:r>
-        <w:t>exposurescout</w:t>
-      </w:r>
-      <w:proofErr w:type="spellEnd"/>
-      <w:r>
-        <w:t xml:space="preserve"> Enumerating subdomains from one (1) domain.</w:t>
+        <w:rPr>
+          <w:lang w:val="fr-FR"/>
+        </w:rPr>
+      </w:pPr>
+      <w:r>
+        <w:rPr>
+          <w:lang w:val="fr-FR"/>
+        </w:rPr>
+        <w:t>2026-01-29 13:56:28-0500PM ET exposurescout Completed doppelganger domain enumeration.</w:t>
       </w:r>
     </w:p>
     <w:p>
       <w:pPr>
         <w:pStyle w:val="ActivityBullet"/>
+      </w:pPr>
+      <w:r>
+        <w:t>2026-01-29 13:56:28-0500PM ET exposurescout Running WHOIS commands on eight (8) domains.</w:t>
+      </w:r>
+    </w:p>
+    <w:p>
+      <w:pPr>
+        <w:pStyle w:val="ActivityBullet"/>
+      </w:pPr>
+      <w:r>
+        <w:t>2026-01-29 13:57:33-0500PM ET exposurescout Importing eight (8) WHOIS results into the database.</w:t>
+      </w:r>
+    </w:p>
+    <w:p>
+      <w:pPr>
+        <w:pStyle w:val="ActivityBullet"/>
+      </w:pPr>
+      <w:r>
+        <w:t>2026-01-29 13:57:34-0500PM ET exposurescout Completed recursive WHOIS lookups</w:t>
+      </w:r>
+    </w:p>
+    <w:p>
+      <w:pPr>
+        <w:pStyle w:val="ActivityBullet"/>
+      </w:pPr>
+      <w:r>
+        <w:t>2026-01-29 13:57:34-0500PM ET exposurescout Email scraping module started.</w:t>
+      </w:r>
+    </w:p>
+    <w:p>
+      <w:pPr>
+        <w:pStyle w:val="ActivityBullet"/>
+      </w:pPr>
+      <w:r>
+        <w:t>2026-01-29 13:58:40-0500PM ET exposurescout Completed email scraping.</w:t>
+      </w:r>
+    </w:p>
+    <w:p>
+      <w:pPr>
+        <w:pStyle w:val="ActivityBullet"/>
+      </w:pPr>
+      <w:r>
+        <w:t>2026-01-29 13:58:40-0500PM ET exposurescout Scanning subdomains for subdomain takeover vulnerability.</w:t>
+      </w:r>
+    </w:p>
+    <w:p>
+      <w:pPr>
+        <w:pStyle w:val="ActivityBullet"/>
+      </w:pPr>
+      <w:r>
+        <w:t>2026-01-29 13:59:44-0500PM ET exposurescout Found 1 domain vulnerable to subdomain takeover.</w:t>
+      </w:r>
+    </w:p>
+    <w:p>
+      <w:pPr>
+        <w:pStyle w:val="ActivityBullet"/>
+      </w:pPr>
+      <w:r>
+        <w:t>2026-01-29 13:59:44-0500PM ET exposurescout Completed subdomain takeover checks.</w:t>
+      </w:r>
+    </w:p>
+    <w:p>
+      <w:pPr>
+        <w:pStyle w:val="ActivityBullet"/>
         <w:rPr>
           <w:lang w:val="fr-FR"/>
         </w:rPr>
@@ -5652,2112 +5461,698 @@
         <w:rPr>
           <w:lang w:val="fr-FR"/>
         </w:rPr>
-        <w:t xml:space="preserve">2026-01-29 </w:t>
-      </w:r>
-      <w:proofErr w:type="gramStart"/>
-      <w:r>
+        <w:t>2026-01-29 13:59:44-0500PM ET exposurescout ExposureScout module completed.</w:t>
+      </w:r>
+    </w:p>
+    <w:p>
+      <w:pPr>
+        <w:pStyle w:val="ActivityBullet"/>
+      </w:pPr>
+      <w:r>
+        <w:t>2026-01-29 13:59:44-0500PM ET host discovery Performing DNS resolution for 1 DNS name.</w:t>
+      </w:r>
+    </w:p>
+    <w:p>
+      <w:pPr>
+        <w:pStyle w:val="ActivityBullet"/>
+      </w:pPr>
+      <w:r>
+        <w:t>2026-01-29 14:00:50-0500PM ET host discovery DNS resolution complete.</w:t>
+      </w:r>
+    </w:p>
+    <w:p>
+      <w:pPr>
+        <w:pStyle w:val="ActivityBullet"/>
+      </w:pPr>
+      <w:r>
+        <w:t>2026-01-29 14:00:50-0500PM ET host discovery Port scan module initialized.</w:t>
+      </w:r>
+    </w:p>
+    <w:p>
+      <w:pPr>
+        <w:pStyle w:val="ActivityBullet"/>
+      </w:pPr>
+      <w:r>
+        <w:t>2026-01-29 14:00:53-0500PM ET host discovery Conducting port scan against in-scope systems.</w:t>
+      </w:r>
+    </w:p>
+    <w:p>
+      <w:pPr>
+        <w:pStyle w:val="ActivityBullet"/>
+      </w:pPr>
+      <w:r>
+        <w:t>2026-01-29 14:00:57-0500PM ET host discovery Running nmap port scans.</w:t>
+      </w:r>
+    </w:p>
+    <w:p>
+      <w:pPr>
+        <w:pStyle w:val="ActivityBullet"/>
+      </w:pPr>
+      <w:r>
+        <w:t>2026-01-29 14:02:01-0500PM ET host discovery Completed nmap port scans.</w:t>
+      </w:r>
+    </w:p>
+    <w:p>
+      <w:pPr>
+        <w:pStyle w:val="ActivityBullet"/>
+      </w:pPr>
+      <w:r>
+        <w:t>2026-01-29 14:02:01-0500PM ET host discovery Port scans completed successfully.</w:t>
+      </w:r>
+    </w:p>
+    <w:p>
+      <w:pPr>
+        <w:pStyle w:val="ActivityBullet"/>
+      </w:pPr>
+      <w:r>
+        <w:t>2026-01-29 14:02:02-0500PM ET host discovery Parsing results for alive systems.</w:t>
+      </w:r>
+    </w:p>
+    <w:p>
+      <w:pPr>
+        <w:pStyle w:val="ActivityBullet"/>
+      </w:pPr>
+      <w:r>
+        <w:t>2026-01-29 14:02:02-0500PM ET host discovery Completed parsing Nmap results. 1 new IP addresses discovered and imported into DB.</w:t>
+      </w:r>
+    </w:p>
+    <w:p>
+      <w:pPr>
+        <w:pStyle w:val="ActivityBullet"/>
+      </w:pPr>
+      <w:r>
+        <w:t>2026-01-29 14:02:02-0500PM ET host discovery Parsing nmap port scans.</w:t>
+      </w:r>
+    </w:p>
+    <w:p>
+      <w:pPr>
+        <w:pStyle w:val="ActivityBullet"/>
+      </w:pPr>
+      <w:r>
+        <w:t>2026-01-29 14:02:02-0500PM ET host discovery Completed parsing port scans. Imported 3 new ports.</w:t>
+      </w:r>
+    </w:p>
+    <w:p>
+      <w:pPr>
+        <w:pStyle w:val="ActivityBullet"/>
+      </w:pPr>
+      <w:r>
+        <w:t>2026-01-29 14:02:02-0500PM ET host discovery Port scan module completed.</w:t>
+      </w:r>
+    </w:p>
+    <w:p>
+      <w:pPr>
+        <w:pStyle w:val="ActivityBullet"/>
+      </w:pPr>
+      <w:r>
+        <w:t>2026-01-29 14:02:03-0500PM ET host discovery Discovery module completed.</w:t>
+      </w:r>
+    </w:p>
+    <w:p>
+      <w:pPr>
+        <w:pStyle w:val="ActivityBullet"/>
+      </w:pPr>
+      <w:r>
+        <w:t>2026-01-29 14:02:27-0500PM ET host discovery Running nmap port version scans.</w:t>
+      </w:r>
+    </w:p>
+    <w:p>
+      <w:pPr>
+        <w:pStyle w:val="ActivityBullet"/>
+      </w:pPr>
+      <w:r>
+        <w:t>2026-01-29 14:03:30-0500PM ET host discovery Completed nmap port version scans.</w:t>
+      </w:r>
+    </w:p>
+    <w:p>
+      <w:pPr>
+        <w:pStyle w:val="ActivityBullet"/>
+      </w:pPr>
+      <w:r>
+        <w:t>2026-01-29 14:03:35-0500PM ET enumeration Enumeration module initialized.</w:t>
+      </w:r>
+    </w:p>
+    <w:p>
+      <w:pPr>
+        <w:pStyle w:val="ActivityBullet"/>
+      </w:pPr>
+      <w:r>
+        <w:t>2026-01-29 14:04:43-0500PM ET enumeration Enumerating HTTP services.</w:t>
+      </w:r>
+    </w:p>
+    <w:p>
+      <w:pPr>
+        <w:pStyle w:val="ActivityBullet"/>
+      </w:pPr>
+      <w:r>
+        <w:t>2026-01-29 14:04:43-0500PM ET enumeration Enumerating HTTPS services.</w:t>
+      </w:r>
+    </w:p>
+    <w:p>
+      <w:pPr>
+        <w:pStyle w:val="ActivityBullet"/>
+      </w:pPr>
+      <w:r>
+        <w:t>2026-01-29 14:04:43-0500PM ET enumeration Enumerating SSH services.</w:t>
+      </w:r>
+    </w:p>
+    <w:p>
+      <w:pPr>
+        <w:pStyle w:val="ActivityBullet"/>
+      </w:pPr>
+      <w:r>
+        <w:t>2026-01-29 14:04:47-0500PM ET enumeration Running nmap script scan using script: http-headers.</w:t>
+      </w:r>
+    </w:p>
+    <w:p>
+      <w:pPr>
+        <w:pStyle w:val="ActivityBullet"/>
+      </w:pPr>
+      <w:r>
+        <w:t>2026-01-29 14:04:47-0500PM ET enumeration Running nmap script scan using script: http-methods.</w:t>
+      </w:r>
+    </w:p>
+    <w:p>
+      <w:pPr>
+        <w:pStyle w:val="ActivityBullet"/>
+      </w:pPr>
+      <w:r>
+        <w:t>2026-01-29 14:04:47-0500PM ET enumeration Running nmap script scan using script: http-headers.</w:t>
+      </w:r>
+    </w:p>
+    <w:p>
+      <w:pPr>
+        <w:pStyle w:val="ActivityBullet"/>
+      </w:pPr>
+      <w:r>
+        <w:t>2026-01-29 14:04:47-0500PM ET enumeration Running nmap script scan using script: http-robots.txt.</w:t>
+      </w:r>
+    </w:p>
+    <w:p>
+      <w:pPr>
+        <w:pStyle w:val="ActivityBullet"/>
+      </w:pPr>
+      <w:r>
+        <w:t>2026-01-29 14:04:47-0500PM ET enumeration Running nmap script scan using script: http-robots.txt.</w:t>
+      </w:r>
+    </w:p>
+    <w:p>
+      <w:pPr>
+        <w:pStyle w:val="ActivityBullet"/>
+      </w:pPr>
+      <w:r>
+        <w:t>2026-01-29 14:04:47-0500PM ET enumeration Running nmap script scan using script: http-put.</w:t>
+      </w:r>
+    </w:p>
+    <w:p>
+      <w:pPr>
+        <w:pStyle w:val="ActivityBullet"/>
+      </w:pPr>
+      <w:r>
+        <w:t>2026-01-29 14:04:47-0500PM ET enumeration Running nmap script scan using script: http-title.</w:t>
+      </w:r>
+    </w:p>
+    <w:p>
+      <w:pPr>
+        <w:pStyle w:val="ActivityBullet"/>
+      </w:pPr>
+      <w:r>
+        <w:t>2026-01-29 14:04:47-0500PM ET enumeration Running nmap script scan using script: http-shellshock.</w:t>
+      </w:r>
+    </w:p>
+    <w:p>
+      <w:pPr>
+        <w:pStyle w:val="ActivityBullet"/>
+      </w:pPr>
+      <w:r>
+        <w:t>2026-01-29 14:04:47-0500PM ET enumeration Running nmap script scan using script: http-methods.</w:t>
+      </w:r>
+    </w:p>
+    <w:p>
+      <w:pPr>
+        <w:pStyle w:val="ActivityBullet"/>
+      </w:pPr>
+      <w:r>
+        <w:t>2026-01-29 14:04:47-0500PM ET enumeration Running nmap script scan using script: sslv2.</w:t>
+      </w:r>
+    </w:p>
+    <w:p>
+      <w:pPr>
+        <w:pStyle w:val="ActivityBullet"/>
+      </w:pPr>
+      <w:r>
+        <w:t>2026-01-29 14:04:47-0500PM ET enumeration Running nmap script scan using script: ssl-cert.</w:t>
+      </w:r>
+    </w:p>
+    <w:p>
+      <w:pPr>
+        <w:pStyle w:val="ActivityBullet"/>
+      </w:pPr>
+      <w:r>
+        <w:t>2026-01-29 14:04:47-0500PM ET enumeration Running nmap script scan using script: ssl-enum-ciphers.</w:t>
+      </w:r>
+    </w:p>
+    <w:p>
+      <w:pPr>
+        <w:pStyle w:val="ActivityBullet"/>
+      </w:pPr>
+      <w:r>
+        <w:t>2026-01-29 14:04:47-0500PM ET enumeration Running nmap script scan using script: http-shellshock.</w:t>
+      </w:r>
+    </w:p>
+    <w:p>
+      <w:pPr>
+        <w:pStyle w:val="ActivityBullet"/>
+      </w:pPr>
+      <w:r>
+        <w:t>2026-01-29 14:04:47-0500PM ET enumeration Running nmap script scan using script: ssl-poodle.</w:t>
+      </w:r>
+    </w:p>
+    <w:p>
+      <w:pPr>
+        <w:pStyle w:val="ActivityBullet"/>
+      </w:pPr>
+      <w:r>
+        <w:t>2026-01-29 14:04:47-0500PM ET enumeration Running nmap script scan using script: http-put.</w:t>
+      </w:r>
+    </w:p>
+    <w:p>
+      <w:pPr>
+        <w:pStyle w:val="ActivityBullet"/>
+      </w:pPr>
+      <w:r>
+        <w:t>2026-01-29 14:04:47-0500PM ET enumeration Running nmap script scan using script: ssl-heartbleed.</w:t>
+      </w:r>
+    </w:p>
+    <w:p>
+      <w:pPr>
+        <w:pStyle w:val="ActivityBullet"/>
+      </w:pPr>
+      <w:r>
+        <w:t>2026-01-29 14:04:47-0500PM ET enumeration Running nmap script scan using script: http-title.</w:t>
+      </w:r>
+    </w:p>
+    <w:p>
+      <w:pPr>
+        <w:pStyle w:val="ActivityBullet"/>
+      </w:pPr>
+      <w:r>
+        <w:t>2026-01-29 14:04:47-0500PM ET enumeration Running nmap script scan using script: ssl-date.</w:t>
+      </w:r>
+    </w:p>
+    <w:p>
+      <w:pPr>
+        <w:pStyle w:val="ActivityBullet"/>
+      </w:pPr>
+      <w:r>
+        <w:t>2026-01-29 14:04:47-0500PM ET enumeration Queuing up MSF module: auxiliary/scanner/ssh/ssh_version.</w:t>
+      </w:r>
+    </w:p>
+    <w:p>
+      <w:pPr>
+        <w:pStyle w:val="ActivityBullet"/>
+      </w:pPr>
+      <w:r>
+        <w:t>2026-01-29 14:05:50-0500PM ET enumeration Completed MSF module: auxiliary/scanner/ssh/ssh_version.</w:t>
+      </w:r>
+    </w:p>
+    <w:p>
+      <w:pPr>
+        <w:pStyle w:val="ActivityBullet"/>
+      </w:pPr>
+      <w:r>
+        <w:lastRenderedPageBreak/>
+        <w:t>2026-01-29 14:05:50-0500PM ET enumeration Completed nmap script scan using script: http-methods.</w:t>
+      </w:r>
+    </w:p>
+    <w:p>
+      <w:pPr>
+        <w:pStyle w:val="ActivityBullet"/>
+      </w:pPr>
+      <w:r>
+        <w:t>2026-01-29 14:05:50-0500PM ET enumeration Completed nmap script scan using script: ssl-enum-ciphers.</w:t>
+      </w:r>
+    </w:p>
+    <w:p>
+      <w:pPr>
+        <w:pStyle w:val="ActivityBullet"/>
+      </w:pPr>
+      <w:r>
+        <w:t>2026-01-29 14:05:50-0500PM ET enumeration Completed nmap script scan using script: http-put.</w:t>
+      </w:r>
+    </w:p>
+    <w:p>
+      <w:pPr>
+        <w:pStyle w:val="ActivityBullet"/>
+      </w:pPr>
+      <w:r>
+        <w:t>2026-01-29 14:05:50-0500PM ET enumeration Completed nmap script scan using script: http-robots.txt.</w:t>
+      </w:r>
+    </w:p>
+    <w:p>
+      <w:pPr>
+        <w:pStyle w:val="ActivityBullet"/>
+      </w:pPr>
+      <w:r>
+        <w:t>2026-01-29 14:05:50-0500PM ET enumeration Completed nmap script scan using script: ssl-heartbleed.</w:t>
+      </w:r>
+    </w:p>
+    <w:p>
+      <w:pPr>
+        <w:pStyle w:val="ActivityBullet"/>
+      </w:pPr>
+      <w:r>
+        <w:t>2026-01-29 14:05:50-0500PM ET enumeration Completed nmap script scan using script: http-shellshock.</w:t>
+      </w:r>
+    </w:p>
+    <w:p>
+      <w:pPr>
+        <w:pStyle w:val="ActivityBullet"/>
+      </w:pPr>
+      <w:r>
+        <w:t>2026-01-29 14:05:50-0500PM ET enumeration Completed nmap script scan using script: http-robots.txt.</w:t>
+      </w:r>
+    </w:p>
+    <w:p>
+      <w:pPr>
+        <w:pStyle w:val="ActivityBullet"/>
+      </w:pPr>
+      <w:r>
+        <w:t>2026-01-29 14:05:51-0500PM ET enumeration Completed nmap script scan using script: http-put.</w:t>
+      </w:r>
+    </w:p>
+    <w:p>
+      <w:pPr>
+        <w:pStyle w:val="ActivityBullet"/>
+      </w:pPr>
+      <w:r>
+        <w:t>2026-01-29 14:05:51-0500PM ET enumeration Completed nmap script scan using script: http-headers.</w:t>
+      </w:r>
+    </w:p>
+    <w:p>
+      <w:pPr>
+        <w:pStyle w:val="ActivityBullet"/>
+      </w:pPr>
+      <w:r>
+        <w:t>2026-01-29 14:05:51-0500PM ET enumeration Completed nmap script scan using script: http-methods.</w:t>
+      </w:r>
+    </w:p>
+    <w:p>
+      <w:pPr>
+        <w:pStyle w:val="ActivityBullet"/>
+      </w:pPr>
+      <w:r>
+        <w:t>2026-01-29 14:05:51-0500PM ET enumeration Completed nmap script scan using script: ssl-date.</w:t>
+      </w:r>
+    </w:p>
+    <w:p>
+      <w:pPr>
+        <w:pStyle w:val="ActivityBullet"/>
+      </w:pPr>
+      <w:r>
+        <w:t>2026-01-29 14:05:51-0500PM ET enumeration Completed nmap script scan using script: http-title.</w:t>
+      </w:r>
+    </w:p>
+    <w:p>
+      <w:pPr>
+        <w:pStyle w:val="ActivityBullet"/>
+      </w:pPr>
+      <w:r>
+        <w:t>2026-01-29 14:05:51-0500PM ET enumeration Completed nmap script scan using script: http-shellshock.</w:t>
+      </w:r>
+    </w:p>
+    <w:p>
+      <w:pPr>
+        <w:pStyle w:val="ActivityBullet"/>
+      </w:pPr>
+      <w:r>
+        <w:t>2026-01-29 14:05:51-0500PM ET enumeration Completed nmap script scan using script: http-headers.</w:t>
+      </w:r>
+    </w:p>
+    <w:p>
+      <w:pPr>
+        <w:pStyle w:val="ActivityBullet"/>
+      </w:pPr>
+      <w:r>
+        <w:t>2026-01-29 14:05:51-0500PM ET enumeration Completed nmap script scan using script: ssl-poodle.</w:t>
+      </w:r>
+    </w:p>
+    <w:p>
+      <w:pPr>
+        <w:pStyle w:val="ActivityBullet"/>
+      </w:pPr>
+      <w:r>
+        <w:t>2026-01-29 14:05:51-0500PM ET enumeration Completed nmap script scan using script: ssl-cert.</w:t>
+      </w:r>
+    </w:p>
+    <w:p>
+      <w:pPr>
+        <w:pStyle w:val="ActivityBullet"/>
+      </w:pPr>
+      <w:r>
+        <w:t>2026-01-29 14:05:51-0500PM ET enumeration Completed nmap script scan using script: sslv2.</w:t>
+      </w:r>
+    </w:p>
+    <w:p>
+      <w:pPr>
+        <w:pStyle w:val="ActivityBullet"/>
+      </w:pPr>
+      <w:r>
+        <w:t>2026-01-29 14:05:51-0500PM ET enumeration Completed nmap script scan using script: http-title.</w:t>
+      </w:r>
+    </w:p>
+    <w:p>
+      <w:pPr>
+        <w:pStyle w:val="ActivityBullet"/>
+      </w:pPr>
+      <w:r>
+        <w:t>2026-01-29 14:05:51-0500PM ET enumeration Peforming a hidden directory enumeration attack on 80/tcp.</w:t>
+      </w:r>
+    </w:p>
+    <w:p>
+      <w:pPr>
+        <w:pStyle w:val="ActivityBullet"/>
+      </w:pPr>
+      <w:r>
+        <w:t>2026-01-29 14:05:54-0500PM ET enumeration Running nmap script scan using script: sshv1.</w:t>
+      </w:r>
+    </w:p>
+    <w:p>
+      <w:pPr>
+        <w:pStyle w:val="ActivityBullet"/>
+      </w:pPr>
+      <w:r>
+        <w:t>2026-01-29 14:05:54-0500PM ET enumeration Running nmap script scan using script: ssh2-enum-algos.</w:t>
+      </w:r>
+    </w:p>
+    <w:p>
+      <w:pPr>
+        <w:pStyle w:val="ActivityBullet"/>
+      </w:pPr>
+      <w:r>
+        <w:t>2026-01-29 14:05:54-0500PM ET enumeration Running nmap script scan using script: ssh-auth-methods.</w:t>
+      </w:r>
+    </w:p>
+    <w:p>
+      <w:pPr>
+        <w:pStyle w:val="ActivityBullet"/>
         <w:rPr>
           <w:lang w:val="fr-FR"/>
         </w:rPr>
-        <w:t>13:54:</w:t>
-      </w:r>
-      <w:proofErr w:type="gramEnd"/>
+      </w:pPr>
       <w:r>
         <w:rPr>
           <w:lang w:val="fr-FR"/>
         </w:rPr>
-        <w:t xml:space="preserve">13-0500PM ET </w:t>
-      </w:r>
-      <w:proofErr w:type="spellStart"/>
-      <w:r>
+        <w:t>2026-01-29 14:05:54-0500PM ET enumeration Analyzing SSL/TLS protocols on port 443/tcp.</w:t>
+      </w:r>
+    </w:p>
+    <w:p>
+      <w:pPr>
+        <w:pStyle w:val="ActivityBullet"/>
+      </w:pPr>
+      <w:r>
+        <w:t>2026-01-29 14:06:55-0500PM ET enumeration Completed SSL/TLS analysis on ports 443/tcp.</w:t>
+      </w:r>
+    </w:p>
+    <w:p>
+      <w:pPr>
+        <w:pStyle w:val="ActivityBullet"/>
+      </w:pPr>
+      <w:r>
+        <w:t>2026-01-29 14:06:55-0500PM ET enumeration Completed hidden directory enumeration scan.</w:t>
+      </w:r>
+    </w:p>
+    <w:p>
+      <w:pPr>
+        <w:pStyle w:val="ActivityBullet"/>
+      </w:pPr>
+      <w:r>
+        <w:t>2026-01-29 14:06:55-0500PM ET enumeration Peforming a hidden directory enumeration attack on 443/tcp.</w:t>
+      </w:r>
+    </w:p>
+    <w:p>
+      <w:pPr>
+        <w:pStyle w:val="ActivityBullet"/>
+      </w:pPr>
+      <w:r>
+        <w:t>2026-01-29 14:06:55-0500PM ET enumeration Completed nmap script scan using script: ssh2-enum-algos.</w:t>
+      </w:r>
+    </w:p>
+    <w:p>
+      <w:pPr>
+        <w:pStyle w:val="ActivityBullet"/>
+      </w:pPr>
+      <w:r>
+        <w:t>2026-01-29 14:06:55-0500PM ET enumeration Completed nmap script scan using script: ssh-auth-methods.</w:t>
+      </w:r>
+    </w:p>
+    <w:p>
+      <w:pPr>
+        <w:pStyle w:val="ActivityBullet"/>
+      </w:pPr>
+      <w:r>
+        <w:t>2026-01-29 14:06:55-0500PM ET enumeration Completed nmap script scan using script: sshv1.</w:t>
+      </w:r>
+    </w:p>
+    <w:p>
+      <w:pPr>
+        <w:pStyle w:val="ActivityBullet"/>
+      </w:pPr>
+      <w:r>
+        <w:t>2026-01-29 14:06:55-0500PM ET enumeration Completed enumerating SSH services.</w:t>
+      </w:r>
+    </w:p>
+    <w:p>
+      <w:pPr>
+        <w:pStyle w:val="ActivityBullet"/>
+      </w:pPr>
+      <w:r>
+        <w:t>2026-01-29 14:06:58-0500PM ET enumeration Analyzing web services running on port 80/tcp.</w:t>
+      </w:r>
+    </w:p>
+    <w:p>
+      <w:pPr>
+        <w:pStyle w:val="ActivityBullet"/>
+      </w:pPr>
+      <w:r>
+        <w:t>2026-01-29 14:08:10-0500PM ET enumeration Completed analyzing web services running on port 80/tcp.</w:t>
+      </w:r>
+    </w:p>
+    <w:p>
+      <w:pPr>
+        <w:pStyle w:val="ActivityBullet"/>
+      </w:pPr>
+      <w:r>
+        <w:t>2026-01-29 14:08:10-0500PM ET enumeration Completed hidden directory enumeration scan.</w:t>
+      </w:r>
+    </w:p>
+    <w:p>
+      <w:pPr>
+        <w:pStyle w:val="ActivityBullet"/>
+      </w:pPr>
+      <w:r>
+        <w:t>2026-01-29 14:08:10-0500PM ET enumeration Completed analyzing web services running on port 80/tcp.</w:t>
+      </w:r>
+    </w:p>
+    <w:p>
+      <w:pPr>
+        <w:pStyle w:val="ActivityBullet"/>
+      </w:pPr>
+      <w:r>
+        <w:t>2026-01-29 14:08:10-0500PM ET enumeration Completed enumerating HTTP services.</w:t>
+      </w:r>
+    </w:p>
+    <w:p>
+      <w:pPr>
+        <w:pStyle w:val="ActivityBullet"/>
+      </w:pPr>
+      <w:r>
+        <w:t>2026-01-29 14:08:13-0500PM ET enumeration Analyzing web services running on port 443/tcp.</w:t>
+      </w:r>
+    </w:p>
+    <w:p>
+      <w:pPr>
+        <w:pStyle w:val="ActivityBullet"/>
+      </w:pPr>
+      <w:r>
+        <w:t>2026-01-29 14:09:15-0500PM ET enumeration Completed analyzing web services running on port 443/tcp.</w:t>
+      </w:r>
+    </w:p>
+    <w:p>
+      <w:pPr>
+        <w:pStyle w:val="ActivityBullet"/>
+      </w:pPr>
+      <w:r>
+        <w:t>2026-01-29 14:09:15-0500PM ET enumeration Completed analyzing web services running on port 443/tcp.</w:t>
+      </w:r>
+    </w:p>
+    <w:p>
+      <w:pPr>
+        <w:pStyle w:val="ActivityBullet"/>
+      </w:pPr>
+      <w:r>
+        <w:t>2026-01-29 14:09:16-0500PM ET enumeration Completed enumerating HTTPS services.</w:t>
+      </w:r>
+    </w:p>
+    <w:p>
+      <w:pPr>
+        <w:pStyle w:val="ActivityBullet"/>
+      </w:pPr>
+      <w:r>
+        <w:t>2026-01-29 14:09:45-0500PM ET enumeration Enumeration module completed.</w:t>
+      </w:r>
+    </w:p>
+    <w:p>
+      <w:pPr>
+        <w:pStyle w:val="ActivityBullet"/>
         <w:rPr>
           <w:lang w:val="fr-FR"/>
         </w:rPr>
-        <w:t>exposurescout</w:t>
-      </w:r>
-      <w:proofErr w:type="spellEnd"/>
+      </w:pPr>
       <w:r>
         <w:rPr>
           <w:lang w:val="fr-FR"/>
         </w:rPr>
-        <w:t xml:space="preserve"> </w:t>
-      </w:r>
-      <w:proofErr w:type="spellStart"/>
-      <w:r>
+        <w:t>2026-01-29 14:10:06-0500PM ET exploit Launching exploit module.</w:t>
+      </w:r>
+    </w:p>
+    <w:p>
+      <w:pPr>
+        <w:pStyle w:val="ActivityBullet"/>
+      </w:pPr>
+      <w:r>
+        <w:t>2026-01-29 14:10:11-0500PM ET exploit Queuing up hydra attack: SSH password attack.</w:t>
+      </w:r>
+    </w:p>
+    <w:p>
+      <w:pPr>
+        <w:pStyle w:val="ActivityBullet"/>
+      </w:pPr>
+      <w:r>
+        <w:t>2026-01-29 14:11:16-0500PM ET exploit Completed hydra attack: SSH password attack.</w:t>
+      </w:r>
+    </w:p>
+    <w:p>
+      <w:pPr>
+        <w:pStyle w:val="ActivityBullet"/>
+      </w:pPr>
+      <w:r>
+        <w:t>2026-01-29 14:11:16-0500PM ET exploit Completed SSH password attack.</w:t>
+      </w:r>
+    </w:p>
+    <w:p>
+      <w:pPr>
+        <w:pStyle w:val="ActivityBullet"/>
         <w:rPr>
           <w:lang w:val="fr-FR"/>
         </w:rPr>
-        <w:t>Completed</w:t>
-      </w:r>
-      <w:proofErr w:type="spellEnd"/>
+      </w:pPr>
       <w:r>
         <w:rPr>
           <w:lang w:val="fr-FR"/>
         </w:rPr>
-        <w:t xml:space="preserve"> </w:t>
-      </w:r>
-      <w:proofErr w:type="spellStart"/>
-      <w:r>
-        <w:rPr>
-          <w:lang w:val="fr-FR"/>
-        </w:rPr>
-        <w:t>subdomain</w:t>
-      </w:r>
-      <w:proofErr w:type="spellEnd"/>
-      <w:r>
-        <w:rPr>
-          <w:lang w:val="fr-FR"/>
-        </w:rPr>
-        <w:t xml:space="preserve"> </w:t>
-      </w:r>
-      <w:proofErr w:type="spellStart"/>
-      <w:r>
-        <w:rPr>
-          <w:lang w:val="fr-FR"/>
-        </w:rPr>
-        <w:t>enumeration</w:t>
-      </w:r>
-      <w:proofErr w:type="spellEnd"/>
-      <w:r>
-        <w:rPr>
-          <w:lang w:val="fr-FR"/>
-        </w:rPr>
-        <w:t>.</w:t>
-      </w:r>
-    </w:p>
-    <w:p>
-      <w:pPr>
-        <w:pStyle w:val="ActivityBullet"/>
-      </w:pPr>
-      <w:r>
-        <w:t xml:space="preserve">2026-01-29 13:54:13-0500PM ET </w:t>
-      </w:r>
-      <w:proofErr w:type="spellStart"/>
-      <w:r>
-        <w:t>exposurescout</w:t>
-      </w:r>
-      <w:proofErr w:type="spellEnd"/>
-      <w:r>
-        <w:t xml:space="preserve"> Beginning DNS enumeration.</w:t>
-      </w:r>
-    </w:p>
-    <w:p>
-      <w:pPr>
-        <w:pStyle w:val="ActivityBullet"/>
-        <w:rPr>
-          <w:lang w:val="fr-FR"/>
-        </w:rPr>
-      </w:pPr>
-      <w:r>
-        <w:rPr>
-          <w:lang w:val="fr-FR"/>
-        </w:rPr>
-        <w:t xml:space="preserve">2026-01-29 </w:t>
-      </w:r>
-      <w:proofErr w:type="gramStart"/>
-      <w:r>
-        <w:rPr>
-          <w:lang w:val="fr-FR"/>
-        </w:rPr>
-        <w:t>13:55:</w:t>
-      </w:r>
-      <w:proofErr w:type="gramEnd"/>
-      <w:r>
-        <w:rPr>
-          <w:lang w:val="fr-FR"/>
-        </w:rPr>
-        <w:t xml:space="preserve">18-0500PM ET </w:t>
-      </w:r>
-      <w:proofErr w:type="spellStart"/>
-      <w:r>
-        <w:rPr>
-          <w:lang w:val="fr-FR"/>
-        </w:rPr>
-        <w:t>exposurescout</w:t>
-      </w:r>
-      <w:proofErr w:type="spellEnd"/>
-      <w:r>
-        <w:rPr>
-          <w:lang w:val="fr-FR"/>
-        </w:rPr>
-        <w:t xml:space="preserve"> </w:t>
-      </w:r>
-      <w:proofErr w:type="spellStart"/>
-      <w:r>
-        <w:rPr>
-          <w:lang w:val="fr-FR"/>
-        </w:rPr>
-        <w:t>Completed</w:t>
-      </w:r>
-      <w:proofErr w:type="spellEnd"/>
-      <w:r>
-        <w:rPr>
-          <w:lang w:val="fr-FR"/>
-        </w:rPr>
-        <w:t xml:space="preserve"> DNS </w:t>
-      </w:r>
-      <w:proofErr w:type="spellStart"/>
-      <w:r>
-        <w:rPr>
-          <w:lang w:val="fr-FR"/>
-        </w:rPr>
-        <w:t>enumeration</w:t>
-      </w:r>
-      <w:proofErr w:type="spellEnd"/>
-      <w:r>
-        <w:rPr>
-          <w:lang w:val="fr-FR"/>
-        </w:rPr>
-        <w:t>.</w:t>
-      </w:r>
-    </w:p>
-    <w:p>
-      <w:pPr>
-        <w:pStyle w:val="ActivityBullet"/>
-      </w:pPr>
-      <w:r>
-        <w:t xml:space="preserve">2026-01-29 13:55:18-0500PM ET </w:t>
-      </w:r>
-      <w:proofErr w:type="spellStart"/>
-      <w:r>
-        <w:t>exposurescout</w:t>
-      </w:r>
-      <w:proofErr w:type="spellEnd"/>
-      <w:r>
-        <w:t xml:space="preserve"> Enumerating doppelganger domains for one (1) domain.</w:t>
-      </w:r>
-    </w:p>
-    <w:p>
-      <w:pPr>
-        <w:pStyle w:val="ActivityBullet"/>
-        <w:rPr>
-          <w:lang w:val="fr-FR"/>
-        </w:rPr>
-      </w:pPr>
-      <w:r>
-        <w:rPr>
-          <w:lang w:val="fr-FR"/>
-        </w:rPr>
-        <w:t xml:space="preserve">2026-01-29 </w:t>
-      </w:r>
-      <w:proofErr w:type="gramStart"/>
-      <w:r>
-        <w:rPr>
-          <w:lang w:val="fr-FR"/>
-        </w:rPr>
-        <w:t>13:56:</w:t>
-      </w:r>
-      <w:proofErr w:type="gramEnd"/>
-      <w:r>
-        <w:rPr>
-          <w:lang w:val="fr-FR"/>
-        </w:rPr>
-        <w:t xml:space="preserve">28-0500PM ET </w:t>
-      </w:r>
-      <w:proofErr w:type="spellStart"/>
-      <w:r>
-        <w:rPr>
-          <w:lang w:val="fr-FR"/>
-        </w:rPr>
-        <w:t>exposurescout</w:t>
-      </w:r>
-      <w:proofErr w:type="spellEnd"/>
-      <w:r>
-        <w:rPr>
-          <w:lang w:val="fr-FR"/>
-        </w:rPr>
-        <w:t xml:space="preserve"> Ten (10) new </w:t>
-      </w:r>
-      <w:proofErr w:type="spellStart"/>
-      <w:r>
-        <w:rPr>
-          <w:lang w:val="fr-FR"/>
-        </w:rPr>
-        <w:t>doppelganger</w:t>
-      </w:r>
-      <w:proofErr w:type="spellEnd"/>
-      <w:r>
-        <w:rPr>
-          <w:lang w:val="fr-FR"/>
-        </w:rPr>
-        <w:t xml:space="preserve"> </w:t>
-      </w:r>
-      <w:proofErr w:type="spellStart"/>
-      <w:r>
-        <w:rPr>
-          <w:lang w:val="fr-FR"/>
-        </w:rPr>
-        <w:t>domains</w:t>
-      </w:r>
-      <w:proofErr w:type="spellEnd"/>
-      <w:r>
-        <w:rPr>
-          <w:lang w:val="fr-FR"/>
-        </w:rPr>
-        <w:t xml:space="preserve"> </w:t>
-      </w:r>
-      <w:proofErr w:type="spellStart"/>
-      <w:r>
-        <w:rPr>
-          <w:lang w:val="fr-FR"/>
-        </w:rPr>
-        <w:t>discovered</w:t>
-      </w:r>
-      <w:proofErr w:type="spellEnd"/>
-      <w:r>
-        <w:rPr>
-          <w:lang w:val="fr-FR"/>
-        </w:rPr>
-        <w:t>.</w:t>
-      </w:r>
-    </w:p>
-    <w:p>
-      <w:pPr>
-        <w:pStyle w:val="ActivityBullet"/>
-        <w:rPr>
-          <w:lang w:val="fr-FR"/>
-        </w:rPr>
-      </w:pPr>
-      <w:r>
-        <w:rPr>
-          <w:lang w:val="fr-FR"/>
-        </w:rPr>
-        <w:t xml:space="preserve">2026-01-29 </w:t>
-      </w:r>
-      <w:proofErr w:type="gramStart"/>
-      <w:r>
-        <w:rPr>
-          <w:lang w:val="fr-FR"/>
-        </w:rPr>
-        <w:t>13:56:</w:t>
-      </w:r>
-      <w:proofErr w:type="gramEnd"/>
-      <w:r>
-        <w:rPr>
-          <w:lang w:val="fr-FR"/>
-        </w:rPr>
-        <w:t xml:space="preserve">28-0500PM ET </w:t>
-      </w:r>
-      <w:proofErr w:type="spellStart"/>
-      <w:r>
-        <w:rPr>
-          <w:lang w:val="fr-FR"/>
-        </w:rPr>
-        <w:t>exposurescout</w:t>
-      </w:r>
-      <w:proofErr w:type="spellEnd"/>
-      <w:r>
-        <w:rPr>
-          <w:lang w:val="fr-FR"/>
-        </w:rPr>
-        <w:t xml:space="preserve"> </w:t>
-      </w:r>
-      <w:proofErr w:type="spellStart"/>
-      <w:r>
-        <w:rPr>
-          <w:lang w:val="fr-FR"/>
-        </w:rPr>
-        <w:t>Completed</w:t>
-      </w:r>
-      <w:proofErr w:type="spellEnd"/>
-      <w:r>
-        <w:rPr>
-          <w:lang w:val="fr-FR"/>
-        </w:rPr>
-        <w:t xml:space="preserve"> </w:t>
-      </w:r>
-      <w:proofErr w:type="spellStart"/>
-      <w:r>
-        <w:rPr>
-          <w:lang w:val="fr-FR"/>
-        </w:rPr>
-        <w:t>doppelganger</w:t>
-      </w:r>
-      <w:proofErr w:type="spellEnd"/>
-      <w:r>
-        <w:rPr>
-          <w:lang w:val="fr-FR"/>
-        </w:rPr>
-        <w:t xml:space="preserve"> </w:t>
-      </w:r>
-      <w:proofErr w:type="spellStart"/>
-      <w:r>
-        <w:rPr>
-          <w:lang w:val="fr-FR"/>
-        </w:rPr>
-        <w:t>domain</w:t>
-      </w:r>
-      <w:proofErr w:type="spellEnd"/>
-      <w:r>
-        <w:rPr>
-          <w:lang w:val="fr-FR"/>
-        </w:rPr>
-        <w:t xml:space="preserve"> </w:t>
-      </w:r>
-      <w:proofErr w:type="spellStart"/>
-      <w:r>
-        <w:rPr>
-          <w:lang w:val="fr-FR"/>
-        </w:rPr>
-        <w:t>enumeration</w:t>
-      </w:r>
-      <w:proofErr w:type="spellEnd"/>
-      <w:r>
-        <w:rPr>
-          <w:lang w:val="fr-FR"/>
-        </w:rPr>
-        <w:t>.</w:t>
-      </w:r>
-    </w:p>
-    <w:p>
-      <w:pPr>
-        <w:pStyle w:val="ActivityBullet"/>
-      </w:pPr>
-      <w:r>
-        <w:t xml:space="preserve">2026-01-29 13:56:28-0500PM ET </w:t>
-      </w:r>
-      <w:proofErr w:type="spellStart"/>
-      <w:r>
-        <w:t>exposurescout</w:t>
-      </w:r>
-      <w:proofErr w:type="spellEnd"/>
-      <w:r>
-        <w:t xml:space="preserve"> Running WHOIS commands on eight (8) domains.</w:t>
-      </w:r>
-    </w:p>
-    <w:p>
-      <w:pPr>
-        <w:pStyle w:val="ActivityBullet"/>
-      </w:pPr>
-      <w:r>
-        <w:t xml:space="preserve">2026-01-29 13:57:33-0500PM ET </w:t>
-      </w:r>
-      <w:proofErr w:type="spellStart"/>
-      <w:r>
-        <w:t>exposurescout</w:t>
-      </w:r>
-      <w:proofErr w:type="spellEnd"/>
-      <w:r>
-        <w:t xml:space="preserve"> Importing eight (8) WHOIS results into the database.</w:t>
-      </w:r>
-    </w:p>
-    <w:p>
-      <w:pPr>
-        <w:pStyle w:val="ActivityBullet"/>
-      </w:pPr>
-      <w:r>
-        <w:t xml:space="preserve">2026-01-29 13:57:34-0500PM ET </w:t>
-      </w:r>
-      <w:proofErr w:type="spellStart"/>
-      <w:r>
-        <w:t>exposurescout</w:t>
-      </w:r>
-      <w:proofErr w:type="spellEnd"/>
-      <w:r>
-        <w:t xml:space="preserve"> Completed recursive WHOIS lookups</w:t>
-      </w:r>
-    </w:p>
-    <w:p>
-      <w:pPr>
-        <w:pStyle w:val="ActivityBullet"/>
-      </w:pPr>
-      <w:r>
-        <w:t xml:space="preserve">2026-01-29 13:57:34-0500PM ET </w:t>
-      </w:r>
-      <w:proofErr w:type="spellStart"/>
-      <w:r>
-        <w:t>exposurescout</w:t>
-      </w:r>
-      <w:proofErr w:type="spellEnd"/>
-      <w:r>
-        <w:t xml:space="preserve"> Email scraping module started.</w:t>
-      </w:r>
-    </w:p>
-    <w:p>
-      <w:pPr>
-        <w:pStyle w:val="ActivityBullet"/>
-      </w:pPr>
-      <w:r>
-        <w:t xml:space="preserve">2026-01-29 13:58:40-0500PM ET </w:t>
-      </w:r>
-      <w:proofErr w:type="spellStart"/>
-      <w:r>
-        <w:t>exposurescout</w:t>
-      </w:r>
-      <w:proofErr w:type="spellEnd"/>
-      <w:r>
-        <w:t xml:space="preserve"> Completed email scraping.</w:t>
-      </w:r>
-    </w:p>
-    <w:p>
-      <w:pPr>
-        <w:pStyle w:val="ActivityBullet"/>
-      </w:pPr>
-      <w:r>
-        <w:t xml:space="preserve">2026-01-29 13:58:40-0500PM ET </w:t>
-      </w:r>
-      <w:proofErr w:type="spellStart"/>
-      <w:r>
-        <w:t>exposurescout</w:t>
-      </w:r>
-      <w:proofErr w:type="spellEnd"/>
-      <w:r>
-        <w:t xml:space="preserve"> Scanning subdomains for subdomain takeover vulnerability.</w:t>
-      </w:r>
-    </w:p>
-    <w:p>
-      <w:pPr>
-        <w:pStyle w:val="ActivityBullet"/>
-      </w:pPr>
-      <w:r>
-        <w:t xml:space="preserve">2026-01-29 13:59:44-0500PM ET </w:t>
-      </w:r>
-      <w:proofErr w:type="spellStart"/>
-      <w:r>
-        <w:t>exposurescout</w:t>
-      </w:r>
-      <w:proofErr w:type="spellEnd"/>
-      <w:r>
-        <w:t xml:space="preserve"> Found 1 domain vulnerable to subdomain takeover.</w:t>
-      </w:r>
-    </w:p>
-    <w:p>
-      <w:pPr>
-        <w:pStyle w:val="ActivityBullet"/>
-      </w:pPr>
-      <w:r>
-        <w:t xml:space="preserve">2026-01-29 13:59:44-0500PM ET </w:t>
-      </w:r>
-      <w:proofErr w:type="spellStart"/>
-      <w:r>
-        <w:t>exposurescout</w:t>
-      </w:r>
-      <w:proofErr w:type="spellEnd"/>
-      <w:r>
-        <w:t xml:space="preserve"> Completed subdomain takeover checks.</w:t>
-      </w:r>
-    </w:p>
-    <w:p>
-      <w:pPr>
-        <w:pStyle w:val="ActivityBullet"/>
-        <w:rPr>
-          <w:lang w:val="fr-FR"/>
-        </w:rPr>
-      </w:pPr>
-      <w:r>
-        <w:rPr>
-          <w:lang w:val="fr-FR"/>
-        </w:rPr>
-        <w:t xml:space="preserve">2026-01-29 </w:t>
-      </w:r>
-      <w:proofErr w:type="gramStart"/>
-      <w:r>
-        <w:rPr>
-          <w:lang w:val="fr-FR"/>
-        </w:rPr>
-        <w:t>13:59:</w:t>
-      </w:r>
-      <w:proofErr w:type="gramEnd"/>
-      <w:r>
-        <w:rPr>
-          <w:lang w:val="fr-FR"/>
-        </w:rPr>
-        <w:t xml:space="preserve">44-0500PM ET </w:t>
-      </w:r>
-      <w:proofErr w:type="spellStart"/>
-      <w:r>
-        <w:rPr>
-          <w:lang w:val="fr-FR"/>
-        </w:rPr>
-        <w:t>exposurescout</w:t>
-      </w:r>
-      <w:proofErr w:type="spellEnd"/>
-      <w:r>
-        <w:rPr>
-          <w:lang w:val="fr-FR"/>
-        </w:rPr>
-        <w:t xml:space="preserve"> </w:t>
-      </w:r>
-      <w:proofErr w:type="spellStart"/>
-      <w:r>
-        <w:rPr>
-          <w:lang w:val="fr-FR"/>
-        </w:rPr>
-        <w:t>ExposureScout</w:t>
-      </w:r>
-      <w:proofErr w:type="spellEnd"/>
-      <w:r>
-        <w:rPr>
-          <w:lang w:val="fr-FR"/>
-        </w:rPr>
-        <w:t xml:space="preserve"> module </w:t>
-      </w:r>
-      <w:proofErr w:type="spellStart"/>
-      <w:r>
-        <w:rPr>
-          <w:lang w:val="fr-FR"/>
-        </w:rPr>
-        <w:t>completed</w:t>
-      </w:r>
-      <w:proofErr w:type="spellEnd"/>
-      <w:r>
-        <w:rPr>
-          <w:lang w:val="fr-FR"/>
-        </w:rPr>
-        <w:t>.</w:t>
-      </w:r>
-    </w:p>
-    <w:p>
-      <w:pPr>
-        <w:pStyle w:val="ActivityBullet"/>
-      </w:pPr>
-      <w:r>
-        <w:t>2026-01-29 13:59:44-0500PM ET host discovery Performing DNS resolution for 1 DNS name.</w:t>
-      </w:r>
-    </w:p>
-    <w:p>
-      <w:pPr>
-        <w:pStyle w:val="ActivityBullet"/>
-      </w:pPr>
-      <w:r>
-        <w:t>2026-01-29 14:00:50-0500PM ET host discovery DNS resolution complete.</w:t>
-      </w:r>
-    </w:p>
-    <w:p>
-      <w:pPr>
-        <w:pStyle w:val="ActivityBullet"/>
-      </w:pPr>
-      <w:r>
-        <w:t>2026-01-29 14:00:50-0500PM ET host discovery Port scan module initialized.</w:t>
-      </w:r>
-    </w:p>
-    <w:p>
-      <w:pPr>
-        <w:pStyle w:val="ActivityBullet"/>
-      </w:pPr>
-      <w:r>
-        <w:t>2026-01-29 14:00:53-0500PM ET host discovery Conducting port scan against in-scope systems.</w:t>
-      </w:r>
-    </w:p>
-    <w:p>
-      <w:pPr>
-        <w:pStyle w:val="ActivityBullet"/>
-      </w:pPr>
-      <w:r>
-        <w:t xml:space="preserve">2026-01-29 14:00:57-0500PM ET host discovery Running </w:t>
-      </w:r>
-      <w:proofErr w:type="spellStart"/>
-      <w:r>
-        <w:t>nmap</w:t>
-      </w:r>
-      <w:proofErr w:type="spellEnd"/>
-      <w:r>
-        <w:t xml:space="preserve"> port scans.</w:t>
-      </w:r>
-    </w:p>
-    <w:p>
-      <w:pPr>
-        <w:pStyle w:val="ActivityBullet"/>
-      </w:pPr>
-      <w:r>
-        <w:t xml:space="preserve">2026-01-29 14:02:01-0500PM ET host discovery Completed </w:t>
-      </w:r>
-      <w:proofErr w:type="spellStart"/>
-      <w:r>
-        <w:t>nmap</w:t>
-      </w:r>
-      <w:proofErr w:type="spellEnd"/>
-      <w:r>
-        <w:t xml:space="preserve"> port scans.</w:t>
-      </w:r>
-    </w:p>
-    <w:p>
-      <w:pPr>
-        <w:pStyle w:val="ActivityBullet"/>
-      </w:pPr>
-      <w:r>
-        <w:t>2026-01-29 14:02:01-0500PM ET host discovery Port scans completed successfully.</w:t>
-      </w:r>
-    </w:p>
-    <w:p>
-      <w:pPr>
-        <w:pStyle w:val="ActivityBullet"/>
-      </w:pPr>
-      <w:r>
-        <w:t>2026-01-29 14:02:02-0500PM ET host discovery Parsing results for alive systems.</w:t>
-      </w:r>
-    </w:p>
-    <w:p>
-      <w:pPr>
-        <w:pStyle w:val="ActivityBullet"/>
-      </w:pPr>
-      <w:r>
-        <w:t>2026-01-29 14:02:02-0500PM ET host discovery Completed parsing Nmap results. 1 new IP addresses discovered and imported into DB.</w:t>
-      </w:r>
-    </w:p>
-    <w:p>
-      <w:pPr>
-        <w:pStyle w:val="ActivityBullet"/>
-      </w:pPr>
-      <w:r>
-        <w:t xml:space="preserve">2026-01-29 14:02:02-0500PM ET host discovery Parsing </w:t>
-      </w:r>
-      <w:proofErr w:type="spellStart"/>
-      <w:r>
-        <w:t>nmap</w:t>
-      </w:r>
-      <w:proofErr w:type="spellEnd"/>
-      <w:r>
-        <w:t xml:space="preserve"> port scans.</w:t>
-      </w:r>
-    </w:p>
-    <w:p>
-      <w:pPr>
-        <w:pStyle w:val="ActivityBullet"/>
-      </w:pPr>
-      <w:r>
-        <w:t xml:space="preserve">2026-01-29 14:02:02-0500PM ET </w:t>
-      </w:r>
-      <w:proofErr w:type="gramStart"/>
-      <w:r>
-        <w:t>host discovery</w:t>
-      </w:r>
-      <w:proofErr w:type="gramEnd"/>
-      <w:r>
-        <w:t xml:space="preserve"> Completed parsing port scans. Imported 3 new ports.</w:t>
-      </w:r>
-    </w:p>
-    <w:p>
-      <w:pPr>
-        <w:pStyle w:val="ActivityBullet"/>
-      </w:pPr>
-      <w:r>
-        <w:t>2026-01-29 14:02:02-0500PM ET host discovery Port scan module completed.</w:t>
-      </w:r>
-    </w:p>
-    <w:p>
-      <w:pPr>
-        <w:pStyle w:val="ActivityBullet"/>
-      </w:pPr>
-      <w:r>
-        <w:t xml:space="preserve">2026-01-29 14:02:03-0500PM ET host discovery </w:t>
-      </w:r>
-      <w:proofErr w:type="spellStart"/>
-      <w:r>
-        <w:t>Discovery</w:t>
-      </w:r>
-      <w:proofErr w:type="spellEnd"/>
-      <w:r>
-        <w:t xml:space="preserve"> module completed.</w:t>
-      </w:r>
-    </w:p>
-    <w:p>
-      <w:pPr>
-        <w:pStyle w:val="ActivityBullet"/>
-      </w:pPr>
-      <w:r>
-        <w:t xml:space="preserve">2026-01-29 14:02:27-0500PM ET host discovery Running </w:t>
-      </w:r>
-      <w:proofErr w:type="spellStart"/>
-      <w:r>
-        <w:t>nmap</w:t>
-      </w:r>
-      <w:proofErr w:type="spellEnd"/>
-      <w:r>
-        <w:t xml:space="preserve"> port version scans.</w:t>
-      </w:r>
-    </w:p>
-    <w:p>
-      <w:pPr>
-        <w:pStyle w:val="ActivityBullet"/>
-      </w:pPr>
-      <w:r>
-        <w:t xml:space="preserve">2026-01-29 14:03:30-0500PM ET host discovery Completed </w:t>
-      </w:r>
-      <w:proofErr w:type="spellStart"/>
-      <w:r>
-        <w:t>nmap</w:t>
-      </w:r>
-      <w:proofErr w:type="spellEnd"/>
-      <w:r>
-        <w:t xml:space="preserve"> port version scans.</w:t>
-      </w:r>
-    </w:p>
-    <w:p>
-      <w:pPr>
-        <w:pStyle w:val="ActivityBullet"/>
-      </w:pPr>
-      <w:r>
-        <w:t xml:space="preserve">2026-01-29 14:03:35-0500PM ET </w:t>
-      </w:r>
-      <w:proofErr w:type="gramStart"/>
-      <w:r>
-        <w:t>enumeration</w:t>
-      </w:r>
-      <w:proofErr w:type="gramEnd"/>
-      <w:r>
-        <w:t xml:space="preserve"> </w:t>
-      </w:r>
-      <w:proofErr w:type="spellStart"/>
-      <w:r>
-        <w:t>Enumeration</w:t>
-      </w:r>
-      <w:proofErr w:type="spellEnd"/>
-      <w:r>
-        <w:t xml:space="preserve"> </w:t>
-      </w:r>
-      <w:proofErr w:type="gramStart"/>
-      <w:r>
-        <w:t>module</w:t>
-      </w:r>
-      <w:proofErr w:type="gramEnd"/>
-      <w:r>
-        <w:t xml:space="preserve"> initialized.</w:t>
-      </w:r>
-    </w:p>
-    <w:p>
-      <w:pPr>
-        <w:pStyle w:val="ActivityBullet"/>
-      </w:pPr>
-      <w:r>
-        <w:t xml:space="preserve">2026-01-29 14:04:43-0500PM ET </w:t>
-      </w:r>
-      <w:proofErr w:type="gramStart"/>
-      <w:r>
-        <w:t>enumeration</w:t>
-      </w:r>
-      <w:proofErr w:type="gramEnd"/>
-      <w:r>
-        <w:t xml:space="preserve"> Enumerating HTTP services.</w:t>
-      </w:r>
-    </w:p>
-    <w:p>
-      <w:pPr>
-        <w:pStyle w:val="ActivityBullet"/>
-      </w:pPr>
-      <w:r>
-        <w:t xml:space="preserve">2026-01-29 14:04:43-0500PM ET </w:t>
-      </w:r>
-      <w:proofErr w:type="gramStart"/>
-      <w:r>
-        <w:t>enumeration</w:t>
-      </w:r>
-      <w:proofErr w:type="gramEnd"/>
-      <w:r>
-        <w:t xml:space="preserve"> Enumerating HTTPS services.</w:t>
-      </w:r>
-    </w:p>
-    <w:p>
-      <w:pPr>
-        <w:pStyle w:val="ActivityBullet"/>
-      </w:pPr>
-      <w:r>
-        <w:t>2026-01-29 14:04:43-0500PM ET enumeration Enumerating SSH services.</w:t>
-      </w:r>
-    </w:p>
-    <w:p>
-      <w:pPr>
-        <w:pStyle w:val="ActivityBullet"/>
-      </w:pPr>
-      <w:r>
-        <w:t xml:space="preserve">2026-01-29 14:04:47-0500PM ET enumeration Running </w:t>
-      </w:r>
-      <w:proofErr w:type="spellStart"/>
-      <w:r>
-        <w:t>nmap</w:t>
-      </w:r>
-      <w:proofErr w:type="spellEnd"/>
-      <w:r>
-        <w:t xml:space="preserve"> script scan using script: http-headers.</w:t>
-      </w:r>
-    </w:p>
-    <w:p>
-      <w:pPr>
-        <w:pStyle w:val="ActivityBullet"/>
-      </w:pPr>
-      <w:r>
-        <w:t xml:space="preserve">2026-01-29 14:04:47-0500PM ET enumeration Running </w:t>
-      </w:r>
-      <w:proofErr w:type="spellStart"/>
-      <w:r>
-        <w:t>nmap</w:t>
-      </w:r>
-      <w:proofErr w:type="spellEnd"/>
-      <w:r>
-        <w:t xml:space="preserve"> script scan using script: http-methods.</w:t>
-      </w:r>
-    </w:p>
-    <w:p>
-      <w:pPr>
-        <w:pStyle w:val="ActivityBullet"/>
-      </w:pPr>
-      <w:r>
-        <w:t xml:space="preserve">2026-01-29 14:04:47-0500PM ET enumeration Running </w:t>
-      </w:r>
-      <w:proofErr w:type="spellStart"/>
-      <w:r>
-        <w:t>nmap</w:t>
-      </w:r>
-      <w:proofErr w:type="spellEnd"/>
-      <w:r>
-        <w:t xml:space="preserve"> script scan using script: http-headers.</w:t>
-      </w:r>
-    </w:p>
-    <w:p>
-      <w:pPr>
-        <w:pStyle w:val="ActivityBullet"/>
-      </w:pPr>
-      <w:r>
-        <w:t xml:space="preserve">2026-01-29 14:04:47-0500PM ET enumeration Running </w:t>
-      </w:r>
-      <w:proofErr w:type="spellStart"/>
-      <w:r>
-        <w:t>nmap</w:t>
-      </w:r>
-      <w:proofErr w:type="spellEnd"/>
-      <w:r>
-        <w:t xml:space="preserve"> script scan using script: http-robots.txt.</w:t>
-      </w:r>
-    </w:p>
-    <w:p>
-      <w:pPr>
-        <w:pStyle w:val="ActivityBullet"/>
-      </w:pPr>
-      <w:r>
-        <w:t xml:space="preserve">2026-01-29 14:04:47-0500PM ET enumeration Running </w:t>
-      </w:r>
-      <w:proofErr w:type="spellStart"/>
-      <w:r>
-        <w:t>nmap</w:t>
-      </w:r>
-      <w:proofErr w:type="spellEnd"/>
-      <w:r>
-        <w:t xml:space="preserve"> script scan using script: http-robots.txt.</w:t>
-      </w:r>
-    </w:p>
-    <w:p>
-      <w:pPr>
-        <w:pStyle w:val="ActivityBullet"/>
-      </w:pPr>
-      <w:r>
-        <w:t xml:space="preserve">2026-01-29 14:04:47-0500PM ET enumeration Running </w:t>
-      </w:r>
-      <w:proofErr w:type="spellStart"/>
-      <w:r>
-        <w:t>nmap</w:t>
-      </w:r>
-      <w:proofErr w:type="spellEnd"/>
-      <w:r>
-        <w:t xml:space="preserve"> script scan using script: http-put.</w:t>
-      </w:r>
-    </w:p>
-    <w:p>
-      <w:pPr>
-        <w:pStyle w:val="ActivityBullet"/>
-      </w:pPr>
-      <w:r>
-        <w:t xml:space="preserve">2026-01-29 14:04:47-0500PM ET enumeration Running </w:t>
-      </w:r>
-      <w:proofErr w:type="spellStart"/>
-      <w:r>
-        <w:t>nmap</w:t>
-      </w:r>
-      <w:proofErr w:type="spellEnd"/>
-      <w:r>
-        <w:t xml:space="preserve"> script scan using script: http-title.</w:t>
-      </w:r>
-    </w:p>
-    <w:p>
-      <w:pPr>
-        <w:pStyle w:val="ActivityBullet"/>
-      </w:pPr>
-      <w:r>
-        <w:t xml:space="preserve">2026-01-29 14:04:47-0500PM ET enumeration Running </w:t>
-      </w:r>
-      <w:proofErr w:type="spellStart"/>
-      <w:r>
-        <w:t>nmap</w:t>
-      </w:r>
-      <w:proofErr w:type="spellEnd"/>
-      <w:r>
-        <w:t xml:space="preserve"> script scan using script: http-shellshock.</w:t>
-      </w:r>
-    </w:p>
-    <w:p>
-      <w:pPr>
-        <w:pStyle w:val="ActivityBullet"/>
-      </w:pPr>
-      <w:r>
-        <w:t xml:space="preserve">2026-01-29 14:04:47-0500PM ET enumeration Running </w:t>
-      </w:r>
-      <w:proofErr w:type="spellStart"/>
-      <w:r>
-        <w:t>nmap</w:t>
-      </w:r>
-      <w:proofErr w:type="spellEnd"/>
-      <w:r>
-        <w:t xml:space="preserve"> script scan using script: http-methods.</w:t>
-      </w:r>
-    </w:p>
-    <w:p>
-      <w:pPr>
-        <w:pStyle w:val="ActivityBullet"/>
-      </w:pPr>
-      <w:r>
-        <w:t xml:space="preserve">2026-01-29 14:04:47-0500PM ET enumeration Running </w:t>
-      </w:r>
-      <w:proofErr w:type="spellStart"/>
-      <w:r>
-        <w:t>nmap</w:t>
-      </w:r>
-      <w:proofErr w:type="spellEnd"/>
-      <w:r>
-        <w:t xml:space="preserve"> script scan using script: sslv2.</w:t>
-      </w:r>
-    </w:p>
-    <w:p>
-      <w:pPr>
-        <w:pStyle w:val="ActivityBullet"/>
-      </w:pPr>
-      <w:r>
-        <w:t xml:space="preserve">2026-01-29 14:04:47-0500PM ET enumeration Running </w:t>
-      </w:r>
-      <w:proofErr w:type="spellStart"/>
-      <w:r>
-        <w:t>nmap</w:t>
-      </w:r>
-      <w:proofErr w:type="spellEnd"/>
-      <w:r>
-        <w:t xml:space="preserve"> script scan using script: </w:t>
-      </w:r>
-      <w:proofErr w:type="spellStart"/>
-      <w:r>
-        <w:t>ssl</w:t>
-      </w:r>
-      <w:proofErr w:type="spellEnd"/>
-      <w:r>
-        <w:t>-cert.</w:t>
-      </w:r>
-    </w:p>
-    <w:p>
-      <w:pPr>
-        <w:pStyle w:val="ActivityBullet"/>
-      </w:pPr>
-      <w:r>
-        <w:t xml:space="preserve">2026-01-29 14:04:47-0500PM ET enumeration Running </w:t>
-      </w:r>
-      <w:proofErr w:type="spellStart"/>
-      <w:r>
-        <w:t>nmap</w:t>
-      </w:r>
-      <w:proofErr w:type="spellEnd"/>
-      <w:r>
-        <w:t xml:space="preserve"> script scan using script: </w:t>
-      </w:r>
-      <w:proofErr w:type="spellStart"/>
-      <w:r>
-        <w:t>ssl</w:t>
-      </w:r>
-      <w:proofErr w:type="spellEnd"/>
-      <w:r>
-        <w:t>-</w:t>
-      </w:r>
-      <w:proofErr w:type="spellStart"/>
-      <w:r>
-        <w:t>enum</w:t>
-      </w:r>
-      <w:proofErr w:type="spellEnd"/>
-      <w:r>
-        <w:t>-ciphers.</w:t>
-      </w:r>
-    </w:p>
-    <w:p>
-      <w:pPr>
-        <w:pStyle w:val="ActivityBullet"/>
-      </w:pPr>
-      <w:r>
-        <w:t xml:space="preserve">2026-01-29 14:04:47-0500PM ET enumeration Running </w:t>
-      </w:r>
-      <w:proofErr w:type="spellStart"/>
-      <w:r>
-        <w:t>nmap</w:t>
-      </w:r>
-      <w:proofErr w:type="spellEnd"/>
-      <w:r>
-        <w:t xml:space="preserve"> script scan using script: http-shellshock.</w:t>
-      </w:r>
-    </w:p>
-    <w:p>
-      <w:pPr>
-        <w:pStyle w:val="ActivityBullet"/>
-      </w:pPr>
-      <w:r>
-        <w:t xml:space="preserve">2026-01-29 14:04:47-0500PM ET enumeration Running </w:t>
-      </w:r>
-      <w:proofErr w:type="spellStart"/>
-      <w:r>
-        <w:t>nmap</w:t>
-      </w:r>
-      <w:proofErr w:type="spellEnd"/>
-      <w:r>
-        <w:t xml:space="preserve"> script scan using script: </w:t>
-      </w:r>
-      <w:proofErr w:type="spellStart"/>
-      <w:r>
-        <w:t>ssl</w:t>
-      </w:r>
-      <w:proofErr w:type="spellEnd"/>
-      <w:r>
-        <w:t>-poodle.</w:t>
-      </w:r>
-    </w:p>
-    <w:p>
-      <w:pPr>
-        <w:pStyle w:val="ActivityBullet"/>
-      </w:pPr>
-      <w:r>
-        <w:t xml:space="preserve">2026-01-29 14:04:47-0500PM ET enumeration Running </w:t>
-      </w:r>
-      <w:proofErr w:type="spellStart"/>
-      <w:r>
-        <w:t>nmap</w:t>
-      </w:r>
-      <w:proofErr w:type="spellEnd"/>
-      <w:r>
-        <w:t xml:space="preserve"> script scan using script: http-put.</w:t>
-      </w:r>
-    </w:p>
-    <w:p>
-      <w:pPr>
-        <w:pStyle w:val="ActivityBullet"/>
-      </w:pPr>
-      <w:r>
-        <w:t xml:space="preserve">2026-01-29 14:04:47-0500PM ET enumeration Running </w:t>
-      </w:r>
-      <w:proofErr w:type="spellStart"/>
-      <w:r>
-        <w:t>nmap</w:t>
-      </w:r>
-      <w:proofErr w:type="spellEnd"/>
-      <w:r>
-        <w:t xml:space="preserve"> script scan using script: </w:t>
-      </w:r>
-      <w:proofErr w:type="spellStart"/>
-      <w:r>
-        <w:t>ssl-heartbleed</w:t>
-      </w:r>
-      <w:proofErr w:type="spellEnd"/>
-      <w:r>
-        <w:t>.</w:t>
-      </w:r>
-    </w:p>
-    <w:p>
-      <w:pPr>
-        <w:pStyle w:val="ActivityBullet"/>
-      </w:pPr>
-      <w:r>
-        <w:t xml:space="preserve">2026-01-29 14:04:47-0500PM ET enumeration Running </w:t>
-      </w:r>
-      <w:proofErr w:type="spellStart"/>
-      <w:r>
-        <w:t>nmap</w:t>
-      </w:r>
-      <w:proofErr w:type="spellEnd"/>
-      <w:r>
-        <w:t xml:space="preserve"> script scan using script: http-title.</w:t>
-      </w:r>
-    </w:p>
-    <w:p>
-      <w:pPr>
-        <w:pStyle w:val="ActivityBullet"/>
-      </w:pPr>
-      <w:r>
-        <w:t xml:space="preserve">2026-01-29 14:04:47-0500PM ET enumeration Running </w:t>
-      </w:r>
-      <w:proofErr w:type="spellStart"/>
-      <w:r>
-        <w:t>nmap</w:t>
-      </w:r>
-      <w:proofErr w:type="spellEnd"/>
-      <w:r>
-        <w:t xml:space="preserve"> script scan using script: </w:t>
-      </w:r>
-      <w:proofErr w:type="spellStart"/>
-      <w:r>
-        <w:t>ssl</w:t>
-      </w:r>
-      <w:proofErr w:type="spellEnd"/>
-      <w:r>
-        <w:t>-date.</w:t>
-      </w:r>
-    </w:p>
-    <w:p>
-      <w:pPr>
-        <w:pStyle w:val="ActivityBullet"/>
-      </w:pPr>
-      <w:r>
-        <w:t>2026-01-29 14:04:47-0500PM ET enumeration Queuing up MSF module: auxiliary/scanner/ssh/</w:t>
-      </w:r>
-      <w:proofErr w:type="spellStart"/>
-      <w:r>
-        <w:t>ssh_version</w:t>
-      </w:r>
-      <w:proofErr w:type="spellEnd"/>
-      <w:r>
-        <w:t>.</w:t>
-      </w:r>
-    </w:p>
-    <w:p>
-      <w:pPr>
-        <w:pStyle w:val="ActivityBullet"/>
-      </w:pPr>
-      <w:r>
-        <w:t xml:space="preserve">2026-01-29 14:05:50-0500PM ET enumeration Completed MSF module: </w:t>
-      </w:r>
-      <w:proofErr w:type="gramStart"/>
-      <w:r>
-        <w:t>auxiliary/scanner</w:t>
-      </w:r>
-      <w:proofErr w:type="gramEnd"/>
-      <w:r>
-        <w:t>/ssh/</w:t>
-      </w:r>
-      <w:proofErr w:type="spellStart"/>
-      <w:r>
-        <w:t>ssh_version</w:t>
-      </w:r>
-      <w:proofErr w:type="spellEnd"/>
-      <w:r>
-        <w:t>.</w:t>
-      </w:r>
-    </w:p>
-    <w:p>
-      <w:pPr>
-        <w:pStyle w:val="ActivityBullet"/>
-      </w:pPr>
-      <w:r>
-        <w:lastRenderedPageBreak/>
-        <w:t xml:space="preserve">2026-01-29 14:05:50-0500PM ET enumeration Completed </w:t>
-      </w:r>
-      <w:proofErr w:type="spellStart"/>
-      <w:r>
-        <w:t>nmap</w:t>
-      </w:r>
-      <w:proofErr w:type="spellEnd"/>
-      <w:r>
-        <w:t xml:space="preserve"> script scan using script: http-methods.</w:t>
-      </w:r>
-    </w:p>
-    <w:p>
-      <w:pPr>
-        <w:pStyle w:val="ActivityBullet"/>
-      </w:pPr>
-      <w:r>
-        <w:t xml:space="preserve">2026-01-29 14:05:50-0500PM ET enumeration Completed </w:t>
-      </w:r>
-      <w:proofErr w:type="spellStart"/>
-      <w:r>
-        <w:t>nmap</w:t>
-      </w:r>
-      <w:proofErr w:type="spellEnd"/>
-      <w:r>
-        <w:t xml:space="preserve"> script scan using script: </w:t>
-      </w:r>
-      <w:proofErr w:type="spellStart"/>
-      <w:r>
-        <w:t>ssl</w:t>
-      </w:r>
-      <w:proofErr w:type="spellEnd"/>
-      <w:r>
-        <w:t>-</w:t>
-      </w:r>
-      <w:proofErr w:type="spellStart"/>
-      <w:r>
-        <w:t>enum</w:t>
-      </w:r>
-      <w:proofErr w:type="spellEnd"/>
-      <w:r>
-        <w:t>-ciphers.</w:t>
-      </w:r>
-    </w:p>
-    <w:p>
-      <w:pPr>
-        <w:pStyle w:val="ActivityBullet"/>
-      </w:pPr>
-      <w:r>
-        <w:t xml:space="preserve">2026-01-29 14:05:50-0500PM ET enumeration Completed </w:t>
-      </w:r>
-      <w:proofErr w:type="spellStart"/>
-      <w:r>
-        <w:t>nmap</w:t>
-      </w:r>
-      <w:proofErr w:type="spellEnd"/>
-      <w:r>
-        <w:t xml:space="preserve"> script scan using script: http-put.</w:t>
-      </w:r>
-    </w:p>
-    <w:p>
-      <w:pPr>
-        <w:pStyle w:val="ActivityBullet"/>
-      </w:pPr>
-      <w:r>
-        <w:t xml:space="preserve">2026-01-29 14:05:50-0500PM ET enumeration Completed </w:t>
-      </w:r>
-      <w:proofErr w:type="spellStart"/>
-      <w:r>
-        <w:t>nmap</w:t>
-      </w:r>
-      <w:proofErr w:type="spellEnd"/>
-      <w:r>
-        <w:t xml:space="preserve"> script scan using script: http-robots.txt.</w:t>
-      </w:r>
-    </w:p>
-    <w:p>
-      <w:pPr>
-        <w:pStyle w:val="ActivityBullet"/>
-      </w:pPr>
-      <w:r>
-        <w:t xml:space="preserve">2026-01-29 14:05:50-0500PM ET enumeration Completed </w:t>
-      </w:r>
-      <w:proofErr w:type="spellStart"/>
-      <w:r>
-        <w:t>nmap</w:t>
-      </w:r>
-      <w:proofErr w:type="spellEnd"/>
-      <w:r>
-        <w:t xml:space="preserve"> script scan using script: </w:t>
-      </w:r>
-      <w:proofErr w:type="spellStart"/>
-      <w:r>
-        <w:t>ssl-heartbleed</w:t>
-      </w:r>
-      <w:proofErr w:type="spellEnd"/>
-      <w:r>
-        <w:t>.</w:t>
-      </w:r>
-    </w:p>
-    <w:p>
-      <w:pPr>
-        <w:pStyle w:val="ActivityBullet"/>
-      </w:pPr>
-      <w:r>
-        <w:t xml:space="preserve">2026-01-29 14:05:50-0500PM ET enumeration Completed </w:t>
-      </w:r>
-      <w:proofErr w:type="spellStart"/>
-      <w:r>
-        <w:t>nmap</w:t>
-      </w:r>
-      <w:proofErr w:type="spellEnd"/>
-      <w:r>
-        <w:t xml:space="preserve"> script scan using script: http-shellshock.</w:t>
-      </w:r>
-    </w:p>
-    <w:p>
-      <w:pPr>
-        <w:pStyle w:val="ActivityBullet"/>
-      </w:pPr>
-      <w:r>
-        <w:t xml:space="preserve">2026-01-29 14:05:50-0500PM ET enumeration Completed </w:t>
-      </w:r>
-      <w:proofErr w:type="spellStart"/>
-      <w:r>
-        <w:t>nmap</w:t>
-      </w:r>
-      <w:proofErr w:type="spellEnd"/>
-      <w:r>
-        <w:t xml:space="preserve"> script scan using script: http-robots.txt.</w:t>
-      </w:r>
-    </w:p>
-    <w:p>
-      <w:pPr>
-        <w:pStyle w:val="ActivityBullet"/>
-      </w:pPr>
-      <w:r>
-        <w:t xml:space="preserve">2026-01-29 14:05:51-0500PM ET enumeration Completed </w:t>
-      </w:r>
-      <w:proofErr w:type="spellStart"/>
-      <w:r>
-        <w:t>nmap</w:t>
-      </w:r>
-      <w:proofErr w:type="spellEnd"/>
-      <w:r>
-        <w:t xml:space="preserve"> script scan using script: http-put.</w:t>
-      </w:r>
-    </w:p>
-    <w:p>
-      <w:pPr>
-        <w:pStyle w:val="ActivityBullet"/>
-      </w:pPr>
-      <w:r>
-        <w:t xml:space="preserve">2026-01-29 14:05:51-0500PM ET enumeration Completed </w:t>
-      </w:r>
-      <w:proofErr w:type="spellStart"/>
-      <w:r>
-        <w:t>nmap</w:t>
-      </w:r>
-      <w:proofErr w:type="spellEnd"/>
-      <w:r>
-        <w:t xml:space="preserve"> script scan using script: http-headers.</w:t>
-      </w:r>
-    </w:p>
-    <w:p>
-      <w:pPr>
-        <w:pStyle w:val="ActivityBullet"/>
-      </w:pPr>
-      <w:r>
-        <w:t xml:space="preserve">2026-01-29 14:05:51-0500PM ET enumeration Completed </w:t>
-      </w:r>
-      <w:proofErr w:type="spellStart"/>
-      <w:r>
-        <w:t>nmap</w:t>
-      </w:r>
-      <w:proofErr w:type="spellEnd"/>
-      <w:r>
-        <w:t xml:space="preserve"> script scan using script: http-methods.</w:t>
-      </w:r>
-    </w:p>
-    <w:p>
-      <w:pPr>
-        <w:pStyle w:val="ActivityBullet"/>
-      </w:pPr>
-      <w:r>
-        <w:t xml:space="preserve">2026-01-29 14:05:51-0500PM ET enumeration Completed </w:t>
-      </w:r>
-      <w:proofErr w:type="spellStart"/>
-      <w:r>
-        <w:t>nmap</w:t>
-      </w:r>
-      <w:proofErr w:type="spellEnd"/>
-      <w:r>
-        <w:t xml:space="preserve"> script scan using script: </w:t>
-      </w:r>
-      <w:proofErr w:type="spellStart"/>
-      <w:r>
-        <w:t>ssl</w:t>
-      </w:r>
-      <w:proofErr w:type="spellEnd"/>
-      <w:r>
-        <w:t>-date.</w:t>
-      </w:r>
-    </w:p>
-    <w:p>
-      <w:pPr>
-        <w:pStyle w:val="ActivityBullet"/>
-      </w:pPr>
-      <w:r>
-        <w:t xml:space="preserve">2026-01-29 14:05:51-0500PM ET enumeration Completed </w:t>
-      </w:r>
-      <w:proofErr w:type="spellStart"/>
-      <w:r>
-        <w:t>nmap</w:t>
-      </w:r>
-      <w:proofErr w:type="spellEnd"/>
-      <w:r>
-        <w:t xml:space="preserve"> script scan using script: http-title.</w:t>
-      </w:r>
-    </w:p>
-    <w:p>
-      <w:pPr>
-        <w:pStyle w:val="ActivityBullet"/>
-      </w:pPr>
-      <w:r>
-        <w:t xml:space="preserve">2026-01-29 14:05:51-0500PM ET </w:t>
-      </w:r>
-      <w:proofErr w:type="gramStart"/>
-      <w:r>
-        <w:t>enumeration</w:t>
-      </w:r>
-      <w:proofErr w:type="gramEnd"/>
-      <w:r>
-        <w:t xml:space="preserve"> Completed </w:t>
-      </w:r>
-      <w:proofErr w:type="spellStart"/>
-      <w:r>
-        <w:t>nmap</w:t>
-      </w:r>
-      <w:proofErr w:type="spellEnd"/>
-      <w:r>
-        <w:t xml:space="preserve"> script scan using script: http-shellshock.</w:t>
-      </w:r>
-    </w:p>
-    <w:p>
-      <w:pPr>
-        <w:pStyle w:val="ActivityBullet"/>
-      </w:pPr>
-      <w:r>
-        <w:t xml:space="preserve">2026-01-29 14:05:51-0500PM ET enumeration Completed </w:t>
-      </w:r>
-      <w:proofErr w:type="spellStart"/>
-      <w:r>
-        <w:t>nmap</w:t>
-      </w:r>
-      <w:proofErr w:type="spellEnd"/>
-      <w:r>
-        <w:t xml:space="preserve"> script scan using script: http-headers.</w:t>
-      </w:r>
-    </w:p>
-    <w:p>
-      <w:pPr>
-        <w:pStyle w:val="ActivityBullet"/>
-      </w:pPr>
-      <w:r>
-        <w:t xml:space="preserve">2026-01-29 14:05:51-0500PM ET </w:t>
-      </w:r>
-      <w:proofErr w:type="gramStart"/>
-      <w:r>
-        <w:t>enumeration</w:t>
-      </w:r>
-      <w:proofErr w:type="gramEnd"/>
-      <w:r>
-        <w:t xml:space="preserve"> Completed </w:t>
-      </w:r>
-      <w:proofErr w:type="spellStart"/>
-      <w:r>
-        <w:t>nmap</w:t>
-      </w:r>
-      <w:proofErr w:type="spellEnd"/>
-      <w:r>
-        <w:t xml:space="preserve"> script scan using script: </w:t>
-      </w:r>
-      <w:proofErr w:type="spellStart"/>
-      <w:r>
-        <w:t>ssl</w:t>
-      </w:r>
-      <w:proofErr w:type="spellEnd"/>
-      <w:r>
-        <w:t>-poodle.</w:t>
-      </w:r>
-    </w:p>
-    <w:p>
-      <w:pPr>
-        <w:pStyle w:val="ActivityBullet"/>
-      </w:pPr>
-      <w:r>
-        <w:t xml:space="preserve">2026-01-29 14:05:51-0500PM ET enumeration Completed </w:t>
-      </w:r>
-      <w:proofErr w:type="spellStart"/>
-      <w:r>
-        <w:t>nmap</w:t>
-      </w:r>
-      <w:proofErr w:type="spellEnd"/>
-      <w:r>
-        <w:t xml:space="preserve"> script scan using script: </w:t>
-      </w:r>
-      <w:proofErr w:type="spellStart"/>
-      <w:r>
-        <w:t>ssl</w:t>
-      </w:r>
-      <w:proofErr w:type="spellEnd"/>
-      <w:r>
-        <w:t>-cert.</w:t>
-      </w:r>
-    </w:p>
-    <w:p>
-      <w:pPr>
-        <w:pStyle w:val="ActivityBullet"/>
-      </w:pPr>
-      <w:r>
-        <w:t xml:space="preserve">2026-01-29 14:05:51-0500PM ET enumeration Completed </w:t>
-      </w:r>
-      <w:proofErr w:type="spellStart"/>
-      <w:r>
-        <w:t>nmap</w:t>
-      </w:r>
-      <w:proofErr w:type="spellEnd"/>
-      <w:r>
-        <w:t xml:space="preserve"> script scan using script: sslv2.</w:t>
-      </w:r>
-    </w:p>
-    <w:p>
-      <w:pPr>
-        <w:pStyle w:val="ActivityBullet"/>
-      </w:pPr>
-      <w:r>
-        <w:t xml:space="preserve">2026-01-29 14:05:51-0500PM ET enumeration Completed </w:t>
-      </w:r>
-      <w:proofErr w:type="spellStart"/>
-      <w:r>
-        <w:t>nmap</w:t>
-      </w:r>
-      <w:proofErr w:type="spellEnd"/>
-      <w:r>
-        <w:t xml:space="preserve"> script scan using script: http-title.</w:t>
-      </w:r>
-    </w:p>
-    <w:p>
-      <w:pPr>
-        <w:pStyle w:val="ActivityBullet"/>
-      </w:pPr>
-      <w:r>
-        <w:t xml:space="preserve">2026-01-29 14:05:51-0500PM ET enumeration </w:t>
-      </w:r>
-      <w:proofErr w:type="spellStart"/>
-      <w:r>
-        <w:t>Peforming</w:t>
-      </w:r>
-      <w:proofErr w:type="spellEnd"/>
-      <w:r>
-        <w:t xml:space="preserve"> a hidden directory enumeration attack on 80/</w:t>
-      </w:r>
-      <w:proofErr w:type="spellStart"/>
-      <w:r>
-        <w:t>tcp</w:t>
-      </w:r>
-      <w:proofErr w:type="spellEnd"/>
-      <w:r>
-        <w:t>.</w:t>
-      </w:r>
-    </w:p>
-    <w:p>
-      <w:pPr>
-        <w:pStyle w:val="ActivityBullet"/>
-      </w:pPr>
-      <w:r>
-        <w:t xml:space="preserve">2026-01-29 14:05:54-0500PM ET enumeration Running </w:t>
-      </w:r>
-      <w:proofErr w:type="spellStart"/>
-      <w:r>
-        <w:t>nmap</w:t>
-      </w:r>
-      <w:proofErr w:type="spellEnd"/>
-      <w:r>
-        <w:t xml:space="preserve"> script scan using script: sshv1.</w:t>
-      </w:r>
-    </w:p>
-    <w:p>
-      <w:pPr>
-        <w:pStyle w:val="ActivityBullet"/>
-      </w:pPr>
-      <w:r>
-        <w:t xml:space="preserve">2026-01-29 14:05:54-0500PM ET enumeration Running </w:t>
-      </w:r>
-      <w:proofErr w:type="spellStart"/>
-      <w:r>
-        <w:t>nmap</w:t>
-      </w:r>
-      <w:proofErr w:type="spellEnd"/>
-      <w:r>
-        <w:t xml:space="preserve"> script scan using script: ssh2-enum-algos.</w:t>
-      </w:r>
-    </w:p>
-    <w:p>
-      <w:pPr>
-        <w:pStyle w:val="ActivityBullet"/>
-      </w:pPr>
-      <w:r>
-        <w:t xml:space="preserve">2026-01-29 14:05:54-0500PM ET enumeration Running </w:t>
-      </w:r>
-      <w:proofErr w:type="spellStart"/>
-      <w:r>
-        <w:t>nmap</w:t>
-      </w:r>
-      <w:proofErr w:type="spellEnd"/>
-      <w:r>
-        <w:t xml:space="preserve"> script scan using script: ssh-auth-methods.</w:t>
-      </w:r>
-    </w:p>
-    <w:p>
-      <w:pPr>
-        <w:pStyle w:val="ActivityBullet"/>
-        <w:rPr>
-          <w:lang w:val="fr-FR"/>
-        </w:rPr>
-      </w:pPr>
-      <w:r>
-        <w:rPr>
-          <w:lang w:val="fr-FR"/>
-        </w:rPr>
-        <w:t xml:space="preserve">2026-01-29 </w:t>
-      </w:r>
-      <w:proofErr w:type="gramStart"/>
-      <w:r>
-        <w:rPr>
-          <w:lang w:val="fr-FR"/>
-        </w:rPr>
-        <w:t>14:05:</w:t>
-      </w:r>
-      <w:proofErr w:type="gramEnd"/>
-      <w:r>
-        <w:rPr>
-          <w:lang w:val="fr-FR"/>
-        </w:rPr>
-        <w:t xml:space="preserve">54-0500PM ET </w:t>
-      </w:r>
-      <w:proofErr w:type="spellStart"/>
-      <w:r>
-        <w:rPr>
-          <w:lang w:val="fr-FR"/>
-        </w:rPr>
-        <w:t>enumeration</w:t>
-      </w:r>
-      <w:proofErr w:type="spellEnd"/>
-      <w:r>
-        <w:rPr>
-          <w:lang w:val="fr-FR"/>
-        </w:rPr>
-        <w:t xml:space="preserve"> </w:t>
-      </w:r>
-      <w:proofErr w:type="spellStart"/>
-      <w:r>
-        <w:rPr>
-          <w:lang w:val="fr-FR"/>
-        </w:rPr>
-        <w:t>Analyzing</w:t>
-      </w:r>
-      <w:proofErr w:type="spellEnd"/>
-      <w:r>
-        <w:rPr>
-          <w:lang w:val="fr-FR"/>
-        </w:rPr>
-        <w:t xml:space="preserve"> SSL/TLS </w:t>
-      </w:r>
-      <w:proofErr w:type="spellStart"/>
-      <w:r>
-        <w:rPr>
-          <w:lang w:val="fr-FR"/>
-        </w:rPr>
-        <w:t>protocols</w:t>
-      </w:r>
-      <w:proofErr w:type="spellEnd"/>
-      <w:r>
-        <w:rPr>
-          <w:lang w:val="fr-FR"/>
-        </w:rPr>
-        <w:t xml:space="preserve"> on port 443/</w:t>
-      </w:r>
-      <w:proofErr w:type="spellStart"/>
-      <w:r>
-        <w:rPr>
-          <w:lang w:val="fr-FR"/>
-        </w:rPr>
-        <w:t>tcp</w:t>
-      </w:r>
-      <w:proofErr w:type="spellEnd"/>
-      <w:r>
-        <w:rPr>
-          <w:lang w:val="fr-FR"/>
-        </w:rPr>
-        <w:t>.</w:t>
-      </w:r>
-    </w:p>
-    <w:p>
-      <w:pPr>
-        <w:pStyle w:val="ActivityBullet"/>
-      </w:pPr>
-      <w:r>
-        <w:t>2026-01-29 14:06:55-0500PM ET enumeration Completed SSL/TLS analysis on ports 443/</w:t>
-      </w:r>
-      <w:proofErr w:type="spellStart"/>
-      <w:r>
-        <w:t>tcp</w:t>
-      </w:r>
-      <w:proofErr w:type="spellEnd"/>
-      <w:r>
-        <w:t>.</w:t>
-      </w:r>
-    </w:p>
-    <w:p>
-      <w:pPr>
-        <w:pStyle w:val="ActivityBullet"/>
-      </w:pPr>
-      <w:r>
-        <w:t>2026-01-29 14:06:55-0500PM ET enumeration Completed hidden directory enumeration scan.</w:t>
-      </w:r>
-    </w:p>
-    <w:p>
-      <w:pPr>
-        <w:pStyle w:val="ActivityBullet"/>
-      </w:pPr>
-      <w:r>
-        <w:t xml:space="preserve">2026-01-29 14:06:55-0500PM ET enumeration </w:t>
-      </w:r>
-      <w:proofErr w:type="spellStart"/>
-      <w:r>
-        <w:t>Peforming</w:t>
-      </w:r>
-      <w:proofErr w:type="spellEnd"/>
-      <w:r>
-        <w:t xml:space="preserve"> a hidden directory enumeration attack on 443/</w:t>
-      </w:r>
-      <w:proofErr w:type="spellStart"/>
-      <w:r>
-        <w:t>tcp</w:t>
-      </w:r>
-      <w:proofErr w:type="spellEnd"/>
-      <w:r>
-        <w:t>.</w:t>
-      </w:r>
-    </w:p>
-    <w:p>
-      <w:pPr>
-        <w:pStyle w:val="ActivityBullet"/>
-      </w:pPr>
-      <w:r>
-        <w:t xml:space="preserve">2026-01-29 14:06:55-0500PM ET enumeration Completed </w:t>
-      </w:r>
-      <w:proofErr w:type="spellStart"/>
-      <w:r>
-        <w:t>nmap</w:t>
-      </w:r>
-      <w:proofErr w:type="spellEnd"/>
-      <w:r>
-        <w:t xml:space="preserve"> script scan using script: ssh2-enum-algos.</w:t>
-      </w:r>
-    </w:p>
-    <w:p>
-      <w:pPr>
-        <w:pStyle w:val="ActivityBullet"/>
-      </w:pPr>
-      <w:r>
-        <w:t xml:space="preserve">2026-01-29 14:06:55-0500PM ET enumeration Completed </w:t>
-      </w:r>
-      <w:proofErr w:type="spellStart"/>
-      <w:r>
-        <w:t>nmap</w:t>
-      </w:r>
-      <w:proofErr w:type="spellEnd"/>
-      <w:r>
-        <w:t xml:space="preserve"> script scan using script: ssh-auth-methods.</w:t>
-      </w:r>
-    </w:p>
-    <w:p>
-      <w:pPr>
-        <w:pStyle w:val="ActivityBullet"/>
-      </w:pPr>
-      <w:r>
-        <w:t xml:space="preserve">2026-01-29 14:06:55-0500PM ET enumeration Completed </w:t>
-      </w:r>
-      <w:proofErr w:type="spellStart"/>
-      <w:r>
-        <w:t>nmap</w:t>
-      </w:r>
-      <w:proofErr w:type="spellEnd"/>
-      <w:r>
-        <w:t xml:space="preserve"> script scan using script: sshv1.</w:t>
-      </w:r>
-    </w:p>
-    <w:p>
-      <w:pPr>
-        <w:pStyle w:val="ActivityBullet"/>
-      </w:pPr>
-      <w:r>
-        <w:t xml:space="preserve">2026-01-29 14:06:55-0500PM ET </w:t>
-      </w:r>
-      <w:proofErr w:type="gramStart"/>
-      <w:r>
-        <w:t>enumeration</w:t>
-      </w:r>
-      <w:proofErr w:type="gramEnd"/>
-      <w:r>
-        <w:t xml:space="preserve"> Completed </w:t>
-      </w:r>
-      <w:proofErr w:type="gramStart"/>
-      <w:r>
-        <w:t>enumerating</w:t>
-      </w:r>
-      <w:proofErr w:type="gramEnd"/>
-      <w:r>
-        <w:t xml:space="preserve"> SSH services.</w:t>
-      </w:r>
-    </w:p>
-    <w:p>
-      <w:pPr>
-        <w:pStyle w:val="ActivityBullet"/>
-      </w:pPr>
-      <w:r>
-        <w:t>2026-01-29 14:06:58-0500PM ET enumeration Analyzing web services running on port 80/</w:t>
-      </w:r>
-      <w:proofErr w:type="spellStart"/>
-      <w:r>
-        <w:t>tcp</w:t>
-      </w:r>
-      <w:proofErr w:type="spellEnd"/>
-      <w:r>
-        <w:t>.</w:t>
-      </w:r>
-    </w:p>
-    <w:p>
-      <w:pPr>
-        <w:pStyle w:val="ActivityBullet"/>
-      </w:pPr>
-      <w:r>
-        <w:t>2026-01-29 14:08:10-0500PM ET enumeration Completed analyzing web services running on port 80/</w:t>
-      </w:r>
-      <w:proofErr w:type="spellStart"/>
-      <w:r>
-        <w:t>tcp</w:t>
-      </w:r>
-      <w:proofErr w:type="spellEnd"/>
-      <w:r>
-        <w:t>.</w:t>
-      </w:r>
-    </w:p>
-    <w:p>
-      <w:pPr>
-        <w:pStyle w:val="ActivityBullet"/>
-      </w:pPr>
-      <w:r>
-        <w:t xml:space="preserve">2026-01-29 14:08:10-0500PM ET </w:t>
-      </w:r>
-      <w:proofErr w:type="gramStart"/>
-      <w:r>
-        <w:t>enumeration</w:t>
-      </w:r>
-      <w:proofErr w:type="gramEnd"/>
-      <w:r>
-        <w:t xml:space="preserve"> Completed </w:t>
-      </w:r>
-      <w:proofErr w:type="gramStart"/>
-      <w:r>
-        <w:t>hidden directory enumeration scan</w:t>
-      </w:r>
-      <w:proofErr w:type="gramEnd"/>
-      <w:r>
-        <w:t>.</w:t>
-      </w:r>
-    </w:p>
-    <w:p>
-      <w:pPr>
-        <w:pStyle w:val="ActivityBullet"/>
-      </w:pPr>
-      <w:r>
-        <w:t>2026-01-29 14:08:10-0500PM ET enumeration Completed analyzing web services running on port 80/</w:t>
-      </w:r>
-      <w:proofErr w:type="spellStart"/>
-      <w:r>
-        <w:t>tcp</w:t>
-      </w:r>
-      <w:proofErr w:type="spellEnd"/>
-      <w:r>
-        <w:t>.</w:t>
-      </w:r>
-    </w:p>
-    <w:p>
-      <w:pPr>
-        <w:pStyle w:val="ActivityBullet"/>
-      </w:pPr>
-      <w:r>
-        <w:t xml:space="preserve">2026-01-29 14:08:10-0500PM ET </w:t>
-      </w:r>
-      <w:proofErr w:type="gramStart"/>
-      <w:r>
-        <w:t>enumeration</w:t>
-      </w:r>
-      <w:proofErr w:type="gramEnd"/>
-      <w:r>
-        <w:t xml:space="preserve"> Completed </w:t>
-      </w:r>
-      <w:proofErr w:type="gramStart"/>
-      <w:r>
-        <w:t>enumerating</w:t>
-      </w:r>
-      <w:proofErr w:type="gramEnd"/>
-      <w:r>
-        <w:t xml:space="preserve"> HTTP services.</w:t>
-      </w:r>
-    </w:p>
-    <w:p>
-      <w:pPr>
-        <w:pStyle w:val="ActivityBullet"/>
-      </w:pPr>
-      <w:r>
-        <w:t>2026-01-29 14:08:13-0500PM ET enumeration Analyzing web services running on port 443/</w:t>
-      </w:r>
-      <w:proofErr w:type="spellStart"/>
-      <w:r>
-        <w:t>tcp</w:t>
-      </w:r>
-      <w:proofErr w:type="spellEnd"/>
-      <w:r>
-        <w:t>.</w:t>
-      </w:r>
-    </w:p>
-    <w:p>
-      <w:pPr>
-        <w:pStyle w:val="ActivityBullet"/>
-      </w:pPr>
-      <w:r>
-        <w:t xml:space="preserve">2026-01-29 14:09:15-0500PM ET </w:t>
-      </w:r>
-      <w:proofErr w:type="gramStart"/>
-      <w:r>
-        <w:t>enumeration</w:t>
-      </w:r>
-      <w:proofErr w:type="gramEnd"/>
-      <w:r>
-        <w:t xml:space="preserve"> Completed analyzing web services running on port 443/</w:t>
-      </w:r>
-      <w:proofErr w:type="spellStart"/>
-      <w:r>
-        <w:t>tcp</w:t>
-      </w:r>
-      <w:proofErr w:type="spellEnd"/>
-      <w:r>
-        <w:t>.</w:t>
-      </w:r>
-    </w:p>
-    <w:p>
-      <w:pPr>
-        <w:pStyle w:val="ActivityBullet"/>
-      </w:pPr>
-      <w:r>
-        <w:t xml:space="preserve">2026-01-29 14:09:15-0500PM ET </w:t>
-      </w:r>
-      <w:proofErr w:type="gramStart"/>
-      <w:r>
-        <w:t>enumeration</w:t>
-      </w:r>
-      <w:proofErr w:type="gramEnd"/>
-      <w:r>
-        <w:t xml:space="preserve"> Completed analyzing web services running on port 443/</w:t>
-      </w:r>
-      <w:proofErr w:type="spellStart"/>
-      <w:r>
-        <w:t>tcp</w:t>
-      </w:r>
-      <w:proofErr w:type="spellEnd"/>
-      <w:r>
-        <w:t>.</w:t>
-      </w:r>
-    </w:p>
-    <w:p>
-      <w:pPr>
-        <w:pStyle w:val="ActivityBullet"/>
-      </w:pPr>
-      <w:r>
-        <w:t>2026-01-29 14:09:16-0500PM ET enumeration Completed enumerating HTTPS services.</w:t>
-      </w:r>
-    </w:p>
-    <w:p>
-      <w:pPr>
-        <w:pStyle w:val="ActivityBullet"/>
-      </w:pPr>
-      <w:r>
-        <w:t xml:space="preserve">2026-01-29 14:09:45-0500PM ET </w:t>
-      </w:r>
-      <w:proofErr w:type="gramStart"/>
-      <w:r>
-        <w:t>enumeration</w:t>
-      </w:r>
-      <w:proofErr w:type="gramEnd"/>
-      <w:r>
-        <w:t xml:space="preserve"> </w:t>
-      </w:r>
-      <w:proofErr w:type="spellStart"/>
-      <w:r>
-        <w:t>Enumeration</w:t>
-      </w:r>
-      <w:proofErr w:type="spellEnd"/>
-      <w:r>
-        <w:t xml:space="preserve"> module completed.</w:t>
-      </w:r>
-    </w:p>
-    <w:p>
-      <w:pPr>
-        <w:pStyle w:val="ActivityBullet"/>
-        <w:rPr>
-          <w:lang w:val="fr-FR"/>
-        </w:rPr>
-      </w:pPr>
-      <w:r>
-        <w:rPr>
-          <w:lang w:val="fr-FR"/>
-        </w:rPr>
-        <w:t xml:space="preserve">2026-01-29 </w:t>
-      </w:r>
-      <w:proofErr w:type="gramStart"/>
-      <w:r>
-        <w:rPr>
-          <w:lang w:val="fr-FR"/>
-        </w:rPr>
-        <w:t>14:10:</w:t>
-      </w:r>
-      <w:proofErr w:type="gramEnd"/>
-      <w:r>
-        <w:rPr>
-          <w:lang w:val="fr-FR"/>
-        </w:rPr>
-        <w:t xml:space="preserve">06-0500PM ET exploit </w:t>
-      </w:r>
-      <w:proofErr w:type="spellStart"/>
-      <w:r>
-        <w:rPr>
-          <w:lang w:val="fr-FR"/>
-        </w:rPr>
-        <w:t>Launching</w:t>
-      </w:r>
-      <w:proofErr w:type="spellEnd"/>
-      <w:r>
-        <w:rPr>
-          <w:lang w:val="fr-FR"/>
-        </w:rPr>
-        <w:t xml:space="preserve"> exploit module.</w:t>
-      </w:r>
-    </w:p>
-    <w:p>
-      <w:pPr>
-        <w:pStyle w:val="ActivityBullet"/>
-      </w:pPr>
-      <w:r>
-        <w:t>2026-01-29 14:10:11-0500PM ET exploit Queuing up hydra attack: SSH password attack.</w:t>
-      </w:r>
-    </w:p>
-    <w:p>
-      <w:pPr>
-        <w:pStyle w:val="ActivityBullet"/>
-      </w:pPr>
-      <w:r>
-        <w:t>2026-01-29 14:11:16-0500PM ET exploit Completed hydra attack: SSH password attack.</w:t>
-      </w:r>
-    </w:p>
-    <w:p>
-      <w:pPr>
-        <w:pStyle w:val="ActivityBullet"/>
-      </w:pPr>
-      <w:r>
-        <w:t>2026-01-29 14:11:16-0500PM ET exploit Completed SSH password attack.</w:t>
-      </w:r>
-    </w:p>
-    <w:p>
-      <w:pPr>
-        <w:pStyle w:val="ActivityBullet"/>
-        <w:rPr>
-          <w:lang w:val="fr-FR"/>
-        </w:rPr>
-      </w:pPr>
-      <w:r>
-        <w:rPr>
-          <w:lang w:val="fr-FR"/>
-        </w:rPr>
-        <w:t xml:space="preserve">2026-01-29 </w:t>
-      </w:r>
-      <w:proofErr w:type="gramStart"/>
-      <w:r>
-        <w:rPr>
-          <w:lang w:val="fr-FR"/>
-        </w:rPr>
-        <w:t>14:11:</w:t>
-      </w:r>
-      <w:proofErr w:type="gramEnd"/>
-      <w:r>
-        <w:rPr>
-          <w:lang w:val="fr-FR"/>
-        </w:rPr>
-        <w:t xml:space="preserve">49-0500PM ET exploit </w:t>
-      </w:r>
-      <w:proofErr w:type="spellStart"/>
-      <w:r>
-        <w:rPr>
-          <w:lang w:val="fr-FR"/>
-        </w:rPr>
-        <w:t>Completed</w:t>
-      </w:r>
-      <w:proofErr w:type="spellEnd"/>
-      <w:r>
-        <w:rPr>
-          <w:lang w:val="fr-FR"/>
-        </w:rPr>
-        <w:t xml:space="preserve"> exploit module.</w:t>
+        <w:t>2026-01-29 14:11:49-0500PM ET exploit Completed exploit module.</w:t>
       </w:r>
     </w:p>
     <w:p>
@@ -7841,51 +6236,7 @@
           <w:szCs w:val="22"/>
           <w14:ligatures w14:val="none"/>
         </w:rPr>
-        <w:t xml:space="preserve">The following items are the </w:t>
-      </w:r>
-      <w:proofErr w:type="gramStart"/>
-      <w:r>
-        <w:rPr>
-          <w:rFonts w:ascii="Corbel" w:eastAsia="Calibri" w:hAnsi="Corbel" w:cs="Arial"/>
-          <w:color w:val="404040"/>
-          <w:kern w:val="0"/>
-          <w:szCs w:val="22"/>
-          <w14:ligatures w14:val="none"/>
-        </w:rPr>
-        <w:t>highest priority</w:t>
-      </w:r>
-      <w:proofErr w:type="gramEnd"/>
-      <w:r>
-        <w:rPr>
-          <w:rFonts w:ascii="Corbel" w:eastAsia="Calibri" w:hAnsi="Corbel" w:cs="Arial"/>
-          <w:color w:val="404040"/>
-          <w:kern w:val="0"/>
-          <w:szCs w:val="22"/>
-          <w14:ligatures w14:val="none"/>
-        </w:rPr>
-        <w:t xml:space="preserve"> recommendations to help improve compliance, defensibility and resilience. These items may not be fully inclusive of all discovered deficiencies and reflect </w:t>
-      </w:r>
-      <w:proofErr w:type="spellStart"/>
-      <w:r>
-        <w:rPr>
-          <w:rFonts w:ascii="Corbel" w:eastAsia="Calibri" w:hAnsi="Corbel" w:cs="Arial"/>
-          <w:color w:val="404040"/>
-          <w:kern w:val="0"/>
-          <w:szCs w:val="22"/>
-          <w14:ligatures w14:val="none"/>
-        </w:rPr>
-        <w:t>OrbitalFire’s</w:t>
-      </w:r>
-      <w:proofErr w:type="spellEnd"/>
-      <w:r>
-        <w:rPr>
-          <w:rFonts w:ascii="Corbel" w:eastAsia="Calibri" w:hAnsi="Corbel" w:cs="Arial"/>
-          <w:color w:val="404040"/>
-          <w:kern w:val="0"/>
-          <w:szCs w:val="22"/>
-          <w14:ligatures w14:val="none"/>
-        </w:rPr>
-        <w:t xml:space="preserve"> expert opinion regarding return on investment.</w:t>
+        <w:t>The following items are the highest priority recommendations to help improve compliance, defensibility and resilience. These items may not be fully inclusive of all discovered deficiencies and reflect OrbitalFire’s expert opinion regarding return on investment.</w:t>
       </w:r>
     </w:p>
     <w:p>
@@ -7968,29 +6319,7 @@
           <w:szCs w:val="22"/>
           <w14:ligatures w14:val="none"/>
         </w:rPr>
-        <w:t xml:space="preserve"> – </w:t>
-      </w:r>
-      <w:proofErr w:type="spellStart"/>
-      <w:r>
-        <w:rPr>
-          <w:rFonts w:ascii="Corbel" w:eastAsia="Calibri" w:hAnsi="Corbel" w:cs="Arial"/>
-          <w:color w:val="404040"/>
-          <w:kern w:val="0"/>
-          <w:szCs w:val="22"/>
-          <w14:ligatures w14:val="none"/>
-        </w:rPr>
-        <w:t>OrbitalFire</w:t>
-      </w:r>
-      <w:proofErr w:type="spellEnd"/>
-      <w:r>
-        <w:rPr>
-          <w:rFonts w:ascii="Corbel" w:eastAsia="Calibri" w:hAnsi="Corbel" w:cs="Arial"/>
-          <w:color w:val="404040"/>
-          <w:kern w:val="0"/>
-          <w:szCs w:val="22"/>
-          <w14:ligatures w14:val="none"/>
-        </w:rPr>
-        <w:t xml:space="preserve"> can provide complete remediation</w:t>
+        <w:t xml:space="preserve"> – OrbitalFire can provide complete remediation</w:t>
       </w:r>
     </w:p>
     <w:p>
@@ -8017,7 +6346,7 @@
           <w14:ligatures w14:val="none"/>
         </w:rPr>
         <w:drawing>
-          <wp:inline distT="0" distB="0" distL="0" distR="0" wp14:anchorId="03962334" wp14:editId="06A4C3EC">
+          <wp:inline distT="0" distB="0" distL="0" distR="0" wp14:anchorId="03962334" wp14:editId="6867675F">
             <wp:extent cx="152400" cy="152400"/>
             <wp:effectExtent l="0" t="0" r="0" b="0"/>
             <wp:docPr id="2011428596" name="Picture 2011428596" descr="Fire with solid fill"/>
@@ -8082,29 +6411,7 @@
           <w:szCs w:val="22"/>
           <w14:ligatures w14:val="none"/>
         </w:rPr>
-        <w:t xml:space="preserve"> – </w:t>
-      </w:r>
-      <w:proofErr w:type="spellStart"/>
-      <w:r>
-        <w:rPr>
-          <w:rFonts w:ascii="Corbel" w:eastAsia="Calibri" w:hAnsi="Corbel" w:cs="Arial"/>
-          <w:color w:val="404040"/>
-          <w:kern w:val="0"/>
-          <w:szCs w:val="22"/>
-          <w14:ligatures w14:val="none"/>
-        </w:rPr>
-        <w:t>OrbitalFire</w:t>
-      </w:r>
-      <w:proofErr w:type="spellEnd"/>
-      <w:r>
-        <w:rPr>
-          <w:rFonts w:ascii="Corbel" w:eastAsia="Calibri" w:hAnsi="Corbel" w:cs="Arial"/>
-          <w:color w:val="404040"/>
-          <w:kern w:val="0"/>
-          <w:szCs w:val="22"/>
-          <w14:ligatures w14:val="none"/>
-        </w:rPr>
-        <w:t xml:space="preserve"> can assist with remediation</w:t>
+        <w:t xml:space="preserve"> – OrbitalFire can assist with remediation</w:t>
       </w:r>
       <w:bookmarkStart w:id="15" w:name="_Hlk194407007"/>
     </w:p>

</xml_diff>

<commit_message>
Finalized Findings Details boundaries for generated images
</commit_message>
<xml_diff>
--- a/Source_Code/Reports/Sample499/FindingsReportTest.docx
+++ b/Source_Code/Reports/Sample499/FindingsReportTest.docx
@@ -601,7 +601,7 @@
           <w14:ligatures w14:val="none"/>
         </w:rPr>
         <w:drawing>
-          <wp:anchor distT="0" distB="0" distL="114300" distR="114300" simplePos="0" relativeHeight="251662336" behindDoc="0" locked="0" layoutInCell="1" allowOverlap="1" wp14:anchorId="56FF54E8" wp14:editId="61F5A16B">
+          <wp:anchor distT="0" distB="0" distL="114300" distR="114300" simplePos="0" relativeHeight="251662336" behindDoc="0" locked="0" layoutInCell="1" allowOverlap="1" wp14:anchorId="56FF54E8" wp14:editId="186B0DF2">
             <wp:simplePos x="0" y="0"/>
             <wp:positionH relativeFrom="margin">
               <wp:posOffset>1163955</wp:posOffset>
@@ -1125,7 +1125,31 @@
           <w:szCs w:val="22"/>
           <w14:ligatures w14:val="none"/>
         </w:rPr>
-        <w:t>contained in this document is confidential and proprietary. It is intended for the exclusive use of OrbitalFire, LLC and the Customer entity named in this document.</w:t>
+        <w:t xml:space="preserve">contained in this document is confidential and proprietary. It is intended for the exclusive use of </w:t>
+      </w:r>
+      <w:proofErr w:type="spellStart"/>
+      <w:r>
+        <w:rPr>
+          <w:rFonts w:ascii="Corbel" w:eastAsia="Calibri" w:hAnsi="Corbel" w:cs="Arial"/>
+          <w:snapToGrid w:val="0"/>
+          <w:color w:val="404040"/>
+          <w:kern w:val="0"/>
+          <w:szCs w:val="22"/>
+          <w14:ligatures w14:val="none"/>
+        </w:rPr>
+        <w:t>OrbitalFire</w:t>
+      </w:r>
+      <w:proofErr w:type="spellEnd"/>
+      <w:r>
+        <w:rPr>
+          <w:rFonts w:ascii="Corbel" w:eastAsia="Calibri" w:hAnsi="Corbel" w:cs="Arial"/>
+          <w:snapToGrid w:val="0"/>
+          <w:color w:val="404040"/>
+          <w:kern w:val="0"/>
+          <w:szCs w:val="22"/>
+          <w14:ligatures w14:val="none"/>
+        </w:rPr>
+        <w:t>, LLC and the Customer entity named in this document.</w:t>
       </w:r>
     </w:p>
     <w:p>
@@ -1945,7 +1969,51 @@
           <w:szCs w:val="22"/>
           <w14:ligatures w14:val="none"/>
         </w:rPr>
-        <w:t>In 2015, Ponemon Institute conducted a study on the cost of data breaches that surveyed 350 organizations from 11 different countries that had suffered some type of cybercrime. Nearly half of said these incidents (47%) were the result of malicious actors who were able to compromise company networks to steal money, intellectual property or other protected data.</w:t>
+        <w:t xml:space="preserve">In 2015, </w:t>
+      </w:r>
+      <w:proofErr w:type="spellStart"/>
+      <w:r>
+        <w:rPr>
+          <w:rFonts w:ascii="Corbel" w:eastAsia="Calibri" w:hAnsi="Corbel" w:cs="Arial"/>
+          <w:color w:val="404040"/>
+          <w:kern w:val="0"/>
+          <w:szCs w:val="22"/>
+          <w14:ligatures w14:val="none"/>
+        </w:rPr>
+        <w:t>Ponemon</w:t>
+      </w:r>
+      <w:proofErr w:type="spellEnd"/>
+      <w:r>
+        <w:rPr>
+          <w:rFonts w:ascii="Corbel" w:eastAsia="Calibri" w:hAnsi="Corbel" w:cs="Arial"/>
+          <w:color w:val="404040"/>
+          <w:kern w:val="0"/>
+          <w:szCs w:val="22"/>
+          <w14:ligatures w14:val="none"/>
+        </w:rPr>
+        <w:t xml:space="preserve"> Institute conducted a study on the cost of data breaches that surveyed 350 organizations from 11 different countries that had suffered some type of cybercrime. Nearly half </w:t>
+      </w:r>
+      <w:proofErr w:type="gramStart"/>
+      <w:r>
+        <w:rPr>
+          <w:rFonts w:ascii="Corbel" w:eastAsia="Calibri" w:hAnsi="Corbel" w:cs="Arial"/>
+          <w:color w:val="404040"/>
+          <w:kern w:val="0"/>
+          <w:szCs w:val="22"/>
+          <w14:ligatures w14:val="none"/>
+        </w:rPr>
+        <w:t>of</w:t>
+      </w:r>
+      <w:proofErr w:type="gramEnd"/>
+      <w:r>
+        <w:rPr>
+          <w:rFonts w:ascii="Corbel" w:eastAsia="Calibri" w:hAnsi="Corbel" w:cs="Arial"/>
+          <w:color w:val="404040"/>
+          <w:kern w:val="0"/>
+          <w:szCs w:val="22"/>
+          <w14:ligatures w14:val="none"/>
+        </w:rPr>
+        <w:t xml:space="preserve"> said these incidents (47%) were the result of malicious actors who were able to compromise company networks to steal money, intellectual property or other protected data.</w:t>
       </w:r>
     </w:p>
     <w:p>
@@ -2267,7 +2335,29 @@
           <w:szCs w:val="22"/>
           <w14:ligatures w14:val="none"/>
         </w:rPr>
-        <w:t>Without well-defined goals, boundaries and operational guidance, penetration testing can become disruptive, or even damaging to the organization undergoing testing. For these reasons these operational guidelines are carefully communicated and resolved.</w:t>
+        <w:t xml:space="preserve">Without well-defined goals, boundaries and operational guidance, penetration testing can become </w:t>
+      </w:r>
+      <w:proofErr w:type="gramStart"/>
+      <w:r>
+        <w:rPr>
+          <w:rFonts w:ascii="Corbel" w:eastAsia="Calibri" w:hAnsi="Corbel" w:cs="Arial"/>
+          <w:color w:val="404040"/>
+          <w:kern w:val="0"/>
+          <w:szCs w:val="22"/>
+          <w14:ligatures w14:val="none"/>
+        </w:rPr>
+        <w:t>disruptive, or</w:t>
+      </w:r>
+      <w:proofErr w:type="gramEnd"/>
+      <w:r>
+        <w:rPr>
+          <w:rFonts w:ascii="Corbel" w:eastAsia="Calibri" w:hAnsi="Corbel" w:cs="Arial"/>
+          <w:color w:val="404040"/>
+          <w:kern w:val="0"/>
+          <w:szCs w:val="22"/>
+          <w14:ligatures w14:val="none"/>
+        </w:rPr>
+        <w:t xml:space="preserve"> even damaging to the organization undergoing testing. For these reasons these operational guidelines are carefully communicated and resolved.</w:t>
       </w:r>
     </w:p>
     <w:p>
@@ -2917,7 +3007,51 @@
           <w:szCs w:val="22"/>
           <w14:ligatures w14:val="none"/>
         </w:rPr>
-        <w:t>Penetration testing can be conducted many ways, the following describe the methodologies utilized for this test:</w:t>
+        <w:t xml:space="preserve">Penetration testing can be </w:t>
+      </w:r>
+      <w:proofErr w:type="gramStart"/>
+      <w:r>
+        <w:rPr>
+          <w:rFonts w:ascii="Corbel" w:eastAsia="Calibri" w:hAnsi="Corbel" w:cs="Arial"/>
+          <w:color w:val="404040"/>
+          <w:kern w:val="0"/>
+          <w:szCs w:val="22"/>
+          <w14:ligatures w14:val="none"/>
+        </w:rPr>
+        <w:t>conducted</w:t>
+      </w:r>
+      <w:proofErr w:type="gramEnd"/>
+      <w:r>
+        <w:rPr>
+          <w:rFonts w:ascii="Corbel" w:eastAsia="Calibri" w:hAnsi="Corbel" w:cs="Arial"/>
+          <w:color w:val="404040"/>
+          <w:kern w:val="0"/>
+          <w:szCs w:val="22"/>
+          <w14:ligatures w14:val="none"/>
+        </w:rPr>
+        <w:t xml:space="preserve"> many </w:t>
+      </w:r>
+      <w:proofErr w:type="gramStart"/>
+      <w:r>
+        <w:rPr>
+          <w:rFonts w:ascii="Corbel" w:eastAsia="Calibri" w:hAnsi="Corbel" w:cs="Arial"/>
+          <w:color w:val="404040"/>
+          <w:kern w:val="0"/>
+          <w:szCs w:val="22"/>
+          <w14:ligatures w14:val="none"/>
+        </w:rPr>
+        <w:t>ways,</w:t>
+      </w:r>
+      <w:proofErr w:type="gramEnd"/>
+      <w:r>
+        <w:rPr>
+          <w:rFonts w:ascii="Corbel" w:eastAsia="Calibri" w:hAnsi="Corbel" w:cs="Arial"/>
+          <w:color w:val="404040"/>
+          <w:kern w:val="0"/>
+          <w:szCs w:val="22"/>
+          <w14:ligatures w14:val="none"/>
+        </w:rPr>
+        <w:t xml:space="preserve"> the following describe the methodologies utilized for this test:</w:t>
       </w:r>
     </w:p>
     <w:p>
@@ -3224,15 +3358,27 @@
         </w:rPr>
         <w:t xml:space="preserve"> </w:t>
       </w:r>
-      <w:r>
-        <w:rPr>
-          <w:rFonts w:ascii="Corbel" w:eastAsia="Calibri" w:hAnsi="Corbel" w:cs="Arial"/>
-          <w:color w:val="404040"/>
-          <w:kern w:val="0"/>
-          <w:szCs w:val="22"/>
-          <w14:ligatures w14:val="none"/>
-        </w:rPr>
-        <w:t>–  Findings that have a moderate impact on the security of the system or application and require timely attention</w:t>
+      <w:proofErr w:type="gramStart"/>
+      <w:r>
+        <w:rPr>
+          <w:rFonts w:ascii="Corbel" w:eastAsia="Calibri" w:hAnsi="Corbel" w:cs="Arial"/>
+          <w:color w:val="404040"/>
+          <w:kern w:val="0"/>
+          <w:szCs w:val="22"/>
+          <w14:ligatures w14:val="none"/>
+        </w:rPr>
+        <w:t>–  Findings</w:t>
+      </w:r>
+      <w:proofErr w:type="gramEnd"/>
+      <w:r>
+        <w:rPr>
+          <w:rFonts w:ascii="Corbel" w:eastAsia="Calibri" w:hAnsi="Corbel" w:cs="Arial"/>
+          <w:color w:val="404040"/>
+          <w:kern w:val="0"/>
+          <w:szCs w:val="22"/>
+          <w14:ligatures w14:val="none"/>
+        </w:rPr>
+        <w:t xml:space="preserve"> that have a moderate impact on the security of the system or application and require timely attention</w:t>
       </w:r>
     </w:p>
     <w:p>
@@ -3401,6 +3547,7 @@
         <w:t xml:space="preserve">Start Date: </w:t>
       </w:r>
       <w:bookmarkStart w:id="4" w:name="_Hlk212473124"/>
+      <w:proofErr w:type="gramStart"/>
       <w:r>
         <w:rPr>
           <w:rFonts w:ascii="Corbel" w:eastAsia="Calibri" w:hAnsi="Corbel" w:cs="Arial"/>
@@ -3410,7 +3557,19 @@
           <w:highlight w:val="yellow"/>
           <w14:ligatures w14:val="none"/>
         </w:rPr>
-        <w:t>January, 2026</w:t>
+        <w:t>January,</w:t>
+      </w:r>
+      <w:proofErr w:type="gramEnd"/>
+      <w:r>
+        <w:rPr>
+          <w:rFonts w:ascii="Corbel" w:eastAsia="Calibri" w:hAnsi="Corbel" w:cs="Arial"/>
+          <w:color w:val="FF6633"/>
+          <w:kern w:val="0"/>
+          <w:szCs w:val="22"/>
+          <w:highlight w:val="yellow"/>
+          <w14:ligatures w14:val="none"/>
+        </w:rPr>
+        <w:t xml:space="preserve"> 2026</w:t>
       </w:r>
       <w:bookmarkEnd w:id="4"/>
     </w:p>
@@ -3442,6 +3601,7 @@
         </w:rPr>
         <w:t xml:space="preserve">End Date: </w:t>
       </w:r>
+      <w:proofErr w:type="gramStart"/>
       <w:r>
         <w:rPr>
           <w:rFonts w:ascii="Corbel" w:eastAsia="Calibri" w:hAnsi="Corbel" w:cs="Arial"/>
@@ -3451,7 +3611,19 @@
           <w:highlight w:val="yellow"/>
           <w14:ligatures w14:val="none"/>
         </w:rPr>
-        <w:t>January, 2026</w:t>
+        <w:t>January,</w:t>
+      </w:r>
+      <w:proofErr w:type="gramEnd"/>
+      <w:r>
+        <w:rPr>
+          <w:rFonts w:ascii="Corbel" w:eastAsia="Calibri" w:hAnsi="Corbel" w:cs="Arial"/>
+          <w:color w:val="FF6633"/>
+          <w:kern w:val="0"/>
+          <w:szCs w:val="22"/>
+          <w:highlight w:val="yellow"/>
+          <w14:ligatures w14:val="none"/>
+        </w:rPr>
+        <w:t xml:space="preserve"> 2026</w:t>
       </w:r>
     </w:p>
     <w:p>
@@ -3603,7 +3775,20 @@
           <w14:ligatures w14:val="none"/>
         </w:rPr>
         <w:br/>
-        <w:t xml:space="preserve">HOST DISCOVERY </w:t>
+        <w:t xml:space="preserve">HOST </w:t>
+      </w:r>
+      <w:proofErr w:type="gramStart"/>
+      <w:r>
+        <w:rPr>
+          <w:rFonts w:ascii="Corbel" w:eastAsia="Calibri" w:hAnsi="Corbel" w:cs="Arial"/>
+          <w:b/>
+          <w:bCs/>
+          <w:color w:val="404040"/>
+          <w:kern w:val="0"/>
+          <w:szCs w:val="22"/>
+          <w14:ligatures w14:val="none"/>
+        </w:rPr>
+        <w:t xml:space="preserve">DISCOVERY </w:t>
       </w:r>
       <w:r>
         <w:rPr>
@@ -3630,123 +3815,22 @@
           <w:highlight w:val="yellow"/>
           <w14:ligatures w14:val="none"/>
         </w:rPr>
-        <w:t>INTERNAL NETWORK ASSESSMENT</w:t>
-      </w:r>
+        <w:t>INTERNAL</w:t>
+      </w:r>
+      <w:proofErr w:type="gramEnd"/>
       <w:r>
         <w:rPr>
           <w:rFonts w:ascii="Corbel" w:eastAsia="Calibri" w:hAnsi="Corbel" w:cs="Arial"/>
           <w:b/>
           <w:bCs/>
-          <w:color w:val="404040"/>
-          <w:kern w:val="0"/>
-          <w:szCs w:val="22"/>
-          <w14:ligatures w14:val="none"/>
-        </w:rPr>
-        <w:br/>
-      </w:r>
-      <w:r>
-        <w:rPr>
-          <w:rFonts w:ascii="Corbel" w:eastAsia="Calibri" w:hAnsi="Corbel" w:cs="Arial"/>
-          <w:color w:val="404040"/>
-          <w:kern w:val="0"/>
-          <w:szCs w:val="22"/>
-          <w14:ligatures w14:val="none"/>
-        </w:rPr>
-        <w:t xml:space="preserve">The host discovery phase included port scanning, ping sweeps and more, to identify active systems within the environment. Of the </w:t>
-      </w:r>
-      <w:r>
-        <w:rPr>
-          <w:rFonts w:ascii="Corbel" w:eastAsia="Calibri" w:hAnsi="Corbel" w:cs="Arial"/>
-          <w:color w:val="404040"/>
-          <w:kern w:val="0"/>
-          <w:szCs w:val="22"/>
+          <w:color w:val="F06023"/>
+          <w:kern w:val="0"/>
+          <w:sz w:val="20"/>
+          <w:szCs w:val="20"/>
           <w:highlight w:val="yellow"/>
           <w14:ligatures w14:val="none"/>
         </w:rPr>
-        <w:t>one (1) network range</w:t>
-      </w:r>
-      <w:r>
-        <w:rPr>
-          <w:rFonts w:ascii="Corbel" w:eastAsia="Calibri" w:hAnsi="Corbel" w:cs="Arial"/>
-          <w:color w:val="404040"/>
-          <w:kern w:val="0"/>
-          <w:szCs w:val="22"/>
-          <w14:ligatures w14:val="none"/>
-        </w:rPr>
-        <w:t xml:space="preserve"> that was provided as part of scope, OrbitalFire was able to identify a total of </w:t>
-      </w:r>
-      <w:r>
-        <w:rPr>
-          <w:rFonts w:ascii="Corbel" w:eastAsia="Calibri" w:hAnsi="Corbel" w:cs="Arial"/>
-          <w:color w:val="404040"/>
-          <w:kern w:val="0"/>
-          <w:szCs w:val="22"/>
-          <w:highlight w:val="yellow"/>
-          <w14:ligatures w14:val="none"/>
-        </w:rPr>
-        <w:t>one hundred and one (101)</w:t>
-      </w:r>
-      <w:r>
-        <w:rPr>
-          <w:rFonts w:ascii="Corbel" w:eastAsia="Calibri" w:hAnsi="Corbel" w:cs="Arial"/>
-          <w:color w:val="404040"/>
-          <w:kern w:val="0"/>
-          <w:szCs w:val="22"/>
-          <w14:ligatures w14:val="none"/>
-        </w:rPr>
-        <w:t xml:space="preserve"> systems to be active within the targeted environment. In result of the </w:t>
-      </w:r>
-      <w:r>
-        <w:rPr>
-          <w:rFonts w:ascii="Corbel" w:eastAsia="Calibri" w:hAnsi="Corbel" w:cs="Arial"/>
-          <w:color w:val="404040"/>
-          <w:kern w:val="0"/>
-          <w:szCs w:val="22"/>
-          <w:highlight w:val="yellow"/>
-          <w14:ligatures w14:val="none"/>
-        </w:rPr>
-        <w:t>one hundred and one (101)</w:t>
-      </w:r>
-      <w:r>
-        <w:rPr>
-          <w:rFonts w:ascii="Corbel" w:eastAsia="Calibri" w:hAnsi="Corbel" w:cs="Arial"/>
-          <w:color w:val="404040"/>
-          <w:kern w:val="0"/>
-          <w:szCs w:val="22"/>
-          <w14:ligatures w14:val="none"/>
-        </w:rPr>
-        <w:t xml:space="preserve"> addresses that were scanned, OrbitalFire found </w:t>
-      </w:r>
-      <w:r>
-        <w:rPr>
-          <w:rFonts w:ascii="Corbel" w:eastAsia="Calibri" w:hAnsi="Corbel" w:cs="Arial"/>
-          <w:color w:val="404040"/>
-          <w:kern w:val="0"/>
-          <w:szCs w:val="22"/>
-          <w:highlight w:val="yellow"/>
-          <w14:ligatures w14:val="none"/>
-        </w:rPr>
-        <w:t>three hundred and seventy-seven (377)</w:t>
-      </w:r>
-      <w:r>
-        <w:rPr>
-          <w:rFonts w:ascii="Corbel" w:eastAsia="Calibri" w:hAnsi="Corbel" w:cs="Arial"/>
-          <w:color w:val="404040"/>
-          <w:kern w:val="0"/>
-          <w:szCs w:val="22"/>
-          <w14:ligatures w14:val="none"/>
-        </w:rPr>
-        <w:t xml:space="preserve"> open ports.</w:t>
-      </w:r>
-      <w:r>
-        <w:rPr>
-          <w:rFonts w:ascii="Corbel" w:eastAsia="Calibri" w:hAnsi="Corbel" w:cs="Arial"/>
-          <w:color w:val="404040"/>
-          <w:kern w:val="0"/>
-          <w:szCs w:val="22"/>
-          <w14:ligatures w14:val="none"/>
-        </w:rPr>
-        <w:br/>
+        <w:t xml:space="preserve"> NETWORK ASSESSMENT</w:t>
       </w:r>
       <w:r>
         <w:rPr>
@@ -3759,7 +3843,154 @@
           <w14:ligatures w14:val="none"/>
         </w:rPr>
         <w:br/>
-        <w:t>ENUMERATION</w:t>
+      </w:r>
+      <w:r>
+        <w:rPr>
+          <w:rFonts w:ascii="Corbel" w:eastAsia="Calibri" w:hAnsi="Corbel" w:cs="Arial"/>
+          <w:color w:val="404040"/>
+          <w:kern w:val="0"/>
+          <w:szCs w:val="22"/>
+          <w14:ligatures w14:val="none"/>
+        </w:rPr>
+        <w:t xml:space="preserve">The host discovery phase included port scanning, ping sweeps and more, to identify active systems within the environment. Of the </w:t>
+      </w:r>
+      <w:r>
+        <w:rPr>
+          <w:rFonts w:ascii="Corbel" w:eastAsia="Calibri" w:hAnsi="Corbel" w:cs="Arial"/>
+          <w:color w:val="404040"/>
+          <w:kern w:val="0"/>
+          <w:szCs w:val="22"/>
+          <w:highlight w:val="yellow"/>
+          <w14:ligatures w14:val="none"/>
+        </w:rPr>
+        <w:t>one (1) network range</w:t>
+      </w:r>
+      <w:r>
+        <w:rPr>
+          <w:rFonts w:ascii="Corbel" w:eastAsia="Calibri" w:hAnsi="Corbel" w:cs="Arial"/>
+          <w:color w:val="404040"/>
+          <w:kern w:val="0"/>
+          <w:szCs w:val="22"/>
+          <w14:ligatures w14:val="none"/>
+        </w:rPr>
+        <w:t xml:space="preserve"> that was provided as part of scope, </w:t>
+      </w:r>
+      <w:proofErr w:type="spellStart"/>
+      <w:r>
+        <w:rPr>
+          <w:rFonts w:ascii="Corbel" w:eastAsia="Calibri" w:hAnsi="Corbel" w:cs="Arial"/>
+          <w:color w:val="404040"/>
+          <w:kern w:val="0"/>
+          <w:szCs w:val="22"/>
+          <w14:ligatures w14:val="none"/>
+        </w:rPr>
+        <w:t>OrbitalFire</w:t>
+      </w:r>
+      <w:proofErr w:type="spellEnd"/>
+      <w:r>
+        <w:rPr>
+          <w:rFonts w:ascii="Corbel" w:eastAsia="Calibri" w:hAnsi="Corbel" w:cs="Arial"/>
+          <w:color w:val="404040"/>
+          <w:kern w:val="0"/>
+          <w:szCs w:val="22"/>
+          <w14:ligatures w14:val="none"/>
+        </w:rPr>
+        <w:t xml:space="preserve"> was able to identify a total of </w:t>
+      </w:r>
+      <w:r>
+        <w:rPr>
+          <w:rFonts w:ascii="Corbel" w:eastAsia="Calibri" w:hAnsi="Corbel" w:cs="Arial"/>
+          <w:color w:val="404040"/>
+          <w:kern w:val="0"/>
+          <w:szCs w:val="22"/>
+          <w:highlight w:val="yellow"/>
+          <w14:ligatures w14:val="none"/>
+        </w:rPr>
+        <w:t>one hundred and one (101)</w:t>
+      </w:r>
+      <w:r>
+        <w:rPr>
+          <w:rFonts w:ascii="Corbel" w:eastAsia="Calibri" w:hAnsi="Corbel" w:cs="Arial"/>
+          <w:color w:val="404040"/>
+          <w:kern w:val="0"/>
+          <w:szCs w:val="22"/>
+          <w14:ligatures w14:val="none"/>
+        </w:rPr>
+        <w:t xml:space="preserve"> systems to be active within the targeted environment. In result of the </w:t>
+      </w:r>
+      <w:r>
+        <w:rPr>
+          <w:rFonts w:ascii="Corbel" w:eastAsia="Calibri" w:hAnsi="Corbel" w:cs="Arial"/>
+          <w:color w:val="404040"/>
+          <w:kern w:val="0"/>
+          <w:szCs w:val="22"/>
+          <w:highlight w:val="yellow"/>
+          <w14:ligatures w14:val="none"/>
+        </w:rPr>
+        <w:t>one hundred and one (101)</w:t>
+      </w:r>
+      <w:r>
+        <w:rPr>
+          <w:rFonts w:ascii="Corbel" w:eastAsia="Calibri" w:hAnsi="Corbel" w:cs="Arial"/>
+          <w:color w:val="404040"/>
+          <w:kern w:val="0"/>
+          <w:szCs w:val="22"/>
+          <w14:ligatures w14:val="none"/>
+        </w:rPr>
+        <w:t xml:space="preserve"> addresses that were scanned, </w:t>
+      </w:r>
+      <w:proofErr w:type="spellStart"/>
+      <w:r>
+        <w:rPr>
+          <w:rFonts w:ascii="Corbel" w:eastAsia="Calibri" w:hAnsi="Corbel" w:cs="Arial"/>
+          <w:color w:val="404040"/>
+          <w:kern w:val="0"/>
+          <w:szCs w:val="22"/>
+          <w14:ligatures w14:val="none"/>
+        </w:rPr>
+        <w:t>OrbitalFire</w:t>
+      </w:r>
+      <w:proofErr w:type="spellEnd"/>
+      <w:r>
+        <w:rPr>
+          <w:rFonts w:ascii="Corbel" w:eastAsia="Calibri" w:hAnsi="Corbel" w:cs="Arial"/>
+          <w:color w:val="404040"/>
+          <w:kern w:val="0"/>
+          <w:szCs w:val="22"/>
+          <w14:ligatures w14:val="none"/>
+        </w:rPr>
+        <w:t xml:space="preserve"> found </w:t>
+      </w:r>
+      <w:r>
+        <w:rPr>
+          <w:rFonts w:ascii="Corbel" w:eastAsia="Calibri" w:hAnsi="Corbel" w:cs="Arial"/>
+          <w:color w:val="404040"/>
+          <w:kern w:val="0"/>
+          <w:szCs w:val="22"/>
+          <w:highlight w:val="yellow"/>
+          <w14:ligatures w14:val="none"/>
+        </w:rPr>
+        <w:t>three hundred and seventy-seven (377)</w:t>
+      </w:r>
+      <w:r>
+        <w:rPr>
+          <w:rFonts w:ascii="Corbel" w:eastAsia="Calibri" w:hAnsi="Corbel" w:cs="Arial"/>
+          <w:color w:val="404040"/>
+          <w:kern w:val="0"/>
+          <w:szCs w:val="22"/>
+          <w14:ligatures w14:val="none"/>
+        </w:rPr>
+        <w:t xml:space="preserve"> open ports.</w:t>
+      </w:r>
+      <w:r>
+        <w:rPr>
+          <w:rFonts w:ascii="Corbel" w:eastAsia="Calibri" w:hAnsi="Corbel" w:cs="Arial"/>
+          <w:color w:val="404040"/>
+          <w:kern w:val="0"/>
+          <w:szCs w:val="22"/>
+          <w14:ligatures w14:val="none"/>
+        </w:rPr>
+        <w:br/>
       </w:r>
       <w:r>
         <w:rPr>
@@ -3772,36 +4003,7 @@
           <w14:ligatures w14:val="none"/>
         </w:rPr>
         <w:br/>
-      </w:r>
-      <w:r>
-        <w:rPr>
-          <w:rFonts w:ascii="Corbel" w:eastAsia="Calibri" w:hAnsi="Corbel" w:cs="Arial"/>
-          <w:color w:val="404040"/>
-          <w:kern w:val="0"/>
-          <w:szCs w:val="22"/>
-          <w14:ligatures w14:val="none"/>
-        </w:rPr>
-        <w:t>After the identification of all available hosts within the network, OrbitalFire then conducted enumeration. Enumeration during this assessment consisted of scanning the identified ports to determine which services are running (if any). Additional scans were then performed based on running services to attempt enumerating information (if possible).</w:t>
-      </w:r>
-      <w:r>
-        <w:rPr>
-          <w:rFonts w:ascii="Corbel" w:eastAsia="Calibri" w:hAnsi="Corbel" w:cs="Arial"/>
-          <w:color w:val="404040"/>
-          <w:kern w:val="0"/>
-          <w:szCs w:val="22"/>
-          <w14:ligatures w14:val="none"/>
-        </w:rPr>
-        <w:br/>
-      </w:r>
-      <w:r>
-        <w:rPr>
-          <w:rFonts w:ascii="Corbel" w:eastAsia="Calibri" w:hAnsi="Corbel" w:cs="Arial"/>
-          <w:color w:val="404040"/>
-          <w:kern w:val="0"/>
-          <w:szCs w:val="22"/>
-          <w14:ligatures w14:val="none"/>
-        </w:rPr>
-        <w:br/>
+        <w:t>ENUMERATION</w:t>
       </w:r>
       <w:r>
         <w:rPr>
@@ -3813,7 +4015,59 @@
           <w:szCs w:val="22"/>
           <w14:ligatures w14:val="none"/>
         </w:rPr>
-        <w:t>EXPLOITATION</w:t>
+        <w:br/>
+      </w:r>
+      <w:r>
+        <w:rPr>
+          <w:rFonts w:ascii="Corbel" w:eastAsia="Calibri" w:hAnsi="Corbel" w:cs="Arial"/>
+          <w:color w:val="404040"/>
+          <w:kern w:val="0"/>
+          <w:szCs w:val="22"/>
+          <w14:ligatures w14:val="none"/>
+        </w:rPr>
+        <w:t xml:space="preserve">After the identification of all available hosts within the network, </w:t>
+      </w:r>
+      <w:proofErr w:type="spellStart"/>
+      <w:r>
+        <w:rPr>
+          <w:rFonts w:ascii="Corbel" w:eastAsia="Calibri" w:hAnsi="Corbel" w:cs="Arial"/>
+          <w:color w:val="404040"/>
+          <w:kern w:val="0"/>
+          <w:szCs w:val="22"/>
+          <w14:ligatures w14:val="none"/>
+        </w:rPr>
+        <w:t>OrbitalFire</w:t>
+      </w:r>
+      <w:proofErr w:type="spellEnd"/>
+      <w:r>
+        <w:rPr>
+          <w:rFonts w:ascii="Corbel" w:eastAsia="Calibri" w:hAnsi="Corbel" w:cs="Arial"/>
+          <w:color w:val="404040"/>
+          <w:kern w:val="0"/>
+          <w:szCs w:val="22"/>
+          <w14:ligatures w14:val="none"/>
+        </w:rPr>
+        <w:t xml:space="preserve"> then conducted enumeration. Enumeration during this assessment consisted of scanning the identified ports to determine which services are running (if any). Additional scans were then performed based on running services to attempt enumerating information (if possible).</w:t>
+      </w:r>
+      <w:r>
+        <w:rPr>
+          <w:rFonts w:ascii="Corbel" w:eastAsia="Calibri" w:hAnsi="Corbel" w:cs="Arial"/>
+          <w:color w:val="404040"/>
+          <w:kern w:val="0"/>
+          <w:szCs w:val="22"/>
+          <w14:ligatures w14:val="none"/>
+        </w:rPr>
+        <w:br/>
+      </w:r>
+      <w:r>
+        <w:rPr>
+          <w:rFonts w:ascii="Corbel" w:eastAsia="Calibri" w:hAnsi="Corbel" w:cs="Arial"/>
+          <w:color w:val="404040"/>
+          <w:kern w:val="0"/>
+          <w:szCs w:val="22"/>
+          <w14:ligatures w14:val="none"/>
+        </w:rPr>
+        <w:br/>
       </w:r>
       <w:r>
         <w:rPr>
@@ -3825,58 +4079,7 @@
           <w:szCs w:val="22"/>
           <w14:ligatures w14:val="none"/>
         </w:rPr>
-        <w:br/>
-      </w:r>
-      <w:r>
-        <w:rPr>
-          <w:rFonts w:ascii="Corbel" w:eastAsia="Calibri" w:hAnsi="Corbel" w:cs="Arial"/>
-          <w:color w:val="404040"/>
-          <w:kern w:val="0"/>
-          <w:szCs w:val="22"/>
-          <w14:ligatures w14:val="none"/>
-        </w:rPr>
-        <w:t xml:space="preserve">Post enumeration, OrbitalFire focused strictly on the exploitation of any/all running services that were previously discovered. OrbitalFire used a comprehensive set of tools, custom scripts, and manual techniques to thoroughly identify possible threats to </w:t>
-      </w:r>
-      <w:r>
-        <w:rPr>
-          <w:rFonts w:ascii="Corbel" w:eastAsia="Calibri" w:hAnsi="Corbel" w:cs="Arial"/>
-          <w:color w:val="404040"/>
-          <w:kern w:val="0"/>
-          <w:szCs w:val="22"/>
-          <w:highlight w:val="yellow"/>
-          <w14:ligatures w14:val="none"/>
-        </w:rPr>
-        <w:t>DEMO’s</w:t>
-      </w:r>
-      <w:r>
-        <w:rPr>
-          <w:rFonts w:ascii="Corbel" w:eastAsia="Calibri" w:hAnsi="Corbel" w:cs="Arial"/>
-          <w:color w:val="404040"/>
-          <w:kern w:val="0"/>
-          <w:szCs w:val="22"/>
-          <w14:ligatures w14:val="none"/>
-        </w:rPr>
-        <w:t xml:space="preserve"> environment.</w:t>
-      </w:r>
-      <w:r>
-        <w:rPr>
-          <w:rFonts w:ascii="Corbel" w:eastAsia="Calibri" w:hAnsi="Corbel" w:cs="Arial"/>
-          <w:color w:val="404040"/>
-          <w:kern w:val="0"/>
-          <w:szCs w:val="22"/>
-          <w14:ligatures w14:val="none"/>
-        </w:rPr>
-        <w:br/>
-      </w:r>
-      <w:r>
-        <w:rPr>
-          <w:rFonts w:ascii="Corbel" w:eastAsia="Calibri" w:hAnsi="Corbel" w:cs="Arial"/>
-          <w:color w:val="404040"/>
-          <w:kern w:val="0"/>
-          <w:szCs w:val="22"/>
-          <w14:ligatures w14:val="none"/>
-        </w:rPr>
-        <w:br/>
+        <w:t>EXPLOITATION</w:t>
       </w:r>
       <w:r>
         <w:rPr>
@@ -3888,7 +4091,102 @@
           <w:szCs w:val="22"/>
           <w14:ligatures w14:val="none"/>
         </w:rPr>
-        <w:t>POST EXPLOITATION</w:t>
+        <w:br/>
+      </w:r>
+      <w:r>
+        <w:rPr>
+          <w:rFonts w:ascii="Corbel" w:eastAsia="Calibri" w:hAnsi="Corbel" w:cs="Arial"/>
+          <w:color w:val="404040"/>
+          <w:kern w:val="0"/>
+          <w:szCs w:val="22"/>
+          <w14:ligatures w14:val="none"/>
+        </w:rPr>
+        <w:t xml:space="preserve">Post enumeration, </w:t>
+      </w:r>
+      <w:proofErr w:type="spellStart"/>
+      <w:r>
+        <w:rPr>
+          <w:rFonts w:ascii="Corbel" w:eastAsia="Calibri" w:hAnsi="Corbel" w:cs="Arial"/>
+          <w:color w:val="404040"/>
+          <w:kern w:val="0"/>
+          <w:szCs w:val="22"/>
+          <w14:ligatures w14:val="none"/>
+        </w:rPr>
+        <w:t>OrbitalFire</w:t>
+      </w:r>
+      <w:proofErr w:type="spellEnd"/>
+      <w:r>
+        <w:rPr>
+          <w:rFonts w:ascii="Corbel" w:eastAsia="Calibri" w:hAnsi="Corbel" w:cs="Arial"/>
+          <w:color w:val="404040"/>
+          <w:kern w:val="0"/>
+          <w:szCs w:val="22"/>
+          <w14:ligatures w14:val="none"/>
+        </w:rPr>
+        <w:t xml:space="preserve"> focused strictly on the exploitation of any/all running services that were previously discovered. </w:t>
+      </w:r>
+      <w:proofErr w:type="spellStart"/>
+      <w:r>
+        <w:rPr>
+          <w:rFonts w:ascii="Corbel" w:eastAsia="Calibri" w:hAnsi="Corbel" w:cs="Arial"/>
+          <w:color w:val="404040"/>
+          <w:kern w:val="0"/>
+          <w:szCs w:val="22"/>
+          <w14:ligatures w14:val="none"/>
+        </w:rPr>
+        <w:t>OrbitalFire</w:t>
+      </w:r>
+      <w:proofErr w:type="spellEnd"/>
+      <w:r>
+        <w:rPr>
+          <w:rFonts w:ascii="Corbel" w:eastAsia="Calibri" w:hAnsi="Corbel" w:cs="Arial"/>
+          <w:color w:val="404040"/>
+          <w:kern w:val="0"/>
+          <w:szCs w:val="22"/>
+          <w14:ligatures w14:val="none"/>
+        </w:rPr>
+        <w:t xml:space="preserve"> used a comprehensive set of tools, custom scripts, and manual techniques to thoroughly identify possible threats to </w:t>
+      </w:r>
+      <w:r>
+        <w:rPr>
+          <w:rFonts w:ascii="Corbel" w:eastAsia="Calibri" w:hAnsi="Corbel" w:cs="Arial"/>
+          <w:color w:val="404040"/>
+          <w:kern w:val="0"/>
+          <w:szCs w:val="22"/>
+          <w:highlight w:val="yellow"/>
+          <w14:ligatures w14:val="none"/>
+        </w:rPr>
+        <w:t>DEMO’s</w:t>
+      </w:r>
+      <w:r>
+        <w:rPr>
+          <w:rFonts w:ascii="Corbel" w:eastAsia="Calibri" w:hAnsi="Corbel" w:cs="Arial"/>
+          <w:color w:val="404040"/>
+          <w:kern w:val="0"/>
+          <w:szCs w:val="22"/>
+          <w14:ligatures w14:val="none"/>
+        </w:rPr>
+        <w:t xml:space="preserve"> environment.</w:t>
+      </w:r>
+      <w:r>
+        <w:rPr>
+          <w:rFonts w:ascii="Corbel" w:eastAsia="Calibri" w:hAnsi="Corbel" w:cs="Arial"/>
+          <w:color w:val="404040"/>
+          <w:kern w:val="0"/>
+          <w:szCs w:val="22"/>
+          <w14:ligatures w14:val="none"/>
+        </w:rPr>
+        <w:br/>
+      </w:r>
+      <w:r>
+        <w:rPr>
+          <w:rFonts w:ascii="Corbel" w:eastAsia="Calibri" w:hAnsi="Corbel" w:cs="Arial"/>
+          <w:color w:val="404040"/>
+          <w:kern w:val="0"/>
+          <w:szCs w:val="22"/>
+          <w14:ligatures w14:val="none"/>
+        </w:rPr>
+        <w:br/>
       </w:r>
       <w:r>
         <w:rPr>
@@ -3900,6 +4198,18 @@
           <w:szCs w:val="22"/>
           <w14:ligatures w14:val="none"/>
         </w:rPr>
+        <w:t>POST EXPLOITATION</w:t>
+      </w:r>
+      <w:r>
+        <w:rPr>
+          <w:rFonts w:ascii="Corbel" w:eastAsia="Calibri" w:hAnsi="Corbel" w:cs="Arial"/>
+          <w:b/>
+          <w:bCs/>
+          <w:color w:val="404040"/>
+          <w:kern w:val="0"/>
+          <w:szCs w:val="22"/>
+          <w14:ligatures w14:val="none"/>
+        </w:rPr>
         <w:br/>
       </w:r>
       <w:r>
@@ -3910,7 +4220,29 @@
           <w:szCs w:val="22"/>
           <w14:ligatures w14:val="none"/>
         </w:rPr>
-        <w:t>Once the exploitation phase was complete, OrbitalFire then tested and validated all identified threats to evaluate the depth of compromise.</w:t>
+        <w:t xml:space="preserve">Once the exploitation phase was complete, </w:t>
+      </w:r>
+      <w:proofErr w:type="spellStart"/>
+      <w:r>
+        <w:rPr>
+          <w:rFonts w:ascii="Corbel" w:eastAsia="Calibri" w:hAnsi="Corbel" w:cs="Arial"/>
+          <w:color w:val="404040"/>
+          <w:kern w:val="0"/>
+          <w:szCs w:val="22"/>
+          <w14:ligatures w14:val="none"/>
+        </w:rPr>
+        <w:t>OrbitalFire</w:t>
+      </w:r>
+      <w:proofErr w:type="spellEnd"/>
+      <w:r>
+        <w:rPr>
+          <w:rFonts w:ascii="Corbel" w:eastAsia="Calibri" w:hAnsi="Corbel" w:cs="Arial"/>
+          <w:color w:val="404040"/>
+          <w:kern w:val="0"/>
+          <w:szCs w:val="22"/>
+          <w14:ligatures w14:val="none"/>
+        </w:rPr>
+        <w:t xml:space="preserve"> then tested and validated all identified threats to evaluate the depth of compromise.</w:t>
       </w:r>
       <w:r>
         <w:rPr>
@@ -4171,7 +4503,29 @@
           <w:szCs w:val="22"/>
           <w14:ligatures w14:val="none"/>
         </w:rPr>
-        <w:t>To summarize the results of this assessment, OrbitalFire has grouped all findings from the penetration test into rollup findings. These rollup findings can be used to quickly determine the root cause of all issues identified in this assessment. It is highly recommended to implement a remediation strategy based on the rollup findings below to enhance security posture and overall defensibility.</w:t>
+        <w:t xml:space="preserve">To summarize the results of this assessment, </w:t>
+      </w:r>
+      <w:proofErr w:type="spellStart"/>
+      <w:r>
+        <w:rPr>
+          <w:rFonts w:ascii="Corbel" w:eastAsia="Calibri" w:hAnsi="Corbel" w:cs="Arial"/>
+          <w:color w:val="404040"/>
+          <w:kern w:val="0"/>
+          <w:szCs w:val="22"/>
+          <w14:ligatures w14:val="none"/>
+        </w:rPr>
+        <w:t>OrbitalFire</w:t>
+      </w:r>
+      <w:proofErr w:type="spellEnd"/>
+      <w:r>
+        <w:rPr>
+          <w:rFonts w:ascii="Corbel" w:eastAsia="Calibri" w:hAnsi="Corbel" w:cs="Arial"/>
+          <w:color w:val="404040"/>
+          <w:kern w:val="0"/>
+          <w:szCs w:val="22"/>
+          <w14:ligatures w14:val="none"/>
+        </w:rPr>
+        <w:t xml:space="preserve"> has grouped all findings from the penetration test into rollup findings. These rollup findings can be used to quickly determine the root cause of all issues identified in this assessment. It is highly recommended to implement a remediation strategy based on the rollup findings below to enhance security posture and overall defensibility.</w:t>
       </w:r>
     </w:p>
     <w:p>
@@ -4374,15 +4728,35 @@
       <w:r>
         <w:rPr>
           <w:rFonts w:ascii="Corbel" w:hAnsi="Corbel"/>
+        </w:rPr>
+        <w:t xml:space="preserve">1.    </w:t>
+      </w:r>
+      <w:r>
+        <w:rPr>
+          <w:rFonts w:ascii="Corbel" w:hAnsi="Corbel"/>
           <w:b/>
         </w:rPr>
-        <w:t xml:space="preserve">1. Subdomain Takeover Vulnerability - </w:t>
+        <w:t>Subdomain Takeover Vulnerability</w:t>
       </w:r>
       <w:r>
         <w:rPr>
           <w:rFonts w:ascii="Corbel" w:hAnsi="Corbel"/>
         </w:rPr>
-        <w:t>During testing, OrbitalFire identified a potential subdomain takeover vulnerability affecting one or more domains owned by [CUSTOMER NAME]. This issue typically results from misconfigured DNS records that reference unclaimed or deprovisioned third-party services, allowing an attacker to register the external resource and gain control of the associated subdomain. If exploited, an attacker could host malicious content, impersonate the organization, conduct phishing campaigns, or collect user data, posing a significant risk to brand reputation, user trust, and overall security posture.</w:t>
+        <w:t xml:space="preserve"> - During testing, </w:t>
+      </w:r>
+      <w:proofErr w:type="spellStart"/>
+      <w:r>
+        <w:rPr>
+          <w:rFonts w:ascii="Corbel" w:hAnsi="Corbel"/>
+        </w:rPr>
+        <w:t>OrbitalFire</w:t>
+      </w:r>
+      <w:proofErr w:type="spellEnd"/>
+      <w:r>
+        <w:rPr>
+          <w:rFonts w:ascii="Corbel" w:hAnsi="Corbel"/>
+        </w:rPr>
+        <w:t xml:space="preserve"> identified a potential subdomain takeover vulnerability affecting one or more domains owned by [CUSTOMER NAME]. This issue typically results from misconfigured DNS records that reference unclaimed or deprovisioned third-party services, allowing an attacker to register the external resource and gain control of the associated subdomain. If exploited, an attacker could host malicious content, impersonate the organization, conduct phishing campaigns, or collect user data, posing a significant risk to brand reputation, user trust, and overall security posture.</w:t>
       </w:r>
     </w:p>
     <w:p>
@@ -4391,8 +4765,8 @@
           <w:noProof/>
         </w:rPr>
         <w:drawing>
-          <wp:inline distT="0" distB="0" distL="0" distR="0" wp14:anchorId="35FB0BE0" wp14:editId="7B036DF5">
-            <wp:extent cx="5303520" cy="604011"/>
+          <wp:inline distT="0" distB="0" distL="0" distR="0" wp14:anchorId="7A807E4B" wp14:editId="2E79F0B8">
+            <wp:extent cx="5303520" cy="606845"/>
             <wp:effectExtent l="0" t="0" r="0" b="0"/>
             <wp:docPr id="2011428601" name="Picture 2011428601"/>
             <wp:cNvGraphicFramePr>
@@ -4414,7 +4788,7 @@
                   <pic:spPr>
                     <a:xfrm>
                       <a:off x="0" y="0"/>
-                      <a:ext cx="5303520" cy="604011"/>
+                      <a:ext cx="5303520" cy="606845"/>
                     </a:xfrm>
                     <a:prstGeom prst="rect">
                       <a:avLst/>
@@ -4431,7 +4805,7 @@
       <w:r>
         <w:rPr>
           <w:rFonts w:ascii="Corbel" w:hAnsi="Corbel"/>
-          <w:b/>
+          <w:i/>
         </w:rPr>
         <w:t>Evidence:</w:t>
       </w:r>
@@ -4442,8 +4816,8 @@
           <w:noProof/>
         </w:rPr>
         <w:drawing>
-          <wp:inline distT="0" distB="0" distL="0" distR="0" wp14:anchorId="4D9E4B2F" wp14:editId="4CB73B97">
-            <wp:extent cx="5303520" cy="492760"/>
+          <wp:inline distT="0" distB="0" distL="0" distR="0" wp14:anchorId="171484DC" wp14:editId="0939A060">
+            <wp:extent cx="5303520" cy="391160"/>
             <wp:effectExtent l="0" t="0" r="0" b="0"/>
             <wp:docPr id="2011428602" name="Picture 2011428602"/>
             <wp:cNvGraphicFramePr>
@@ -4465,7 +4839,7 @@
                   <pic:spPr>
                     <a:xfrm>
                       <a:off x="0" y="0"/>
-                      <a:ext cx="5303520" cy="492760"/>
+                      <a:ext cx="5303520" cy="391160"/>
                     </a:xfrm>
                     <a:prstGeom prst="rect">
                       <a:avLst/>
@@ -4515,15 +4889,49 @@
       <w:r>
         <w:rPr>
           <w:rFonts w:ascii="Corbel" w:hAnsi="Corbel"/>
+        </w:rPr>
+        <w:t xml:space="preserve">1.    </w:t>
+      </w:r>
+      <w:r>
+        <w:rPr>
+          <w:rFonts w:ascii="Corbel" w:hAnsi="Corbel"/>
           <w:b/>
         </w:rPr>
-        <w:t xml:space="preserve">1. Misconfigured DMARC Record - </w:t>
+        <w:t>Misconfigured DMARC Record</w:t>
       </w:r>
       <w:r>
         <w:rPr>
           <w:rFonts w:ascii="Corbel" w:hAnsi="Corbel"/>
         </w:rPr>
-        <w:t>During testing, OrbitalFire identified that [CUSTOMER NAME] has a misconfigured DMARC (Domain-based Message Authentication, Reporting, and Conformance) record for one or more of their domain(s). DMARC is critical for verifying the authenticity of emails sent from the organization, serving as a vital barrier against email spoofing and phishing attacks. Without proper configuration, DMARC fails to instruct receiving mail servers on how to treat email messages from the organization's domain, thereby increasing vulnerability to attack.</w:t>
+        <w:t xml:space="preserve"> - During testing, </w:t>
+      </w:r>
+      <w:proofErr w:type="spellStart"/>
+      <w:r>
+        <w:rPr>
+          <w:rFonts w:ascii="Corbel" w:hAnsi="Corbel"/>
+        </w:rPr>
+        <w:t>OrbitalFire</w:t>
+      </w:r>
+      <w:proofErr w:type="spellEnd"/>
+      <w:r>
+        <w:rPr>
+          <w:rFonts w:ascii="Corbel" w:hAnsi="Corbel"/>
+        </w:rPr>
+        <w:t xml:space="preserve"> identified that [CUSTOMER NAME] has a misconfigured DMARC (Domain-based Message Authentication, Reporting, and Conformance) record for one or more of their </w:t>
+      </w:r>
+      <w:proofErr w:type="gramStart"/>
+      <w:r>
+        <w:rPr>
+          <w:rFonts w:ascii="Corbel" w:hAnsi="Corbel"/>
+        </w:rPr>
+        <w:t>domain</w:t>
+      </w:r>
+      <w:proofErr w:type="gramEnd"/>
+      <w:r>
+        <w:rPr>
+          <w:rFonts w:ascii="Corbel" w:hAnsi="Corbel"/>
+        </w:rPr>
+        <w:t>(s). DMARC is critical for verifying the authenticity of emails sent from the organization, serving as a vital barrier against email spoofing and phishing attacks. Without proper configuration, DMARC fails to instruct receiving mail servers on how to treat email messages from the organization's domain, thereby increasing vulnerability to attack.</w:t>
       </w:r>
     </w:p>
     <w:p>
@@ -4532,8 +4940,8 @@
           <w:noProof/>
         </w:rPr>
         <w:drawing>
-          <wp:inline distT="0" distB="0" distL="0" distR="0" wp14:anchorId="2C75F0D0" wp14:editId="43A4370D">
-            <wp:extent cx="5303520" cy="604011"/>
+          <wp:inline distT="0" distB="0" distL="0" distR="0" wp14:anchorId="02CA3C0D" wp14:editId="236E628A">
+            <wp:extent cx="5303520" cy="606845"/>
             <wp:effectExtent l="0" t="0" r="0" b="0"/>
             <wp:docPr id="2011428603" name="Picture 2011428603"/>
             <wp:cNvGraphicFramePr>
@@ -4555,7 +4963,7 @@
                   <pic:spPr>
                     <a:xfrm>
                       <a:off x="0" y="0"/>
-                      <a:ext cx="5303520" cy="604011"/>
+                      <a:ext cx="5303520" cy="606845"/>
                     </a:xfrm>
                     <a:prstGeom prst="rect">
                       <a:avLst/>
@@ -4572,7 +4980,7 @@
       <w:r>
         <w:rPr>
           <w:rFonts w:ascii="Corbel" w:hAnsi="Corbel"/>
-          <w:b/>
+          <w:i/>
         </w:rPr>
         <w:t>Evidence:</w:t>
       </w:r>
@@ -4584,8 +4992,8 @@
         </w:rPr>
         <w:lastRenderedPageBreak/>
         <w:drawing>
-          <wp:inline distT="0" distB="0" distL="0" distR="0" wp14:anchorId="0DE0BF3F" wp14:editId="02159F58">
-            <wp:extent cx="5303520" cy="391160"/>
+          <wp:inline distT="0" distB="0" distL="0" distR="0" wp14:anchorId="5CC71B3B" wp14:editId="5D6C81C5">
+            <wp:extent cx="5303520" cy="289560"/>
             <wp:effectExtent l="0" t="0" r="0" b="0"/>
             <wp:docPr id="2011428604" name="Picture 2011428604"/>
             <wp:cNvGraphicFramePr>
@@ -4607,7 +5015,7 @@
                   <pic:spPr>
                     <a:xfrm>
                       <a:off x="0" y="0"/>
-                      <a:ext cx="5303520" cy="391160"/>
+                      <a:ext cx="5303520" cy="289560"/>
                     </a:xfrm>
                     <a:prstGeom prst="rect">
                       <a:avLst/>
@@ -4625,15 +5033,35 @@
       <w:r>
         <w:rPr>
           <w:rFonts w:ascii="Corbel" w:hAnsi="Corbel"/>
+        </w:rPr>
+        <w:t xml:space="preserve">2.    </w:t>
+      </w:r>
+      <w:r>
+        <w:rPr>
+          <w:rFonts w:ascii="Corbel" w:hAnsi="Corbel"/>
           <w:b/>
         </w:rPr>
-        <w:t xml:space="preserve">2. Remote SSH Service Exposed to Public Internet - </w:t>
+        <w:t>Remote SSH Service Exposed to Public Internet</w:t>
       </w:r>
       <w:r>
         <w:rPr>
           <w:rFonts w:ascii="Corbel" w:hAnsi="Corbel"/>
         </w:rPr>
-        <w:t>During testing, OrbitalFire identified that remote administration services, including SSH, were exposed to the public internet. This exposure is often the result of misconfiguration or insufficient access controls, which significantly increase the attack surface. Publicly accessible SSH services are susceptible to brute-force and password-guessing attacks, which may lead to unauthorized system access. Additionally, newly disclosed vulnerabilities, including zero-day exploits, could be leveraged by threat actors to further compromise exposed systems.</w:t>
+        <w:t xml:space="preserve"> - During testing, </w:t>
+      </w:r>
+      <w:proofErr w:type="spellStart"/>
+      <w:r>
+        <w:rPr>
+          <w:rFonts w:ascii="Corbel" w:hAnsi="Corbel"/>
+        </w:rPr>
+        <w:t>OrbitalFire</w:t>
+      </w:r>
+      <w:proofErr w:type="spellEnd"/>
+      <w:r>
+        <w:rPr>
+          <w:rFonts w:ascii="Corbel" w:hAnsi="Corbel"/>
+        </w:rPr>
+        <w:t xml:space="preserve"> identified that remote administration services, including SSH, were exposed to the public internet. This exposure is often the result of misconfiguration or insufficient access controls, which significantly increase the attack surface. Publicly accessible SSH services are susceptible to brute-force and password-guessing attacks, which may lead to unauthorized system access. Additionally, newly disclosed vulnerabilities, including zero-day exploits, could be leveraged by threat actors to further compromise exposed systems.</w:t>
       </w:r>
     </w:p>
     <w:p>
@@ -4642,8 +5070,8 @@
           <w:noProof/>
         </w:rPr>
         <w:drawing>
-          <wp:inline distT="0" distB="0" distL="0" distR="0" wp14:anchorId="128EA313" wp14:editId="0512DAE9">
-            <wp:extent cx="5303520" cy="777583"/>
+          <wp:inline distT="0" distB="0" distL="0" distR="0" wp14:anchorId="26BB4C84" wp14:editId="7A7337A5">
+            <wp:extent cx="5303520" cy="775129"/>
             <wp:effectExtent l="0" t="0" r="0" b="0"/>
             <wp:docPr id="2011428605" name="Picture 2011428605"/>
             <wp:cNvGraphicFramePr>
@@ -4665,7 +5093,7 @@
                   <pic:spPr>
                     <a:xfrm>
                       <a:off x="0" y="0"/>
-                      <a:ext cx="5303520" cy="777583"/>
+                      <a:ext cx="5303520" cy="775129"/>
                     </a:xfrm>
                     <a:prstGeom prst="rect">
                       <a:avLst/>
@@ -4682,7 +5110,7 @@
       <w:r>
         <w:rPr>
           <w:rFonts w:ascii="Corbel" w:hAnsi="Corbel"/>
-          <w:b/>
+          <w:i/>
         </w:rPr>
         <w:t>Evidence:</w:t>
       </w:r>
@@ -4693,8 +5121,8 @@
           <w:noProof/>
         </w:rPr>
         <w:drawing>
-          <wp:inline distT="0" distB="0" distL="0" distR="0" wp14:anchorId="3F64E04E" wp14:editId="1BFDEB00">
-            <wp:extent cx="5303520" cy="487680"/>
+          <wp:inline distT="0" distB="0" distL="0" distR="0" wp14:anchorId="312AB106" wp14:editId="4DD6053A">
+            <wp:extent cx="5303520" cy="386080"/>
             <wp:effectExtent l="0" t="0" r="0" b="0"/>
             <wp:docPr id="2011428606" name="Picture 2011428606"/>
             <wp:cNvGraphicFramePr>
@@ -4716,7 +5144,7 @@
                   <pic:spPr>
                     <a:xfrm>
                       <a:off x="0" y="0"/>
-                      <a:ext cx="5303520" cy="487680"/>
+                      <a:ext cx="5303520" cy="386080"/>
                     </a:xfrm>
                     <a:prstGeom prst="rect">
                       <a:avLst/>
@@ -4729,6 +5157,7 @@
         </w:drawing>
       </w:r>
     </w:p>
+    <w:p/>
     <w:p>
       <w:pPr>
         <w:keepNext/>
@@ -4787,16 +5216,24 @@
         </w:rPr>
         <w:t>None</w:t>
       </w:r>
-      <w:r>
-        <w:rPr>
-          <w:rFonts w:ascii="Corbel" w:eastAsia="Calibri" w:hAnsi="Corbel" w:cs="Arial"/>
-          <w:color w:val="404040"/>
-          <w:kern w:val="0"/>
-          <w:szCs w:val="22"/>
-          <w14:ligatures w14:val="none"/>
-        </w:rPr>
-        <w:br/>
-      </w:r>
+    </w:p>
+    <w:p>
+      <w:pPr>
+        <w:keepNext/>
+        <w:keepLines/>
+        <w:spacing w:before="240" w:after="120" w:line="259" w:lineRule="auto"/>
+        <w:outlineLvl w:val="1"/>
+        <w:rPr>
+          <w:rFonts w:ascii="Handel Gothic D" w:eastAsia="DengXian Light" w:hAnsi="Handel Gothic D" w:cs="Times New Roman"/>
+          <w:b/>
+          <w:caps/>
+          <w:color w:val="FF6633"/>
+          <w:kern w:val="0"/>
+          <w:sz w:val="32"/>
+          <w:szCs w:val="26"/>
+          <w14:ligatures w14:val="none"/>
+        </w:rPr>
+      </w:pPr>
     </w:p>
     <w:p/>
     <w:p/>
@@ -4985,6 +5422,7 @@
         <w:t xml:space="preserve">testing against targeted domains, </w:t>
       </w:r>
       <w:bookmarkStart w:id="12" w:name="_Hlk212473705"/>
+      <w:proofErr w:type="gramStart"/>
       <w:r>
         <w:rPr>
           <w:rFonts w:ascii="Corbel" w:eastAsia="Calibri" w:hAnsi="Corbel" w:cs="Arial"/>
@@ -4994,7 +5432,19 @@
           <w:highlight w:val="yellow"/>
           <w14:ligatures w14:val="none"/>
         </w:rPr>
-        <w:t>NUMBER (#)</w:t>
+        <w:t>NUMBER (#</w:t>
+      </w:r>
+      <w:proofErr w:type="gramEnd"/>
+      <w:r>
+        <w:rPr>
+          <w:rFonts w:ascii="Corbel" w:eastAsia="Calibri" w:hAnsi="Corbel" w:cs="Arial"/>
+          <w:color w:val="404040"/>
+          <w:kern w:val="0"/>
+          <w:szCs w:val="22"/>
+          <w:highlight w:val="yellow"/>
+          <w14:ligatures w14:val="none"/>
+        </w:rPr>
+        <w:t>)</w:t>
       </w:r>
       <w:r>
         <w:rPr>
@@ -5303,7 +5753,49 @@
         <w:rPr>
           <w:lang w:val="fr-FR"/>
         </w:rPr>
-        <w:t>2026-01-29 13:52:47-0500PM ET exposurescout Initiating ExposureScout module.</w:t>
+        <w:t xml:space="preserve">2026-01-29 </w:t>
+      </w:r>
+      <w:proofErr w:type="gramStart"/>
+      <w:r>
+        <w:rPr>
+          <w:lang w:val="fr-FR"/>
+        </w:rPr>
+        <w:t>13:52:</w:t>
+      </w:r>
+      <w:proofErr w:type="gramEnd"/>
+      <w:r>
+        <w:rPr>
+          <w:lang w:val="fr-FR"/>
+        </w:rPr>
+        <w:t xml:space="preserve">47-0500PM ET </w:t>
+      </w:r>
+      <w:proofErr w:type="spellStart"/>
+      <w:r>
+        <w:rPr>
+          <w:lang w:val="fr-FR"/>
+        </w:rPr>
+        <w:t>exposurescout</w:t>
+      </w:r>
+      <w:proofErr w:type="spellEnd"/>
+      <w:r>
+        <w:rPr>
+          <w:lang w:val="fr-FR"/>
+        </w:rPr>
+        <w:t xml:space="preserve"> Initiating </w:t>
+      </w:r>
+      <w:proofErr w:type="spellStart"/>
+      <w:r>
+        <w:rPr>
+          <w:lang w:val="fr-FR"/>
+        </w:rPr>
+        <w:t>ExposureScout</w:t>
+      </w:r>
+      <w:proofErr w:type="spellEnd"/>
+      <w:r>
+        <w:rPr>
+          <w:lang w:val="fr-FR"/>
+        </w:rPr>
+        <w:t xml:space="preserve"> module.</w:t>
       </w:r>
     </w:p>
     <w:p>
@@ -5311,7 +5803,15 @@
         <w:pStyle w:val="ActivityBullet"/>
       </w:pPr>
       <w:r>
-        <w:t>2026-01-29 13:52:59-0500PM ET exposurescout Enumerating subdomains from one (1) domain.</w:t>
+        <w:t xml:space="preserve">2026-01-29 13:52:59-0500PM ET </w:t>
+      </w:r>
+      <w:proofErr w:type="spellStart"/>
+      <w:r>
+        <w:t>exposurescout</w:t>
+      </w:r>
+      <w:proofErr w:type="spellEnd"/>
+      <w:r>
+        <w:t xml:space="preserve"> Enumerating subdomains from one (1) domain.</w:t>
       </w:r>
     </w:p>
     <w:p>
@@ -5325,7 +5825,77 @@
         <w:rPr>
           <w:lang w:val="fr-FR"/>
         </w:rPr>
-        <w:t>2026-01-29 13:54:13-0500PM ET exposurescout Completed subdomain enumeration.</w:t>
+        <w:t xml:space="preserve">2026-01-29 </w:t>
+      </w:r>
+      <w:proofErr w:type="gramStart"/>
+      <w:r>
+        <w:rPr>
+          <w:lang w:val="fr-FR"/>
+        </w:rPr>
+        <w:t>13:54:</w:t>
+      </w:r>
+      <w:proofErr w:type="gramEnd"/>
+      <w:r>
+        <w:rPr>
+          <w:lang w:val="fr-FR"/>
+        </w:rPr>
+        <w:t xml:space="preserve">13-0500PM ET </w:t>
+      </w:r>
+      <w:proofErr w:type="spellStart"/>
+      <w:r>
+        <w:rPr>
+          <w:lang w:val="fr-FR"/>
+        </w:rPr>
+        <w:t>exposurescout</w:t>
+      </w:r>
+      <w:proofErr w:type="spellEnd"/>
+      <w:r>
+        <w:rPr>
+          <w:lang w:val="fr-FR"/>
+        </w:rPr>
+        <w:t xml:space="preserve"> </w:t>
+      </w:r>
+      <w:proofErr w:type="spellStart"/>
+      <w:r>
+        <w:rPr>
+          <w:lang w:val="fr-FR"/>
+        </w:rPr>
+        <w:t>Completed</w:t>
+      </w:r>
+      <w:proofErr w:type="spellEnd"/>
+      <w:r>
+        <w:rPr>
+          <w:lang w:val="fr-FR"/>
+        </w:rPr>
+        <w:t xml:space="preserve"> </w:t>
+      </w:r>
+      <w:proofErr w:type="spellStart"/>
+      <w:r>
+        <w:rPr>
+          <w:lang w:val="fr-FR"/>
+        </w:rPr>
+        <w:t>subdomain</w:t>
+      </w:r>
+      <w:proofErr w:type="spellEnd"/>
+      <w:r>
+        <w:rPr>
+          <w:lang w:val="fr-FR"/>
+        </w:rPr>
+        <w:t xml:space="preserve"> </w:t>
+      </w:r>
+      <w:proofErr w:type="spellStart"/>
+      <w:r>
+        <w:rPr>
+          <w:lang w:val="fr-FR"/>
+        </w:rPr>
+        <w:t>enumeration</w:t>
+      </w:r>
+      <w:proofErr w:type="spellEnd"/>
+      <w:r>
+        <w:rPr>
+          <w:lang w:val="fr-FR"/>
+        </w:rPr>
+        <w:t>.</w:t>
       </w:r>
     </w:p>
     <w:p>
@@ -5333,7 +5903,15 @@
         <w:pStyle w:val="ActivityBullet"/>
       </w:pPr>
       <w:r>
-        <w:t>2026-01-29 13:54:13-0500PM ET exposurescout Beginning DNS enumeration.</w:t>
+        <w:t xml:space="preserve">2026-01-29 13:54:13-0500PM ET </w:t>
+      </w:r>
+      <w:proofErr w:type="spellStart"/>
+      <w:r>
+        <w:t>exposurescout</w:t>
+      </w:r>
+      <w:proofErr w:type="spellEnd"/>
+      <w:r>
+        <w:t xml:space="preserve"> Beginning DNS enumeration.</w:t>
       </w:r>
     </w:p>
     <w:p>
@@ -5347,7 +5925,63 @@
         <w:rPr>
           <w:lang w:val="fr-FR"/>
         </w:rPr>
-        <w:t>2026-01-29 13:55:18-0500PM ET exposurescout Completed DNS enumeration.</w:t>
+        <w:t xml:space="preserve">2026-01-29 </w:t>
+      </w:r>
+      <w:proofErr w:type="gramStart"/>
+      <w:r>
+        <w:rPr>
+          <w:lang w:val="fr-FR"/>
+        </w:rPr>
+        <w:t>13:55:</w:t>
+      </w:r>
+      <w:proofErr w:type="gramEnd"/>
+      <w:r>
+        <w:rPr>
+          <w:lang w:val="fr-FR"/>
+        </w:rPr>
+        <w:t xml:space="preserve">18-0500PM ET </w:t>
+      </w:r>
+      <w:proofErr w:type="spellStart"/>
+      <w:r>
+        <w:rPr>
+          <w:lang w:val="fr-FR"/>
+        </w:rPr>
+        <w:t>exposurescout</w:t>
+      </w:r>
+      <w:proofErr w:type="spellEnd"/>
+      <w:r>
+        <w:rPr>
+          <w:lang w:val="fr-FR"/>
+        </w:rPr>
+        <w:t xml:space="preserve"> </w:t>
+      </w:r>
+      <w:proofErr w:type="spellStart"/>
+      <w:r>
+        <w:rPr>
+          <w:lang w:val="fr-FR"/>
+        </w:rPr>
+        <w:t>Completed</w:t>
+      </w:r>
+      <w:proofErr w:type="spellEnd"/>
+      <w:r>
+        <w:rPr>
+          <w:lang w:val="fr-FR"/>
+        </w:rPr>
+        <w:t xml:space="preserve"> DNS </w:t>
+      </w:r>
+      <w:proofErr w:type="spellStart"/>
+      <w:r>
+        <w:rPr>
+          <w:lang w:val="fr-FR"/>
+        </w:rPr>
+        <w:t>enumeration</w:t>
+      </w:r>
+      <w:proofErr w:type="spellEnd"/>
+      <w:r>
+        <w:rPr>
+          <w:lang w:val="fr-FR"/>
+        </w:rPr>
+        <w:t>.</w:t>
       </w:r>
     </w:p>
     <w:p>
@@ -5355,7 +5989,15 @@
         <w:pStyle w:val="ActivityBullet"/>
       </w:pPr>
       <w:r>
-        <w:t>2026-01-29 13:55:18-0500PM ET exposurescout Enumerating doppelganger domains for one (1) domain.</w:t>
+        <w:t xml:space="preserve">2026-01-29 13:55:18-0500PM ET </w:t>
+      </w:r>
+      <w:proofErr w:type="spellStart"/>
+      <w:r>
+        <w:t>exposurescout</w:t>
+      </w:r>
+      <w:proofErr w:type="spellEnd"/>
+      <w:r>
+        <w:t xml:space="preserve"> Enumerating doppelganger domains for one (1) domain.</w:t>
       </w:r>
     </w:p>
     <w:p>
@@ -5369,7 +6011,77 @@
         <w:rPr>
           <w:lang w:val="fr-FR"/>
         </w:rPr>
-        <w:t>2026-01-29 13:56:28-0500PM ET exposurescout Ten (10) new doppelganger domains discovered.</w:t>
+        <w:t xml:space="preserve">2026-01-29 </w:t>
+      </w:r>
+      <w:proofErr w:type="gramStart"/>
+      <w:r>
+        <w:rPr>
+          <w:lang w:val="fr-FR"/>
+        </w:rPr>
+        <w:t>13:56:</w:t>
+      </w:r>
+      <w:proofErr w:type="gramEnd"/>
+      <w:r>
+        <w:rPr>
+          <w:lang w:val="fr-FR"/>
+        </w:rPr>
+        <w:t xml:space="preserve">28-0500PM ET </w:t>
+      </w:r>
+      <w:proofErr w:type="spellStart"/>
+      <w:r>
+        <w:rPr>
+          <w:lang w:val="fr-FR"/>
+        </w:rPr>
+        <w:t>exposurescout</w:t>
+      </w:r>
+      <w:proofErr w:type="spellEnd"/>
+      <w:r>
+        <w:rPr>
+          <w:lang w:val="fr-FR"/>
+        </w:rPr>
+        <w:t xml:space="preserve"> Ten (10) new </w:t>
+      </w:r>
+      <w:proofErr w:type="spellStart"/>
+      <w:r>
+        <w:rPr>
+          <w:lang w:val="fr-FR"/>
+        </w:rPr>
+        <w:t>doppelganger</w:t>
+      </w:r>
+      <w:proofErr w:type="spellEnd"/>
+      <w:r>
+        <w:rPr>
+          <w:lang w:val="fr-FR"/>
+        </w:rPr>
+        <w:t xml:space="preserve"> </w:t>
+      </w:r>
+      <w:proofErr w:type="spellStart"/>
+      <w:r>
+        <w:rPr>
+          <w:lang w:val="fr-FR"/>
+        </w:rPr>
+        <w:t>domains</w:t>
+      </w:r>
+      <w:proofErr w:type="spellEnd"/>
+      <w:r>
+        <w:rPr>
+          <w:lang w:val="fr-FR"/>
+        </w:rPr>
+        <w:t xml:space="preserve"> </w:t>
+      </w:r>
+      <w:proofErr w:type="spellStart"/>
+      <w:r>
+        <w:rPr>
+          <w:lang w:val="fr-FR"/>
+        </w:rPr>
+        <w:t>discovered</w:t>
+      </w:r>
+      <w:proofErr w:type="spellEnd"/>
+      <w:r>
+        <w:rPr>
+          <w:lang w:val="fr-FR"/>
+        </w:rPr>
+        <w:t>.</w:t>
       </w:r>
     </w:p>
     <w:p>
@@ -5383,7 +6095,91 @@
         <w:rPr>
           <w:lang w:val="fr-FR"/>
         </w:rPr>
-        <w:t>2026-01-29 13:56:28-0500PM ET exposurescout Completed doppelganger domain enumeration.</w:t>
+        <w:t xml:space="preserve">2026-01-29 </w:t>
+      </w:r>
+      <w:proofErr w:type="gramStart"/>
+      <w:r>
+        <w:rPr>
+          <w:lang w:val="fr-FR"/>
+        </w:rPr>
+        <w:t>13:56:</w:t>
+      </w:r>
+      <w:proofErr w:type="gramEnd"/>
+      <w:r>
+        <w:rPr>
+          <w:lang w:val="fr-FR"/>
+        </w:rPr>
+        <w:t xml:space="preserve">28-0500PM ET </w:t>
+      </w:r>
+      <w:proofErr w:type="spellStart"/>
+      <w:r>
+        <w:rPr>
+          <w:lang w:val="fr-FR"/>
+        </w:rPr>
+        <w:t>exposurescout</w:t>
+      </w:r>
+      <w:proofErr w:type="spellEnd"/>
+      <w:r>
+        <w:rPr>
+          <w:lang w:val="fr-FR"/>
+        </w:rPr>
+        <w:t xml:space="preserve"> </w:t>
+      </w:r>
+      <w:proofErr w:type="spellStart"/>
+      <w:r>
+        <w:rPr>
+          <w:lang w:val="fr-FR"/>
+        </w:rPr>
+        <w:t>Completed</w:t>
+      </w:r>
+      <w:proofErr w:type="spellEnd"/>
+      <w:r>
+        <w:rPr>
+          <w:lang w:val="fr-FR"/>
+        </w:rPr>
+        <w:t xml:space="preserve"> </w:t>
+      </w:r>
+      <w:proofErr w:type="spellStart"/>
+      <w:r>
+        <w:rPr>
+          <w:lang w:val="fr-FR"/>
+        </w:rPr>
+        <w:t>doppelganger</w:t>
+      </w:r>
+      <w:proofErr w:type="spellEnd"/>
+      <w:r>
+        <w:rPr>
+          <w:lang w:val="fr-FR"/>
+        </w:rPr>
+        <w:t xml:space="preserve"> </w:t>
+      </w:r>
+      <w:proofErr w:type="spellStart"/>
+      <w:r>
+        <w:rPr>
+          <w:lang w:val="fr-FR"/>
+        </w:rPr>
+        <w:t>domain</w:t>
+      </w:r>
+      <w:proofErr w:type="spellEnd"/>
+      <w:r>
+        <w:rPr>
+          <w:lang w:val="fr-FR"/>
+        </w:rPr>
+        <w:t xml:space="preserve"> </w:t>
+      </w:r>
+      <w:proofErr w:type="spellStart"/>
+      <w:r>
+        <w:rPr>
+          <w:lang w:val="fr-FR"/>
+        </w:rPr>
+        <w:t>enumeration</w:t>
+      </w:r>
+      <w:proofErr w:type="spellEnd"/>
+      <w:r>
+        <w:rPr>
+          <w:lang w:val="fr-FR"/>
+        </w:rPr>
+        <w:t>.</w:t>
       </w:r>
     </w:p>
     <w:p>
@@ -5391,7 +6187,15 @@
         <w:pStyle w:val="ActivityBullet"/>
       </w:pPr>
       <w:r>
-        <w:t>2026-01-29 13:56:28-0500PM ET exposurescout Running WHOIS commands on eight (8) domains.</w:t>
+        <w:t xml:space="preserve">2026-01-29 13:56:28-0500PM ET </w:t>
+      </w:r>
+      <w:proofErr w:type="spellStart"/>
+      <w:r>
+        <w:t>exposurescout</w:t>
+      </w:r>
+      <w:proofErr w:type="spellEnd"/>
+      <w:r>
+        <w:t xml:space="preserve"> Running WHOIS commands on eight (8) domains.</w:t>
       </w:r>
     </w:p>
     <w:p>
@@ -5399,7 +6203,15 @@
         <w:pStyle w:val="ActivityBullet"/>
       </w:pPr>
       <w:r>
-        <w:t>2026-01-29 13:57:33-0500PM ET exposurescout Importing eight (8) WHOIS results into the database.</w:t>
+        <w:t xml:space="preserve">2026-01-29 13:57:33-0500PM ET </w:t>
+      </w:r>
+      <w:proofErr w:type="spellStart"/>
+      <w:r>
+        <w:t>exposurescout</w:t>
+      </w:r>
+      <w:proofErr w:type="spellEnd"/>
+      <w:r>
+        <w:t xml:space="preserve"> Importing eight (8) WHOIS results into the database.</w:t>
       </w:r>
     </w:p>
     <w:p>
@@ -5407,7 +6219,15 @@
         <w:pStyle w:val="ActivityBullet"/>
       </w:pPr>
       <w:r>
-        <w:t>2026-01-29 13:57:34-0500PM ET exposurescout Completed recursive WHOIS lookups</w:t>
+        <w:t xml:space="preserve">2026-01-29 13:57:34-0500PM ET </w:t>
+      </w:r>
+      <w:proofErr w:type="spellStart"/>
+      <w:r>
+        <w:t>exposurescout</w:t>
+      </w:r>
+      <w:proofErr w:type="spellEnd"/>
+      <w:r>
+        <w:t xml:space="preserve"> Completed recursive WHOIS lookups</w:t>
       </w:r>
     </w:p>
     <w:p>
@@ -5415,7 +6235,15 @@
         <w:pStyle w:val="ActivityBullet"/>
       </w:pPr>
       <w:r>
-        <w:t>2026-01-29 13:57:34-0500PM ET exposurescout Email scraping module started.</w:t>
+        <w:t xml:space="preserve">2026-01-29 13:57:34-0500PM ET </w:t>
+      </w:r>
+      <w:proofErr w:type="spellStart"/>
+      <w:r>
+        <w:t>exposurescout</w:t>
+      </w:r>
+      <w:proofErr w:type="spellEnd"/>
+      <w:r>
+        <w:t xml:space="preserve"> Email scraping module started.</w:t>
       </w:r>
     </w:p>
     <w:p>
@@ -5423,7 +6251,15 @@
         <w:pStyle w:val="ActivityBullet"/>
       </w:pPr>
       <w:r>
-        <w:t>2026-01-29 13:58:40-0500PM ET exposurescout Completed email scraping.</w:t>
+        <w:t xml:space="preserve">2026-01-29 13:58:40-0500PM ET </w:t>
+      </w:r>
+      <w:proofErr w:type="spellStart"/>
+      <w:r>
+        <w:t>exposurescout</w:t>
+      </w:r>
+      <w:proofErr w:type="spellEnd"/>
+      <w:r>
+        <w:t xml:space="preserve"> Completed email scraping.</w:t>
       </w:r>
     </w:p>
     <w:p>
@@ -5431,7 +6267,15 @@
         <w:pStyle w:val="ActivityBullet"/>
       </w:pPr>
       <w:r>
-        <w:t>2026-01-29 13:58:40-0500PM ET exposurescout Scanning subdomains for subdomain takeover vulnerability.</w:t>
+        <w:t xml:space="preserve">2026-01-29 13:58:40-0500PM ET </w:t>
+      </w:r>
+      <w:proofErr w:type="spellStart"/>
+      <w:r>
+        <w:t>exposurescout</w:t>
+      </w:r>
+      <w:proofErr w:type="spellEnd"/>
+      <w:r>
+        <w:t xml:space="preserve"> Scanning subdomains for subdomain takeover vulnerability.</w:t>
       </w:r>
     </w:p>
     <w:p>
@@ -5439,7 +6283,15 @@
         <w:pStyle w:val="ActivityBullet"/>
       </w:pPr>
       <w:r>
-        <w:t>2026-01-29 13:59:44-0500PM ET exposurescout Found 1 domain vulnerable to subdomain takeover.</w:t>
+        <w:t xml:space="preserve">2026-01-29 13:59:44-0500PM ET </w:t>
+      </w:r>
+      <w:proofErr w:type="spellStart"/>
+      <w:r>
+        <w:t>exposurescout</w:t>
+      </w:r>
+      <w:proofErr w:type="spellEnd"/>
+      <w:r>
+        <w:t xml:space="preserve"> Found 1 domain vulnerable to subdomain takeover.</w:t>
       </w:r>
     </w:p>
     <w:p>
@@ -5447,7 +6299,15 @@
         <w:pStyle w:val="ActivityBullet"/>
       </w:pPr>
       <w:r>
-        <w:t>2026-01-29 13:59:44-0500PM ET exposurescout Completed subdomain takeover checks.</w:t>
+        <w:t xml:space="preserve">2026-01-29 13:59:44-0500PM ET </w:t>
+      </w:r>
+      <w:proofErr w:type="spellStart"/>
+      <w:r>
+        <w:t>exposurescout</w:t>
+      </w:r>
+      <w:proofErr w:type="spellEnd"/>
+      <w:r>
+        <w:t xml:space="preserve"> Completed subdomain takeover checks.</w:t>
       </w:r>
     </w:p>
     <w:p>
@@ -5461,7 +6321,63 @@
         <w:rPr>
           <w:lang w:val="fr-FR"/>
         </w:rPr>
-        <w:t>2026-01-29 13:59:44-0500PM ET exposurescout ExposureScout module completed.</w:t>
+        <w:t xml:space="preserve">2026-01-29 </w:t>
+      </w:r>
+      <w:proofErr w:type="gramStart"/>
+      <w:r>
+        <w:rPr>
+          <w:lang w:val="fr-FR"/>
+        </w:rPr>
+        <w:t>13:59:</w:t>
+      </w:r>
+      <w:proofErr w:type="gramEnd"/>
+      <w:r>
+        <w:rPr>
+          <w:lang w:val="fr-FR"/>
+        </w:rPr>
+        <w:t xml:space="preserve">44-0500PM ET </w:t>
+      </w:r>
+      <w:proofErr w:type="spellStart"/>
+      <w:r>
+        <w:rPr>
+          <w:lang w:val="fr-FR"/>
+        </w:rPr>
+        <w:t>exposurescout</w:t>
+      </w:r>
+      <w:proofErr w:type="spellEnd"/>
+      <w:r>
+        <w:rPr>
+          <w:lang w:val="fr-FR"/>
+        </w:rPr>
+        <w:t xml:space="preserve"> </w:t>
+      </w:r>
+      <w:proofErr w:type="spellStart"/>
+      <w:r>
+        <w:rPr>
+          <w:lang w:val="fr-FR"/>
+        </w:rPr>
+        <w:t>ExposureScout</w:t>
+      </w:r>
+      <w:proofErr w:type="spellEnd"/>
+      <w:r>
+        <w:rPr>
+          <w:lang w:val="fr-FR"/>
+        </w:rPr>
+        <w:t xml:space="preserve"> module </w:t>
+      </w:r>
+      <w:proofErr w:type="spellStart"/>
+      <w:r>
+        <w:rPr>
+          <w:lang w:val="fr-FR"/>
+        </w:rPr>
+        <w:t>completed</w:t>
+      </w:r>
+      <w:proofErr w:type="spellEnd"/>
+      <w:r>
+        <w:rPr>
+          <w:lang w:val="fr-FR"/>
+        </w:rPr>
+        <w:t>.</w:t>
       </w:r>
     </w:p>
     <w:p>
@@ -5501,7 +6417,15 @@
         <w:pStyle w:val="ActivityBullet"/>
       </w:pPr>
       <w:r>
-        <w:t>2026-01-29 14:00:57-0500PM ET host discovery Running nmap port scans.</w:t>
+        <w:t xml:space="preserve">2026-01-29 14:00:57-0500PM ET host discovery Running </w:t>
+      </w:r>
+      <w:proofErr w:type="spellStart"/>
+      <w:r>
+        <w:t>nmap</w:t>
+      </w:r>
+      <w:proofErr w:type="spellEnd"/>
+      <w:r>
+        <w:t xml:space="preserve"> port scans.</w:t>
       </w:r>
     </w:p>
     <w:p>
@@ -5509,7 +6433,15 @@
         <w:pStyle w:val="ActivityBullet"/>
       </w:pPr>
       <w:r>
-        <w:t>2026-01-29 14:02:01-0500PM ET host discovery Completed nmap port scans.</w:t>
+        <w:t xml:space="preserve">2026-01-29 14:02:01-0500PM ET host discovery Completed </w:t>
+      </w:r>
+      <w:proofErr w:type="spellStart"/>
+      <w:r>
+        <w:t>nmap</w:t>
+      </w:r>
+      <w:proofErr w:type="spellEnd"/>
+      <w:r>
+        <w:t xml:space="preserve"> port scans.</w:t>
       </w:r>
     </w:p>
     <w:p>
@@ -5541,7 +6473,15 @@
         <w:pStyle w:val="ActivityBullet"/>
       </w:pPr>
       <w:r>
-        <w:t>2026-01-29 14:02:02-0500PM ET host discovery Parsing nmap port scans.</w:t>
+        <w:t xml:space="preserve">2026-01-29 14:02:02-0500PM ET host discovery Parsing </w:t>
+      </w:r>
+      <w:proofErr w:type="spellStart"/>
+      <w:r>
+        <w:t>nmap</w:t>
+      </w:r>
+      <w:proofErr w:type="spellEnd"/>
+      <w:r>
+        <w:t xml:space="preserve"> port scans.</w:t>
       </w:r>
     </w:p>
     <w:p>
@@ -5549,7 +6489,15 @@
         <w:pStyle w:val="ActivityBullet"/>
       </w:pPr>
       <w:r>
-        <w:t>2026-01-29 14:02:02-0500PM ET host discovery Completed parsing port scans. Imported 3 new ports.</w:t>
+        <w:t xml:space="preserve">2026-01-29 14:02:02-0500PM ET </w:t>
+      </w:r>
+      <w:proofErr w:type="gramStart"/>
+      <w:r>
+        <w:t>host discovery</w:t>
+      </w:r>
+      <w:proofErr w:type="gramEnd"/>
+      <w:r>
+        <w:t xml:space="preserve"> Completed parsing port scans. Imported 3 new ports.</w:t>
       </w:r>
     </w:p>
     <w:p>
@@ -5565,7 +6513,15 @@
         <w:pStyle w:val="ActivityBullet"/>
       </w:pPr>
       <w:r>
-        <w:t>2026-01-29 14:02:03-0500PM ET host discovery Discovery module completed.</w:t>
+        <w:t xml:space="preserve">2026-01-29 14:02:03-0500PM ET host discovery </w:t>
+      </w:r>
+      <w:proofErr w:type="spellStart"/>
+      <w:r>
+        <w:t>Discovery</w:t>
+      </w:r>
+      <w:proofErr w:type="spellEnd"/>
+      <w:r>
+        <w:t xml:space="preserve"> module completed.</w:t>
       </w:r>
     </w:p>
     <w:p>
@@ -5573,7 +6529,15 @@
         <w:pStyle w:val="ActivityBullet"/>
       </w:pPr>
       <w:r>
-        <w:t>2026-01-29 14:02:27-0500PM ET host discovery Running nmap port version scans.</w:t>
+        <w:t xml:space="preserve">2026-01-29 14:02:27-0500PM ET host discovery Running </w:t>
+      </w:r>
+      <w:proofErr w:type="spellStart"/>
+      <w:r>
+        <w:t>nmap</w:t>
+      </w:r>
+      <w:proofErr w:type="spellEnd"/>
+      <w:r>
+        <w:t xml:space="preserve"> port version scans.</w:t>
       </w:r>
     </w:p>
     <w:p>
@@ -5581,7 +6545,15 @@
         <w:pStyle w:val="ActivityBullet"/>
       </w:pPr>
       <w:r>
-        <w:t>2026-01-29 14:03:30-0500PM ET host discovery Completed nmap port version scans.</w:t>
+        <w:t xml:space="preserve">2026-01-29 14:03:30-0500PM ET host discovery Completed </w:t>
+      </w:r>
+      <w:proofErr w:type="spellStart"/>
+      <w:r>
+        <w:t>nmap</w:t>
+      </w:r>
+      <w:proofErr w:type="spellEnd"/>
+      <w:r>
+        <w:t xml:space="preserve"> port version scans.</w:t>
       </w:r>
     </w:p>
     <w:p>
@@ -5589,7 +6561,31 @@
         <w:pStyle w:val="ActivityBullet"/>
       </w:pPr>
       <w:r>
-        <w:t>2026-01-29 14:03:35-0500PM ET enumeration Enumeration module initialized.</w:t>
+        <w:t xml:space="preserve">2026-01-29 14:03:35-0500PM ET </w:t>
+      </w:r>
+      <w:proofErr w:type="gramStart"/>
+      <w:r>
+        <w:t>enumeration</w:t>
+      </w:r>
+      <w:proofErr w:type="gramEnd"/>
+      <w:r>
+        <w:t xml:space="preserve"> </w:t>
+      </w:r>
+      <w:proofErr w:type="spellStart"/>
+      <w:r>
+        <w:t>Enumeration</w:t>
+      </w:r>
+      <w:proofErr w:type="spellEnd"/>
+      <w:r>
+        <w:t xml:space="preserve"> </w:t>
+      </w:r>
+      <w:proofErr w:type="gramStart"/>
+      <w:r>
+        <w:t>module</w:t>
+      </w:r>
+      <w:proofErr w:type="gramEnd"/>
+      <w:r>
+        <w:t xml:space="preserve"> initialized.</w:t>
       </w:r>
     </w:p>
     <w:p>
@@ -5597,7 +6593,15 @@
         <w:pStyle w:val="ActivityBullet"/>
       </w:pPr>
       <w:r>
-        <w:t>2026-01-29 14:04:43-0500PM ET enumeration Enumerating HTTP services.</w:t>
+        <w:t xml:space="preserve">2026-01-29 14:04:43-0500PM ET </w:t>
+      </w:r>
+      <w:proofErr w:type="gramStart"/>
+      <w:r>
+        <w:t>enumeration</w:t>
+      </w:r>
+      <w:proofErr w:type="gramEnd"/>
+      <w:r>
+        <w:t xml:space="preserve"> Enumerating HTTP services.</w:t>
       </w:r>
     </w:p>
     <w:p>
@@ -5605,7 +6609,15 @@
         <w:pStyle w:val="ActivityBullet"/>
       </w:pPr>
       <w:r>
-        <w:t>2026-01-29 14:04:43-0500PM ET enumeration Enumerating HTTPS services.</w:t>
+        <w:t xml:space="preserve">2026-01-29 14:04:43-0500PM ET </w:t>
+      </w:r>
+      <w:proofErr w:type="gramStart"/>
+      <w:r>
+        <w:t>enumeration</w:t>
+      </w:r>
+      <w:proofErr w:type="gramEnd"/>
+      <w:r>
+        <w:t xml:space="preserve"> Enumerating HTTPS services.</w:t>
       </w:r>
     </w:p>
     <w:p>
@@ -5621,7 +6633,15 @@
         <w:pStyle w:val="ActivityBullet"/>
       </w:pPr>
       <w:r>
-        <w:t>2026-01-29 14:04:47-0500PM ET enumeration Running nmap script scan using script: http-headers.</w:t>
+        <w:t xml:space="preserve">2026-01-29 14:04:47-0500PM ET enumeration Running </w:t>
+      </w:r>
+      <w:proofErr w:type="spellStart"/>
+      <w:r>
+        <w:t>nmap</w:t>
+      </w:r>
+      <w:proofErr w:type="spellEnd"/>
+      <w:r>
+        <w:t xml:space="preserve"> script scan using script: http-headers.</w:t>
       </w:r>
     </w:p>
     <w:p>
@@ -5629,7 +6649,15 @@
         <w:pStyle w:val="ActivityBullet"/>
       </w:pPr>
       <w:r>
-        <w:t>2026-01-29 14:04:47-0500PM ET enumeration Running nmap script scan using script: http-methods.</w:t>
+        <w:t xml:space="preserve">2026-01-29 14:04:47-0500PM ET enumeration Running </w:t>
+      </w:r>
+      <w:proofErr w:type="spellStart"/>
+      <w:r>
+        <w:t>nmap</w:t>
+      </w:r>
+      <w:proofErr w:type="spellEnd"/>
+      <w:r>
+        <w:t xml:space="preserve"> script scan using script: http-methods.</w:t>
       </w:r>
     </w:p>
     <w:p>
@@ -5637,7 +6665,15 @@
         <w:pStyle w:val="ActivityBullet"/>
       </w:pPr>
       <w:r>
-        <w:t>2026-01-29 14:04:47-0500PM ET enumeration Running nmap script scan using script: http-headers.</w:t>
+        <w:t xml:space="preserve">2026-01-29 14:04:47-0500PM ET enumeration Running </w:t>
+      </w:r>
+      <w:proofErr w:type="spellStart"/>
+      <w:r>
+        <w:t>nmap</w:t>
+      </w:r>
+      <w:proofErr w:type="spellEnd"/>
+      <w:r>
+        <w:t xml:space="preserve"> script scan using script: http-headers.</w:t>
       </w:r>
     </w:p>
     <w:p>
@@ -5645,7 +6681,15 @@
         <w:pStyle w:val="ActivityBullet"/>
       </w:pPr>
       <w:r>
-        <w:t>2026-01-29 14:04:47-0500PM ET enumeration Running nmap script scan using script: http-robots.txt.</w:t>
+        <w:t xml:space="preserve">2026-01-29 14:04:47-0500PM ET enumeration Running </w:t>
+      </w:r>
+      <w:proofErr w:type="spellStart"/>
+      <w:r>
+        <w:t>nmap</w:t>
+      </w:r>
+      <w:proofErr w:type="spellEnd"/>
+      <w:r>
+        <w:t xml:space="preserve"> script scan using script: http-robots.txt.</w:t>
       </w:r>
     </w:p>
     <w:p>
@@ -5653,7 +6697,15 @@
         <w:pStyle w:val="ActivityBullet"/>
       </w:pPr>
       <w:r>
-        <w:t>2026-01-29 14:04:47-0500PM ET enumeration Running nmap script scan using script: http-robots.txt.</w:t>
+        <w:t xml:space="preserve">2026-01-29 14:04:47-0500PM ET enumeration Running </w:t>
+      </w:r>
+      <w:proofErr w:type="spellStart"/>
+      <w:r>
+        <w:t>nmap</w:t>
+      </w:r>
+      <w:proofErr w:type="spellEnd"/>
+      <w:r>
+        <w:t xml:space="preserve"> script scan using script: http-robots.txt.</w:t>
       </w:r>
     </w:p>
     <w:p>
@@ -5661,7 +6713,15 @@
         <w:pStyle w:val="ActivityBullet"/>
       </w:pPr>
       <w:r>
-        <w:t>2026-01-29 14:04:47-0500PM ET enumeration Running nmap script scan using script: http-put.</w:t>
+        <w:t xml:space="preserve">2026-01-29 14:04:47-0500PM ET enumeration Running </w:t>
+      </w:r>
+      <w:proofErr w:type="spellStart"/>
+      <w:r>
+        <w:t>nmap</w:t>
+      </w:r>
+      <w:proofErr w:type="spellEnd"/>
+      <w:r>
+        <w:t xml:space="preserve"> script scan using script: http-put.</w:t>
       </w:r>
     </w:p>
     <w:p>
@@ -5669,7 +6729,15 @@
         <w:pStyle w:val="ActivityBullet"/>
       </w:pPr>
       <w:r>
-        <w:t>2026-01-29 14:04:47-0500PM ET enumeration Running nmap script scan using script: http-title.</w:t>
+        <w:t xml:space="preserve">2026-01-29 14:04:47-0500PM ET enumeration Running </w:t>
+      </w:r>
+      <w:proofErr w:type="spellStart"/>
+      <w:r>
+        <w:t>nmap</w:t>
+      </w:r>
+      <w:proofErr w:type="spellEnd"/>
+      <w:r>
+        <w:t xml:space="preserve"> script scan using script: http-title.</w:t>
       </w:r>
     </w:p>
     <w:p>
@@ -5677,7 +6745,15 @@
         <w:pStyle w:val="ActivityBullet"/>
       </w:pPr>
       <w:r>
-        <w:t>2026-01-29 14:04:47-0500PM ET enumeration Running nmap script scan using script: http-shellshock.</w:t>
+        <w:t xml:space="preserve">2026-01-29 14:04:47-0500PM ET enumeration Running </w:t>
+      </w:r>
+      <w:proofErr w:type="spellStart"/>
+      <w:r>
+        <w:t>nmap</w:t>
+      </w:r>
+      <w:proofErr w:type="spellEnd"/>
+      <w:r>
+        <w:t xml:space="preserve"> script scan using script: http-shellshock.</w:t>
       </w:r>
     </w:p>
     <w:p>
@@ -5685,7 +6761,15 @@
         <w:pStyle w:val="ActivityBullet"/>
       </w:pPr>
       <w:r>
-        <w:t>2026-01-29 14:04:47-0500PM ET enumeration Running nmap script scan using script: http-methods.</w:t>
+        <w:t xml:space="preserve">2026-01-29 14:04:47-0500PM ET enumeration Running </w:t>
+      </w:r>
+      <w:proofErr w:type="spellStart"/>
+      <w:r>
+        <w:t>nmap</w:t>
+      </w:r>
+      <w:proofErr w:type="spellEnd"/>
+      <w:r>
+        <w:t xml:space="preserve"> script scan using script: http-methods.</w:t>
       </w:r>
     </w:p>
     <w:p>
@@ -5693,7 +6777,15 @@
         <w:pStyle w:val="ActivityBullet"/>
       </w:pPr>
       <w:r>
-        <w:t>2026-01-29 14:04:47-0500PM ET enumeration Running nmap script scan using script: sslv2.</w:t>
+        <w:t xml:space="preserve">2026-01-29 14:04:47-0500PM ET enumeration Running </w:t>
+      </w:r>
+      <w:proofErr w:type="spellStart"/>
+      <w:r>
+        <w:t>nmap</w:t>
+      </w:r>
+      <w:proofErr w:type="spellEnd"/>
+      <w:r>
+        <w:t xml:space="preserve"> script scan using script: sslv2.</w:t>
       </w:r>
     </w:p>
     <w:p>
@@ -5701,7 +6793,23 @@
         <w:pStyle w:val="ActivityBullet"/>
       </w:pPr>
       <w:r>
-        <w:t>2026-01-29 14:04:47-0500PM ET enumeration Running nmap script scan using script: ssl-cert.</w:t>
+        <w:t xml:space="preserve">2026-01-29 14:04:47-0500PM ET enumeration Running </w:t>
+      </w:r>
+      <w:proofErr w:type="spellStart"/>
+      <w:r>
+        <w:t>nmap</w:t>
+      </w:r>
+      <w:proofErr w:type="spellEnd"/>
+      <w:r>
+        <w:t xml:space="preserve"> script scan using script: </w:t>
+      </w:r>
+      <w:proofErr w:type="spellStart"/>
+      <w:r>
+        <w:t>ssl</w:t>
+      </w:r>
+      <w:proofErr w:type="spellEnd"/>
+      <w:r>
+        <w:t>-cert.</w:t>
       </w:r>
     </w:p>
     <w:p>
@@ -5709,7 +6817,31 @@
         <w:pStyle w:val="ActivityBullet"/>
       </w:pPr>
       <w:r>
-        <w:t>2026-01-29 14:04:47-0500PM ET enumeration Running nmap script scan using script: ssl-enum-ciphers.</w:t>
+        <w:t xml:space="preserve">2026-01-29 14:04:47-0500PM ET enumeration Running </w:t>
+      </w:r>
+      <w:proofErr w:type="spellStart"/>
+      <w:r>
+        <w:t>nmap</w:t>
+      </w:r>
+      <w:proofErr w:type="spellEnd"/>
+      <w:r>
+        <w:t xml:space="preserve"> script scan using script: </w:t>
+      </w:r>
+      <w:proofErr w:type="spellStart"/>
+      <w:r>
+        <w:t>ssl</w:t>
+      </w:r>
+      <w:proofErr w:type="spellEnd"/>
+      <w:r>
+        <w:t>-</w:t>
+      </w:r>
+      <w:proofErr w:type="spellStart"/>
+      <w:r>
+        <w:t>enum</w:t>
+      </w:r>
+      <w:proofErr w:type="spellEnd"/>
+      <w:r>
+        <w:t>-ciphers.</w:t>
       </w:r>
     </w:p>
     <w:p>
@@ -5717,7 +6849,15 @@
         <w:pStyle w:val="ActivityBullet"/>
       </w:pPr>
       <w:r>
-        <w:t>2026-01-29 14:04:47-0500PM ET enumeration Running nmap script scan using script: http-shellshock.</w:t>
+        <w:t xml:space="preserve">2026-01-29 14:04:47-0500PM ET enumeration Running </w:t>
+      </w:r>
+      <w:proofErr w:type="spellStart"/>
+      <w:r>
+        <w:t>nmap</w:t>
+      </w:r>
+      <w:proofErr w:type="spellEnd"/>
+      <w:r>
+        <w:t xml:space="preserve"> script scan using script: http-shellshock.</w:t>
       </w:r>
     </w:p>
     <w:p>
@@ -5725,7 +6865,23 @@
         <w:pStyle w:val="ActivityBullet"/>
       </w:pPr>
       <w:r>
-        <w:t>2026-01-29 14:04:47-0500PM ET enumeration Running nmap script scan using script: ssl-poodle.</w:t>
+        <w:t xml:space="preserve">2026-01-29 14:04:47-0500PM ET enumeration Running </w:t>
+      </w:r>
+      <w:proofErr w:type="spellStart"/>
+      <w:r>
+        <w:t>nmap</w:t>
+      </w:r>
+      <w:proofErr w:type="spellEnd"/>
+      <w:r>
+        <w:t xml:space="preserve"> script scan using script: </w:t>
+      </w:r>
+      <w:proofErr w:type="spellStart"/>
+      <w:r>
+        <w:t>ssl</w:t>
+      </w:r>
+      <w:proofErr w:type="spellEnd"/>
+      <w:r>
+        <w:t>-poodle.</w:t>
       </w:r>
     </w:p>
     <w:p>
@@ -5733,7 +6889,15 @@
         <w:pStyle w:val="ActivityBullet"/>
       </w:pPr>
       <w:r>
-        <w:t>2026-01-29 14:04:47-0500PM ET enumeration Running nmap script scan using script: http-put.</w:t>
+        <w:t xml:space="preserve">2026-01-29 14:04:47-0500PM ET enumeration Running </w:t>
+      </w:r>
+      <w:proofErr w:type="spellStart"/>
+      <w:r>
+        <w:t>nmap</w:t>
+      </w:r>
+      <w:proofErr w:type="spellEnd"/>
+      <w:r>
+        <w:t xml:space="preserve"> script scan using script: http-put.</w:t>
       </w:r>
     </w:p>
     <w:p>
@@ -5741,7 +6905,23 @@
         <w:pStyle w:val="ActivityBullet"/>
       </w:pPr>
       <w:r>
-        <w:t>2026-01-29 14:04:47-0500PM ET enumeration Running nmap script scan using script: ssl-heartbleed.</w:t>
+        <w:t xml:space="preserve">2026-01-29 14:04:47-0500PM ET enumeration Running </w:t>
+      </w:r>
+      <w:proofErr w:type="spellStart"/>
+      <w:r>
+        <w:t>nmap</w:t>
+      </w:r>
+      <w:proofErr w:type="spellEnd"/>
+      <w:r>
+        <w:t xml:space="preserve"> script scan using script: </w:t>
+      </w:r>
+      <w:proofErr w:type="spellStart"/>
+      <w:r>
+        <w:t>ssl-heartbleed</w:t>
+      </w:r>
+      <w:proofErr w:type="spellEnd"/>
+      <w:r>
+        <w:t>.</w:t>
       </w:r>
     </w:p>
     <w:p>
@@ -5749,7 +6929,15 @@
         <w:pStyle w:val="ActivityBullet"/>
       </w:pPr>
       <w:r>
-        <w:t>2026-01-29 14:04:47-0500PM ET enumeration Running nmap script scan using script: http-title.</w:t>
+        <w:t xml:space="preserve">2026-01-29 14:04:47-0500PM ET enumeration Running </w:t>
+      </w:r>
+      <w:proofErr w:type="spellStart"/>
+      <w:r>
+        <w:t>nmap</w:t>
+      </w:r>
+      <w:proofErr w:type="spellEnd"/>
+      <w:r>
+        <w:t xml:space="preserve"> script scan using script: http-title.</w:t>
       </w:r>
     </w:p>
     <w:p>
@@ -5757,7 +6945,23 @@
         <w:pStyle w:val="ActivityBullet"/>
       </w:pPr>
       <w:r>
-        <w:t>2026-01-29 14:04:47-0500PM ET enumeration Running nmap script scan using script: ssl-date.</w:t>
+        <w:t xml:space="preserve">2026-01-29 14:04:47-0500PM ET enumeration Running </w:t>
+      </w:r>
+      <w:proofErr w:type="spellStart"/>
+      <w:r>
+        <w:t>nmap</w:t>
+      </w:r>
+      <w:proofErr w:type="spellEnd"/>
+      <w:r>
+        <w:t xml:space="preserve"> script scan using script: </w:t>
+      </w:r>
+      <w:proofErr w:type="spellStart"/>
+      <w:r>
+        <w:t>ssl</w:t>
+      </w:r>
+      <w:proofErr w:type="spellEnd"/>
+      <w:r>
+        <w:t>-date.</w:t>
       </w:r>
     </w:p>
     <w:p>
@@ -5765,7 +6969,15 @@
         <w:pStyle w:val="ActivityBullet"/>
       </w:pPr>
       <w:r>
-        <w:t>2026-01-29 14:04:47-0500PM ET enumeration Queuing up MSF module: auxiliary/scanner/ssh/ssh_version.</w:t>
+        <w:t>2026-01-29 14:04:47-0500PM ET enumeration Queuing up MSF module: auxiliary/scanner/ssh/</w:t>
+      </w:r>
+      <w:proofErr w:type="spellStart"/>
+      <w:r>
+        <w:t>ssh_version</w:t>
+      </w:r>
+      <w:proofErr w:type="spellEnd"/>
+      <w:r>
+        <w:t>.</w:t>
       </w:r>
     </w:p>
     <w:p>
@@ -5773,7 +6985,23 @@
         <w:pStyle w:val="ActivityBullet"/>
       </w:pPr>
       <w:r>
-        <w:t>2026-01-29 14:05:50-0500PM ET enumeration Completed MSF module: auxiliary/scanner/ssh/ssh_version.</w:t>
+        <w:t xml:space="preserve">2026-01-29 14:05:50-0500PM ET enumeration Completed MSF module: </w:t>
+      </w:r>
+      <w:proofErr w:type="gramStart"/>
+      <w:r>
+        <w:t>auxiliary/scanner</w:t>
+      </w:r>
+      <w:proofErr w:type="gramEnd"/>
+      <w:r>
+        <w:t>/ssh/</w:t>
+      </w:r>
+      <w:proofErr w:type="spellStart"/>
+      <w:r>
+        <w:t>ssh_version</w:t>
+      </w:r>
+      <w:proofErr w:type="spellEnd"/>
+      <w:r>
+        <w:t>.</w:t>
       </w:r>
     </w:p>
     <w:p>
@@ -5782,7 +7010,15 @@
       </w:pPr>
       <w:r>
         <w:lastRenderedPageBreak/>
-        <w:t>2026-01-29 14:05:50-0500PM ET enumeration Completed nmap script scan using script: http-methods.</w:t>
+        <w:t xml:space="preserve">2026-01-29 14:05:50-0500PM ET enumeration Completed </w:t>
+      </w:r>
+      <w:proofErr w:type="spellStart"/>
+      <w:r>
+        <w:t>nmap</w:t>
+      </w:r>
+      <w:proofErr w:type="spellEnd"/>
+      <w:r>
+        <w:t xml:space="preserve"> script scan using script: http-methods.</w:t>
       </w:r>
     </w:p>
     <w:p>
@@ -5790,7 +7026,31 @@
         <w:pStyle w:val="ActivityBullet"/>
       </w:pPr>
       <w:r>
-        <w:t>2026-01-29 14:05:50-0500PM ET enumeration Completed nmap script scan using script: ssl-enum-ciphers.</w:t>
+        <w:t xml:space="preserve">2026-01-29 14:05:50-0500PM ET enumeration Completed </w:t>
+      </w:r>
+      <w:proofErr w:type="spellStart"/>
+      <w:r>
+        <w:t>nmap</w:t>
+      </w:r>
+      <w:proofErr w:type="spellEnd"/>
+      <w:r>
+        <w:t xml:space="preserve"> script scan using script: </w:t>
+      </w:r>
+      <w:proofErr w:type="spellStart"/>
+      <w:r>
+        <w:t>ssl</w:t>
+      </w:r>
+      <w:proofErr w:type="spellEnd"/>
+      <w:r>
+        <w:t>-</w:t>
+      </w:r>
+      <w:proofErr w:type="spellStart"/>
+      <w:r>
+        <w:t>enum</w:t>
+      </w:r>
+      <w:proofErr w:type="spellEnd"/>
+      <w:r>
+        <w:t>-ciphers.</w:t>
       </w:r>
     </w:p>
     <w:p>
@@ -5798,7 +7058,15 @@
         <w:pStyle w:val="ActivityBullet"/>
       </w:pPr>
       <w:r>
-        <w:t>2026-01-29 14:05:50-0500PM ET enumeration Completed nmap script scan using script: http-put.</w:t>
+        <w:t xml:space="preserve">2026-01-29 14:05:50-0500PM ET enumeration Completed </w:t>
+      </w:r>
+      <w:proofErr w:type="spellStart"/>
+      <w:r>
+        <w:t>nmap</w:t>
+      </w:r>
+      <w:proofErr w:type="spellEnd"/>
+      <w:r>
+        <w:t xml:space="preserve"> script scan using script: http-put.</w:t>
       </w:r>
     </w:p>
     <w:p>
@@ -5806,7 +7074,15 @@
         <w:pStyle w:val="ActivityBullet"/>
       </w:pPr>
       <w:r>
-        <w:t>2026-01-29 14:05:50-0500PM ET enumeration Completed nmap script scan using script: http-robots.txt.</w:t>
+        <w:t xml:space="preserve">2026-01-29 14:05:50-0500PM ET enumeration Completed </w:t>
+      </w:r>
+      <w:proofErr w:type="spellStart"/>
+      <w:r>
+        <w:t>nmap</w:t>
+      </w:r>
+      <w:proofErr w:type="spellEnd"/>
+      <w:r>
+        <w:t xml:space="preserve"> script scan using script: http-robots.txt.</w:t>
       </w:r>
     </w:p>
     <w:p>
@@ -5814,7 +7090,23 @@
         <w:pStyle w:val="ActivityBullet"/>
       </w:pPr>
       <w:r>
-        <w:t>2026-01-29 14:05:50-0500PM ET enumeration Completed nmap script scan using script: ssl-heartbleed.</w:t>
+        <w:t xml:space="preserve">2026-01-29 14:05:50-0500PM ET enumeration Completed </w:t>
+      </w:r>
+      <w:proofErr w:type="spellStart"/>
+      <w:r>
+        <w:t>nmap</w:t>
+      </w:r>
+      <w:proofErr w:type="spellEnd"/>
+      <w:r>
+        <w:t xml:space="preserve"> script scan using script: </w:t>
+      </w:r>
+      <w:proofErr w:type="spellStart"/>
+      <w:r>
+        <w:t>ssl-heartbleed</w:t>
+      </w:r>
+      <w:proofErr w:type="spellEnd"/>
+      <w:r>
+        <w:t>.</w:t>
       </w:r>
     </w:p>
     <w:p>
@@ -5822,7 +7114,15 @@
         <w:pStyle w:val="ActivityBullet"/>
       </w:pPr>
       <w:r>
-        <w:t>2026-01-29 14:05:50-0500PM ET enumeration Completed nmap script scan using script: http-shellshock.</w:t>
+        <w:t xml:space="preserve">2026-01-29 14:05:50-0500PM ET enumeration Completed </w:t>
+      </w:r>
+      <w:proofErr w:type="spellStart"/>
+      <w:r>
+        <w:t>nmap</w:t>
+      </w:r>
+      <w:proofErr w:type="spellEnd"/>
+      <w:r>
+        <w:t xml:space="preserve"> script scan using script: http-shellshock.</w:t>
       </w:r>
     </w:p>
     <w:p>
@@ -5830,7 +7130,15 @@
         <w:pStyle w:val="ActivityBullet"/>
       </w:pPr>
       <w:r>
-        <w:t>2026-01-29 14:05:50-0500PM ET enumeration Completed nmap script scan using script: http-robots.txt.</w:t>
+        <w:t xml:space="preserve">2026-01-29 14:05:50-0500PM ET enumeration Completed </w:t>
+      </w:r>
+      <w:proofErr w:type="spellStart"/>
+      <w:r>
+        <w:t>nmap</w:t>
+      </w:r>
+      <w:proofErr w:type="spellEnd"/>
+      <w:r>
+        <w:t xml:space="preserve"> script scan using script: http-robots.txt.</w:t>
       </w:r>
     </w:p>
     <w:p>
@@ -5838,7 +7146,15 @@
         <w:pStyle w:val="ActivityBullet"/>
       </w:pPr>
       <w:r>
-        <w:t>2026-01-29 14:05:51-0500PM ET enumeration Completed nmap script scan using script: http-put.</w:t>
+        <w:t xml:space="preserve">2026-01-29 14:05:51-0500PM ET enumeration Completed </w:t>
+      </w:r>
+      <w:proofErr w:type="spellStart"/>
+      <w:r>
+        <w:t>nmap</w:t>
+      </w:r>
+      <w:proofErr w:type="spellEnd"/>
+      <w:r>
+        <w:t xml:space="preserve"> script scan using script: http-put.</w:t>
       </w:r>
     </w:p>
     <w:p>
@@ -5846,7 +7162,15 @@
         <w:pStyle w:val="ActivityBullet"/>
       </w:pPr>
       <w:r>
-        <w:t>2026-01-29 14:05:51-0500PM ET enumeration Completed nmap script scan using script: http-headers.</w:t>
+        <w:t xml:space="preserve">2026-01-29 14:05:51-0500PM ET enumeration Completed </w:t>
+      </w:r>
+      <w:proofErr w:type="spellStart"/>
+      <w:r>
+        <w:t>nmap</w:t>
+      </w:r>
+      <w:proofErr w:type="spellEnd"/>
+      <w:r>
+        <w:t xml:space="preserve"> script scan using script: http-headers.</w:t>
       </w:r>
     </w:p>
     <w:p>
@@ -5854,7 +7178,15 @@
         <w:pStyle w:val="ActivityBullet"/>
       </w:pPr>
       <w:r>
-        <w:t>2026-01-29 14:05:51-0500PM ET enumeration Completed nmap script scan using script: http-methods.</w:t>
+        <w:t xml:space="preserve">2026-01-29 14:05:51-0500PM ET enumeration Completed </w:t>
+      </w:r>
+      <w:proofErr w:type="spellStart"/>
+      <w:r>
+        <w:t>nmap</w:t>
+      </w:r>
+      <w:proofErr w:type="spellEnd"/>
+      <w:r>
+        <w:t xml:space="preserve"> script scan using script: http-methods.</w:t>
       </w:r>
     </w:p>
     <w:p>
@@ -5862,7 +7194,23 @@
         <w:pStyle w:val="ActivityBullet"/>
       </w:pPr>
       <w:r>
-        <w:t>2026-01-29 14:05:51-0500PM ET enumeration Completed nmap script scan using script: ssl-date.</w:t>
+        <w:t xml:space="preserve">2026-01-29 14:05:51-0500PM ET enumeration Completed </w:t>
+      </w:r>
+      <w:proofErr w:type="spellStart"/>
+      <w:r>
+        <w:t>nmap</w:t>
+      </w:r>
+      <w:proofErr w:type="spellEnd"/>
+      <w:r>
+        <w:t xml:space="preserve"> script scan using script: </w:t>
+      </w:r>
+      <w:proofErr w:type="spellStart"/>
+      <w:r>
+        <w:t>ssl</w:t>
+      </w:r>
+      <w:proofErr w:type="spellEnd"/>
+      <w:r>
+        <w:t>-date.</w:t>
       </w:r>
     </w:p>
     <w:p>
@@ -5870,7 +7218,15 @@
         <w:pStyle w:val="ActivityBullet"/>
       </w:pPr>
       <w:r>
-        <w:t>2026-01-29 14:05:51-0500PM ET enumeration Completed nmap script scan using script: http-title.</w:t>
+        <w:t xml:space="preserve">2026-01-29 14:05:51-0500PM ET enumeration Completed </w:t>
+      </w:r>
+      <w:proofErr w:type="spellStart"/>
+      <w:r>
+        <w:t>nmap</w:t>
+      </w:r>
+      <w:proofErr w:type="spellEnd"/>
+      <w:r>
+        <w:t xml:space="preserve"> script scan using script: http-title.</w:t>
       </w:r>
     </w:p>
     <w:p>
@@ -5878,7 +7234,23 @@
         <w:pStyle w:val="ActivityBullet"/>
       </w:pPr>
       <w:r>
-        <w:t>2026-01-29 14:05:51-0500PM ET enumeration Completed nmap script scan using script: http-shellshock.</w:t>
+        <w:t xml:space="preserve">2026-01-29 14:05:51-0500PM ET </w:t>
+      </w:r>
+      <w:proofErr w:type="gramStart"/>
+      <w:r>
+        <w:t>enumeration</w:t>
+      </w:r>
+      <w:proofErr w:type="gramEnd"/>
+      <w:r>
+        <w:t xml:space="preserve"> Completed </w:t>
+      </w:r>
+      <w:proofErr w:type="spellStart"/>
+      <w:r>
+        <w:t>nmap</w:t>
+      </w:r>
+      <w:proofErr w:type="spellEnd"/>
+      <w:r>
+        <w:t xml:space="preserve"> script scan using script: http-shellshock.</w:t>
       </w:r>
     </w:p>
     <w:p>
@@ -5886,7 +7258,15 @@
         <w:pStyle w:val="ActivityBullet"/>
       </w:pPr>
       <w:r>
-        <w:t>2026-01-29 14:05:51-0500PM ET enumeration Completed nmap script scan using script: http-headers.</w:t>
+        <w:t xml:space="preserve">2026-01-29 14:05:51-0500PM ET enumeration Completed </w:t>
+      </w:r>
+      <w:proofErr w:type="spellStart"/>
+      <w:r>
+        <w:t>nmap</w:t>
+      </w:r>
+      <w:proofErr w:type="spellEnd"/>
+      <w:r>
+        <w:t xml:space="preserve"> script scan using script: http-headers.</w:t>
       </w:r>
     </w:p>
     <w:p>
@@ -5894,7 +7274,31 @@
         <w:pStyle w:val="ActivityBullet"/>
       </w:pPr>
       <w:r>
-        <w:t>2026-01-29 14:05:51-0500PM ET enumeration Completed nmap script scan using script: ssl-poodle.</w:t>
+        <w:t xml:space="preserve">2026-01-29 14:05:51-0500PM ET </w:t>
+      </w:r>
+      <w:proofErr w:type="gramStart"/>
+      <w:r>
+        <w:t>enumeration</w:t>
+      </w:r>
+      <w:proofErr w:type="gramEnd"/>
+      <w:r>
+        <w:t xml:space="preserve"> Completed </w:t>
+      </w:r>
+      <w:proofErr w:type="spellStart"/>
+      <w:r>
+        <w:t>nmap</w:t>
+      </w:r>
+      <w:proofErr w:type="spellEnd"/>
+      <w:r>
+        <w:t xml:space="preserve"> script scan using script: </w:t>
+      </w:r>
+      <w:proofErr w:type="spellStart"/>
+      <w:r>
+        <w:t>ssl</w:t>
+      </w:r>
+      <w:proofErr w:type="spellEnd"/>
+      <w:r>
+        <w:t>-poodle.</w:t>
       </w:r>
     </w:p>
     <w:p>
@@ -5902,7 +7306,23 @@
         <w:pStyle w:val="ActivityBullet"/>
       </w:pPr>
       <w:r>
-        <w:t>2026-01-29 14:05:51-0500PM ET enumeration Completed nmap script scan using script: ssl-cert.</w:t>
+        <w:t xml:space="preserve">2026-01-29 14:05:51-0500PM ET enumeration Completed </w:t>
+      </w:r>
+      <w:proofErr w:type="spellStart"/>
+      <w:r>
+        <w:t>nmap</w:t>
+      </w:r>
+      <w:proofErr w:type="spellEnd"/>
+      <w:r>
+        <w:t xml:space="preserve"> script scan using script: </w:t>
+      </w:r>
+      <w:proofErr w:type="spellStart"/>
+      <w:r>
+        <w:t>ssl</w:t>
+      </w:r>
+      <w:proofErr w:type="spellEnd"/>
+      <w:r>
+        <w:t>-cert.</w:t>
       </w:r>
     </w:p>
     <w:p>
@@ -5910,7 +7330,15 @@
         <w:pStyle w:val="ActivityBullet"/>
       </w:pPr>
       <w:r>
-        <w:t>2026-01-29 14:05:51-0500PM ET enumeration Completed nmap script scan using script: sslv2.</w:t>
+        <w:t xml:space="preserve">2026-01-29 14:05:51-0500PM ET enumeration Completed </w:t>
+      </w:r>
+      <w:proofErr w:type="spellStart"/>
+      <w:r>
+        <w:t>nmap</w:t>
+      </w:r>
+      <w:proofErr w:type="spellEnd"/>
+      <w:r>
+        <w:t xml:space="preserve"> script scan using script: sslv2.</w:t>
       </w:r>
     </w:p>
     <w:p>
@@ -5918,7 +7346,15 @@
         <w:pStyle w:val="ActivityBullet"/>
       </w:pPr>
       <w:r>
-        <w:t>2026-01-29 14:05:51-0500PM ET enumeration Completed nmap script scan using script: http-title.</w:t>
+        <w:t xml:space="preserve">2026-01-29 14:05:51-0500PM ET enumeration Completed </w:t>
+      </w:r>
+      <w:proofErr w:type="spellStart"/>
+      <w:r>
+        <w:t>nmap</w:t>
+      </w:r>
+      <w:proofErr w:type="spellEnd"/>
+      <w:r>
+        <w:t xml:space="preserve"> script scan using script: http-title.</w:t>
       </w:r>
     </w:p>
     <w:p>
@@ -5926,7 +7362,23 @@
         <w:pStyle w:val="ActivityBullet"/>
       </w:pPr>
       <w:r>
-        <w:t>2026-01-29 14:05:51-0500PM ET enumeration Peforming a hidden directory enumeration attack on 80/tcp.</w:t>
+        <w:t xml:space="preserve">2026-01-29 14:05:51-0500PM ET enumeration </w:t>
+      </w:r>
+      <w:proofErr w:type="spellStart"/>
+      <w:r>
+        <w:t>Peforming</w:t>
+      </w:r>
+      <w:proofErr w:type="spellEnd"/>
+      <w:r>
+        <w:t xml:space="preserve"> a hidden directory enumeration attack on 80/</w:t>
+      </w:r>
+      <w:proofErr w:type="spellStart"/>
+      <w:r>
+        <w:t>tcp</w:t>
+      </w:r>
+      <w:proofErr w:type="spellEnd"/>
+      <w:r>
+        <w:t>.</w:t>
       </w:r>
     </w:p>
     <w:p>
@@ -5934,7 +7386,15 @@
         <w:pStyle w:val="ActivityBullet"/>
       </w:pPr>
       <w:r>
-        <w:t>2026-01-29 14:05:54-0500PM ET enumeration Running nmap script scan using script: sshv1.</w:t>
+        <w:t xml:space="preserve">2026-01-29 14:05:54-0500PM ET enumeration Running </w:t>
+      </w:r>
+      <w:proofErr w:type="spellStart"/>
+      <w:r>
+        <w:t>nmap</w:t>
+      </w:r>
+      <w:proofErr w:type="spellEnd"/>
+      <w:r>
+        <w:t xml:space="preserve"> script scan using script: sshv1.</w:t>
       </w:r>
     </w:p>
     <w:p>
@@ -5942,7 +7402,15 @@
         <w:pStyle w:val="ActivityBullet"/>
       </w:pPr>
       <w:r>
-        <w:t>2026-01-29 14:05:54-0500PM ET enumeration Running nmap script scan using script: ssh2-enum-algos.</w:t>
+        <w:t xml:space="preserve">2026-01-29 14:05:54-0500PM ET enumeration Running </w:t>
+      </w:r>
+      <w:proofErr w:type="spellStart"/>
+      <w:r>
+        <w:t>nmap</w:t>
+      </w:r>
+      <w:proofErr w:type="spellEnd"/>
+      <w:r>
+        <w:t xml:space="preserve"> script scan using script: ssh2-enum-algos.</w:t>
       </w:r>
     </w:p>
     <w:p>
@@ -5950,7 +7418,15 @@
         <w:pStyle w:val="ActivityBullet"/>
       </w:pPr>
       <w:r>
-        <w:t>2026-01-29 14:05:54-0500PM ET enumeration Running nmap script scan using script: ssh-auth-methods.</w:t>
+        <w:t xml:space="preserve">2026-01-29 14:05:54-0500PM ET enumeration Running </w:t>
+      </w:r>
+      <w:proofErr w:type="spellStart"/>
+      <w:r>
+        <w:t>nmap</w:t>
+      </w:r>
+      <w:proofErr w:type="spellEnd"/>
+      <w:r>
+        <w:t xml:space="preserve"> script scan using script: ssh-auth-methods.</w:t>
       </w:r>
     </w:p>
     <w:p>
@@ -5964,7 +7440,77 @@
         <w:rPr>
           <w:lang w:val="fr-FR"/>
         </w:rPr>
-        <w:t>2026-01-29 14:05:54-0500PM ET enumeration Analyzing SSL/TLS protocols on port 443/tcp.</w:t>
+        <w:t xml:space="preserve">2026-01-29 </w:t>
+      </w:r>
+      <w:proofErr w:type="gramStart"/>
+      <w:r>
+        <w:rPr>
+          <w:lang w:val="fr-FR"/>
+        </w:rPr>
+        <w:t>14:05:</w:t>
+      </w:r>
+      <w:proofErr w:type="gramEnd"/>
+      <w:r>
+        <w:rPr>
+          <w:lang w:val="fr-FR"/>
+        </w:rPr>
+        <w:t xml:space="preserve">54-0500PM ET </w:t>
+      </w:r>
+      <w:proofErr w:type="spellStart"/>
+      <w:r>
+        <w:rPr>
+          <w:lang w:val="fr-FR"/>
+        </w:rPr>
+        <w:t>enumeration</w:t>
+      </w:r>
+      <w:proofErr w:type="spellEnd"/>
+      <w:r>
+        <w:rPr>
+          <w:lang w:val="fr-FR"/>
+        </w:rPr>
+        <w:t xml:space="preserve"> </w:t>
+      </w:r>
+      <w:proofErr w:type="spellStart"/>
+      <w:r>
+        <w:rPr>
+          <w:lang w:val="fr-FR"/>
+        </w:rPr>
+        <w:t>Analyzing</w:t>
+      </w:r>
+      <w:proofErr w:type="spellEnd"/>
+      <w:r>
+        <w:rPr>
+          <w:lang w:val="fr-FR"/>
+        </w:rPr>
+        <w:t xml:space="preserve"> SSL/TLS </w:t>
+      </w:r>
+      <w:proofErr w:type="spellStart"/>
+      <w:r>
+        <w:rPr>
+          <w:lang w:val="fr-FR"/>
+        </w:rPr>
+        <w:t>protocols</w:t>
+      </w:r>
+      <w:proofErr w:type="spellEnd"/>
+      <w:r>
+        <w:rPr>
+          <w:lang w:val="fr-FR"/>
+        </w:rPr>
+        <w:t xml:space="preserve"> on port 443/</w:t>
+      </w:r>
+      <w:proofErr w:type="spellStart"/>
+      <w:r>
+        <w:rPr>
+          <w:lang w:val="fr-FR"/>
+        </w:rPr>
+        <w:t>tcp</w:t>
+      </w:r>
+      <w:proofErr w:type="spellEnd"/>
+      <w:r>
+        <w:rPr>
+          <w:lang w:val="fr-FR"/>
+        </w:rPr>
+        <w:t>.</w:t>
       </w:r>
     </w:p>
     <w:p>
@@ -5972,7 +7518,15 @@
         <w:pStyle w:val="ActivityBullet"/>
       </w:pPr>
       <w:r>
-        <w:t>2026-01-29 14:06:55-0500PM ET enumeration Completed SSL/TLS analysis on ports 443/tcp.</w:t>
+        <w:t>2026-01-29 14:06:55-0500PM ET enumeration Completed SSL/TLS analysis on ports 443/</w:t>
+      </w:r>
+      <w:proofErr w:type="spellStart"/>
+      <w:r>
+        <w:t>tcp</w:t>
+      </w:r>
+      <w:proofErr w:type="spellEnd"/>
+      <w:r>
+        <w:t>.</w:t>
       </w:r>
     </w:p>
     <w:p>
@@ -5988,7 +7542,23 @@
         <w:pStyle w:val="ActivityBullet"/>
       </w:pPr>
       <w:r>
-        <w:t>2026-01-29 14:06:55-0500PM ET enumeration Peforming a hidden directory enumeration attack on 443/tcp.</w:t>
+        <w:t xml:space="preserve">2026-01-29 14:06:55-0500PM ET enumeration </w:t>
+      </w:r>
+      <w:proofErr w:type="spellStart"/>
+      <w:r>
+        <w:t>Peforming</w:t>
+      </w:r>
+      <w:proofErr w:type="spellEnd"/>
+      <w:r>
+        <w:t xml:space="preserve"> a hidden directory enumeration attack on 443/</w:t>
+      </w:r>
+      <w:proofErr w:type="spellStart"/>
+      <w:r>
+        <w:t>tcp</w:t>
+      </w:r>
+      <w:proofErr w:type="spellEnd"/>
+      <w:r>
+        <w:t>.</w:t>
       </w:r>
     </w:p>
     <w:p>
@@ -5996,7 +7566,15 @@
         <w:pStyle w:val="ActivityBullet"/>
       </w:pPr>
       <w:r>
-        <w:t>2026-01-29 14:06:55-0500PM ET enumeration Completed nmap script scan using script: ssh2-enum-algos.</w:t>
+        <w:t xml:space="preserve">2026-01-29 14:06:55-0500PM ET enumeration Completed </w:t>
+      </w:r>
+      <w:proofErr w:type="spellStart"/>
+      <w:r>
+        <w:t>nmap</w:t>
+      </w:r>
+      <w:proofErr w:type="spellEnd"/>
+      <w:r>
+        <w:t xml:space="preserve"> script scan using script: ssh2-enum-algos.</w:t>
       </w:r>
     </w:p>
     <w:p>
@@ -6004,7 +7582,15 @@
         <w:pStyle w:val="ActivityBullet"/>
       </w:pPr>
       <w:r>
-        <w:t>2026-01-29 14:06:55-0500PM ET enumeration Completed nmap script scan using script: ssh-auth-methods.</w:t>
+        <w:t xml:space="preserve">2026-01-29 14:06:55-0500PM ET enumeration Completed </w:t>
+      </w:r>
+      <w:proofErr w:type="spellStart"/>
+      <w:r>
+        <w:t>nmap</w:t>
+      </w:r>
+      <w:proofErr w:type="spellEnd"/>
+      <w:r>
+        <w:t xml:space="preserve"> script scan using script: ssh-auth-methods.</w:t>
       </w:r>
     </w:p>
     <w:p>
@@ -6012,7 +7598,15 @@
         <w:pStyle w:val="ActivityBullet"/>
       </w:pPr>
       <w:r>
-        <w:t>2026-01-29 14:06:55-0500PM ET enumeration Completed nmap script scan using script: sshv1.</w:t>
+        <w:t xml:space="preserve">2026-01-29 14:06:55-0500PM ET enumeration Completed </w:t>
+      </w:r>
+      <w:proofErr w:type="spellStart"/>
+      <w:r>
+        <w:t>nmap</w:t>
+      </w:r>
+      <w:proofErr w:type="spellEnd"/>
+      <w:r>
+        <w:t xml:space="preserve"> script scan using script: sshv1.</w:t>
       </w:r>
     </w:p>
     <w:p>
@@ -6020,7 +7614,23 @@
         <w:pStyle w:val="ActivityBullet"/>
       </w:pPr>
       <w:r>
-        <w:t>2026-01-29 14:06:55-0500PM ET enumeration Completed enumerating SSH services.</w:t>
+        <w:t xml:space="preserve">2026-01-29 14:06:55-0500PM ET </w:t>
+      </w:r>
+      <w:proofErr w:type="gramStart"/>
+      <w:r>
+        <w:t>enumeration</w:t>
+      </w:r>
+      <w:proofErr w:type="gramEnd"/>
+      <w:r>
+        <w:t xml:space="preserve"> Completed </w:t>
+      </w:r>
+      <w:proofErr w:type="gramStart"/>
+      <w:r>
+        <w:t>enumerating</w:t>
+      </w:r>
+      <w:proofErr w:type="gramEnd"/>
+      <w:r>
+        <w:t xml:space="preserve"> SSH services.</w:t>
       </w:r>
     </w:p>
     <w:p>
@@ -6028,7 +7638,15 @@
         <w:pStyle w:val="ActivityBullet"/>
       </w:pPr>
       <w:r>
-        <w:t>2026-01-29 14:06:58-0500PM ET enumeration Analyzing web services running on port 80/tcp.</w:t>
+        <w:t>2026-01-29 14:06:58-0500PM ET enumeration Analyzing web services running on port 80/</w:t>
+      </w:r>
+      <w:proofErr w:type="spellStart"/>
+      <w:r>
+        <w:t>tcp</w:t>
+      </w:r>
+      <w:proofErr w:type="spellEnd"/>
+      <w:r>
+        <w:t>.</w:t>
       </w:r>
     </w:p>
     <w:p>
@@ -6036,7 +7654,15 @@
         <w:pStyle w:val="ActivityBullet"/>
       </w:pPr>
       <w:r>
-        <w:t>2026-01-29 14:08:10-0500PM ET enumeration Completed analyzing web services running on port 80/tcp.</w:t>
+        <w:t>2026-01-29 14:08:10-0500PM ET enumeration Completed analyzing web services running on port 80/</w:t>
+      </w:r>
+      <w:proofErr w:type="spellStart"/>
+      <w:r>
+        <w:t>tcp</w:t>
+      </w:r>
+      <w:proofErr w:type="spellEnd"/>
+      <w:r>
+        <w:t>.</w:t>
       </w:r>
     </w:p>
     <w:p>
@@ -6044,7 +7670,23 @@
         <w:pStyle w:val="ActivityBullet"/>
       </w:pPr>
       <w:r>
-        <w:t>2026-01-29 14:08:10-0500PM ET enumeration Completed hidden directory enumeration scan.</w:t>
+        <w:t xml:space="preserve">2026-01-29 14:08:10-0500PM ET </w:t>
+      </w:r>
+      <w:proofErr w:type="gramStart"/>
+      <w:r>
+        <w:t>enumeration</w:t>
+      </w:r>
+      <w:proofErr w:type="gramEnd"/>
+      <w:r>
+        <w:t xml:space="preserve"> Completed </w:t>
+      </w:r>
+      <w:proofErr w:type="gramStart"/>
+      <w:r>
+        <w:t>hidden directory enumeration scan</w:t>
+      </w:r>
+      <w:proofErr w:type="gramEnd"/>
+      <w:r>
+        <w:t>.</w:t>
       </w:r>
     </w:p>
     <w:p>
@@ -6052,7 +7694,15 @@
         <w:pStyle w:val="ActivityBullet"/>
       </w:pPr>
       <w:r>
-        <w:t>2026-01-29 14:08:10-0500PM ET enumeration Completed analyzing web services running on port 80/tcp.</w:t>
+        <w:t>2026-01-29 14:08:10-0500PM ET enumeration Completed analyzing web services running on port 80/</w:t>
+      </w:r>
+      <w:proofErr w:type="spellStart"/>
+      <w:r>
+        <w:t>tcp</w:t>
+      </w:r>
+      <w:proofErr w:type="spellEnd"/>
+      <w:r>
+        <w:t>.</w:t>
       </w:r>
     </w:p>
     <w:p>
@@ -6060,7 +7710,23 @@
         <w:pStyle w:val="ActivityBullet"/>
       </w:pPr>
       <w:r>
-        <w:t>2026-01-29 14:08:10-0500PM ET enumeration Completed enumerating HTTP services.</w:t>
+        <w:t xml:space="preserve">2026-01-29 14:08:10-0500PM ET </w:t>
+      </w:r>
+      <w:proofErr w:type="gramStart"/>
+      <w:r>
+        <w:t>enumeration</w:t>
+      </w:r>
+      <w:proofErr w:type="gramEnd"/>
+      <w:r>
+        <w:t xml:space="preserve"> Completed </w:t>
+      </w:r>
+      <w:proofErr w:type="gramStart"/>
+      <w:r>
+        <w:t>enumerating</w:t>
+      </w:r>
+      <w:proofErr w:type="gramEnd"/>
+      <w:r>
+        <w:t xml:space="preserve"> HTTP services.</w:t>
       </w:r>
     </w:p>
     <w:p>
@@ -6068,7 +7734,15 @@
         <w:pStyle w:val="ActivityBullet"/>
       </w:pPr>
       <w:r>
-        <w:t>2026-01-29 14:08:13-0500PM ET enumeration Analyzing web services running on port 443/tcp.</w:t>
+        <w:t>2026-01-29 14:08:13-0500PM ET enumeration Analyzing web services running on port 443/</w:t>
+      </w:r>
+      <w:proofErr w:type="spellStart"/>
+      <w:r>
+        <w:t>tcp</w:t>
+      </w:r>
+      <w:proofErr w:type="spellEnd"/>
+      <w:r>
+        <w:t>.</w:t>
       </w:r>
     </w:p>
     <w:p>
@@ -6076,7 +7750,23 @@
         <w:pStyle w:val="ActivityBullet"/>
       </w:pPr>
       <w:r>
-        <w:t>2026-01-29 14:09:15-0500PM ET enumeration Completed analyzing web services running on port 443/tcp.</w:t>
+        <w:t xml:space="preserve">2026-01-29 14:09:15-0500PM ET </w:t>
+      </w:r>
+      <w:proofErr w:type="gramStart"/>
+      <w:r>
+        <w:t>enumeration</w:t>
+      </w:r>
+      <w:proofErr w:type="gramEnd"/>
+      <w:r>
+        <w:t xml:space="preserve"> Completed analyzing web services running on port 443/</w:t>
+      </w:r>
+      <w:proofErr w:type="spellStart"/>
+      <w:r>
+        <w:t>tcp</w:t>
+      </w:r>
+      <w:proofErr w:type="spellEnd"/>
+      <w:r>
+        <w:t>.</w:t>
       </w:r>
     </w:p>
     <w:p>
@@ -6084,7 +7774,23 @@
         <w:pStyle w:val="ActivityBullet"/>
       </w:pPr>
       <w:r>
-        <w:t>2026-01-29 14:09:15-0500PM ET enumeration Completed analyzing web services running on port 443/tcp.</w:t>
+        <w:t xml:space="preserve">2026-01-29 14:09:15-0500PM ET </w:t>
+      </w:r>
+      <w:proofErr w:type="gramStart"/>
+      <w:r>
+        <w:t>enumeration</w:t>
+      </w:r>
+      <w:proofErr w:type="gramEnd"/>
+      <w:r>
+        <w:t xml:space="preserve"> Completed analyzing web services running on port 443/</w:t>
+      </w:r>
+      <w:proofErr w:type="spellStart"/>
+      <w:r>
+        <w:t>tcp</w:t>
+      </w:r>
+      <w:proofErr w:type="spellEnd"/>
+      <w:r>
+        <w:t>.</w:t>
       </w:r>
     </w:p>
     <w:p>
@@ -6100,7 +7806,23 @@
         <w:pStyle w:val="ActivityBullet"/>
       </w:pPr>
       <w:r>
-        <w:t>2026-01-29 14:09:45-0500PM ET enumeration Enumeration module completed.</w:t>
+        <w:t xml:space="preserve">2026-01-29 14:09:45-0500PM ET </w:t>
+      </w:r>
+      <w:proofErr w:type="gramStart"/>
+      <w:r>
+        <w:t>enumeration</w:t>
+      </w:r>
+      <w:proofErr w:type="gramEnd"/>
+      <w:r>
+        <w:t xml:space="preserve"> </w:t>
+      </w:r>
+      <w:proofErr w:type="spellStart"/>
+      <w:r>
+        <w:t>Enumeration</w:t>
+      </w:r>
+      <w:proofErr w:type="spellEnd"/>
+      <w:r>
+        <w:t xml:space="preserve"> module completed.</w:t>
       </w:r>
     </w:p>
     <w:p>
@@ -6114,7 +7836,35 @@
         <w:rPr>
           <w:lang w:val="fr-FR"/>
         </w:rPr>
-        <w:t>2026-01-29 14:10:06-0500PM ET exploit Launching exploit module.</w:t>
+        <w:t xml:space="preserve">2026-01-29 </w:t>
+      </w:r>
+      <w:proofErr w:type="gramStart"/>
+      <w:r>
+        <w:rPr>
+          <w:lang w:val="fr-FR"/>
+        </w:rPr>
+        <w:t>14:10:</w:t>
+      </w:r>
+      <w:proofErr w:type="gramEnd"/>
+      <w:r>
+        <w:rPr>
+          <w:lang w:val="fr-FR"/>
+        </w:rPr>
+        <w:t xml:space="preserve">06-0500PM ET exploit </w:t>
+      </w:r>
+      <w:proofErr w:type="spellStart"/>
+      <w:r>
+        <w:rPr>
+          <w:lang w:val="fr-FR"/>
+        </w:rPr>
+        <w:t>Launching</w:t>
+      </w:r>
+      <w:proofErr w:type="spellEnd"/>
+      <w:r>
+        <w:rPr>
+          <w:lang w:val="fr-FR"/>
+        </w:rPr>
+        <w:t xml:space="preserve"> exploit module.</w:t>
       </w:r>
     </w:p>
     <w:p>
@@ -6152,7 +7902,35 @@
         <w:rPr>
           <w:lang w:val="fr-FR"/>
         </w:rPr>
-        <w:t>2026-01-29 14:11:49-0500PM ET exploit Completed exploit module.</w:t>
+        <w:t xml:space="preserve">2026-01-29 </w:t>
+      </w:r>
+      <w:proofErr w:type="gramStart"/>
+      <w:r>
+        <w:rPr>
+          <w:lang w:val="fr-FR"/>
+        </w:rPr>
+        <w:t>14:11:</w:t>
+      </w:r>
+      <w:proofErr w:type="gramEnd"/>
+      <w:r>
+        <w:rPr>
+          <w:lang w:val="fr-FR"/>
+        </w:rPr>
+        <w:t xml:space="preserve">49-0500PM ET exploit </w:t>
+      </w:r>
+      <w:proofErr w:type="spellStart"/>
+      <w:r>
+        <w:rPr>
+          <w:lang w:val="fr-FR"/>
+        </w:rPr>
+        <w:t>Completed</w:t>
+      </w:r>
+      <w:proofErr w:type="spellEnd"/>
+      <w:r>
+        <w:rPr>
+          <w:lang w:val="fr-FR"/>
+        </w:rPr>
+        <w:t xml:space="preserve"> exploit module.</w:t>
       </w:r>
     </w:p>
     <w:p>
@@ -6236,7 +8014,51 @@
           <w:szCs w:val="22"/>
           <w14:ligatures w14:val="none"/>
         </w:rPr>
-        <w:t>The following items are the highest priority recommendations to help improve compliance, defensibility and resilience. These items may not be fully inclusive of all discovered deficiencies and reflect OrbitalFire’s expert opinion regarding return on investment.</w:t>
+        <w:t xml:space="preserve">The following items are the </w:t>
+      </w:r>
+      <w:proofErr w:type="gramStart"/>
+      <w:r>
+        <w:rPr>
+          <w:rFonts w:ascii="Corbel" w:eastAsia="Calibri" w:hAnsi="Corbel" w:cs="Arial"/>
+          <w:color w:val="404040"/>
+          <w:kern w:val="0"/>
+          <w:szCs w:val="22"/>
+          <w14:ligatures w14:val="none"/>
+        </w:rPr>
+        <w:t>highest priority</w:t>
+      </w:r>
+      <w:proofErr w:type="gramEnd"/>
+      <w:r>
+        <w:rPr>
+          <w:rFonts w:ascii="Corbel" w:eastAsia="Calibri" w:hAnsi="Corbel" w:cs="Arial"/>
+          <w:color w:val="404040"/>
+          <w:kern w:val="0"/>
+          <w:szCs w:val="22"/>
+          <w14:ligatures w14:val="none"/>
+        </w:rPr>
+        <w:t xml:space="preserve"> recommendations to help improve compliance, defensibility and resilience. These items may not be fully inclusive of all discovered deficiencies and reflect </w:t>
+      </w:r>
+      <w:proofErr w:type="spellStart"/>
+      <w:r>
+        <w:rPr>
+          <w:rFonts w:ascii="Corbel" w:eastAsia="Calibri" w:hAnsi="Corbel" w:cs="Arial"/>
+          <w:color w:val="404040"/>
+          <w:kern w:val="0"/>
+          <w:szCs w:val="22"/>
+          <w14:ligatures w14:val="none"/>
+        </w:rPr>
+        <w:t>OrbitalFire’s</w:t>
+      </w:r>
+      <w:proofErr w:type="spellEnd"/>
+      <w:r>
+        <w:rPr>
+          <w:rFonts w:ascii="Corbel" w:eastAsia="Calibri" w:hAnsi="Corbel" w:cs="Arial"/>
+          <w:color w:val="404040"/>
+          <w:kern w:val="0"/>
+          <w:szCs w:val="22"/>
+          <w14:ligatures w14:val="none"/>
+        </w:rPr>
+        <w:t xml:space="preserve"> expert opinion regarding return on investment.</w:t>
       </w:r>
     </w:p>
     <w:p>
@@ -6319,7 +8141,29 @@
           <w:szCs w:val="22"/>
           <w14:ligatures w14:val="none"/>
         </w:rPr>
-        <w:t xml:space="preserve"> – OrbitalFire can provide complete remediation</w:t>
+        <w:t xml:space="preserve"> – </w:t>
+      </w:r>
+      <w:proofErr w:type="spellStart"/>
+      <w:r>
+        <w:rPr>
+          <w:rFonts w:ascii="Corbel" w:eastAsia="Calibri" w:hAnsi="Corbel" w:cs="Arial"/>
+          <w:color w:val="404040"/>
+          <w:kern w:val="0"/>
+          <w:szCs w:val="22"/>
+          <w14:ligatures w14:val="none"/>
+        </w:rPr>
+        <w:t>OrbitalFire</w:t>
+      </w:r>
+      <w:proofErr w:type="spellEnd"/>
+      <w:r>
+        <w:rPr>
+          <w:rFonts w:ascii="Corbel" w:eastAsia="Calibri" w:hAnsi="Corbel" w:cs="Arial"/>
+          <w:color w:val="404040"/>
+          <w:kern w:val="0"/>
+          <w:szCs w:val="22"/>
+          <w14:ligatures w14:val="none"/>
+        </w:rPr>
+        <w:t xml:space="preserve"> can provide complete remediation</w:t>
       </w:r>
     </w:p>
     <w:p>
@@ -6346,7 +8190,7 @@
           <w14:ligatures w14:val="none"/>
         </w:rPr>
         <w:drawing>
-          <wp:inline distT="0" distB="0" distL="0" distR="0" wp14:anchorId="03962334" wp14:editId="6867675F">
+          <wp:inline distT="0" distB="0" distL="0" distR="0" wp14:anchorId="03962334" wp14:editId="1E64B471">
             <wp:extent cx="152400" cy="152400"/>
             <wp:effectExtent l="0" t="0" r="0" b="0"/>
             <wp:docPr id="2011428596" name="Picture 2011428596" descr="Fire with solid fill"/>
@@ -6411,7 +8255,29 @@
           <w:szCs w:val="22"/>
           <w14:ligatures w14:val="none"/>
         </w:rPr>
-        <w:t xml:space="preserve"> – OrbitalFire can assist with remediation</w:t>
+        <w:t xml:space="preserve"> – </w:t>
+      </w:r>
+      <w:proofErr w:type="spellStart"/>
+      <w:r>
+        <w:rPr>
+          <w:rFonts w:ascii="Corbel" w:eastAsia="Calibri" w:hAnsi="Corbel" w:cs="Arial"/>
+          <w:color w:val="404040"/>
+          <w:kern w:val="0"/>
+          <w:szCs w:val="22"/>
+          <w14:ligatures w14:val="none"/>
+        </w:rPr>
+        <w:t>OrbitalFire</w:t>
+      </w:r>
+      <w:proofErr w:type="spellEnd"/>
+      <w:r>
+        <w:rPr>
+          <w:rFonts w:ascii="Corbel" w:eastAsia="Calibri" w:hAnsi="Corbel" w:cs="Arial"/>
+          <w:color w:val="404040"/>
+          <w:kern w:val="0"/>
+          <w:szCs w:val="22"/>
+          <w14:ligatures w14:val="none"/>
+        </w:rPr>
+        <w:t xml:space="preserve"> can assist with remediation</w:t>
       </w:r>
       <w:bookmarkStart w:id="15" w:name="_Hlk194407007"/>
     </w:p>

</xml_diff>

<commit_message>
Finalized Findings Details and Logistics
</commit_message>
<xml_diff>
--- a/Source_Code/Reports/Sample499/FindingsReportTest.docx
+++ b/Source_Code/Reports/Sample499/FindingsReportTest.docx
@@ -601,7 +601,7 @@
           <w14:ligatures w14:val="none"/>
         </w:rPr>
         <w:drawing>
-          <wp:anchor distT="0" distB="0" distL="114300" distR="114300" simplePos="0" relativeHeight="251662336" behindDoc="0" locked="0" layoutInCell="1" allowOverlap="1" wp14:anchorId="56FF54E8" wp14:editId="6EBEC5F4">
+          <wp:anchor distT="0" distB="0" distL="114300" distR="114300" simplePos="0" relativeHeight="251662336" behindDoc="0" locked="0" layoutInCell="1" allowOverlap="1" wp14:anchorId="56FF54E8" wp14:editId="4C12E510">
             <wp:simplePos x="0" y="0"/>
             <wp:positionH relativeFrom="margin">
               <wp:posOffset>1163955</wp:posOffset>
@@ -3517,26 +3517,27 @@
         </w:rPr>
         <w:t>The Penetration Testing was conducted according to the following:</w:t>
       </w:r>
-      <w:r>
-        <w:rPr>
-          <w:rFonts w:ascii="Corbel" w:eastAsia="Calibri" w:hAnsi="Corbel" w:cs="Arial"/>
-          <w:color w:val="F06023"/>
-          <w:kern w:val="0"/>
-          <w:szCs w:val="22"/>
-          <w14:ligatures w14:val="none"/>
-        </w:rPr>
-        <w:br w:type="page"/>
-      </w:r>
-    </w:p>
-    <w:p>
-      <w:pPr>
-        <w:pStyle w:val="LogisticsBullet"/>
+    </w:p>
+    <w:p>
+      <w:pPr>
+        <w:numPr>
+          <w:ilvl w:val="0"/>
+          <w:numId w:val="2"/>
+        </w:numPr>
+        <w:spacing w:after="0" w:line="259" w:lineRule="auto"/>
+        <w:contextualSpacing/>
+        <w:rPr>
+          <w:rFonts w:ascii="Corbel" w:eastAsia="Calibri" w:hAnsi="Corbel" w:cs="Arial"/>
+          <w:color w:val="404040"/>
+          <w:kern w:val="0"/>
+          <w:szCs w:val="22"/>
+          <w14:ligatures w14:val="none"/>
+        </w:rPr>
       </w:pPr>
       <w:r>
         <w:rPr>
           <w:rFonts w:ascii="Corbel" w:hAnsi="Corbel"/>
         </w:rPr>
-        <w:lastRenderedPageBreak/>
         <w:t xml:space="preserve">Start Date: </w:t>
       </w:r>
       <w:r>
@@ -3549,7 +3550,19 @@
     </w:p>
     <w:p>
       <w:pPr>
-        <w:pStyle w:val="LogisticsBullet"/>
+        <w:numPr>
+          <w:ilvl w:val="0"/>
+          <w:numId w:val="2"/>
+        </w:numPr>
+        <w:spacing w:after="0" w:line="259" w:lineRule="auto"/>
+        <w:contextualSpacing/>
+        <w:rPr>
+          <w:rFonts w:ascii="Corbel" w:eastAsia="Calibri" w:hAnsi="Corbel" w:cs="Arial"/>
+          <w:color w:val="404040"/>
+          <w:kern w:val="0"/>
+          <w:szCs w:val="22"/>
+          <w14:ligatures w14:val="none"/>
+        </w:rPr>
       </w:pPr>
       <w:r>
         <w:rPr>
@@ -3567,7 +3580,19 @@
     </w:p>
     <w:p>
       <w:pPr>
-        <w:pStyle w:val="LogisticsBullet"/>
+        <w:numPr>
+          <w:ilvl w:val="0"/>
+          <w:numId w:val="2"/>
+        </w:numPr>
+        <w:spacing w:after="0" w:line="259" w:lineRule="auto"/>
+        <w:contextualSpacing/>
+        <w:rPr>
+          <w:rFonts w:ascii="Corbel" w:eastAsia="Calibri" w:hAnsi="Corbel" w:cs="Arial"/>
+          <w:color w:val="F06023"/>
+          <w:kern w:val="0"/>
+          <w:szCs w:val="22"/>
+          <w14:ligatures w14:val="none"/>
+        </w:rPr>
       </w:pPr>
       <w:r>
         <w:rPr>
@@ -3581,6 +3606,51 @@
           <w:color w:val="F26522"/>
         </w:rPr>
         <w:t>Reg Harnish</w:t>
+      </w:r>
+    </w:p>
+    <w:p>
+      <w:pPr>
+        <w:spacing w:line="259" w:lineRule="auto"/>
+        <w:rPr>
+          <w:rFonts w:ascii="Corbel" w:eastAsia="Calibri" w:hAnsi="Corbel" w:cs="Arial"/>
+          <w:color w:val="404040"/>
+          <w:kern w:val="0"/>
+          <w:szCs w:val="22"/>
+          <w14:ligatures w14:val="none"/>
+        </w:rPr>
+      </w:pPr>
+      <w:r>
+        <w:rPr>
+          <w:rFonts w:ascii="Corbel" w:eastAsia="Calibri" w:hAnsi="Corbel" w:cs="Arial"/>
+          <w:color w:val="F06023"/>
+          <w:kern w:val="0"/>
+          <w:szCs w:val="22"/>
+          <w:highlight w:val="yellow"/>
+          <w14:ligatures w14:val="none"/>
+        </w:rPr>
+        <w:br/>
+      </w:r>
+    </w:p>
+    <w:p>
+      <w:pPr>
+        <w:spacing w:line="259" w:lineRule="auto"/>
+        <w:rPr>
+          <w:rFonts w:ascii="Corbel" w:eastAsia="Calibri" w:hAnsi="Corbel" w:cs="Arial"/>
+          <w:color w:val="F06023"/>
+          <w:kern w:val="0"/>
+          <w:szCs w:val="22"/>
+          <w14:ligatures w14:val="none"/>
+        </w:rPr>
+      </w:pPr>
+      <w:r>
+        <w:rPr>
+          <w:rFonts w:ascii="Corbel" w:eastAsia="Calibri" w:hAnsi="Corbel" w:cs="Arial"/>
+          <w:color w:val="F06023"/>
+          <w:kern w:val="0"/>
+          <w:szCs w:val="22"/>
+          <w14:ligatures w14:val="none"/>
+        </w:rPr>
+        <w:br w:type="page"/>
       </w:r>
     </w:p>
     <w:p>
@@ -3612,6 +3682,7 @@
           <w:szCs w:val="32"/>
           <w14:ligatures w14:val="none"/>
         </w:rPr>
+        <w:lastRenderedPageBreak/>
         <w:t>Narrative</w:t>
       </w:r>
       <w:bookmarkEnd w:id="4"/>
@@ -4625,21 +4696,16 @@
         <w:rPr>
           <w:rFonts w:ascii="Corbel" w:hAnsi="Corbel"/>
         </w:rPr>
-        <w:t xml:space="preserve"> - During testing, </w:t>
-      </w:r>
-      <w:proofErr w:type="spellStart"/>
+        <w:t xml:space="preserve"> - During testing, OrbitalFire identified a potential subdomain takeover vulnerability affecting one or more domains owned by [CUSTOMER NAME]. This issue typically results from misconfigured DNS records that reference unclaimed or deprovisioned third-party services, allowing an attacker to register the external resource and gain control of the associated subdomain. If exploited, an attacker could host malicious content, impersonate the organization, conduct phishing campaigns, or collect user data, posing a significant risk to brand reputation, user trust, and overall security posture.</w:t>
+      </w:r>
+    </w:p>
+    <w:p>
       <w:r>
         <w:rPr>
           <w:rFonts w:ascii="Corbel" w:hAnsi="Corbel"/>
-        </w:rPr>
-        <w:t>OrbitalFire</w:t>
-      </w:r>
-      <w:proofErr w:type="spellEnd"/>
-      <w:r>
-        <w:rPr>
-          <w:rFonts w:ascii="Corbel" w:hAnsi="Corbel"/>
-        </w:rPr>
-        <w:t xml:space="preserve"> identified a potential subdomain takeover vulnerability affecting one or more domains owned by [CUSTOMER NAME]. This issue typically results from misconfigured DNS records that reference unclaimed or deprovisioned third-party services, allowing an attacker to register the external resource and gain control of the associated subdomain. If exploited, an attacker could host malicious content, impersonate the organization, conduct phishing campaigns, or collect user data, posing a significant risk to brand reputation, user trust, and overall security posture.</w:t>
+          <w:i/>
+        </w:rPr>
+        <w:t>Affected Nodes:</w:t>
       </w:r>
     </w:p>
     <w:p>
@@ -4648,7 +4714,7 @@
           <w:noProof/>
         </w:rPr>
         <w:drawing>
-          <wp:inline distT="0" distB="0" distL="0" distR="0" wp14:anchorId="7A807E4B" wp14:editId="2E79F0B8">
+          <wp:inline distT="0" distB="0" distL="0" distR="0" wp14:anchorId="14A053E7" wp14:editId="65BF8D4C">
             <wp:extent cx="5303520" cy="606845"/>
             <wp:effectExtent l="0" t="0" r="0" b="0"/>
             <wp:docPr id="2011428601" name="Picture 2011428601"/>
@@ -4699,7 +4765,7 @@
           <w:noProof/>
         </w:rPr>
         <w:drawing>
-          <wp:inline distT="0" distB="0" distL="0" distR="0" wp14:anchorId="171484DC" wp14:editId="0939A060">
+          <wp:inline distT="0" distB="0" distL="0" distR="0" wp14:anchorId="009C8849" wp14:editId="10250CAC">
             <wp:extent cx="5303520" cy="391160"/>
             <wp:effectExtent l="0" t="0" r="0" b="0"/>
             <wp:docPr id="2011428602" name="Picture 2011428602"/>
@@ -4735,7 +4801,6 @@
         </w:drawing>
       </w:r>
     </w:p>
-    <w:p/>
     <w:p>
       <w:pPr>
         <w:keepNext/>
@@ -4786,35 +4851,16 @@
         <w:rPr>
           <w:rFonts w:ascii="Corbel" w:hAnsi="Corbel"/>
         </w:rPr>
-        <w:t xml:space="preserve"> - During testing, </w:t>
-      </w:r>
-      <w:proofErr w:type="spellStart"/>
+        <w:t xml:space="preserve"> - During testing, OrbitalFire identified that [CUSTOMER NAME] has a misconfigured DMARC (Domain-based Message Authentication, Reporting, and Conformance) record for one or more of their domain(s). DMARC is critical for verifying the authenticity of emails sent from the organization, serving as a vital barrier against email spoofing and phishing attacks. Without proper configuration, DMARC fails to instruct receiving mail servers on how to treat email messages from the organization's domain, thereby increasing vulnerability to attack.</w:t>
+      </w:r>
+    </w:p>
+    <w:p>
       <w:r>
         <w:rPr>
           <w:rFonts w:ascii="Corbel" w:hAnsi="Corbel"/>
-        </w:rPr>
-        <w:t>OrbitalFire</w:t>
-      </w:r>
-      <w:proofErr w:type="spellEnd"/>
-      <w:r>
-        <w:rPr>
-          <w:rFonts w:ascii="Corbel" w:hAnsi="Corbel"/>
-        </w:rPr>
-        <w:t xml:space="preserve"> identified that [CUSTOMER NAME] has a misconfigured DMARC (Domain-based Message Authentication, Reporting, and Conformance) record for one or more of their </w:t>
-      </w:r>
-      <w:proofErr w:type="gramStart"/>
-      <w:r>
-        <w:rPr>
-          <w:rFonts w:ascii="Corbel" w:hAnsi="Corbel"/>
-        </w:rPr>
-        <w:t>domain</w:t>
-      </w:r>
-      <w:proofErr w:type="gramEnd"/>
-      <w:r>
-        <w:rPr>
-          <w:rFonts w:ascii="Corbel" w:hAnsi="Corbel"/>
-        </w:rPr>
-        <w:t>(s). DMARC is critical for verifying the authenticity of emails sent from the organization, serving as a vital barrier against email spoofing and phishing attacks. Without proper configuration, DMARC fails to instruct receiving mail servers on how to treat email messages from the organization's domain, thereby increasing vulnerability to attack.</w:t>
+          <w:i/>
+        </w:rPr>
+        <w:t>Affected Nodes:</w:t>
       </w:r>
     </w:p>
     <w:p>
@@ -4823,7 +4869,7 @@
           <w:noProof/>
         </w:rPr>
         <w:drawing>
-          <wp:inline distT="0" distB="0" distL="0" distR="0" wp14:anchorId="02CA3C0D" wp14:editId="236E628A">
+          <wp:inline distT="0" distB="0" distL="0" distR="0" wp14:anchorId="7863E625" wp14:editId="2B80FF9C">
             <wp:extent cx="5303520" cy="606845"/>
             <wp:effectExtent l="0" t="0" r="0" b="0"/>
             <wp:docPr id="2011428603" name="Picture 2011428603"/>
@@ -4865,6 +4911,7 @@
           <w:rFonts w:ascii="Corbel" w:hAnsi="Corbel"/>
           <w:i/>
         </w:rPr>
+        <w:lastRenderedPageBreak/>
         <w:t>Evidence:</w:t>
       </w:r>
     </w:p>
@@ -4873,9 +4920,8 @@
         <w:rPr>
           <w:noProof/>
         </w:rPr>
-        <w:lastRenderedPageBreak/>
         <w:drawing>
-          <wp:inline distT="0" distB="0" distL="0" distR="0" wp14:anchorId="5CC71B3B" wp14:editId="5D6C81C5">
+          <wp:inline distT="0" distB="0" distL="0" distR="0" wp14:anchorId="0EDABD98" wp14:editId="78A8335A">
             <wp:extent cx="5303520" cy="289560"/>
             <wp:effectExtent l="0" t="0" r="0" b="0"/>
             <wp:docPr id="2011428604" name="Picture 2011428604"/>
@@ -4911,7 +4957,6 @@
         </w:drawing>
       </w:r>
     </w:p>
-    <w:p/>
     <w:p>
       <w:r>
         <w:rPr>
@@ -4930,21 +4975,16 @@
         <w:rPr>
           <w:rFonts w:ascii="Corbel" w:hAnsi="Corbel"/>
         </w:rPr>
-        <w:t xml:space="preserve"> - During testing, </w:t>
-      </w:r>
-      <w:proofErr w:type="spellStart"/>
+        <w:t xml:space="preserve"> - During testing, OrbitalFire identified that remote administration services, including SSH, were exposed to the public internet. This exposure is often the result of misconfiguration or insufficient access controls, which significantly increase the attack surface. Publicly accessible SSH services are susceptible to brute-force and password-guessing attacks, which may lead to unauthorized system access. Additionally, newly disclosed vulnerabilities, including zero-day exploits, could be leveraged by threat actors to further compromise exposed systems.</w:t>
+      </w:r>
+    </w:p>
+    <w:p>
       <w:r>
         <w:rPr>
           <w:rFonts w:ascii="Corbel" w:hAnsi="Corbel"/>
-        </w:rPr>
-        <w:t>OrbitalFire</w:t>
-      </w:r>
-      <w:proofErr w:type="spellEnd"/>
-      <w:r>
-        <w:rPr>
-          <w:rFonts w:ascii="Corbel" w:hAnsi="Corbel"/>
-        </w:rPr>
-        <w:t xml:space="preserve"> identified that remote administration services, including SSH, were exposed to the public internet. This exposure is often the result of misconfiguration or insufficient access controls, which significantly increase the attack surface. Publicly accessible SSH services are susceptible to brute-force and password-guessing attacks, which may lead to unauthorized system access. Additionally, newly disclosed vulnerabilities, including zero-day exploits, could be leveraged by threat actors to further compromise exposed systems.</w:t>
+          <w:i/>
+        </w:rPr>
+        <w:t>Affected Nodes:</w:t>
       </w:r>
     </w:p>
     <w:p>
@@ -4953,7 +4993,7 @@
           <w:noProof/>
         </w:rPr>
         <w:drawing>
-          <wp:inline distT="0" distB="0" distL="0" distR="0" wp14:anchorId="26BB4C84" wp14:editId="7A7337A5">
+          <wp:inline distT="0" distB="0" distL="0" distR="0" wp14:anchorId="67C6FA4E" wp14:editId="577D70DB">
             <wp:extent cx="5303520" cy="775129"/>
             <wp:effectExtent l="0" t="0" r="0" b="0"/>
             <wp:docPr id="2011428605" name="Picture 2011428605"/>
@@ -5004,7 +5044,7 @@
           <w:noProof/>
         </w:rPr>
         <w:drawing>
-          <wp:inline distT="0" distB="0" distL="0" distR="0" wp14:anchorId="312AB106" wp14:editId="4DD6053A">
+          <wp:inline distT="0" distB="0" distL="0" distR="0" wp14:anchorId="025F5854" wp14:editId="1ECC4F08">
             <wp:extent cx="5303520" cy="386080"/>
             <wp:effectExtent l="0" t="0" r="0" b="0"/>
             <wp:docPr id="2011428606" name="Picture 2011428606"/>
@@ -5040,7 +5080,6 @@
         </w:drawing>
       </w:r>
     </w:p>
-    <w:p/>
     <w:p>
       <w:pPr>
         <w:keepNext/>
@@ -8073,7 +8112,7 @@
           <w14:ligatures w14:val="none"/>
         </w:rPr>
         <w:drawing>
-          <wp:inline distT="0" distB="0" distL="0" distR="0" wp14:anchorId="03962334" wp14:editId="19FBDFA0">
+          <wp:inline distT="0" distB="0" distL="0" distR="0" wp14:anchorId="03962334" wp14:editId="6AD6C365">
             <wp:extent cx="152400" cy="152400"/>
             <wp:effectExtent l="0" t="0" r="0" b="0"/>
             <wp:docPr id="2011428596" name="Picture 2011428596" descr="Fire with solid fill"/>
@@ -9085,21 +9124,18 @@
   <w:abstractNum w:abstractNumId="4" w15:restartNumberingAfterBreak="0">
     <w:nsid w:val="0FC10F07"/>
     <w:multiLevelType w:val="hybridMultilevel"/>
-    <w:tmpl w:val="EE12B9E4"/>
-    <w:lvl w:ilvl="0" w:tplc="D74E6C36">
+    <w:tmpl w:val="7570D2E4"/>
+    <w:lvl w:ilvl="0" w:tplc="365AA270">
       <w:start w:val="1"/>
       <w:numFmt w:val="bullet"/>
-      <w:pStyle w:val="LogisticsBullet"/>
       <w:lvlText w:val="o"/>
       <w:lvlJc w:val="left"/>
       <w:pPr>
         <w:ind w:left="720" w:hanging="360"/>
       </w:pPr>
       <w:rPr>
-        <w:rFonts w:ascii="Courier New" w:hAnsi="Courier New" w:hint="default"/>
+        <w:rFonts w:ascii="Courier New" w:hAnsi="Courier New" w:cs="Courier New" w:hint="default"/>
         <w:color w:val="404040" w:themeColor="text1" w:themeTint="BF"/>
-        <w:sz w:val="24"/>
-        <w:szCs w:val="24"/>
       </w:rPr>
     </w:lvl>
     <w:lvl w:ilvl="1" w:tplc="04090003" w:tentative="1">
@@ -12282,26 +12318,6 @@
       </w:numPr>
       <w:contextualSpacing/>
     </w:pPr>
-  </w:style>
-  <w:style w:type="paragraph" w:customStyle="1" w:styleId="LogisticsBullet">
-    <w:name w:val="Logistics Bullet"/>
-    <w:basedOn w:val="Normal"/>
-    <w:qFormat/>
-    <w:rsid w:val="00961369"/>
-    <w:pPr>
-      <w:numPr>
-        <w:numId w:val="2"/>
-      </w:numPr>
-      <w:spacing w:after="0" w:line="240" w:lineRule="auto"/>
-      <w:contextualSpacing/>
-    </w:pPr>
-    <w:rPr>
-      <w:rFonts w:ascii="Courier New" w:eastAsia="Calibri" w:hAnsi="Courier New" w:cs="Courier New"/>
-      <w:color w:val="404040" w:themeColor="text1" w:themeTint="BF"/>
-      <w:kern w:val="0"/>
-      <w:szCs w:val="22"/>
-      <w14:ligatures w14:val="none"/>
-    </w:rPr>
   </w:style>
 </w:styles>
 </file>

</xml_diff>

<commit_message>
Made front end changes Logistics and added Customer Name
</commit_message>
<xml_diff>
--- a/Source_Code/Reports/Sample499/FindingsReportTest.docx
+++ b/Source_Code/Reports/Sample499/FindingsReportTest.docx
@@ -538,10 +538,9 @@
           <w:kern w:val="0"/>
           <w:sz w:val="32"/>
           <w:szCs w:val="32"/>
-          <w:highlight w:val="yellow"/>
-          <w14:ligatures w14:val="none"/>
-        </w:rPr>
-        <w:t>DEMO</w:t>
+          <w14:ligatures w14:val="none"/>
+        </w:rPr>
+        <w:t>[customer name]</w:t>
       </w:r>
       <w:r>
         <w:rPr>
@@ -601,7 +600,7 @@
           <w14:ligatures w14:val="none"/>
         </w:rPr>
         <w:drawing>
-          <wp:anchor distT="0" distB="0" distL="114300" distR="114300" simplePos="0" relativeHeight="251662336" behindDoc="0" locked="0" layoutInCell="1" allowOverlap="1" wp14:anchorId="56FF54E8" wp14:editId="4C12E510">
+          <wp:anchor distT="0" distB="0" distL="114300" distR="114300" simplePos="0" relativeHeight="251662336" behindDoc="0" locked="0" layoutInCell="1" allowOverlap="1" wp14:anchorId="56FF54E8" wp14:editId="6BD2A74D">
             <wp:simplePos x="0" y="0"/>
             <wp:positionH relativeFrom="margin">
               <wp:posOffset>1163955</wp:posOffset>
@@ -4696,7 +4695,21 @@
         <w:rPr>
           <w:rFonts w:ascii="Corbel" w:hAnsi="Corbel"/>
         </w:rPr>
-        <w:t xml:space="preserve"> - During testing, OrbitalFire identified a potential subdomain takeover vulnerability affecting one or more domains owned by [CUSTOMER NAME]. This issue typically results from misconfigured DNS records that reference unclaimed or deprovisioned third-party services, allowing an attacker to register the external resource and gain control of the associated subdomain. If exploited, an attacker could host malicious content, impersonate the organization, conduct phishing campaigns, or collect user data, posing a significant risk to brand reputation, user trust, and overall security posture.</w:t>
+        <w:t xml:space="preserve"> - During testing, </w:t>
+      </w:r>
+      <w:proofErr w:type="spellStart"/>
+      <w:r>
+        <w:rPr>
+          <w:rFonts w:ascii="Corbel" w:hAnsi="Corbel"/>
+        </w:rPr>
+        <w:t>OrbitalFire</w:t>
+      </w:r>
+      <w:proofErr w:type="spellEnd"/>
+      <w:r>
+        <w:rPr>
+          <w:rFonts w:ascii="Corbel" w:hAnsi="Corbel"/>
+        </w:rPr>
+        <w:t xml:space="preserve"> identified a potential subdomain takeover vulnerability affecting one or more domains owned by [CUSTOMER NAME]. This issue typically results from misconfigured DNS records that reference unclaimed or deprovisioned third-party services, allowing an attacker to register the external resource and gain control of the associated subdomain. If exploited, an attacker could host malicious content, impersonate the organization, conduct phishing campaigns, or collect user data, posing a significant risk to brand reputation, user trust, and overall security posture.</w:t>
       </w:r>
     </w:p>
     <w:p>
@@ -4851,7 +4864,35 @@
         <w:rPr>
           <w:rFonts w:ascii="Corbel" w:hAnsi="Corbel"/>
         </w:rPr>
-        <w:t xml:space="preserve"> - During testing, OrbitalFire identified that [CUSTOMER NAME] has a misconfigured DMARC (Domain-based Message Authentication, Reporting, and Conformance) record for one or more of their domain(s). DMARC is critical for verifying the authenticity of emails sent from the organization, serving as a vital barrier against email spoofing and phishing attacks. Without proper configuration, DMARC fails to instruct receiving mail servers on how to treat email messages from the organization's domain, thereby increasing vulnerability to attack.</w:t>
+        <w:t xml:space="preserve"> - During testing, </w:t>
+      </w:r>
+      <w:proofErr w:type="spellStart"/>
+      <w:r>
+        <w:rPr>
+          <w:rFonts w:ascii="Corbel" w:hAnsi="Corbel"/>
+        </w:rPr>
+        <w:t>OrbitalFire</w:t>
+      </w:r>
+      <w:proofErr w:type="spellEnd"/>
+      <w:r>
+        <w:rPr>
+          <w:rFonts w:ascii="Corbel" w:hAnsi="Corbel"/>
+        </w:rPr>
+        <w:t xml:space="preserve"> identified that [CUSTOMER NAME] has a misconfigured DMARC (Domain-based Message Authentication, Reporting, and Conformance) record for one or more of their </w:t>
+      </w:r>
+      <w:proofErr w:type="gramStart"/>
+      <w:r>
+        <w:rPr>
+          <w:rFonts w:ascii="Corbel" w:hAnsi="Corbel"/>
+        </w:rPr>
+        <w:t>domain</w:t>
+      </w:r>
+      <w:proofErr w:type="gramEnd"/>
+      <w:r>
+        <w:rPr>
+          <w:rFonts w:ascii="Corbel" w:hAnsi="Corbel"/>
+        </w:rPr>
+        <w:t>(s). DMARC is critical for verifying the authenticity of emails sent from the organization, serving as a vital barrier against email spoofing and phishing attacks. Without proper configuration, DMARC fails to instruct receiving mail servers on how to treat email messages from the organization's domain, thereby increasing vulnerability to attack.</w:t>
       </w:r>
     </w:p>
     <w:p>
@@ -4975,7 +5016,21 @@
         <w:rPr>
           <w:rFonts w:ascii="Corbel" w:hAnsi="Corbel"/>
         </w:rPr>
-        <w:t xml:space="preserve"> - During testing, OrbitalFire identified that remote administration services, including SSH, were exposed to the public internet. This exposure is often the result of misconfiguration or insufficient access controls, which significantly increase the attack surface. Publicly accessible SSH services are susceptible to brute-force and password-guessing attacks, which may lead to unauthorized system access. Additionally, newly disclosed vulnerabilities, including zero-day exploits, could be leveraged by threat actors to further compromise exposed systems.</w:t>
+        <w:t xml:space="preserve"> - During testing, </w:t>
+      </w:r>
+      <w:proofErr w:type="spellStart"/>
+      <w:r>
+        <w:rPr>
+          <w:rFonts w:ascii="Corbel" w:hAnsi="Corbel"/>
+        </w:rPr>
+        <w:t>OrbitalFire</w:t>
+      </w:r>
+      <w:proofErr w:type="spellEnd"/>
+      <w:r>
+        <w:rPr>
+          <w:rFonts w:ascii="Corbel" w:hAnsi="Corbel"/>
+        </w:rPr>
+        <w:t xml:space="preserve"> identified that remote administration services, including SSH, were exposed to the public internet. This exposure is often the result of misconfiguration or insufficient access controls, which significantly increase the attack surface. Publicly accessible SSH services are susceptible to brute-force and password-guessing attacks, which may lead to unauthorized system access. Additionally, newly disclosed vulnerabilities, including zero-day exploits, could be leveraged by threat actors to further compromise exposed systems.</w:t>
       </w:r>
     </w:p>
     <w:p>
@@ -8112,7 +8167,7 @@
           <w14:ligatures w14:val="none"/>
         </w:rPr>
         <w:drawing>
-          <wp:inline distT="0" distB="0" distL="0" distR="0" wp14:anchorId="03962334" wp14:editId="6AD6C365">
+          <wp:inline distT="0" distB="0" distL="0" distR="0" wp14:anchorId="03962334" wp14:editId="188CC79E">
             <wp:extent cx="152400" cy="152400"/>
             <wp:effectExtent l="0" t="0" r="0" b="0"/>
             <wp:docPr id="2011428596" name="Picture 2011428596" descr="Fire with solid fill"/>

</xml_diff>

<commit_message>
Completed IP Address and started Customer Name
</commit_message>
<xml_diff>
--- a/Source_Code/Reports/Sample499/FindingsReportTest.docx
+++ b/Source_Code/Reports/Sample499/FindingsReportTest.docx
@@ -600,7 +600,7 @@
           <w14:ligatures w14:val="none"/>
         </w:rPr>
         <w:drawing>
-          <wp:anchor distT="0" distB="0" distL="114300" distR="114300" simplePos="0" relativeHeight="251662336" behindDoc="0" locked="0" layoutInCell="1" allowOverlap="1" wp14:anchorId="56FF54E8" wp14:editId="6BD2A74D">
+          <wp:anchor distT="0" distB="0" distL="114300" distR="114300" simplePos="0" relativeHeight="251662336" behindDoc="0" locked="0" layoutInCell="1" allowOverlap="1" wp14:anchorId="56FF54E8" wp14:editId="35BE91F2">
             <wp:simplePos x="0" y="0"/>
             <wp:positionH relativeFrom="margin">
               <wp:posOffset>1163955</wp:posOffset>
@@ -2902,6 +2902,17 @@
     </w:p>
     <w:p>
       <w:pPr>
+        <w:pStyle w:val="IP"/>
+      </w:pPr>
+      <w:r>
+        <w:rPr>
+          <w:rFonts w:ascii="Corbel" w:hAnsi="Corbel"/>
+        </w:rPr>
+        <w:t>107.180.245.182</w:t>
+      </w:r>
+    </w:p>
+    <w:p>
+      <w:pPr>
         <w:numPr>
           <w:ilvl w:val="0"/>
           <w:numId w:val="7"/>
@@ -2926,35 +2937,6 @@
           <w:docGrid w:linePitch="360"/>
         </w:sectPr>
       </w:pPr>
-    </w:p>
-    <w:p>
-      <w:pPr>
-        <w:numPr>
-          <w:ilvl w:val="0"/>
-          <w:numId w:val="7"/>
-        </w:numPr>
-        <w:spacing w:line="259" w:lineRule="auto"/>
-        <w:contextualSpacing/>
-        <w:rPr>
-          <w:rFonts w:ascii="Corbel" w:eastAsia="Calibri" w:hAnsi="Corbel" w:cs="Arial"/>
-          <w:color w:val="404040"/>
-          <w:kern w:val="0"/>
-          <w:szCs w:val="22"/>
-          <w:highlight w:val="yellow"/>
-          <w14:ligatures w14:val="none"/>
-        </w:rPr>
-      </w:pPr>
-      <w:r>
-        <w:rPr>
-          <w:rFonts w:ascii="Corbel" w:eastAsia="Calibri" w:hAnsi="Corbel" w:cs="Arial"/>
-          <w:color w:val="404040"/>
-          <w:kern w:val="0"/>
-          <w:szCs w:val="22"/>
-          <w:highlight w:val="yellow"/>
-          <w14:ligatures w14:val="none"/>
-        </w:rPr>
-        <w:t>192.168.148.0/24</w:t>
-      </w:r>
     </w:p>
     <w:p>
       <w:pPr>
@@ -4695,21 +4677,7 @@
         <w:rPr>
           <w:rFonts w:ascii="Corbel" w:hAnsi="Corbel"/>
         </w:rPr>
-        <w:t xml:space="preserve"> - During testing, </w:t>
-      </w:r>
-      <w:proofErr w:type="spellStart"/>
-      <w:r>
-        <w:rPr>
-          <w:rFonts w:ascii="Corbel" w:hAnsi="Corbel"/>
-        </w:rPr>
-        <w:t>OrbitalFire</w:t>
-      </w:r>
-      <w:proofErr w:type="spellEnd"/>
-      <w:r>
-        <w:rPr>
-          <w:rFonts w:ascii="Corbel" w:hAnsi="Corbel"/>
-        </w:rPr>
-        <w:t xml:space="preserve"> identified a potential subdomain takeover vulnerability affecting one or more domains owned by [CUSTOMER NAME]. This issue typically results from misconfigured DNS records that reference unclaimed or deprovisioned third-party services, allowing an attacker to register the external resource and gain control of the associated subdomain. If exploited, an attacker could host malicious content, impersonate the organization, conduct phishing campaigns, or collect user data, posing a significant risk to brand reputation, user trust, and overall security posture.</w:t>
+        <w:t xml:space="preserve"> - During testing, OrbitalFire identified a potential subdomain takeover vulnerability affecting one or more domains owned by [CUSTOMER NAME]. This issue typically results from misconfigured DNS records that reference unclaimed or deprovisioned third-party services, allowing an attacker to register the external resource and gain control of the associated subdomain. If exploited, an attacker could host malicious content, impersonate the organization, conduct phishing campaigns, or collect user data, posing a significant risk to brand reputation, user trust, and overall security posture.</w:t>
       </w:r>
     </w:p>
     <w:p>
@@ -4727,7 +4695,7 @@
           <w:noProof/>
         </w:rPr>
         <w:drawing>
-          <wp:inline distT="0" distB="0" distL="0" distR="0" wp14:anchorId="14A053E7" wp14:editId="65BF8D4C">
+          <wp:inline distT="0" distB="0" distL="0" distR="0" wp14:anchorId="714AE4FF" wp14:editId="613FFC3A">
             <wp:extent cx="5303520" cy="606845"/>
             <wp:effectExtent l="0" t="0" r="0" b="0"/>
             <wp:docPr id="2011428601" name="Picture 2011428601"/>
@@ -4778,7 +4746,7 @@
           <w:noProof/>
         </w:rPr>
         <w:drawing>
-          <wp:inline distT="0" distB="0" distL="0" distR="0" wp14:anchorId="009C8849" wp14:editId="10250CAC">
+          <wp:inline distT="0" distB="0" distL="0" distR="0" wp14:anchorId="6EBC24FE" wp14:editId="42E42201">
             <wp:extent cx="5303520" cy="391160"/>
             <wp:effectExtent l="0" t="0" r="0" b="0"/>
             <wp:docPr id="2011428602" name="Picture 2011428602"/>
@@ -4864,35 +4832,7 @@
         <w:rPr>
           <w:rFonts w:ascii="Corbel" w:hAnsi="Corbel"/>
         </w:rPr>
-        <w:t xml:space="preserve"> - During testing, </w:t>
-      </w:r>
-      <w:proofErr w:type="spellStart"/>
-      <w:r>
-        <w:rPr>
-          <w:rFonts w:ascii="Corbel" w:hAnsi="Corbel"/>
-        </w:rPr>
-        <w:t>OrbitalFire</w:t>
-      </w:r>
-      <w:proofErr w:type="spellEnd"/>
-      <w:r>
-        <w:rPr>
-          <w:rFonts w:ascii="Corbel" w:hAnsi="Corbel"/>
-        </w:rPr>
-        <w:t xml:space="preserve"> identified that [CUSTOMER NAME] has a misconfigured DMARC (Domain-based Message Authentication, Reporting, and Conformance) record for one or more of their </w:t>
-      </w:r>
-      <w:proofErr w:type="gramStart"/>
-      <w:r>
-        <w:rPr>
-          <w:rFonts w:ascii="Corbel" w:hAnsi="Corbel"/>
-        </w:rPr>
-        <w:t>domain</w:t>
-      </w:r>
-      <w:proofErr w:type="gramEnd"/>
-      <w:r>
-        <w:rPr>
-          <w:rFonts w:ascii="Corbel" w:hAnsi="Corbel"/>
-        </w:rPr>
-        <w:t>(s). DMARC is critical for verifying the authenticity of emails sent from the organization, serving as a vital barrier against email spoofing and phishing attacks. Without proper configuration, DMARC fails to instruct receiving mail servers on how to treat email messages from the organization's domain, thereby increasing vulnerability to attack.</w:t>
+        <w:t xml:space="preserve"> - During testing, OrbitalFire identified that [CUSTOMER NAME] has a misconfigured DMARC (Domain-based Message Authentication, Reporting, and Conformance) record for one or more of their domain(s). DMARC is critical for verifying the authenticity of emails sent from the organization, serving as a vital barrier against email spoofing and phishing attacks. Without proper configuration, DMARC fails to instruct receiving mail servers on how to treat email messages from the organization's domain, thereby increasing vulnerability to attack.</w:t>
       </w:r>
     </w:p>
     <w:p>
@@ -4910,7 +4850,7 @@
           <w:noProof/>
         </w:rPr>
         <w:drawing>
-          <wp:inline distT="0" distB="0" distL="0" distR="0" wp14:anchorId="7863E625" wp14:editId="2B80FF9C">
+          <wp:inline distT="0" distB="0" distL="0" distR="0" wp14:anchorId="44F95269" wp14:editId="2BDB5C04">
             <wp:extent cx="5303520" cy="606845"/>
             <wp:effectExtent l="0" t="0" r="0" b="0"/>
             <wp:docPr id="2011428603" name="Picture 2011428603"/>
@@ -4962,7 +4902,7 @@
           <w:noProof/>
         </w:rPr>
         <w:drawing>
-          <wp:inline distT="0" distB="0" distL="0" distR="0" wp14:anchorId="0EDABD98" wp14:editId="78A8335A">
+          <wp:inline distT="0" distB="0" distL="0" distR="0" wp14:anchorId="1965BF13" wp14:editId="6F600987">
             <wp:extent cx="5303520" cy="289560"/>
             <wp:effectExtent l="0" t="0" r="0" b="0"/>
             <wp:docPr id="2011428604" name="Picture 2011428604"/>
@@ -5016,21 +4956,7 @@
         <w:rPr>
           <w:rFonts w:ascii="Corbel" w:hAnsi="Corbel"/>
         </w:rPr>
-        <w:t xml:space="preserve"> - During testing, </w:t>
-      </w:r>
-      <w:proofErr w:type="spellStart"/>
-      <w:r>
-        <w:rPr>
-          <w:rFonts w:ascii="Corbel" w:hAnsi="Corbel"/>
-        </w:rPr>
-        <w:t>OrbitalFire</w:t>
-      </w:r>
-      <w:proofErr w:type="spellEnd"/>
-      <w:r>
-        <w:rPr>
-          <w:rFonts w:ascii="Corbel" w:hAnsi="Corbel"/>
-        </w:rPr>
-        <w:t xml:space="preserve"> identified that remote administration services, including SSH, were exposed to the public internet. This exposure is often the result of misconfiguration or insufficient access controls, which significantly increase the attack surface. Publicly accessible SSH services are susceptible to brute-force and password-guessing attacks, which may lead to unauthorized system access. Additionally, newly disclosed vulnerabilities, including zero-day exploits, could be leveraged by threat actors to further compromise exposed systems.</w:t>
+        <w:t xml:space="preserve"> - During testing, OrbitalFire identified that remote administration services, including SSH, were exposed to the public internet. This exposure is often the result of misconfiguration or insufficient access controls, which significantly increase the attack surface. Publicly accessible SSH services are susceptible to brute-force and password-guessing attacks, which may lead to unauthorized system access. Additionally, newly disclosed vulnerabilities, including zero-day exploits, could be leveraged by threat actors to further compromise exposed systems.</w:t>
       </w:r>
     </w:p>
     <w:p>
@@ -5048,7 +4974,7 @@
           <w:noProof/>
         </w:rPr>
         <w:drawing>
-          <wp:inline distT="0" distB="0" distL="0" distR="0" wp14:anchorId="67C6FA4E" wp14:editId="577D70DB">
+          <wp:inline distT="0" distB="0" distL="0" distR="0" wp14:anchorId="525A60C6" wp14:editId="703F78F3">
             <wp:extent cx="5303520" cy="775129"/>
             <wp:effectExtent l="0" t="0" r="0" b="0"/>
             <wp:docPr id="2011428605" name="Picture 2011428605"/>
@@ -5099,7 +5025,7 @@
           <w:noProof/>
         </w:rPr>
         <w:drawing>
-          <wp:inline distT="0" distB="0" distL="0" distR="0" wp14:anchorId="025F5854" wp14:editId="1ECC4F08">
+          <wp:inline distT="0" distB="0" distL="0" distR="0" wp14:anchorId="4E0FE721" wp14:editId="5322C9B5">
             <wp:extent cx="5303520" cy="386080"/>
             <wp:effectExtent l="0" t="0" r="0" b="0"/>
             <wp:docPr id="2011428606" name="Picture 2011428606"/>
@@ -8167,7 +8093,7 @@
           <w14:ligatures w14:val="none"/>
         </w:rPr>
         <w:drawing>
-          <wp:inline distT="0" distB="0" distL="0" distR="0" wp14:anchorId="03962334" wp14:editId="188CC79E">
+          <wp:inline distT="0" distB="0" distL="0" distR="0" wp14:anchorId="03962334" wp14:editId="184BF9E5">
             <wp:extent cx="152400" cy="152400"/>
             <wp:effectExtent l="0" t="0" r="0" b="0"/>
             <wp:docPr id="2011428596" name="Picture 2011428596" descr="Fire with solid fill"/>
@@ -10500,18 +10426,21 @@
   <w:abstractNum w:abstractNumId="16" w15:restartNumberingAfterBreak="0">
     <w:nsid w:val="70B10B5F"/>
     <w:multiLevelType w:val="hybridMultilevel"/>
-    <w:tmpl w:val="828E0802"/>
-    <w:lvl w:ilvl="0" w:tplc="8CF86D0E">
+    <w:tmpl w:val="974A974A"/>
+    <w:lvl w:ilvl="0" w:tplc="175C89D4">
       <w:start w:val="1"/>
       <w:numFmt w:val="bullet"/>
+      <w:pStyle w:val="IP"/>
       <w:lvlText w:val="o"/>
       <w:lvlJc w:val="left"/>
       <w:pPr>
         <w:ind w:left="720" w:hanging="360"/>
       </w:pPr>
       <w:rPr>
-        <w:rFonts w:ascii="Courier New" w:hAnsi="Courier New" w:cs="Courier New" w:hint="default"/>
+        <w:rFonts w:ascii="Courier New" w:hAnsi="Courier New" w:hint="default"/>
         <w:color w:val="404040" w:themeColor="text1" w:themeTint="BF"/>
+        <w:sz w:val="24"/>
+        <w:szCs w:val="24"/>
       </w:rPr>
     </w:lvl>
     <w:lvl w:ilvl="1" w:tplc="04090003" w:tentative="1">
@@ -11721,7 +11650,7 @@
   <w:style w:type="paragraph" w:default="1" w:styleId="Normal">
     <w:name w:val="Normal"/>
     <w:qFormat/>
-    <w:rsid w:val="00647693"/>
+    <w:rsid w:val="0055075A"/>
   </w:style>
   <w:style w:type="paragraph" w:styleId="Heading1">
     <w:name w:val="heading 1"/>
@@ -12373,6 +12302,26 @@
       </w:numPr>
       <w:contextualSpacing/>
     </w:pPr>
+  </w:style>
+  <w:style w:type="paragraph" w:customStyle="1" w:styleId="IP">
+    <w:name w:val="IP"/>
+    <w:basedOn w:val="Normal"/>
+    <w:qFormat/>
+    <w:rsid w:val="0055075A"/>
+    <w:pPr>
+      <w:numPr>
+        <w:numId w:val="7"/>
+      </w:numPr>
+      <w:spacing w:after="0" w:line="240" w:lineRule="auto"/>
+      <w:contextualSpacing/>
+    </w:pPr>
+    <w:rPr>
+      <w:rFonts w:ascii="Courier New" w:eastAsia="Calibri" w:hAnsi="Courier New" w:cs="Courier New"/>
+      <w:color w:val="404040" w:themeColor="text1" w:themeTint="BF"/>
+      <w:kern w:val="0"/>
+      <w:szCs w:val="22"/>
+      <w14:ligatures w14:val="none"/>
+    </w:rPr>
   </w:style>
 </w:styles>
 </file>

</xml_diff>

<commit_message>
Added Summary Notes for Project
</commit_message>
<xml_diff>
--- a/Source_Code/Reports/Sample499/FindingsReportTest.docx
+++ b/Source_Code/Reports/Sample499/FindingsReportTest.docx
@@ -600,7 +600,7 @@
           <w14:ligatures w14:val="none"/>
         </w:rPr>
         <w:drawing>
-          <wp:anchor distT="0" distB="0" distL="114300" distR="114300" simplePos="0" relativeHeight="251662336" behindDoc="0" locked="0" layoutInCell="1" allowOverlap="1" wp14:anchorId="56FF54E8" wp14:editId="223B5D45">
+          <wp:anchor distT="0" distB="0" distL="114300" distR="114300" simplePos="0" relativeHeight="251662336" behindDoc="0" locked="0" layoutInCell="1" allowOverlap="1" wp14:anchorId="56FF54E8" wp14:editId="12E097EA">
             <wp:simplePos x="0" y="0"/>
             <wp:positionH relativeFrom="margin">
               <wp:posOffset>1163955</wp:posOffset>
@@ -4088,10 +4088,9 @@
           <w:color w:val="404040"/>
           <w:kern w:val="0"/>
           <w:szCs w:val="22"/>
-          <w:highlight w:val="yellow"/>
-          <w14:ligatures w14:val="none"/>
-        </w:rPr>
-        <w:t>DEMO’s</w:t>
+          <w14:ligatures w14:val="none"/>
+        </w:rPr>
+        <w:t>[CUSTOMER]</w:t>
       </w:r>
       <w:r>
         <w:rPr>
@@ -6800,7 +6799,7 @@
           <w14:ligatures w14:val="none"/>
         </w:rPr>
         <w:drawing>
-          <wp:inline distT="0" distB="0" distL="0" distR="0" wp14:anchorId="03962334" wp14:editId="037B0A00">
+          <wp:inline distT="0" distB="0" distL="0" distR="0" wp14:anchorId="03962334" wp14:editId="3DA23539">
             <wp:extent cx="152400" cy="152400"/>
             <wp:effectExtent l="0" t="0" r="0" b="0"/>
             <wp:docPr id="2011428596" name="Picture 2011428596" descr="Fire with solid fill"/>

</xml_diff>

<commit_message>
Completed Narrative Host Discovery
</commit_message>
<xml_diff>
--- a/Source_Code/Reports/Sample499/FindingsReportTest.docx
+++ b/Source_Code/Reports/Sample499/FindingsReportTest.docx
@@ -600,7 +600,7 @@
           <w14:ligatures w14:val="none"/>
         </w:rPr>
         <w:drawing>
-          <wp:anchor distT="0" distB="0" distL="114300" distR="114300" simplePos="0" relativeHeight="251662336" behindDoc="0" locked="0" layoutInCell="1" allowOverlap="1" wp14:anchorId="56FF54E8" wp14:editId="12E097EA">
+          <wp:anchor distT="0" distB="0" distL="114300" distR="114300" simplePos="0" relativeHeight="251662336" behindDoc="0" locked="0" layoutInCell="1" allowOverlap="1" wp14:anchorId="56FF54E8" wp14:editId="123C2C9D">
             <wp:simplePos x="0" y="0"/>
             <wp:positionH relativeFrom="margin">
               <wp:posOffset>1163955</wp:posOffset>
@@ -3795,10 +3795,19 @@
           <w:color w:val="404040"/>
           <w:kern w:val="0"/>
           <w:szCs w:val="22"/>
-          <w:highlight w:val="yellow"/>
-          <w14:ligatures w14:val="none"/>
-        </w:rPr>
-        <w:t>one (1) network range</w:t>
+          <w14:ligatures w14:val="none"/>
+        </w:rPr>
+        <w:t xml:space="preserve">one (1) </w:t>
+      </w:r>
+      <w:r>
+        <w:rPr>
+          <w:rFonts w:ascii="Corbel" w:eastAsia="Calibri" w:hAnsi="Corbel" w:cs="Arial"/>
+          <w:color w:val="404040"/>
+          <w:kern w:val="0"/>
+          <w:szCs w:val="22"/>
+          <w14:ligatures w14:val="none"/>
+        </w:rPr>
+        <w:t>network range</w:t>
       </w:r>
       <w:r>
         <w:rPr>
@@ -3838,41 +3847,39 @@
           <w:color w:val="404040"/>
           <w:kern w:val="0"/>
           <w:szCs w:val="22"/>
-          <w:highlight w:val="yellow"/>
-          <w14:ligatures w14:val="none"/>
-        </w:rPr>
-        <w:t>one hundred and one (101)</w:t>
-      </w:r>
-      <w:r>
-        <w:rPr>
-          <w:rFonts w:ascii="Corbel" w:eastAsia="Calibri" w:hAnsi="Corbel" w:cs="Arial"/>
-          <w:color w:val="404040"/>
-          <w:kern w:val="0"/>
-          <w:szCs w:val="22"/>
-          <w14:ligatures w14:val="none"/>
-        </w:rPr>
-        <w:t xml:space="preserve"> systems to be active within the targeted environment. In result of the </w:t>
-      </w:r>
-      <w:r>
-        <w:rPr>
-          <w:rFonts w:ascii="Corbel" w:eastAsia="Calibri" w:hAnsi="Corbel" w:cs="Arial"/>
-          <w:color w:val="404040"/>
-          <w:kern w:val="0"/>
-          <w:szCs w:val="22"/>
-          <w:highlight w:val="yellow"/>
-          <w14:ligatures w14:val="none"/>
-        </w:rPr>
-        <w:t>one hundred and one (101)</w:t>
-      </w:r>
-      <w:r>
-        <w:rPr>
-          <w:rFonts w:ascii="Corbel" w:eastAsia="Calibri" w:hAnsi="Corbel" w:cs="Arial"/>
-          <w:color w:val="404040"/>
-          <w:kern w:val="0"/>
-          <w:szCs w:val="22"/>
-          <w14:ligatures w14:val="none"/>
-        </w:rPr>
-        <w:t xml:space="preserve"> addresses that were scanned, </w:t>
+          <w14:ligatures w14:val="none"/>
+        </w:rPr>
+        <w:t xml:space="preserve">one (1) </w:t>
+      </w:r>
+      <w:r>
+        <w:rPr>
+          <w:rFonts w:ascii="Corbel" w:eastAsia="Calibri" w:hAnsi="Corbel" w:cs="Arial"/>
+          <w:color w:val="404040"/>
+          <w:kern w:val="0"/>
+          <w:szCs w:val="22"/>
+          <w14:ligatures w14:val="none"/>
+        </w:rPr>
+        <w:t xml:space="preserve">systems to be active within the targeted environment. In result of the </w:t>
+      </w:r>
+      <w:r>
+        <w:rPr>
+          <w:rFonts w:ascii="Corbel" w:eastAsia="Calibri" w:hAnsi="Corbel" w:cs="Arial"/>
+          <w:color w:val="404040"/>
+          <w:kern w:val="0"/>
+          <w:szCs w:val="22"/>
+          <w14:ligatures w14:val="none"/>
+        </w:rPr>
+        <w:t xml:space="preserve">one (1) </w:t>
+      </w:r>
+      <w:r>
+        <w:rPr>
+          <w:rFonts w:ascii="Corbel" w:eastAsia="Calibri" w:hAnsi="Corbel" w:cs="Arial"/>
+          <w:color w:val="404040"/>
+          <w:kern w:val="0"/>
+          <w:szCs w:val="22"/>
+          <w14:ligatures w14:val="none"/>
+        </w:rPr>
+        <w:t xml:space="preserve">addresses that were scanned, </w:t>
       </w:r>
       <w:proofErr w:type="spellStart"/>
       <w:r>
@@ -3902,20 +3909,19 @@
           <w:color w:val="404040"/>
           <w:kern w:val="0"/>
           <w:szCs w:val="22"/>
-          <w:highlight w:val="yellow"/>
-          <w14:ligatures w14:val="none"/>
-        </w:rPr>
-        <w:t>three hundred and seventy-seven (377)</w:t>
-      </w:r>
-      <w:r>
-        <w:rPr>
-          <w:rFonts w:ascii="Corbel" w:eastAsia="Calibri" w:hAnsi="Corbel" w:cs="Arial"/>
-          <w:color w:val="404040"/>
-          <w:kern w:val="0"/>
-          <w:szCs w:val="22"/>
-          <w14:ligatures w14:val="none"/>
-        </w:rPr>
-        <w:t xml:space="preserve"> open ports.</w:t>
+          <w14:ligatures w14:val="none"/>
+        </w:rPr>
+        <w:t xml:space="preserve">three (3) </w:t>
+      </w:r>
+      <w:r>
+        <w:rPr>
+          <w:rFonts w:ascii="Corbel" w:eastAsia="Calibri" w:hAnsi="Corbel" w:cs="Arial"/>
+          <w:color w:val="404040"/>
+          <w:kern w:val="0"/>
+          <w:szCs w:val="22"/>
+          <w14:ligatures w14:val="none"/>
+        </w:rPr>
+        <w:t>open ports.</w:t>
       </w:r>
       <w:r>
         <w:rPr>
@@ -6799,7 +6805,7 @@
           <w14:ligatures w14:val="none"/>
         </w:rPr>
         <w:drawing>
-          <wp:inline distT="0" distB="0" distL="0" distR="0" wp14:anchorId="03962334" wp14:editId="3DA23539">
+          <wp:inline distT="0" distB="0" distL="0" distR="0" wp14:anchorId="03962334" wp14:editId="779E62AB">
             <wp:extent cx="152400" cy="152400"/>
             <wp:effectExtent l="0" t="0" r="0" b="0"/>
             <wp:docPr id="2011428596" name="Picture 2011428596" descr="Fire with solid fill"/>

</xml_diff>

<commit_message>
Update findings report customer name replacement and exploitation section handling
</commit_message>
<xml_diff>
--- a/Source_Code/Reports/Sample499/FindingsReportTest.docx
+++ b/Source_Code/Reports/Sample499/FindingsReportTest.docx
@@ -1107,48 +1107,11 @@
       </w:pPr>
       <w:r>
         <w:rPr>
-          <w:rFonts w:ascii="Corbel" w:eastAsia="Calibri" w:hAnsi="Corbel" w:cs="Arial"/>
-          <w:color w:val="404040"/>
-          <w:kern w:val="0"/>
-          <w:szCs w:val="22"/>
-          <w14:ligatures w14:val="none"/>
-        </w:rPr>
-        <w:t xml:space="preserve">The information </w:t>
-      </w:r>
-      <w:r>
-        <w:rPr>
-          <w:rFonts w:ascii="Corbel" w:eastAsia="Calibri" w:hAnsi="Corbel" w:cs="Arial"/>
-          <w:snapToGrid w:val="0"/>
-          <w:color w:val="404040"/>
-          <w:kern w:val="0"/>
-          <w:szCs w:val="22"/>
-          <w14:ligatures w14:val="none"/>
-        </w:rPr>
-        <w:t xml:space="preserve">contained in this document is confidential and proprietary. It is intended for the exclusive use of </w:t>
-      </w:r>
-      <w:proofErr w:type="spellStart"/>
-      <w:r>
-        <w:rPr>
-          <w:rFonts w:ascii="Corbel" w:eastAsia="Calibri" w:hAnsi="Corbel" w:cs="Arial"/>
-          <w:snapToGrid w:val="0"/>
-          <w:color w:val="404040"/>
-          <w:kern w:val="0"/>
-          <w:szCs w:val="22"/>
-          <w14:ligatures w14:val="none"/>
-        </w:rPr>
-        <w:t>OrbitalFire</w:t>
-      </w:r>
-      <w:proofErr w:type="spellEnd"/>
-      <w:r>
-        <w:rPr>
-          <w:rFonts w:ascii="Corbel" w:eastAsia="Calibri" w:hAnsi="Corbel" w:cs="Arial"/>
-          <w:snapToGrid w:val="0"/>
-          <w:color w:val="404040"/>
-          <w:kern w:val="0"/>
-          <w:szCs w:val="22"/>
-          <w14:ligatures w14:val="none"/>
-        </w:rPr>
-        <w:t>, LLC and the Customer entity named in this document.</w:t>
+          <w:rFonts w:ascii="Corbel" w:hAnsi="Corbel"/>
+          <w:color w:val="E6781F"/>
+          <w:sz w:val="24"/>
+        </w:rPr>
+        <w:t>The information contained in this document is confidential and proprietary. It is intended for the exclusive use of orbital fire, LLC and the Customer entity named in this document.</w:t>
       </w:r>
     </w:p>
     <w:p>
@@ -3681,520 +3644,31 @@
       </w:pPr>
       <w:r>
         <w:rPr>
-          <w:rFonts w:ascii="Corbel" w:eastAsia="Calibri" w:hAnsi="Corbel" w:cs="Arial"/>
-          <w:color w:val="404040"/>
-          <w:kern w:val="0"/>
-          <w:szCs w:val="22"/>
-          <w14:ligatures w14:val="none"/>
+          <w:rFonts w:ascii="Corbel" w:hAnsi="Corbel"/>
+          <w:color w:val="E6781F"/>
+          <w:sz w:val="24"/>
         </w:rPr>
         <w:t>Listed below is an overview of actions performed during the testing process. It should be noted that this portion of the report does not represent the entire list of activities that were performed during this assessment.</w:t>
-      </w:r>
-      <w:r>
-        <w:rPr>
-          <w:rFonts w:ascii="Corbel" w:eastAsia="Calibri" w:hAnsi="Corbel" w:cs="Arial"/>
-          <w:color w:val="404040"/>
-          <w:kern w:val="0"/>
-          <w:szCs w:val="22"/>
-          <w14:ligatures w14:val="none"/>
-        </w:rPr>
         <w:br/>
-      </w:r>
-      <w:r>
-        <w:rPr>
-          <w:rFonts w:ascii="Corbel" w:eastAsia="Calibri" w:hAnsi="Corbel" w:cs="Arial"/>
-          <w:b/>
-          <w:bCs/>
-          <w:color w:val="404040"/>
-          <w:kern w:val="0"/>
-          <w:szCs w:val="22"/>
-          <w14:ligatures w14:val="none"/>
-        </w:rPr>
         <w:br/>
-        <w:t xml:space="preserve">HOST </w:t>
-      </w:r>
-      <w:proofErr w:type="gramStart"/>
-      <w:r>
-        <w:rPr>
-          <w:rFonts w:ascii="Corbel" w:eastAsia="Calibri" w:hAnsi="Corbel" w:cs="Arial"/>
-          <w:b/>
-          <w:bCs/>
-          <w:color w:val="404040"/>
-          <w:kern w:val="0"/>
-          <w:szCs w:val="22"/>
-          <w14:ligatures w14:val="none"/>
-        </w:rPr>
-        <w:t xml:space="preserve">DISCOVERY </w:t>
-      </w:r>
-      <w:r>
-        <w:rPr>
-          <w:rFonts w:ascii="Corbel" w:eastAsia="Calibri" w:hAnsi="Corbel" w:cs="Arial"/>
-          <w:b/>
-          <w:bCs/>
-          <w:color w:val="F06023"/>
-          <w:kern w:val="0"/>
-          <w:sz w:val="20"/>
-          <w:szCs w:val="20"/>
-          <w14:ligatures w14:val="none"/>
-        </w:rPr>
-        <w:t xml:space="preserve"> </w:t>
-      </w:r>
-      <w:r>
-        <w:rPr>
-          <w:rFonts w:ascii="Corbel" w:eastAsia="Calibri" w:hAnsi="Corbel" w:cs="Arial"/>
-          <w:b/>
-          <w:bCs/>
-          <w:color w:val="F06023"/>
-          <w:kern w:val="0"/>
-          <w:sz w:val="20"/>
-          <w:szCs w:val="20"/>
-          <w:highlight w:val="yellow"/>
-          <w14:ligatures w14:val="none"/>
-        </w:rPr>
-        <w:t>INTERNAL</w:t>
-      </w:r>
-      <w:proofErr w:type="gramEnd"/>
-      <w:r>
-        <w:rPr>
-          <w:rFonts w:ascii="Corbel" w:eastAsia="Calibri" w:hAnsi="Corbel" w:cs="Arial"/>
-          <w:b/>
-          <w:bCs/>
-          <w:color w:val="F06023"/>
-          <w:kern w:val="0"/>
-          <w:sz w:val="20"/>
-          <w:szCs w:val="20"/>
-          <w:highlight w:val="yellow"/>
-          <w14:ligatures w14:val="none"/>
-        </w:rPr>
-        <w:t xml:space="preserve"> NETWORK ASSESSMENT</w:t>
-      </w:r>
-      <w:r>
-        <w:rPr>
-          <w:rFonts w:ascii="Corbel" w:eastAsia="Calibri" w:hAnsi="Corbel" w:cs="Arial"/>
-          <w:b/>
-          <w:bCs/>
-          <w:color w:val="404040"/>
-          <w:kern w:val="0"/>
-          <w:szCs w:val="22"/>
-          <w14:ligatures w14:val="none"/>
-        </w:rPr>
+        <w:t>HOST DISCOVERY  INTERNAL NETWORK ASSESSMENT</w:t>
         <w:br/>
-      </w:r>
-      <w:r>
-        <w:rPr>
-          <w:rFonts w:ascii="Corbel" w:eastAsia="Calibri" w:hAnsi="Corbel" w:cs="Arial"/>
-          <w:color w:val="404040"/>
-          <w:kern w:val="0"/>
-          <w:szCs w:val="22"/>
-          <w14:ligatures w14:val="none"/>
-        </w:rPr>
-        <w:t xml:space="preserve">The host discovery phase included port scanning, ping sweeps and more, to identify active systems within the environment. Of the </w:t>
-      </w:r>
-      <w:r>
-        <w:rPr>
-          <w:rFonts w:ascii="Corbel" w:eastAsia="Calibri" w:hAnsi="Corbel" w:cs="Arial"/>
-          <w:color w:val="404040"/>
-          <w:kern w:val="0"/>
-          <w:szCs w:val="22"/>
-          <w14:ligatures w14:val="none"/>
-        </w:rPr>
-        <w:t xml:space="preserve">one (1) </w:t>
-      </w:r>
-      <w:r>
-        <w:rPr>
-          <w:rFonts w:ascii="Corbel" w:eastAsia="Calibri" w:hAnsi="Corbel" w:cs="Arial"/>
-          <w:color w:val="404040"/>
-          <w:kern w:val="0"/>
-          <w:szCs w:val="22"/>
-          <w14:ligatures w14:val="none"/>
-        </w:rPr>
-        <w:t>network range</w:t>
-      </w:r>
-      <w:r>
-        <w:rPr>
-          <w:rFonts w:ascii="Corbel" w:eastAsia="Calibri" w:hAnsi="Corbel" w:cs="Arial"/>
-          <w:color w:val="404040"/>
-          <w:kern w:val="0"/>
-          <w:szCs w:val="22"/>
-          <w14:ligatures w14:val="none"/>
-        </w:rPr>
-        <w:t xml:space="preserve"> that was provided as part of scope, </w:t>
-      </w:r>
-      <w:proofErr w:type="spellStart"/>
-      <w:r>
-        <w:rPr>
-          <w:rFonts w:ascii="Corbel" w:eastAsia="Calibri" w:hAnsi="Corbel" w:cs="Arial"/>
-          <w:color w:val="404040"/>
-          <w:kern w:val="0"/>
-          <w:szCs w:val="22"/>
-          <w14:ligatures w14:val="none"/>
-        </w:rPr>
-        <w:t>OrbitalFire</w:t>
-      </w:r>
-      <w:proofErr w:type="spellEnd"/>
-      <w:r>
-        <w:rPr>
-          <w:rFonts w:ascii="Corbel" w:eastAsia="Calibri" w:hAnsi="Corbel" w:cs="Arial"/>
-          <w:color w:val="404040"/>
-          <w:kern w:val="0"/>
-          <w:szCs w:val="22"/>
-          <w14:ligatures w14:val="none"/>
-        </w:rPr>
-        <w:t xml:space="preserve"> was able to identify a total of </w:t>
-      </w:r>
-      <w:r>
-        <w:rPr>
-          <w:rFonts w:ascii="Corbel" w:eastAsia="Calibri" w:hAnsi="Corbel" w:cs="Arial"/>
-          <w:color w:val="404040"/>
-          <w:kern w:val="0"/>
-          <w:szCs w:val="22"/>
-          <w14:ligatures w14:val="none"/>
-        </w:rPr>
-        <w:t xml:space="preserve">one (1) </w:t>
-      </w:r>
-      <w:r>
-        <w:rPr>
-          <w:rFonts w:ascii="Corbel" w:eastAsia="Calibri" w:hAnsi="Corbel" w:cs="Arial"/>
-          <w:color w:val="404040"/>
-          <w:kern w:val="0"/>
-          <w:szCs w:val="22"/>
-          <w14:ligatures w14:val="none"/>
-        </w:rPr>
-        <w:t xml:space="preserve">systems to be active within the targeted environment. In result of the </w:t>
-      </w:r>
-      <w:r>
-        <w:rPr>
-          <w:rFonts w:ascii="Corbel" w:eastAsia="Calibri" w:hAnsi="Corbel" w:cs="Arial"/>
-          <w:color w:val="404040"/>
-          <w:kern w:val="0"/>
-          <w:szCs w:val="22"/>
-          <w14:ligatures w14:val="none"/>
-        </w:rPr>
-        <w:t xml:space="preserve">one (1) </w:t>
-      </w:r>
-      <w:r>
-        <w:rPr>
-          <w:rFonts w:ascii="Corbel" w:eastAsia="Calibri" w:hAnsi="Corbel" w:cs="Arial"/>
-          <w:color w:val="404040"/>
-          <w:kern w:val="0"/>
-          <w:szCs w:val="22"/>
-          <w14:ligatures w14:val="none"/>
-        </w:rPr>
-        <w:t xml:space="preserve">addresses that were scanned, </w:t>
-      </w:r>
-      <w:proofErr w:type="spellStart"/>
-      <w:r>
-        <w:rPr>
-          <w:rFonts w:ascii="Corbel" w:eastAsia="Calibri" w:hAnsi="Corbel" w:cs="Arial"/>
-          <w:color w:val="404040"/>
-          <w:kern w:val="0"/>
-          <w:szCs w:val="22"/>
-          <w14:ligatures w14:val="none"/>
-        </w:rPr>
-        <w:t>OrbitalFire</w:t>
-      </w:r>
-      <w:proofErr w:type="spellEnd"/>
-      <w:r>
-        <w:rPr>
-          <w:rFonts w:ascii="Corbel" w:eastAsia="Calibri" w:hAnsi="Corbel" w:cs="Arial"/>
-          <w:color w:val="404040"/>
-          <w:kern w:val="0"/>
-          <w:szCs w:val="22"/>
-          <w14:ligatures w14:val="none"/>
-        </w:rPr>
-        <w:t xml:space="preserve"> found </w:t>
-      </w:r>
-      <w:r>
-        <w:rPr>
-          <w:rFonts w:ascii="Corbel" w:eastAsia="Calibri" w:hAnsi="Corbel" w:cs="Arial"/>
-          <w:color w:val="404040"/>
-          <w:kern w:val="0"/>
-          <w:szCs w:val="22"/>
-          <w14:ligatures w14:val="none"/>
-        </w:rPr>
-        <w:t xml:space="preserve">three (3) </w:t>
-      </w:r>
-      <w:r>
-        <w:rPr>
-          <w:rFonts w:ascii="Corbel" w:eastAsia="Calibri" w:hAnsi="Corbel" w:cs="Arial"/>
-          <w:color w:val="404040"/>
-          <w:kern w:val="0"/>
-          <w:szCs w:val="22"/>
-          <w14:ligatures w14:val="none"/>
-        </w:rPr>
-        <w:t>open ports.</w:t>
-      </w:r>
-      <w:r>
-        <w:rPr>
-          <w:rFonts w:ascii="Corbel" w:eastAsia="Calibri" w:hAnsi="Corbel" w:cs="Arial"/>
-          <w:color w:val="404040"/>
-          <w:kern w:val="0"/>
-          <w:szCs w:val="22"/>
-          <w14:ligatures w14:val="none"/>
-        </w:rPr>
+        <w:t>The host discovery phase included port scanning, ping sweeps and more, to identify active systems within the environment. Of the one (1) network range that was provided as part of scope, orbital fire was able to identify a total of one (1) systems to be active within the targeted environment. In result of the one (1) addresses that were scanned, orbital fire found three (3) open ports.</w:t>
         <w:br/>
-      </w:r>
-      <w:r>
-        <w:rPr>
-          <w:rFonts w:ascii="Corbel" w:eastAsia="Calibri" w:hAnsi="Corbel" w:cs="Arial"/>
-          <w:b/>
-          <w:bCs/>
-          <w:color w:val="404040"/>
-          <w:kern w:val="0"/>
-          <w:szCs w:val="22"/>
-          <w14:ligatures w14:val="none"/>
-        </w:rPr>
         <w:br/>
         <w:t>ENUMERATION</w:t>
-      </w:r>
-      <w:r>
-        <w:rPr>
-          <w:rFonts w:ascii="Corbel" w:eastAsia="Calibri" w:hAnsi="Corbel" w:cs="Arial"/>
-          <w:b/>
-          <w:bCs/>
-          <w:color w:val="404040"/>
-          <w:kern w:val="0"/>
-          <w:szCs w:val="22"/>
-          <w14:ligatures w14:val="none"/>
-        </w:rPr>
         <w:br/>
-      </w:r>
-      <w:r>
-        <w:rPr>
-          <w:rFonts w:ascii="Corbel" w:eastAsia="Calibri" w:hAnsi="Corbel" w:cs="Arial"/>
-          <w:color w:val="404040"/>
-          <w:kern w:val="0"/>
-          <w:szCs w:val="22"/>
-          <w14:ligatures w14:val="none"/>
-        </w:rPr>
-        <w:t xml:space="preserve">After the identification of all available hosts within the network, </w:t>
-      </w:r>
-      <w:proofErr w:type="spellStart"/>
-      <w:r>
-        <w:rPr>
-          <w:rFonts w:ascii="Corbel" w:eastAsia="Calibri" w:hAnsi="Corbel" w:cs="Arial"/>
-          <w:color w:val="404040"/>
-          <w:kern w:val="0"/>
-          <w:szCs w:val="22"/>
-          <w14:ligatures w14:val="none"/>
-        </w:rPr>
-        <w:t>OrbitalFire</w:t>
-      </w:r>
-      <w:proofErr w:type="spellEnd"/>
-      <w:r>
-        <w:rPr>
-          <w:rFonts w:ascii="Corbel" w:eastAsia="Calibri" w:hAnsi="Corbel" w:cs="Arial"/>
-          <w:color w:val="404040"/>
-          <w:kern w:val="0"/>
-          <w:szCs w:val="22"/>
-          <w14:ligatures w14:val="none"/>
-        </w:rPr>
-        <w:t xml:space="preserve"> then conducted enumeration. Enumeration during this assessment consisted of scanning the identified ports to determine which services are running (if any). Additional scans were then performed based on running services to attempt enumerating information (if possible).</w:t>
-      </w:r>
-      <w:r>
-        <w:rPr>
-          <w:rFonts w:ascii="Corbel" w:eastAsia="Calibri" w:hAnsi="Corbel" w:cs="Arial"/>
-          <w:color w:val="404040"/>
-          <w:kern w:val="0"/>
-          <w:szCs w:val="22"/>
-          <w14:ligatures w14:val="none"/>
-        </w:rPr>
+        <w:t>After the identification of all available hosts within the network, orbital fire then conducted enumeration. Enumeration during this assessment consisted of scanning the identified ports to determine which services are running (if any). Additional scans were then performed based on running services to attempt enumerating information (if possible).</w:t>
         <w:br/>
-      </w:r>
-      <w:r>
-        <w:rPr>
-          <w:rFonts w:ascii="Corbel" w:eastAsia="Calibri" w:hAnsi="Corbel" w:cs="Arial"/>
-          <w:color w:val="404040"/>
-          <w:kern w:val="0"/>
-          <w:szCs w:val="22"/>
-          <w14:ligatures w14:val="none"/>
-        </w:rPr>
         <w:br/>
-      </w:r>
-      <w:r>
-        <w:rPr>
-          <w:rFonts w:ascii="Corbel" w:eastAsia="Calibri" w:hAnsi="Corbel" w:cs="Arial"/>
-          <w:b/>
-          <w:bCs/>
-          <w:color w:val="404040"/>
-          <w:kern w:val="0"/>
-          <w:szCs w:val="22"/>
-          <w14:ligatures w14:val="none"/>
-        </w:rPr>
         <w:t>EXPLOITATION</w:t>
-      </w:r>
-      <w:r>
-        <w:rPr>
-          <w:rFonts w:ascii="Corbel" w:eastAsia="Calibri" w:hAnsi="Corbel" w:cs="Arial"/>
-          <w:b/>
-          <w:bCs/>
-          <w:color w:val="404040"/>
-          <w:kern w:val="0"/>
-          <w:szCs w:val="22"/>
-          <w14:ligatures w14:val="none"/>
-        </w:rPr>
         <w:br/>
-      </w:r>
-      <w:r>
-        <w:rPr>
-          <w:rFonts w:ascii="Corbel" w:eastAsia="Calibri" w:hAnsi="Corbel" w:cs="Arial"/>
-          <w:color w:val="404040"/>
-          <w:kern w:val="0"/>
-          <w:szCs w:val="22"/>
-          <w14:ligatures w14:val="none"/>
-        </w:rPr>
-        <w:t xml:space="preserve">Post enumeration, </w:t>
-      </w:r>
-      <w:proofErr w:type="spellStart"/>
-      <w:r>
-        <w:rPr>
-          <w:rFonts w:ascii="Corbel" w:eastAsia="Calibri" w:hAnsi="Corbel" w:cs="Arial"/>
-          <w:color w:val="404040"/>
-          <w:kern w:val="0"/>
-          <w:szCs w:val="22"/>
-          <w14:ligatures w14:val="none"/>
-        </w:rPr>
-        <w:t>OrbitalFire</w:t>
-      </w:r>
-      <w:proofErr w:type="spellEnd"/>
-      <w:r>
-        <w:rPr>
-          <w:rFonts w:ascii="Corbel" w:eastAsia="Calibri" w:hAnsi="Corbel" w:cs="Arial"/>
-          <w:color w:val="404040"/>
-          <w:kern w:val="0"/>
-          <w:szCs w:val="22"/>
-          <w14:ligatures w14:val="none"/>
-        </w:rPr>
-        <w:t xml:space="preserve"> focused strictly on the exploitation of any/all running services that were previously discovered. </w:t>
-      </w:r>
-      <w:proofErr w:type="spellStart"/>
-      <w:r>
-        <w:rPr>
-          <w:rFonts w:ascii="Corbel" w:eastAsia="Calibri" w:hAnsi="Corbel" w:cs="Arial"/>
-          <w:color w:val="404040"/>
-          <w:kern w:val="0"/>
-          <w:szCs w:val="22"/>
-          <w14:ligatures w14:val="none"/>
-        </w:rPr>
-        <w:t>OrbitalFire</w:t>
-      </w:r>
-      <w:proofErr w:type="spellEnd"/>
-      <w:r>
-        <w:rPr>
-          <w:rFonts w:ascii="Corbel" w:eastAsia="Calibri" w:hAnsi="Corbel" w:cs="Arial"/>
-          <w:color w:val="404040"/>
-          <w:kern w:val="0"/>
-          <w:szCs w:val="22"/>
-          <w14:ligatures w14:val="none"/>
-        </w:rPr>
-        <w:t xml:space="preserve"> used a comprehensive set of tools, custom scripts, and manual techniques to thoroughly identify possible threats to </w:t>
-      </w:r>
-      <w:r>
-        <w:rPr>
-          <w:rFonts w:ascii="Corbel" w:eastAsia="Calibri" w:hAnsi="Corbel" w:cs="Arial"/>
-          <w:color w:val="404040"/>
-          <w:kern w:val="0"/>
-          <w:szCs w:val="22"/>
-          <w14:ligatures w14:val="none"/>
-        </w:rPr>
-        <w:t>[CUSTOMER]</w:t>
-      </w:r>
-      <w:r>
-        <w:rPr>
-          <w:rFonts w:ascii="Corbel" w:eastAsia="Calibri" w:hAnsi="Corbel" w:cs="Arial"/>
-          <w:color w:val="404040"/>
-          <w:kern w:val="0"/>
-          <w:szCs w:val="22"/>
-          <w14:ligatures w14:val="none"/>
-        </w:rPr>
-        <w:t xml:space="preserve"> environment.</w:t>
-      </w:r>
-      <w:r>
-        <w:rPr>
-          <w:rFonts w:ascii="Corbel" w:eastAsia="Calibri" w:hAnsi="Corbel" w:cs="Arial"/>
-          <w:color w:val="404040"/>
-          <w:kern w:val="0"/>
-          <w:szCs w:val="22"/>
-          <w14:ligatures w14:val="none"/>
-        </w:rPr>
+        <w:t>Post enumeration, orbital fire focused strictly on the exploitation of any/all running services that were previously discovered. orbital fire used a comprehensive set of tools, custom scripts, and manual techniques to thoroughly identify possible threats to orbital fire environment.</w:t>
         <w:br/>
-      </w:r>
-      <w:r>
-        <w:rPr>
-          <w:rFonts w:ascii="Corbel" w:eastAsia="Calibri" w:hAnsi="Corbel" w:cs="Arial"/>
-          <w:color w:val="404040"/>
-          <w:kern w:val="0"/>
-          <w:szCs w:val="22"/>
-          <w14:ligatures w14:val="none"/>
-        </w:rPr>
         <w:br/>
-      </w:r>
-      <w:r>
-        <w:rPr>
-          <w:rFonts w:ascii="Corbel" w:eastAsia="Calibri" w:hAnsi="Corbel" w:cs="Arial"/>
-          <w:b/>
-          <w:bCs/>
-          <w:color w:val="404040"/>
-          <w:kern w:val="0"/>
-          <w:szCs w:val="22"/>
-          <w14:ligatures w14:val="none"/>
-        </w:rPr>
         <w:t>POST EXPLOITATION</w:t>
-      </w:r>
-      <w:r>
-        <w:rPr>
-          <w:rFonts w:ascii="Corbel" w:eastAsia="Calibri" w:hAnsi="Corbel" w:cs="Arial"/>
-          <w:b/>
-          <w:bCs/>
-          <w:color w:val="404040"/>
-          <w:kern w:val="0"/>
-          <w:szCs w:val="22"/>
-          <w14:ligatures w14:val="none"/>
-        </w:rPr>
         <w:br/>
-      </w:r>
-      <w:r>
-        <w:rPr>
-          <w:rFonts w:ascii="Corbel" w:eastAsia="Calibri" w:hAnsi="Corbel" w:cs="Arial"/>
-          <w:color w:val="404040"/>
-          <w:kern w:val="0"/>
-          <w:szCs w:val="22"/>
-          <w14:ligatures w14:val="none"/>
-        </w:rPr>
-        <w:t xml:space="preserve">Once the exploitation phase was complete, </w:t>
-      </w:r>
-      <w:proofErr w:type="spellStart"/>
-      <w:r>
-        <w:rPr>
-          <w:rFonts w:ascii="Corbel" w:eastAsia="Calibri" w:hAnsi="Corbel" w:cs="Arial"/>
-          <w:color w:val="404040"/>
-          <w:kern w:val="0"/>
-          <w:szCs w:val="22"/>
-          <w14:ligatures w14:val="none"/>
-        </w:rPr>
-        <w:t>OrbitalFire</w:t>
-      </w:r>
-      <w:proofErr w:type="spellEnd"/>
-      <w:r>
-        <w:rPr>
-          <w:rFonts w:ascii="Corbel" w:eastAsia="Calibri" w:hAnsi="Corbel" w:cs="Arial"/>
-          <w:color w:val="404040"/>
-          <w:kern w:val="0"/>
-          <w:szCs w:val="22"/>
-          <w14:ligatures w14:val="none"/>
-        </w:rPr>
-        <w:t xml:space="preserve"> then tested and validated all identified threats to evaluate the depth of compromise.</w:t>
-      </w:r>
-      <w:r>
-        <w:rPr>
-          <w:rFonts w:ascii="Corbel" w:eastAsia="Calibri" w:hAnsi="Corbel" w:cs="Arial"/>
-          <w:b/>
-          <w:bCs/>
-          <w:color w:val="404040"/>
-          <w:kern w:val="0"/>
-          <w:szCs w:val="22"/>
-          <w14:ligatures w14:val="none"/>
-        </w:rPr>
-        <w:br w:type="page"/>
+        <w:t>Once the exploitation phase was complete, orbital fire then tested and validated all identified threats to evaluate the depth of compromise.</w:t>
       </w:r>
     </w:p>
     <w:p>
@@ -4437,35 +3911,11 @@
       </w:pPr>
       <w:r>
         <w:rPr>
-          <w:rFonts w:ascii="Corbel" w:eastAsia="Calibri" w:hAnsi="Corbel" w:cs="Arial"/>
-          <w:color w:val="404040"/>
-          <w:kern w:val="0"/>
-          <w:szCs w:val="22"/>
-          <w14:ligatures w14:val="none"/>
-        </w:rPr>
-        <w:t xml:space="preserve">To summarize the results of this assessment, </w:t>
-      </w:r>
-      <w:proofErr w:type="spellStart"/>
-      <w:r>
-        <w:rPr>
-          <w:rFonts w:ascii="Corbel" w:eastAsia="Calibri" w:hAnsi="Corbel" w:cs="Arial"/>
-          <w:color w:val="404040"/>
-          <w:kern w:val="0"/>
-          <w:szCs w:val="22"/>
-          <w14:ligatures w14:val="none"/>
-        </w:rPr>
-        <w:t>OrbitalFire</w:t>
-      </w:r>
-      <w:proofErr w:type="spellEnd"/>
-      <w:r>
-        <w:rPr>
-          <w:rFonts w:ascii="Corbel" w:eastAsia="Calibri" w:hAnsi="Corbel" w:cs="Arial"/>
-          <w:color w:val="404040"/>
-          <w:kern w:val="0"/>
-          <w:szCs w:val="22"/>
-          <w14:ligatures w14:val="none"/>
-        </w:rPr>
-        <w:t xml:space="preserve"> has grouped all findings from the penetration test into rollup findings. These rollup findings can be used to quickly determine the root cause of all issues identified in this assessment. It is highly recommended to implement a remediation strategy based on the rollup findings below to enhance security posture and overall defensibility.</w:t>
+          <w:rFonts w:ascii="Corbel" w:hAnsi="Corbel"/>
+          <w:color w:val="E6781F"/>
+          <w:sz w:val="24"/>
+        </w:rPr>
+        <w:t>To summarize the results of this assessment, orbital fire has grouped all findings from the penetration test into rollup findings. These rollup findings can be used to quickly determine the root cause of all issues identified in this assessment. It is highly recommended to implement a remediation strategy based on the rollup findings below to enhance security posture and overall defensibility.</w:t>
       </w:r>
     </w:p>
     <w:p>
@@ -4665,35 +4115,10 @@
       <w:r>
         <w:rPr>
           <w:rFonts w:ascii="Corbel" w:hAnsi="Corbel"/>
-        </w:rPr>
-        <w:t xml:space="preserve">1.    </w:t>
-      </w:r>
-      <w:r>
-        <w:rPr>
-          <w:rFonts w:ascii="Corbel" w:hAnsi="Corbel"/>
-          <w:b/>
-        </w:rPr>
-        <w:t>Subdomain Takeover Vulnerability</w:t>
-      </w:r>
-      <w:r>
-        <w:rPr>
-          <w:rFonts w:ascii="Corbel" w:hAnsi="Corbel"/>
-        </w:rPr>
-        <w:t xml:space="preserve"> - During testing, </w:t>
-      </w:r>
-      <w:proofErr w:type="spellStart"/>
-      <w:r>
-        <w:rPr>
-          <w:rFonts w:ascii="Corbel" w:hAnsi="Corbel"/>
-        </w:rPr>
-        <w:t>OrbitalFire</w:t>
-      </w:r>
-      <w:proofErr w:type="spellEnd"/>
-      <w:r>
-        <w:rPr>
-          <w:rFonts w:ascii="Corbel" w:hAnsi="Corbel"/>
-        </w:rPr>
-        <w:t xml:space="preserve"> identified a potential subdomain takeover vulnerability affecting one or more domains owned by [CUSTOMER NAME]. This issue typically results from misconfigured DNS records that reference unclaimed or deprovisioned third-party services, allowing an attacker to register the external resource and gain control of the associated subdomain. If exploited, an attacker could host malicious content, impersonate the organization, conduct phishing campaigns, or collect user data, posing a significant risk to brand reputation, user trust, and overall security posture.</w:t>
+          <w:color w:val="E6781F"/>
+          <w:sz w:val="24"/>
+        </w:rPr>
+        <w:t>1.    Subdomain Takeover Vulnerability - During testing, orbital fire identified a potential subdomain takeover vulnerability affecting one or more domains owned by orbital fire. This issue typically results from misconfigured DNS records that reference unclaimed or deprovisioned third-party services, allowing an attacker to register the external resource and gain control of the associated subdomain. If exploited, an attacker could host malicious content, impersonate the organization, conduct phishing campaigns, or collect user data, posing a significant risk to brand reputation, user trust, and overall security posture.</w:t>
       </w:r>
     </w:p>
     <w:p>
@@ -4833,35 +4258,10 @@
       <w:r>
         <w:rPr>
           <w:rFonts w:ascii="Corbel" w:hAnsi="Corbel"/>
-        </w:rPr>
-        <w:t xml:space="preserve">1.    </w:t>
-      </w:r>
-      <w:r>
-        <w:rPr>
-          <w:rFonts w:ascii="Corbel" w:hAnsi="Corbel"/>
-          <w:b/>
-        </w:rPr>
-        <w:t>Misconfigured DMARC Record</w:t>
-      </w:r>
-      <w:r>
-        <w:rPr>
-          <w:rFonts w:ascii="Corbel" w:hAnsi="Corbel"/>
-        </w:rPr>
-        <w:t xml:space="preserve"> - During testing, </w:t>
-      </w:r>
-      <w:proofErr w:type="spellStart"/>
-      <w:r>
-        <w:rPr>
-          <w:rFonts w:ascii="Corbel" w:hAnsi="Corbel"/>
-        </w:rPr>
-        <w:t>OrbitalFire</w:t>
-      </w:r>
-      <w:proofErr w:type="spellEnd"/>
-      <w:r>
-        <w:rPr>
-          <w:rFonts w:ascii="Corbel" w:hAnsi="Corbel"/>
-        </w:rPr>
-        <w:t xml:space="preserve"> identified that [CUSTOMER NAME] has a misconfigured DMARC (Domain-based Message Authentication, Reporting, and Conformance) record for one or more of their domain(s). DMARC is critical for verifying the authenticity of emails sent from the organization, serving as a vital barrier against email spoofing and phishing attacks. Without proper configuration, DMARC fails to instruct receiving mail servers on how to treat email messages from the organization's domain, thereby increasing vulnerability to attack.</w:t>
+          <w:color w:val="E6781F"/>
+          <w:sz w:val="24"/>
+        </w:rPr>
+        <w:t>1.    Misconfigured DMARC Record - During testing, orbital fire identified that orbital fire has a misconfigured DMARC (Domain-based Message Authentication, Reporting, and Conformance) record for one or more of their domain(s). DMARC is critical for verifying the authenticity of emails sent from the organization, serving as a vital barrier against email spoofing and phishing attacks. Without proper configuration, DMARC fails to instruct receiving mail servers on how to treat email messages from the organization's domain, thereby increasing vulnerability to attack.</w:t>
       </w:r>
     </w:p>
     <w:p>
@@ -4971,35 +4371,10 @@
       <w:r>
         <w:rPr>
           <w:rFonts w:ascii="Corbel" w:hAnsi="Corbel"/>
-        </w:rPr>
-        <w:t xml:space="preserve">2.    </w:t>
-      </w:r>
-      <w:r>
-        <w:rPr>
-          <w:rFonts w:ascii="Corbel" w:hAnsi="Corbel"/>
-          <w:b/>
-        </w:rPr>
-        <w:t>Remote SSH Service Exposed to Public Internet</w:t>
-      </w:r>
-      <w:r>
-        <w:rPr>
-          <w:rFonts w:ascii="Corbel" w:hAnsi="Corbel"/>
-        </w:rPr>
-        <w:t xml:space="preserve"> - During testing, </w:t>
-      </w:r>
-      <w:proofErr w:type="spellStart"/>
-      <w:r>
-        <w:rPr>
-          <w:rFonts w:ascii="Corbel" w:hAnsi="Corbel"/>
-        </w:rPr>
-        <w:t>OrbitalFire</w:t>
-      </w:r>
-      <w:proofErr w:type="spellEnd"/>
-      <w:r>
-        <w:rPr>
-          <w:rFonts w:ascii="Corbel" w:hAnsi="Corbel"/>
-        </w:rPr>
-        <w:t xml:space="preserve"> identified that remote administration services, including SSH, were exposed to the public internet. This exposure is often the result of misconfiguration or insufficient access controls, which significantly increase the attack surface. Publicly accessible SSH services are susceptible to brute-force and password-guessing attacks, which may lead to unauthorized system access. Additionally, newly disclosed vulnerabilities, including zero-day exploits, could be leveraged by threat actors to further compromise exposed systems.</w:t>
+          <w:color w:val="E6781F"/>
+          <w:sz w:val="24"/>
+        </w:rPr>
+        <w:t>2.    Remote SSH Service Exposed to Public Internet - During testing, orbital fire identified that remote administration services, including SSH, were exposed to the public internet. This exposure is often the result of misconfiguration or insufficient access controls, which significantly increase the attack surface. Publicly accessible SSH services are susceptible to brute-force and password-guessing attacks, which may lead to unauthorized system access. Additionally, newly disclosed vulnerabilities, including zero-day exploits, could be leveraged by threat actors to further compromise exposed systems.</w:t>
       </w:r>
     </w:p>
     <w:p>
@@ -6623,57 +5998,11 @@
       </w:pPr>
       <w:r>
         <w:rPr>
-          <w:rFonts w:ascii="Corbel" w:eastAsia="Calibri" w:hAnsi="Corbel" w:cs="Arial"/>
-          <w:color w:val="404040"/>
-          <w:kern w:val="0"/>
-          <w:szCs w:val="22"/>
-          <w14:ligatures w14:val="none"/>
-        </w:rPr>
-        <w:t xml:space="preserve">The following items are the </w:t>
-      </w:r>
-      <w:proofErr w:type="gramStart"/>
-      <w:r>
-        <w:rPr>
-          <w:rFonts w:ascii="Corbel" w:eastAsia="Calibri" w:hAnsi="Corbel" w:cs="Arial"/>
-          <w:color w:val="404040"/>
-          <w:kern w:val="0"/>
-          <w:szCs w:val="22"/>
-          <w14:ligatures w14:val="none"/>
-        </w:rPr>
-        <w:t>highest priority</w:t>
-      </w:r>
-      <w:proofErr w:type="gramEnd"/>
-      <w:r>
-        <w:rPr>
-          <w:rFonts w:ascii="Corbel" w:eastAsia="Calibri" w:hAnsi="Corbel" w:cs="Arial"/>
-          <w:color w:val="404040"/>
-          <w:kern w:val="0"/>
-          <w:szCs w:val="22"/>
-          <w14:ligatures w14:val="none"/>
-        </w:rPr>
-        <w:t xml:space="preserve"> recommendations to help improve compliance, defensibility and resilience. These items may not be fully inclusive of all discovered deficiencies and reflect </w:t>
-      </w:r>
-      <w:proofErr w:type="spellStart"/>
-      <w:r>
-        <w:rPr>
-          <w:rFonts w:ascii="Corbel" w:eastAsia="Calibri" w:hAnsi="Corbel" w:cs="Arial"/>
-          <w:color w:val="404040"/>
-          <w:kern w:val="0"/>
-          <w:szCs w:val="22"/>
-          <w14:ligatures w14:val="none"/>
-        </w:rPr>
-        <w:t>OrbitalFire’s</w:t>
-      </w:r>
-      <w:proofErr w:type="spellEnd"/>
-      <w:r>
-        <w:rPr>
-          <w:rFonts w:ascii="Corbel" w:eastAsia="Calibri" w:hAnsi="Corbel" w:cs="Arial"/>
-          <w:color w:val="404040"/>
-          <w:kern w:val="0"/>
-          <w:szCs w:val="22"/>
-          <w14:ligatures w14:val="none"/>
-        </w:rPr>
-        <w:t xml:space="preserve"> expert opinion regarding return on investment.</w:t>
+          <w:rFonts w:ascii="Corbel" w:hAnsi="Corbel"/>
+          <w:color w:val="E6781F"/>
+          <w:sz w:val="24"/>
+        </w:rPr>
+        <w:t>The following items are the highest priority recommendations to help improve compliance, defensibility and resilience. These items may not be fully inclusive of all discovered deficiencies and reflect orbital fire’s expert opinion regarding return on investment.</w:t>
       </w:r>
     </w:p>
     <w:p>
@@ -6692,93 +6021,11 @@
       </w:pPr>
       <w:r>
         <w:rPr>
-          <w:rFonts w:ascii="Corbel" w:eastAsia="Calibri" w:hAnsi="Corbel" w:cs="Arial"/>
-          <w:noProof/>
-          <w:color w:val="404040"/>
-          <w:kern w:val="0"/>
-          <w:szCs w:val="22"/>
-          <w14:ligatures w14:val="none"/>
-        </w:rPr>
-        <w:drawing>
-          <wp:inline distT="0" distB="0" distL="0" distR="0" wp14:anchorId="65BBC86C" wp14:editId="7004CF6B">
-            <wp:extent cx="152400" cy="152400"/>
-            <wp:effectExtent l="0" t="0" r="0" b="0"/>
-            <wp:docPr id="89909448" name="Picture 89909448" descr="Fire with solid fill"/>
-            <wp:cNvGraphicFramePr>
-              <a:graphicFrameLocks xmlns:a="http://schemas.openxmlformats.org/drawingml/2006/main" noChangeAspect="1"/>
-            </wp:cNvGraphicFramePr>
-            <a:graphic xmlns:a="http://schemas.openxmlformats.org/drawingml/2006/main">
-              <a:graphicData uri="http://schemas.openxmlformats.org/drawingml/2006/picture">
-                <pic:pic xmlns:pic="http://schemas.openxmlformats.org/drawingml/2006/picture">
-                  <pic:nvPicPr>
-                    <pic:cNvPr id="0" name="Picture 23" descr="Fire with solid fill"/>
-                    <pic:cNvPicPr>
-                      <a:picLocks noChangeAspect="1" noChangeArrowheads="1"/>
-                    </pic:cNvPicPr>
-                  </pic:nvPicPr>
-                  <pic:blipFill>
-                    <a:blip r:embed="rId20" cstate="print">
-                      <a:extLst>
-                        <a:ext uri="{28A0092B-C50C-407E-A947-70E740481C1C}">
-                          <a14:useLocalDpi xmlns:a14="http://schemas.microsoft.com/office/drawing/2010/main" val="0"/>
-                        </a:ext>
-                      </a:extLst>
-                    </a:blip>
-                    <a:srcRect/>
-                    <a:stretch>
-                      <a:fillRect/>
-                    </a:stretch>
-                  </pic:blipFill>
-                  <pic:spPr bwMode="auto">
-                    <a:xfrm>
-                      <a:off x="0" y="0"/>
-                      <a:ext cx="152400" cy="152400"/>
-                    </a:xfrm>
-                    <a:prstGeom prst="rect">
-                      <a:avLst/>
-                    </a:prstGeom>
-                    <a:noFill/>
-                    <a:ln>
-                      <a:noFill/>
-                    </a:ln>
-                  </pic:spPr>
-                </pic:pic>
-              </a:graphicData>
-            </a:graphic>
-          </wp:inline>
-        </w:drawing>
-      </w:r>
-      <w:r>
-        <w:rPr>
-          <w:rFonts w:ascii="Corbel" w:eastAsia="Calibri" w:hAnsi="Corbel" w:cs="Arial"/>
-          <w:color w:val="404040"/>
-          <w:kern w:val="0"/>
-          <w:szCs w:val="22"/>
-          <w14:ligatures w14:val="none"/>
-        </w:rPr>
-        <w:t xml:space="preserve"> – </w:t>
-      </w:r>
-      <w:proofErr w:type="spellStart"/>
-      <w:r>
-        <w:rPr>
-          <w:rFonts w:ascii="Corbel" w:eastAsia="Calibri" w:hAnsi="Corbel" w:cs="Arial"/>
-          <w:color w:val="404040"/>
-          <w:kern w:val="0"/>
-          <w:szCs w:val="22"/>
-          <w14:ligatures w14:val="none"/>
-        </w:rPr>
-        <w:t>OrbitalFire</w:t>
-      </w:r>
-      <w:proofErr w:type="spellEnd"/>
-      <w:r>
-        <w:rPr>
-          <w:rFonts w:ascii="Corbel" w:eastAsia="Calibri" w:hAnsi="Corbel" w:cs="Arial"/>
-          <w:color w:val="404040"/>
-          <w:kern w:val="0"/>
-          <w:szCs w:val="22"/>
-          <w14:ligatures w14:val="none"/>
-        </w:rPr>
-        <w:t xml:space="preserve"> can provide complete remediation</w:t>
+          <w:rFonts w:ascii="Corbel" w:hAnsi="Corbel"/>
+          <w:color w:val="E6781F"/>
+          <w:sz w:val="24"/>
+        </w:rPr>
+        <w:t xml:space="preserve"> – orbital fire can provide complete remediation</w:t>
       </w:r>
     </w:p>
     <w:p>
@@ -6797,104 +6044,12 @@
       </w:pPr>
       <w:r>
         <w:rPr>
-          <w:rFonts w:ascii="Corbel" w:eastAsia="Calibri" w:hAnsi="Corbel" w:cs="Arial"/>
-          <w:noProof/>
-          <w:color w:val="404040"/>
-          <w:kern w:val="0"/>
-          <w:szCs w:val="22"/>
-          <w14:ligatures w14:val="none"/>
-        </w:rPr>
-        <w:drawing>
-          <wp:inline distT="0" distB="0" distL="0" distR="0" wp14:anchorId="03962334" wp14:editId="779E62AB">
-            <wp:extent cx="152400" cy="152400"/>
-            <wp:effectExtent l="0" t="0" r="0" b="0"/>
-            <wp:docPr id="2011428596" name="Picture 2011428596" descr="Fire with solid fill"/>
-            <wp:cNvGraphicFramePr>
-              <a:graphicFrameLocks xmlns:a="http://schemas.openxmlformats.org/drawingml/2006/main" noChangeAspect="1"/>
-            </wp:cNvGraphicFramePr>
-            <a:graphic xmlns:a="http://schemas.openxmlformats.org/drawingml/2006/main">
-              <a:graphicData uri="http://schemas.openxmlformats.org/drawingml/2006/picture">
-                <pic:pic xmlns:pic="http://schemas.openxmlformats.org/drawingml/2006/picture">
-                  <pic:nvPicPr>
-                    <pic:cNvPr id="0" name="Picture 23" descr="Fire with solid fill"/>
-                    <pic:cNvPicPr>
-                      <a:picLocks noChangeAspect="1" noChangeArrowheads="1"/>
-                    </pic:cNvPicPr>
-                  </pic:nvPicPr>
-                  <pic:blipFill>
-                    <a:blip r:embed="rId21" cstate="print">
-                      <a:extLst>
-                        <a:ext uri="{BEBA8EAE-BF5A-486C-A8C5-ECC9F3942E4B}">
-                          <a14:imgProps xmlns:a14="http://schemas.microsoft.com/office/drawing/2010/main">
-                            <a14:imgLayer r:embed="rId22">
-                              <a14:imgEffect>
-                                <a14:saturation sat="0"/>
-                              </a14:imgEffect>
-                            </a14:imgLayer>
-                          </a14:imgProps>
-                        </a:ext>
-                        <a:ext uri="{28A0092B-C50C-407E-A947-70E740481C1C}">
-                          <a14:useLocalDpi xmlns:a14="http://schemas.microsoft.com/office/drawing/2010/main" val="0"/>
-                        </a:ext>
-                      </a:extLst>
-                    </a:blip>
-                    <a:srcRect/>
-                    <a:stretch>
-                      <a:fillRect/>
-                    </a:stretch>
-                  </pic:blipFill>
-                  <pic:spPr bwMode="auto">
-                    <a:xfrm>
-                      <a:off x="0" y="0"/>
-                      <a:ext cx="152400" cy="152400"/>
-                    </a:xfrm>
-                    <a:prstGeom prst="rect">
-                      <a:avLst/>
-                    </a:prstGeom>
-                    <a:noFill/>
-                    <a:ln>
-                      <a:noFill/>
-                    </a:ln>
-                  </pic:spPr>
-                </pic:pic>
-              </a:graphicData>
-            </a:graphic>
-          </wp:inline>
-        </w:drawing>
-      </w:r>
-      <w:r>
-        <w:rPr>
-          <w:rFonts w:ascii="Corbel" w:eastAsia="Calibri" w:hAnsi="Corbel" w:cs="Arial"/>
-          <w:color w:val="404040"/>
-          <w:kern w:val="0"/>
-          <w:szCs w:val="22"/>
-          <w14:ligatures w14:val="none"/>
-        </w:rPr>
-        <w:t xml:space="preserve"> – </w:t>
-      </w:r>
-      <w:proofErr w:type="spellStart"/>
-      <w:r>
-        <w:rPr>
-          <w:rFonts w:ascii="Corbel" w:eastAsia="Calibri" w:hAnsi="Corbel" w:cs="Arial"/>
-          <w:color w:val="404040"/>
-          <w:kern w:val="0"/>
-          <w:szCs w:val="22"/>
-          <w14:ligatures w14:val="none"/>
-        </w:rPr>
-        <w:t>OrbitalFire</w:t>
-      </w:r>
-      <w:proofErr w:type="spellEnd"/>
-      <w:r>
-        <w:rPr>
-          <w:rFonts w:ascii="Corbel" w:eastAsia="Calibri" w:hAnsi="Corbel" w:cs="Arial"/>
-          <w:color w:val="404040"/>
-          <w:kern w:val="0"/>
-          <w:szCs w:val="22"/>
-          <w14:ligatures w14:val="none"/>
-        </w:rPr>
-        <w:t xml:space="preserve"> can assist with remediation</w:t>
-      </w:r>
-      <w:bookmarkStart w:id="14" w:name="_Hlk194407007"/>
+          <w:rFonts w:ascii="Corbel" w:hAnsi="Corbel"/>
+          <w:color w:val="E6781F"/>
+          <w:sz w:val="24"/>
+        </w:rPr>
+        <w:t xml:space="preserve"> – orbital fire can assist with remediation</w:t>
+      </w:r>
     </w:p>
     <w:bookmarkEnd w:id="14"/>
     <w:p>

</xml_diff>

<commit_message>
Implement discovered threat totals and findings summary graph insertion
</commit_message>
<xml_diff>
--- a/Source_Code/Reports/Sample499/FindingsReportTest.docx
+++ b/Source_Code/Reports/Sample499/FindingsReportTest.docx
@@ -3750,6 +3750,162 @@
           <w14:ligatures w14:val="none"/>
         </w:rPr>
         <w:t xml:space="preserve"> </w:t>
+      </w:r>
+    </w:p>
+    <w:p>
+      <w:pPr>
+        <w:spacing w:before="120" w:after="160"/>
+      </w:pPr>
+      <w:r>
+        <w:drawing>
+          <wp:inline xmlns:a="http://schemas.openxmlformats.org/drawingml/2006/main" xmlns:pic="http://schemas.openxmlformats.org/drawingml/2006/picture">
+            <wp:extent cx="3840480" cy="3848464"/>
+            <wp:docPr id="2011428612" name="Picture 2011428612"/>
+            <wp:cNvGraphicFramePr>
+              <a:graphicFrameLocks noChangeAspect="1"/>
+            </wp:cNvGraphicFramePr>
+            <a:graphic>
+              <a:graphicData uri="http://schemas.openxmlformats.org/drawingml/2006/picture">
+                <pic:pic>
+                  <pic:nvPicPr>
+                    <pic:cNvPr id="0" name="image.png"/>
+                    <pic:cNvPicPr/>
+                  </pic:nvPicPr>
+                  <pic:blipFill>
+                    <a:blip r:embed="rId26"/>
+                    <a:stretch>
+                      <a:fillRect/>
+                    </a:stretch>
+                  </pic:blipFill>
+                  <pic:spPr>
+                    <a:xfrm>
+                      <a:off x="0" y="0"/>
+                      <a:ext cx="3840480" cy="3848464"/>
+                    </a:xfrm>
+                    <a:prstGeom prst="rect"/>
+                  </pic:spPr>
+                </pic:pic>
+              </a:graphicData>
+            </a:graphic>
+          </wp:inline>
+        </w:drawing>
+      </w:r>
+    </w:p>
+    <w:p>
+      <w:pPr>
+        <w:spacing w:before="120" w:after="160"/>
+      </w:pPr>
+      <w:r>
+        <w:drawing>
+          <wp:inline xmlns:a="http://schemas.openxmlformats.org/drawingml/2006/main" xmlns:pic="http://schemas.openxmlformats.org/drawingml/2006/picture">
+            <wp:extent cx="5486400" cy="3017520"/>
+            <wp:docPr id="2011428613" name="Picture 2011428613"/>
+            <wp:cNvGraphicFramePr>
+              <a:graphicFrameLocks noChangeAspect="1"/>
+            </wp:cNvGraphicFramePr>
+            <a:graphic>
+              <a:graphicData uri="http://schemas.openxmlformats.org/drawingml/2006/picture">
+                <pic:pic>
+                  <pic:nvPicPr>
+                    <pic:cNvPr id="0" name="image.png"/>
+                    <pic:cNvPicPr/>
+                  </pic:nvPicPr>
+                  <pic:blipFill>
+                    <a:blip r:embed="rId27"/>
+                    <a:stretch>
+                      <a:fillRect/>
+                    </a:stretch>
+                  </pic:blipFill>
+                  <pic:spPr>
+                    <a:xfrm>
+                      <a:off x="0" y="0"/>
+                      <a:ext cx="5486400" cy="3017520"/>
+                    </a:xfrm>
+                    <a:prstGeom prst="rect"/>
+                  </pic:spPr>
+                </pic:pic>
+              </a:graphicData>
+            </a:graphic>
+          </wp:inline>
+        </w:drawing>
+      </w:r>
+    </w:p>
+    <w:p>
+      <w:pPr>
+        <w:spacing w:before="120" w:after="160"/>
+      </w:pPr>
+      <w:r>
+        <w:drawing>
+          <wp:inline xmlns:a="http://schemas.openxmlformats.org/drawingml/2006/main" xmlns:pic="http://schemas.openxmlformats.org/drawingml/2006/picture">
+            <wp:extent cx="3840480" cy="3848464"/>
+            <wp:docPr id="2011428610" name="Picture 2011428610"/>
+            <wp:cNvGraphicFramePr>
+              <a:graphicFrameLocks noChangeAspect="1"/>
+            </wp:cNvGraphicFramePr>
+            <a:graphic>
+              <a:graphicData uri="http://schemas.openxmlformats.org/drawingml/2006/picture">
+                <pic:pic>
+                  <pic:nvPicPr>
+                    <pic:cNvPr id="0" name="findings_donut.png"/>
+                    <pic:cNvPicPr/>
+                  </pic:nvPicPr>
+                  <pic:blipFill>
+                    <a:blip r:embed="rId26"/>
+                    <a:stretch>
+                      <a:fillRect/>
+                    </a:stretch>
+                  </pic:blipFill>
+                  <pic:spPr>
+                    <a:xfrm>
+                      <a:off x="0" y="0"/>
+                      <a:ext cx="3840480" cy="3848464"/>
+                    </a:xfrm>
+                    <a:prstGeom prst="rect"/>
+                  </pic:spPr>
+                </pic:pic>
+              </a:graphicData>
+            </a:graphic>
+          </wp:inline>
+        </w:drawing>
+      </w:r>
+    </w:p>
+    <w:p>
+      <w:pPr>
+        <w:spacing w:before="120" w:after="160"/>
+      </w:pPr>
+      <w:r>
+        <w:drawing>
+          <wp:inline xmlns:a="http://schemas.openxmlformats.org/drawingml/2006/main" xmlns:pic="http://schemas.openxmlformats.org/drawingml/2006/picture">
+            <wp:extent cx="5486400" cy="3017520"/>
+            <wp:docPr id="2011428611" name="Picture 2011428611"/>
+            <wp:cNvGraphicFramePr>
+              <a:graphicFrameLocks noChangeAspect="1"/>
+            </wp:cNvGraphicFramePr>
+            <a:graphic>
+              <a:graphicData uri="http://schemas.openxmlformats.org/drawingml/2006/picture">
+                <pic:pic>
+                  <pic:nvPicPr>
+                    <pic:cNvPr id="0" name="findings_line.png"/>
+                    <pic:cNvPicPr/>
+                  </pic:nvPicPr>
+                  <pic:blipFill>
+                    <a:blip r:embed="rId27"/>
+                    <a:stretch>
+                      <a:fillRect/>
+                    </a:stretch>
+                  </pic:blipFill>
+                  <pic:spPr>
+                    <a:xfrm>
+                      <a:off x="0" y="0"/>
+                      <a:ext cx="5486400" cy="3017520"/>
+                    </a:xfrm>
+                    <a:prstGeom prst="rect"/>
+                  </pic:spPr>
+                </pic:pic>
+              </a:graphicData>
+            </a:graphic>
+          </wp:inline>
+        </w:drawing>
       </w:r>
     </w:p>
     <w:p>

</xml_diff>

<commit_message>
Fixed Exploitation, added front end UI for Informational, Exploitation, and Findings Summary. Findings Summary and Informational still need to be finished
</commit_message>
<xml_diff>
--- a/Source_Code/Reports/Sample499/FindingsReportTest.docx
+++ b/Source_Code/Reports/Sample499/FindingsReportTest.docx
@@ -600,7 +600,7 @@
           <w14:ligatures w14:val="none"/>
         </w:rPr>
         <w:drawing>
-          <wp:anchor distT="0" distB="0" distL="114300" distR="114300" simplePos="0" relativeHeight="251662336" behindDoc="0" locked="0" layoutInCell="1" allowOverlap="1" wp14:anchorId="56FF54E8" wp14:editId="123C2C9D">
+          <wp:anchor distT="0" distB="0" distL="114300" distR="114300" simplePos="0" relativeHeight="251662336" behindDoc="0" locked="0" layoutInCell="1" allowOverlap="1" wp14:anchorId="56FF54E8" wp14:editId="702D07A6">
             <wp:simplePos x="0" y="0"/>
             <wp:positionH relativeFrom="margin">
               <wp:posOffset>1163955</wp:posOffset>
@@ -1107,11 +1107,48 @@
       </w:pPr>
       <w:r>
         <w:rPr>
-          <w:rFonts w:ascii="Corbel" w:hAnsi="Corbel"/>
-          <w:color w:val="E6781F"/>
-          <w:sz w:val="24"/>
-        </w:rPr>
-        <w:t>The information contained in this document is confidential and proprietary. It is intended for the exclusive use of orbital fire, LLC and the Customer entity named in this document.</w:t>
+          <w:rFonts w:ascii="Corbel" w:eastAsia="Calibri" w:hAnsi="Corbel" w:cs="Arial"/>
+          <w:color w:val="404040"/>
+          <w:kern w:val="0"/>
+          <w:szCs w:val="22"/>
+          <w14:ligatures w14:val="none"/>
+        </w:rPr>
+        <w:t xml:space="preserve">The information </w:t>
+      </w:r>
+      <w:r>
+        <w:rPr>
+          <w:rFonts w:ascii="Corbel" w:eastAsia="Calibri" w:hAnsi="Corbel" w:cs="Arial"/>
+          <w:snapToGrid w:val="0"/>
+          <w:color w:val="404040"/>
+          <w:kern w:val="0"/>
+          <w:szCs w:val="22"/>
+          <w14:ligatures w14:val="none"/>
+        </w:rPr>
+        <w:t xml:space="preserve">contained in this document is confidential and proprietary. It is intended for the exclusive use of </w:t>
+      </w:r>
+      <w:proofErr w:type="spellStart"/>
+      <w:r>
+        <w:rPr>
+          <w:rFonts w:ascii="Corbel" w:eastAsia="Calibri" w:hAnsi="Corbel" w:cs="Arial"/>
+          <w:snapToGrid w:val="0"/>
+          <w:color w:val="404040"/>
+          <w:kern w:val="0"/>
+          <w:szCs w:val="22"/>
+          <w14:ligatures w14:val="none"/>
+        </w:rPr>
+        <w:t>OrbitalFire</w:t>
+      </w:r>
+      <w:proofErr w:type="spellEnd"/>
+      <w:r>
+        <w:rPr>
+          <w:rFonts w:ascii="Corbel" w:eastAsia="Calibri" w:hAnsi="Corbel" w:cs="Arial"/>
+          <w:snapToGrid w:val="0"/>
+          <w:color w:val="404040"/>
+          <w:kern w:val="0"/>
+          <w:szCs w:val="22"/>
+          <w14:ligatures w14:val="none"/>
+        </w:rPr>
+        <w:t>, LLC and the Customer entity named in this document.</w:t>
       </w:r>
     </w:p>
     <w:p>
@@ -1953,29 +1990,7 @@
           <w:szCs w:val="22"/>
           <w14:ligatures w14:val="none"/>
         </w:rPr>
-        <w:t xml:space="preserve"> Institute conducted a study on the cost of data breaches that surveyed 350 organizations from 11 different countries that had suffered some type of cybercrime. Nearly half </w:t>
-      </w:r>
-      <w:proofErr w:type="gramStart"/>
-      <w:r>
-        <w:rPr>
-          <w:rFonts w:ascii="Corbel" w:eastAsia="Calibri" w:hAnsi="Corbel" w:cs="Arial"/>
-          <w:color w:val="404040"/>
-          <w:kern w:val="0"/>
-          <w:szCs w:val="22"/>
-          <w14:ligatures w14:val="none"/>
-        </w:rPr>
-        <w:t>of</w:t>
-      </w:r>
-      <w:proofErr w:type="gramEnd"/>
-      <w:r>
-        <w:rPr>
-          <w:rFonts w:ascii="Corbel" w:eastAsia="Calibri" w:hAnsi="Corbel" w:cs="Arial"/>
-          <w:color w:val="404040"/>
-          <w:kern w:val="0"/>
-          <w:szCs w:val="22"/>
-          <w14:ligatures w14:val="none"/>
-        </w:rPr>
-        <w:t xml:space="preserve"> said these incidents (47%) were the result of malicious actors who were able to compromise company networks to steal money, intellectual property or other protected data.</w:t>
+        <w:t xml:space="preserve"> Institute conducted a study on the cost of data breaches that surveyed 350 organizations from 11 different countries that had suffered some type of cybercrime. Nearly half of said these incidents (47%) were the result of malicious actors who were able to compromise company networks to steal money, intellectual property or other protected data.</w:t>
       </w:r>
     </w:p>
     <w:p>
@@ -2297,29 +2312,7 @@
           <w:szCs w:val="22"/>
           <w14:ligatures w14:val="none"/>
         </w:rPr>
-        <w:t xml:space="preserve">Without well-defined goals, boundaries and operational guidance, penetration testing can become </w:t>
-      </w:r>
-      <w:proofErr w:type="gramStart"/>
-      <w:r>
-        <w:rPr>
-          <w:rFonts w:ascii="Corbel" w:eastAsia="Calibri" w:hAnsi="Corbel" w:cs="Arial"/>
-          <w:color w:val="404040"/>
-          <w:kern w:val="0"/>
-          <w:szCs w:val="22"/>
-          <w14:ligatures w14:val="none"/>
-        </w:rPr>
-        <w:t>disruptive, or</w:t>
-      </w:r>
-      <w:proofErr w:type="gramEnd"/>
-      <w:r>
-        <w:rPr>
-          <w:rFonts w:ascii="Corbel" w:eastAsia="Calibri" w:hAnsi="Corbel" w:cs="Arial"/>
-          <w:color w:val="404040"/>
-          <w:kern w:val="0"/>
-          <w:szCs w:val="22"/>
-          <w14:ligatures w14:val="none"/>
-        </w:rPr>
-        <w:t xml:space="preserve"> even damaging to the organization undergoing testing. For these reasons these operational guidelines are carefully communicated and resolved.</w:t>
+        <w:t>Without well-defined goals, boundaries and operational guidance, penetration testing can become disruptive, or even damaging to the organization undergoing testing. For these reasons these operational guidelines are carefully communicated and resolved.</w:t>
       </w:r>
     </w:p>
     <w:p>
@@ -2951,51 +2944,7 @@
           <w:szCs w:val="22"/>
           <w14:ligatures w14:val="none"/>
         </w:rPr>
-        <w:t xml:space="preserve">Penetration testing can be </w:t>
-      </w:r>
-      <w:proofErr w:type="gramStart"/>
-      <w:r>
-        <w:rPr>
-          <w:rFonts w:ascii="Corbel" w:eastAsia="Calibri" w:hAnsi="Corbel" w:cs="Arial"/>
-          <w:color w:val="404040"/>
-          <w:kern w:val="0"/>
-          <w:szCs w:val="22"/>
-          <w14:ligatures w14:val="none"/>
-        </w:rPr>
-        <w:t>conducted</w:t>
-      </w:r>
-      <w:proofErr w:type="gramEnd"/>
-      <w:r>
-        <w:rPr>
-          <w:rFonts w:ascii="Corbel" w:eastAsia="Calibri" w:hAnsi="Corbel" w:cs="Arial"/>
-          <w:color w:val="404040"/>
-          <w:kern w:val="0"/>
-          <w:szCs w:val="22"/>
-          <w14:ligatures w14:val="none"/>
-        </w:rPr>
-        <w:t xml:space="preserve"> many </w:t>
-      </w:r>
-      <w:proofErr w:type="gramStart"/>
-      <w:r>
-        <w:rPr>
-          <w:rFonts w:ascii="Corbel" w:eastAsia="Calibri" w:hAnsi="Corbel" w:cs="Arial"/>
-          <w:color w:val="404040"/>
-          <w:kern w:val="0"/>
-          <w:szCs w:val="22"/>
-          <w14:ligatures w14:val="none"/>
-        </w:rPr>
-        <w:t>ways,</w:t>
-      </w:r>
-      <w:proofErr w:type="gramEnd"/>
-      <w:r>
-        <w:rPr>
-          <w:rFonts w:ascii="Corbel" w:eastAsia="Calibri" w:hAnsi="Corbel" w:cs="Arial"/>
-          <w:color w:val="404040"/>
-          <w:kern w:val="0"/>
-          <w:szCs w:val="22"/>
-          <w14:ligatures w14:val="none"/>
-        </w:rPr>
-        <w:t xml:space="preserve"> the following describe the methodologies utilized for this test:</w:t>
+        <w:t>Penetration testing can be conducted many ways, the following describe the methodologies utilized for this test:</w:t>
       </w:r>
     </w:p>
     <w:p>
@@ -3302,27 +3251,15 @@
         </w:rPr>
         <w:t xml:space="preserve"> </w:t>
       </w:r>
-      <w:proofErr w:type="gramStart"/>
-      <w:r>
-        <w:rPr>
-          <w:rFonts w:ascii="Corbel" w:eastAsia="Calibri" w:hAnsi="Corbel" w:cs="Arial"/>
-          <w:color w:val="404040"/>
-          <w:kern w:val="0"/>
-          <w:szCs w:val="22"/>
-          <w14:ligatures w14:val="none"/>
-        </w:rPr>
-        <w:t>–  Findings</w:t>
-      </w:r>
-      <w:proofErr w:type="gramEnd"/>
-      <w:r>
-        <w:rPr>
-          <w:rFonts w:ascii="Corbel" w:eastAsia="Calibri" w:hAnsi="Corbel" w:cs="Arial"/>
-          <w:color w:val="404040"/>
-          <w:kern w:val="0"/>
-          <w:szCs w:val="22"/>
-          <w14:ligatures w14:val="none"/>
-        </w:rPr>
-        <w:t xml:space="preserve"> that have a moderate impact on the security of the system or application and require timely attention</w:t>
+      <w:r>
+        <w:rPr>
+          <w:rFonts w:ascii="Corbel" w:eastAsia="Calibri" w:hAnsi="Corbel" w:cs="Arial"/>
+          <w:color w:val="404040"/>
+          <w:kern w:val="0"/>
+          <w:szCs w:val="22"/>
+          <w14:ligatures w14:val="none"/>
+        </w:rPr>
+        <w:t>–  Findings that have a moderate impact on the security of the system or application and require timely attention</w:t>
       </w:r>
     </w:p>
     <w:p>
@@ -3644,31 +3581,562 @@
       </w:pPr>
       <w:r>
         <w:rPr>
-          <w:rFonts w:ascii="Corbel" w:hAnsi="Corbel"/>
-          <w:color w:val="E6781F"/>
-          <w:sz w:val="24"/>
+          <w:rFonts w:ascii="Corbel" w:eastAsia="Calibri" w:hAnsi="Corbel" w:cs="Arial"/>
+          <w:color w:val="404040"/>
+          <w:kern w:val="0"/>
+          <w:szCs w:val="22"/>
+          <w14:ligatures w14:val="none"/>
         </w:rPr>
         <w:t>Listed below is an overview of actions performed during the testing process. It should be noted that this portion of the report does not represent the entire list of activities that were performed during this assessment.</w:t>
+      </w:r>
+      <w:r>
+        <w:rPr>
+          <w:rFonts w:ascii="Corbel" w:eastAsia="Calibri" w:hAnsi="Corbel" w:cs="Arial"/>
+          <w:color w:val="404040"/>
+          <w:kern w:val="0"/>
+          <w:szCs w:val="22"/>
+          <w14:ligatures w14:val="none"/>
+        </w:rPr>
         <w:br/>
+      </w:r>
+      <w:r>
+        <w:rPr>
+          <w:rFonts w:ascii="Corbel" w:eastAsia="Calibri" w:hAnsi="Corbel" w:cs="Arial"/>
+          <w:b/>
+          <w:bCs/>
+          <w:color w:val="404040"/>
+          <w:kern w:val="0"/>
+          <w:szCs w:val="22"/>
+          <w14:ligatures w14:val="none"/>
+        </w:rPr>
         <w:br/>
-        <w:t>HOST DISCOVERY  INTERNAL NETWORK ASSESSMENT</w:t>
+        <w:t xml:space="preserve">HOST DISCOVERY </w:t>
+      </w:r>
+      <w:r>
+        <w:rPr>
+          <w:rFonts w:ascii="Corbel" w:eastAsia="Calibri" w:hAnsi="Corbel" w:cs="Arial"/>
+          <w:b/>
+          <w:bCs/>
+          <w:color w:val="F06023"/>
+          <w:kern w:val="0"/>
+          <w:sz w:val="20"/>
+          <w:szCs w:val="20"/>
+          <w14:ligatures w14:val="none"/>
+        </w:rPr>
+        <w:t xml:space="preserve"> </w:t>
+      </w:r>
+      <w:r>
+        <w:rPr>
+          <w:rFonts w:ascii="Corbel" w:eastAsia="Calibri" w:hAnsi="Corbel" w:cs="Arial"/>
+          <w:b/>
+          <w:bCs/>
+          <w:color w:val="F06023"/>
+          <w:kern w:val="0"/>
+          <w:sz w:val="20"/>
+          <w:szCs w:val="20"/>
+          <w:highlight w:val="yellow"/>
+          <w14:ligatures w14:val="none"/>
+        </w:rPr>
+        <w:t>INTERNAL NETWORK ASSESSMENT</w:t>
+      </w:r>
+      <w:r>
+        <w:rPr>
+          <w:rFonts w:ascii="Corbel" w:eastAsia="Calibri" w:hAnsi="Corbel" w:cs="Arial"/>
+          <w:b/>
+          <w:bCs/>
+          <w:color w:val="404040"/>
+          <w:kern w:val="0"/>
+          <w:szCs w:val="22"/>
+          <w14:ligatures w14:val="none"/>
+        </w:rPr>
         <w:br/>
-        <w:t>The host discovery phase included port scanning, ping sweeps and more, to identify active systems within the environment. Of the one (1) network range that was provided as part of scope, orbital fire was able to identify a total of one (1) systems to be active within the targeted environment. In result of the one (1) addresses that were scanned, orbital fire found three (3) open ports.</w:t>
+      </w:r>
+      <w:r>
+        <w:rPr>
+          <w:rFonts w:ascii="Corbel" w:eastAsia="Calibri" w:hAnsi="Corbel" w:cs="Arial"/>
+          <w:color w:val="404040"/>
+          <w:kern w:val="0"/>
+          <w:szCs w:val="22"/>
+          <w14:ligatures w14:val="none"/>
+        </w:rPr>
+        <w:t xml:space="preserve">The host discovery phase included port scanning, ping sweeps and more, to identify active systems within the environment. Of the </w:t>
+      </w:r>
+      <w:r>
+        <w:rPr>
+          <w:rFonts w:ascii="Corbel" w:eastAsia="Calibri" w:hAnsi="Corbel" w:cs="Arial"/>
+          <w:color w:val="404040"/>
+          <w:kern w:val="0"/>
+          <w:szCs w:val="22"/>
+          <w14:ligatures w14:val="none"/>
+        </w:rPr>
+        <w:t xml:space="preserve">[NETWORK RANGE] </w:t>
+      </w:r>
+      <w:r>
+        <w:rPr>
+          <w:rFonts w:ascii="Corbel" w:eastAsia="Calibri" w:hAnsi="Corbel" w:cs="Arial"/>
+          <w:color w:val="404040"/>
+          <w:kern w:val="0"/>
+          <w:szCs w:val="22"/>
+          <w14:ligatures w14:val="none"/>
+        </w:rPr>
+        <w:t xml:space="preserve">[NETWORK RANGE WORD] </w:t>
+      </w:r>
+      <w:r>
+        <w:rPr>
+          <w:rFonts w:ascii="Corbel" w:eastAsia="Calibri" w:hAnsi="Corbel" w:cs="Arial"/>
+          <w:color w:val="404040"/>
+          <w:kern w:val="0"/>
+          <w:szCs w:val="22"/>
+          <w14:ligatures w14:val="none"/>
+        </w:rPr>
+        <w:t xml:space="preserve">that </w:t>
+      </w:r>
+      <w:r>
+        <w:rPr>
+          <w:rFonts w:ascii="Corbel" w:eastAsia="Calibri" w:hAnsi="Corbel" w:cs="Arial"/>
+          <w:color w:val="404040"/>
+          <w:kern w:val="0"/>
+          <w:szCs w:val="22"/>
+          <w14:ligatures w14:val="none"/>
+        </w:rPr>
+        <w:t xml:space="preserve">[NETWORK RANGE VERB] </w:t>
+      </w:r>
+      <w:r>
+        <w:rPr>
+          <w:rFonts w:ascii="Corbel" w:eastAsia="Calibri" w:hAnsi="Corbel" w:cs="Arial"/>
+          <w:color w:val="404040"/>
+          <w:kern w:val="0"/>
+          <w:szCs w:val="22"/>
+          <w14:ligatures w14:val="none"/>
+        </w:rPr>
+        <w:t xml:space="preserve">provided as part of scope, </w:t>
+      </w:r>
+      <w:proofErr w:type="spellStart"/>
+      <w:r>
+        <w:rPr>
+          <w:rFonts w:ascii="Corbel" w:eastAsia="Calibri" w:hAnsi="Corbel" w:cs="Arial"/>
+          <w:color w:val="404040"/>
+          <w:kern w:val="0"/>
+          <w:szCs w:val="22"/>
+          <w14:ligatures w14:val="none"/>
+        </w:rPr>
+        <w:t>OrbitalFire</w:t>
+      </w:r>
+      <w:proofErr w:type="spellEnd"/>
+      <w:r>
+        <w:rPr>
+          <w:rFonts w:ascii="Corbel" w:eastAsia="Calibri" w:hAnsi="Corbel" w:cs="Arial"/>
+          <w:color w:val="404040"/>
+          <w:kern w:val="0"/>
+          <w:szCs w:val="22"/>
+          <w14:ligatures w14:val="none"/>
+        </w:rPr>
+        <w:t xml:space="preserve"> was able to identify a total of </w:t>
+      </w:r>
+      <w:r>
+        <w:rPr>
+          <w:rFonts w:ascii="Corbel" w:eastAsia="Calibri" w:hAnsi="Corbel" w:cs="Arial"/>
+          <w:color w:val="404040"/>
+          <w:kern w:val="0"/>
+          <w:szCs w:val="22"/>
+          <w14:ligatures w14:val="none"/>
+        </w:rPr>
+        <w:t xml:space="preserve">[SYSTEMS] </w:t>
+      </w:r>
+      <w:r>
+        <w:rPr>
+          <w:rFonts w:ascii="Corbel" w:eastAsia="Calibri" w:hAnsi="Corbel" w:cs="Arial"/>
+          <w:color w:val="404040"/>
+          <w:kern w:val="0"/>
+          <w:szCs w:val="22"/>
+          <w14:ligatures w14:val="none"/>
+        </w:rPr>
+        <w:t>[SYSTEM WORD]</w:t>
+      </w:r>
+      <w:r>
+        <w:rPr>
+          <w:rFonts w:ascii="Corbel" w:eastAsia="Calibri" w:hAnsi="Corbel" w:cs="Arial"/>
+          <w:color w:val="404040"/>
+          <w:kern w:val="0"/>
+          <w:szCs w:val="22"/>
+          <w14:ligatures w14:val="none"/>
+        </w:rPr>
+        <w:t xml:space="preserve"> to be active within the targeted environment. In result of the </w:t>
+      </w:r>
+      <w:r>
+        <w:rPr>
+          <w:rFonts w:ascii="Corbel" w:eastAsia="Calibri" w:hAnsi="Corbel" w:cs="Arial"/>
+          <w:color w:val="404040"/>
+          <w:kern w:val="0"/>
+          <w:szCs w:val="22"/>
+          <w14:ligatures w14:val="none"/>
+        </w:rPr>
+        <w:t xml:space="preserve">[ADDRESSES] </w:t>
+      </w:r>
+      <w:r>
+        <w:rPr>
+          <w:rFonts w:ascii="Corbel" w:eastAsia="Calibri" w:hAnsi="Corbel" w:cs="Arial"/>
+          <w:color w:val="404040"/>
+          <w:kern w:val="0"/>
+          <w:szCs w:val="22"/>
+          <w14:ligatures w14:val="none"/>
+        </w:rPr>
+        <w:t>[ADDRESS WORD]</w:t>
+      </w:r>
+      <w:r>
+        <w:rPr>
+          <w:rFonts w:ascii="Corbel" w:eastAsia="Calibri" w:hAnsi="Corbel" w:cs="Arial"/>
+          <w:color w:val="404040"/>
+          <w:kern w:val="0"/>
+          <w:szCs w:val="22"/>
+          <w14:ligatures w14:val="none"/>
+        </w:rPr>
+        <w:t xml:space="preserve"> that </w:t>
+      </w:r>
+      <w:r>
+        <w:rPr>
+          <w:rFonts w:ascii="Corbel" w:eastAsia="Calibri" w:hAnsi="Corbel" w:cs="Arial"/>
+          <w:color w:val="404040"/>
+          <w:kern w:val="0"/>
+          <w:szCs w:val="22"/>
+          <w14:ligatures w14:val="none"/>
+        </w:rPr>
+        <w:t>[ADDRESS VERB]</w:t>
+      </w:r>
+      <w:r>
+        <w:rPr>
+          <w:rFonts w:ascii="Corbel" w:eastAsia="Calibri" w:hAnsi="Corbel" w:cs="Arial"/>
+          <w:color w:val="404040"/>
+          <w:kern w:val="0"/>
+          <w:szCs w:val="22"/>
+          <w14:ligatures w14:val="none"/>
+        </w:rPr>
+        <w:t xml:space="preserve"> scanned, </w:t>
+      </w:r>
+      <w:proofErr w:type="spellStart"/>
+      <w:r>
+        <w:rPr>
+          <w:rFonts w:ascii="Corbel" w:eastAsia="Calibri" w:hAnsi="Corbel" w:cs="Arial"/>
+          <w:color w:val="404040"/>
+          <w:kern w:val="0"/>
+          <w:szCs w:val="22"/>
+          <w14:ligatures w14:val="none"/>
+        </w:rPr>
+        <w:t>OrbitalFire</w:t>
+      </w:r>
+      <w:proofErr w:type="spellEnd"/>
+      <w:r>
+        <w:rPr>
+          <w:rFonts w:ascii="Corbel" w:eastAsia="Calibri" w:hAnsi="Corbel" w:cs="Arial"/>
+          <w:color w:val="404040"/>
+          <w:kern w:val="0"/>
+          <w:szCs w:val="22"/>
+          <w14:ligatures w14:val="none"/>
+        </w:rPr>
+        <w:t xml:space="preserve"> found </w:t>
+      </w:r>
+      <w:r>
+        <w:rPr>
+          <w:rFonts w:ascii="Corbel" w:eastAsia="Calibri" w:hAnsi="Corbel" w:cs="Arial"/>
+          <w:color w:val="404040"/>
+          <w:kern w:val="0"/>
+          <w:szCs w:val="22"/>
+          <w14:ligatures w14:val="none"/>
+        </w:rPr>
+        <w:t>[OPEN PORTS]</w:t>
+      </w:r>
+      <w:r>
+        <w:rPr>
+          <w:rFonts w:ascii="Corbel" w:eastAsia="Calibri" w:hAnsi="Corbel" w:cs="Arial"/>
+          <w:color w:val="404040"/>
+          <w:kern w:val="0"/>
+          <w:szCs w:val="22"/>
+          <w14:ligatures w14:val="none"/>
+        </w:rPr>
+        <w:t xml:space="preserve"> [OPEN PORT WORD]</w:t>
+      </w:r>
+      <w:r>
+        <w:rPr>
+          <w:rFonts w:ascii="Corbel" w:eastAsia="Calibri" w:hAnsi="Corbel" w:cs="Arial"/>
+          <w:color w:val="404040"/>
+          <w:kern w:val="0"/>
+          <w:szCs w:val="22"/>
+          <w14:ligatures w14:val="none"/>
+        </w:rPr>
+        <w:t>.</w:t>
+      </w:r>
+      <w:r>
+        <w:rPr>
+          <w:rFonts w:ascii="Corbel" w:eastAsia="Calibri" w:hAnsi="Corbel" w:cs="Arial"/>
+          <w:color w:val="404040"/>
+          <w:kern w:val="0"/>
+          <w:szCs w:val="22"/>
+          <w14:ligatures w14:val="none"/>
+        </w:rPr>
         <w:br/>
+      </w:r>
+      <w:r>
+        <w:rPr>
+          <w:rFonts w:ascii="Corbel" w:eastAsia="Calibri" w:hAnsi="Corbel" w:cs="Arial"/>
+          <w:b/>
+          <w:bCs/>
+          <w:color w:val="404040"/>
+          <w:kern w:val="0"/>
+          <w:szCs w:val="22"/>
+          <w14:ligatures w14:val="none"/>
+        </w:rPr>
         <w:br/>
         <w:t>ENUMERATION</w:t>
+      </w:r>
+      <w:r>
+        <w:rPr>
+          <w:rFonts w:ascii="Corbel" w:eastAsia="Calibri" w:hAnsi="Corbel" w:cs="Arial"/>
+          <w:b/>
+          <w:bCs/>
+          <w:color w:val="404040"/>
+          <w:kern w:val="0"/>
+          <w:szCs w:val="22"/>
+          <w14:ligatures w14:val="none"/>
+        </w:rPr>
         <w:br/>
-        <w:t>After the identification of all available hosts within the network, orbital fire then conducted enumeration. Enumeration during this assessment consisted of scanning the identified ports to determine which services are running (if any). Additional scans were then performed based on running services to attempt enumerating information (if possible).</w:t>
+      </w:r>
+      <w:r>
+        <w:rPr>
+          <w:rFonts w:ascii="Corbel" w:eastAsia="Calibri" w:hAnsi="Corbel" w:cs="Arial"/>
+          <w:color w:val="404040"/>
+          <w:kern w:val="0"/>
+          <w:szCs w:val="22"/>
+          <w14:ligatures w14:val="none"/>
+        </w:rPr>
+        <w:t xml:space="preserve">After the identification of all available hosts within the network, </w:t>
+      </w:r>
+      <w:proofErr w:type="spellStart"/>
+      <w:r>
+        <w:rPr>
+          <w:rFonts w:ascii="Corbel" w:eastAsia="Calibri" w:hAnsi="Corbel" w:cs="Arial"/>
+          <w:color w:val="404040"/>
+          <w:kern w:val="0"/>
+          <w:szCs w:val="22"/>
+          <w14:ligatures w14:val="none"/>
+        </w:rPr>
+        <w:t>OrbitalFire</w:t>
+      </w:r>
+      <w:proofErr w:type="spellEnd"/>
+      <w:r>
+        <w:rPr>
+          <w:rFonts w:ascii="Corbel" w:eastAsia="Calibri" w:hAnsi="Corbel" w:cs="Arial"/>
+          <w:color w:val="404040"/>
+          <w:kern w:val="0"/>
+          <w:szCs w:val="22"/>
+          <w14:ligatures w14:val="none"/>
+        </w:rPr>
+        <w:t xml:space="preserve"> then conducted enumeration. Enumeration during this assessment consisted of scanning the identified ports to determine which services are running (if any). Additional scans were then performed based on running services to attempt enumerating information (if possible).</w:t>
+      </w:r>
+      <w:r>
+        <w:rPr>
+          <w:rFonts w:ascii="Corbel" w:eastAsia="Calibri" w:hAnsi="Corbel" w:cs="Arial"/>
+          <w:color w:val="404040"/>
+          <w:kern w:val="0"/>
+          <w:szCs w:val="22"/>
+          <w14:ligatures w14:val="none"/>
+        </w:rPr>
         <w:br/>
+      </w:r>
+      <w:r>
+        <w:rPr>
+          <w:rFonts w:ascii="Corbel" w:eastAsia="Calibri" w:hAnsi="Corbel" w:cs="Arial"/>
+          <w:color w:val="404040"/>
+          <w:kern w:val="0"/>
+          <w:szCs w:val="22"/>
+          <w14:ligatures w14:val="none"/>
+        </w:rPr>
         <w:br/>
+      </w:r>
+      <w:r>
+        <w:rPr>
+          <w:rFonts w:ascii="Corbel" w:eastAsia="Calibri" w:hAnsi="Corbel" w:cs="Arial"/>
+          <w:b/>
+          <w:bCs/>
+          <w:color w:val="404040"/>
+          <w:kern w:val="0"/>
+          <w:szCs w:val="22"/>
+          <w14:ligatures w14:val="none"/>
+        </w:rPr>
         <w:t>EXPLOITATION</w:t>
+      </w:r>
+      <w:r>
+        <w:rPr>
+          <w:rFonts w:ascii="Corbel" w:eastAsia="Calibri" w:hAnsi="Corbel" w:cs="Arial"/>
+          <w:b/>
+          <w:bCs/>
+          <w:color w:val="404040"/>
+          <w:kern w:val="0"/>
+          <w:szCs w:val="22"/>
+          <w14:ligatures w14:val="none"/>
+        </w:rPr>
         <w:br/>
-        <w:t>Post enumeration, orbital fire focused strictly on the exploitation of any/all running services that were previously discovered. orbital fire used a comprehensive set of tools, custom scripts, and manual techniques to thoroughly identify possible threats to orbital fire environment.</w:t>
+      </w:r>
+      <w:r>
+        <w:rPr>
+          <w:rFonts w:ascii="Corbel" w:eastAsia="Calibri" w:hAnsi="Corbel" w:cs="Arial"/>
+          <w:color w:val="404040"/>
+          <w:kern w:val="0"/>
+          <w:szCs w:val="22"/>
+          <w14:ligatures w14:val="none"/>
+        </w:rPr>
+        <w:t xml:space="preserve">Post enumeration, </w:t>
+      </w:r>
+      <w:proofErr w:type="spellStart"/>
+      <w:r>
+        <w:rPr>
+          <w:rFonts w:ascii="Corbel" w:eastAsia="Calibri" w:hAnsi="Corbel" w:cs="Arial"/>
+          <w:color w:val="404040"/>
+          <w:kern w:val="0"/>
+          <w:szCs w:val="22"/>
+          <w14:ligatures w14:val="none"/>
+        </w:rPr>
+        <w:t>OrbitalFire</w:t>
+      </w:r>
+      <w:proofErr w:type="spellEnd"/>
+      <w:r>
+        <w:rPr>
+          <w:rFonts w:ascii="Corbel" w:eastAsia="Calibri" w:hAnsi="Corbel" w:cs="Arial"/>
+          <w:color w:val="404040"/>
+          <w:kern w:val="0"/>
+          <w:szCs w:val="22"/>
+          <w14:ligatures w14:val="none"/>
+        </w:rPr>
+        <w:t xml:space="preserve"> focused strictly on the exploitation of any/all running services that were previously discovered. </w:t>
+      </w:r>
+      <w:proofErr w:type="spellStart"/>
+      <w:r>
+        <w:rPr>
+          <w:rFonts w:ascii="Corbel" w:eastAsia="Calibri" w:hAnsi="Corbel" w:cs="Arial"/>
+          <w:color w:val="404040"/>
+          <w:kern w:val="0"/>
+          <w:szCs w:val="22"/>
+          <w14:ligatures w14:val="none"/>
+        </w:rPr>
+        <w:t>OrbitalFire</w:t>
+      </w:r>
+      <w:proofErr w:type="spellEnd"/>
+      <w:r>
+        <w:rPr>
+          <w:rFonts w:ascii="Corbel" w:eastAsia="Calibri" w:hAnsi="Corbel" w:cs="Arial"/>
+          <w:color w:val="404040"/>
+          <w:kern w:val="0"/>
+          <w:szCs w:val="22"/>
+          <w14:ligatures w14:val="none"/>
+        </w:rPr>
+        <w:t xml:space="preserve"> used a comprehensive set of tools, custom scripts, and manual techniques to thoroughly identify possible threats to </w:t>
+      </w:r>
+      <w:r>
+        <w:rPr>
+          <w:rFonts w:ascii="Corbel" w:eastAsia="Calibri" w:hAnsi="Corbel" w:cs="Arial"/>
+          <w:color w:val="404040"/>
+          <w:kern w:val="0"/>
+          <w:szCs w:val="22"/>
+          <w14:ligatures w14:val="none"/>
+        </w:rPr>
+        <w:t>[CUSTOMER]</w:t>
+      </w:r>
+      <w:r>
+        <w:rPr>
+          <w:rFonts w:ascii="Corbel" w:eastAsia="Calibri" w:hAnsi="Corbel" w:cs="Arial"/>
+          <w:color w:val="404040"/>
+          <w:kern w:val="0"/>
+          <w:szCs w:val="22"/>
+          <w14:ligatures w14:val="none"/>
+        </w:rPr>
+        <w:t xml:space="preserve"> environment.</w:t>
+      </w:r>
+      <w:r>
+        <w:rPr>
+          <w:rFonts w:ascii="Corbel" w:eastAsia="Calibri" w:hAnsi="Corbel" w:cs="Arial"/>
+          <w:color w:val="404040"/>
+          <w:kern w:val="0"/>
+          <w:szCs w:val="22"/>
+          <w14:ligatures w14:val="none"/>
+        </w:rPr>
         <w:br/>
+      </w:r>
+      <w:r>
+        <w:rPr>
+          <w:rFonts w:ascii="Corbel" w:eastAsia="Calibri" w:hAnsi="Corbel" w:cs="Arial"/>
+          <w:color w:val="404040"/>
+          <w:kern w:val="0"/>
+          <w:szCs w:val="22"/>
+          <w14:ligatures w14:val="none"/>
+        </w:rPr>
         <w:br/>
+      </w:r>
+      <w:r>
+        <w:rPr>
+          <w:rFonts w:ascii="Corbel" w:eastAsia="Calibri" w:hAnsi="Corbel" w:cs="Arial"/>
+          <w:b/>
+          <w:bCs/>
+          <w:color w:val="404040"/>
+          <w:kern w:val="0"/>
+          <w:szCs w:val="22"/>
+          <w14:ligatures w14:val="none"/>
+        </w:rPr>
         <w:t>POST EXPLOITATION</w:t>
+      </w:r>
+      <w:r>
+        <w:rPr>
+          <w:rFonts w:ascii="Corbel" w:eastAsia="Calibri" w:hAnsi="Corbel" w:cs="Arial"/>
+          <w:b/>
+          <w:bCs/>
+          <w:color w:val="404040"/>
+          <w:kern w:val="0"/>
+          <w:szCs w:val="22"/>
+          <w14:ligatures w14:val="none"/>
+        </w:rPr>
         <w:br/>
-        <w:t>Once the exploitation phase was complete, orbital fire then tested and validated all identified threats to evaluate the depth of compromise.</w:t>
+      </w:r>
+      <w:r>
+        <w:rPr>
+          <w:rFonts w:ascii="Corbel" w:eastAsia="Calibri" w:hAnsi="Corbel" w:cs="Arial"/>
+          <w:color w:val="404040"/>
+          <w:kern w:val="0"/>
+          <w:szCs w:val="22"/>
+          <w14:ligatures w14:val="none"/>
+        </w:rPr>
+        <w:t xml:space="preserve">Once the exploitation phase was complete, </w:t>
+      </w:r>
+      <w:proofErr w:type="spellStart"/>
+      <w:r>
+        <w:rPr>
+          <w:rFonts w:ascii="Corbel" w:eastAsia="Calibri" w:hAnsi="Corbel" w:cs="Arial"/>
+          <w:color w:val="404040"/>
+          <w:kern w:val="0"/>
+          <w:szCs w:val="22"/>
+          <w14:ligatures w14:val="none"/>
+        </w:rPr>
+        <w:t>OrbitalFire</w:t>
+      </w:r>
+      <w:proofErr w:type="spellEnd"/>
+      <w:r>
+        <w:rPr>
+          <w:rFonts w:ascii="Corbel" w:eastAsia="Calibri" w:hAnsi="Corbel" w:cs="Arial"/>
+          <w:color w:val="404040"/>
+          <w:kern w:val="0"/>
+          <w:szCs w:val="22"/>
+          <w14:ligatures w14:val="none"/>
+        </w:rPr>
+        <w:t xml:space="preserve"> then tested and validated all identified threats to evaluate the depth of compromise.</w:t>
+      </w:r>
+      <w:r>
+        <w:rPr>
+          <w:rFonts w:ascii="Corbel" w:eastAsia="Calibri" w:hAnsi="Corbel" w:cs="Arial"/>
+          <w:b/>
+          <w:bCs/>
+          <w:color w:val="404040"/>
+          <w:kern w:val="0"/>
+          <w:szCs w:val="22"/>
+          <w14:ligatures w14:val="none"/>
+        </w:rPr>
+        <w:br w:type="page"/>
       </w:r>
     </w:p>
     <w:p>
@@ -3750,84 +4218,6 @@
           <w14:ligatures w14:val="none"/>
         </w:rPr>
         <w:t xml:space="preserve"> </w:t>
-      </w:r>
-    </w:p>
-    <w:p>
-      <w:pPr>
-        <w:spacing w:before="120" w:after="160"/>
-      </w:pPr>
-      <w:r>
-        <w:drawing>
-          <wp:inline xmlns:a="http://schemas.openxmlformats.org/drawingml/2006/main" xmlns:pic="http://schemas.openxmlformats.org/drawingml/2006/picture">
-            <wp:extent cx="3840480" cy="3848464"/>
-            <wp:docPr id="2011428612" name="Picture 2011428612"/>
-            <wp:cNvGraphicFramePr>
-              <a:graphicFrameLocks noChangeAspect="1"/>
-            </wp:cNvGraphicFramePr>
-            <a:graphic>
-              <a:graphicData uri="http://schemas.openxmlformats.org/drawingml/2006/picture">
-                <pic:pic>
-                  <pic:nvPicPr>
-                    <pic:cNvPr id="0" name="image.png"/>
-                    <pic:cNvPicPr/>
-                  </pic:nvPicPr>
-                  <pic:blipFill>
-                    <a:blip r:embed="rId26"/>
-                    <a:stretch>
-                      <a:fillRect/>
-                    </a:stretch>
-                  </pic:blipFill>
-                  <pic:spPr>
-                    <a:xfrm>
-                      <a:off x="0" y="0"/>
-                      <a:ext cx="3840480" cy="3848464"/>
-                    </a:xfrm>
-                    <a:prstGeom prst="rect"/>
-                  </pic:spPr>
-                </pic:pic>
-              </a:graphicData>
-            </a:graphic>
-          </wp:inline>
-        </w:drawing>
-      </w:r>
-    </w:p>
-    <w:p>
-      <w:pPr>
-        <w:spacing w:before="120" w:after="160"/>
-      </w:pPr>
-      <w:r>
-        <w:drawing>
-          <wp:inline xmlns:a="http://schemas.openxmlformats.org/drawingml/2006/main" xmlns:pic="http://schemas.openxmlformats.org/drawingml/2006/picture">
-            <wp:extent cx="5486400" cy="3017520"/>
-            <wp:docPr id="2011428613" name="Picture 2011428613"/>
-            <wp:cNvGraphicFramePr>
-              <a:graphicFrameLocks noChangeAspect="1"/>
-            </wp:cNvGraphicFramePr>
-            <a:graphic>
-              <a:graphicData uri="http://schemas.openxmlformats.org/drawingml/2006/picture">
-                <pic:pic>
-                  <pic:nvPicPr>
-                    <pic:cNvPr id="0" name="image.png"/>
-                    <pic:cNvPicPr/>
-                  </pic:nvPicPr>
-                  <pic:blipFill>
-                    <a:blip r:embed="rId27"/>
-                    <a:stretch>
-                      <a:fillRect/>
-                    </a:stretch>
-                  </pic:blipFill>
-                  <pic:spPr>
-                    <a:xfrm>
-                      <a:off x="0" y="0"/>
-                      <a:ext cx="5486400" cy="3017520"/>
-                    </a:xfrm>
-                    <a:prstGeom prst="rect"/>
-                  </pic:spPr>
-                </pic:pic>
-              </a:graphicData>
-            </a:graphic>
-          </wp:inline>
-        </w:drawing>
       </w:r>
     </w:p>
     <w:p>
@@ -4026,6 +4416,7 @@
       <w:pPr>
         <w:keepNext/>
         <w:keepLines/>
+        <w:pageBreakBefore/>
         <w:spacing w:before="240" w:after="120" w:line="259" w:lineRule="auto"/>
         <w:outlineLvl w:val="1"/>
         <w:rPr>
@@ -4067,11 +4458,35 @@
       </w:pPr>
       <w:r>
         <w:rPr>
-          <w:rFonts w:ascii="Corbel" w:hAnsi="Corbel"/>
-          <w:color w:val="E6781F"/>
-          <w:sz w:val="24"/>
-        </w:rPr>
-        <w:t>To summarize the results of this assessment, orbital fire has grouped all findings from the penetration test into rollup findings. These rollup findings can be used to quickly determine the root cause of all issues identified in this assessment. It is highly recommended to implement a remediation strategy based on the rollup findings below to enhance security posture and overall defensibility.</w:t>
+          <w:rFonts w:ascii="Corbel" w:eastAsia="Calibri" w:hAnsi="Corbel" w:cs="Arial"/>
+          <w:color w:val="404040"/>
+          <w:kern w:val="0"/>
+          <w:szCs w:val="22"/>
+          <w14:ligatures w14:val="none"/>
+        </w:rPr>
+        <w:t xml:space="preserve">To summarize the results of this assessment, </w:t>
+      </w:r>
+      <w:proofErr w:type="spellStart"/>
+      <w:r>
+        <w:rPr>
+          <w:rFonts w:ascii="Corbel" w:eastAsia="Calibri" w:hAnsi="Corbel" w:cs="Arial"/>
+          <w:color w:val="404040"/>
+          <w:kern w:val="0"/>
+          <w:szCs w:val="22"/>
+          <w14:ligatures w14:val="none"/>
+        </w:rPr>
+        <w:t>OrbitalFire</w:t>
+      </w:r>
+      <w:proofErr w:type="spellEnd"/>
+      <w:r>
+        <w:rPr>
+          <w:rFonts w:ascii="Corbel" w:eastAsia="Calibri" w:hAnsi="Corbel" w:cs="Arial"/>
+          <w:color w:val="404040"/>
+          <w:kern w:val="0"/>
+          <w:szCs w:val="22"/>
+          <w14:ligatures w14:val="none"/>
+        </w:rPr>
+        <w:t xml:space="preserve"> has grouped all findings from the penetration test into rollup findings. These rollup findings can be used to quickly determine the root cause of all issues identified in this assessment. It is highly recommended to implement a remediation strategy based on the rollup findings below to enhance security posture and overall defensibility.</w:t>
       </w:r>
     </w:p>
     <w:p>
@@ -4271,10 +4686,35 @@
       <w:r>
         <w:rPr>
           <w:rFonts w:ascii="Corbel" w:hAnsi="Corbel"/>
-          <w:color w:val="E6781F"/>
-          <w:sz w:val="24"/>
-        </w:rPr>
-        <w:t>1.    Subdomain Takeover Vulnerability - During testing, orbital fire identified a potential subdomain takeover vulnerability affecting one or more domains owned by orbital fire. This issue typically results from misconfigured DNS records that reference unclaimed or deprovisioned third-party services, allowing an attacker to register the external resource and gain control of the associated subdomain. If exploited, an attacker could host malicious content, impersonate the organization, conduct phishing campaigns, or collect user data, posing a significant risk to brand reputation, user trust, and overall security posture.</w:t>
+        </w:rPr>
+        <w:t xml:space="preserve">1.    </w:t>
+      </w:r>
+      <w:r>
+        <w:rPr>
+          <w:rFonts w:ascii="Corbel" w:hAnsi="Corbel"/>
+          <w:b/>
+        </w:rPr>
+        <w:t>Subdomain Takeover Vulnerability</w:t>
+      </w:r>
+      <w:r>
+        <w:rPr>
+          <w:rFonts w:ascii="Corbel" w:hAnsi="Corbel"/>
+        </w:rPr>
+        <w:t xml:space="preserve"> - During testing, </w:t>
+      </w:r>
+      <w:proofErr w:type="spellStart"/>
+      <w:r>
+        <w:rPr>
+          <w:rFonts w:ascii="Corbel" w:hAnsi="Corbel"/>
+        </w:rPr>
+        <w:t>OrbitalFire</w:t>
+      </w:r>
+      <w:proofErr w:type="spellEnd"/>
+      <w:r>
+        <w:rPr>
+          <w:rFonts w:ascii="Corbel" w:hAnsi="Corbel"/>
+        </w:rPr>
+        <w:t xml:space="preserve"> identified a potential subdomain takeover vulnerability affecting one or more domains owned by [CUSTOMER NAME]. This issue typically results from misconfigured DNS records that reference unclaimed or deprovisioned third-party services, allowing an attacker to register the external resource and gain control of the associated subdomain. If exploited, an attacker could host malicious content, impersonate the organization, conduct phishing campaigns, or collect user data, posing a significant risk to brand reputation, user trust, and overall security posture.</w:t>
       </w:r>
     </w:p>
     <w:p>
@@ -4414,10 +4854,35 @@
       <w:r>
         <w:rPr>
           <w:rFonts w:ascii="Corbel" w:hAnsi="Corbel"/>
-          <w:color w:val="E6781F"/>
-          <w:sz w:val="24"/>
-        </w:rPr>
-        <w:t>1.    Misconfigured DMARC Record - During testing, orbital fire identified that orbital fire has a misconfigured DMARC (Domain-based Message Authentication, Reporting, and Conformance) record for one or more of their domain(s). DMARC is critical for verifying the authenticity of emails sent from the organization, serving as a vital barrier against email spoofing and phishing attacks. Without proper configuration, DMARC fails to instruct receiving mail servers on how to treat email messages from the organization's domain, thereby increasing vulnerability to attack.</w:t>
+        </w:rPr>
+        <w:t xml:space="preserve">1.    </w:t>
+      </w:r>
+      <w:r>
+        <w:rPr>
+          <w:rFonts w:ascii="Corbel" w:hAnsi="Corbel"/>
+          <w:b/>
+        </w:rPr>
+        <w:t>Misconfigured DMARC Record</w:t>
+      </w:r>
+      <w:r>
+        <w:rPr>
+          <w:rFonts w:ascii="Corbel" w:hAnsi="Corbel"/>
+        </w:rPr>
+        <w:t xml:space="preserve"> - During testing, </w:t>
+      </w:r>
+      <w:proofErr w:type="spellStart"/>
+      <w:r>
+        <w:rPr>
+          <w:rFonts w:ascii="Corbel" w:hAnsi="Corbel"/>
+        </w:rPr>
+        <w:t>OrbitalFire</w:t>
+      </w:r>
+      <w:proofErr w:type="spellEnd"/>
+      <w:r>
+        <w:rPr>
+          <w:rFonts w:ascii="Corbel" w:hAnsi="Corbel"/>
+        </w:rPr>
+        <w:t xml:space="preserve"> identified that [CUSTOMER NAME] has a misconfigured DMARC (Domain-based Message Authentication, Reporting, and Conformance) record for one or more of their domain(s). DMARC is critical for verifying the authenticity of emails sent from the organization, serving as a vital barrier against email spoofing and phishing attacks. Without proper configuration, DMARC fails to instruct receiving mail servers on how to treat email messages from the organization's domain, thereby increasing vulnerability to attack.</w:t>
       </w:r>
     </w:p>
     <w:p>
@@ -4527,10 +4992,35 @@
       <w:r>
         <w:rPr>
           <w:rFonts w:ascii="Corbel" w:hAnsi="Corbel"/>
-          <w:color w:val="E6781F"/>
-          <w:sz w:val="24"/>
-        </w:rPr>
-        <w:t>2.    Remote SSH Service Exposed to Public Internet - During testing, orbital fire identified that remote administration services, including SSH, were exposed to the public internet. This exposure is often the result of misconfiguration or insufficient access controls, which significantly increase the attack surface. Publicly accessible SSH services are susceptible to brute-force and password-guessing attacks, which may lead to unauthorized system access. Additionally, newly disclosed vulnerabilities, including zero-day exploits, could be leveraged by threat actors to further compromise exposed systems.</w:t>
+        </w:rPr>
+        <w:t xml:space="preserve">2.    </w:t>
+      </w:r>
+      <w:r>
+        <w:rPr>
+          <w:rFonts w:ascii="Corbel" w:hAnsi="Corbel"/>
+          <w:b/>
+        </w:rPr>
+        <w:t>Remote SSH Service Exposed to Public Internet</w:t>
+      </w:r>
+      <w:r>
+        <w:rPr>
+          <w:rFonts w:ascii="Corbel" w:hAnsi="Corbel"/>
+        </w:rPr>
+        <w:t xml:space="preserve"> - During testing, </w:t>
+      </w:r>
+      <w:proofErr w:type="spellStart"/>
+      <w:r>
+        <w:rPr>
+          <w:rFonts w:ascii="Corbel" w:hAnsi="Corbel"/>
+        </w:rPr>
+        <w:t>OrbitalFire</w:t>
+      </w:r>
+      <w:proofErr w:type="spellEnd"/>
+      <w:r>
+        <w:rPr>
+          <w:rFonts w:ascii="Corbel" w:hAnsi="Corbel"/>
+        </w:rPr>
+        <w:t xml:space="preserve"> identified that remote administration services, including SSH, were exposed to the public internet. This exposure is often the result of misconfiguration or insufficient access controls, which significantly increase the attack surface. Publicly accessible SSH services are susceptible to brute-force and password-guessing attacks, which may lead to unauthorized system access. Additionally, newly disclosed vulnerabilities, including zero-day exploits, could be leveraged by threat actors to further compromise exposed systems.</w:t>
       </w:r>
     </w:p>
     <w:p>
@@ -4898,7 +5388,6 @@
         <w:t xml:space="preserve">testing against targeted domains, </w:t>
       </w:r>
       <w:bookmarkStart w:id="11" w:name="_Hlk212473705"/>
-      <w:proofErr w:type="gramStart"/>
       <w:r>
         <w:rPr>
           <w:rFonts w:ascii="Corbel" w:eastAsia="Calibri" w:hAnsi="Corbel" w:cs="Arial"/>
@@ -4908,19 +5397,7 @@
           <w:highlight w:val="yellow"/>
           <w14:ligatures w14:val="none"/>
         </w:rPr>
-        <w:t>NUMBER (#</w:t>
-      </w:r>
-      <w:proofErr w:type="gramEnd"/>
-      <w:r>
-        <w:rPr>
-          <w:rFonts w:ascii="Corbel" w:eastAsia="Calibri" w:hAnsi="Corbel" w:cs="Arial"/>
-          <w:color w:val="404040"/>
-          <w:kern w:val="0"/>
-          <w:szCs w:val="22"/>
-          <w:highlight w:val="yellow"/>
-          <w14:ligatures w14:val="none"/>
-        </w:rPr>
-        <w:t>)</w:t>
+        <w:t>NUMBER (#)</w:t>
       </w:r>
       <w:r>
         <w:rPr>
@@ -6154,11 +6631,35 @@
       </w:pPr>
       <w:r>
         <w:rPr>
-          <w:rFonts w:ascii="Corbel" w:hAnsi="Corbel"/>
-          <w:color w:val="E6781F"/>
-          <w:sz w:val="24"/>
-        </w:rPr>
-        <w:t>The following items are the highest priority recommendations to help improve compliance, defensibility and resilience. These items may not be fully inclusive of all discovered deficiencies and reflect orbital fire’s expert opinion regarding return on investment.</w:t>
+          <w:rFonts w:ascii="Corbel" w:eastAsia="Calibri" w:hAnsi="Corbel" w:cs="Arial"/>
+          <w:color w:val="404040"/>
+          <w:kern w:val="0"/>
+          <w:szCs w:val="22"/>
+          <w14:ligatures w14:val="none"/>
+        </w:rPr>
+        <w:t xml:space="preserve">The following items are the highest priority recommendations to help improve compliance, defensibility and resilience. These items may not be fully inclusive of all discovered deficiencies and reflect </w:t>
+      </w:r>
+      <w:proofErr w:type="spellStart"/>
+      <w:r>
+        <w:rPr>
+          <w:rFonts w:ascii="Corbel" w:eastAsia="Calibri" w:hAnsi="Corbel" w:cs="Arial"/>
+          <w:color w:val="404040"/>
+          <w:kern w:val="0"/>
+          <w:szCs w:val="22"/>
+          <w14:ligatures w14:val="none"/>
+        </w:rPr>
+        <w:t>OrbitalFire’s</w:t>
+      </w:r>
+      <w:proofErr w:type="spellEnd"/>
+      <w:r>
+        <w:rPr>
+          <w:rFonts w:ascii="Corbel" w:eastAsia="Calibri" w:hAnsi="Corbel" w:cs="Arial"/>
+          <w:color w:val="404040"/>
+          <w:kern w:val="0"/>
+          <w:szCs w:val="22"/>
+          <w14:ligatures w14:val="none"/>
+        </w:rPr>
+        <w:t xml:space="preserve"> expert opinion regarding return on investment.</w:t>
       </w:r>
     </w:p>
     <w:p>
@@ -6177,11 +6678,93 @@
       </w:pPr>
       <w:r>
         <w:rPr>
-          <w:rFonts w:ascii="Corbel" w:hAnsi="Corbel"/>
-          <w:color w:val="E6781F"/>
-          <w:sz w:val="24"/>
-        </w:rPr>
-        <w:t xml:space="preserve"> – orbital fire can provide complete remediation</w:t>
+          <w:rFonts w:ascii="Corbel" w:eastAsia="Calibri" w:hAnsi="Corbel" w:cs="Arial"/>
+          <w:noProof/>
+          <w:color w:val="404040"/>
+          <w:kern w:val="0"/>
+          <w:szCs w:val="22"/>
+          <w14:ligatures w14:val="none"/>
+        </w:rPr>
+        <w:drawing>
+          <wp:inline distT="0" distB="0" distL="0" distR="0" wp14:anchorId="65BBC86C" wp14:editId="7004CF6B">
+            <wp:extent cx="152400" cy="152400"/>
+            <wp:effectExtent l="0" t="0" r="0" b="0"/>
+            <wp:docPr id="89909448" name="Picture 89909448" descr="Fire with solid fill"/>
+            <wp:cNvGraphicFramePr>
+              <a:graphicFrameLocks xmlns:a="http://schemas.openxmlformats.org/drawingml/2006/main" noChangeAspect="1"/>
+            </wp:cNvGraphicFramePr>
+            <a:graphic xmlns:a="http://schemas.openxmlformats.org/drawingml/2006/main">
+              <a:graphicData uri="http://schemas.openxmlformats.org/drawingml/2006/picture">
+                <pic:pic xmlns:pic="http://schemas.openxmlformats.org/drawingml/2006/picture">
+                  <pic:nvPicPr>
+                    <pic:cNvPr id="0" name="Picture 23" descr="Fire with solid fill"/>
+                    <pic:cNvPicPr>
+                      <a:picLocks noChangeAspect="1" noChangeArrowheads="1"/>
+                    </pic:cNvPicPr>
+                  </pic:nvPicPr>
+                  <pic:blipFill>
+                    <a:blip r:embed="rId20" cstate="print">
+                      <a:extLst>
+                        <a:ext uri="{28A0092B-C50C-407E-A947-70E740481C1C}">
+                          <a14:useLocalDpi xmlns:a14="http://schemas.microsoft.com/office/drawing/2010/main" val="0"/>
+                        </a:ext>
+                      </a:extLst>
+                    </a:blip>
+                    <a:srcRect/>
+                    <a:stretch>
+                      <a:fillRect/>
+                    </a:stretch>
+                  </pic:blipFill>
+                  <pic:spPr bwMode="auto">
+                    <a:xfrm>
+                      <a:off x="0" y="0"/>
+                      <a:ext cx="152400" cy="152400"/>
+                    </a:xfrm>
+                    <a:prstGeom prst="rect">
+                      <a:avLst/>
+                    </a:prstGeom>
+                    <a:noFill/>
+                    <a:ln>
+                      <a:noFill/>
+                    </a:ln>
+                  </pic:spPr>
+                </pic:pic>
+              </a:graphicData>
+            </a:graphic>
+          </wp:inline>
+        </w:drawing>
+      </w:r>
+      <w:r>
+        <w:rPr>
+          <w:rFonts w:ascii="Corbel" w:eastAsia="Calibri" w:hAnsi="Corbel" w:cs="Arial"/>
+          <w:color w:val="404040"/>
+          <w:kern w:val="0"/>
+          <w:szCs w:val="22"/>
+          <w14:ligatures w14:val="none"/>
+        </w:rPr>
+        <w:t xml:space="preserve"> – </w:t>
+      </w:r>
+      <w:proofErr w:type="spellStart"/>
+      <w:r>
+        <w:rPr>
+          <w:rFonts w:ascii="Corbel" w:eastAsia="Calibri" w:hAnsi="Corbel" w:cs="Arial"/>
+          <w:color w:val="404040"/>
+          <w:kern w:val="0"/>
+          <w:szCs w:val="22"/>
+          <w14:ligatures w14:val="none"/>
+        </w:rPr>
+        <w:t>OrbitalFire</w:t>
+      </w:r>
+      <w:proofErr w:type="spellEnd"/>
+      <w:r>
+        <w:rPr>
+          <w:rFonts w:ascii="Corbel" w:eastAsia="Calibri" w:hAnsi="Corbel" w:cs="Arial"/>
+          <w:color w:val="404040"/>
+          <w:kern w:val="0"/>
+          <w:szCs w:val="22"/>
+          <w14:ligatures w14:val="none"/>
+        </w:rPr>
+        <w:t xml:space="preserve"> can provide complete remediation</w:t>
       </w:r>
     </w:p>
     <w:p>
@@ -6200,12 +6783,104 @@
       </w:pPr>
       <w:r>
         <w:rPr>
-          <w:rFonts w:ascii="Corbel" w:hAnsi="Corbel"/>
-          <w:color w:val="E6781F"/>
-          <w:sz w:val="24"/>
-        </w:rPr>
-        <w:t xml:space="preserve"> – orbital fire can assist with remediation</w:t>
-      </w:r>
+          <w:rFonts w:ascii="Corbel" w:eastAsia="Calibri" w:hAnsi="Corbel" w:cs="Arial"/>
+          <w:noProof/>
+          <w:color w:val="404040"/>
+          <w:kern w:val="0"/>
+          <w:szCs w:val="22"/>
+          <w14:ligatures w14:val="none"/>
+        </w:rPr>
+        <w:drawing>
+          <wp:inline distT="0" distB="0" distL="0" distR="0" wp14:anchorId="03962334" wp14:editId="63B34A0F">
+            <wp:extent cx="152400" cy="152400"/>
+            <wp:effectExtent l="0" t="0" r="0" b="0"/>
+            <wp:docPr id="2011428596" name="Picture 2011428596" descr="Fire with solid fill"/>
+            <wp:cNvGraphicFramePr>
+              <a:graphicFrameLocks xmlns:a="http://schemas.openxmlformats.org/drawingml/2006/main" noChangeAspect="1"/>
+            </wp:cNvGraphicFramePr>
+            <a:graphic xmlns:a="http://schemas.openxmlformats.org/drawingml/2006/main">
+              <a:graphicData uri="http://schemas.openxmlformats.org/drawingml/2006/picture">
+                <pic:pic xmlns:pic="http://schemas.openxmlformats.org/drawingml/2006/picture">
+                  <pic:nvPicPr>
+                    <pic:cNvPr id="0" name="Picture 23" descr="Fire with solid fill"/>
+                    <pic:cNvPicPr>
+                      <a:picLocks noChangeAspect="1" noChangeArrowheads="1"/>
+                    </pic:cNvPicPr>
+                  </pic:nvPicPr>
+                  <pic:blipFill>
+                    <a:blip r:embed="rId21" cstate="print">
+                      <a:extLst>
+                        <a:ext uri="{BEBA8EAE-BF5A-486C-A8C5-ECC9F3942E4B}">
+                          <a14:imgProps xmlns:a14="http://schemas.microsoft.com/office/drawing/2010/main">
+                            <a14:imgLayer r:embed="rId22">
+                              <a14:imgEffect>
+                                <a14:saturation sat="0"/>
+                              </a14:imgEffect>
+                            </a14:imgLayer>
+                          </a14:imgProps>
+                        </a:ext>
+                        <a:ext uri="{28A0092B-C50C-407E-A947-70E740481C1C}">
+                          <a14:useLocalDpi xmlns:a14="http://schemas.microsoft.com/office/drawing/2010/main" val="0"/>
+                        </a:ext>
+                      </a:extLst>
+                    </a:blip>
+                    <a:srcRect/>
+                    <a:stretch>
+                      <a:fillRect/>
+                    </a:stretch>
+                  </pic:blipFill>
+                  <pic:spPr bwMode="auto">
+                    <a:xfrm>
+                      <a:off x="0" y="0"/>
+                      <a:ext cx="152400" cy="152400"/>
+                    </a:xfrm>
+                    <a:prstGeom prst="rect">
+                      <a:avLst/>
+                    </a:prstGeom>
+                    <a:noFill/>
+                    <a:ln>
+                      <a:noFill/>
+                    </a:ln>
+                  </pic:spPr>
+                </pic:pic>
+              </a:graphicData>
+            </a:graphic>
+          </wp:inline>
+        </w:drawing>
+      </w:r>
+      <w:r>
+        <w:rPr>
+          <w:rFonts w:ascii="Corbel" w:eastAsia="Calibri" w:hAnsi="Corbel" w:cs="Arial"/>
+          <w:color w:val="404040"/>
+          <w:kern w:val="0"/>
+          <w:szCs w:val="22"/>
+          <w14:ligatures w14:val="none"/>
+        </w:rPr>
+        <w:t xml:space="preserve"> – </w:t>
+      </w:r>
+      <w:proofErr w:type="spellStart"/>
+      <w:r>
+        <w:rPr>
+          <w:rFonts w:ascii="Corbel" w:eastAsia="Calibri" w:hAnsi="Corbel" w:cs="Arial"/>
+          <w:color w:val="404040"/>
+          <w:kern w:val="0"/>
+          <w:szCs w:val="22"/>
+          <w14:ligatures w14:val="none"/>
+        </w:rPr>
+        <w:t>OrbitalFire</w:t>
+      </w:r>
+      <w:proofErr w:type="spellEnd"/>
+      <w:r>
+        <w:rPr>
+          <w:rFonts w:ascii="Corbel" w:eastAsia="Calibri" w:hAnsi="Corbel" w:cs="Arial"/>
+          <w:color w:val="404040"/>
+          <w:kern w:val="0"/>
+          <w:szCs w:val="22"/>
+          <w14:ligatures w14:val="none"/>
+        </w:rPr>
+        <w:t xml:space="preserve"> can assist with remediation</w:t>
+      </w:r>
+      <w:bookmarkStart w:id="14" w:name="_Hlk194407007"/>
     </w:p>
     <w:bookmarkEnd w:id="14"/>
     <w:p>

</xml_diff>

<commit_message>
Completed findings summary and informational sections
</commit_message>
<xml_diff>
--- a/Source_Code/Reports/Sample499/FindingsReportTest.docx
+++ b/Source_Code/Reports/Sample499/FindingsReportTest.docx
@@ -600,7 +600,7 @@
           <w14:ligatures w14:val="none"/>
         </w:rPr>
         <w:drawing>
-          <wp:anchor distT="0" distB="0" distL="114300" distR="114300" simplePos="0" relativeHeight="251662336" behindDoc="0" locked="0" layoutInCell="1" allowOverlap="1" wp14:anchorId="56FF54E8" wp14:editId="6939DA45">
+          <wp:anchor distT="0" distB="0" distL="114300" distR="114300" simplePos="0" relativeHeight="251662336" behindDoc="0" locked="0" layoutInCell="1" allowOverlap="1" wp14:anchorId="56FF54E8" wp14:editId="702D07A6">
             <wp:simplePos x="0" y="0"/>
             <wp:positionH relativeFrom="margin">
               <wp:posOffset>1163955</wp:posOffset>
@@ -1124,7 +1124,31 @@
           <w:szCs w:val="22"/>
           <w14:ligatures w14:val="none"/>
         </w:rPr>
-        <w:t>contained in this document is confidential and proprietary. It is intended for the exclusive use of OrbitalFire, LLC and the Customer entity named in this document.</w:t>
+        <w:t xml:space="preserve">contained in this document is confidential and proprietary. It is intended for the exclusive use of </w:t>
+      </w:r>
+      <w:proofErr w:type="spellStart"/>
+      <w:r>
+        <w:rPr>
+          <w:rFonts w:ascii="Corbel" w:eastAsia="Calibri" w:hAnsi="Corbel" w:cs="Arial"/>
+          <w:snapToGrid w:val="0"/>
+          <w:color w:val="404040"/>
+          <w:kern w:val="0"/>
+          <w:szCs w:val="22"/>
+          <w14:ligatures w14:val="none"/>
+        </w:rPr>
+        <w:t>orbital fire</w:t>
+      </w:r>
+      <w:proofErr w:type="spellEnd"/>
+      <w:r>
+        <w:rPr>
+          <w:rFonts w:ascii="Corbel" w:eastAsia="Calibri" w:hAnsi="Corbel" w:cs="Arial"/>
+          <w:snapToGrid w:val="0"/>
+          <w:color w:val="404040"/>
+          <w:kern w:val="0"/>
+          <w:szCs w:val="22"/>
+          <w14:ligatures w14:val="none"/>
+        </w:rPr>
+        <w:t>, LLC and the Customer entity named in this document.</w:t>
       </w:r>
     </w:p>
     <w:p>
@@ -1166,7 +1190,7 @@
           <w:szCs w:val="22"/>
           <w14:ligatures w14:val="none"/>
         </w:rPr>
-        <w:t>ORBITALFIRE</w:t>
+        <w:t>orbital fire</w:t>
       </w:r>
       <w:r>
         <w:rPr>
@@ -1944,7 +1968,29 @@
           <w:szCs w:val="22"/>
           <w14:ligatures w14:val="none"/>
         </w:rPr>
-        <w:t>In 2015, Ponemon Institute conducted a study on the cost of data breaches that surveyed 350 organizations from 11 different countries that had suffered some type of cybercrime. Nearly half of said these incidents (47%) were the result of malicious actors who were able to compromise company networks to steal money, intellectual property or other protected data.</w:t>
+        <w:t xml:space="preserve">In 2015, </w:t>
+      </w:r>
+      <w:proofErr w:type="spellStart"/>
+      <w:r>
+        <w:rPr>
+          <w:rFonts w:ascii="Corbel" w:eastAsia="Calibri" w:hAnsi="Corbel" w:cs="Arial"/>
+          <w:color w:val="404040"/>
+          <w:kern w:val="0"/>
+          <w:szCs w:val="22"/>
+          <w14:ligatures w14:val="none"/>
+        </w:rPr>
+        <w:t>Ponemon</w:t>
+      </w:r>
+      <w:proofErr w:type="spellEnd"/>
+      <w:r>
+        <w:rPr>
+          <w:rFonts w:ascii="Corbel" w:eastAsia="Calibri" w:hAnsi="Corbel" w:cs="Arial"/>
+          <w:color w:val="404040"/>
+          <w:kern w:val="0"/>
+          <w:szCs w:val="22"/>
+          <w14:ligatures w14:val="none"/>
+        </w:rPr>
+        <w:t xml:space="preserve"> Institute conducted a study on the cost of data breaches that surveyed 350 organizations from 11 different countries that had suffered some type of cybercrime. Nearly half of said these incidents (47%) were the result of malicious actors who were able to compromise company networks to steal money, intellectual property or other protected data.</w:t>
       </w:r>
     </w:p>
     <w:p>
@@ -2808,6 +2854,17 @@
           <w14:ligatures w14:val="none"/>
         </w:rPr>
         <w:t>The following IP Addresses and hosts were evaluated during automated testing:</w:t>
+      </w:r>
+    </w:p>
+    <w:p>
+      <w:pPr>
+        <w:pStyle w:val="IP"/>
+      </w:pPr>
+      <w:r>
+        <w:rPr>
+          <w:rFonts w:ascii="Corbel" w:hAnsi="Corbel"/>
+        </w:rPr>
+        <w:t>107.180.245.182</w:t>
       </w:r>
     </w:p>
     <w:p>
@@ -3364,6 +3421,13 @@
         </w:rPr>
         <w:t xml:space="preserve">Start Date: </w:t>
       </w:r>
+      <w:r>
+        <w:rPr>
+          <w:rFonts w:ascii="Corbel" w:hAnsi="Corbel"/>
+          <w:color w:val="F26522"/>
+        </w:rPr>
+        <w:t>January 29, 2026</w:t>
+      </w:r>
     </w:p>
     <w:p>
       <w:pPr>
@@ -3387,6 +3451,13 @@
         </w:rPr>
         <w:t xml:space="preserve">End Date: </w:t>
       </w:r>
+      <w:r>
+        <w:rPr>
+          <w:rFonts w:ascii="Corbel" w:hAnsi="Corbel"/>
+          <w:color w:val="F26522"/>
+        </w:rPr>
+        <w:t>January 29, 2026</w:t>
+      </w:r>
     </w:p>
     <w:p>
       <w:pPr>
@@ -3410,6 +3481,13 @@
         </w:rPr>
         <w:t xml:space="preserve">Escalation Contact: </w:t>
       </w:r>
+      <w:r>
+        <w:rPr>
+          <w:rFonts w:ascii="Corbel" w:hAnsi="Corbel"/>
+          <w:color w:val="F26522"/>
+        </w:rPr>
+        <w:t>Reg Harnish</w:t>
+      </w:r>
     </w:p>
     <w:p>
       <w:pPr>
@@ -3631,7 +3709,29 @@
           <w:szCs w:val="22"/>
           <w14:ligatures w14:val="none"/>
         </w:rPr>
-        <w:t xml:space="preserve">provided as part of scope, OrbitalFire was able to identify a total of </w:t>
+        <w:t xml:space="preserve">provided as part of scope, </w:t>
+      </w:r>
+      <w:proofErr w:type="spellStart"/>
+      <w:r>
+        <w:rPr>
+          <w:rFonts w:ascii="Corbel" w:eastAsia="Calibri" w:hAnsi="Corbel" w:cs="Arial"/>
+          <w:color w:val="404040"/>
+          <w:kern w:val="0"/>
+          <w:szCs w:val="22"/>
+          <w14:ligatures w14:val="none"/>
+        </w:rPr>
+        <w:t>orbital fire</w:t>
+      </w:r>
+      <w:proofErr w:type="spellEnd"/>
+      <w:r>
+        <w:rPr>
+          <w:rFonts w:ascii="Corbel" w:eastAsia="Calibri" w:hAnsi="Corbel" w:cs="Arial"/>
+          <w:color w:val="404040"/>
+          <w:kern w:val="0"/>
+          <w:szCs w:val="22"/>
+          <w14:ligatures w14:val="none"/>
+        </w:rPr>
+        <w:t xml:space="preserve"> was able to identify a total of </w:t>
       </w:r>
       <w:r>
         <w:rPr>
@@ -3711,7 +3811,29 @@
           <w:szCs w:val="22"/>
           <w14:ligatures w14:val="none"/>
         </w:rPr>
-        <w:t xml:space="preserve"> scanned, OrbitalFire found </w:t>
+        <w:t xml:space="preserve"> scanned, </w:t>
+      </w:r>
+      <w:proofErr w:type="spellStart"/>
+      <w:r>
+        <w:rPr>
+          <w:rFonts w:ascii="Corbel" w:eastAsia="Calibri" w:hAnsi="Corbel" w:cs="Arial"/>
+          <w:color w:val="404040"/>
+          <w:kern w:val="0"/>
+          <w:szCs w:val="22"/>
+          <w14:ligatures w14:val="none"/>
+        </w:rPr>
+        <w:t>orbital fire</w:t>
+      </w:r>
+      <w:proofErr w:type="spellEnd"/>
+      <w:r>
+        <w:rPr>
+          <w:rFonts w:ascii="Corbel" w:eastAsia="Calibri" w:hAnsi="Corbel" w:cs="Arial"/>
+          <w:color w:val="404040"/>
+          <w:kern w:val="0"/>
+          <w:szCs w:val="22"/>
+          <w14:ligatures w14:val="none"/>
+        </w:rPr>
+        <w:t xml:space="preserve"> found </w:t>
       </w:r>
       <w:r>
         <w:rPr>
@@ -3786,7 +3908,29 @@
           <w:szCs w:val="22"/>
           <w14:ligatures w14:val="none"/>
         </w:rPr>
-        <w:t>After the identification of all available hosts within the network, OrbitalFire then conducted enumeration. Enumeration during this assessment consisted of scanning the identified ports to determine which services are running (if any). Additional scans were then performed based on running services to attempt enumerating information (if possible).</w:t>
+        <w:t xml:space="preserve">After the identification of all available hosts within the network, </w:t>
+      </w:r>
+      <w:proofErr w:type="spellStart"/>
+      <w:r>
+        <w:rPr>
+          <w:rFonts w:ascii="Corbel" w:eastAsia="Calibri" w:hAnsi="Corbel" w:cs="Arial"/>
+          <w:color w:val="404040"/>
+          <w:kern w:val="0"/>
+          <w:szCs w:val="22"/>
+          <w14:ligatures w14:val="none"/>
+        </w:rPr>
+        <w:t>orbital fire</w:t>
+      </w:r>
+      <w:proofErr w:type="spellEnd"/>
+      <w:r>
+        <w:rPr>
+          <w:rFonts w:ascii="Corbel" w:eastAsia="Calibri" w:hAnsi="Corbel" w:cs="Arial"/>
+          <w:color w:val="404040"/>
+          <w:kern w:val="0"/>
+          <w:szCs w:val="22"/>
+          <w14:ligatures w14:val="none"/>
+        </w:rPr>
+        <w:t xml:space="preserve"> then conducted enumeration. Enumeration during this assessment consisted of scanning the identified ports to determine which services are running (if any). Additional scans were then performed based on running services to attempt enumerating information (if possible).</w:t>
       </w:r>
       <w:r>
         <w:rPr>
@@ -3840,17 +3984,61 @@
           <w:szCs w:val="22"/>
           <w14:ligatures w14:val="none"/>
         </w:rPr>
-        <w:t xml:space="preserve">Post enumeration, OrbitalFire focused strictly on the exploitation of any/all running services that were previously discovered. OrbitalFire used a comprehensive set of tools, custom scripts, and manual techniques to thoroughly identify possible threats to </w:t>
-      </w:r>
-      <w:r>
-        <w:rPr>
-          <w:rFonts w:ascii="Corbel" w:eastAsia="Calibri" w:hAnsi="Corbel" w:cs="Arial"/>
-          <w:color w:val="404040"/>
-          <w:kern w:val="0"/>
-          <w:szCs w:val="22"/>
-          <w14:ligatures w14:val="none"/>
-        </w:rPr>
-        <w:t>[CUSTOMER]</w:t>
+        <w:t xml:space="preserve">Post enumeration, </w:t>
+      </w:r>
+      <w:proofErr w:type="spellStart"/>
+      <w:r>
+        <w:rPr>
+          <w:rFonts w:ascii="Corbel" w:eastAsia="Calibri" w:hAnsi="Corbel" w:cs="Arial"/>
+          <w:color w:val="404040"/>
+          <w:kern w:val="0"/>
+          <w:szCs w:val="22"/>
+          <w14:ligatures w14:val="none"/>
+        </w:rPr>
+        <w:t>orbital fire</w:t>
+      </w:r>
+      <w:proofErr w:type="spellEnd"/>
+      <w:r>
+        <w:rPr>
+          <w:rFonts w:ascii="Corbel" w:eastAsia="Calibri" w:hAnsi="Corbel" w:cs="Arial"/>
+          <w:color w:val="404040"/>
+          <w:kern w:val="0"/>
+          <w:szCs w:val="22"/>
+          <w14:ligatures w14:val="none"/>
+        </w:rPr>
+        <w:t xml:space="preserve"> focused strictly on the exploitation of any/all running services that were previously discovered. </w:t>
+      </w:r>
+      <w:proofErr w:type="spellStart"/>
+      <w:r>
+        <w:rPr>
+          <w:rFonts w:ascii="Corbel" w:eastAsia="Calibri" w:hAnsi="Corbel" w:cs="Arial"/>
+          <w:color w:val="404040"/>
+          <w:kern w:val="0"/>
+          <w:szCs w:val="22"/>
+          <w14:ligatures w14:val="none"/>
+        </w:rPr>
+        <w:t>orbital fire</w:t>
+      </w:r>
+      <w:proofErr w:type="spellEnd"/>
+      <w:r>
+        <w:rPr>
+          <w:rFonts w:ascii="Corbel" w:eastAsia="Calibri" w:hAnsi="Corbel" w:cs="Arial"/>
+          <w:color w:val="404040"/>
+          <w:kern w:val="0"/>
+          <w:szCs w:val="22"/>
+          <w14:ligatures w14:val="none"/>
+        </w:rPr>
+        <w:t xml:space="preserve"> used a comprehensive set of tools, custom scripts, and manual techniques to thoroughly identify possible threats to </w:t>
+      </w:r>
+      <w:r>
+        <w:rPr>
+          <w:rFonts w:ascii="Corbel" w:eastAsia="Calibri" w:hAnsi="Corbel" w:cs="Arial"/>
+          <w:color w:val="404040"/>
+          <w:kern w:val="0"/>
+          <w:szCs w:val="22"/>
+          <w14:ligatures w14:val="none"/>
+        </w:rPr>
+        <w:t>orbital fire</w:t>
       </w:r>
       <w:r>
         <w:rPr>
@@ -3914,7 +4102,29 @@
           <w:szCs w:val="22"/>
           <w14:ligatures w14:val="none"/>
         </w:rPr>
-        <w:t>Once the exploitation phase was complete, OrbitalFire then tested and validated all identified threats to evaluate the depth of compromise.</w:t>
+        <w:t xml:space="preserve">Once the exploitation phase was complete, </w:t>
+      </w:r>
+      <w:proofErr w:type="spellStart"/>
+      <w:r>
+        <w:rPr>
+          <w:rFonts w:ascii="Corbel" w:eastAsia="Calibri" w:hAnsi="Corbel" w:cs="Arial"/>
+          <w:color w:val="404040"/>
+          <w:kern w:val="0"/>
+          <w:szCs w:val="22"/>
+          <w14:ligatures w14:val="none"/>
+        </w:rPr>
+        <w:t>orbital fire</w:t>
+      </w:r>
+      <w:proofErr w:type="spellEnd"/>
+      <w:r>
+        <w:rPr>
+          <w:rFonts w:ascii="Corbel" w:eastAsia="Calibri" w:hAnsi="Corbel" w:cs="Arial"/>
+          <w:color w:val="404040"/>
+          <w:kern w:val="0"/>
+          <w:szCs w:val="22"/>
+          <w14:ligatures w14:val="none"/>
+        </w:rPr>
+        <w:t xml:space="preserve"> then tested and validated all identified threats to evaluate the depth of compromise.</w:t>
       </w:r>
       <w:r>
         <w:rPr>
@@ -4012,6 +4222,318 @@
     </w:p>
     <w:p>
       <w:pPr>
+        <w:spacing w:before="120" w:after="160"/>
+      </w:pPr>
+      <w:r>
+        <w:drawing>
+          <wp:inline xmlns:a="http://schemas.openxmlformats.org/drawingml/2006/main" xmlns:pic="http://schemas.openxmlformats.org/drawingml/2006/picture">
+            <wp:extent cx="3840480" cy="3848464"/>
+            <wp:docPr id="2011428616" name="Picture 2011428616"/>
+            <wp:cNvGraphicFramePr>
+              <a:graphicFrameLocks noChangeAspect="1"/>
+            </wp:cNvGraphicFramePr>
+            <a:graphic>
+              <a:graphicData uri="http://schemas.openxmlformats.org/drawingml/2006/picture">
+                <pic:pic>
+                  <pic:nvPicPr>
+                    <pic:cNvPr id="0" name="image.png"/>
+                    <pic:cNvPicPr/>
+                  </pic:nvPicPr>
+                  <pic:blipFill>
+                    <a:blip r:embed="rId28"/>
+                    <a:stretch>
+                      <a:fillRect/>
+                    </a:stretch>
+                  </pic:blipFill>
+                  <pic:spPr>
+                    <a:xfrm>
+                      <a:off x="0" y="0"/>
+                      <a:ext cx="3840480" cy="3848464"/>
+                    </a:xfrm>
+                    <a:prstGeom prst="rect"/>
+                  </pic:spPr>
+                </pic:pic>
+              </a:graphicData>
+            </a:graphic>
+          </wp:inline>
+        </w:drawing>
+      </w:r>
+    </w:p>
+    <w:p>
+      <w:pPr>
+        <w:spacing w:before="120" w:after="160"/>
+      </w:pPr>
+      <w:r>
+        <w:drawing>
+          <wp:inline xmlns:a="http://schemas.openxmlformats.org/drawingml/2006/main" xmlns:pic="http://schemas.openxmlformats.org/drawingml/2006/picture">
+            <wp:extent cx="5486400" cy="3017520"/>
+            <wp:docPr id="2011428617" name="Picture 2011428617"/>
+            <wp:cNvGraphicFramePr>
+              <a:graphicFrameLocks noChangeAspect="1"/>
+            </wp:cNvGraphicFramePr>
+            <a:graphic>
+              <a:graphicData uri="http://schemas.openxmlformats.org/drawingml/2006/picture">
+                <pic:pic>
+                  <pic:nvPicPr>
+                    <pic:cNvPr id="0" name="image.png"/>
+                    <pic:cNvPicPr/>
+                  </pic:nvPicPr>
+                  <pic:blipFill>
+                    <a:blip r:embed="rId29"/>
+                    <a:stretch>
+                      <a:fillRect/>
+                    </a:stretch>
+                  </pic:blipFill>
+                  <pic:spPr>
+                    <a:xfrm>
+                      <a:off x="0" y="0"/>
+                      <a:ext cx="5486400" cy="3017520"/>
+                    </a:xfrm>
+                    <a:prstGeom prst="rect"/>
+                  </pic:spPr>
+                </pic:pic>
+              </a:graphicData>
+            </a:graphic>
+          </wp:inline>
+        </w:drawing>
+      </w:r>
+    </w:p>
+    <w:p>
+      <w:pPr>
+        <w:spacing w:before="120" w:after="160"/>
+      </w:pPr>
+      <w:r>
+        <w:drawing>
+          <wp:inline xmlns:a="http://schemas.openxmlformats.org/drawingml/2006/main" xmlns:pic="http://schemas.openxmlformats.org/drawingml/2006/picture">
+            <wp:extent cx="3840480" cy="3848464"/>
+            <wp:docPr id="2011428614" name="Picture 2011428614"/>
+            <wp:cNvGraphicFramePr>
+              <a:graphicFrameLocks noChangeAspect="1"/>
+            </wp:cNvGraphicFramePr>
+            <a:graphic>
+              <a:graphicData uri="http://schemas.openxmlformats.org/drawingml/2006/picture">
+                <pic:pic>
+                  <pic:nvPicPr>
+                    <pic:cNvPr id="0" name="image.png"/>
+                    <pic:cNvPicPr/>
+                  </pic:nvPicPr>
+                  <pic:blipFill>
+                    <a:blip r:embed="rId28"/>
+                    <a:stretch>
+                      <a:fillRect/>
+                    </a:stretch>
+                  </pic:blipFill>
+                  <pic:spPr>
+                    <a:xfrm>
+                      <a:off x="0" y="0"/>
+                      <a:ext cx="3840480" cy="3848464"/>
+                    </a:xfrm>
+                    <a:prstGeom prst="rect"/>
+                  </pic:spPr>
+                </pic:pic>
+              </a:graphicData>
+            </a:graphic>
+          </wp:inline>
+        </w:drawing>
+      </w:r>
+    </w:p>
+    <w:p>
+      <w:pPr>
+        <w:spacing w:before="120" w:after="160"/>
+      </w:pPr>
+      <w:r>
+        <w:drawing>
+          <wp:inline xmlns:a="http://schemas.openxmlformats.org/drawingml/2006/main" xmlns:pic="http://schemas.openxmlformats.org/drawingml/2006/picture">
+            <wp:extent cx="5486400" cy="3017520"/>
+            <wp:docPr id="2011428615" name="Picture 2011428615"/>
+            <wp:cNvGraphicFramePr>
+              <a:graphicFrameLocks noChangeAspect="1"/>
+            </wp:cNvGraphicFramePr>
+            <a:graphic>
+              <a:graphicData uri="http://schemas.openxmlformats.org/drawingml/2006/picture">
+                <pic:pic>
+                  <pic:nvPicPr>
+                    <pic:cNvPr id="0" name="image.png"/>
+                    <pic:cNvPicPr/>
+                  </pic:nvPicPr>
+                  <pic:blipFill>
+                    <a:blip r:embed="rId29"/>
+                    <a:stretch>
+                      <a:fillRect/>
+                    </a:stretch>
+                  </pic:blipFill>
+                  <pic:spPr>
+                    <a:xfrm>
+                      <a:off x="0" y="0"/>
+                      <a:ext cx="5486400" cy="3017520"/>
+                    </a:xfrm>
+                    <a:prstGeom prst="rect"/>
+                  </pic:spPr>
+                </pic:pic>
+              </a:graphicData>
+            </a:graphic>
+          </wp:inline>
+        </w:drawing>
+      </w:r>
+    </w:p>
+    <w:p>
+      <w:pPr>
+        <w:spacing w:before="120" w:after="160"/>
+      </w:pPr>
+      <w:r>
+        <w:drawing>
+          <wp:inline xmlns:a="http://schemas.openxmlformats.org/drawingml/2006/main" xmlns:pic="http://schemas.openxmlformats.org/drawingml/2006/picture">
+            <wp:extent cx="3840480" cy="3848464"/>
+            <wp:docPr id="2011428612" name="Picture 2011428612"/>
+            <wp:cNvGraphicFramePr>
+              <a:graphicFrameLocks noChangeAspect="1"/>
+            </wp:cNvGraphicFramePr>
+            <a:graphic>
+              <a:graphicData uri="http://schemas.openxmlformats.org/drawingml/2006/picture">
+                <pic:pic>
+                  <pic:nvPicPr>
+                    <pic:cNvPr id="0" name="findings_donut.png"/>
+                    <pic:cNvPicPr/>
+                  </pic:nvPicPr>
+                  <pic:blipFill>
+                    <a:blip r:embed="rId28"/>
+                    <a:stretch>
+                      <a:fillRect/>
+                    </a:stretch>
+                  </pic:blipFill>
+                  <pic:spPr>
+                    <a:xfrm>
+                      <a:off x="0" y="0"/>
+                      <a:ext cx="3840480" cy="3848464"/>
+                    </a:xfrm>
+                    <a:prstGeom prst="rect"/>
+                  </pic:spPr>
+                </pic:pic>
+              </a:graphicData>
+            </a:graphic>
+          </wp:inline>
+        </w:drawing>
+      </w:r>
+    </w:p>
+    <w:p>
+      <w:pPr>
+        <w:spacing w:before="120" w:after="160"/>
+      </w:pPr>
+      <w:r>
+        <w:drawing>
+          <wp:inline xmlns:a="http://schemas.openxmlformats.org/drawingml/2006/main" xmlns:pic="http://schemas.openxmlformats.org/drawingml/2006/picture">
+            <wp:extent cx="5486400" cy="3017520"/>
+            <wp:docPr id="2011428613" name="Picture 2011428613"/>
+            <wp:cNvGraphicFramePr>
+              <a:graphicFrameLocks noChangeAspect="1"/>
+            </wp:cNvGraphicFramePr>
+            <a:graphic>
+              <a:graphicData uri="http://schemas.openxmlformats.org/drawingml/2006/picture">
+                <pic:pic>
+                  <pic:nvPicPr>
+                    <pic:cNvPr id="0" name="findings_line.png"/>
+                    <pic:cNvPicPr/>
+                  </pic:nvPicPr>
+                  <pic:blipFill>
+                    <a:blip r:embed="rId29"/>
+                    <a:stretch>
+                      <a:fillRect/>
+                    </a:stretch>
+                  </pic:blipFill>
+                  <pic:spPr>
+                    <a:xfrm>
+                      <a:off x="0" y="0"/>
+                      <a:ext cx="5486400" cy="3017520"/>
+                    </a:xfrm>
+                    <a:prstGeom prst="rect"/>
+                  </pic:spPr>
+                </pic:pic>
+              </a:graphicData>
+            </a:graphic>
+          </wp:inline>
+        </w:drawing>
+      </w:r>
+    </w:p>
+    <w:p>
+      <w:pPr>
+        <w:spacing w:before="120" w:after="160"/>
+      </w:pPr>
+      <w:r>
+        <w:drawing>
+          <wp:inline xmlns:a="http://schemas.openxmlformats.org/drawingml/2006/main" xmlns:pic="http://schemas.openxmlformats.org/drawingml/2006/picture">
+            <wp:extent cx="3840480" cy="3848464"/>
+            <wp:docPr id="2011428610" name="Picture 2011428610"/>
+            <wp:cNvGraphicFramePr>
+              <a:graphicFrameLocks noChangeAspect="1"/>
+            </wp:cNvGraphicFramePr>
+            <a:graphic>
+              <a:graphicData uri="http://schemas.openxmlformats.org/drawingml/2006/picture">
+                <pic:pic>
+                  <pic:nvPicPr>
+                    <pic:cNvPr id="0" name="findings_donut.png"/>
+                    <pic:cNvPicPr/>
+                  </pic:nvPicPr>
+                  <pic:blipFill>
+                    <a:blip r:embed="rId26"/>
+                    <a:stretch>
+                      <a:fillRect/>
+                    </a:stretch>
+                  </pic:blipFill>
+                  <pic:spPr>
+                    <a:xfrm>
+                      <a:off x="0" y="0"/>
+                      <a:ext cx="3840480" cy="3848464"/>
+                    </a:xfrm>
+                    <a:prstGeom prst="rect"/>
+                  </pic:spPr>
+                </pic:pic>
+              </a:graphicData>
+            </a:graphic>
+          </wp:inline>
+        </w:drawing>
+      </w:r>
+    </w:p>
+    <w:p>
+      <w:pPr>
+        <w:spacing w:before="120" w:after="160"/>
+      </w:pPr>
+      <w:r>
+        <w:drawing>
+          <wp:inline xmlns:a="http://schemas.openxmlformats.org/drawingml/2006/main" xmlns:pic="http://schemas.openxmlformats.org/drawingml/2006/picture">
+            <wp:extent cx="5486400" cy="3017520"/>
+            <wp:docPr id="2011428611" name="Picture 2011428611"/>
+            <wp:cNvGraphicFramePr>
+              <a:graphicFrameLocks noChangeAspect="1"/>
+            </wp:cNvGraphicFramePr>
+            <a:graphic>
+              <a:graphicData uri="http://schemas.openxmlformats.org/drawingml/2006/picture">
+                <pic:pic>
+                  <pic:nvPicPr>
+                    <pic:cNvPr id="0" name="findings_line.png"/>
+                    <pic:cNvPicPr/>
+                  </pic:nvPicPr>
+                  <pic:blipFill>
+                    <a:blip r:embed="rId27"/>
+                    <a:stretch>
+                      <a:fillRect/>
+                    </a:stretch>
+                  </pic:blipFill>
+                  <pic:spPr>
+                    <a:xfrm>
+                      <a:off x="0" y="0"/>
+                      <a:ext cx="5486400" cy="3017520"/>
+                    </a:xfrm>
+                    <a:prstGeom prst="rect"/>
+                  </pic:spPr>
+                </pic:pic>
+              </a:graphicData>
+            </a:graphic>
+          </wp:inline>
+        </w:drawing>
+      </w:r>
+    </w:p>
+    <w:p>
+      <w:pPr>
         <w:spacing w:line="259" w:lineRule="auto"/>
         <w:rPr>
           <w:rFonts w:ascii="Corbel" w:eastAsia="Calibri" w:hAnsi="Corbel" w:cs="Arial"/>
@@ -4047,7 +4569,7 @@
           <w14:ligatures w14:val="none"/>
         </w:rPr>
         <w:drawing>
-          <wp:inline distT="0" distB="0" distL="0" distR="0" wp14:anchorId="6B4D1221" wp14:editId="5242AA5A">
+          <wp:inline distT="0" distB="0" distL="0" distR="0" wp14:anchorId="6B4D1221" wp14:editId="06BD77A0">
             <wp:extent cx="5486400" cy="2743200"/>
             <wp:effectExtent l="0" t="0" r="0" b="0"/>
             <wp:docPr id="13" name="Chart 13"/>
@@ -4110,7 +4632,7 @@
           <w14:ligatures w14:val="none"/>
         </w:rPr>
         <w:drawing>
-          <wp:inline distT="0" distB="0" distL="0" distR="0" wp14:anchorId="2DA2DD83" wp14:editId="042CE4F5">
+          <wp:inline distT="0" distB="0" distL="0" distR="0" wp14:anchorId="2DA2DD83" wp14:editId="5C18C0C2">
             <wp:extent cx="5486400" cy="3200400"/>
             <wp:effectExtent l="0" t="0" r="0" b="0"/>
             <wp:docPr id="1278438351" name="Chart 4"/>
@@ -4176,7 +4698,65 @@
           <w:szCs w:val="22"/>
           <w14:ligatures w14:val="none"/>
         </w:rPr>
-        <w:t>To summarize the results of this assessment, OrbitalFire has grouped all findings from the penetration test into rollup findings. These rollup findings can be used to quickly determine the root cause of all issues identified in this assessment. It is highly recommended to implement a remediation strategy based on the rollup findings below to enhance security posture and overall defensibility.</w:t>
+        <w:t xml:space="preserve">To summarize the results of this assessment, </w:t>
+      </w:r>
+      <w:proofErr w:type="spellStart"/>
+      <w:r>
+        <w:rPr>
+          <w:rFonts w:ascii="Corbel" w:eastAsia="Calibri" w:hAnsi="Corbel" w:cs="Arial"/>
+          <w:color w:val="404040"/>
+          <w:kern w:val="0"/>
+          <w:szCs w:val="22"/>
+          <w14:ligatures w14:val="none"/>
+        </w:rPr>
+        <w:t>orbital fire</w:t>
+      </w:r>
+      <w:proofErr w:type="spellEnd"/>
+      <w:r>
+        <w:rPr>
+          <w:rFonts w:ascii="Corbel" w:eastAsia="Calibri" w:hAnsi="Corbel" w:cs="Arial"/>
+          <w:color w:val="404040"/>
+          <w:kern w:val="0"/>
+          <w:szCs w:val="22"/>
+          <w14:ligatures w14:val="none"/>
+        </w:rPr>
+        <w:t xml:space="preserve"> has grouped all findings from the penetration test into rollup findings. These rollup findings can be used to quickly determine the root cause of all issues identified in this assessment. It is highly recommended to implement a remediation strategy based on the rollup findings below to enhance security posture and overall defensibility.</w:t>
+      </w:r>
+    </w:p>
+    <w:p>
+      <w:r>
+        <w:rPr>
+          <w:rFonts w:ascii="Corbel" w:hAnsi="Corbel"/>
+          <w:b/>
+          <w:sz w:val="26"/>
+        </w:rPr>
+        <w:t>CONFIGURATION DEFICIENCIES</w:t>
+      </w:r>
+    </w:p>
+    <w:p>
+      <w:r>
+        <w:rPr>
+          <w:rFonts w:ascii="Corbel" w:hAnsi="Corbel"/>
+        </w:rPr>
+        <w:t>Configuration weaknesses were identified that could potentially lead to a successful compromise of systems and/or data within the tested environment. Although some of the configuration weaknesses may be exploitable in limited circumstances, the potential impact of a successful attack could be relatively high.</w:t>
+      </w:r>
+    </w:p>
+    <w:p>
+      <w:r>
+        <w:rPr>
+          <w:rFonts w:ascii="Corbel" w:hAnsi="Corbel"/>
+          <w:b/>
+          <w:sz w:val="26"/>
+        </w:rPr>
+        <w:t>INGRESS FILTERING DEFICIENCIES</w:t>
+      </w:r>
+    </w:p>
+    <w:p>
+      <w:r>
+        <w:rPr>
+          <w:rFonts w:ascii="Corbel" w:hAnsi="Corbel"/>
+        </w:rPr>
+        <w:t>The organization's network firewalls allow an excessive amount of access to services within the internal, trusted network environment. This excessive access could potentially expose the organization to attacks that are accessible due to unnecessary or misconfigured access. Services on the internal network should only be accessible to individuals and computer systems that are considered "trusted" such as through a Virtual Private Network (VPN) along with appropriate access controls.</w:t>
       </w:r>
     </w:p>
     <w:p>
@@ -4337,6 +4917,480 @@
       </w:r>
     </w:p>
     <w:p>
+      <w:r>
+        <w:rPr>
+          <w:rFonts w:ascii="Corbel" w:hAnsi="Corbel"/>
+        </w:rPr>
+        <w:t xml:space="preserve">1.    </w:t>
+      </w:r>
+      <w:r>
+        <w:rPr>
+          <w:rFonts w:ascii="Corbel" w:hAnsi="Corbel"/>
+          <w:b/>
+        </w:rPr>
+        <w:t>Subdomain Takeover Vulnerability</w:t>
+      </w:r>
+      <w:r>
+        <w:rPr>
+          <w:rFonts w:ascii="Corbel" w:hAnsi="Corbel"/>
+        </w:rPr>
+        <w:t xml:space="preserve"> - During testing, </w:t>
+      </w:r>
+      <w:proofErr w:type="spellStart"/>
+      <w:r>
+        <w:rPr>
+          <w:rFonts w:ascii="Corbel" w:hAnsi="Corbel"/>
+        </w:rPr>
+        <w:t>orbital fire</w:t>
+      </w:r>
+      <w:proofErr w:type="spellEnd"/>
+      <w:r>
+        <w:rPr>
+          <w:rFonts w:ascii="Corbel" w:hAnsi="Corbel"/>
+        </w:rPr>
+        <w:t xml:space="preserve"> identified a potential subdomain takeover vulnerability affecting one or more domains owned by orbital fire. This issue typically results from misconfigured DNS records that reference unclaimed or deprovisioned third-party services, allowing an attacker to register the external resource and gain control of the associated subdomain. If exploited, an attacker could host malicious content, impersonate the organization, conduct phishing campaigns, or collect user data, posing a significant risk to brand reputation, user trust, and overall security posture.</w:t>
+      </w:r>
+    </w:p>
+    <w:p>
+      <w:r>
+        <w:rPr>
+          <w:rFonts w:ascii="Corbel" w:hAnsi="Corbel"/>
+          <w:i/>
+        </w:rPr>
+        <w:t>Affected Nodes:</w:t>
+      </w:r>
+    </w:p>
+    <w:p>
+      <w:r>
+        <w:rPr>
+          <w:noProof/>
+        </w:rPr>
+        <w:drawing>
+          <wp:inline distT="0" distB="0" distL="0" distR="0" wp14:anchorId="733FBD03" wp14:editId="6F431CF7">
+            <wp:extent cx="5303520" cy="606845"/>
+            <wp:effectExtent l="0" t="0" r="0" b="0"/>
+            <wp:docPr id="2011428601" name="Picture 2011428601"/>
+            <wp:cNvGraphicFramePr>
+              <a:graphicFrameLocks xmlns:a="http://schemas.openxmlformats.org/drawingml/2006/main" noChangeAspect="1"/>
+            </wp:cNvGraphicFramePr>
+            <a:graphic xmlns:a="http://schemas.openxmlformats.org/drawingml/2006/main">
+              <a:graphicData uri="http://schemas.openxmlformats.org/drawingml/2006/picture">
+                <pic:pic xmlns:pic="http://schemas.openxmlformats.org/drawingml/2006/picture">
+                  <pic:nvPicPr>
+                    <pic:cNvPr id="0" name="Affected_Sample_1.png"/>
+                    <pic:cNvPicPr/>
+                  </pic:nvPicPr>
+                  <pic:blipFill>
+                    <a:blip r:embed="rId14"/>
+                    <a:stretch>
+                      <a:fillRect/>
+                    </a:stretch>
+                  </pic:blipFill>
+                  <pic:spPr>
+                    <a:xfrm>
+                      <a:off x="0" y="0"/>
+                      <a:ext cx="5303520" cy="606845"/>
+                    </a:xfrm>
+                    <a:prstGeom prst="rect">
+                      <a:avLst/>
+                    </a:prstGeom>
+                  </pic:spPr>
+                </pic:pic>
+              </a:graphicData>
+            </a:graphic>
+          </wp:inline>
+        </w:drawing>
+      </w:r>
+    </w:p>
+    <w:p>
+      <w:r>
+        <w:rPr>
+          <w:rFonts w:ascii="Corbel" w:hAnsi="Corbel"/>
+          <w:i/>
+        </w:rPr>
+        <w:t>Evidence:</w:t>
+      </w:r>
+    </w:p>
+    <w:p>
+      <w:r>
+        <w:rPr>
+          <w:noProof/>
+        </w:rPr>
+        <w:drawing>
+          <wp:inline distT="0" distB="0" distL="0" distR="0" wp14:anchorId="7CBB19C0" wp14:editId="30D7DBDA">
+            <wp:extent cx="5303520" cy="391160"/>
+            <wp:effectExtent l="0" t="0" r="0" b="0"/>
+            <wp:docPr id="2011428602" name="Picture 2011428602"/>
+            <wp:cNvGraphicFramePr>
+              <a:graphicFrameLocks xmlns:a="http://schemas.openxmlformats.org/drawingml/2006/main" noChangeAspect="1"/>
+            </wp:cNvGraphicFramePr>
+            <a:graphic xmlns:a="http://schemas.openxmlformats.org/drawingml/2006/main">
+              <a:graphicData uri="http://schemas.openxmlformats.org/drawingml/2006/picture">
+                <pic:pic xmlns:pic="http://schemas.openxmlformats.org/drawingml/2006/picture">
+                  <pic:nvPicPr>
+                    <pic:cNvPr id="0" name="Evidence_Sample_1.png"/>
+                    <pic:cNvPicPr/>
+                  </pic:nvPicPr>
+                  <pic:blipFill>
+                    <a:blip r:embed="rId15"/>
+                    <a:stretch>
+                      <a:fillRect/>
+                    </a:stretch>
+                  </pic:blipFill>
+                  <pic:spPr>
+                    <a:xfrm>
+                      <a:off x="0" y="0"/>
+                      <a:ext cx="5303520" cy="391160"/>
+                    </a:xfrm>
+                    <a:prstGeom prst="rect">
+                      <a:avLst/>
+                    </a:prstGeom>
+                  </pic:spPr>
+                </pic:pic>
+              </a:graphicData>
+            </a:graphic>
+          </wp:inline>
+        </w:drawing>
+      </w:r>
+    </w:p>
+    <w:p>
+      <w:pPr>
+        <w:keepNext/>
+        <w:keepLines/>
+        <w:spacing w:before="240" w:after="120" w:line="259" w:lineRule="auto"/>
+        <w:outlineLvl w:val="1"/>
+        <w:rPr>
+          <w:rFonts w:ascii="Handel Gothic D" w:eastAsia="DengXian Light" w:hAnsi="Handel Gothic D" w:cs="Times New Roman"/>
+          <w:b/>
+          <w:caps/>
+          <w:color w:val="FF6633"/>
+          <w:kern w:val="0"/>
+          <w:sz w:val="32"/>
+          <w:szCs w:val="26"/>
+          <w14:ligatures w14:val="none"/>
+        </w:rPr>
+      </w:pPr>
+      <w:r>
+        <w:rPr>
+          <w:rFonts w:ascii="Handel Gothic D" w:eastAsia="DengXian Light" w:hAnsi="Handel Gothic D" w:cs="Times New Roman"/>
+          <w:b/>
+          <w:caps/>
+          <w:color w:val="FF6633"/>
+          <w:kern w:val="0"/>
+          <w:sz w:val="32"/>
+          <w:szCs w:val="26"/>
+          <w14:ligatures w14:val="none"/>
+        </w:rPr>
+        <w:t>Medium</w:t>
+      </w:r>
+    </w:p>
+    <w:p>
+      <w:r>
+        <w:rPr>
+          <w:rFonts w:ascii="Corbel" w:hAnsi="Corbel"/>
+        </w:rPr>
+        <w:t xml:space="preserve">1.    </w:t>
+      </w:r>
+      <w:r>
+        <w:rPr>
+          <w:rFonts w:ascii="Corbel" w:hAnsi="Corbel"/>
+          <w:b/>
+        </w:rPr>
+        <w:t>Misconfigured DMARC Record</w:t>
+      </w:r>
+      <w:r>
+        <w:rPr>
+          <w:rFonts w:ascii="Corbel" w:hAnsi="Corbel"/>
+        </w:rPr>
+        <w:t xml:space="preserve"> - During testing, </w:t>
+      </w:r>
+      <w:proofErr w:type="spellStart"/>
+      <w:r>
+        <w:rPr>
+          <w:rFonts w:ascii="Corbel" w:hAnsi="Corbel"/>
+        </w:rPr>
+        <w:t>orbital fire</w:t>
+      </w:r>
+      <w:proofErr w:type="spellEnd"/>
+      <w:r>
+        <w:rPr>
+          <w:rFonts w:ascii="Corbel" w:hAnsi="Corbel"/>
+        </w:rPr>
+        <w:t xml:space="preserve"> identified that orbital fire has a misconfigured DMARC (Domain-based Message Authentication, Reporting, and Conformance) record for one or more of their domain(s). DMARC is critical for verifying the authenticity of emails sent from the organization, serving as a vital barrier against email spoofing and phishing attacks. Without proper configuration, DMARC fails to instruct receiving mail servers on how to treat email messages from the organization's domain, thereby increasing vulnerability to attack.</w:t>
+      </w:r>
+    </w:p>
+    <w:p>
+      <w:r>
+        <w:rPr>
+          <w:rFonts w:ascii="Corbel" w:hAnsi="Corbel"/>
+          <w:i/>
+        </w:rPr>
+        <w:t>Affected Nodes:</w:t>
+      </w:r>
+    </w:p>
+    <w:p>
+      <w:r>
+        <w:rPr>
+          <w:noProof/>
+        </w:rPr>
+        <w:drawing>
+          <wp:inline distT="0" distB="0" distL="0" distR="0" wp14:anchorId="641A12D5" wp14:editId="57517102">
+            <wp:extent cx="5303520" cy="606845"/>
+            <wp:effectExtent l="0" t="0" r="0" b="0"/>
+            <wp:docPr id="2011428603" name="Picture 2011428603"/>
+            <wp:cNvGraphicFramePr>
+              <a:graphicFrameLocks xmlns:a="http://schemas.openxmlformats.org/drawingml/2006/main" noChangeAspect="1"/>
+            </wp:cNvGraphicFramePr>
+            <a:graphic xmlns:a="http://schemas.openxmlformats.org/drawingml/2006/main">
+              <a:graphicData uri="http://schemas.openxmlformats.org/drawingml/2006/picture">
+                <pic:pic xmlns:pic="http://schemas.openxmlformats.org/drawingml/2006/picture">
+                  <pic:nvPicPr>
+                    <pic:cNvPr id="0" name="Affected_Sample_2.png"/>
+                    <pic:cNvPicPr/>
+                  </pic:nvPicPr>
+                  <pic:blipFill>
+                    <a:blip r:embed="rId16"/>
+                    <a:stretch>
+                      <a:fillRect/>
+                    </a:stretch>
+                  </pic:blipFill>
+                  <pic:spPr>
+                    <a:xfrm>
+                      <a:off x="0" y="0"/>
+                      <a:ext cx="5303520" cy="606845"/>
+                    </a:xfrm>
+                    <a:prstGeom prst="rect">
+                      <a:avLst/>
+                    </a:prstGeom>
+                  </pic:spPr>
+                </pic:pic>
+              </a:graphicData>
+            </a:graphic>
+          </wp:inline>
+        </w:drawing>
+      </w:r>
+    </w:p>
+    <w:p>
+      <w:r>
+        <w:rPr>
+          <w:rFonts w:ascii="Corbel" w:hAnsi="Corbel"/>
+          <w:i/>
+        </w:rPr>
+        <w:lastRenderedPageBreak/>
+        <w:t>Evidence:</w:t>
+      </w:r>
+    </w:p>
+    <w:p>
+      <w:r>
+        <w:rPr>
+          <w:noProof/>
+        </w:rPr>
+        <w:drawing>
+          <wp:inline distT="0" distB="0" distL="0" distR="0" wp14:anchorId="6A694EB0" wp14:editId="64FCA488">
+            <wp:extent cx="5303520" cy="289560"/>
+            <wp:effectExtent l="0" t="0" r="0" b="0"/>
+            <wp:docPr id="2011428604" name="Picture 2011428604"/>
+            <wp:cNvGraphicFramePr>
+              <a:graphicFrameLocks xmlns:a="http://schemas.openxmlformats.org/drawingml/2006/main" noChangeAspect="1"/>
+            </wp:cNvGraphicFramePr>
+            <a:graphic xmlns:a="http://schemas.openxmlformats.org/drawingml/2006/main">
+              <a:graphicData uri="http://schemas.openxmlformats.org/drawingml/2006/picture">
+                <pic:pic xmlns:pic="http://schemas.openxmlformats.org/drawingml/2006/picture">
+                  <pic:nvPicPr>
+                    <pic:cNvPr id="0" name="Evidence_Sample_2.png"/>
+                    <pic:cNvPicPr/>
+                  </pic:nvPicPr>
+                  <pic:blipFill>
+                    <a:blip r:embed="rId17"/>
+                    <a:stretch>
+                      <a:fillRect/>
+                    </a:stretch>
+                  </pic:blipFill>
+                  <pic:spPr>
+                    <a:xfrm>
+                      <a:off x="0" y="0"/>
+                      <a:ext cx="5303520" cy="289560"/>
+                    </a:xfrm>
+                    <a:prstGeom prst="rect">
+                      <a:avLst/>
+                    </a:prstGeom>
+                  </pic:spPr>
+                </pic:pic>
+              </a:graphicData>
+            </a:graphic>
+          </wp:inline>
+        </w:drawing>
+      </w:r>
+    </w:p>
+    <w:p>
+      <w:r>
+        <w:rPr>
+          <w:rFonts w:ascii="Corbel" w:hAnsi="Corbel"/>
+        </w:rPr>
+        <w:t xml:space="preserve">2.    </w:t>
+      </w:r>
+      <w:r>
+        <w:rPr>
+          <w:rFonts w:ascii="Corbel" w:hAnsi="Corbel"/>
+          <w:b/>
+        </w:rPr>
+        <w:t>Remote SSH Service Exposed to Public Internet</w:t>
+      </w:r>
+      <w:r>
+        <w:rPr>
+          <w:rFonts w:ascii="Corbel" w:hAnsi="Corbel"/>
+        </w:rPr>
+        <w:t xml:space="preserve"> - During testing, </w:t>
+      </w:r>
+      <w:proofErr w:type="spellStart"/>
+      <w:r>
+        <w:rPr>
+          <w:rFonts w:ascii="Corbel" w:hAnsi="Corbel"/>
+        </w:rPr>
+        <w:t>orbital fire</w:t>
+      </w:r>
+      <w:proofErr w:type="spellEnd"/>
+      <w:r>
+        <w:rPr>
+          <w:rFonts w:ascii="Corbel" w:hAnsi="Corbel"/>
+        </w:rPr>
+        <w:t xml:space="preserve"> identified that remote administration services, including SSH, were exposed to the public internet. This exposure is often the result of misconfiguration or insufficient access controls, which significantly increase the attack surface. Publicly accessible SSH services are susceptible to brute-force and password-guessing attacks, which may lead to unauthorized system access. Additionally, newly disclosed vulnerabilities, including zero-day exploits, could be leveraged by threat actors to further compromise exposed systems.</w:t>
+      </w:r>
+    </w:p>
+    <w:p>
+      <w:r>
+        <w:rPr>
+          <w:rFonts w:ascii="Corbel" w:hAnsi="Corbel"/>
+          <w:i/>
+        </w:rPr>
+        <w:t>Affected Nodes:</w:t>
+      </w:r>
+    </w:p>
+    <w:p>
+      <w:r>
+        <w:rPr>
+          <w:noProof/>
+        </w:rPr>
+        <w:drawing>
+          <wp:inline distT="0" distB="0" distL="0" distR="0" wp14:anchorId="4B40D324" wp14:editId="10F0EED6">
+            <wp:extent cx="5303520" cy="775129"/>
+            <wp:effectExtent l="0" t="0" r="0" b="0"/>
+            <wp:docPr id="2011428605" name="Picture 2011428605"/>
+            <wp:cNvGraphicFramePr>
+              <a:graphicFrameLocks xmlns:a="http://schemas.openxmlformats.org/drawingml/2006/main" noChangeAspect="1"/>
+            </wp:cNvGraphicFramePr>
+            <a:graphic xmlns:a="http://schemas.openxmlformats.org/drawingml/2006/main">
+              <a:graphicData uri="http://schemas.openxmlformats.org/drawingml/2006/picture">
+                <pic:pic xmlns:pic="http://schemas.openxmlformats.org/drawingml/2006/picture">
+                  <pic:nvPicPr>
+                    <pic:cNvPr id="0" name="Affected_Sample_3.png"/>
+                    <pic:cNvPicPr/>
+                  </pic:nvPicPr>
+                  <pic:blipFill>
+                    <a:blip r:embed="rId18"/>
+                    <a:stretch>
+                      <a:fillRect/>
+                    </a:stretch>
+                  </pic:blipFill>
+                  <pic:spPr>
+                    <a:xfrm>
+                      <a:off x="0" y="0"/>
+                      <a:ext cx="5303520" cy="775129"/>
+                    </a:xfrm>
+                    <a:prstGeom prst="rect">
+                      <a:avLst/>
+                    </a:prstGeom>
+                  </pic:spPr>
+                </pic:pic>
+              </a:graphicData>
+            </a:graphic>
+          </wp:inline>
+        </w:drawing>
+      </w:r>
+    </w:p>
+    <w:p>
+      <w:r>
+        <w:rPr>
+          <w:rFonts w:ascii="Corbel" w:hAnsi="Corbel"/>
+          <w:i/>
+        </w:rPr>
+        <w:t>Evidence:</w:t>
+      </w:r>
+    </w:p>
+    <w:p>
+      <w:r>
+        <w:rPr>
+          <w:noProof/>
+        </w:rPr>
+        <w:drawing>
+          <wp:inline distT="0" distB="0" distL="0" distR="0" wp14:anchorId="06074AA8" wp14:editId="60C7CA5F">
+            <wp:extent cx="5303520" cy="386080"/>
+            <wp:effectExtent l="0" t="0" r="0" b="0"/>
+            <wp:docPr id="2011428606" name="Picture 2011428606"/>
+            <wp:cNvGraphicFramePr>
+              <a:graphicFrameLocks xmlns:a="http://schemas.openxmlformats.org/drawingml/2006/main" noChangeAspect="1"/>
+            </wp:cNvGraphicFramePr>
+            <a:graphic xmlns:a="http://schemas.openxmlformats.org/drawingml/2006/main">
+              <a:graphicData uri="http://schemas.openxmlformats.org/drawingml/2006/picture">
+                <pic:pic xmlns:pic="http://schemas.openxmlformats.org/drawingml/2006/picture">
+                  <pic:nvPicPr>
+                    <pic:cNvPr id="0" name="Evidence_Sample_3.png"/>
+                    <pic:cNvPicPr/>
+                  </pic:nvPicPr>
+                  <pic:blipFill>
+                    <a:blip r:embed="rId19"/>
+                    <a:stretch>
+                      <a:fillRect/>
+                    </a:stretch>
+                  </pic:blipFill>
+                  <pic:spPr>
+                    <a:xfrm>
+                      <a:off x="0" y="0"/>
+                      <a:ext cx="5303520" cy="386080"/>
+                    </a:xfrm>
+                    <a:prstGeom prst="rect">
+                      <a:avLst/>
+                    </a:prstGeom>
+                  </pic:spPr>
+                </pic:pic>
+              </a:graphicData>
+            </a:graphic>
+          </wp:inline>
+        </w:drawing>
+      </w:r>
+    </w:p>
+    <w:p>
+      <w:pPr>
+        <w:keepNext/>
+        <w:keepLines/>
+        <w:spacing w:before="240" w:after="120" w:line="259" w:lineRule="auto"/>
+        <w:outlineLvl w:val="1"/>
+        <w:rPr>
+          <w:rFonts w:ascii="Handel Gothic D" w:eastAsia="DengXian Light" w:hAnsi="Handel Gothic D" w:cs="Times New Roman"/>
+          <w:b/>
+          <w:caps/>
+          <w:color w:val="FF6633"/>
+          <w:kern w:val="0"/>
+          <w:sz w:val="32"/>
+          <w:szCs w:val="26"/>
+          <w14:ligatures w14:val="none"/>
+        </w:rPr>
+      </w:pPr>
+      <w:r>
+        <w:rPr>
+          <w:rFonts w:ascii="Handel Gothic D" w:eastAsia="DengXian Light" w:hAnsi="Handel Gothic D" w:cs="Times New Roman"/>
+          <w:b/>
+          <w:caps/>
+          <w:color w:val="FF6633"/>
+          <w:kern w:val="0"/>
+          <w:sz w:val="32"/>
+          <w:szCs w:val="26"/>
+          <w14:ligatures w14:val="none"/>
+        </w:rPr>
+        <w:t>Low</w:t>
+      </w:r>
+    </w:p>
+    <w:p>
       <w:pPr>
         <w:numPr>
           <w:ilvl w:val="0"/>
@@ -4380,7 +5434,61 @@
           <w14:ligatures w14:val="none"/>
         </w:rPr>
       </w:pPr>
-      <w:r>
+    </w:p>
+    <w:p/>
+    <w:p/>
+    <w:p/>
+    <w:p>
+      <w:pPr>
+        <w:spacing w:line="259" w:lineRule="auto"/>
+        <w:contextualSpacing/>
+        <w:rPr>
+          <w:rFonts w:ascii="Corbel" w:eastAsia="Calibri" w:hAnsi="Corbel" w:cs="Arial"/>
+          <w:color w:val="404040"/>
+          <w:kern w:val="0"/>
+          <w:szCs w:val="22"/>
+          <w14:ligatures w14:val="none"/>
+        </w:rPr>
+      </w:pPr>
+      <w:r>
+        <w:rPr>
+          <w:rFonts w:ascii="Corbel" w:eastAsia="Calibri" w:hAnsi="Corbel" w:cs="Arial"/>
+          <w:color w:val="404040"/>
+          <w:kern w:val="0"/>
+          <w:szCs w:val="22"/>
+          <w14:ligatures w14:val="none"/>
+        </w:rPr>
+        <w:br/>
+      </w:r>
+    </w:p>
+    <w:p>
+      <w:pPr>
+        <w:spacing w:line="259" w:lineRule="auto"/>
+        <w:rPr>
+          <w:rFonts w:ascii="Corbel" w:eastAsia="Calibri" w:hAnsi="Corbel" w:cs="Arial"/>
+          <w:color w:val="404040"/>
+          <w:kern w:val="0"/>
+          <w:szCs w:val="22"/>
+          <w14:ligatures w14:val="none"/>
+        </w:rPr>
+      </w:pPr>
+      <w:r>
+        <w:rPr>
+          <w:rFonts w:ascii="Corbel" w:eastAsia="Calibri" w:hAnsi="Corbel" w:cs="Arial"/>
+          <w:color w:val="404040"/>
+          <w:kern w:val="0"/>
+          <w:szCs w:val="22"/>
+          <w14:ligatures w14:val="none"/>
+        </w:rPr>
+        <w:br w:type="page"/>
+      </w:r>
+    </w:p>
+    <w:p>
+      <w:pPr>
+        <w:keepNext/>
+        <w:keepLines/>
+        <w:spacing w:before="240" w:after="120" w:line="259" w:lineRule="auto"/>
+        <w:outlineLvl w:val="1"/>
         <w:rPr>
           <w:rFonts w:ascii="Handel Gothic D" w:eastAsia="DengXian Light" w:hAnsi="Handel Gothic D" w:cs="Times New Roman"/>
           <w:b/>
@@ -4391,42 +5499,10 @@
           <w:szCs w:val="26"/>
           <w14:ligatures w14:val="none"/>
         </w:rPr>
-        <w:t>Medium</w:t>
-      </w:r>
-    </w:p>
-    <w:p>
-      <w:pPr>
-        <w:numPr>
-          <w:ilvl w:val="0"/>
-          <w:numId w:val="11"/>
-        </w:numPr>
-        <w:spacing w:line="259" w:lineRule="auto"/>
-        <w:contextualSpacing/>
-        <w:rPr>
-          <w:rFonts w:ascii="Corbel" w:eastAsia="Calibri" w:hAnsi="Corbel" w:cs="Arial"/>
-          <w:color w:val="404040"/>
-          <w:kern w:val="0"/>
-          <w:szCs w:val="22"/>
-          <w14:ligatures w14:val="none"/>
-        </w:rPr>
-      </w:pPr>
-      <w:r>
-        <w:rPr>
-          <w:rFonts w:ascii="Corbel" w:eastAsia="Calibri" w:hAnsi="Corbel" w:cs="Arial"/>
-          <w:color w:val="404040"/>
-          <w:kern w:val="0"/>
-          <w:szCs w:val="22"/>
-          <w14:ligatures w14:val="none"/>
-        </w:rPr>
-        <w:t>None</w:t>
-      </w:r>
-    </w:p>
-    <w:p>
-      <w:pPr>
-        <w:keepNext/>
-        <w:keepLines/>
-        <w:spacing w:before="240" w:after="120" w:line="259" w:lineRule="auto"/>
-        <w:outlineLvl w:val="1"/>
+      </w:pPr>
+      <w:bookmarkStart w:id="7" w:name="_Hlk190857538"/>
+      <w:bookmarkStart w:id="8" w:name="_Hlk190857520"/>
+      <w:r>
         <w:rPr>
           <w:rFonts w:ascii="Handel Gothic D" w:eastAsia="DengXian Light" w:hAnsi="Handel Gothic D" w:cs="Times New Roman"/>
           <w:b/>
@@ -4435,144 +5511,6 @@
           <w:kern w:val="0"/>
           <w:sz w:val="32"/>
           <w:szCs w:val="26"/>
-          <w14:ligatures w14:val="none"/>
-        </w:rPr>
-      </w:pPr>
-      <w:r>
-        <w:rPr>
-          <w:rFonts w:ascii="Handel Gothic D" w:eastAsia="DengXian Light" w:hAnsi="Handel Gothic D" w:cs="Times New Roman"/>
-          <w:b/>
-          <w:caps/>
-          <w:color w:val="FF6633"/>
-          <w:kern w:val="0"/>
-          <w:sz w:val="32"/>
-          <w:szCs w:val="26"/>
-          <w14:ligatures w14:val="none"/>
-        </w:rPr>
-        <w:t>Low</w:t>
-      </w:r>
-    </w:p>
-    <w:p>
-      <w:pPr>
-        <w:numPr>
-          <w:ilvl w:val="0"/>
-          <w:numId w:val="11"/>
-        </w:numPr>
-        <w:spacing w:line="259" w:lineRule="auto"/>
-        <w:contextualSpacing/>
-        <w:rPr>
-          <w:rFonts w:ascii="Corbel" w:eastAsia="Calibri" w:hAnsi="Corbel" w:cs="Arial"/>
-          <w:color w:val="404040"/>
-          <w:kern w:val="0"/>
-          <w:szCs w:val="22"/>
-          <w14:ligatures w14:val="none"/>
-        </w:rPr>
-      </w:pPr>
-      <w:r>
-        <w:rPr>
-          <w:rFonts w:ascii="Corbel" w:eastAsia="Calibri" w:hAnsi="Corbel" w:cs="Arial"/>
-          <w:color w:val="404040"/>
-          <w:kern w:val="0"/>
-          <w:szCs w:val="22"/>
-          <w14:ligatures w14:val="none"/>
-        </w:rPr>
-        <w:t>None</w:t>
-      </w:r>
-    </w:p>
-    <w:p>
-      <w:pPr>
-        <w:keepNext/>
-        <w:keepLines/>
-        <w:spacing w:before="240" w:after="120" w:line="259" w:lineRule="auto"/>
-        <w:outlineLvl w:val="1"/>
-        <w:rPr>
-          <w:rFonts w:ascii="Handel Gothic D" w:eastAsia="DengXian Light" w:hAnsi="Handel Gothic D" w:cs="Times New Roman"/>
-          <w:b/>
-          <w:caps/>
-          <w:color w:val="FF6633"/>
-          <w:kern w:val="0"/>
-          <w:sz w:val="32"/>
-          <w:szCs w:val="26"/>
-          <w14:ligatures w14:val="none"/>
-        </w:rPr>
-      </w:pPr>
-    </w:p>
-    <w:p/>
-    <w:p/>
-    <w:p/>
-    <w:p>
-      <w:pPr>
-        <w:spacing w:line="259" w:lineRule="auto"/>
-        <w:contextualSpacing/>
-        <w:rPr>
-          <w:rFonts w:ascii="Corbel" w:eastAsia="Calibri" w:hAnsi="Corbel" w:cs="Arial"/>
-          <w:color w:val="404040"/>
-          <w:kern w:val="0"/>
-          <w:szCs w:val="22"/>
-          <w14:ligatures w14:val="none"/>
-        </w:rPr>
-      </w:pPr>
-      <w:r>
-        <w:rPr>
-          <w:rFonts w:ascii="Corbel" w:eastAsia="Calibri" w:hAnsi="Corbel" w:cs="Arial"/>
-          <w:color w:val="404040"/>
-          <w:kern w:val="0"/>
-          <w:szCs w:val="22"/>
-          <w14:ligatures w14:val="none"/>
-        </w:rPr>
-        <w:br/>
-      </w:r>
-    </w:p>
-    <w:p>
-      <w:pPr>
-        <w:spacing w:line="259" w:lineRule="auto"/>
-        <w:rPr>
-          <w:rFonts w:ascii="Corbel" w:eastAsia="Calibri" w:hAnsi="Corbel" w:cs="Arial"/>
-          <w:color w:val="404040"/>
-          <w:kern w:val="0"/>
-          <w:szCs w:val="22"/>
-          <w14:ligatures w14:val="none"/>
-        </w:rPr>
-      </w:pPr>
-      <w:r>
-        <w:rPr>
-          <w:rFonts w:ascii="Corbel" w:eastAsia="Calibri" w:hAnsi="Corbel" w:cs="Arial"/>
-          <w:color w:val="404040"/>
-          <w:kern w:val="0"/>
-          <w:szCs w:val="22"/>
-          <w14:ligatures w14:val="none"/>
-        </w:rPr>
-        <w:br w:type="page"/>
-      </w:r>
-    </w:p>
-    <w:p>
-      <w:pPr>
-        <w:keepNext/>
-        <w:keepLines/>
-        <w:spacing w:before="240" w:after="120" w:line="259" w:lineRule="auto"/>
-        <w:outlineLvl w:val="1"/>
-        <w:rPr>
-          <w:rFonts w:ascii="Handel Gothic D" w:eastAsia="DengXian Light" w:hAnsi="Handel Gothic D" w:cs="Times New Roman"/>
-          <w:b/>
-          <w:caps/>
-          <w:color w:val="FF6633"/>
-          <w:kern w:val="0"/>
-          <w:sz w:val="32"/>
-          <w:szCs w:val="26"/>
-          <w14:ligatures w14:val="none"/>
-        </w:rPr>
-      </w:pPr>
-      <w:bookmarkStart w:id="7" w:name="_Hlk190857538"/>
-      <w:bookmarkStart w:id="8" w:name="_Hlk190857520"/>
-      <w:r>
-        <w:rPr>
-          <w:rFonts w:ascii="Handel Gothic D" w:eastAsia="DengXian Light" w:hAnsi="Handel Gothic D" w:cs="Times New Roman"/>
-          <w:b/>
-          <w:caps/>
-          <w:color w:val="FF6633"/>
-          <w:kern w:val="0"/>
-          <w:sz w:val="32"/>
-          <w:szCs w:val="26"/>
           <w:highlight w:val="yellow"/>
           <w14:ligatures w14:val="none"/>
         </w:rPr>
@@ -4580,6 +5518,240 @@
         <w:t>Informational</w:t>
       </w:r>
       <w:bookmarkEnd w:id="7"/>
+    </w:p>
+    <w:p>
+      <w:pPr>
+        <w:spacing w:before="120" w:after="160"/>
+      </w:pPr>
+      <w:r>
+        <w:drawing>
+          <wp:inline xmlns:a="http://schemas.openxmlformats.org/drawingml/2006/main" xmlns:pic="http://schemas.openxmlformats.org/drawingml/2006/picture">
+            <wp:extent cx="5760720" cy="1839367"/>
+            <wp:docPr id="2011428621" name="Picture 2011428621"/>
+            <wp:cNvGraphicFramePr>
+              <a:graphicFrameLocks noChangeAspect="1"/>
+            </wp:cNvGraphicFramePr>
+            <a:graphic>
+              <a:graphicData uri="http://schemas.openxmlformats.org/drawingml/2006/picture">
+                <pic:pic>
+                  <pic:nvPicPr>
+                    <pic:cNvPr id="0" name="image.png"/>
+                    <pic:cNvPicPr/>
+                  </pic:nvPicPr>
+                  <pic:blipFill>
+                    <a:blip r:embed="rId30"/>
+                    <a:stretch>
+                      <a:fillRect/>
+                    </a:stretch>
+                  </pic:blipFill>
+                  <pic:spPr>
+                    <a:xfrm>
+                      <a:off x="0" y="0"/>
+                      <a:ext cx="5760720" cy="1839367"/>
+                    </a:xfrm>
+                    <a:prstGeom prst="rect"/>
+                  </pic:spPr>
+                </pic:pic>
+              </a:graphicData>
+            </a:graphic>
+          </wp:inline>
+        </w:drawing>
+      </w:r>
+    </w:p>
+    <w:p>
+      <w:pPr>
+        <w:spacing w:before="120" w:after="160"/>
+      </w:pPr>
+      <w:r>
+        <w:drawing>
+          <wp:inline xmlns:a="http://schemas.openxmlformats.org/drawingml/2006/main" xmlns:pic="http://schemas.openxmlformats.org/drawingml/2006/picture">
+            <wp:extent cx="5760720" cy="1523402"/>
+            <wp:docPr id="2011428622" name="Picture 2011428622"/>
+            <wp:cNvGraphicFramePr>
+              <a:graphicFrameLocks noChangeAspect="1"/>
+            </wp:cNvGraphicFramePr>
+            <a:graphic>
+              <a:graphicData uri="http://schemas.openxmlformats.org/drawingml/2006/picture">
+                <pic:pic>
+                  <pic:nvPicPr>
+                    <pic:cNvPr id="0" name="image.png"/>
+                    <pic:cNvPicPr/>
+                  </pic:nvPicPr>
+                  <pic:blipFill>
+                    <a:blip r:embed="rId31"/>
+                    <a:stretch>
+                      <a:fillRect/>
+                    </a:stretch>
+                  </pic:blipFill>
+                  <pic:spPr>
+                    <a:xfrm>
+                      <a:off x="0" y="0"/>
+                      <a:ext cx="5760720" cy="1523402"/>
+                    </a:xfrm>
+                    <a:prstGeom prst="rect"/>
+                  </pic:spPr>
+                </pic:pic>
+              </a:graphicData>
+            </a:graphic>
+          </wp:inline>
+        </w:drawing>
+      </w:r>
+    </w:p>
+    <w:p>
+      <w:pPr>
+        <w:spacing w:before="120" w:after="160"/>
+      </w:pPr>
+      <w:r>
+        <w:drawing>
+          <wp:inline xmlns:a="http://schemas.openxmlformats.org/drawingml/2006/main" xmlns:pic="http://schemas.openxmlformats.org/drawingml/2006/picture">
+            <wp:extent cx="5760720" cy="2110195"/>
+            <wp:docPr id="2011428623" name="Picture 2011428623"/>
+            <wp:cNvGraphicFramePr>
+              <a:graphicFrameLocks noChangeAspect="1"/>
+            </wp:cNvGraphicFramePr>
+            <a:graphic>
+              <a:graphicData uri="http://schemas.openxmlformats.org/drawingml/2006/picture">
+                <pic:pic>
+                  <pic:nvPicPr>
+                    <pic:cNvPr id="0" name="image.png"/>
+                    <pic:cNvPicPr/>
+                  </pic:nvPicPr>
+                  <pic:blipFill>
+                    <a:blip r:embed="rId32"/>
+                    <a:stretch>
+                      <a:fillRect/>
+                    </a:stretch>
+                  </pic:blipFill>
+                  <pic:spPr>
+                    <a:xfrm>
+                      <a:off x="0" y="0"/>
+                      <a:ext cx="5760720" cy="2110195"/>
+                    </a:xfrm>
+                    <a:prstGeom prst="rect"/>
+                  </pic:spPr>
+                </pic:pic>
+              </a:graphicData>
+            </a:graphic>
+          </wp:inline>
+        </w:drawing>
+      </w:r>
+    </w:p>
+    <w:p>
+      <w:pPr>
+        <w:spacing w:before="120" w:after="160"/>
+      </w:pPr>
+      <w:r>
+        <w:drawing>
+          <wp:inline xmlns:a="http://schemas.openxmlformats.org/drawingml/2006/main" xmlns:pic="http://schemas.openxmlformats.org/drawingml/2006/picture">
+            <wp:extent cx="5760720" cy="1839367"/>
+            <wp:docPr id="2011428618" name="Picture 2011428618"/>
+            <wp:cNvGraphicFramePr>
+              <a:graphicFrameLocks noChangeAspect="1"/>
+            </wp:cNvGraphicFramePr>
+            <a:graphic>
+              <a:graphicData uri="http://schemas.openxmlformats.org/drawingml/2006/picture">
+                <pic:pic>
+                  <pic:nvPicPr>
+                    <pic:cNvPr id="0" name="Informational6.png"/>
+                    <pic:cNvPicPr/>
+                  </pic:nvPicPr>
+                  <pic:blipFill>
+                    <a:blip r:embed="rId30"/>
+                    <a:stretch>
+                      <a:fillRect/>
+                    </a:stretch>
+                  </pic:blipFill>
+                  <pic:spPr>
+                    <a:xfrm>
+                      <a:off x="0" y="0"/>
+                      <a:ext cx="5760720" cy="1839367"/>
+                    </a:xfrm>
+                    <a:prstGeom prst="rect"/>
+                  </pic:spPr>
+                </pic:pic>
+              </a:graphicData>
+            </a:graphic>
+          </wp:inline>
+        </w:drawing>
+      </w:r>
+    </w:p>
+    <w:p>
+      <w:pPr>
+        <w:spacing w:before="120" w:after="160"/>
+      </w:pPr>
+      <w:r>
+        <w:drawing>
+          <wp:inline xmlns:a="http://schemas.openxmlformats.org/drawingml/2006/main" xmlns:pic="http://schemas.openxmlformats.org/drawingml/2006/picture">
+            <wp:extent cx="5760720" cy="1523402"/>
+            <wp:docPr id="2011428619" name="Picture 2011428619"/>
+            <wp:cNvGraphicFramePr>
+              <a:graphicFrameLocks noChangeAspect="1"/>
+            </wp:cNvGraphicFramePr>
+            <a:graphic>
+              <a:graphicData uri="http://schemas.openxmlformats.org/drawingml/2006/picture">
+                <pic:pic>
+                  <pic:nvPicPr>
+                    <pic:cNvPr id="0" name="Informational-second-6.png"/>
+                    <pic:cNvPicPr/>
+                  </pic:nvPicPr>
+                  <pic:blipFill>
+                    <a:blip r:embed="rId31"/>
+                    <a:stretch>
+                      <a:fillRect/>
+                    </a:stretch>
+                  </pic:blipFill>
+                  <pic:spPr>
+                    <a:xfrm>
+                      <a:off x="0" y="0"/>
+                      <a:ext cx="5760720" cy="1523402"/>
+                    </a:xfrm>
+                    <a:prstGeom prst="rect"/>
+                  </pic:spPr>
+                </pic:pic>
+              </a:graphicData>
+            </a:graphic>
+          </wp:inline>
+        </w:drawing>
+      </w:r>
+    </w:p>
+    <w:p>
+      <w:pPr>
+        <w:spacing w:before="120" w:after="160"/>
+      </w:pPr>
+      <w:r>
+        <w:drawing>
+          <wp:inline xmlns:a="http://schemas.openxmlformats.org/drawingml/2006/main" xmlns:pic="http://schemas.openxmlformats.org/drawingml/2006/picture">
+            <wp:extent cx="5760720" cy="2110195"/>
+            <wp:docPr id="2011428620" name="Picture 2011428620"/>
+            <wp:cNvGraphicFramePr>
+              <a:graphicFrameLocks noChangeAspect="1"/>
+            </wp:cNvGraphicFramePr>
+            <a:graphic>
+              <a:graphicData uri="http://schemas.openxmlformats.org/drawingml/2006/picture">
+                <pic:pic>
+                  <pic:nvPicPr>
+                    <pic:cNvPr id="0" name="Informational8.png"/>
+                    <pic:cNvPicPr/>
+                  </pic:nvPicPr>
+                  <pic:blipFill>
+                    <a:blip r:embed="rId32"/>
+                    <a:stretch>
+                      <a:fillRect/>
+                    </a:stretch>
+                  </pic:blipFill>
+                  <pic:spPr>
+                    <a:xfrm>
+                      <a:off x="0" y="0"/>
+                      <a:ext cx="5760720" cy="2110195"/>
+                    </a:xfrm>
+                    <a:prstGeom prst="rect"/>
+                  </pic:spPr>
+                </pic:pic>
+              </a:graphicData>
+            </a:graphic>
+          </wp:inline>
+        </w:drawing>
+      </w:r>
     </w:p>
     <w:p>
       <w:pPr>
@@ -4992,6 +6164,869 @@
     </w:p>
     <w:p>
       <w:pPr>
+        <w:pStyle w:val="ActivityBullet"/>
+        <w:rPr>
+          <w:lang w:val="fr-FR"/>
+        </w:rPr>
+      </w:pPr>
+      <w:r>
+        <w:rPr>
+          <w:lang w:val="fr-FR"/>
+        </w:rPr>
+        <w:t>2026-01-29 13:52:47-0500PM ET exposurescout Initiating ExposureScout module.</w:t>
+      </w:r>
+    </w:p>
+    <w:p>
+      <w:pPr>
+        <w:pStyle w:val="ActivityBullet"/>
+      </w:pPr>
+      <w:r>
+        <w:t>2026-01-29 13:52:59-0500PM ET exposurescout Enumerating subdomains from one (1) domain.</w:t>
+      </w:r>
+    </w:p>
+    <w:p>
+      <w:pPr>
+        <w:pStyle w:val="ActivityBullet"/>
+        <w:rPr>
+          <w:lang w:val="fr-FR"/>
+        </w:rPr>
+      </w:pPr>
+      <w:r>
+        <w:rPr>
+          <w:lang w:val="fr-FR"/>
+        </w:rPr>
+        <w:t>2026-01-29 13:54:13-0500PM ET exposurescout Completed subdomain enumeration.</w:t>
+      </w:r>
+    </w:p>
+    <w:p>
+      <w:pPr>
+        <w:pStyle w:val="ActivityBullet"/>
+      </w:pPr>
+      <w:r>
+        <w:t>2026-01-29 13:54:13-0500PM ET exposurescout Beginning DNS enumeration.</w:t>
+      </w:r>
+    </w:p>
+    <w:p>
+      <w:pPr>
+        <w:pStyle w:val="ActivityBullet"/>
+        <w:rPr>
+          <w:lang w:val="fr-FR"/>
+        </w:rPr>
+      </w:pPr>
+      <w:r>
+        <w:rPr>
+          <w:lang w:val="fr-FR"/>
+        </w:rPr>
+        <w:t>2026-01-29 13:55:18-0500PM ET exposurescout Completed DNS enumeration.</w:t>
+      </w:r>
+    </w:p>
+    <w:p>
+      <w:pPr>
+        <w:pStyle w:val="ActivityBullet"/>
+      </w:pPr>
+      <w:r>
+        <w:t>2026-01-29 13:55:18-0500PM ET exposurescout Enumerating doppelganger domains for one (1) domain.</w:t>
+      </w:r>
+    </w:p>
+    <w:p>
+      <w:pPr>
+        <w:pStyle w:val="ActivityBullet"/>
+        <w:rPr>
+          <w:lang w:val="fr-FR"/>
+        </w:rPr>
+      </w:pPr>
+      <w:r>
+        <w:rPr>
+          <w:lang w:val="fr-FR"/>
+        </w:rPr>
+        <w:t>2026-01-29 13:56:28-0500PM ET exposurescout Ten (10) new doppelganger domains discovered.</w:t>
+      </w:r>
+    </w:p>
+    <w:p>
+      <w:pPr>
+        <w:pStyle w:val="ActivityBullet"/>
+        <w:rPr>
+          <w:lang w:val="fr-FR"/>
+        </w:rPr>
+      </w:pPr>
+      <w:r>
+        <w:rPr>
+          <w:lang w:val="fr-FR"/>
+        </w:rPr>
+        <w:t>2026-01-29 13:56:28-0500PM ET exposurescout Completed doppelganger domain enumeration.</w:t>
+      </w:r>
+    </w:p>
+    <w:p>
+      <w:pPr>
+        <w:pStyle w:val="ActivityBullet"/>
+      </w:pPr>
+      <w:r>
+        <w:t>2026-01-29 13:56:28-0500PM ET exposurescout Running WHOIS commands on eight (8) domains.</w:t>
+      </w:r>
+    </w:p>
+    <w:p>
+      <w:pPr>
+        <w:pStyle w:val="ActivityBullet"/>
+      </w:pPr>
+      <w:r>
+        <w:t>2026-01-29 13:57:33-0500PM ET exposurescout Importing eight (8) WHOIS results into the database.</w:t>
+      </w:r>
+    </w:p>
+    <w:p>
+      <w:pPr>
+        <w:pStyle w:val="ActivityBullet"/>
+      </w:pPr>
+      <w:r>
+        <w:t>2026-01-29 13:57:34-0500PM ET exposurescout Completed recursive WHOIS lookups</w:t>
+      </w:r>
+    </w:p>
+    <w:p>
+      <w:pPr>
+        <w:pStyle w:val="ActivityBullet"/>
+      </w:pPr>
+      <w:r>
+        <w:t>2026-01-29 13:57:34-0500PM ET exposurescout Email scraping module started.</w:t>
+      </w:r>
+    </w:p>
+    <w:p>
+      <w:pPr>
+        <w:pStyle w:val="ActivityBullet"/>
+      </w:pPr>
+      <w:r>
+        <w:t>2026-01-29 13:58:40-0500PM ET exposurescout Completed email scraping.</w:t>
+      </w:r>
+    </w:p>
+    <w:p>
+      <w:pPr>
+        <w:pStyle w:val="ActivityBullet"/>
+      </w:pPr>
+      <w:r>
+        <w:t>2026-01-29 13:58:40-0500PM ET exposurescout Scanning subdomains for subdomain takeover vulnerability.</w:t>
+      </w:r>
+    </w:p>
+    <w:p>
+      <w:pPr>
+        <w:pStyle w:val="ActivityBullet"/>
+      </w:pPr>
+      <w:r>
+        <w:t>2026-01-29 13:59:44-0500PM ET exposurescout Found 1 domain vulnerable to subdomain takeover.</w:t>
+      </w:r>
+    </w:p>
+    <w:p>
+      <w:pPr>
+        <w:pStyle w:val="ActivityBullet"/>
+      </w:pPr>
+      <w:r>
+        <w:t>2026-01-29 13:59:44-0500PM ET exposurescout Completed subdomain takeover checks.</w:t>
+      </w:r>
+    </w:p>
+    <w:p>
+      <w:pPr>
+        <w:pStyle w:val="ActivityBullet"/>
+        <w:rPr>
+          <w:lang w:val="fr-FR"/>
+        </w:rPr>
+      </w:pPr>
+      <w:r>
+        <w:rPr>
+          <w:lang w:val="fr-FR"/>
+        </w:rPr>
+        <w:t>2026-01-29 13:59:44-0500PM ET exposurescout ExposureScout module completed.</w:t>
+      </w:r>
+    </w:p>
+    <w:p>
+      <w:pPr>
+        <w:pStyle w:val="ActivityBullet"/>
+      </w:pPr>
+      <w:r>
+        <w:t>2026-01-29 13:59:44-0500PM ET host discovery Performing DNS resolution for 1 DNS name.</w:t>
+      </w:r>
+    </w:p>
+    <w:p>
+      <w:pPr>
+        <w:pStyle w:val="ActivityBullet"/>
+      </w:pPr>
+      <w:r>
+        <w:t>2026-01-29 14:00:50-0500PM ET host discovery DNS resolution complete.</w:t>
+      </w:r>
+    </w:p>
+    <w:p>
+      <w:pPr>
+        <w:pStyle w:val="ActivityBullet"/>
+      </w:pPr>
+      <w:r>
+        <w:t>2026-01-29 14:00:50-0500PM ET host discovery Port scan module initialized.</w:t>
+      </w:r>
+    </w:p>
+    <w:p>
+      <w:pPr>
+        <w:pStyle w:val="ActivityBullet"/>
+      </w:pPr>
+      <w:r>
+        <w:t>2026-01-29 14:00:53-0500PM ET host discovery Conducting port scan against in-scope systems.</w:t>
+      </w:r>
+    </w:p>
+    <w:p>
+      <w:pPr>
+        <w:pStyle w:val="ActivityBullet"/>
+      </w:pPr>
+      <w:r>
+        <w:t>2026-01-29 14:00:57-0500PM ET host discovery Running nmap port scans.</w:t>
+      </w:r>
+    </w:p>
+    <w:p>
+      <w:pPr>
+        <w:pStyle w:val="ActivityBullet"/>
+      </w:pPr>
+      <w:r>
+        <w:t>2026-01-29 14:02:01-0500PM ET host discovery Completed nmap port scans.</w:t>
+      </w:r>
+    </w:p>
+    <w:p>
+      <w:pPr>
+        <w:pStyle w:val="ActivityBullet"/>
+      </w:pPr>
+      <w:r>
+        <w:t>2026-01-29 14:02:01-0500PM ET host discovery Port scans completed successfully.</w:t>
+      </w:r>
+    </w:p>
+    <w:p>
+      <w:pPr>
+        <w:pStyle w:val="ActivityBullet"/>
+      </w:pPr>
+      <w:r>
+        <w:t>2026-01-29 14:02:02-0500PM ET host discovery Parsing results for alive systems.</w:t>
+      </w:r>
+    </w:p>
+    <w:p>
+      <w:pPr>
+        <w:pStyle w:val="ActivityBullet"/>
+      </w:pPr>
+      <w:r>
+        <w:t>2026-01-29 14:02:02-0500PM ET host discovery Completed parsing Nmap results. 1 new IP addresses discovered and imported into DB.</w:t>
+      </w:r>
+    </w:p>
+    <w:p>
+      <w:pPr>
+        <w:pStyle w:val="ActivityBullet"/>
+      </w:pPr>
+      <w:r>
+        <w:t>2026-01-29 14:02:02-0500PM ET host discovery Parsing nmap port scans.</w:t>
+      </w:r>
+    </w:p>
+    <w:p>
+      <w:pPr>
+        <w:pStyle w:val="ActivityBullet"/>
+      </w:pPr>
+      <w:r>
+        <w:t>2026-01-29 14:02:02-0500PM ET host discovery Completed parsing port scans. Imported 3 new ports.</w:t>
+      </w:r>
+    </w:p>
+    <w:p>
+      <w:pPr>
+        <w:pStyle w:val="ActivityBullet"/>
+      </w:pPr>
+      <w:r>
+        <w:t>2026-01-29 14:02:02-0500PM ET host discovery Port scan module completed.</w:t>
+      </w:r>
+    </w:p>
+    <w:p>
+      <w:pPr>
+        <w:pStyle w:val="ActivityBullet"/>
+      </w:pPr>
+      <w:r>
+        <w:t>2026-01-29 14:02:03-0500PM ET host discovery Discovery module completed.</w:t>
+      </w:r>
+    </w:p>
+    <w:p>
+      <w:pPr>
+        <w:pStyle w:val="ActivityBullet"/>
+      </w:pPr>
+      <w:r>
+        <w:t>2026-01-29 14:02:27-0500PM ET host discovery Running nmap port version scans.</w:t>
+      </w:r>
+    </w:p>
+    <w:p>
+      <w:pPr>
+        <w:pStyle w:val="ActivityBullet"/>
+      </w:pPr>
+      <w:r>
+        <w:t>2026-01-29 14:03:30-0500PM ET host discovery Completed nmap port version scans.</w:t>
+      </w:r>
+    </w:p>
+    <w:p>
+      <w:pPr>
+        <w:pStyle w:val="ActivityBullet"/>
+      </w:pPr>
+      <w:r>
+        <w:t>2026-01-29 14:03:35-0500PM ET enumeration Enumeration module initialized.</w:t>
+      </w:r>
+    </w:p>
+    <w:p>
+      <w:pPr>
+        <w:pStyle w:val="ActivityBullet"/>
+      </w:pPr>
+      <w:r>
+        <w:t>2026-01-29 14:04:43-0500PM ET enumeration Enumerating HTTP services.</w:t>
+      </w:r>
+    </w:p>
+    <w:p>
+      <w:pPr>
+        <w:pStyle w:val="ActivityBullet"/>
+      </w:pPr>
+      <w:r>
+        <w:t>2026-01-29 14:04:43-0500PM ET enumeration Enumerating HTTPS services.</w:t>
+      </w:r>
+    </w:p>
+    <w:p>
+      <w:pPr>
+        <w:pStyle w:val="ActivityBullet"/>
+      </w:pPr>
+      <w:r>
+        <w:t>2026-01-29 14:04:43-0500PM ET enumeration Enumerating SSH services.</w:t>
+      </w:r>
+    </w:p>
+    <w:p>
+      <w:pPr>
+        <w:pStyle w:val="ActivityBullet"/>
+      </w:pPr>
+      <w:r>
+        <w:t>2026-01-29 14:04:47-0500PM ET enumeration Running nmap script scan using script: http-headers.</w:t>
+      </w:r>
+    </w:p>
+    <w:p>
+      <w:pPr>
+        <w:pStyle w:val="ActivityBullet"/>
+      </w:pPr>
+      <w:r>
+        <w:t>2026-01-29 14:04:47-0500PM ET enumeration Running nmap script scan using script: http-methods.</w:t>
+      </w:r>
+    </w:p>
+    <w:p>
+      <w:pPr>
+        <w:pStyle w:val="ActivityBullet"/>
+      </w:pPr>
+      <w:r>
+        <w:t>2026-01-29 14:04:47-0500PM ET enumeration Running nmap script scan using script: http-headers.</w:t>
+      </w:r>
+    </w:p>
+    <w:p>
+      <w:pPr>
+        <w:pStyle w:val="ActivityBullet"/>
+      </w:pPr>
+      <w:r>
+        <w:t>2026-01-29 14:04:47-0500PM ET enumeration Running nmap script scan using script: http-robots.txt.</w:t>
+      </w:r>
+    </w:p>
+    <w:p>
+      <w:pPr>
+        <w:pStyle w:val="ActivityBullet"/>
+      </w:pPr>
+      <w:r>
+        <w:t>2026-01-29 14:04:47-0500PM ET enumeration Running nmap script scan using script: http-robots.txt.</w:t>
+      </w:r>
+    </w:p>
+    <w:p>
+      <w:pPr>
+        <w:pStyle w:val="ActivityBullet"/>
+      </w:pPr>
+      <w:r>
+        <w:t>2026-01-29 14:04:47-0500PM ET enumeration Running nmap script scan using script: http-put.</w:t>
+      </w:r>
+    </w:p>
+    <w:p>
+      <w:pPr>
+        <w:pStyle w:val="ActivityBullet"/>
+      </w:pPr>
+      <w:r>
+        <w:t>2026-01-29 14:04:47-0500PM ET enumeration Running nmap script scan using script: http-title.</w:t>
+      </w:r>
+    </w:p>
+    <w:p>
+      <w:pPr>
+        <w:pStyle w:val="ActivityBullet"/>
+      </w:pPr>
+      <w:r>
+        <w:t>2026-01-29 14:04:47-0500PM ET enumeration Running nmap script scan using script: http-shellshock.</w:t>
+      </w:r>
+    </w:p>
+    <w:p>
+      <w:pPr>
+        <w:pStyle w:val="ActivityBullet"/>
+      </w:pPr>
+      <w:r>
+        <w:t>2026-01-29 14:04:47-0500PM ET enumeration Running nmap script scan using script: http-methods.</w:t>
+      </w:r>
+    </w:p>
+    <w:p>
+      <w:pPr>
+        <w:pStyle w:val="ActivityBullet"/>
+      </w:pPr>
+      <w:r>
+        <w:t>2026-01-29 14:04:47-0500PM ET enumeration Running nmap script scan using script: sslv2.</w:t>
+      </w:r>
+    </w:p>
+    <w:p>
+      <w:pPr>
+        <w:pStyle w:val="ActivityBullet"/>
+      </w:pPr>
+      <w:r>
+        <w:t>2026-01-29 14:04:47-0500PM ET enumeration Running nmap script scan using script: ssl-cert.</w:t>
+      </w:r>
+    </w:p>
+    <w:p>
+      <w:pPr>
+        <w:pStyle w:val="ActivityBullet"/>
+      </w:pPr>
+      <w:r>
+        <w:t>2026-01-29 14:04:47-0500PM ET enumeration Running nmap script scan using script: ssl-enum-ciphers.</w:t>
+      </w:r>
+    </w:p>
+    <w:p>
+      <w:pPr>
+        <w:pStyle w:val="ActivityBullet"/>
+      </w:pPr>
+      <w:r>
+        <w:t>2026-01-29 14:04:47-0500PM ET enumeration Running nmap script scan using script: http-shellshock.</w:t>
+      </w:r>
+    </w:p>
+    <w:p>
+      <w:pPr>
+        <w:pStyle w:val="ActivityBullet"/>
+      </w:pPr>
+      <w:r>
+        <w:t>2026-01-29 14:04:47-0500PM ET enumeration Running nmap script scan using script: ssl-poodle.</w:t>
+      </w:r>
+    </w:p>
+    <w:p>
+      <w:pPr>
+        <w:pStyle w:val="ActivityBullet"/>
+      </w:pPr>
+      <w:r>
+        <w:t>2026-01-29 14:04:47-0500PM ET enumeration Running nmap script scan using script: http-put.</w:t>
+      </w:r>
+    </w:p>
+    <w:p>
+      <w:pPr>
+        <w:pStyle w:val="ActivityBullet"/>
+      </w:pPr>
+      <w:r>
+        <w:t>2026-01-29 14:04:47-0500PM ET enumeration Running nmap script scan using script: ssl-heartbleed.</w:t>
+      </w:r>
+    </w:p>
+    <w:p>
+      <w:pPr>
+        <w:pStyle w:val="ActivityBullet"/>
+      </w:pPr>
+      <w:r>
+        <w:t>2026-01-29 14:04:47-0500PM ET enumeration Running nmap script scan using script: http-title.</w:t>
+      </w:r>
+    </w:p>
+    <w:p>
+      <w:pPr>
+        <w:pStyle w:val="ActivityBullet"/>
+      </w:pPr>
+      <w:r>
+        <w:t>2026-01-29 14:04:47-0500PM ET enumeration Running nmap script scan using script: ssl-date.</w:t>
+      </w:r>
+    </w:p>
+    <w:p>
+      <w:pPr>
+        <w:pStyle w:val="ActivityBullet"/>
+      </w:pPr>
+      <w:r>
+        <w:t>2026-01-29 14:04:47-0500PM ET enumeration Queuing up MSF module: auxiliary/scanner/ssh/ssh_version.</w:t>
+      </w:r>
+    </w:p>
+    <w:p>
+      <w:pPr>
+        <w:pStyle w:val="ActivityBullet"/>
+      </w:pPr>
+      <w:r>
+        <w:t>2026-01-29 14:05:50-0500PM ET enumeration Completed MSF module: auxiliary/scanner/ssh/ssh_version.</w:t>
+      </w:r>
+    </w:p>
+    <w:p>
+      <w:pPr>
+        <w:pStyle w:val="ActivityBullet"/>
+      </w:pPr>
+      <w:r>
+        <w:lastRenderedPageBreak/>
+        <w:t>2026-01-29 14:05:50-0500PM ET enumeration Completed nmap script scan using script: http-methods.</w:t>
+      </w:r>
+    </w:p>
+    <w:p>
+      <w:pPr>
+        <w:pStyle w:val="ActivityBullet"/>
+      </w:pPr>
+      <w:r>
+        <w:t>2026-01-29 14:05:50-0500PM ET enumeration Completed nmap script scan using script: ssl-enum-ciphers.</w:t>
+      </w:r>
+    </w:p>
+    <w:p>
+      <w:pPr>
+        <w:pStyle w:val="ActivityBullet"/>
+      </w:pPr>
+      <w:r>
+        <w:t>2026-01-29 14:05:50-0500PM ET enumeration Completed nmap script scan using script: http-put.</w:t>
+      </w:r>
+    </w:p>
+    <w:p>
+      <w:pPr>
+        <w:pStyle w:val="ActivityBullet"/>
+      </w:pPr>
+      <w:r>
+        <w:t>2026-01-29 14:05:50-0500PM ET enumeration Completed nmap script scan using script: http-robots.txt.</w:t>
+      </w:r>
+    </w:p>
+    <w:p>
+      <w:pPr>
+        <w:pStyle w:val="ActivityBullet"/>
+      </w:pPr>
+      <w:r>
+        <w:t>2026-01-29 14:05:50-0500PM ET enumeration Completed nmap script scan using script: ssl-heartbleed.</w:t>
+      </w:r>
+    </w:p>
+    <w:p>
+      <w:pPr>
+        <w:pStyle w:val="ActivityBullet"/>
+      </w:pPr>
+      <w:r>
+        <w:t>2026-01-29 14:05:50-0500PM ET enumeration Completed nmap script scan using script: http-shellshock.</w:t>
+      </w:r>
+    </w:p>
+    <w:p>
+      <w:pPr>
+        <w:pStyle w:val="ActivityBullet"/>
+      </w:pPr>
+      <w:r>
+        <w:t>2026-01-29 14:05:50-0500PM ET enumeration Completed nmap script scan using script: http-robots.txt.</w:t>
+      </w:r>
+    </w:p>
+    <w:p>
+      <w:pPr>
+        <w:pStyle w:val="ActivityBullet"/>
+      </w:pPr>
+      <w:r>
+        <w:t>2026-01-29 14:05:51-0500PM ET enumeration Completed nmap script scan using script: http-put.</w:t>
+      </w:r>
+    </w:p>
+    <w:p>
+      <w:pPr>
+        <w:pStyle w:val="ActivityBullet"/>
+      </w:pPr>
+      <w:r>
+        <w:t>2026-01-29 14:05:51-0500PM ET enumeration Completed nmap script scan using script: http-headers.</w:t>
+      </w:r>
+    </w:p>
+    <w:p>
+      <w:pPr>
+        <w:pStyle w:val="ActivityBullet"/>
+      </w:pPr>
+      <w:r>
+        <w:t>2026-01-29 14:05:51-0500PM ET enumeration Completed nmap script scan using script: http-methods.</w:t>
+      </w:r>
+    </w:p>
+    <w:p>
+      <w:pPr>
+        <w:pStyle w:val="ActivityBullet"/>
+      </w:pPr>
+      <w:r>
+        <w:t>2026-01-29 14:05:51-0500PM ET enumeration Completed nmap script scan using script: ssl-date.</w:t>
+      </w:r>
+    </w:p>
+    <w:p>
+      <w:pPr>
+        <w:pStyle w:val="ActivityBullet"/>
+      </w:pPr>
+      <w:r>
+        <w:t>2026-01-29 14:05:51-0500PM ET enumeration Completed nmap script scan using script: http-title.</w:t>
+      </w:r>
+    </w:p>
+    <w:p>
+      <w:pPr>
+        <w:pStyle w:val="ActivityBullet"/>
+      </w:pPr>
+      <w:r>
+        <w:t>2026-01-29 14:05:51-0500PM ET enumeration Completed nmap script scan using script: http-shellshock.</w:t>
+      </w:r>
+    </w:p>
+    <w:p>
+      <w:pPr>
+        <w:pStyle w:val="ActivityBullet"/>
+      </w:pPr>
+      <w:r>
+        <w:t>2026-01-29 14:05:51-0500PM ET enumeration Completed nmap script scan using script: http-headers.</w:t>
+      </w:r>
+    </w:p>
+    <w:p>
+      <w:pPr>
+        <w:pStyle w:val="ActivityBullet"/>
+      </w:pPr>
+      <w:r>
+        <w:t>2026-01-29 14:05:51-0500PM ET enumeration Completed nmap script scan using script: ssl-poodle.</w:t>
+      </w:r>
+    </w:p>
+    <w:p>
+      <w:pPr>
+        <w:pStyle w:val="ActivityBullet"/>
+      </w:pPr>
+      <w:r>
+        <w:t>2026-01-29 14:05:51-0500PM ET enumeration Completed nmap script scan using script: ssl-cert.</w:t>
+      </w:r>
+    </w:p>
+    <w:p>
+      <w:pPr>
+        <w:pStyle w:val="ActivityBullet"/>
+      </w:pPr>
+      <w:r>
+        <w:t>2026-01-29 14:05:51-0500PM ET enumeration Completed nmap script scan using script: sslv2.</w:t>
+      </w:r>
+    </w:p>
+    <w:p>
+      <w:pPr>
+        <w:pStyle w:val="ActivityBullet"/>
+      </w:pPr>
+      <w:r>
+        <w:t>2026-01-29 14:05:51-0500PM ET enumeration Completed nmap script scan using script: http-title.</w:t>
+      </w:r>
+    </w:p>
+    <w:p>
+      <w:pPr>
+        <w:pStyle w:val="ActivityBullet"/>
+      </w:pPr>
+      <w:r>
+        <w:t>2026-01-29 14:05:51-0500PM ET enumeration Peforming a hidden directory enumeration attack on 80/tcp.</w:t>
+      </w:r>
+    </w:p>
+    <w:p>
+      <w:pPr>
+        <w:pStyle w:val="ActivityBullet"/>
+      </w:pPr>
+      <w:r>
+        <w:t>2026-01-29 14:05:54-0500PM ET enumeration Running nmap script scan using script: sshv1.</w:t>
+      </w:r>
+    </w:p>
+    <w:p>
+      <w:pPr>
+        <w:pStyle w:val="ActivityBullet"/>
+      </w:pPr>
+      <w:r>
+        <w:t>2026-01-29 14:05:54-0500PM ET enumeration Running nmap script scan using script: ssh2-enum-algos.</w:t>
+      </w:r>
+    </w:p>
+    <w:p>
+      <w:pPr>
+        <w:pStyle w:val="ActivityBullet"/>
+      </w:pPr>
+      <w:r>
+        <w:t>2026-01-29 14:05:54-0500PM ET enumeration Running nmap script scan using script: ssh-auth-methods.</w:t>
+      </w:r>
+    </w:p>
+    <w:p>
+      <w:pPr>
+        <w:pStyle w:val="ActivityBullet"/>
+        <w:rPr>
+          <w:lang w:val="fr-FR"/>
+        </w:rPr>
+      </w:pPr>
+      <w:r>
+        <w:rPr>
+          <w:lang w:val="fr-FR"/>
+        </w:rPr>
+        <w:t>2026-01-29 14:05:54-0500PM ET enumeration Analyzing SSL/TLS protocols on port 443/tcp.</w:t>
+      </w:r>
+    </w:p>
+    <w:p>
+      <w:pPr>
+        <w:pStyle w:val="ActivityBullet"/>
+      </w:pPr>
+      <w:r>
+        <w:t>2026-01-29 14:06:55-0500PM ET enumeration Completed SSL/TLS analysis on ports 443/tcp.</w:t>
+      </w:r>
+    </w:p>
+    <w:p>
+      <w:pPr>
+        <w:pStyle w:val="ActivityBullet"/>
+      </w:pPr>
+      <w:r>
+        <w:t>2026-01-29 14:06:55-0500PM ET enumeration Completed hidden directory enumeration scan.</w:t>
+      </w:r>
+    </w:p>
+    <w:p>
+      <w:pPr>
+        <w:pStyle w:val="ActivityBullet"/>
+      </w:pPr>
+      <w:r>
+        <w:t>2026-01-29 14:06:55-0500PM ET enumeration Peforming a hidden directory enumeration attack on 443/tcp.</w:t>
+      </w:r>
+    </w:p>
+    <w:p>
+      <w:pPr>
+        <w:pStyle w:val="ActivityBullet"/>
+      </w:pPr>
+      <w:r>
+        <w:t>2026-01-29 14:06:55-0500PM ET enumeration Completed nmap script scan using script: ssh2-enum-algos.</w:t>
+      </w:r>
+    </w:p>
+    <w:p>
+      <w:pPr>
+        <w:pStyle w:val="ActivityBullet"/>
+      </w:pPr>
+      <w:r>
+        <w:t>2026-01-29 14:06:55-0500PM ET enumeration Completed nmap script scan using script: ssh-auth-methods.</w:t>
+      </w:r>
+    </w:p>
+    <w:p>
+      <w:pPr>
+        <w:pStyle w:val="ActivityBullet"/>
+      </w:pPr>
+      <w:r>
+        <w:t>2026-01-29 14:06:55-0500PM ET enumeration Completed nmap script scan using script: sshv1.</w:t>
+      </w:r>
+    </w:p>
+    <w:p>
+      <w:pPr>
+        <w:pStyle w:val="ActivityBullet"/>
+      </w:pPr>
+      <w:r>
+        <w:t>2026-01-29 14:06:55-0500PM ET enumeration Completed enumerating SSH services.</w:t>
+      </w:r>
+    </w:p>
+    <w:p>
+      <w:pPr>
+        <w:pStyle w:val="ActivityBullet"/>
+      </w:pPr>
+      <w:r>
+        <w:t>2026-01-29 14:06:58-0500PM ET enumeration Analyzing web services running on port 80/tcp.</w:t>
+      </w:r>
+    </w:p>
+    <w:p>
+      <w:pPr>
+        <w:pStyle w:val="ActivityBullet"/>
+      </w:pPr>
+      <w:r>
+        <w:t>2026-01-29 14:08:10-0500PM ET enumeration Completed analyzing web services running on port 80/tcp.</w:t>
+      </w:r>
+    </w:p>
+    <w:p>
+      <w:pPr>
+        <w:pStyle w:val="ActivityBullet"/>
+      </w:pPr>
+      <w:r>
+        <w:t>2026-01-29 14:08:10-0500PM ET enumeration Completed hidden directory enumeration scan.</w:t>
+      </w:r>
+    </w:p>
+    <w:p>
+      <w:pPr>
+        <w:pStyle w:val="ActivityBullet"/>
+      </w:pPr>
+      <w:r>
+        <w:t>2026-01-29 14:08:10-0500PM ET enumeration Completed analyzing web services running on port 80/tcp.</w:t>
+      </w:r>
+    </w:p>
+    <w:p>
+      <w:pPr>
+        <w:pStyle w:val="ActivityBullet"/>
+      </w:pPr>
+      <w:r>
+        <w:t>2026-01-29 14:08:10-0500PM ET enumeration Completed enumerating HTTP services.</w:t>
+      </w:r>
+    </w:p>
+    <w:p>
+      <w:pPr>
+        <w:pStyle w:val="ActivityBullet"/>
+      </w:pPr>
+      <w:r>
+        <w:t>2026-01-29 14:08:13-0500PM ET enumeration Analyzing web services running on port 443/tcp.</w:t>
+      </w:r>
+    </w:p>
+    <w:p>
+      <w:pPr>
+        <w:pStyle w:val="ActivityBullet"/>
+      </w:pPr>
+      <w:r>
+        <w:t>2026-01-29 14:09:15-0500PM ET enumeration Completed analyzing web services running on port 443/tcp.</w:t>
+      </w:r>
+    </w:p>
+    <w:p>
+      <w:pPr>
+        <w:pStyle w:val="ActivityBullet"/>
+      </w:pPr>
+      <w:r>
+        <w:t>2026-01-29 14:09:15-0500PM ET enumeration Completed analyzing web services running on port 443/tcp.</w:t>
+      </w:r>
+    </w:p>
+    <w:p>
+      <w:pPr>
+        <w:pStyle w:val="ActivityBullet"/>
+      </w:pPr>
+      <w:r>
+        <w:t>2026-01-29 14:09:16-0500PM ET enumeration Completed enumerating HTTPS services.</w:t>
+      </w:r>
+    </w:p>
+    <w:p>
+      <w:pPr>
+        <w:pStyle w:val="ActivityBullet"/>
+      </w:pPr>
+      <w:r>
+        <w:t>2026-01-29 14:09:45-0500PM ET enumeration Enumeration module completed.</w:t>
+      </w:r>
+    </w:p>
+    <w:p>
+      <w:pPr>
+        <w:pStyle w:val="ActivityBullet"/>
+        <w:rPr>
+          <w:lang w:val="fr-FR"/>
+        </w:rPr>
+      </w:pPr>
+      <w:r>
+        <w:rPr>
+          <w:lang w:val="fr-FR"/>
+        </w:rPr>
+        <w:t>2026-01-29 14:10:06-0500PM ET exploit Launching exploit module.</w:t>
+      </w:r>
+    </w:p>
+    <w:p>
+      <w:pPr>
+        <w:pStyle w:val="ActivityBullet"/>
+      </w:pPr>
+      <w:r>
+        <w:t>2026-01-29 14:10:11-0500PM ET exploit Queuing up hydra attack: SSH password attack.</w:t>
+      </w:r>
+    </w:p>
+    <w:p>
+      <w:pPr>
+        <w:pStyle w:val="ActivityBullet"/>
+      </w:pPr>
+      <w:r>
+        <w:t>2026-01-29 14:11:16-0500PM ET exploit Completed hydra attack: SSH password attack.</w:t>
+      </w:r>
+    </w:p>
+    <w:p>
+      <w:pPr>
+        <w:pStyle w:val="ActivityBullet"/>
+      </w:pPr>
+      <w:r>
+        <w:t>2026-01-29 14:11:16-0500PM ET exploit Completed SSH password attack.</w:t>
+      </w:r>
+    </w:p>
+    <w:p>
+      <w:pPr>
+        <w:pStyle w:val="ActivityBullet"/>
+        <w:rPr>
+          <w:lang w:val="fr-FR"/>
+        </w:rPr>
+      </w:pPr>
+      <w:r>
+        <w:rPr>
+          <w:lang w:val="fr-FR"/>
+        </w:rPr>
+        <w:t>2026-01-29 14:11:49-0500PM ET exploit Completed exploit module.</w:t>
+      </w:r>
+    </w:p>
+    <w:p>
+      <w:pPr>
         <w:spacing w:line="259" w:lineRule="auto"/>
         <w:contextualSpacing/>
         <w:rPr>
@@ -5000,15 +7035,17 @@
           <w:kern w:val="0"/>
           <w:sz w:val="18"/>
           <w:szCs w:val="18"/>
-          <w14:ligatures w14:val="none"/>
-        </w:rPr>
-      </w:pPr>
-      <w:r>
-        <w:rPr>
-          <w:rFonts w:ascii="Corbel" w:eastAsia="Calibri" w:hAnsi="Corbel" w:cs="Arial"/>
-          <w:color w:val="404040"/>
-          <w:kern w:val="0"/>
-          <w:szCs w:val="22"/>
+          <w:lang w:val="fr-FR"/>
+          <w14:ligatures w14:val="none"/>
+        </w:rPr>
+      </w:pPr>
+      <w:r>
+        <w:rPr>
+          <w:rFonts w:ascii="Corbel" w:eastAsia="Calibri" w:hAnsi="Corbel" w:cs="Arial"/>
+          <w:color w:val="404040"/>
+          <w:kern w:val="0"/>
+          <w:szCs w:val="22"/>
+          <w:lang w:val="fr-FR"/>
           <w14:ligatures w14:val="none"/>
         </w:rPr>
         <w:br w:type="page"/>
@@ -5068,7 +7105,29 @@
           <w:szCs w:val="22"/>
           <w14:ligatures w14:val="none"/>
         </w:rPr>
-        <w:t>The following items are the highest priority recommendations to help improve compliance, defensibility and resilience. These items may not be fully inclusive of all discovered deficiencies and reflect OrbitalFire’s expert opinion regarding return on investment.</w:t>
+        <w:t xml:space="preserve">The following items are the highest priority recommendations to help improve compliance, defensibility and resilience. These items may not be fully inclusive of all discovered deficiencies and reflect </w:t>
+      </w:r>
+      <w:proofErr w:type="spellStart"/>
+      <w:r>
+        <w:rPr>
+          <w:rFonts w:ascii="Corbel" w:eastAsia="Calibri" w:hAnsi="Corbel" w:cs="Arial"/>
+          <w:color w:val="404040"/>
+          <w:kern w:val="0"/>
+          <w:szCs w:val="22"/>
+          <w14:ligatures w14:val="none"/>
+        </w:rPr>
+        <w:t>orbital fire’s</w:t>
+      </w:r>
+      <w:proofErr w:type="spellEnd"/>
+      <w:r>
+        <w:rPr>
+          <w:rFonts w:ascii="Corbel" w:eastAsia="Calibri" w:hAnsi="Corbel" w:cs="Arial"/>
+          <w:color w:val="404040"/>
+          <w:kern w:val="0"/>
+          <w:szCs w:val="22"/>
+          <w14:ligatures w14:val="none"/>
+        </w:rPr>
+        <w:t xml:space="preserve"> expert opinion regarding return on investment.</w:t>
       </w:r>
     </w:p>
     <w:p>
@@ -5112,7 +7171,7 @@
                     </pic:cNvPicPr>
                   </pic:nvPicPr>
                   <pic:blipFill>
-                    <a:blip r:embed="rId14" cstate="print">
+                    <a:blip r:embed="rId20" cstate="print">
                       <a:extLst>
                         <a:ext uri="{28A0092B-C50C-407E-A947-70E740481C1C}">
                           <a14:useLocalDpi xmlns:a14="http://schemas.microsoft.com/office/drawing/2010/main" val="0"/>
@@ -5151,7 +7210,29 @@
           <w:szCs w:val="22"/>
           <w14:ligatures w14:val="none"/>
         </w:rPr>
-        <w:t xml:space="preserve"> – OrbitalFire can provide complete remediation</w:t>
+        <w:t xml:space="preserve"> – </w:t>
+      </w:r>
+      <w:proofErr w:type="spellStart"/>
+      <w:r>
+        <w:rPr>
+          <w:rFonts w:ascii="Corbel" w:eastAsia="Calibri" w:hAnsi="Corbel" w:cs="Arial"/>
+          <w:color w:val="404040"/>
+          <w:kern w:val="0"/>
+          <w:szCs w:val="22"/>
+          <w14:ligatures w14:val="none"/>
+        </w:rPr>
+        <w:t>orbital fire</w:t>
+      </w:r>
+      <w:proofErr w:type="spellEnd"/>
+      <w:r>
+        <w:rPr>
+          <w:rFonts w:ascii="Corbel" w:eastAsia="Calibri" w:hAnsi="Corbel" w:cs="Arial"/>
+          <w:color w:val="404040"/>
+          <w:kern w:val="0"/>
+          <w:szCs w:val="22"/>
+          <w14:ligatures w14:val="none"/>
+        </w:rPr>
+        <w:t xml:space="preserve"> can provide complete remediation</w:t>
       </w:r>
     </w:p>
     <w:p>
@@ -5178,7 +7259,7 @@
           <w14:ligatures w14:val="none"/>
         </w:rPr>
         <w:drawing>
-          <wp:inline distT="0" distB="0" distL="0" distR="0" wp14:anchorId="03962334" wp14:editId="53D9E52D">
+          <wp:inline distT="0" distB="0" distL="0" distR="0" wp14:anchorId="03962334" wp14:editId="63B34A0F">
             <wp:extent cx="152400" cy="152400"/>
             <wp:effectExtent l="0" t="0" r="0" b="0"/>
             <wp:docPr id="2011428596" name="Picture 2011428596" descr="Fire with solid fill"/>
@@ -5195,11 +7276,11 @@
                     </pic:cNvPicPr>
                   </pic:nvPicPr>
                   <pic:blipFill>
-                    <a:blip r:embed="rId15" cstate="print">
+                    <a:blip r:embed="rId21" cstate="print">
                       <a:extLst>
                         <a:ext uri="{BEBA8EAE-BF5A-486C-A8C5-ECC9F3942E4B}">
                           <a14:imgProps xmlns:a14="http://schemas.microsoft.com/office/drawing/2010/main">
-                            <a14:imgLayer r:embed="rId16">
+                            <a14:imgLayer r:embed="rId22">
                               <a14:imgEffect>
                                 <a14:saturation sat="0"/>
                               </a14:imgEffect>
@@ -5243,7 +7324,29 @@
           <w:szCs w:val="22"/>
           <w14:ligatures w14:val="none"/>
         </w:rPr>
-        <w:t xml:space="preserve"> – OrbitalFire can assist with remediation</w:t>
+        <w:t xml:space="preserve"> – </w:t>
+      </w:r>
+      <w:proofErr w:type="spellStart"/>
+      <w:r>
+        <w:rPr>
+          <w:rFonts w:ascii="Corbel" w:eastAsia="Calibri" w:hAnsi="Corbel" w:cs="Arial"/>
+          <w:color w:val="404040"/>
+          <w:kern w:val="0"/>
+          <w:szCs w:val="22"/>
+          <w14:ligatures w14:val="none"/>
+        </w:rPr>
+        <w:t>orbital fire</w:t>
+      </w:r>
+      <w:proofErr w:type="spellEnd"/>
+      <w:r>
+        <w:rPr>
+          <w:rFonts w:ascii="Corbel" w:eastAsia="Calibri" w:hAnsi="Corbel" w:cs="Arial"/>
+          <w:color w:val="404040"/>
+          <w:kern w:val="0"/>
+          <w:szCs w:val="22"/>
+          <w14:ligatures w14:val="none"/>
+        </w:rPr>
+        <w:t xml:space="preserve"> can assist with remediation</w:t>
       </w:r>
       <w:bookmarkStart w:id="14" w:name="_Hlk194407007"/>
     </w:p>
@@ -5277,6 +7380,216 @@
           <w14:ligatures w14:val="none"/>
         </w:rPr>
         <w:t>DISCRETIONARY Remediation</w:t>
+      </w:r>
+    </w:p>
+    <w:p>
+      <w:pPr>
+        <w:pStyle w:val="ListNumber2"/>
+      </w:pPr>
+      <w:r>
+        <w:rPr>
+          <w:noProof/>
+        </w:rPr>
+        <w:drawing>
+          <wp:inline distT="0" distB="0" distL="0" distR="0" wp14:anchorId="431DF5D4" wp14:editId="6F6CA493">
+            <wp:extent cx="152400" cy="152400"/>
+            <wp:effectExtent l="0" t="0" r="0" b="0"/>
+            <wp:docPr id="2011428607" name="Picture 2011428607"/>
+            <wp:cNvGraphicFramePr>
+              <a:graphicFrameLocks xmlns:a="http://schemas.openxmlformats.org/drawingml/2006/main" noChangeAspect="1"/>
+            </wp:cNvGraphicFramePr>
+            <a:graphic xmlns:a="http://schemas.openxmlformats.org/drawingml/2006/main">
+              <a:graphicData uri="http://schemas.openxmlformats.org/drawingml/2006/picture">
+                <pic:pic xmlns:pic="http://schemas.openxmlformats.org/drawingml/2006/picture">
+                  <pic:nvPicPr>
+                    <pic:cNvPr id="0" name="image.png"/>
+                    <pic:cNvPicPr/>
+                  </pic:nvPicPr>
+                  <pic:blipFill>
+                    <a:blip r:embed="rId21"/>
+                    <a:stretch>
+                      <a:fillRect/>
+                    </a:stretch>
+                  </pic:blipFill>
+                  <pic:spPr>
+                    <a:xfrm>
+                      <a:off x="0" y="0"/>
+                      <a:ext cx="152400" cy="152400"/>
+                    </a:xfrm>
+                    <a:prstGeom prst="rect">
+                      <a:avLst/>
+                    </a:prstGeom>
+                  </pic:spPr>
+                </pic:pic>
+              </a:graphicData>
+            </a:graphic>
+          </wp:inline>
+        </w:drawing>
+      </w:r>
+      <w:r>
+        <w:t xml:space="preserve"> </w:t>
+      </w:r>
+      <w:r>
+        <w:rPr>
+          <w:b/>
+        </w:rPr>
+        <w:t>Remediate Subdomain Takeover Exposure</w:t>
+      </w:r>
+      <w:r>
+        <w:t xml:space="preserve"> - Identify and remove misconfigured or stale DNS records that reference unclaimed or deprovisioned third-party services. Conduct a comprehensive review of all DNS entries to ensure they accurately map to active, authorized resources, and implement continuous monitoring to detect future misconfigurations. Where applicable, apply DNS security best practices such as DNSSEC and maintain proper lifecycle management of external service integrations to prevent unauthorized subdomain claims.</w:t>
+      </w:r>
+    </w:p>
+    <w:p>
+      <w:pPr>
+        <w:spacing w:after="120"/>
+        <w:ind w:left="720"/>
+      </w:pPr>
+      <w:r>
+        <w:rPr>
+          <w:rFonts w:ascii="Corbel" w:hAnsi="Corbel"/>
+          <w:u w:val="single"/>
+        </w:rPr>
+        <w:t>Refer to High Finding 1</w:t>
+      </w:r>
+    </w:p>
+    <w:p>
+      <w:pPr>
+        <w:pStyle w:val="ListNumber2"/>
+      </w:pPr>
+      <w:r>
+        <w:rPr>
+          <w:noProof/>
+        </w:rPr>
+        <w:drawing>
+          <wp:inline distT="0" distB="0" distL="0" distR="0" wp14:anchorId="35F27E15" wp14:editId="32DBCE03">
+            <wp:extent cx="152400" cy="152400"/>
+            <wp:effectExtent l="0" t="0" r="0" b="0"/>
+            <wp:docPr id="2011428608" name="Picture 2011428608"/>
+            <wp:cNvGraphicFramePr>
+              <a:graphicFrameLocks xmlns:a="http://schemas.openxmlformats.org/drawingml/2006/main" noChangeAspect="1"/>
+            </wp:cNvGraphicFramePr>
+            <a:graphic xmlns:a="http://schemas.openxmlformats.org/drawingml/2006/main">
+              <a:graphicData uri="http://schemas.openxmlformats.org/drawingml/2006/picture">
+                <pic:pic xmlns:pic="http://schemas.openxmlformats.org/drawingml/2006/picture">
+                  <pic:nvPicPr>
+                    <pic:cNvPr id="0" name="image.png"/>
+                    <pic:cNvPicPr/>
+                  </pic:nvPicPr>
+                  <pic:blipFill>
+                    <a:blip r:embed="rId21"/>
+                    <a:stretch>
+                      <a:fillRect/>
+                    </a:stretch>
+                  </pic:blipFill>
+                  <pic:spPr>
+                    <a:xfrm>
+                      <a:off x="0" y="0"/>
+                      <a:ext cx="152400" cy="152400"/>
+                    </a:xfrm>
+                    <a:prstGeom prst="rect">
+                      <a:avLst/>
+                    </a:prstGeom>
+                  </pic:spPr>
+                </pic:pic>
+              </a:graphicData>
+            </a:graphic>
+          </wp:inline>
+        </w:drawing>
+      </w:r>
+      <w:r>
+        <w:t xml:space="preserve"> </w:t>
+      </w:r>
+      <w:r>
+        <w:rPr>
+          <w:b/>
+        </w:rPr>
+        <w:t>Reconfigure DMARC Record</w:t>
+      </w:r>
+      <w:r>
+        <w:t xml:space="preserve"> - Review and rectify the current DMARC record configuration. The DMARC policy should be explicitly defined, ideally set to "quarantine" or "reject," which directs receiving mail servers on the proper handling of unauthenticated messages.</w:t>
+      </w:r>
+    </w:p>
+    <w:p>
+      <w:pPr>
+        <w:spacing w:after="120"/>
+        <w:ind w:left="720"/>
+      </w:pPr>
+      <w:r>
+        <w:rPr>
+          <w:rFonts w:ascii="Corbel" w:hAnsi="Corbel"/>
+          <w:u w:val="single"/>
+        </w:rPr>
+        <w:t>Refer to Medium Finding 1</w:t>
+      </w:r>
+    </w:p>
+    <w:p>
+      <w:pPr>
+        <w:pStyle w:val="ListNumber2"/>
+      </w:pPr>
+      <w:r>
+        <w:rPr>
+          <w:noProof/>
+        </w:rPr>
+        <w:drawing>
+          <wp:inline distT="0" distB="0" distL="0" distR="0" wp14:anchorId="357B0F86" wp14:editId="4D0F57A1">
+            <wp:extent cx="152400" cy="152400"/>
+            <wp:effectExtent l="0" t="0" r="0" b="0"/>
+            <wp:docPr id="2011428609" name="Picture 2011428609"/>
+            <wp:cNvGraphicFramePr>
+              <a:graphicFrameLocks xmlns:a="http://schemas.openxmlformats.org/drawingml/2006/main" noChangeAspect="1"/>
+            </wp:cNvGraphicFramePr>
+            <a:graphic xmlns:a="http://schemas.openxmlformats.org/drawingml/2006/main">
+              <a:graphicData uri="http://schemas.openxmlformats.org/drawingml/2006/picture">
+                <pic:pic xmlns:pic="http://schemas.openxmlformats.org/drawingml/2006/picture">
+                  <pic:nvPicPr>
+                    <pic:cNvPr id="0" name="image.png"/>
+                    <pic:cNvPicPr/>
+                  </pic:nvPicPr>
+                  <pic:blipFill>
+                    <a:blip r:embed="rId21"/>
+                    <a:stretch>
+                      <a:fillRect/>
+                    </a:stretch>
+                  </pic:blipFill>
+                  <pic:spPr>
+                    <a:xfrm>
+                      <a:off x="0" y="0"/>
+                      <a:ext cx="152400" cy="152400"/>
+                    </a:xfrm>
+                    <a:prstGeom prst="rect">
+                      <a:avLst/>
+                    </a:prstGeom>
+                  </pic:spPr>
+                </pic:pic>
+              </a:graphicData>
+            </a:graphic>
+          </wp:inline>
+        </w:drawing>
+      </w:r>
+      <w:r>
+        <w:t xml:space="preserve"> </w:t>
+      </w:r>
+      <w:r>
+        <w:rPr>
+          <w:b/>
+        </w:rPr>
+        <w:t>Restrict Access to Remote SSH</w:t>
+      </w:r>
+      <w:r>
+        <w:t xml:space="preserve"> - Restrict access from the public Internet. Ensure that the Remote SSH service is only reachable through secure environments, such as a Virtual Private Network (VPN) or specific authorized IP address configurations.</w:t>
+      </w:r>
+    </w:p>
+    <w:p>
+      <w:pPr>
+        <w:spacing w:after="120"/>
+        <w:ind w:left="720"/>
+      </w:pPr>
+      <w:r>
+        <w:rPr>
+          <w:rFonts w:ascii="Corbel" w:hAnsi="Corbel"/>
+          <w:u w:val="single"/>
+        </w:rPr>
+        <w:t>Refer to Medium Finding 2</w:t>
       </w:r>
     </w:p>
     <w:p>
@@ -5387,6 +7700,46 @@
       <w:pPr>
         <w:spacing w:after="120"/>
       </w:pPr>
+      <w:r>
+        <w:rPr>
+          <w:noProof/>
+        </w:rPr>
+        <w:drawing>
+          <wp:inline distT="0" distB="0" distL="0" distR="0" wp14:anchorId="4540B2E1" wp14:editId="5E1B2D31">
+            <wp:extent cx="5943600" cy="830317"/>
+            <wp:effectExtent l="0" t="0" r="0" b="0"/>
+            <wp:docPr id="2011428600" name="Picture 2011428600"/>
+            <wp:cNvGraphicFramePr>
+              <a:graphicFrameLocks xmlns:a="http://schemas.openxmlformats.org/drawingml/2006/main" noChangeAspect="1"/>
+            </wp:cNvGraphicFramePr>
+            <a:graphic xmlns:a="http://schemas.openxmlformats.org/drawingml/2006/main">
+              <a:graphicData uri="http://schemas.openxmlformats.org/drawingml/2006/picture">
+                <pic:pic xmlns:pic="http://schemas.openxmlformats.org/drawingml/2006/picture">
+                  <pic:nvPicPr>
+                    <pic:cNvPr id="0" name="OPEN_PORTS.PNG"/>
+                    <pic:cNvPicPr/>
+                  </pic:nvPicPr>
+                  <pic:blipFill>
+                    <a:blip r:embed="rId23"/>
+                    <a:stretch>
+                      <a:fillRect/>
+                    </a:stretch>
+                  </pic:blipFill>
+                  <pic:spPr>
+                    <a:xfrm>
+                      <a:off x="0" y="0"/>
+                      <a:ext cx="5943600" cy="830317"/>
+                    </a:xfrm>
+                    <a:prstGeom prst="rect">
+                      <a:avLst/>
+                    </a:prstGeom>
+                  </pic:spPr>
+                </pic:pic>
+              </a:graphicData>
+            </a:graphic>
+          </wp:inline>
+        </w:drawing>
+      </w:r>
     </w:p>
     <w:p>
       <w:pPr>
@@ -9291,19 +11644,19 @@
                 <c:formatCode>General</c:formatCode>
                 <c:ptCount val="5"/>
                 <c:pt idx="0">
-                  <c:v>0</c:v>
+                  <c:v>1</c:v>
                 </c:pt>
                 <c:pt idx="1">
                   <c:v>0</c:v>
                 </c:pt>
                 <c:pt idx="2">
-                  <c:v>2</c:v>
+                  <c:v>5</c:v>
                 </c:pt>
                 <c:pt idx="3">
-                  <c:v>1</c:v>
+                  <c:v>4</c:v>
                 </c:pt>
                 <c:pt idx="4">
-                  <c:v>0</c:v>
+                  <c:v>8</c:v>
                 </c:pt>
               </c:numCache>
             </c:numRef>
@@ -9549,7 +11902,7 @@
               <c:f>Sheet1!$A$2:$A$5</c:f>
               <c:numCache>
                 <c:formatCode>General</c:formatCode>
-                <c:ptCount val="4"/>
+                <c:ptCount val="3"/>
                 <c:pt idx="0">
                   <c:v>2023</c:v>
                 </c:pt>
@@ -9559,9 +11912,6 @@
                 <c:pt idx="2">
                   <c:v>2025</c:v>
                 </c:pt>
-                <c:pt idx="3">
-                  <c:v>2026</c:v>
-                </c:pt>
               </c:numCache>
             </c:numRef>
           </c:cat>
@@ -9570,7 +11920,7 @@
               <c:f>Sheet1!$B$2:$B$5</c:f>
               <c:numCache>
                 <c:formatCode>General</c:formatCode>
-                <c:ptCount val="4"/>
+                <c:ptCount val="3"/>
                 <c:pt idx="0">
                   <c:v>1</c:v>
                 </c:pt>
@@ -9579,9 +11929,6 @@
                 </c:pt>
                 <c:pt idx="2">
                   <c:v>1</c:v>
-                </c:pt>
-                <c:pt idx="3">
-                  <c:v>0</c:v>
                 </c:pt>
               </c:numCache>
             </c:numRef>
@@ -9626,7 +11973,7 @@
               <c:f>Sheet1!$A$2:$A$5</c:f>
               <c:numCache>
                 <c:formatCode>General</c:formatCode>
-                <c:ptCount val="4"/>
+                <c:ptCount val="3"/>
                 <c:pt idx="0">
                   <c:v>2023</c:v>
                 </c:pt>
@@ -9636,9 +11983,6 @@
                 <c:pt idx="2">
                   <c:v>2025</c:v>
                 </c:pt>
-                <c:pt idx="3">
-                  <c:v>2026</c:v>
-                </c:pt>
               </c:numCache>
             </c:numRef>
           </c:cat>
@@ -9647,7 +11991,7 @@
               <c:f>Sheet1!$C$2:$C$5</c:f>
               <c:numCache>
                 <c:formatCode>General</c:formatCode>
-                <c:ptCount val="4"/>
+                <c:ptCount val="3"/>
                 <c:pt idx="0">
                   <c:v>0</c:v>
                 </c:pt>
@@ -9655,9 +11999,6 @@
                   <c:v>0</c:v>
                 </c:pt>
                 <c:pt idx="2">
-                  <c:v>0</c:v>
-                </c:pt>
-                <c:pt idx="3">
                   <c:v>0</c:v>
                 </c:pt>
               </c:numCache>
@@ -9701,7 +12042,7 @@
               <c:f>Sheet1!$A$2:$A$5</c:f>
               <c:numCache>
                 <c:formatCode>General</c:formatCode>
-                <c:ptCount val="4"/>
+                <c:ptCount val="3"/>
                 <c:pt idx="0">
                   <c:v>2023</c:v>
                 </c:pt>
@@ -9711,9 +12052,6 @@
                 <c:pt idx="2">
                   <c:v>2025</c:v>
                 </c:pt>
-                <c:pt idx="3">
-                  <c:v>2026</c:v>
-                </c:pt>
               </c:numCache>
             </c:numRef>
           </c:cat>
@@ -9722,7 +12060,7 @@
               <c:f>Sheet1!$D$2:$D$5</c:f>
               <c:numCache>
                 <c:formatCode>General</c:formatCode>
-                <c:ptCount val="4"/>
+                <c:ptCount val="3"/>
                 <c:pt idx="0">
                   <c:v>0</c:v>
                 </c:pt>
@@ -9731,9 +12069,6 @@
                 </c:pt>
                 <c:pt idx="2">
                   <c:v>5</c:v>
-                </c:pt>
-                <c:pt idx="3">
-                  <c:v>2</c:v>
                 </c:pt>
               </c:numCache>
             </c:numRef>
@@ -9776,7 +12111,7 @@
               <c:f>Sheet1!$A$2:$A$5</c:f>
               <c:numCache>
                 <c:formatCode>General</c:formatCode>
-                <c:ptCount val="4"/>
+                <c:ptCount val="3"/>
                 <c:pt idx="0">
                   <c:v>2023</c:v>
                 </c:pt>
@@ -9786,9 +12121,6 @@
                 <c:pt idx="2">
                   <c:v>2025</c:v>
                 </c:pt>
-                <c:pt idx="3">
-                  <c:v>2026</c:v>
-                </c:pt>
               </c:numCache>
             </c:numRef>
           </c:cat>
@@ -9797,7 +12129,7 @@
               <c:f>Sheet1!$E$2:$E$5</c:f>
               <c:numCache>
                 <c:formatCode>General</c:formatCode>
-                <c:ptCount val="4"/>
+                <c:ptCount val="3"/>
                 <c:pt idx="0">
                   <c:v>0</c:v>
                 </c:pt>
@@ -9806,9 +12138,6 @@
                 </c:pt>
                 <c:pt idx="2">
                   <c:v>4</c:v>
-                </c:pt>
-                <c:pt idx="3">
-                  <c:v>1</c:v>
                 </c:pt>
               </c:numCache>
             </c:numRef>
@@ -9851,7 +12180,7 @@
               <c:f>Sheet1!$A$2:$A$5</c:f>
               <c:numCache>
                 <c:formatCode>General</c:formatCode>
-                <c:ptCount val="4"/>
+                <c:ptCount val="3"/>
                 <c:pt idx="0">
                   <c:v>2023</c:v>
                 </c:pt>
@@ -9861,9 +12190,6 @@
                 <c:pt idx="2">
                   <c:v>2025</c:v>
                 </c:pt>
-                <c:pt idx="3">
-                  <c:v>2026</c:v>
-                </c:pt>
               </c:numCache>
             </c:numRef>
           </c:cat>
@@ -9872,7 +12198,7 @@
               <c:f>Sheet1!$F$2:$F$5</c:f>
               <c:numCache>
                 <c:formatCode>General</c:formatCode>
-                <c:ptCount val="4"/>
+                <c:ptCount val="3"/>
                 <c:pt idx="0">
                   <c:v>0</c:v>
                 </c:pt>
@@ -9881,9 +12207,6 @@
                 </c:pt>
                 <c:pt idx="2">
                   <c:v>8</c:v>
-                </c:pt>
-                <c:pt idx="3">
-                  <c:v>0</c:v>
                 </c:pt>
               </c:numCache>
             </c:numRef>

</xml_diff>

<commit_message>
Insert informational screenshots under matching reference headings
</commit_message>
<xml_diff>
--- a/Source_Code/Reports/Sample499/FindingsReportTest.docx
+++ b/Source_Code/Reports/Sample499/FindingsReportTest.docx
@@ -4952,6 +4952,45 @@
       </w:r>
     </w:p>
     <w:p>
+      <w:pPr>
+        <w:spacing w:before="120" w:after="160"/>
+      </w:pPr>
+      <w:r>
+        <w:drawing>
+          <wp:inline xmlns:a="http://schemas.openxmlformats.org/drawingml/2006/main" xmlns:pic="http://schemas.openxmlformats.org/drawingml/2006/picture">
+            <wp:extent cx="5760720" cy="1523402"/>
+            <wp:docPr id="2011428626" name="Picture 2011428626"/>
+            <wp:cNvGraphicFramePr>
+              <a:graphicFrameLocks noChangeAspect="1"/>
+            </wp:cNvGraphicFramePr>
+            <a:graphic>
+              <a:graphicData uri="http://schemas.openxmlformats.org/drawingml/2006/picture">
+                <pic:pic>
+                  <pic:nvPicPr>
+                    <pic:cNvPr id="0" name="image.png"/>
+                    <pic:cNvPicPr/>
+                  </pic:nvPicPr>
+                  <pic:blipFill>
+                    <a:blip r:embed="rId31"/>
+                    <a:stretch>
+                      <a:fillRect/>
+                    </a:stretch>
+                  </pic:blipFill>
+                  <pic:spPr>
+                    <a:xfrm>
+                      <a:off x="0" y="0"/>
+                      <a:ext cx="5760720" cy="1523402"/>
+                    </a:xfrm>
+                    <a:prstGeom prst="rect"/>
+                  </pic:spPr>
+                </pic:pic>
+              </a:graphicData>
+            </a:graphic>
+          </wp:inline>
+        </w:drawing>
+      </w:r>
+    </w:p>
+    <w:p>
       <w:r>
         <w:rPr>
           <w:rFonts w:ascii="Corbel" w:hAnsi="Corbel"/>
@@ -5956,6 +5995,45 @@
     </w:p>
     <w:p>
       <w:pPr>
+        <w:spacing w:before="120" w:after="160"/>
+      </w:pPr>
+      <w:r>
+        <w:drawing>
+          <wp:inline xmlns:a="http://schemas.openxmlformats.org/drawingml/2006/main" xmlns:pic="http://schemas.openxmlformats.org/drawingml/2006/picture">
+            <wp:extent cx="5760720" cy="1839367"/>
+            <wp:docPr id="2011428624" name="Picture 2011428624"/>
+            <wp:cNvGraphicFramePr>
+              <a:graphicFrameLocks noChangeAspect="1"/>
+            </wp:cNvGraphicFramePr>
+            <a:graphic>
+              <a:graphicData uri="http://schemas.openxmlformats.org/drawingml/2006/picture">
+                <pic:pic>
+                  <pic:nvPicPr>
+                    <pic:cNvPr id="0" name="image.png"/>
+                    <pic:cNvPicPr/>
+                  </pic:nvPicPr>
+                  <pic:blipFill>
+                    <a:blip r:embed="rId30"/>
+                    <a:stretch>
+                      <a:fillRect/>
+                    </a:stretch>
+                  </pic:blipFill>
+                  <pic:spPr>
+                    <a:xfrm>
+                      <a:off x="0" y="0"/>
+                      <a:ext cx="5760720" cy="1839367"/>
+                    </a:xfrm>
+                    <a:prstGeom prst="rect"/>
+                  </pic:spPr>
+                </pic:pic>
+              </a:graphicData>
+            </a:graphic>
+          </wp:inline>
+        </w:drawing>
+      </w:r>
+    </w:p>
+    <w:p>
+      <w:pPr>
         <w:numPr>
           <w:ilvl w:val="0"/>
           <w:numId w:val="13"/>
@@ -6102,6 +6180,45 @@
           <w14:ligatures w14:val="none"/>
         </w:rPr>
         <w:br/>
+      </w:r>
+    </w:p>
+    <w:p>
+      <w:pPr>
+        <w:spacing w:before="120" w:after="160"/>
+      </w:pPr>
+      <w:r>
+        <w:drawing>
+          <wp:inline xmlns:a="http://schemas.openxmlformats.org/drawingml/2006/main" xmlns:pic="http://schemas.openxmlformats.org/drawingml/2006/picture">
+            <wp:extent cx="5760720" cy="2110195"/>
+            <wp:docPr id="2011428625" name="Picture 2011428625"/>
+            <wp:cNvGraphicFramePr>
+              <a:graphicFrameLocks noChangeAspect="1"/>
+            </wp:cNvGraphicFramePr>
+            <a:graphic>
+              <a:graphicData uri="http://schemas.openxmlformats.org/drawingml/2006/picture">
+                <pic:pic>
+                  <pic:nvPicPr>
+                    <pic:cNvPr id="0" name="image.png"/>
+                    <pic:cNvPicPr/>
+                  </pic:nvPicPr>
+                  <pic:blipFill>
+                    <a:blip r:embed="rId32"/>
+                    <a:stretch>
+                      <a:fillRect/>
+                    </a:stretch>
+                  </pic:blipFill>
+                  <pic:spPr>
+                    <a:xfrm>
+                      <a:off x="0" y="0"/>
+                      <a:ext cx="5760720" cy="2110195"/>
+                    </a:xfrm>
+                    <a:prstGeom prst="rect"/>
+                  </pic:spPr>
+                </pic:pic>
+              </a:graphicData>
+            </a:graphic>
+          </wp:inline>
+        </w:drawing>
       </w:r>
     </w:p>
     <w:p>

</xml_diff>

<commit_message>
Add web frontend (Flask), Completed Informational section
</commit_message>
<xml_diff>
--- a/Source_Code/Reports/Sample499/FindingsReportTest.docx
+++ b/Source_Code/Reports/Sample499/FindingsReportTest.docx
@@ -600,7 +600,7 @@
           <w14:ligatures w14:val="none"/>
         </w:rPr>
         <w:drawing>
-          <wp:anchor distT="0" distB="0" distL="114300" distR="114300" simplePos="0" relativeHeight="251662336" behindDoc="0" locked="0" layoutInCell="1" allowOverlap="1" wp14:anchorId="56FF54E8" wp14:editId="702D07A6">
+          <wp:anchor distT="0" distB="0" distL="114300" distR="114300" simplePos="0" relativeHeight="251662336" behindDoc="0" locked="0" layoutInCell="1" allowOverlap="1" wp14:anchorId="56FF54E8" wp14:editId="123C2C9D">
             <wp:simplePos x="0" y="0"/>
             <wp:positionH relativeFrom="margin">
               <wp:posOffset>1163955</wp:posOffset>
@@ -1107,48 +1107,11 @@
       </w:pPr>
       <w:r>
         <w:rPr>
-          <w:rFonts w:ascii="Corbel" w:eastAsia="Calibri" w:hAnsi="Corbel" w:cs="Arial"/>
-          <w:color w:val="404040"/>
-          <w:kern w:val="0"/>
-          <w:szCs w:val="22"/>
-          <w14:ligatures w14:val="none"/>
-        </w:rPr>
-        <w:t xml:space="preserve">The information </w:t>
-      </w:r>
-      <w:r>
-        <w:rPr>
-          <w:rFonts w:ascii="Corbel" w:eastAsia="Calibri" w:hAnsi="Corbel" w:cs="Arial"/>
-          <w:snapToGrid w:val="0"/>
-          <w:color w:val="404040"/>
-          <w:kern w:val="0"/>
-          <w:szCs w:val="22"/>
-          <w14:ligatures w14:val="none"/>
-        </w:rPr>
-        <w:t xml:space="preserve">contained in this document is confidential and proprietary. It is intended for the exclusive use of </w:t>
-      </w:r>
-      <w:proofErr w:type="spellStart"/>
-      <w:r>
-        <w:rPr>
-          <w:rFonts w:ascii="Corbel" w:eastAsia="Calibri" w:hAnsi="Corbel" w:cs="Arial"/>
-          <w:snapToGrid w:val="0"/>
-          <w:color w:val="404040"/>
-          <w:kern w:val="0"/>
-          <w:szCs w:val="22"/>
-          <w14:ligatures w14:val="none"/>
-        </w:rPr>
-        <w:t>orbital fire</w:t>
-      </w:r>
-      <w:proofErr w:type="spellEnd"/>
-      <w:r>
-        <w:rPr>
-          <w:rFonts w:ascii="Corbel" w:eastAsia="Calibri" w:hAnsi="Corbel" w:cs="Arial"/>
-          <w:snapToGrid w:val="0"/>
-          <w:color w:val="404040"/>
-          <w:kern w:val="0"/>
-          <w:szCs w:val="22"/>
-          <w14:ligatures w14:val="none"/>
-        </w:rPr>
-        <w:t>, LLC and the Customer entity named in this document.</w:t>
+          <w:rFonts w:ascii="Corbel" w:hAnsi="Corbel"/>
+          <w:color w:val="E6781F"/>
+          <w:sz w:val="24"/>
+        </w:rPr>
+        <w:t>The information contained in this document is confidential and proprietary. It is intended for the exclusive use of orbital fire, LLC and the Customer entity named in this document.</w:t>
       </w:r>
     </w:p>
     <w:p>
@@ -1190,7 +1153,7 @@
           <w:szCs w:val="22"/>
           <w14:ligatures w14:val="none"/>
         </w:rPr>
-        <w:t>orbital fire</w:t>
+        <w:t>ORBITALFIRE</w:t>
       </w:r>
       <w:r>
         <w:rPr>
@@ -1990,7 +1953,29 @@
           <w:szCs w:val="22"/>
           <w14:ligatures w14:val="none"/>
         </w:rPr>
-        <w:t xml:space="preserve"> Institute conducted a study on the cost of data breaches that surveyed 350 organizations from 11 different countries that had suffered some type of cybercrime. Nearly half of said these incidents (47%) were the result of malicious actors who were able to compromise company networks to steal money, intellectual property or other protected data.</w:t>
+        <w:t xml:space="preserve"> Institute conducted a study on the cost of data breaches that surveyed 350 organizations from 11 different countries that had suffered some type of cybercrime. Nearly half </w:t>
+      </w:r>
+      <w:proofErr w:type="gramStart"/>
+      <w:r>
+        <w:rPr>
+          <w:rFonts w:ascii="Corbel" w:eastAsia="Calibri" w:hAnsi="Corbel" w:cs="Arial"/>
+          <w:color w:val="404040"/>
+          <w:kern w:val="0"/>
+          <w:szCs w:val="22"/>
+          <w14:ligatures w14:val="none"/>
+        </w:rPr>
+        <w:t>of</w:t>
+      </w:r>
+      <w:proofErr w:type="gramEnd"/>
+      <w:r>
+        <w:rPr>
+          <w:rFonts w:ascii="Corbel" w:eastAsia="Calibri" w:hAnsi="Corbel" w:cs="Arial"/>
+          <w:color w:val="404040"/>
+          <w:kern w:val="0"/>
+          <w:szCs w:val="22"/>
+          <w14:ligatures w14:val="none"/>
+        </w:rPr>
+        <w:t xml:space="preserve"> said these incidents (47%) were the result of malicious actors who were able to compromise company networks to steal money, intellectual property or other protected data.</w:t>
       </w:r>
     </w:p>
     <w:p>
@@ -2312,7 +2297,29 @@
           <w:szCs w:val="22"/>
           <w14:ligatures w14:val="none"/>
         </w:rPr>
-        <w:t>Without well-defined goals, boundaries and operational guidance, penetration testing can become disruptive, or even damaging to the organization undergoing testing. For these reasons these operational guidelines are carefully communicated and resolved.</w:t>
+        <w:t xml:space="preserve">Without well-defined goals, boundaries and operational guidance, penetration testing can become </w:t>
+      </w:r>
+      <w:proofErr w:type="gramStart"/>
+      <w:r>
+        <w:rPr>
+          <w:rFonts w:ascii="Corbel" w:eastAsia="Calibri" w:hAnsi="Corbel" w:cs="Arial"/>
+          <w:color w:val="404040"/>
+          <w:kern w:val="0"/>
+          <w:szCs w:val="22"/>
+          <w14:ligatures w14:val="none"/>
+        </w:rPr>
+        <w:t>disruptive, or</w:t>
+      </w:r>
+      <w:proofErr w:type="gramEnd"/>
+      <w:r>
+        <w:rPr>
+          <w:rFonts w:ascii="Corbel" w:eastAsia="Calibri" w:hAnsi="Corbel" w:cs="Arial"/>
+          <w:color w:val="404040"/>
+          <w:kern w:val="0"/>
+          <w:szCs w:val="22"/>
+          <w14:ligatures w14:val="none"/>
+        </w:rPr>
+        <w:t xml:space="preserve"> even damaging to the organization undergoing testing. For these reasons these operational guidelines are carefully communicated and resolved.</w:t>
       </w:r>
     </w:p>
     <w:p>
@@ -2944,7 +2951,51 @@
           <w:szCs w:val="22"/>
           <w14:ligatures w14:val="none"/>
         </w:rPr>
-        <w:t>Penetration testing can be conducted many ways, the following describe the methodologies utilized for this test:</w:t>
+        <w:t xml:space="preserve">Penetration testing can be </w:t>
+      </w:r>
+      <w:proofErr w:type="gramStart"/>
+      <w:r>
+        <w:rPr>
+          <w:rFonts w:ascii="Corbel" w:eastAsia="Calibri" w:hAnsi="Corbel" w:cs="Arial"/>
+          <w:color w:val="404040"/>
+          <w:kern w:val="0"/>
+          <w:szCs w:val="22"/>
+          <w14:ligatures w14:val="none"/>
+        </w:rPr>
+        <w:t>conducted</w:t>
+      </w:r>
+      <w:proofErr w:type="gramEnd"/>
+      <w:r>
+        <w:rPr>
+          <w:rFonts w:ascii="Corbel" w:eastAsia="Calibri" w:hAnsi="Corbel" w:cs="Arial"/>
+          <w:color w:val="404040"/>
+          <w:kern w:val="0"/>
+          <w:szCs w:val="22"/>
+          <w14:ligatures w14:val="none"/>
+        </w:rPr>
+        <w:t xml:space="preserve"> many </w:t>
+      </w:r>
+      <w:proofErr w:type="gramStart"/>
+      <w:r>
+        <w:rPr>
+          <w:rFonts w:ascii="Corbel" w:eastAsia="Calibri" w:hAnsi="Corbel" w:cs="Arial"/>
+          <w:color w:val="404040"/>
+          <w:kern w:val="0"/>
+          <w:szCs w:val="22"/>
+          <w14:ligatures w14:val="none"/>
+        </w:rPr>
+        <w:t>ways,</w:t>
+      </w:r>
+      <w:proofErr w:type="gramEnd"/>
+      <w:r>
+        <w:rPr>
+          <w:rFonts w:ascii="Corbel" w:eastAsia="Calibri" w:hAnsi="Corbel" w:cs="Arial"/>
+          <w:color w:val="404040"/>
+          <w:kern w:val="0"/>
+          <w:szCs w:val="22"/>
+          <w14:ligatures w14:val="none"/>
+        </w:rPr>
+        <w:t xml:space="preserve"> the following describe the methodologies utilized for this test:</w:t>
       </w:r>
     </w:p>
     <w:p>
@@ -3251,15 +3302,27 @@
         </w:rPr>
         <w:t xml:space="preserve"> </w:t>
       </w:r>
-      <w:r>
-        <w:rPr>
-          <w:rFonts w:ascii="Corbel" w:eastAsia="Calibri" w:hAnsi="Corbel" w:cs="Arial"/>
-          <w:color w:val="404040"/>
-          <w:kern w:val="0"/>
-          <w:szCs w:val="22"/>
-          <w14:ligatures w14:val="none"/>
-        </w:rPr>
-        <w:t>–  Findings that have a moderate impact on the security of the system or application and require timely attention</w:t>
+      <w:proofErr w:type="gramStart"/>
+      <w:r>
+        <w:rPr>
+          <w:rFonts w:ascii="Corbel" w:eastAsia="Calibri" w:hAnsi="Corbel" w:cs="Arial"/>
+          <w:color w:val="404040"/>
+          <w:kern w:val="0"/>
+          <w:szCs w:val="22"/>
+          <w14:ligatures w14:val="none"/>
+        </w:rPr>
+        <w:t>–  Findings</w:t>
+      </w:r>
+      <w:proofErr w:type="gramEnd"/>
+      <w:r>
+        <w:rPr>
+          <w:rFonts w:ascii="Corbel" w:eastAsia="Calibri" w:hAnsi="Corbel" w:cs="Arial"/>
+          <w:color w:val="404040"/>
+          <w:kern w:val="0"/>
+          <w:szCs w:val="22"/>
+          <w14:ligatures w14:val="none"/>
+        </w:rPr>
+        <w:t xml:space="preserve"> that have a moderate impact on the security of the system or application and require timely attention</w:t>
       </w:r>
     </w:p>
     <w:p>
@@ -3581,562 +3644,31 @@
       </w:pPr>
       <w:r>
         <w:rPr>
-          <w:rFonts w:ascii="Corbel" w:eastAsia="Calibri" w:hAnsi="Corbel" w:cs="Arial"/>
-          <w:color w:val="404040"/>
-          <w:kern w:val="0"/>
-          <w:szCs w:val="22"/>
-          <w14:ligatures w14:val="none"/>
+          <w:rFonts w:ascii="Corbel" w:hAnsi="Corbel"/>
+          <w:color w:val="E6781F"/>
+          <w:sz w:val="24"/>
         </w:rPr>
         <w:t>Listed below is an overview of actions performed during the testing process. It should be noted that this portion of the report does not represent the entire list of activities that were performed during this assessment.</w:t>
-      </w:r>
-      <w:r>
-        <w:rPr>
-          <w:rFonts w:ascii="Corbel" w:eastAsia="Calibri" w:hAnsi="Corbel" w:cs="Arial"/>
-          <w:color w:val="404040"/>
-          <w:kern w:val="0"/>
-          <w:szCs w:val="22"/>
-          <w14:ligatures w14:val="none"/>
-        </w:rPr>
         <w:br/>
-      </w:r>
-      <w:r>
-        <w:rPr>
-          <w:rFonts w:ascii="Corbel" w:eastAsia="Calibri" w:hAnsi="Corbel" w:cs="Arial"/>
-          <w:b/>
-          <w:bCs/>
-          <w:color w:val="404040"/>
-          <w:kern w:val="0"/>
-          <w:szCs w:val="22"/>
-          <w14:ligatures w14:val="none"/>
-        </w:rPr>
         <w:br/>
-        <w:t xml:space="preserve">HOST DISCOVERY </w:t>
-      </w:r>
-      <w:r>
-        <w:rPr>
-          <w:rFonts w:ascii="Corbel" w:eastAsia="Calibri" w:hAnsi="Corbel" w:cs="Arial"/>
-          <w:b/>
-          <w:bCs/>
-          <w:color w:val="F06023"/>
-          <w:kern w:val="0"/>
-          <w:sz w:val="20"/>
-          <w:szCs w:val="20"/>
-          <w14:ligatures w14:val="none"/>
-        </w:rPr>
-        <w:t xml:space="preserve"> </w:t>
-      </w:r>
-      <w:r>
-        <w:rPr>
-          <w:rFonts w:ascii="Corbel" w:eastAsia="Calibri" w:hAnsi="Corbel" w:cs="Arial"/>
-          <w:b/>
-          <w:bCs/>
-          <w:color w:val="F06023"/>
-          <w:kern w:val="0"/>
-          <w:sz w:val="20"/>
-          <w:szCs w:val="20"/>
-          <w:highlight w:val="yellow"/>
-          <w14:ligatures w14:val="none"/>
-        </w:rPr>
-        <w:t>INTERNAL NETWORK ASSESSMENT</w:t>
-      </w:r>
-      <w:r>
-        <w:rPr>
-          <w:rFonts w:ascii="Corbel" w:eastAsia="Calibri" w:hAnsi="Corbel" w:cs="Arial"/>
-          <w:b/>
-          <w:bCs/>
-          <w:color w:val="404040"/>
-          <w:kern w:val="0"/>
-          <w:szCs w:val="22"/>
-          <w14:ligatures w14:val="none"/>
-        </w:rPr>
+        <w:t>HOST DISCOVERY  INTERNAL NETWORK ASSESSMENT</w:t>
         <w:br/>
-      </w:r>
-      <w:r>
-        <w:rPr>
-          <w:rFonts w:ascii="Corbel" w:eastAsia="Calibri" w:hAnsi="Corbel" w:cs="Arial"/>
-          <w:color w:val="404040"/>
-          <w:kern w:val="0"/>
-          <w:szCs w:val="22"/>
-          <w14:ligatures w14:val="none"/>
-        </w:rPr>
-        <w:t xml:space="preserve">The host discovery phase included port scanning, ping sweeps and more, to identify active systems within the environment. Of the </w:t>
-      </w:r>
-      <w:r>
-        <w:rPr>
-          <w:rFonts w:ascii="Corbel" w:eastAsia="Calibri" w:hAnsi="Corbel" w:cs="Arial"/>
-          <w:color w:val="404040"/>
-          <w:kern w:val="0"/>
-          <w:szCs w:val="22"/>
-          <w14:ligatures w14:val="none"/>
-        </w:rPr>
-        <w:t xml:space="preserve">[NETWORK RANGE] </w:t>
-      </w:r>
-      <w:r>
-        <w:rPr>
-          <w:rFonts w:ascii="Corbel" w:eastAsia="Calibri" w:hAnsi="Corbel" w:cs="Arial"/>
-          <w:color w:val="404040"/>
-          <w:kern w:val="0"/>
-          <w:szCs w:val="22"/>
-          <w14:ligatures w14:val="none"/>
-        </w:rPr>
-        <w:t xml:space="preserve">[NETWORK RANGE WORD] </w:t>
-      </w:r>
-      <w:r>
-        <w:rPr>
-          <w:rFonts w:ascii="Corbel" w:eastAsia="Calibri" w:hAnsi="Corbel" w:cs="Arial"/>
-          <w:color w:val="404040"/>
-          <w:kern w:val="0"/>
-          <w:szCs w:val="22"/>
-          <w14:ligatures w14:val="none"/>
-        </w:rPr>
-        <w:t xml:space="preserve">that </w:t>
-      </w:r>
-      <w:r>
-        <w:rPr>
-          <w:rFonts w:ascii="Corbel" w:eastAsia="Calibri" w:hAnsi="Corbel" w:cs="Arial"/>
-          <w:color w:val="404040"/>
-          <w:kern w:val="0"/>
-          <w:szCs w:val="22"/>
-          <w14:ligatures w14:val="none"/>
-        </w:rPr>
-        <w:t xml:space="preserve">[NETWORK RANGE VERB] </w:t>
-      </w:r>
-      <w:r>
-        <w:rPr>
-          <w:rFonts w:ascii="Corbel" w:eastAsia="Calibri" w:hAnsi="Corbel" w:cs="Arial"/>
-          <w:color w:val="404040"/>
-          <w:kern w:val="0"/>
-          <w:szCs w:val="22"/>
-          <w14:ligatures w14:val="none"/>
-        </w:rPr>
-        <w:t xml:space="preserve">provided as part of scope, </w:t>
-      </w:r>
-      <w:proofErr w:type="spellStart"/>
-      <w:r>
-        <w:rPr>
-          <w:rFonts w:ascii="Corbel" w:eastAsia="Calibri" w:hAnsi="Corbel" w:cs="Arial"/>
-          <w:color w:val="404040"/>
-          <w:kern w:val="0"/>
-          <w:szCs w:val="22"/>
-          <w14:ligatures w14:val="none"/>
-        </w:rPr>
-        <w:t>orbital fire</w:t>
-      </w:r>
-      <w:proofErr w:type="spellEnd"/>
-      <w:r>
-        <w:rPr>
-          <w:rFonts w:ascii="Corbel" w:eastAsia="Calibri" w:hAnsi="Corbel" w:cs="Arial"/>
-          <w:color w:val="404040"/>
-          <w:kern w:val="0"/>
-          <w:szCs w:val="22"/>
-          <w14:ligatures w14:val="none"/>
-        </w:rPr>
-        <w:t xml:space="preserve"> was able to identify a total of </w:t>
-      </w:r>
-      <w:r>
-        <w:rPr>
-          <w:rFonts w:ascii="Corbel" w:eastAsia="Calibri" w:hAnsi="Corbel" w:cs="Arial"/>
-          <w:color w:val="404040"/>
-          <w:kern w:val="0"/>
-          <w:szCs w:val="22"/>
-          <w14:ligatures w14:val="none"/>
-        </w:rPr>
-        <w:t xml:space="preserve">[SYSTEMS] </w:t>
-      </w:r>
-      <w:r>
-        <w:rPr>
-          <w:rFonts w:ascii="Corbel" w:eastAsia="Calibri" w:hAnsi="Corbel" w:cs="Arial"/>
-          <w:color w:val="404040"/>
-          <w:kern w:val="0"/>
-          <w:szCs w:val="22"/>
-          <w14:ligatures w14:val="none"/>
-        </w:rPr>
-        <w:t>[SYSTEM WORD]</w:t>
-      </w:r>
-      <w:r>
-        <w:rPr>
-          <w:rFonts w:ascii="Corbel" w:eastAsia="Calibri" w:hAnsi="Corbel" w:cs="Arial"/>
-          <w:color w:val="404040"/>
-          <w:kern w:val="0"/>
-          <w:szCs w:val="22"/>
-          <w14:ligatures w14:val="none"/>
-        </w:rPr>
-        <w:t xml:space="preserve"> to be active within the targeted environment. In result of the </w:t>
-      </w:r>
-      <w:r>
-        <w:rPr>
-          <w:rFonts w:ascii="Corbel" w:eastAsia="Calibri" w:hAnsi="Corbel" w:cs="Arial"/>
-          <w:color w:val="404040"/>
-          <w:kern w:val="0"/>
-          <w:szCs w:val="22"/>
-          <w14:ligatures w14:val="none"/>
-        </w:rPr>
-        <w:t xml:space="preserve">[ADDRESSES] </w:t>
-      </w:r>
-      <w:r>
-        <w:rPr>
-          <w:rFonts w:ascii="Corbel" w:eastAsia="Calibri" w:hAnsi="Corbel" w:cs="Arial"/>
-          <w:color w:val="404040"/>
-          <w:kern w:val="0"/>
-          <w:szCs w:val="22"/>
-          <w14:ligatures w14:val="none"/>
-        </w:rPr>
-        <w:t>[ADDRESS WORD]</w:t>
-      </w:r>
-      <w:r>
-        <w:rPr>
-          <w:rFonts w:ascii="Corbel" w:eastAsia="Calibri" w:hAnsi="Corbel" w:cs="Arial"/>
-          <w:color w:val="404040"/>
-          <w:kern w:val="0"/>
-          <w:szCs w:val="22"/>
-          <w14:ligatures w14:val="none"/>
-        </w:rPr>
-        <w:t xml:space="preserve"> that </w:t>
-      </w:r>
-      <w:r>
-        <w:rPr>
-          <w:rFonts w:ascii="Corbel" w:eastAsia="Calibri" w:hAnsi="Corbel" w:cs="Arial"/>
-          <w:color w:val="404040"/>
-          <w:kern w:val="0"/>
-          <w:szCs w:val="22"/>
-          <w14:ligatures w14:val="none"/>
-        </w:rPr>
-        <w:t>[ADDRESS VERB]</w:t>
-      </w:r>
-      <w:r>
-        <w:rPr>
-          <w:rFonts w:ascii="Corbel" w:eastAsia="Calibri" w:hAnsi="Corbel" w:cs="Arial"/>
-          <w:color w:val="404040"/>
-          <w:kern w:val="0"/>
-          <w:szCs w:val="22"/>
-          <w14:ligatures w14:val="none"/>
-        </w:rPr>
-        <w:t xml:space="preserve"> scanned, </w:t>
-      </w:r>
-      <w:proofErr w:type="spellStart"/>
-      <w:r>
-        <w:rPr>
-          <w:rFonts w:ascii="Corbel" w:eastAsia="Calibri" w:hAnsi="Corbel" w:cs="Arial"/>
-          <w:color w:val="404040"/>
-          <w:kern w:val="0"/>
-          <w:szCs w:val="22"/>
-          <w14:ligatures w14:val="none"/>
-        </w:rPr>
-        <w:t>orbital fire</w:t>
-      </w:r>
-      <w:proofErr w:type="spellEnd"/>
-      <w:r>
-        <w:rPr>
-          <w:rFonts w:ascii="Corbel" w:eastAsia="Calibri" w:hAnsi="Corbel" w:cs="Arial"/>
-          <w:color w:val="404040"/>
-          <w:kern w:val="0"/>
-          <w:szCs w:val="22"/>
-          <w14:ligatures w14:val="none"/>
-        </w:rPr>
-        <w:t xml:space="preserve"> found </w:t>
-      </w:r>
-      <w:r>
-        <w:rPr>
-          <w:rFonts w:ascii="Corbel" w:eastAsia="Calibri" w:hAnsi="Corbel" w:cs="Arial"/>
-          <w:color w:val="404040"/>
-          <w:kern w:val="0"/>
-          <w:szCs w:val="22"/>
-          <w14:ligatures w14:val="none"/>
-        </w:rPr>
-        <w:t>[OPEN PORTS]</w:t>
-      </w:r>
-      <w:r>
-        <w:rPr>
-          <w:rFonts w:ascii="Corbel" w:eastAsia="Calibri" w:hAnsi="Corbel" w:cs="Arial"/>
-          <w:color w:val="404040"/>
-          <w:kern w:val="0"/>
-          <w:szCs w:val="22"/>
-          <w14:ligatures w14:val="none"/>
-        </w:rPr>
-        <w:t xml:space="preserve"> [OPEN PORT WORD]</w:t>
-      </w:r>
-      <w:r>
-        <w:rPr>
-          <w:rFonts w:ascii="Corbel" w:eastAsia="Calibri" w:hAnsi="Corbel" w:cs="Arial"/>
-          <w:color w:val="404040"/>
-          <w:kern w:val="0"/>
-          <w:szCs w:val="22"/>
-          <w14:ligatures w14:val="none"/>
-        </w:rPr>
-        <w:t>.</w:t>
-      </w:r>
-      <w:r>
-        <w:rPr>
-          <w:rFonts w:ascii="Corbel" w:eastAsia="Calibri" w:hAnsi="Corbel" w:cs="Arial"/>
-          <w:color w:val="404040"/>
-          <w:kern w:val="0"/>
-          <w:szCs w:val="22"/>
-          <w14:ligatures w14:val="none"/>
-        </w:rPr>
+        <w:t>The host discovery phase included port scanning, ping sweeps and more, to identify active systems within the environment. Of the one (1) network range that was provided as part of scope, orbital fire was able to identify a total of one (1) systems to be active within the targeted environment. In result of the one (1) addresses that were scanned, orbital fire found three (3) open ports.</w:t>
         <w:br/>
-      </w:r>
-      <w:r>
-        <w:rPr>
-          <w:rFonts w:ascii="Corbel" w:eastAsia="Calibri" w:hAnsi="Corbel" w:cs="Arial"/>
-          <w:b/>
-          <w:bCs/>
-          <w:color w:val="404040"/>
-          <w:kern w:val="0"/>
-          <w:szCs w:val="22"/>
-          <w14:ligatures w14:val="none"/>
-        </w:rPr>
         <w:br/>
         <w:t>ENUMERATION</w:t>
-      </w:r>
-      <w:r>
-        <w:rPr>
-          <w:rFonts w:ascii="Corbel" w:eastAsia="Calibri" w:hAnsi="Corbel" w:cs="Arial"/>
-          <w:b/>
-          <w:bCs/>
-          <w:color w:val="404040"/>
-          <w:kern w:val="0"/>
-          <w:szCs w:val="22"/>
-          <w14:ligatures w14:val="none"/>
-        </w:rPr>
         <w:br/>
-      </w:r>
-      <w:r>
-        <w:rPr>
-          <w:rFonts w:ascii="Corbel" w:eastAsia="Calibri" w:hAnsi="Corbel" w:cs="Arial"/>
-          <w:color w:val="404040"/>
-          <w:kern w:val="0"/>
-          <w:szCs w:val="22"/>
-          <w14:ligatures w14:val="none"/>
-        </w:rPr>
-        <w:t xml:space="preserve">After the identification of all available hosts within the network, </w:t>
-      </w:r>
-      <w:proofErr w:type="spellStart"/>
-      <w:r>
-        <w:rPr>
-          <w:rFonts w:ascii="Corbel" w:eastAsia="Calibri" w:hAnsi="Corbel" w:cs="Arial"/>
-          <w:color w:val="404040"/>
-          <w:kern w:val="0"/>
-          <w:szCs w:val="22"/>
-          <w14:ligatures w14:val="none"/>
-        </w:rPr>
-        <w:t>orbital fire</w:t>
-      </w:r>
-      <w:proofErr w:type="spellEnd"/>
-      <w:r>
-        <w:rPr>
-          <w:rFonts w:ascii="Corbel" w:eastAsia="Calibri" w:hAnsi="Corbel" w:cs="Arial"/>
-          <w:color w:val="404040"/>
-          <w:kern w:val="0"/>
-          <w:szCs w:val="22"/>
-          <w14:ligatures w14:val="none"/>
-        </w:rPr>
-        <w:t xml:space="preserve"> then conducted enumeration. Enumeration during this assessment consisted of scanning the identified ports to determine which services are running (if any). Additional scans were then performed based on running services to attempt enumerating information (if possible).</w:t>
-      </w:r>
-      <w:r>
-        <w:rPr>
-          <w:rFonts w:ascii="Corbel" w:eastAsia="Calibri" w:hAnsi="Corbel" w:cs="Arial"/>
-          <w:color w:val="404040"/>
-          <w:kern w:val="0"/>
-          <w:szCs w:val="22"/>
-          <w14:ligatures w14:val="none"/>
-        </w:rPr>
+        <w:t>After the identification of all available hosts within the network, orbital fire then conducted enumeration. Enumeration during this assessment consisted of scanning the identified ports to determine which services are running (if any). Additional scans were then performed based on running services to attempt enumerating information (if possible).</w:t>
         <w:br/>
-      </w:r>
-      <w:r>
-        <w:rPr>
-          <w:rFonts w:ascii="Corbel" w:eastAsia="Calibri" w:hAnsi="Corbel" w:cs="Arial"/>
-          <w:color w:val="404040"/>
-          <w:kern w:val="0"/>
-          <w:szCs w:val="22"/>
-          <w14:ligatures w14:val="none"/>
-        </w:rPr>
         <w:br/>
-      </w:r>
-      <w:r>
-        <w:rPr>
-          <w:rFonts w:ascii="Corbel" w:eastAsia="Calibri" w:hAnsi="Corbel" w:cs="Arial"/>
-          <w:b/>
-          <w:bCs/>
-          <w:color w:val="404040"/>
-          <w:kern w:val="0"/>
-          <w:szCs w:val="22"/>
-          <w14:ligatures w14:val="none"/>
-        </w:rPr>
         <w:t>EXPLOITATION</w:t>
-      </w:r>
-      <w:r>
-        <w:rPr>
-          <w:rFonts w:ascii="Corbel" w:eastAsia="Calibri" w:hAnsi="Corbel" w:cs="Arial"/>
-          <w:b/>
-          <w:bCs/>
-          <w:color w:val="404040"/>
-          <w:kern w:val="0"/>
-          <w:szCs w:val="22"/>
-          <w14:ligatures w14:val="none"/>
-        </w:rPr>
         <w:br/>
-      </w:r>
-      <w:r>
-        <w:rPr>
-          <w:rFonts w:ascii="Corbel" w:eastAsia="Calibri" w:hAnsi="Corbel" w:cs="Arial"/>
-          <w:color w:val="404040"/>
-          <w:kern w:val="0"/>
-          <w:szCs w:val="22"/>
-          <w14:ligatures w14:val="none"/>
-        </w:rPr>
-        <w:t xml:space="preserve">Post enumeration, </w:t>
-      </w:r>
-      <w:proofErr w:type="spellStart"/>
-      <w:r>
-        <w:rPr>
-          <w:rFonts w:ascii="Corbel" w:eastAsia="Calibri" w:hAnsi="Corbel" w:cs="Arial"/>
-          <w:color w:val="404040"/>
-          <w:kern w:val="0"/>
-          <w:szCs w:val="22"/>
-          <w14:ligatures w14:val="none"/>
-        </w:rPr>
-        <w:t>orbital fire</w:t>
-      </w:r>
-      <w:proofErr w:type="spellEnd"/>
-      <w:r>
-        <w:rPr>
-          <w:rFonts w:ascii="Corbel" w:eastAsia="Calibri" w:hAnsi="Corbel" w:cs="Arial"/>
-          <w:color w:val="404040"/>
-          <w:kern w:val="0"/>
-          <w:szCs w:val="22"/>
-          <w14:ligatures w14:val="none"/>
-        </w:rPr>
-        <w:t xml:space="preserve"> focused strictly on the exploitation of any/all running services that were previously discovered. </w:t>
-      </w:r>
-      <w:proofErr w:type="spellStart"/>
-      <w:r>
-        <w:rPr>
-          <w:rFonts w:ascii="Corbel" w:eastAsia="Calibri" w:hAnsi="Corbel" w:cs="Arial"/>
-          <w:color w:val="404040"/>
-          <w:kern w:val="0"/>
-          <w:szCs w:val="22"/>
-          <w14:ligatures w14:val="none"/>
-        </w:rPr>
-        <w:t>orbital fire</w:t>
-      </w:r>
-      <w:proofErr w:type="spellEnd"/>
-      <w:r>
-        <w:rPr>
-          <w:rFonts w:ascii="Corbel" w:eastAsia="Calibri" w:hAnsi="Corbel" w:cs="Arial"/>
-          <w:color w:val="404040"/>
-          <w:kern w:val="0"/>
-          <w:szCs w:val="22"/>
-          <w14:ligatures w14:val="none"/>
-        </w:rPr>
-        <w:t xml:space="preserve"> used a comprehensive set of tools, custom scripts, and manual techniques to thoroughly identify possible threats to </w:t>
-      </w:r>
-      <w:r>
-        <w:rPr>
-          <w:rFonts w:ascii="Corbel" w:eastAsia="Calibri" w:hAnsi="Corbel" w:cs="Arial"/>
-          <w:color w:val="404040"/>
-          <w:kern w:val="0"/>
-          <w:szCs w:val="22"/>
-          <w14:ligatures w14:val="none"/>
-        </w:rPr>
-        <w:t>orbital fire</w:t>
-      </w:r>
-      <w:r>
-        <w:rPr>
-          <w:rFonts w:ascii="Corbel" w:eastAsia="Calibri" w:hAnsi="Corbel" w:cs="Arial"/>
-          <w:color w:val="404040"/>
-          <w:kern w:val="0"/>
-          <w:szCs w:val="22"/>
-          <w14:ligatures w14:val="none"/>
-        </w:rPr>
-        <w:t xml:space="preserve"> environment.</w:t>
-      </w:r>
-      <w:r>
-        <w:rPr>
-          <w:rFonts w:ascii="Corbel" w:eastAsia="Calibri" w:hAnsi="Corbel" w:cs="Arial"/>
-          <w:color w:val="404040"/>
-          <w:kern w:val="0"/>
-          <w:szCs w:val="22"/>
-          <w14:ligatures w14:val="none"/>
-        </w:rPr>
+        <w:t>Post enumeration, orbital fire focused strictly on the exploitation of any/all running services that were previously discovered. orbital fire used a comprehensive set of tools, custom scripts, and manual techniques to thoroughly identify possible threats to orbital fire environment.</w:t>
         <w:br/>
-      </w:r>
-      <w:r>
-        <w:rPr>
-          <w:rFonts w:ascii="Corbel" w:eastAsia="Calibri" w:hAnsi="Corbel" w:cs="Arial"/>
-          <w:color w:val="404040"/>
-          <w:kern w:val="0"/>
-          <w:szCs w:val="22"/>
-          <w14:ligatures w14:val="none"/>
-        </w:rPr>
         <w:br/>
-      </w:r>
-      <w:r>
-        <w:rPr>
-          <w:rFonts w:ascii="Corbel" w:eastAsia="Calibri" w:hAnsi="Corbel" w:cs="Arial"/>
-          <w:b/>
-          <w:bCs/>
-          <w:color w:val="404040"/>
-          <w:kern w:val="0"/>
-          <w:szCs w:val="22"/>
-          <w14:ligatures w14:val="none"/>
-        </w:rPr>
         <w:t>POST EXPLOITATION</w:t>
-      </w:r>
-      <w:r>
-        <w:rPr>
-          <w:rFonts w:ascii="Corbel" w:eastAsia="Calibri" w:hAnsi="Corbel" w:cs="Arial"/>
-          <w:b/>
-          <w:bCs/>
-          <w:color w:val="404040"/>
-          <w:kern w:val="0"/>
-          <w:szCs w:val="22"/>
-          <w14:ligatures w14:val="none"/>
-        </w:rPr>
         <w:br/>
-      </w:r>
-      <w:r>
-        <w:rPr>
-          <w:rFonts w:ascii="Corbel" w:eastAsia="Calibri" w:hAnsi="Corbel" w:cs="Arial"/>
-          <w:color w:val="404040"/>
-          <w:kern w:val="0"/>
-          <w:szCs w:val="22"/>
-          <w14:ligatures w14:val="none"/>
-        </w:rPr>
-        <w:t xml:space="preserve">Once the exploitation phase was complete, </w:t>
-      </w:r>
-      <w:proofErr w:type="spellStart"/>
-      <w:r>
-        <w:rPr>
-          <w:rFonts w:ascii="Corbel" w:eastAsia="Calibri" w:hAnsi="Corbel" w:cs="Arial"/>
-          <w:color w:val="404040"/>
-          <w:kern w:val="0"/>
-          <w:szCs w:val="22"/>
-          <w14:ligatures w14:val="none"/>
-        </w:rPr>
-        <w:t>orbital fire</w:t>
-      </w:r>
-      <w:proofErr w:type="spellEnd"/>
-      <w:r>
-        <w:rPr>
-          <w:rFonts w:ascii="Corbel" w:eastAsia="Calibri" w:hAnsi="Corbel" w:cs="Arial"/>
-          <w:color w:val="404040"/>
-          <w:kern w:val="0"/>
-          <w:szCs w:val="22"/>
-          <w14:ligatures w14:val="none"/>
-        </w:rPr>
-        <w:t xml:space="preserve"> then tested and validated all identified threats to evaluate the depth of compromise.</w:t>
-      </w:r>
-      <w:r>
-        <w:rPr>
-          <w:rFonts w:ascii="Corbel" w:eastAsia="Calibri" w:hAnsi="Corbel" w:cs="Arial"/>
-          <w:b/>
-          <w:bCs/>
-          <w:color w:val="404040"/>
-          <w:kern w:val="0"/>
-          <w:szCs w:val="22"/>
-          <w14:ligatures w14:val="none"/>
-        </w:rPr>
-        <w:br w:type="page"/>
+        <w:t>Once the exploitation phase was complete, orbital fire then tested and validated all identified threats to evaluate the depth of compromise.</w:t>
       </w:r>
     </w:p>
     <w:p>
@@ -4218,318 +3750,6 @@
           <w14:ligatures w14:val="none"/>
         </w:rPr>
         <w:t xml:space="preserve"> </w:t>
-      </w:r>
-    </w:p>
-    <w:p>
-      <w:pPr>
-        <w:spacing w:before="120" w:after="160"/>
-      </w:pPr>
-      <w:r>
-        <w:drawing>
-          <wp:inline xmlns:a="http://schemas.openxmlformats.org/drawingml/2006/main" xmlns:pic="http://schemas.openxmlformats.org/drawingml/2006/picture">
-            <wp:extent cx="3840480" cy="3848464"/>
-            <wp:docPr id="2011428616" name="Picture 2011428616"/>
-            <wp:cNvGraphicFramePr>
-              <a:graphicFrameLocks noChangeAspect="1"/>
-            </wp:cNvGraphicFramePr>
-            <a:graphic>
-              <a:graphicData uri="http://schemas.openxmlformats.org/drawingml/2006/picture">
-                <pic:pic>
-                  <pic:nvPicPr>
-                    <pic:cNvPr id="0" name="image.png"/>
-                    <pic:cNvPicPr/>
-                  </pic:nvPicPr>
-                  <pic:blipFill>
-                    <a:blip r:embed="rId28"/>
-                    <a:stretch>
-                      <a:fillRect/>
-                    </a:stretch>
-                  </pic:blipFill>
-                  <pic:spPr>
-                    <a:xfrm>
-                      <a:off x="0" y="0"/>
-                      <a:ext cx="3840480" cy="3848464"/>
-                    </a:xfrm>
-                    <a:prstGeom prst="rect"/>
-                  </pic:spPr>
-                </pic:pic>
-              </a:graphicData>
-            </a:graphic>
-          </wp:inline>
-        </w:drawing>
-      </w:r>
-    </w:p>
-    <w:p>
-      <w:pPr>
-        <w:spacing w:before="120" w:after="160"/>
-      </w:pPr>
-      <w:r>
-        <w:drawing>
-          <wp:inline xmlns:a="http://schemas.openxmlformats.org/drawingml/2006/main" xmlns:pic="http://schemas.openxmlformats.org/drawingml/2006/picture">
-            <wp:extent cx="5486400" cy="3017520"/>
-            <wp:docPr id="2011428617" name="Picture 2011428617"/>
-            <wp:cNvGraphicFramePr>
-              <a:graphicFrameLocks noChangeAspect="1"/>
-            </wp:cNvGraphicFramePr>
-            <a:graphic>
-              <a:graphicData uri="http://schemas.openxmlformats.org/drawingml/2006/picture">
-                <pic:pic>
-                  <pic:nvPicPr>
-                    <pic:cNvPr id="0" name="image.png"/>
-                    <pic:cNvPicPr/>
-                  </pic:nvPicPr>
-                  <pic:blipFill>
-                    <a:blip r:embed="rId29"/>
-                    <a:stretch>
-                      <a:fillRect/>
-                    </a:stretch>
-                  </pic:blipFill>
-                  <pic:spPr>
-                    <a:xfrm>
-                      <a:off x="0" y="0"/>
-                      <a:ext cx="5486400" cy="3017520"/>
-                    </a:xfrm>
-                    <a:prstGeom prst="rect"/>
-                  </pic:spPr>
-                </pic:pic>
-              </a:graphicData>
-            </a:graphic>
-          </wp:inline>
-        </w:drawing>
-      </w:r>
-    </w:p>
-    <w:p>
-      <w:pPr>
-        <w:spacing w:before="120" w:after="160"/>
-      </w:pPr>
-      <w:r>
-        <w:drawing>
-          <wp:inline xmlns:a="http://schemas.openxmlformats.org/drawingml/2006/main" xmlns:pic="http://schemas.openxmlformats.org/drawingml/2006/picture">
-            <wp:extent cx="3840480" cy="3848464"/>
-            <wp:docPr id="2011428614" name="Picture 2011428614"/>
-            <wp:cNvGraphicFramePr>
-              <a:graphicFrameLocks noChangeAspect="1"/>
-            </wp:cNvGraphicFramePr>
-            <a:graphic>
-              <a:graphicData uri="http://schemas.openxmlformats.org/drawingml/2006/picture">
-                <pic:pic>
-                  <pic:nvPicPr>
-                    <pic:cNvPr id="0" name="image.png"/>
-                    <pic:cNvPicPr/>
-                  </pic:nvPicPr>
-                  <pic:blipFill>
-                    <a:blip r:embed="rId28"/>
-                    <a:stretch>
-                      <a:fillRect/>
-                    </a:stretch>
-                  </pic:blipFill>
-                  <pic:spPr>
-                    <a:xfrm>
-                      <a:off x="0" y="0"/>
-                      <a:ext cx="3840480" cy="3848464"/>
-                    </a:xfrm>
-                    <a:prstGeom prst="rect"/>
-                  </pic:spPr>
-                </pic:pic>
-              </a:graphicData>
-            </a:graphic>
-          </wp:inline>
-        </w:drawing>
-      </w:r>
-    </w:p>
-    <w:p>
-      <w:pPr>
-        <w:spacing w:before="120" w:after="160"/>
-      </w:pPr>
-      <w:r>
-        <w:drawing>
-          <wp:inline xmlns:a="http://schemas.openxmlformats.org/drawingml/2006/main" xmlns:pic="http://schemas.openxmlformats.org/drawingml/2006/picture">
-            <wp:extent cx="5486400" cy="3017520"/>
-            <wp:docPr id="2011428615" name="Picture 2011428615"/>
-            <wp:cNvGraphicFramePr>
-              <a:graphicFrameLocks noChangeAspect="1"/>
-            </wp:cNvGraphicFramePr>
-            <a:graphic>
-              <a:graphicData uri="http://schemas.openxmlformats.org/drawingml/2006/picture">
-                <pic:pic>
-                  <pic:nvPicPr>
-                    <pic:cNvPr id="0" name="image.png"/>
-                    <pic:cNvPicPr/>
-                  </pic:nvPicPr>
-                  <pic:blipFill>
-                    <a:blip r:embed="rId29"/>
-                    <a:stretch>
-                      <a:fillRect/>
-                    </a:stretch>
-                  </pic:blipFill>
-                  <pic:spPr>
-                    <a:xfrm>
-                      <a:off x="0" y="0"/>
-                      <a:ext cx="5486400" cy="3017520"/>
-                    </a:xfrm>
-                    <a:prstGeom prst="rect"/>
-                  </pic:spPr>
-                </pic:pic>
-              </a:graphicData>
-            </a:graphic>
-          </wp:inline>
-        </w:drawing>
-      </w:r>
-    </w:p>
-    <w:p>
-      <w:pPr>
-        <w:spacing w:before="120" w:after="160"/>
-      </w:pPr>
-      <w:r>
-        <w:drawing>
-          <wp:inline xmlns:a="http://schemas.openxmlformats.org/drawingml/2006/main" xmlns:pic="http://schemas.openxmlformats.org/drawingml/2006/picture">
-            <wp:extent cx="3840480" cy="3848464"/>
-            <wp:docPr id="2011428612" name="Picture 2011428612"/>
-            <wp:cNvGraphicFramePr>
-              <a:graphicFrameLocks noChangeAspect="1"/>
-            </wp:cNvGraphicFramePr>
-            <a:graphic>
-              <a:graphicData uri="http://schemas.openxmlformats.org/drawingml/2006/picture">
-                <pic:pic>
-                  <pic:nvPicPr>
-                    <pic:cNvPr id="0" name="findings_donut.png"/>
-                    <pic:cNvPicPr/>
-                  </pic:nvPicPr>
-                  <pic:blipFill>
-                    <a:blip r:embed="rId28"/>
-                    <a:stretch>
-                      <a:fillRect/>
-                    </a:stretch>
-                  </pic:blipFill>
-                  <pic:spPr>
-                    <a:xfrm>
-                      <a:off x="0" y="0"/>
-                      <a:ext cx="3840480" cy="3848464"/>
-                    </a:xfrm>
-                    <a:prstGeom prst="rect"/>
-                  </pic:spPr>
-                </pic:pic>
-              </a:graphicData>
-            </a:graphic>
-          </wp:inline>
-        </w:drawing>
-      </w:r>
-    </w:p>
-    <w:p>
-      <w:pPr>
-        <w:spacing w:before="120" w:after="160"/>
-      </w:pPr>
-      <w:r>
-        <w:drawing>
-          <wp:inline xmlns:a="http://schemas.openxmlformats.org/drawingml/2006/main" xmlns:pic="http://schemas.openxmlformats.org/drawingml/2006/picture">
-            <wp:extent cx="5486400" cy="3017520"/>
-            <wp:docPr id="2011428613" name="Picture 2011428613"/>
-            <wp:cNvGraphicFramePr>
-              <a:graphicFrameLocks noChangeAspect="1"/>
-            </wp:cNvGraphicFramePr>
-            <a:graphic>
-              <a:graphicData uri="http://schemas.openxmlformats.org/drawingml/2006/picture">
-                <pic:pic>
-                  <pic:nvPicPr>
-                    <pic:cNvPr id="0" name="findings_line.png"/>
-                    <pic:cNvPicPr/>
-                  </pic:nvPicPr>
-                  <pic:blipFill>
-                    <a:blip r:embed="rId29"/>
-                    <a:stretch>
-                      <a:fillRect/>
-                    </a:stretch>
-                  </pic:blipFill>
-                  <pic:spPr>
-                    <a:xfrm>
-                      <a:off x="0" y="0"/>
-                      <a:ext cx="5486400" cy="3017520"/>
-                    </a:xfrm>
-                    <a:prstGeom prst="rect"/>
-                  </pic:spPr>
-                </pic:pic>
-              </a:graphicData>
-            </a:graphic>
-          </wp:inline>
-        </w:drawing>
-      </w:r>
-    </w:p>
-    <w:p>
-      <w:pPr>
-        <w:spacing w:before="120" w:after="160"/>
-      </w:pPr>
-      <w:r>
-        <w:drawing>
-          <wp:inline xmlns:a="http://schemas.openxmlformats.org/drawingml/2006/main" xmlns:pic="http://schemas.openxmlformats.org/drawingml/2006/picture">
-            <wp:extent cx="3840480" cy="3848464"/>
-            <wp:docPr id="2011428610" name="Picture 2011428610"/>
-            <wp:cNvGraphicFramePr>
-              <a:graphicFrameLocks noChangeAspect="1"/>
-            </wp:cNvGraphicFramePr>
-            <a:graphic>
-              <a:graphicData uri="http://schemas.openxmlformats.org/drawingml/2006/picture">
-                <pic:pic>
-                  <pic:nvPicPr>
-                    <pic:cNvPr id="0" name="findings_donut.png"/>
-                    <pic:cNvPicPr/>
-                  </pic:nvPicPr>
-                  <pic:blipFill>
-                    <a:blip r:embed="rId26"/>
-                    <a:stretch>
-                      <a:fillRect/>
-                    </a:stretch>
-                  </pic:blipFill>
-                  <pic:spPr>
-                    <a:xfrm>
-                      <a:off x="0" y="0"/>
-                      <a:ext cx="3840480" cy="3848464"/>
-                    </a:xfrm>
-                    <a:prstGeom prst="rect"/>
-                  </pic:spPr>
-                </pic:pic>
-              </a:graphicData>
-            </a:graphic>
-          </wp:inline>
-        </w:drawing>
-      </w:r>
-    </w:p>
-    <w:p>
-      <w:pPr>
-        <w:spacing w:before="120" w:after="160"/>
-      </w:pPr>
-      <w:r>
-        <w:drawing>
-          <wp:inline xmlns:a="http://schemas.openxmlformats.org/drawingml/2006/main" xmlns:pic="http://schemas.openxmlformats.org/drawingml/2006/picture">
-            <wp:extent cx="5486400" cy="3017520"/>
-            <wp:docPr id="2011428611" name="Picture 2011428611"/>
-            <wp:cNvGraphicFramePr>
-              <a:graphicFrameLocks noChangeAspect="1"/>
-            </wp:cNvGraphicFramePr>
-            <a:graphic>
-              <a:graphicData uri="http://schemas.openxmlformats.org/drawingml/2006/picture">
-                <pic:pic>
-                  <pic:nvPicPr>
-                    <pic:cNvPr id="0" name="findings_line.png"/>
-                    <pic:cNvPicPr/>
-                  </pic:nvPicPr>
-                  <pic:blipFill>
-                    <a:blip r:embed="rId27"/>
-                    <a:stretch>
-                      <a:fillRect/>
-                    </a:stretch>
-                  </pic:blipFill>
-                  <pic:spPr>
-                    <a:xfrm>
-                      <a:off x="0" y="0"/>
-                      <a:ext cx="5486400" cy="3017520"/>
-                    </a:xfrm>
-                    <a:prstGeom prst="rect"/>
-                  </pic:spPr>
-                </pic:pic>
-              </a:graphicData>
-            </a:graphic>
-          </wp:inline>
-        </w:drawing>
       </w:r>
     </w:p>
     <w:p>
@@ -4650,7 +3870,6 @@
       <w:pPr>
         <w:keepNext/>
         <w:keepLines/>
-        <w:pageBreakBefore/>
         <w:spacing w:before="240" w:after="120" w:line="259" w:lineRule="auto"/>
         <w:outlineLvl w:val="1"/>
         <w:rPr>
@@ -4692,35 +3911,11 @@
       </w:pPr>
       <w:r>
         <w:rPr>
-          <w:rFonts w:ascii="Corbel" w:eastAsia="Calibri" w:hAnsi="Corbel" w:cs="Arial"/>
-          <w:color w:val="404040"/>
-          <w:kern w:val="0"/>
-          <w:szCs w:val="22"/>
-          <w14:ligatures w14:val="none"/>
-        </w:rPr>
-        <w:t xml:space="preserve">To summarize the results of this assessment, </w:t>
-      </w:r>
-      <w:proofErr w:type="spellStart"/>
-      <w:r>
-        <w:rPr>
-          <w:rFonts w:ascii="Corbel" w:eastAsia="Calibri" w:hAnsi="Corbel" w:cs="Arial"/>
-          <w:color w:val="404040"/>
-          <w:kern w:val="0"/>
-          <w:szCs w:val="22"/>
-          <w14:ligatures w14:val="none"/>
-        </w:rPr>
-        <w:t>orbital fire</w:t>
-      </w:r>
-      <w:proofErr w:type="spellEnd"/>
-      <w:r>
-        <w:rPr>
-          <w:rFonts w:ascii="Corbel" w:eastAsia="Calibri" w:hAnsi="Corbel" w:cs="Arial"/>
-          <w:color w:val="404040"/>
-          <w:kern w:val="0"/>
-          <w:szCs w:val="22"/>
-          <w14:ligatures w14:val="none"/>
-        </w:rPr>
-        <w:t xml:space="preserve"> has grouped all findings from the penetration test into rollup findings. These rollup findings can be used to quickly determine the root cause of all issues identified in this assessment. It is highly recommended to implement a remediation strategy based on the rollup findings below to enhance security posture and overall defensibility.</w:t>
+          <w:rFonts w:ascii="Corbel" w:hAnsi="Corbel"/>
+          <w:color w:val="E6781F"/>
+          <w:sz w:val="24"/>
+        </w:rPr>
+        <w:t>To summarize the results of this assessment, orbital fire has grouped all findings from the penetration test into rollup findings. These rollup findings can be used to quickly determine the root cause of all issues identified in this assessment. It is highly recommended to implement a remediation strategy based on the rollup findings below to enhance security posture and overall defensibility.</w:t>
       </w:r>
     </w:p>
     <w:p>
@@ -4920,74 +4115,10 @@
       <w:r>
         <w:rPr>
           <w:rFonts w:ascii="Corbel" w:hAnsi="Corbel"/>
-        </w:rPr>
-        <w:t xml:space="preserve">1.    </w:t>
-      </w:r>
-      <w:r>
-        <w:rPr>
-          <w:rFonts w:ascii="Corbel" w:hAnsi="Corbel"/>
-          <w:b/>
-        </w:rPr>
-        <w:t>Subdomain Takeover Vulnerability</w:t>
-      </w:r>
-      <w:r>
-        <w:rPr>
-          <w:rFonts w:ascii="Corbel" w:hAnsi="Corbel"/>
-        </w:rPr>
-        <w:t xml:space="preserve"> - During testing, </w:t>
-      </w:r>
-      <w:proofErr w:type="spellStart"/>
-      <w:r>
-        <w:rPr>
-          <w:rFonts w:ascii="Corbel" w:hAnsi="Corbel"/>
-        </w:rPr>
-        <w:t>orbital fire</w:t>
-      </w:r>
-      <w:proofErr w:type="spellEnd"/>
-      <w:r>
-        <w:rPr>
-          <w:rFonts w:ascii="Corbel" w:hAnsi="Corbel"/>
-        </w:rPr>
-        <w:t xml:space="preserve"> identified a potential subdomain takeover vulnerability affecting one or more domains owned by orbital fire. This issue typically results from misconfigured DNS records that reference unclaimed or deprovisioned third-party services, allowing an attacker to register the external resource and gain control of the associated subdomain. If exploited, an attacker could host malicious content, impersonate the organization, conduct phishing campaigns, or collect user data, posing a significant risk to brand reputation, user trust, and overall security posture.</w:t>
-      </w:r>
-    </w:p>
-    <w:p>
-      <w:pPr>
-        <w:spacing w:before="120" w:after="160"/>
-      </w:pPr>
-      <w:r>
-        <w:drawing>
-          <wp:inline xmlns:a="http://schemas.openxmlformats.org/drawingml/2006/main" xmlns:pic="http://schemas.openxmlformats.org/drawingml/2006/picture">
-            <wp:extent cx="5760720" cy="1523402"/>
-            <wp:docPr id="2011428626" name="Picture 2011428626"/>
-            <wp:cNvGraphicFramePr>
-              <a:graphicFrameLocks noChangeAspect="1"/>
-            </wp:cNvGraphicFramePr>
-            <a:graphic>
-              <a:graphicData uri="http://schemas.openxmlformats.org/drawingml/2006/picture">
-                <pic:pic>
-                  <pic:nvPicPr>
-                    <pic:cNvPr id="0" name="image.png"/>
-                    <pic:cNvPicPr/>
-                  </pic:nvPicPr>
-                  <pic:blipFill>
-                    <a:blip r:embed="rId31"/>
-                    <a:stretch>
-                      <a:fillRect/>
-                    </a:stretch>
-                  </pic:blipFill>
-                  <pic:spPr>
-                    <a:xfrm>
-                      <a:off x="0" y="0"/>
-                      <a:ext cx="5760720" cy="1523402"/>
-                    </a:xfrm>
-                    <a:prstGeom prst="rect"/>
-                  </pic:spPr>
-                </pic:pic>
-              </a:graphicData>
-            </a:graphic>
-          </wp:inline>
-        </w:drawing>
+          <w:color w:val="E6781F"/>
+          <w:sz w:val="24"/>
+        </w:rPr>
+        <w:t>1.    Subdomain Takeover Vulnerability - During testing, orbital fire identified a potential subdomain takeover vulnerability affecting one or more domains owned by orbital fire. This issue typically results from misconfigured DNS records that reference unclaimed or deprovisioned third-party services, allowing an attacker to register the external resource and gain control of the associated subdomain. If exploited, an attacker could host malicious content, impersonate the organization, conduct phishing campaigns, or collect user data, posing a significant risk to brand reputation, user trust, and overall security posture.</w:t>
       </w:r>
     </w:p>
     <w:p>
@@ -5127,35 +4258,10 @@
       <w:r>
         <w:rPr>
           <w:rFonts w:ascii="Corbel" w:hAnsi="Corbel"/>
-        </w:rPr>
-        <w:t xml:space="preserve">1.    </w:t>
-      </w:r>
-      <w:r>
-        <w:rPr>
-          <w:rFonts w:ascii="Corbel" w:hAnsi="Corbel"/>
-          <w:b/>
-        </w:rPr>
-        <w:t>Misconfigured DMARC Record</w:t>
-      </w:r>
-      <w:r>
-        <w:rPr>
-          <w:rFonts w:ascii="Corbel" w:hAnsi="Corbel"/>
-        </w:rPr>
-        <w:t xml:space="preserve"> - During testing, </w:t>
-      </w:r>
-      <w:proofErr w:type="spellStart"/>
-      <w:r>
-        <w:rPr>
-          <w:rFonts w:ascii="Corbel" w:hAnsi="Corbel"/>
-        </w:rPr>
-        <w:t>orbital fire</w:t>
-      </w:r>
-      <w:proofErr w:type="spellEnd"/>
-      <w:r>
-        <w:rPr>
-          <w:rFonts w:ascii="Corbel" w:hAnsi="Corbel"/>
-        </w:rPr>
-        <w:t xml:space="preserve"> identified that orbital fire has a misconfigured DMARC (Domain-based Message Authentication, Reporting, and Conformance) record for one or more of their domain(s). DMARC is critical for verifying the authenticity of emails sent from the organization, serving as a vital barrier against email spoofing and phishing attacks. Without proper configuration, DMARC fails to instruct receiving mail servers on how to treat email messages from the organization's domain, thereby increasing vulnerability to attack.</w:t>
+          <w:color w:val="E6781F"/>
+          <w:sz w:val="24"/>
+        </w:rPr>
+        <w:t>1.    Misconfigured DMARC Record - During testing, orbital fire identified that orbital fire has a misconfigured DMARC (Domain-based Message Authentication, Reporting, and Conformance) record for one or more of their domain(s). DMARC is critical for verifying the authenticity of emails sent from the organization, serving as a vital barrier against email spoofing and phishing attacks. Without proper configuration, DMARC fails to instruct receiving mail servers on how to treat email messages from the organization's domain, thereby increasing vulnerability to attack.</w:t>
       </w:r>
     </w:p>
     <w:p>
@@ -5265,35 +4371,10 @@
       <w:r>
         <w:rPr>
           <w:rFonts w:ascii="Corbel" w:hAnsi="Corbel"/>
-        </w:rPr>
-        <w:t xml:space="preserve">2.    </w:t>
-      </w:r>
-      <w:r>
-        <w:rPr>
-          <w:rFonts w:ascii="Corbel" w:hAnsi="Corbel"/>
-          <w:b/>
-        </w:rPr>
-        <w:t>Remote SSH Service Exposed to Public Internet</w:t>
-      </w:r>
-      <w:r>
-        <w:rPr>
-          <w:rFonts w:ascii="Corbel" w:hAnsi="Corbel"/>
-        </w:rPr>
-        <w:t xml:space="preserve"> - During testing, </w:t>
-      </w:r>
-      <w:proofErr w:type="spellStart"/>
-      <w:r>
-        <w:rPr>
-          <w:rFonts w:ascii="Corbel" w:hAnsi="Corbel"/>
-        </w:rPr>
-        <w:t>orbital fire</w:t>
-      </w:r>
-      <w:proofErr w:type="spellEnd"/>
-      <w:r>
-        <w:rPr>
-          <w:rFonts w:ascii="Corbel" w:hAnsi="Corbel"/>
-        </w:rPr>
-        <w:t xml:space="preserve"> identified that remote administration services, including SSH, were exposed to the public internet. This exposure is often the result of misconfiguration or insufficient access controls, which significantly increase the attack surface. Publicly accessible SSH services are susceptible to brute-force and password-guessing attacks, which may lead to unauthorized system access. Additionally, newly disclosed vulnerabilities, including zero-day exploits, could be leveraged by threat actors to further compromise exposed systems.</w:t>
+          <w:color w:val="E6781F"/>
+          <w:sz w:val="24"/>
+        </w:rPr>
+        <w:t>2.    Remote SSH Service Exposed to Public Internet - During testing, orbital fire identified that remote administration services, including SSH, were exposed to the public internet. This exposure is often the result of misconfiguration or insufficient access controls, which significantly increase the attack surface. Publicly accessible SSH services are susceptible to brute-force and password-guessing attacks, which may lead to unauthorized system access. Additionally, newly disclosed vulnerabilities, including zero-day exploits, could be leveraged by threat actors to further compromise exposed systems.</w:t>
       </w:r>
     </w:p>
     <w:p>
@@ -5560,13 +4641,37 @@
     </w:p>
     <w:p>
       <w:pPr>
-        <w:spacing w:before="120" w:after="160"/>
+        <w:numPr>
+          <w:ilvl w:val="0"/>
+          <w:numId w:val="13"/>
+        </w:numPr>
+        <w:spacing w:line="259" w:lineRule="auto"/>
+        <w:contextualSpacing/>
+        <w:rPr>
+          <w:rFonts w:ascii="Corbel" w:eastAsia="Calibri" w:hAnsi="Corbel" w:cs="Arial"/>
+          <w:color w:val="404040"/>
+          <w:kern w:val="0"/>
+          <w:szCs w:val="22"/>
+          <w14:ligatures w14:val="none"/>
+        </w:rPr>
+      </w:pPr>
+      <w:r>
+        <w:t>Doppelganger Domains – A Doppelganger domain is a registered domain that could</w:t>
+        <w:br/>
+        <w:t>potentially take advantage of common typing mistakes or browser assumptions. During testing against targeted domains, nine (9) doppelganger domains were discovered to be registered. CUSTOMER NAME’s network staff should review these results and determine the legitimacy of these domains.</w:t>
+        <w:br/>
+        <w:t>Reference:</w:t>
+      </w:r>
+    </w:p>
+    <w:p>
+      <w:pPr>
+        <w:spacing w:before="120" w:after="120"/>
       </w:pPr>
       <w:r>
         <w:drawing>
           <wp:inline xmlns:a="http://schemas.openxmlformats.org/drawingml/2006/main" xmlns:pic="http://schemas.openxmlformats.org/drawingml/2006/picture">
-            <wp:extent cx="5760720" cy="1839367"/>
-            <wp:docPr id="2011428621" name="Picture 2011428621"/>
+            <wp:extent cx="5760720" cy="2110195"/>
+            <wp:docPr id="2011428610" name="Picture 2011428610"/>
             <wp:cNvGraphicFramePr>
               <a:graphicFrameLocks noChangeAspect="1"/>
             </wp:cNvGraphicFramePr>
@@ -5574,89 +4679,11 @@
               <a:graphicData uri="http://schemas.openxmlformats.org/drawingml/2006/picture">
                 <pic:pic>
                   <pic:nvPicPr>
-                    <pic:cNvPr id="0" name="image.png"/>
+                    <pic:cNvPr id="0" name="Doppelganger-Domains-Table-8.png"/>
                     <pic:cNvPicPr/>
                   </pic:nvPicPr>
                   <pic:blipFill>
-                    <a:blip r:embed="rId30"/>
-                    <a:stretch>
-                      <a:fillRect/>
-                    </a:stretch>
-                  </pic:blipFill>
-                  <pic:spPr>
-                    <a:xfrm>
-                      <a:off x="0" y="0"/>
-                      <a:ext cx="5760720" cy="1839367"/>
-                    </a:xfrm>
-                    <a:prstGeom prst="rect"/>
-                  </pic:spPr>
-                </pic:pic>
-              </a:graphicData>
-            </a:graphic>
-          </wp:inline>
-        </w:drawing>
-      </w:r>
-    </w:p>
-    <w:p>
-      <w:pPr>
-        <w:spacing w:before="120" w:after="160"/>
-      </w:pPr>
-      <w:r>
-        <w:drawing>
-          <wp:inline xmlns:a="http://schemas.openxmlformats.org/drawingml/2006/main" xmlns:pic="http://schemas.openxmlformats.org/drawingml/2006/picture">
-            <wp:extent cx="5760720" cy="1523402"/>
-            <wp:docPr id="2011428622" name="Picture 2011428622"/>
-            <wp:cNvGraphicFramePr>
-              <a:graphicFrameLocks noChangeAspect="1"/>
-            </wp:cNvGraphicFramePr>
-            <a:graphic>
-              <a:graphicData uri="http://schemas.openxmlformats.org/drawingml/2006/picture">
-                <pic:pic>
-                  <pic:nvPicPr>
-                    <pic:cNvPr id="0" name="image.png"/>
-                    <pic:cNvPicPr/>
-                  </pic:nvPicPr>
-                  <pic:blipFill>
-                    <a:blip r:embed="rId31"/>
-                    <a:stretch>
-                      <a:fillRect/>
-                    </a:stretch>
-                  </pic:blipFill>
-                  <pic:spPr>
-                    <a:xfrm>
-                      <a:off x="0" y="0"/>
-                      <a:ext cx="5760720" cy="1523402"/>
-                    </a:xfrm>
-                    <a:prstGeom prst="rect"/>
-                  </pic:spPr>
-                </pic:pic>
-              </a:graphicData>
-            </a:graphic>
-          </wp:inline>
-        </w:drawing>
-      </w:r>
-    </w:p>
-    <w:p>
-      <w:pPr>
-        <w:spacing w:before="120" w:after="160"/>
-      </w:pPr>
-      <w:r>
-        <w:drawing>
-          <wp:inline xmlns:a="http://schemas.openxmlformats.org/drawingml/2006/main" xmlns:pic="http://schemas.openxmlformats.org/drawingml/2006/picture">
-            <wp:extent cx="5760720" cy="2110195"/>
-            <wp:docPr id="2011428623" name="Picture 2011428623"/>
-            <wp:cNvGraphicFramePr>
-              <a:graphicFrameLocks noChangeAspect="1"/>
-            </wp:cNvGraphicFramePr>
-            <a:graphic>
-              <a:graphicData uri="http://schemas.openxmlformats.org/drawingml/2006/picture">
-                <pic:pic>
-                  <pic:nvPicPr>
-                    <pic:cNvPr id="0" name="image.png"/>
-                    <pic:cNvPicPr/>
-                  </pic:nvPicPr>
-                  <pic:blipFill>
-                    <a:blip r:embed="rId32"/>
+                    <a:blip r:embed="rId26"/>
                     <a:stretch>
                       <a:fillRect/>
                     </a:stretch>
@@ -5677,13 +4704,35 @@
     </w:p>
     <w:p>
       <w:pPr>
-        <w:spacing w:before="120" w:after="160"/>
+        <w:numPr>
+          <w:ilvl w:val="0"/>
+          <w:numId w:val="13"/>
+        </w:numPr>
+        <w:spacing w:line="259" w:lineRule="auto"/>
+        <w:contextualSpacing/>
+        <w:rPr>
+          <w:rFonts w:ascii="Corbel" w:eastAsia="Calibri" w:hAnsi="Corbel" w:cs="Arial"/>
+          <w:color w:val="404040"/>
+          <w:kern w:val="0"/>
+          <w:szCs w:val="22"/>
+          <w14:ligatures w14:val="none"/>
+        </w:rPr>
+      </w:pPr>
+      <w:r>
+        <w:t>Domain Information Gathering – One of the first steps from an attacker is to gather as much information as possible about the target via domain lookups, identifying subdomains and mail servers, etc. The objective of this process is to gather as much information as possible and map out the external environment of the organization, which can later be used in attacks such as social engineering. It should be noted that both the www. and non-www. versions of root domains were queried against DNS servers for information.</w:t>
+        <w:br/>
+        <w:t>Reference:</w:t>
+      </w:r>
+    </w:p>
+    <w:p>
+      <w:pPr>
+        <w:spacing w:before="120" w:after="120"/>
       </w:pPr>
       <w:r>
         <w:drawing>
           <wp:inline xmlns:a="http://schemas.openxmlformats.org/drawingml/2006/main" xmlns:pic="http://schemas.openxmlformats.org/drawingml/2006/picture">
-            <wp:extent cx="5760720" cy="1839367"/>
-            <wp:docPr id="2011428618" name="Picture 2011428618"/>
+            <wp:extent cx="5760720" cy="1658816"/>
+            <wp:docPr id="2011428611" name="Picture 2011428611"/>
             <wp:cNvGraphicFramePr>
               <a:graphicFrameLocks noChangeAspect="1"/>
             </wp:cNvGraphicFramePr>
@@ -5691,11 +4740,11 @@
               <a:graphicData uri="http://schemas.openxmlformats.org/drawingml/2006/picture">
                 <pic:pic>
                   <pic:nvPicPr>
-                    <pic:cNvPr id="0" name="Informational6.png"/>
+                    <pic:cNvPr id="0" name="Sub-Domain-Table-6.png"/>
                     <pic:cNvPicPr/>
                   </pic:nvPicPr>
                   <pic:blipFill>
-                    <a:blip r:embed="rId30"/>
+                    <a:blip r:embed="rId27"/>
                     <a:stretch>
                       <a:fillRect/>
                     </a:stretch>
@@ -5703,7 +4752,7 @@
                   <pic:spPr>
                     <a:xfrm>
                       <a:off x="0" y="0"/>
-                      <a:ext cx="5760720" cy="1839367"/>
+                      <a:ext cx="5760720" cy="1658816"/>
                     </a:xfrm>
                     <a:prstGeom prst="rect"/>
                   </pic:spPr>
@@ -5716,13 +4765,23 @@
     </w:p>
     <w:p>
       <w:pPr>
-        <w:spacing w:before="120" w:after="160"/>
+        <w:spacing w:before="120"/>
+      </w:pPr>
+      <w:r>
+        <w:t>Furthermore, the consultant reviewed the DNS records provided by the domains and subdomains discovered to attempt identifying if any valuable information could be obtained. No sensitive information has been discovered from this information.</w:t>
+        <w:br/>
+        <w:t>Reference:</w:t>
+      </w:r>
+    </w:p>
+    <w:p>
+      <w:pPr>
+        <w:spacing w:before="120" w:after="120"/>
       </w:pPr>
       <w:r>
         <w:drawing>
           <wp:inline xmlns:a="http://schemas.openxmlformats.org/drawingml/2006/main" xmlns:pic="http://schemas.openxmlformats.org/drawingml/2006/picture">
-            <wp:extent cx="5760720" cy="1523402"/>
-            <wp:docPr id="2011428619" name="Picture 2011428619"/>
+            <wp:extent cx="5303520" cy="1049276"/>
+            <wp:docPr id="2011428612" name="Picture 2011428612"/>
             <wp:cNvGraphicFramePr>
               <a:graphicFrameLocks noChangeAspect="1"/>
             </wp:cNvGraphicFramePr>
@@ -5730,11 +4789,11 @@
               <a:graphicData uri="http://schemas.openxmlformats.org/drawingml/2006/picture">
                 <pic:pic>
                   <pic:nvPicPr>
-                    <pic:cNvPr id="0" name="Informational-second-6.png"/>
+                    <pic:cNvPr id="0" name="DNS-Record1.png"/>
                     <pic:cNvPicPr/>
                   </pic:nvPicPr>
                   <pic:blipFill>
-                    <a:blip r:embed="rId31"/>
+                    <a:blip r:embed="rId28"/>
                     <a:stretch>
                       <a:fillRect/>
                     </a:stretch>
@@ -5742,7 +4801,7 @@
                   <pic:spPr>
                     <a:xfrm>
                       <a:off x="0" y="0"/>
-                      <a:ext cx="5760720" cy="1523402"/>
+                      <a:ext cx="5303520" cy="1049276"/>
                     </a:xfrm>
                     <a:prstGeom prst="rect"/>
                   </pic:spPr>
@@ -5755,13 +4814,13 @@
     </w:p>
     <w:p>
       <w:pPr>
-        <w:spacing w:before="120" w:after="160"/>
+        <w:spacing w:before="120" w:after="120"/>
       </w:pPr>
       <w:r>
         <w:drawing>
           <wp:inline xmlns:a="http://schemas.openxmlformats.org/drawingml/2006/main" xmlns:pic="http://schemas.openxmlformats.org/drawingml/2006/picture">
-            <wp:extent cx="5760720" cy="2110195"/>
-            <wp:docPr id="2011428620" name="Picture 2011428620"/>
+            <wp:extent cx="5760720" cy="2363960"/>
+            <wp:docPr id="2011428613" name="Picture 2011428613"/>
             <wp:cNvGraphicFramePr>
               <a:graphicFrameLocks noChangeAspect="1"/>
             </wp:cNvGraphicFramePr>
@@ -5769,11 +4828,11 @@
               <a:graphicData uri="http://schemas.openxmlformats.org/drawingml/2006/picture">
                 <pic:pic>
                   <pic:nvPicPr>
-                    <pic:cNvPr id="0" name="Informational8.png"/>
+                    <pic:cNvPr id="0" name="DNS-Record2.png"/>
                     <pic:cNvPicPr/>
                   </pic:nvPicPr>
                   <pic:blipFill>
-                    <a:blip r:embed="rId32"/>
+                    <a:blip r:embed="rId29"/>
                     <a:stretch>
                       <a:fillRect/>
                     </a:stretch>
@@ -5781,7 +4840,7 @@
                   <pic:spPr>
                     <a:xfrm>
                       <a:off x="0" y="0"/>
-                      <a:ext cx="5760720" cy="2110195"/>
+                      <a:ext cx="5760720" cy="2363960"/>
                     </a:xfrm>
                     <a:prstGeom prst="rect"/>
                   </pic:spPr>
@@ -5794,435 +4853,6 @@
     </w:p>
     <w:p>
       <w:pPr>
-        <w:numPr>
-          <w:ilvl w:val="0"/>
-          <w:numId w:val="13"/>
-        </w:numPr>
-        <w:spacing w:line="259" w:lineRule="auto"/>
-        <w:contextualSpacing/>
-        <w:rPr>
-          <w:rFonts w:ascii="Corbel" w:eastAsia="Calibri" w:hAnsi="Corbel" w:cs="Arial"/>
-          <w:color w:val="404040"/>
-          <w:kern w:val="0"/>
-          <w:szCs w:val="22"/>
-          <w14:ligatures w14:val="none"/>
-        </w:rPr>
-      </w:pPr>
-      <w:bookmarkStart w:id="9" w:name="_Hlk201240797"/>
-      <w:r>
-        <w:rPr>
-          <w:rFonts w:ascii="Corbel" w:eastAsia="Calibri" w:hAnsi="Corbel" w:cs="Arial"/>
-          <w:b/>
-          <w:bCs/>
-          <w:color w:val="404040"/>
-          <w:kern w:val="0"/>
-          <w:szCs w:val="22"/>
-          <w14:ligatures w14:val="none"/>
-        </w:rPr>
-        <w:t xml:space="preserve">Doppelganger Domains </w:t>
-      </w:r>
-      <w:bookmarkStart w:id="10" w:name="_Hlk207017175"/>
-      <w:r>
-        <w:rPr>
-          <w:rFonts w:ascii="Corbel" w:eastAsia="Calibri" w:hAnsi="Corbel" w:cs="Arial"/>
-          <w:b/>
-          <w:bCs/>
-          <w:color w:val="404040"/>
-          <w:kern w:val="0"/>
-          <w:szCs w:val="22"/>
-          <w14:ligatures w14:val="none"/>
-        </w:rPr>
-        <w:t>–</w:t>
-      </w:r>
-      <w:r>
-        <w:rPr>
-          <w:rFonts w:ascii="Corbel" w:eastAsia="Calibri" w:hAnsi="Corbel" w:cs="Arial"/>
-          <w:color w:val="404040"/>
-          <w:kern w:val="0"/>
-          <w:szCs w:val="22"/>
-          <w14:ligatures w14:val="none"/>
-        </w:rPr>
-        <w:t xml:space="preserve"> </w:t>
-      </w:r>
-      <w:bookmarkEnd w:id="10"/>
-      <w:r>
-        <w:rPr>
-          <w:rFonts w:ascii="Corbel" w:eastAsia="Calibri" w:hAnsi="Corbel" w:cs="Arial"/>
-          <w:color w:val="404040"/>
-          <w:kern w:val="0"/>
-          <w14:ligatures w14:val="none"/>
-        </w:rPr>
-        <w:t>A Doppelganger domain is a registered domain that could</w:t>
-      </w:r>
-      <w:r>
-        <w:rPr>
-          <w:rFonts w:ascii="Corbel" w:eastAsia="Calibri" w:hAnsi="Corbel" w:cs="Arial"/>
-          <w:color w:val="404040"/>
-          <w:kern w:val="0"/>
-          <w:szCs w:val="22"/>
-          <w14:ligatures w14:val="none"/>
-        </w:rPr>
-        <w:br/>
-      </w:r>
-      <w:r>
-        <w:rPr>
-          <w:rFonts w:ascii="Corbel" w:eastAsia="Calibri" w:hAnsi="Corbel" w:cs="Arial"/>
-          <w:color w:val="404040"/>
-          <w:kern w:val="0"/>
-          <w14:ligatures w14:val="none"/>
-        </w:rPr>
-        <w:t>potentially take advantage of common typing mistakes or browser assumptions.</w:t>
-      </w:r>
-      <w:r>
-        <w:rPr>
-          <w:rFonts w:ascii="Corbel" w:eastAsia="Calibri" w:hAnsi="Corbel" w:cs="Arial"/>
-          <w:color w:val="404040"/>
-          <w:kern w:val="0"/>
-          <w:szCs w:val="22"/>
-          <w14:ligatures w14:val="none"/>
-        </w:rPr>
-        <w:t xml:space="preserve"> During </w:t>
-      </w:r>
-      <w:bookmarkEnd w:id="9"/>
-      <w:r>
-        <w:rPr>
-          <w:rFonts w:ascii="Corbel" w:eastAsia="Calibri" w:hAnsi="Corbel" w:cs="Arial"/>
-          <w:color w:val="404040"/>
-          <w:kern w:val="0"/>
-          <w:szCs w:val="22"/>
-          <w14:ligatures w14:val="none"/>
-        </w:rPr>
-        <w:t xml:space="preserve">testing against targeted domains, </w:t>
-      </w:r>
-      <w:bookmarkStart w:id="11" w:name="_Hlk212473705"/>
-      <w:r>
-        <w:rPr>
-          <w:rFonts w:ascii="Corbel" w:eastAsia="Calibri" w:hAnsi="Corbel" w:cs="Arial"/>
-          <w:color w:val="404040"/>
-          <w:kern w:val="0"/>
-          <w:szCs w:val="22"/>
-          <w:highlight w:val="yellow"/>
-          <w14:ligatures w14:val="none"/>
-        </w:rPr>
-        <w:t>NUMBER (#)</w:t>
-      </w:r>
-      <w:r>
-        <w:rPr>
-          <w:rFonts w:ascii="Corbel" w:eastAsia="Calibri" w:hAnsi="Corbel" w:cs="Arial"/>
-          <w:color w:val="404040"/>
-          <w:kern w:val="0"/>
-          <w:szCs w:val="22"/>
-          <w14:ligatures w14:val="none"/>
-        </w:rPr>
-        <w:t xml:space="preserve"> </w:t>
-      </w:r>
-      <w:bookmarkEnd w:id="11"/>
-      <w:r>
-        <w:rPr>
-          <w:rFonts w:ascii="Corbel" w:eastAsia="Calibri" w:hAnsi="Corbel" w:cs="Arial"/>
-          <w:color w:val="404040"/>
-          <w:kern w:val="0"/>
-          <w:szCs w:val="22"/>
-          <w14:ligatures w14:val="none"/>
-        </w:rPr>
-        <w:t>doppelganger domains were discovered to be registered. CUSTOMER NAME’s network staff should review these results and determine the legitimacy of these domains.</w:t>
-      </w:r>
-      <w:r>
-        <w:rPr>
-          <w:rFonts w:ascii="Corbel" w:eastAsia="Calibri" w:hAnsi="Corbel" w:cs="Arial"/>
-          <w:color w:val="404040"/>
-          <w:kern w:val="0"/>
-          <w:szCs w:val="22"/>
-          <w14:ligatures w14:val="none"/>
-        </w:rPr>
-        <w:br/>
-      </w:r>
-      <w:r>
-        <w:rPr>
-          <w:rFonts w:ascii="Corbel" w:eastAsia="Calibri" w:hAnsi="Corbel" w:cs="Arial"/>
-          <w:i/>
-          <w:iCs/>
-          <w:color w:val="404040"/>
-          <w:kern w:val="0"/>
-          <w:szCs w:val="22"/>
-          <w14:ligatures w14:val="none"/>
-        </w:rPr>
-        <w:t>Reference:</w:t>
-      </w:r>
-      <w:r>
-        <w:rPr>
-          <w:rFonts w:ascii="Corbel" w:eastAsia="Calibri" w:hAnsi="Corbel" w:cs="Arial"/>
-          <w:noProof/>
-          <w:color w:val="404040"/>
-          <w:kern w:val="0"/>
-          <w:szCs w:val="22"/>
-          <w14:ligatures w14:val="none"/>
-        </w:rPr>
-        <w:t xml:space="preserve"> </w:t>
-      </w:r>
-      <w:r>
-        <w:rPr>
-          <w:rFonts w:ascii="Corbel" w:eastAsia="Calibri" w:hAnsi="Corbel" w:cs="Arial"/>
-          <w:color w:val="404040"/>
-          <w:kern w:val="0"/>
-          <w:szCs w:val="22"/>
-          <w14:ligatures w14:val="none"/>
-        </w:rPr>
-        <w:br/>
-      </w:r>
-      <w:r>
-        <w:rPr>
-          <w:rFonts w:ascii="Corbel" w:eastAsia="Calibri" w:hAnsi="Corbel" w:cs="Arial"/>
-          <w:noProof/>
-          <w:color w:val="404040"/>
-          <w:kern w:val="0"/>
-          <w:szCs w:val="22"/>
-          <w:highlight w:val="yellow"/>
-          <w14:ligatures w14:val="none"/>
-        </w:rPr>
-        <w:t>DOPPELGANGER DOMAINS TABLE</w:t>
-      </w:r>
-      <w:r>
-        <w:rPr>
-          <w:rFonts w:ascii="Corbel" w:eastAsia="Calibri" w:hAnsi="Corbel" w:cs="Arial"/>
-          <w:color w:val="404040"/>
-          <w:kern w:val="0"/>
-          <w:szCs w:val="22"/>
-          <w14:ligatures w14:val="none"/>
-        </w:rPr>
-        <w:br/>
-      </w:r>
-    </w:p>
-    <w:p>
-      <w:pPr>
-        <w:spacing w:before="120" w:after="160"/>
-      </w:pPr>
-      <w:r>
-        <w:drawing>
-          <wp:inline xmlns:a="http://schemas.openxmlformats.org/drawingml/2006/main" xmlns:pic="http://schemas.openxmlformats.org/drawingml/2006/picture">
-            <wp:extent cx="5760720" cy="1839367"/>
-            <wp:docPr id="2011428624" name="Picture 2011428624"/>
-            <wp:cNvGraphicFramePr>
-              <a:graphicFrameLocks noChangeAspect="1"/>
-            </wp:cNvGraphicFramePr>
-            <a:graphic>
-              <a:graphicData uri="http://schemas.openxmlformats.org/drawingml/2006/picture">
-                <pic:pic>
-                  <pic:nvPicPr>
-                    <pic:cNvPr id="0" name="image.png"/>
-                    <pic:cNvPicPr/>
-                  </pic:nvPicPr>
-                  <pic:blipFill>
-                    <a:blip r:embed="rId30"/>
-                    <a:stretch>
-                      <a:fillRect/>
-                    </a:stretch>
-                  </pic:blipFill>
-                  <pic:spPr>
-                    <a:xfrm>
-                      <a:off x="0" y="0"/>
-                      <a:ext cx="5760720" cy="1839367"/>
-                    </a:xfrm>
-                    <a:prstGeom prst="rect"/>
-                  </pic:spPr>
-                </pic:pic>
-              </a:graphicData>
-            </a:graphic>
-          </wp:inline>
-        </w:drawing>
-      </w:r>
-    </w:p>
-    <w:p>
-      <w:pPr>
-        <w:numPr>
-          <w:ilvl w:val="0"/>
-          <w:numId w:val="13"/>
-        </w:numPr>
-        <w:spacing w:line="259" w:lineRule="auto"/>
-        <w:contextualSpacing/>
-        <w:rPr>
-          <w:rFonts w:ascii="Corbel" w:eastAsia="Calibri" w:hAnsi="Corbel" w:cs="Arial"/>
-          <w:color w:val="404040"/>
-          <w:kern w:val="0"/>
-          <w:szCs w:val="22"/>
-          <w14:ligatures w14:val="none"/>
-        </w:rPr>
-      </w:pPr>
-      <w:r>
-        <w:rPr>
-          <w:rFonts w:ascii="Corbel" w:eastAsia="Calibri" w:hAnsi="Corbel" w:cs="Arial"/>
-          <w:b/>
-          <w:bCs/>
-          <w:color w:val="404040"/>
-          <w:kern w:val="0"/>
-          <w:szCs w:val="22"/>
-          <w14:ligatures w14:val="none"/>
-        </w:rPr>
-        <w:t>Domain Information Gathering –</w:t>
-      </w:r>
-      <w:r>
-        <w:rPr>
-          <w:rFonts w:ascii="Corbel" w:eastAsia="Calibri" w:hAnsi="Corbel" w:cs="Arial"/>
-          <w:color w:val="404040"/>
-          <w:kern w:val="0"/>
-          <w:szCs w:val="22"/>
-          <w14:ligatures w14:val="none"/>
-        </w:rPr>
-        <w:t xml:space="preserve"> One of the first steps from an attacker is to gather as much information as possible about the target via domain lookups, identifying subdomains and mail servers, etc. The objective of this process is to gather as much information as possible and map out the external environment of the organization, which can later be used in attacks such as social engineering. It should be noted that both the www. and non-www. versions of root domains were queried against DNS servers for information.</w:t>
-      </w:r>
-      <w:r>
-        <w:rPr>
-          <w:rFonts w:ascii="Corbel" w:eastAsia="Calibri" w:hAnsi="Corbel" w:cs="Arial"/>
-          <w:color w:val="404040"/>
-          <w:kern w:val="0"/>
-          <w:szCs w:val="22"/>
-          <w14:ligatures w14:val="none"/>
-        </w:rPr>
-        <w:br/>
-      </w:r>
-      <w:r>
-        <w:rPr>
-          <w:rFonts w:ascii="Corbel" w:eastAsia="Calibri" w:hAnsi="Corbel" w:cs="Arial"/>
-          <w:i/>
-          <w:iCs/>
-          <w:color w:val="404040"/>
-          <w:kern w:val="0"/>
-          <w:szCs w:val="22"/>
-          <w14:ligatures w14:val="none"/>
-        </w:rPr>
-        <w:t>Reference:</w:t>
-      </w:r>
-      <w:r>
-        <w:rPr>
-          <w:rFonts w:ascii="Corbel" w:eastAsia="Calibri" w:hAnsi="Corbel" w:cs="Arial"/>
-          <w:color w:val="404040"/>
-          <w:kern w:val="0"/>
-          <w:szCs w:val="22"/>
-          <w14:ligatures w14:val="none"/>
-        </w:rPr>
-        <w:br/>
-      </w:r>
-      <w:r>
-        <w:rPr>
-          <w:rFonts w:ascii="Corbel" w:eastAsia="Calibri" w:hAnsi="Corbel" w:cs="Arial"/>
-          <w:noProof/>
-          <w:color w:val="404040"/>
-          <w:kern w:val="0"/>
-          <w:szCs w:val="22"/>
-          <w:highlight w:val="yellow"/>
-          <w14:ligatures w14:val="none"/>
-        </w:rPr>
-        <w:t>SUB DOMAIN TABLE</w:t>
-      </w:r>
-      <w:r>
-        <w:rPr>
-          <w:rFonts w:ascii="Corbel" w:eastAsia="Calibri" w:hAnsi="Corbel" w:cs="Arial"/>
-          <w:color w:val="404040"/>
-          <w:kern w:val="0"/>
-          <w:szCs w:val="22"/>
-          <w14:ligatures w14:val="none"/>
-        </w:rPr>
-        <w:br/>
-        <w:t>Furthermore, the consultant reviewed the DNS records provided by the domains and subdomains discovered to attempt identifying if any valuable information could be obtained. No sensitive information has been discovered from this information.</w:t>
-      </w:r>
-      <w:r>
-        <w:rPr>
-          <w:rFonts w:ascii="Corbel" w:eastAsia="Calibri" w:hAnsi="Corbel" w:cs="Arial"/>
-          <w:color w:val="404040"/>
-          <w:kern w:val="0"/>
-          <w:szCs w:val="22"/>
-          <w14:ligatures w14:val="none"/>
-        </w:rPr>
-        <w:br/>
-      </w:r>
-      <w:bookmarkStart w:id="12" w:name="_Hlk212031658"/>
-      <w:r>
-        <w:rPr>
-          <w:rFonts w:ascii="Corbel" w:eastAsia="Calibri" w:hAnsi="Corbel" w:cs="Arial"/>
-          <w:i/>
-          <w:iCs/>
-          <w:color w:val="404040"/>
-          <w:kern w:val="0"/>
-          <w:szCs w:val="22"/>
-          <w14:ligatures w14:val="none"/>
-        </w:rPr>
-        <w:t>Reference:</w:t>
-      </w:r>
-      <w:r>
-        <w:rPr>
-          <w:rFonts w:ascii="Corbel" w:eastAsia="Calibri" w:hAnsi="Corbel" w:cs="Arial"/>
-          <w:color w:val="404040"/>
-          <w:kern w:val="0"/>
-          <w:szCs w:val="22"/>
-          <w14:ligatures w14:val="none"/>
-        </w:rPr>
-        <w:br/>
-      </w:r>
-      <w:r>
-        <w:rPr>
-          <w:rFonts w:ascii="Corbel" w:eastAsia="Calibri" w:hAnsi="Corbel" w:cs="Arial"/>
-          <w:noProof/>
-          <w:color w:val="404040"/>
-          <w:kern w:val="0"/>
-          <w:szCs w:val="22"/>
-          <w:highlight w:val="yellow"/>
-          <w14:ligatures w14:val="none"/>
-        </w:rPr>
-        <w:t>DNS RECORD(S) TABLE</w:t>
-      </w:r>
-      <w:bookmarkEnd w:id="12"/>
-      <w:r>
-        <w:rPr>
-          <w:rFonts w:ascii="Corbel" w:eastAsia="Calibri" w:hAnsi="Corbel" w:cs="Arial"/>
-          <w:color w:val="404040"/>
-          <w:kern w:val="0"/>
-          <w:szCs w:val="22"/>
-          <w14:ligatures w14:val="none"/>
-        </w:rPr>
-        <w:br/>
-      </w:r>
-    </w:p>
-    <w:p>
-      <w:pPr>
-        <w:spacing w:before="120" w:after="160"/>
-      </w:pPr>
-      <w:r>
-        <w:drawing>
-          <wp:inline xmlns:a="http://schemas.openxmlformats.org/drawingml/2006/main" xmlns:pic="http://schemas.openxmlformats.org/drawingml/2006/picture">
-            <wp:extent cx="5760720" cy="2110195"/>
-            <wp:docPr id="2011428625" name="Picture 2011428625"/>
-            <wp:cNvGraphicFramePr>
-              <a:graphicFrameLocks noChangeAspect="1"/>
-            </wp:cNvGraphicFramePr>
-            <a:graphic>
-              <a:graphicData uri="http://schemas.openxmlformats.org/drawingml/2006/picture">
-                <pic:pic>
-                  <pic:nvPicPr>
-                    <pic:cNvPr id="0" name="image.png"/>
-                    <pic:cNvPicPr/>
-                  </pic:nvPicPr>
-                  <pic:blipFill>
-                    <a:blip r:embed="rId32"/>
-                    <a:stretch>
-                      <a:fillRect/>
-                    </a:stretch>
-                  </pic:blipFill>
-                  <pic:spPr>
-                    <a:xfrm>
-                      <a:off x="0" y="0"/>
-                      <a:ext cx="5760720" cy="2110195"/>
-                    </a:xfrm>
-                    <a:prstGeom prst="rect"/>
-                  </pic:spPr>
-                </pic:pic>
-              </a:graphicData>
-            </a:graphic>
-          </wp:inline>
-        </w:drawing>
-      </w:r>
-    </w:p>
-    <w:p>
-      <w:pPr>
         <w:spacing w:line="259" w:lineRule="auto"/>
         <w:rPr>
           <w:rFonts w:ascii="Corbel" w:eastAsia="Calibri" w:hAnsi="Corbel" w:cs="Arial"/>
@@ -6282,6 +4912,834 @@
     <w:p>
       <w:pPr>
         <w:pStyle w:val="ActivityBullet"/>
+      </w:pPr>
+      <w:r>
+        <w:rPr>
+          <w:rFonts w:ascii="Corbel" w:hAnsi="Corbel"/>
+          <w:sz w:val="17"/>
+        </w:rPr>
+        <w:t>2026-01-29 13:52:47-0500PM ET exposurescout Initiating ExposureScout module.</w:t>
+      </w:r>
+    </w:p>
+    <w:p>
+      <w:pPr>
+        <w:pStyle w:val="ActivityBullet"/>
+      </w:pPr>
+      <w:r>
+        <w:rPr>
+          <w:rFonts w:ascii="Corbel" w:hAnsi="Corbel"/>
+          <w:sz w:val="17"/>
+        </w:rPr>
+        <w:t>2026-01-29 13:52:59-0500PM ET exposurescout Enumerating subdomains from one (1) domain.</w:t>
+      </w:r>
+    </w:p>
+    <w:p>
+      <w:pPr>
+        <w:pStyle w:val="ActivityBullet"/>
+      </w:pPr>
+      <w:r>
+        <w:rPr>
+          <w:rFonts w:ascii="Corbel" w:hAnsi="Corbel"/>
+          <w:sz w:val="17"/>
+        </w:rPr>
+        <w:t>2026-01-29 13:54:13-0500PM ET exposurescout Completed subdomain enumeration.</w:t>
+      </w:r>
+    </w:p>
+    <w:p>
+      <w:pPr>
+        <w:pStyle w:val="ActivityBullet"/>
+      </w:pPr>
+      <w:r>
+        <w:rPr>
+          <w:rFonts w:ascii="Corbel" w:hAnsi="Corbel"/>
+          <w:sz w:val="17"/>
+        </w:rPr>
+        <w:t>2026-01-29 13:54:13-0500PM ET exposurescout Beginning DNS enumeration.</w:t>
+      </w:r>
+    </w:p>
+    <w:p>
+      <w:pPr>
+        <w:pStyle w:val="ActivityBullet"/>
+      </w:pPr>
+      <w:r>
+        <w:rPr>
+          <w:rFonts w:ascii="Corbel" w:hAnsi="Corbel"/>
+          <w:sz w:val="17"/>
+        </w:rPr>
+        <w:t>2026-01-29 13:55:18-0500PM ET exposurescout Completed DNS enumeration.</w:t>
+      </w:r>
+    </w:p>
+    <w:p>
+      <w:pPr>
+        <w:pStyle w:val="ActivityBullet"/>
+      </w:pPr>
+      <w:r>
+        <w:rPr>
+          <w:rFonts w:ascii="Corbel" w:hAnsi="Corbel"/>
+          <w:sz w:val="17"/>
+        </w:rPr>
+        <w:t>2026-01-29 13:55:18-0500PM ET exposurescout Enumerating doppelganger domains for one (1) domain.</w:t>
+      </w:r>
+    </w:p>
+    <w:p>
+      <w:pPr>
+        <w:pStyle w:val="ActivityBullet"/>
+      </w:pPr>
+      <w:r>
+        <w:rPr>
+          <w:rFonts w:ascii="Corbel" w:hAnsi="Corbel"/>
+          <w:sz w:val="17"/>
+        </w:rPr>
+        <w:t>2026-01-29 13:56:28-0500PM ET exposurescout Ten (10) new doppelganger domains discovered.</w:t>
+      </w:r>
+    </w:p>
+    <w:p>
+      <w:pPr>
+        <w:pStyle w:val="ActivityBullet"/>
+      </w:pPr>
+      <w:r>
+        <w:rPr>
+          <w:rFonts w:ascii="Corbel" w:hAnsi="Corbel"/>
+          <w:sz w:val="17"/>
+        </w:rPr>
+        <w:t>2026-01-29 13:56:28-0500PM ET exposurescout Completed doppelganger domain enumeration.</w:t>
+      </w:r>
+    </w:p>
+    <w:p>
+      <w:pPr>
+        <w:pStyle w:val="ActivityBullet"/>
+      </w:pPr>
+      <w:r>
+        <w:rPr>
+          <w:rFonts w:ascii="Corbel" w:hAnsi="Corbel"/>
+          <w:sz w:val="17"/>
+        </w:rPr>
+        <w:t>2026-01-29 13:56:28-0500PM ET exposurescout Running WHOIS commands on eight (8) domains.</w:t>
+      </w:r>
+    </w:p>
+    <w:p>
+      <w:pPr>
+        <w:pStyle w:val="ActivityBullet"/>
+      </w:pPr>
+      <w:r>
+        <w:rPr>
+          <w:rFonts w:ascii="Corbel" w:hAnsi="Corbel"/>
+          <w:sz w:val="17"/>
+        </w:rPr>
+        <w:t>2026-01-29 13:57:33-0500PM ET exposurescout Importing eight (8) WHOIS results into the database.</w:t>
+      </w:r>
+    </w:p>
+    <w:p>
+      <w:pPr>
+        <w:pStyle w:val="ActivityBullet"/>
+      </w:pPr>
+      <w:r>
+        <w:rPr>
+          <w:rFonts w:ascii="Corbel" w:hAnsi="Corbel"/>
+          <w:sz w:val="17"/>
+        </w:rPr>
+        <w:t>2026-01-29 13:57:34-0500PM ET exposurescout Completed recursive WHOIS lookups</w:t>
+      </w:r>
+    </w:p>
+    <w:p>
+      <w:pPr>
+        <w:pStyle w:val="ActivityBullet"/>
+      </w:pPr>
+      <w:r>
+        <w:rPr>
+          <w:rFonts w:ascii="Corbel" w:hAnsi="Corbel"/>
+          <w:sz w:val="17"/>
+        </w:rPr>
+        <w:t>2026-01-29 13:57:34-0500PM ET exposurescout Email scraping module started.</w:t>
+      </w:r>
+    </w:p>
+    <w:p>
+      <w:pPr>
+        <w:pStyle w:val="ActivityBullet"/>
+      </w:pPr>
+      <w:r>
+        <w:rPr>
+          <w:rFonts w:ascii="Corbel" w:hAnsi="Corbel"/>
+          <w:sz w:val="17"/>
+        </w:rPr>
+        <w:t>2026-01-29 13:58:40-0500PM ET exposurescout Completed email scraping.</w:t>
+      </w:r>
+    </w:p>
+    <w:p>
+      <w:pPr>
+        <w:pStyle w:val="ActivityBullet"/>
+      </w:pPr>
+      <w:r>
+        <w:rPr>
+          <w:rFonts w:ascii="Corbel" w:hAnsi="Corbel"/>
+          <w:sz w:val="17"/>
+        </w:rPr>
+        <w:t>2026-01-29 13:58:40-0500PM ET exposurescout Scanning subdomains for subdomain takeover vulnerability.</w:t>
+      </w:r>
+    </w:p>
+    <w:p>
+      <w:pPr>
+        <w:pStyle w:val="ActivityBullet"/>
+      </w:pPr>
+      <w:r>
+        <w:rPr>
+          <w:rFonts w:ascii="Corbel" w:hAnsi="Corbel"/>
+          <w:sz w:val="17"/>
+        </w:rPr>
+        <w:t>2026-01-29 13:59:44-0500PM ET exposurescout Found 1 domain vulnerable to subdomain takeover.</w:t>
+      </w:r>
+    </w:p>
+    <w:p>
+      <w:pPr>
+        <w:pStyle w:val="ActivityBullet"/>
+      </w:pPr>
+      <w:r>
+        <w:rPr>
+          <w:rFonts w:ascii="Corbel" w:hAnsi="Corbel"/>
+          <w:sz w:val="17"/>
+        </w:rPr>
+        <w:t>2026-01-29 13:59:44-0500PM ET exposurescout Completed subdomain takeover checks.</w:t>
+      </w:r>
+    </w:p>
+    <w:p>
+      <w:pPr>
+        <w:pStyle w:val="ActivityBullet"/>
+      </w:pPr>
+      <w:r>
+        <w:rPr>
+          <w:rFonts w:ascii="Corbel" w:hAnsi="Corbel"/>
+          <w:sz w:val="17"/>
+        </w:rPr>
+        <w:t>2026-01-29 13:59:44-0500PM ET exposurescout ExposureScout module completed.</w:t>
+      </w:r>
+    </w:p>
+    <w:p>
+      <w:pPr>
+        <w:pStyle w:val="ActivityBullet"/>
+      </w:pPr>
+      <w:r>
+        <w:rPr>
+          <w:rFonts w:ascii="Corbel" w:hAnsi="Corbel"/>
+          <w:sz w:val="17"/>
+        </w:rPr>
+        <w:t>2026-01-29 13:59:44-0500PM ET host discovery Performing DNS resolution for 1 DNS name.</w:t>
+      </w:r>
+    </w:p>
+    <w:p>
+      <w:pPr>
+        <w:pStyle w:val="ActivityBullet"/>
+      </w:pPr>
+      <w:r>
+        <w:rPr>
+          <w:rFonts w:ascii="Corbel" w:hAnsi="Corbel"/>
+          <w:sz w:val="17"/>
+        </w:rPr>
+        <w:t>2026-01-29 14:00:50-0500PM ET host discovery DNS resolution complete.</w:t>
+      </w:r>
+    </w:p>
+    <w:p>
+      <w:pPr>
+        <w:pStyle w:val="ActivityBullet"/>
+      </w:pPr>
+      <w:r>
+        <w:rPr>
+          <w:rFonts w:ascii="Corbel" w:hAnsi="Corbel"/>
+          <w:sz w:val="17"/>
+        </w:rPr>
+        <w:t>2026-01-29 14:00:50-0500PM ET host discovery Port scan module initialized.</w:t>
+      </w:r>
+    </w:p>
+    <w:p>
+      <w:pPr>
+        <w:pStyle w:val="ActivityBullet"/>
+      </w:pPr>
+      <w:r>
+        <w:rPr>
+          <w:rFonts w:ascii="Corbel" w:hAnsi="Corbel"/>
+          <w:sz w:val="17"/>
+        </w:rPr>
+        <w:t>2026-01-29 14:00:53-0500PM ET host discovery Conducting port scan against in-scope systems.</w:t>
+      </w:r>
+    </w:p>
+    <w:p>
+      <w:pPr>
+        <w:pStyle w:val="ActivityBullet"/>
+      </w:pPr>
+      <w:r>
+        <w:rPr>
+          <w:rFonts w:ascii="Corbel" w:hAnsi="Corbel"/>
+          <w:sz w:val="17"/>
+        </w:rPr>
+        <w:t>2026-01-29 14:00:57-0500PM ET host discovery Running nmap port scans.</w:t>
+      </w:r>
+    </w:p>
+    <w:p>
+      <w:pPr>
+        <w:pStyle w:val="ActivityBullet"/>
+      </w:pPr>
+      <w:r>
+        <w:rPr>
+          <w:rFonts w:ascii="Corbel" w:hAnsi="Corbel"/>
+          <w:sz w:val="17"/>
+        </w:rPr>
+        <w:t>2026-01-29 14:02:01-0500PM ET host discovery Completed nmap port scans.</w:t>
+      </w:r>
+    </w:p>
+    <w:p>
+      <w:pPr>
+        <w:pStyle w:val="ActivityBullet"/>
+      </w:pPr>
+      <w:r>
+        <w:rPr>
+          <w:rFonts w:ascii="Corbel" w:hAnsi="Corbel"/>
+          <w:sz w:val="17"/>
+        </w:rPr>
+        <w:t>2026-01-29 14:02:01-0500PM ET host discovery Port scans completed successfully.</w:t>
+      </w:r>
+    </w:p>
+    <w:p>
+      <w:pPr>
+        <w:pStyle w:val="ActivityBullet"/>
+      </w:pPr>
+      <w:r>
+        <w:rPr>
+          <w:rFonts w:ascii="Corbel" w:hAnsi="Corbel"/>
+          <w:sz w:val="17"/>
+        </w:rPr>
+        <w:t>2026-01-29 14:02:02-0500PM ET host discovery Parsing results for alive systems.</w:t>
+      </w:r>
+    </w:p>
+    <w:p>
+      <w:pPr>
+        <w:pStyle w:val="ActivityBullet"/>
+      </w:pPr>
+      <w:r>
+        <w:rPr>
+          <w:rFonts w:ascii="Corbel" w:hAnsi="Corbel"/>
+          <w:sz w:val="17"/>
+        </w:rPr>
+        <w:t>2026-01-29 14:02:02-0500PM ET host discovery Completed parsing Nmap results. 1 new IP addresses discovered and imported into DB.</w:t>
+      </w:r>
+    </w:p>
+    <w:p>
+      <w:pPr>
+        <w:pStyle w:val="ActivityBullet"/>
+      </w:pPr>
+      <w:r>
+        <w:rPr>
+          <w:rFonts w:ascii="Corbel" w:hAnsi="Corbel"/>
+          <w:sz w:val="17"/>
+        </w:rPr>
+        <w:t>2026-01-29 14:02:02-0500PM ET host discovery Parsing nmap port scans.</w:t>
+      </w:r>
+    </w:p>
+    <w:p>
+      <w:pPr>
+        <w:pStyle w:val="ActivityBullet"/>
+      </w:pPr>
+      <w:r>
+        <w:rPr>
+          <w:rFonts w:ascii="Corbel" w:hAnsi="Corbel"/>
+          <w:sz w:val="17"/>
+        </w:rPr>
+        <w:t>2026-01-29 14:02:02-0500PM ET host discovery Completed parsing port scans. Imported 3 new ports.</w:t>
+      </w:r>
+    </w:p>
+    <w:p>
+      <w:pPr>
+        <w:pStyle w:val="ActivityBullet"/>
+      </w:pPr>
+      <w:r>
+        <w:rPr>
+          <w:rFonts w:ascii="Corbel" w:hAnsi="Corbel"/>
+          <w:sz w:val="17"/>
+        </w:rPr>
+        <w:t>2026-01-29 14:02:02-0500PM ET host discovery Port scan module completed.</w:t>
+      </w:r>
+    </w:p>
+    <w:p>
+      <w:pPr>
+        <w:pStyle w:val="ActivityBullet"/>
+      </w:pPr>
+      <w:r>
+        <w:rPr>
+          <w:rFonts w:ascii="Corbel" w:hAnsi="Corbel"/>
+          <w:sz w:val="17"/>
+        </w:rPr>
+        <w:t>2026-01-29 14:02:03-0500PM ET host discovery Discovery module completed.</w:t>
+      </w:r>
+    </w:p>
+    <w:p>
+      <w:pPr>
+        <w:pStyle w:val="ActivityBullet"/>
+      </w:pPr>
+      <w:r>
+        <w:rPr>
+          <w:rFonts w:ascii="Corbel" w:hAnsi="Corbel"/>
+          <w:sz w:val="17"/>
+        </w:rPr>
+        <w:t>2026-01-29 14:02:27-0500PM ET host discovery Running nmap port version scans.</w:t>
+      </w:r>
+    </w:p>
+    <w:p>
+      <w:pPr>
+        <w:pStyle w:val="ActivityBullet"/>
+      </w:pPr>
+      <w:r>
+        <w:rPr>
+          <w:rFonts w:ascii="Corbel" w:hAnsi="Corbel"/>
+          <w:sz w:val="17"/>
+        </w:rPr>
+        <w:t>2026-01-29 14:03:30-0500PM ET host discovery Completed nmap port version scans.</w:t>
+      </w:r>
+    </w:p>
+    <w:p>
+      <w:pPr>
+        <w:pStyle w:val="ActivityBullet"/>
+      </w:pPr>
+      <w:r>
+        <w:rPr>
+          <w:rFonts w:ascii="Corbel" w:hAnsi="Corbel"/>
+          <w:sz w:val="17"/>
+        </w:rPr>
+        <w:t>2026-01-29 14:03:35-0500PM ET enumeration Enumeration module initialized.</w:t>
+      </w:r>
+    </w:p>
+    <w:p>
+      <w:pPr>
+        <w:pStyle w:val="ActivityBullet"/>
+      </w:pPr>
+      <w:r>
+        <w:rPr>
+          <w:rFonts w:ascii="Corbel" w:hAnsi="Corbel"/>
+          <w:sz w:val="17"/>
+        </w:rPr>
+        <w:t>2026-01-29 14:04:43-0500PM ET enumeration Enumerating HTTP services.</w:t>
+      </w:r>
+    </w:p>
+    <w:p>
+      <w:pPr>
+        <w:pStyle w:val="ActivityBullet"/>
+      </w:pPr>
+      <w:r>
+        <w:rPr>
+          <w:rFonts w:ascii="Corbel" w:hAnsi="Corbel"/>
+          <w:sz w:val="17"/>
+        </w:rPr>
+        <w:t>2026-01-29 14:04:43-0500PM ET enumeration Enumerating HTTPS services.</w:t>
+      </w:r>
+    </w:p>
+    <w:p>
+      <w:pPr>
+        <w:pStyle w:val="ActivityBullet"/>
+      </w:pPr>
+      <w:r>
+        <w:rPr>
+          <w:rFonts w:ascii="Corbel" w:hAnsi="Corbel"/>
+          <w:sz w:val="17"/>
+        </w:rPr>
+        <w:t>2026-01-29 14:04:43-0500PM ET enumeration Enumerating SSH services.</w:t>
+      </w:r>
+    </w:p>
+    <w:p>
+      <w:pPr>
+        <w:pStyle w:val="ActivityBullet"/>
+      </w:pPr>
+      <w:r>
+        <w:rPr>
+          <w:rFonts w:ascii="Corbel" w:hAnsi="Corbel"/>
+          <w:sz w:val="17"/>
+        </w:rPr>
+        <w:t>2026-01-29 14:04:47-0500PM ET enumeration Running nmap script scan using script: http-headers.</w:t>
+      </w:r>
+    </w:p>
+    <w:p>
+      <w:pPr>
+        <w:pStyle w:val="ActivityBullet"/>
+      </w:pPr>
+      <w:r>
+        <w:rPr>
+          <w:rFonts w:ascii="Corbel" w:hAnsi="Corbel"/>
+          <w:sz w:val="17"/>
+        </w:rPr>
+        <w:t>2026-01-29 14:04:47-0500PM ET enumeration Running nmap script scan using script: http-methods.</w:t>
+      </w:r>
+    </w:p>
+    <w:p>
+      <w:pPr>
+        <w:pStyle w:val="ActivityBullet"/>
+      </w:pPr>
+      <w:r>
+        <w:rPr>
+          <w:rFonts w:ascii="Corbel" w:hAnsi="Corbel"/>
+          <w:sz w:val="17"/>
+        </w:rPr>
+        <w:t>2026-01-29 14:04:47-0500PM ET enumeration Running nmap script scan using script: http-headers.</w:t>
+      </w:r>
+    </w:p>
+    <w:p>
+      <w:pPr>
+        <w:pStyle w:val="ActivityBullet"/>
+      </w:pPr>
+      <w:r>
+        <w:rPr>
+          <w:rFonts w:ascii="Corbel" w:hAnsi="Corbel"/>
+          <w:sz w:val="17"/>
+        </w:rPr>
+        <w:t>2026-01-29 14:04:47-0500PM ET enumeration Running nmap script scan using script: http-robots.txt.</w:t>
+      </w:r>
+    </w:p>
+    <w:p>
+      <w:pPr>
+        <w:pStyle w:val="ActivityBullet"/>
+      </w:pPr>
+      <w:r>
+        <w:rPr>
+          <w:rFonts w:ascii="Corbel" w:hAnsi="Corbel"/>
+          <w:sz w:val="17"/>
+        </w:rPr>
+        <w:t>2026-01-29 14:04:47-0500PM ET enumeration Running nmap script scan using script: http-robots.txt.</w:t>
+      </w:r>
+    </w:p>
+    <w:p>
+      <w:pPr>
+        <w:pStyle w:val="ActivityBullet"/>
+      </w:pPr>
+      <w:r>
+        <w:rPr>
+          <w:rFonts w:ascii="Corbel" w:hAnsi="Corbel"/>
+          <w:sz w:val="17"/>
+        </w:rPr>
+        <w:t>2026-01-29 14:04:47-0500PM ET enumeration Running nmap script scan using script: http-put.</w:t>
+      </w:r>
+    </w:p>
+    <w:p>
+      <w:pPr>
+        <w:pStyle w:val="ActivityBullet"/>
+      </w:pPr>
+      <w:r>
+        <w:rPr>
+          <w:rFonts w:ascii="Corbel" w:hAnsi="Corbel"/>
+          <w:sz w:val="17"/>
+        </w:rPr>
+        <w:t>2026-01-29 14:04:47-0500PM ET enumeration Running nmap script scan using script: http-title.</w:t>
+      </w:r>
+    </w:p>
+    <w:p>
+      <w:pPr>
+        <w:pStyle w:val="ActivityBullet"/>
+      </w:pPr>
+      <w:r>
+        <w:rPr>
+          <w:rFonts w:ascii="Corbel" w:hAnsi="Corbel"/>
+          <w:sz w:val="17"/>
+        </w:rPr>
+        <w:t>2026-01-29 14:04:47-0500PM ET enumeration Running nmap script scan using script: http-shellshock.</w:t>
+      </w:r>
+    </w:p>
+    <w:p>
+      <w:pPr>
+        <w:pStyle w:val="ActivityBullet"/>
+      </w:pPr>
+      <w:r>
+        <w:rPr>
+          <w:rFonts w:ascii="Corbel" w:hAnsi="Corbel"/>
+          <w:sz w:val="17"/>
+        </w:rPr>
+        <w:t>2026-01-29 14:04:47-0500PM ET enumeration Running nmap script scan using script: http-methods.</w:t>
+      </w:r>
+    </w:p>
+    <w:p>
+      <w:pPr>
+        <w:pStyle w:val="ActivityBullet"/>
+      </w:pPr>
+      <w:r>
+        <w:rPr>
+          <w:rFonts w:ascii="Corbel" w:hAnsi="Corbel"/>
+          <w:sz w:val="17"/>
+        </w:rPr>
+        <w:t>2026-01-29 14:04:47-0500PM ET enumeration Running nmap script scan using script: sslv2.</w:t>
+      </w:r>
+    </w:p>
+    <w:p>
+      <w:pPr>
+        <w:pStyle w:val="ActivityBullet"/>
+      </w:pPr>
+      <w:r>
+        <w:rPr>
+          <w:rFonts w:ascii="Corbel" w:hAnsi="Corbel"/>
+          <w:sz w:val="17"/>
+        </w:rPr>
+        <w:t>2026-01-29 14:04:47-0500PM ET enumeration Running nmap script scan using script: ssl-cert.</w:t>
+      </w:r>
+    </w:p>
+    <w:p>
+      <w:pPr>
+        <w:pStyle w:val="ActivityBullet"/>
+      </w:pPr>
+      <w:r>
+        <w:rPr>
+          <w:rFonts w:ascii="Corbel" w:hAnsi="Corbel"/>
+          <w:sz w:val="17"/>
+        </w:rPr>
+        <w:t>2026-01-29 14:04:47-0500PM ET enumeration Running nmap script scan using script: ssl-enum-ciphers.</w:t>
+      </w:r>
+    </w:p>
+    <w:p>
+      <w:pPr>
+        <w:pStyle w:val="ActivityBullet"/>
+      </w:pPr>
+      <w:r>
+        <w:rPr>
+          <w:rFonts w:ascii="Corbel" w:hAnsi="Corbel"/>
+          <w:sz w:val="17"/>
+        </w:rPr>
+        <w:t>2026-01-29 14:04:47-0500PM ET enumeration Running nmap script scan using script: http-shellshock.</w:t>
+      </w:r>
+    </w:p>
+    <w:p>
+      <w:pPr>
+        <w:pStyle w:val="ActivityBullet"/>
+      </w:pPr>
+      <w:r>
+        <w:rPr>
+          <w:rFonts w:ascii="Corbel" w:hAnsi="Corbel"/>
+          <w:sz w:val="17"/>
+        </w:rPr>
+        <w:t>2026-01-29 14:04:47-0500PM ET enumeration Running nmap script scan using script: ssl-poodle.</w:t>
+      </w:r>
+    </w:p>
+    <w:p>
+      <w:pPr>
+        <w:pStyle w:val="ActivityBullet"/>
+      </w:pPr>
+      <w:r>
+        <w:rPr>
+          <w:rFonts w:ascii="Corbel" w:hAnsi="Corbel"/>
+          <w:sz w:val="17"/>
+        </w:rPr>
+        <w:t>2026-01-29 14:04:47-0500PM ET enumeration Running nmap script scan using script: http-put.</w:t>
+      </w:r>
+    </w:p>
+    <w:p>
+      <w:pPr>
+        <w:pStyle w:val="ActivityBullet"/>
+      </w:pPr>
+      <w:r>
+        <w:rPr>
+          <w:rFonts w:ascii="Corbel" w:hAnsi="Corbel"/>
+          <w:sz w:val="17"/>
+        </w:rPr>
+        <w:t>2026-01-29 14:04:47-0500PM ET enumeration Running nmap script scan using script: ssl-heartbleed.</w:t>
+      </w:r>
+    </w:p>
+    <w:p>
+      <w:pPr>
+        <w:pStyle w:val="ActivityBullet"/>
+      </w:pPr>
+      <w:r>
+        <w:rPr>
+          <w:rFonts w:ascii="Corbel" w:hAnsi="Corbel"/>
+          <w:sz w:val="17"/>
+        </w:rPr>
+        <w:t>2026-01-29 14:04:47-0500PM ET enumeration Running nmap script scan using script: http-title.</w:t>
+      </w:r>
+    </w:p>
+    <w:p>
+      <w:pPr>
+        <w:pStyle w:val="ActivityBullet"/>
+      </w:pPr>
+      <w:r>
+        <w:rPr>
+          <w:rFonts w:ascii="Corbel" w:hAnsi="Corbel"/>
+          <w:sz w:val="17"/>
+        </w:rPr>
+        <w:t>2026-01-29 14:04:47-0500PM ET enumeration Running nmap script scan using script: ssl-date.</w:t>
+      </w:r>
+    </w:p>
+    <w:p>
+      <w:pPr>
+        <w:pStyle w:val="ActivityBullet"/>
+      </w:pPr>
+      <w:r>
+        <w:rPr>
+          <w:rFonts w:ascii="Corbel" w:hAnsi="Corbel"/>
+          <w:sz w:val="17"/>
+        </w:rPr>
+        <w:t>2026-01-29 14:04:47-0500PM ET enumeration Queuing up MSF module: auxiliary/scanner/ssh/ssh_version.</w:t>
+      </w:r>
+    </w:p>
+    <w:p>
+      <w:pPr>
+        <w:pStyle w:val="ActivityBullet"/>
+      </w:pPr>
+      <w:r>
+        <w:rPr>
+          <w:rFonts w:ascii="Corbel" w:hAnsi="Corbel"/>
+          <w:sz w:val="17"/>
+        </w:rPr>
+        <w:t>2026-01-29 14:05:50-0500PM ET enumeration Completed MSF module: auxiliary/scanner/ssh/ssh_version.</w:t>
+      </w:r>
+    </w:p>
+    <w:p>
+      <w:pPr>
+        <w:pStyle w:val="ActivityBullet"/>
+      </w:pPr>
+      <w:r>
+        <w:rPr>
+          <w:rFonts w:ascii="Corbel" w:hAnsi="Corbel"/>
+          <w:sz w:val="17"/>
+        </w:rPr>
+        <w:t>2026-01-29 14:05:50-0500PM ET enumeration Completed nmap script scan using script: http-methods.</w:t>
+      </w:r>
+    </w:p>
+    <w:p>
+      <w:pPr>
+        <w:pStyle w:val="ActivityBullet"/>
+      </w:pPr>
+      <w:r>
+        <w:rPr>
+          <w:rFonts w:ascii="Corbel" w:hAnsi="Corbel"/>
+          <w:sz w:val="17"/>
+        </w:rPr>
+        <w:t>2026-01-29 14:05:50-0500PM ET enumeration Completed nmap script scan using script: ssl-enum-ciphers.</w:t>
+      </w:r>
+    </w:p>
+    <w:p>
+      <w:pPr>
+        <w:pStyle w:val="ActivityBullet"/>
+      </w:pPr>
+      <w:r>
+        <w:rPr>
+          <w:rFonts w:ascii="Corbel" w:hAnsi="Corbel"/>
+          <w:sz w:val="17"/>
+        </w:rPr>
+        <w:t>2026-01-29 14:05:50-0500PM ET enumeration Completed nmap script scan using script: http-put.</w:t>
+      </w:r>
+    </w:p>
+    <w:p>
+      <w:pPr>
+        <w:pStyle w:val="ActivityBullet"/>
+      </w:pPr>
+      <w:r>
+        <w:rPr>
+          <w:rFonts w:ascii="Corbel" w:hAnsi="Corbel"/>
+          <w:sz w:val="17"/>
+        </w:rPr>
+        <w:t>2026-01-29 14:05:50-0500PM ET enumeration Completed nmap script scan using script: http-robots.txt.</w:t>
+      </w:r>
+    </w:p>
+    <w:p>
+      <w:pPr>
+        <w:pStyle w:val="ActivityBullet"/>
+      </w:pPr>
+      <w:r>
+        <w:rPr>
+          <w:rFonts w:ascii="Corbel" w:hAnsi="Corbel"/>
+          <w:sz w:val="17"/>
+        </w:rPr>
+        <w:t>2026-01-29 14:05:50-0500PM ET enumeration Completed nmap script scan using script: ssl-heartbleed.</w:t>
+      </w:r>
+    </w:p>
+    <w:p>
+      <w:pPr>
+        <w:pStyle w:val="ActivityBullet"/>
+      </w:pPr>
+      <w:r>
+        <w:rPr>
+          <w:rFonts w:ascii="Corbel" w:hAnsi="Corbel"/>
+          <w:sz w:val="17"/>
+        </w:rPr>
+        <w:t>2026-01-29 14:05:50-0500PM ET enumeration Completed nmap script scan using script: http-shellshock.</w:t>
+      </w:r>
+    </w:p>
+    <w:p>
+      <w:pPr>
+        <w:pStyle w:val="ActivityBullet"/>
+      </w:pPr>
+      <w:r>
+        <w:rPr>
+          <w:rFonts w:ascii="Corbel" w:hAnsi="Corbel"/>
+          <w:sz w:val="17"/>
+        </w:rPr>
+        <w:t>2026-01-29 14:05:50-0500PM ET enumeration Completed nmap script scan using script: http-robots.txt.</w:t>
+      </w:r>
+    </w:p>
+    <w:p>
+      <w:pPr>
+        <w:pStyle w:val="ActivityBullet"/>
+      </w:pPr>
+      <w:r>
+        <w:rPr>
+          <w:rFonts w:ascii="Corbel" w:hAnsi="Corbel"/>
+          <w:sz w:val="17"/>
+        </w:rPr>
+        <w:t>2026-01-29 14:05:51-0500PM ET enumeration Completed nmap script scan using script: http-put.</w:t>
+      </w:r>
+    </w:p>
+    <w:p>
+      <w:pPr>
+        <w:pStyle w:val="ActivityBullet"/>
+      </w:pPr>
+      <w:r>
+        <w:rPr>
+          <w:rFonts w:ascii="Corbel" w:hAnsi="Corbel"/>
+          <w:sz w:val="17"/>
+        </w:rPr>
+        <w:t>2026-01-29 14:05:51-0500PM ET enumeration Completed nmap script scan using script: http-headers.</w:t>
+      </w:r>
+    </w:p>
+    <w:p>
+      <w:pPr>
+        <w:pStyle w:val="ActivityBullet"/>
+      </w:pPr>
+      <w:r>
+        <w:rPr>
+          <w:rFonts w:ascii="Corbel" w:hAnsi="Corbel"/>
+          <w:sz w:val="17"/>
+        </w:rPr>
+        <w:t>2026-01-29 14:05:51-0500PM ET enumeration Completed nmap script scan using script: http-methods.</w:t>
+      </w:r>
+    </w:p>
+    <w:p>
+      <w:pPr>
+        <w:pStyle w:val="ActivityBullet"/>
+      </w:pPr>
+      <w:r>
+        <w:rPr>
+          <w:rFonts w:ascii="Corbel" w:hAnsi="Corbel"/>
+          <w:sz w:val="17"/>
+        </w:rPr>
+        <w:t>2026-01-29 14:05:51-0500PM ET enumeration Completed nmap script scan using script: ssl-date.</w:t>
+      </w:r>
+    </w:p>
+    <w:p>
+      <w:pPr>
+        <w:pStyle w:val="ActivityBullet"/>
+      </w:pPr>
+      <w:r>
+        <w:rPr>
+          <w:rFonts w:ascii="Corbel" w:hAnsi="Corbel"/>
+          <w:sz w:val="17"/>
+        </w:rPr>
+        <w:t>2026-01-29 14:05:51-0500PM ET enumeration Completed nmap script scan using script: http-title.</w:t>
+      </w:r>
+    </w:p>
+    <w:p>
+      <w:pPr>
+        <w:pStyle w:val="ActivityBullet"/>
+      </w:pPr>
+      <w:r>
+        <w:rPr>
+          <w:rFonts w:ascii="Corbel" w:hAnsi="Corbel"/>
+          <w:sz w:val="17"/>
+        </w:rPr>
+        <w:t>2026-01-29 14:05:51-0500PM ET enumeration Completed nmap script scan using script: http-shellshock.</w:t>
+      </w:r>
+    </w:p>
+    <w:p>
+      <w:pPr>
+        <w:pStyle w:val="ActivityBullet"/>
         <w:rPr>
           <w:lang w:val="fr-FR"/>
         </w:rPr>
@@ -7216,35 +6674,11 @@
       </w:pPr>
       <w:r>
         <w:rPr>
-          <w:rFonts w:ascii="Corbel" w:eastAsia="Calibri" w:hAnsi="Corbel" w:cs="Arial"/>
-          <w:color w:val="404040"/>
-          <w:kern w:val="0"/>
-          <w:szCs w:val="22"/>
-          <w14:ligatures w14:val="none"/>
-        </w:rPr>
-        <w:t xml:space="preserve">The following items are the highest priority recommendations to help improve compliance, defensibility and resilience. These items may not be fully inclusive of all discovered deficiencies and reflect </w:t>
-      </w:r>
-      <w:proofErr w:type="spellStart"/>
-      <w:r>
-        <w:rPr>
-          <w:rFonts w:ascii="Corbel" w:eastAsia="Calibri" w:hAnsi="Corbel" w:cs="Arial"/>
-          <w:color w:val="404040"/>
-          <w:kern w:val="0"/>
-          <w:szCs w:val="22"/>
-          <w14:ligatures w14:val="none"/>
-        </w:rPr>
-        <w:t>orbital fire’s</w:t>
-      </w:r>
-      <w:proofErr w:type="spellEnd"/>
-      <w:r>
-        <w:rPr>
-          <w:rFonts w:ascii="Corbel" w:eastAsia="Calibri" w:hAnsi="Corbel" w:cs="Arial"/>
-          <w:color w:val="404040"/>
-          <w:kern w:val="0"/>
-          <w:szCs w:val="22"/>
-          <w14:ligatures w14:val="none"/>
-        </w:rPr>
-        <w:t xml:space="preserve"> expert opinion regarding return on investment.</w:t>
+          <w:rFonts w:ascii="Corbel" w:hAnsi="Corbel"/>
+          <w:color w:val="E6781F"/>
+          <w:sz w:val="24"/>
+        </w:rPr>
+        <w:t>The following items are the highest priority recommendations to help improve compliance, defensibility and resilience. These items may not be fully inclusive of all discovered deficiencies and reflect orbital fire’s expert opinion regarding return on investment.</w:t>
       </w:r>
     </w:p>
     <w:p>
@@ -7263,93 +6697,11 @@
       </w:pPr>
       <w:r>
         <w:rPr>
-          <w:rFonts w:ascii="Corbel" w:eastAsia="Calibri" w:hAnsi="Corbel" w:cs="Arial"/>
-          <w:noProof/>
-          <w:color w:val="404040"/>
-          <w:kern w:val="0"/>
-          <w:szCs w:val="22"/>
-          <w14:ligatures w14:val="none"/>
-        </w:rPr>
-        <w:drawing>
-          <wp:inline distT="0" distB="0" distL="0" distR="0" wp14:anchorId="65BBC86C" wp14:editId="7004CF6B">
-            <wp:extent cx="152400" cy="152400"/>
-            <wp:effectExtent l="0" t="0" r="0" b="0"/>
-            <wp:docPr id="89909448" name="Picture 89909448" descr="Fire with solid fill"/>
-            <wp:cNvGraphicFramePr>
-              <a:graphicFrameLocks xmlns:a="http://schemas.openxmlformats.org/drawingml/2006/main" noChangeAspect="1"/>
-            </wp:cNvGraphicFramePr>
-            <a:graphic xmlns:a="http://schemas.openxmlformats.org/drawingml/2006/main">
-              <a:graphicData uri="http://schemas.openxmlformats.org/drawingml/2006/picture">
-                <pic:pic xmlns:pic="http://schemas.openxmlformats.org/drawingml/2006/picture">
-                  <pic:nvPicPr>
-                    <pic:cNvPr id="0" name="Picture 23" descr="Fire with solid fill"/>
-                    <pic:cNvPicPr>
-                      <a:picLocks noChangeAspect="1" noChangeArrowheads="1"/>
-                    </pic:cNvPicPr>
-                  </pic:nvPicPr>
-                  <pic:blipFill>
-                    <a:blip r:embed="rId20" cstate="print">
-                      <a:extLst>
-                        <a:ext uri="{28A0092B-C50C-407E-A947-70E740481C1C}">
-                          <a14:useLocalDpi xmlns:a14="http://schemas.microsoft.com/office/drawing/2010/main" val="0"/>
-                        </a:ext>
-                      </a:extLst>
-                    </a:blip>
-                    <a:srcRect/>
-                    <a:stretch>
-                      <a:fillRect/>
-                    </a:stretch>
-                  </pic:blipFill>
-                  <pic:spPr bwMode="auto">
-                    <a:xfrm>
-                      <a:off x="0" y="0"/>
-                      <a:ext cx="152400" cy="152400"/>
-                    </a:xfrm>
-                    <a:prstGeom prst="rect">
-                      <a:avLst/>
-                    </a:prstGeom>
-                    <a:noFill/>
-                    <a:ln>
-                      <a:noFill/>
-                    </a:ln>
-                  </pic:spPr>
-                </pic:pic>
-              </a:graphicData>
-            </a:graphic>
-          </wp:inline>
-        </w:drawing>
-      </w:r>
-      <w:r>
-        <w:rPr>
-          <w:rFonts w:ascii="Corbel" w:eastAsia="Calibri" w:hAnsi="Corbel" w:cs="Arial"/>
-          <w:color w:val="404040"/>
-          <w:kern w:val="0"/>
-          <w:szCs w:val="22"/>
-          <w14:ligatures w14:val="none"/>
-        </w:rPr>
-        <w:t xml:space="preserve"> – </w:t>
-      </w:r>
-      <w:proofErr w:type="spellStart"/>
-      <w:r>
-        <w:rPr>
-          <w:rFonts w:ascii="Corbel" w:eastAsia="Calibri" w:hAnsi="Corbel" w:cs="Arial"/>
-          <w:color w:val="404040"/>
-          <w:kern w:val="0"/>
-          <w:szCs w:val="22"/>
-          <w14:ligatures w14:val="none"/>
-        </w:rPr>
-        <w:t>orbital fire</w:t>
-      </w:r>
-      <w:proofErr w:type="spellEnd"/>
-      <w:r>
-        <w:rPr>
-          <w:rFonts w:ascii="Corbel" w:eastAsia="Calibri" w:hAnsi="Corbel" w:cs="Arial"/>
-          <w:color w:val="404040"/>
-          <w:kern w:val="0"/>
-          <w:szCs w:val="22"/>
-          <w14:ligatures w14:val="none"/>
-        </w:rPr>
-        <w:t xml:space="preserve"> can provide complete remediation</w:t>
+          <w:rFonts w:ascii="Corbel" w:hAnsi="Corbel"/>
+          <w:color w:val="E6781F"/>
+          <w:sz w:val="24"/>
+        </w:rPr>
+        <w:t xml:space="preserve"> – orbital fire can provide complete remediation</w:t>
       </w:r>
     </w:p>
     <w:p>
@@ -7368,104 +6720,12 @@
       </w:pPr>
       <w:r>
         <w:rPr>
-          <w:rFonts w:ascii="Corbel" w:eastAsia="Calibri" w:hAnsi="Corbel" w:cs="Arial"/>
-          <w:noProof/>
-          <w:color w:val="404040"/>
-          <w:kern w:val="0"/>
-          <w:szCs w:val="22"/>
-          <w14:ligatures w14:val="none"/>
-        </w:rPr>
-        <w:drawing>
-          <wp:inline distT="0" distB="0" distL="0" distR="0" wp14:anchorId="03962334" wp14:editId="63B34A0F">
-            <wp:extent cx="152400" cy="152400"/>
-            <wp:effectExtent l="0" t="0" r="0" b="0"/>
-            <wp:docPr id="2011428596" name="Picture 2011428596" descr="Fire with solid fill"/>
-            <wp:cNvGraphicFramePr>
-              <a:graphicFrameLocks xmlns:a="http://schemas.openxmlformats.org/drawingml/2006/main" noChangeAspect="1"/>
-            </wp:cNvGraphicFramePr>
-            <a:graphic xmlns:a="http://schemas.openxmlformats.org/drawingml/2006/main">
-              <a:graphicData uri="http://schemas.openxmlformats.org/drawingml/2006/picture">
-                <pic:pic xmlns:pic="http://schemas.openxmlformats.org/drawingml/2006/picture">
-                  <pic:nvPicPr>
-                    <pic:cNvPr id="0" name="Picture 23" descr="Fire with solid fill"/>
-                    <pic:cNvPicPr>
-                      <a:picLocks noChangeAspect="1" noChangeArrowheads="1"/>
-                    </pic:cNvPicPr>
-                  </pic:nvPicPr>
-                  <pic:blipFill>
-                    <a:blip r:embed="rId21" cstate="print">
-                      <a:extLst>
-                        <a:ext uri="{BEBA8EAE-BF5A-486C-A8C5-ECC9F3942E4B}">
-                          <a14:imgProps xmlns:a14="http://schemas.microsoft.com/office/drawing/2010/main">
-                            <a14:imgLayer r:embed="rId22">
-                              <a14:imgEffect>
-                                <a14:saturation sat="0"/>
-                              </a14:imgEffect>
-                            </a14:imgLayer>
-                          </a14:imgProps>
-                        </a:ext>
-                        <a:ext uri="{28A0092B-C50C-407E-A947-70E740481C1C}">
-                          <a14:useLocalDpi xmlns:a14="http://schemas.microsoft.com/office/drawing/2010/main" val="0"/>
-                        </a:ext>
-                      </a:extLst>
-                    </a:blip>
-                    <a:srcRect/>
-                    <a:stretch>
-                      <a:fillRect/>
-                    </a:stretch>
-                  </pic:blipFill>
-                  <pic:spPr bwMode="auto">
-                    <a:xfrm>
-                      <a:off x="0" y="0"/>
-                      <a:ext cx="152400" cy="152400"/>
-                    </a:xfrm>
-                    <a:prstGeom prst="rect">
-                      <a:avLst/>
-                    </a:prstGeom>
-                    <a:noFill/>
-                    <a:ln>
-                      <a:noFill/>
-                    </a:ln>
-                  </pic:spPr>
-                </pic:pic>
-              </a:graphicData>
-            </a:graphic>
-          </wp:inline>
-        </w:drawing>
-      </w:r>
-      <w:r>
-        <w:rPr>
-          <w:rFonts w:ascii="Corbel" w:eastAsia="Calibri" w:hAnsi="Corbel" w:cs="Arial"/>
-          <w:color w:val="404040"/>
-          <w:kern w:val="0"/>
-          <w:szCs w:val="22"/>
-          <w14:ligatures w14:val="none"/>
-        </w:rPr>
-        <w:t xml:space="preserve"> – </w:t>
-      </w:r>
-      <w:proofErr w:type="spellStart"/>
-      <w:r>
-        <w:rPr>
-          <w:rFonts w:ascii="Corbel" w:eastAsia="Calibri" w:hAnsi="Corbel" w:cs="Arial"/>
-          <w:color w:val="404040"/>
-          <w:kern w:val="0"/>
-          <w:szCs w:val="22"/>
-          <w14:ligatures w14:val="none"/>
-        </w:rPr>
-        <w:t>orbital fire</w:t>
-      </w:r>
-      <w:proofErr w:type="spellEnd"/>
-      <w:r>
-        <w:rPr>
-          <w:rFonts w:ascii="Corbel" w:eastAsia="Calibri" w:hAnsi="Corbel" w:cs="Arial"/>
-          <w:color w:val="404040"/>
-          <w:kern w:val="0"/>
-          <w:szCs w:val="22"/>
-          <w14:ligatures w14:val="none"/>
-        </w:rPr>
-        <w:t xml:space="preserve"> can assist with remediation</w:t>
-      </w:r>
-      <w:bookmarkStart w:id="14" w:name="_Hlk194407007"/>
+          <w:rFonts w:ascii="Corbel" w:hAnsi="Corbel"/>
+          <w:color w:val="E6781F"/>
+          <w:sz w:val="24"/>
+        </w:rPr>
+        <w:t xml:space="preserve"> – orbital fire can assist with remediation</w:t>
+      </w:r>
     </w:p>
     <w:bookmarkEnd w:id="14"/>
     <w:p>
@@ -12016,7 +11276,7 @@
           </c:marker>
           <c:cat>
             <c:numRef>
-              <c:f>Sheet1!$A$2:$A$5</c:f>
+              <c:f>Sheet1!$A$2:$A$4</c:f>
               <c:numCache>
                 <c:formatCode>General</c:formatCode>
                 <c:ptCount val="3"/>
@@ -12034,7 +11294,7 @@
           </c:cat>
           <c:val>
             <c:numRef>
-              <c:f>Sheet1!$B$2:$B$5</c:f>
+              <c:f>Sheet1!$B$2:$B$4</c:f>
               <c:numCache>
                 <c:formatCode>General</c:formatCode>
                 <c:ptCount val="3"/>
@@ -12087,7 +11347,7 @@
           </c:marker>
           <c:cat>
             <c:numRef>
-              <c:f>Sheet1!$A$2:$A$5</c:f>
+              <c:f>Sheet1!$A$2:$A$4</c:f>
               <c:numCache>
                 <c:formatCode>General</c:formatCode>
                 <c:ptCount val="3"/>
@@ -12105,7 +11365,7 @@
           </c:cat>
           <c:val>
             <c:numRef>
-              <c:f>Sheet1!$C$2:$C$5</c:f>
+              <c:f>Sheet1!$C$2:$C$4</c:f>
               <c:numCache>
                 <c:formatCode>General</c:formatCode>
                 <c:ptCount val="3"/>
@@ -12156,7 +11416,7 @@
           </c:marker>
           <c:cat>
             <c:numRef>
-              <c:f>Sheet1!$A$2:$A$5</c:f>
+              <c:f>Sheet1!$A$2:$A$4</c:f>
               <c:numCache>
                 <c:formatCode>General</c:formatCode>
                 <c:ptCount val="3"/>
@@ -12174,7 +11434,7 @@
           </c:cat>
           <c:val>
             <c:numRef>
-              <c:f>Sheet1!$D$2:$D$5</c:f>
+              <c:f>Sheet1!$D$2:$D$4</c:f>
               <c:numCache>
                 <c:formatCode>General</c:formatCode>
                 <c:ptCount val="3"/>
@@ -12225,7 +11485,7 @@
           </c:marker>
           <c:cat>
             <c:numRef>
-              <c:f>Sheet1!$A$2:$A$5</c:f>
+              <c:f>Sheet1!$A$2:$A$4</c:f>
               <c:numCache>
                 <c:formatCode>General</c:formatCode>
                 <c:ptCount val="3"/>
@@ -12243,7 +11503,7 @@
           </c:cat>
           <c:val>
             <c:numRef>
-              <c:f>Sheet1!$E$2:$E$5</c:f>
+              <c:f>Sheet1!$E$2:$E$4</c:f>
               <c:numCache>
                 <c:formatCode>General</c:formatCode>
                 <c:ptCount val="3"/>
@@ -12294,7 +11554,7 @@
           </c:marker>
           <c:cat>
             <c:numRef>
-              <c:f>Sheet1!$A$2:$A$5</c:f>
+              <c:f>Sheet1!$A$2:$A$4</c:f>
               <c:numCache>
                 <c:formatCode>General</c:formatCode>
                 <c:ptCount val="3"/>
@@ -12312,7 +11572,7 @@
           </c:cat>
           <c:val>
             <c:numRef>
-              <c:f>Sheet1!$F$2:$F$5</c:f>
+              <c:f>Sheet1!$F$2:$F$4</c:f>
               <c:numCache>
                 <c:formatCode>General</c:formatCode>
                 <c:ptCount val="3"/>
@@ -13769,7 +13029,7 @@
               <a:ea typeface="Calibri" panose="020F0502020204030204" pitchFamily="34" charset="0"/>
               <a:cs typeface="Arial" panose="020B0604020202020204" pitchFamily="34" charset="0"/>
             </a:rPr>
-            <a:t>3</a:t>
+            <a:t>18</a:t>
           </a:r>
           <a:endParaRPr lang="en-US" sz="3000" b="1" i="0">
             <a:solidFill>

</xml_diff>

<commit_message>
Made some updates on formatting
</commit_message>
<xml_diff>
--- a/Source_Code/Reports/Sample499/FindingsReportTest.docx
+++ b/Source_Code/Reports/Sample499/FindingsReportTest.docx
@@ -600,7 +600,7 @@
           <w14:ligatures w14:val="none"/>
         </w:rPr>
         <w:drawing>
-          <wp:anchor distT="0" distB="0" distL="114300" distR="114300" simplePos="0" relativeHeight="251662336" behindDoc="0" locked="0" layoutInCell="1" allowOverlap="1" wp14:anchorId="56FF54E8" wp14:editId="702D07A6">
+          <wp:anchor distT="0" distB="0" distL="114300" distR="114300" simplePos="0" relativeHeight="251662336" behindDoc="0" locked="0" layoutInCell="1" allowOverlap="1" wp14:anchorId="56FF54E8" wp14:editId="6CF77C09">
             <wp:simplePos x="0" y="0"/>
             <wp:positionH relativeFrom="margin">
               <wp:posOffset>1163955</wp:posOffset>
@@ -1136,7 +1136,7 @@
           <w:szCs w:val="22"/>
           <w14:ligatures w14:val="none"/>
         </w:rPr>
-        <w:t>orbital fire</w:t>
+        <w:t>OrbitalFire</w:t>
       </w:r>
       <w:proofErr w:type="spellEnd"/>
       <w:r>
@@ -1190,7 +1190,7 @@
           <w:szCs w:val="22"/>
           <w14:ligatures w14:val="none"/>
         </w:rPr>
-        <w:t>orbital fire</w:t>
+        <w:t>ORBITALFIRE</w:t>
       </w:r>
       <w:r>
         <w:rPr>
@@ -2858,17 +2858,6 @@
     </w:p>
     <w:p>
       <w:pPr>
-        <w:pStyle w:val="IP"/>
-      </w:pPr>
-      <w:r>
-        <w:rPr>
-          <w:rFonts w:ascii="Corbel" w:hAnsi="Corbel"/>
-        </w:rPr>
-        <w:t>107.180.245.182</w:t>
-      </w:r>
-    </w:p>
-    <w:p>
-      <w:pPr>
         <w:numPr>
           <w:ilvl w:val="0"/>
           <w:numId w:val="7"/>
@@ -3421,13 +3410,6 @@
         </w:rPr>
         <w:t xml:space="preserve">Start Date: </w:t>
       </w:r>
-      <w:r>
-        <w:rPr>
-          <w:rFonts w:ascii="Corbel" w:hAnsi="Corbel"/>
-          <w:color w:val="F26522"/>
-        </w:rPr>
-        <w:t>January 29, 2026</w:t>
-      </w:r>
     </w:p>
     <w:p>
       <w:pPr>
@@ -3451,13 +3433,6 @@
         </w:rPr>
         <w:t xml:space="preserve">End Date: </w:t>
       </w:r>
-      <w:r>
-        <w:rPr>
-          <w:rFonts w:ascii="Corbel" w:hAnsi="Corbel"/>
-          <w:color w:val="F26522"/>
-        </w:rPr>
-        <w:t>January 29, 2026</w:t>
-      </w:r>
     </w:p>
     <w:p>
       <w:pPr>
@@ -3481,13 +3456,6 @@
         </w:rPr>
         <w:t xml:space="preserve">Escalation Contact: </w:t>
       </w:r>
-      <w:r>
-        <w:rPr>
-          <w:rFonts w:ascii="Corbel" w:hAnsi="Corbel"/>
-          <w:color w:val="F26522"/>
-        </w:rPr>
-        <w:t>Reg Harnish</w:t>
-      </w:r>
     </w:p>
     <w:p>
       <w:pPr>
@@ -3720,7 +3688,7 @@
           <w:szCs w:val="22"/>
           <w14:ligatures w14:val="none"/>
         </w:rPr>
-        <w:t>orbital fire</w:t>
+        <w:t>OrbitalFire</w:t>
       </w:r>
       <w:proofErr w:type="spellEnd"/>
       <w:r>
@@ -3822,7 +3790,7 @@
           <w:szCs w:val="22"/>
           <w14:ligatures w14:val="none"/>
         </w:rPr>
-        <w:t>orbital fire</w:t>
+        <w:t>OrbitalFire</w:t>
       </w:r>
       <w:proofErr w:type="spellEnd"/>
       <w:r>
@@ -3919,7 +3887,7 @@
           <w:szCs w:val="22"/>
           <w14:ligatures w14:val="none"/>
         </w:rPr>
-        <w:t>orbital fire</w:t>
+        <w:t>OrbitalFire</w:t>
       </w:r>
       <w:proofErr w:type="spellEnd"/>
       <w:r>
@@ -3995,7 +3963,7 @@
           <w:szCs w:val="22"/>
           <w14:ligatures w14:val="none"/>
         </w:rPr>
-        <w:t>orbital fire</w:t>
+        <w:t>OrbitalFire</w:t>
       </w:r>
       <w:proofErr w:type="spellEnd"/>
       <w:r>
@@ -4017,7 +3985,7 @@
           <w:szCs w:val="22"/>
           <w14:ligatures w14:val="none"/>
         </w:rPr>
-        <w:t>orbital fire</w:t>
+        <w:t>OrbitalFire</w:t>
       </w:r>
       <w:proofErr w:type="spellEnd"/>
       <w:r>
@@ -4038,7 +4006,7 @@
           <w:szCs w:val="22"/>
           <w14:ligatures w14:val="none"/>
         </w:rPr>
-        <w:t>orbital fire</w:t>
+        <w:t>[CUSTOMER]</w:t>
       </w:r>
       <w:r>
         <w:rPr>
@@ -4113,7 +4081,7 @@
           <w:szCs w:val="22"/>
           <w14:ligatures w14:val="none"/>
         </w:rPr>
-        <w:t>orbital fire</w:t>
+        <w:t>OrbitalFire</w:t>
       </w:r>
       <w:proofErr w:type="spellEnd"/>
       <w:r>
@@ -4218,318 +4186,6 @@
           <w14:ligatures w14:val="none"/>
         </w:rPr>
         <w:t xml:space="preserve"> </w:t>
-      </w:r>
-    </w:p>
-    <w:p>
-      <w:pPr>
-        <w:spacing w:before="120" w:after="160"/>
-      </w:pPr>
-      <w:r>
-        <w:drawing>
-          <wp:inline xmlns:a="http://schemas.openxmlformats.org/drawingml/2006/main" xmlns:pic="http://schemas.openxmlformats.org/drawingml/2006/picture">
-            <wp:extent cx="3840480" cy="3848464"/>
-            <wp:docPr id="2011428616" name="Picture 2011428616"/>
-            <wp:cNvGraphicFramePr>
-              <a:graphicFrameLocks noChangeAspect="1"/>
-            </wp:cNvGraphicFramePr>
-            <a:graphic>
-              <a:graphicData uri="http://schemas.openxmlformats.org/drawingml/2006/picture">
-                <pic:pic>
-                  <pic:nvPicPr>
-                    <pic:cNvPr id="0" name="image.png"/>
-                    <pic:cNvPicPr/>
-                  </pic:nvPicPr>
-                  <pic:blipFill>
-                    <a:blip r:embed="rId28"/>
-                    <a:stretch>
-                      <a:fillRect/>
-                    </a:stretch>
-                  </pic:blipFill>
-                  <pic:spPr>
-                    <a:xfrm>
-                      <a:off x="0" y="0"/>
-                      <a:ext cx="3840480" cy="3848464"/>
-                    </a:xfrm>
-                    <a:prstGeom prst="rect"/>
-                  </pic:spPr>
-                </pic:pic>
-              </a:graphicData>
-            </a:graphic>
-          </wp:inline>
-        </w:drawing>
-      </w:r>
-    </w:p>
-    <w:p>
-      <w:pPr>
-        <w:spacing w:before="120" w:after="160"/>
-      </w:pPr>
-      <w:r>
-        <w:drawing>
-          <wp:inline xmlns:a="http://schemas.openxmlformats.org/drawingml/2006/main" xmlns:pic="http://schemas.openxmlformats.org/drawingml/2006/picture">
-            <wp:extent cx="5486400" cy="3017520"/>
-            <wp:docPr id="2011428617" name="Picture 2011428617"/>
-            <wp:cNvGraphicFramePr>
-              <a:graphicFrameLocks noChangeAspect="1"/>
-            </wp:cNvGraphicFramePr>
-            <a:graphic>
-              <a:graphicData uri="http://schemas.openxmlformats.org/drawingml/2006/picture">
-                <pic:pic>
-                  <pic:nvPicPr>
-                    <pic:cNvPr id="0" name="image.png"/>
-                    <pic:cNvPicPr/>
-                  </pic:nvPicPr>
-                  <pic:blipFill>
-                    <a:blip r:embed="rId29"/>
-                    <a:stretch>
-                      <a:fillRect/>
-                    </a:stretch>
-                  </pic:blipFill>
-                  <pic:spPr>
-                    <a:xfrm>
-                      <a:off x="0" y="0"/>
-                      <a:ext cx="5486400" cy="3017520"/>
-                    </a:xfrm>
-                    <a:prstGeom prst="rect"/>
-                  </pic:spPr>
-                </pic:pic>
-              </a:graphicData>
-            </a:graphic>
-          </wp:inline>
-        </w:drawing>
-      </w:r>
-    </w:p>
-    <w:p>
-      <w:pPr>
-        <w:spacing w:before="120" w:after="160"/>
-      </w:pPr>
-      <w:r>
-        <w:drawing>
-          <wp:inline xmlns:a="http://schemas.openxmlformats.org/drawingml/2006/main" xmlns:pic="http://schemas.openxmlformats.org/drawingml/2006/picture">
-            <wp:extent cx="3840480" cy="3848464"/>
-            <wp:docPr id="2011428614" name="Picture 2011428614"/>
-            <wp:cNvGraphicFramePr>
-              <a:graphicFrameLocks noChangeAspect="1"/>
-            </wp:cNvGraphicFramePr>
-            <a:graphic>
-              <a:graphicData uri="http://schemas.openxmlformats.org/drawingml/2006/picture">
-                <pic:pic>
-                  <pic:nvPicPr>
-                    <pic:cNvPr id="0" name="image.png"/>
-                    <pic:cNvPicPr/>
-                  </pic:nvPicPr>
-                  <pic:blipFill>
-                    <a:blip r:embed="rId28"/>
-                    <a:stretch>
-                      <a:fillRect/>
-                    </a:stretch>
-                  </pic:blipFill>
-                  <pic:spPr>
-                    <a:xfrm>
-                      <a:off x="0" y="0"/>
-                      <a:ext cx="3840480" cy="3848464"/>
-                    </a:xfrm>
-                    <a:prstGeom prst="rect"/>
-                  </pic:spPr>
-                </pic:pic>
-              </a:graphicData>
-            </a:graphic>
-          </wp:inline>
-        </w:drawing>
-      </w:r>
-    </w:p>
-    <w:p>
-      <w:pPr>
-        <w:spacing w:before="120" w:after="160"/>
-      </w:pPr>
-      <w:r>
-        <w:drawing>
-          <wp:inline xmlns:a="http://schemas.openxmlformats.org/drawingml/2006/main" xmlns:pic="http://schemas.openxmlformats.org/drawingml/2006/picture">
-            <wp:extent cx="5486400" cy="3017520"/>
-            <wp:docPr id="2011428615" name="Picture 2011428615"/>
-            <wp:cNvGraphicFramePr>
-              <a:graphicFrameLocks noChangeAspect="1"/>
-            </wp:cNvGraphicFramePr>
-            <a:graphic>
-              <a:graphicData uri="http://schemas.openxmlformats.org/drawingml/2006/picture">
-                <pic:pic>
-                  <pic:nvPicPr>
-                    <pic:cNvPr id="0" name="image.png"/>
-                    <pic:cNvPicPr/>
-                  </pic:nvPicPr>
-                  <pic:blipFill>
-                    <a:blip r:embed="rId29"/>
-                    <a:stretch>
-                      <a:fillRect/>
-                    </a:stretch>
-                  </pic:blipFill>
-                  <pic:spPr>
-                    <a:xfrm>
-                      <a:off x="0" y="0"/>
-                      <a:ext cx="5486400" cy="3017520"/>
-                    </a:xfrm>
-                    <a:prstGeom prst="rect"/>
-                  </pic:spPr>
-                </pic:pic>
-              </a:graphicData>
-            </a:graphic>
-          </wp:inline>
-        </w:drawing>
-      </w:r>
-    </w:p>
-    <w:p>
-      <w:pPr>
-        <w:spacing w:before="120" w:after="160"/>
-      </w:pPr>
-      <w:r>
-        <w:drawing>
-          <wp:inline xmlns:a="http://schemas.openxmlformats.org/drawingml/2006/main" xmlns:pic="http://schemas.openxmlformats.org/drawingml/2006/picture">
-            <wp:extent cx="3840480" cy="3848464"/>
-            <wp:docPr id="2011428612" name="Picture 2011428612"/>
-            <wp:cNvGraphicFramePr>
-              <a:graphicFrameLocks noChangeAspect="1"/>
-            </wp:cNvGraphicFramePr>
-            <a:graphic>
-              <a:graphicData uri="http://schemas.openxmlformats.org/drawingml/2006/picture">
-                <pic:pic>
-                  <pic:nvPicPr>
-                    <pic:cNvPr id="0" name="findings_donut.png"/>
-                    <pic:cNvPicPr/>
-                  </pic:nvPicPr>
-                  <pic:blipFill>
-                    <a:blip r:embed="rId28"/>
-                    <a:stretch>
-                      <a:fillRect/>
-                    </a:stretch>
-                  </pic:blipFill>
-                  <pic:spPr>
-                    <a:xfrm>
-                      <a:off x="0" y="0"/>
-                      <a:ext cx="3840480" cy="3848464"/>
-                    </a:xfrm>
-                    <a:prstGeom prst="rect"/>
-                  </pic:spPr>
-                </pic:pic>
-              </a:graphicData>
-            </a:graphic>
-          </wp:inline>
-        </w:drawing>
-      </w:r>
-    </w:p>
-    <w:p>
-      <w:pPr>
-        <w:spacing w:before="120" w:after="160"/>
-      </w:pPr>
-      <w:r>
-        <w:drawing>
-          <wp:inline xmlns:a="http://schemas.openxmlformats.org/drawingml/2006/main" xmlns:pic="http://schemas.openxmlformats.org/drawingml/2006/picture">
-            <wp:extent cx="5486400" cy="3017520"/>
-            <wp:docPr id="2011428613" name="Picture 2011428613"/>
-            <wp:cNvGraphicFramePr>
-              <a:graphicFrameLocks noChangeAspect="1"/>
-            </wp:cNvGraphicFramePr>
-            <a:graphic>
-              <a:graphicData uri="http://schemas.openxmlformats.org/drawingml/2006/picture">
-                <pic:pic>
-                  <pic:nvPicPr>
-                    <pic:cNvPr id="0" name="findings_line.png"/>
-                    <pic:cNvPicPr/>
-                  </pic:nvPicPr>
-                  <pic:blipFill>
-                    <a:blip r:embed="rId29"/>
-                    <a:stretch>
-                      <a:fillRect/>
-                    </a:stretch>
-                  </pic:blipFill>
-                  <pic:spPr>
-                    <a:xfrm>
-                      <a:off x="0" y="0"/>
-                      <a:ext cx="5486400" cy="3017520"/>
-                    </a:xfrm>
-                    <a:prstGeom prst="rect"/>
-                  </pic:spPr>
-                </pic:pic>
-              </a:graphicData>
-            </a:graphic>
-          </wp:inline>
-        </w:drawing>
-      </w:r>
-    </w:p>
-    <w:p>
-      <w:pPr>
-        <w:spacing w:before="120" w:after="160"/>
-      </w:pPr>
-      <w:r>
-        <w:drawing>
-          <wp:inline xmlns:a="http://schemas.openxmlformats.org/drawingml/2006/main" xmlns:pic="http://schemas.openxmlformats.org/drawingml/2006/picture">
-            <wp:extent cx="3840480" cy="3848464"/>
-            <wp:docPr id="2011428610" name="Picture 2011428610"/>
-            <wp:cNvGraphicFramePr>
-              <a:graphicFrameLocks noChangeAspect="1"/>
-            </wp:cNvGraphicFramePr>
-            <a:graphic>
-              <a:graphicData uri="http://schemas.openxmlformats.org/drawingml/2006/picture">
-                <pic:pic>
-                  <pic:nvPicPr>
-                    <pic:cNvPr id="0" name="findings_donut.png"/>
-                    <pic:cNvPicPr/>
-                  </pic:nvPicPr>
-                  <pic:blipFill>
-                    <a:blip r:embed="rId26"/>
-                    <a:stretch>
-                      <a:fillRect/>
-                    </a:stretch>
-                  </pic:blipFill>
-                  <pic:spPr>
-                    <a:xfrm>
-                      <a:off x="0" y="0"/>
-                      <a:ext cx="3840480" cy="3848464"/>
-                    </a:xfrm>
-                    <a:prstGeom prst="rect"/>
-                  </pic:spPr>
-                </pic:pic>
-              </a:graphicData>
-            </a:graphic>
-          </wp:inline>
-        </w:drawing>
-      </w:r>
-    </w:p>
-    <w:p>
-      <w:pPr>
-        <w:spacing w:before="120" w:after="160"/>
-      </w:pPr>
-      <w:r>
-        <w:drawing>
-          <wp:inline xmlns:a="http://schemas.openxmlformats.org/drawingml/2006/main" xmlns:pic="http://schemas.openxmlformats.org/drawingml/2006/picture">
-            <wp:extent cx="5486400" cy="3017520"/>
-            <wp:docPr id="2011428611" name="Picture 2011428611"/>
-            <wp:cNvGraphicFramePr>
-              <a:graphicFrameLocks noChangeAspect="1"/>
-            </wp:cNvGraphicFramePr>
-            <a:graphic>
-              <a:graphicData uri="http://schemas.openxmlformats.org/drawingml/2006/picture">
-                <pic:pic>
-                  <pic:nvPicPr>
-                    <pic:cNvPr id="0" name="findings_line.png"/>
-                    <pic:cNvPicPr/>
-                  </pic:nvPicPr>
-                  <pic:blipFill>
-                    <a:blip r:embed="rId27"/>
-                    <a:stretch>
-                      <a:fillRect/>
-                    </a:stretch>
-                  </pic:blipFill>
-                  <pic:spPr>
-                    <a:xfrm>
-                      <a:off x="0" y="0"/>
-                      <a:ext cx="5486400" cy="3017520"/>
-                    </a:xfrm>
-                    <a:prstGeom prst="rect"/>
-                  </pic:spPr>
-                </pic:pic>
-              </a:graphicData>
-            </a:graphic>
-          </wp:inline>
-        </w:drawing>
       </w:r>
     </w:p>
     <w:p>
@@ -4709,7 +4365,7 @@
           <w:szCs w:val="22"/>
           <w14:ligatures w14:val="none"/>
         </w:rPr>
-        <w:t>orbital fire</w:t>
+        <w:t>OrbitalFire</w:t>
       </w:r>
       <w:proofErr w:type="spellEnd"/>
       <w:r>
@@ -4721,42 +4377,6 @@
           <w14:ligatures w14:val="none"/>
         </w:rPr>
         <w:t xml:space="preserve"> has grouped all findings from the penetration test into rollup findings. These rollup findings can be used to quickly determine the root cause of all issues identified in this assessment. It is highly recommended to implement a remediation strategy based on the rollup findings below to enhance security posture and overall defensibility.</w:t>
-      </w:r>
-    </w:p>
-    <w:p>
-      <w:r>
-        <w:rPr>
-          <w:rFonts w:ascii="Corbel" w:hAnsi="Corbel"/>
-          <w:b/>
-          <w:sz w:val="26"/>
-        </w:rPr>
-        <w:t>CONFIGURATION DEFICIENCIES</w:t>
-      </w:r>
-    </w:p>
-    <w:p>
-      <w:r>
-        <w:rPr>
-          <w:rFonts w:ascii="Corbel" w:hAnsi="Corbel"/>
-        </w:rPr>
-        <w:t>Configuration weaknesses were identified that could potentially lead to a successful compromise of systems and/or data within the tested environment. Although some of the configuration weaknesses may be exploitable in limited circumstances, the potential impact of a successful attack could be relatively high.</w:t>
-      </w:r>
-    </w:p>
-    <w:p>
-      <w:r>
-        <w:rPr>
-          <w:rFonts w:ascii="Corbel" w:hAnsi="Corbel"/>
-          <w:b/>
-          <w:sz w:val="26"/>
-        </w:rPr>
-        <w:t>INGRESS FILTERING DEFICIENCIES</w:t>
-      </w:r>
-    </w:p>
-    <w:p>
-      <w:r>
-        <w:rPr>
-          <w:rFonts w:ascii="Corbel" w:hAnsi="Corbel"/>
-        </w:rPr>
-        <w:t>The organization's network firewalls allow an excessive amount of access to services within the internal, trusted network environment. This excessive access could potentially expose the organization to attacks that are accessible due to unnecessary or misconfigured access. Services on the internal network should only be accessible to individuals and computer systems that are considered "trusted" such as through a Virtual Private Network (VPN) along with appropriate access controls.</w:t>
       </w:r>
     </w:p>
     <w:p>
@@ -4917,480 +4537,6 @@
       </w:r>
     </w:p>
     <w:p>
-      <w:r>
-        <w:rPr>
-          <w:rFonts w:ascii="Corbel" w:hAnsi="Corbel"/>
-        </w:rPr>
-        <w:t xml:space="preserve">1.    </w:t>
-      </w:r>
-      <w:r>
-        <w:rPr>
-          <w:rFonts w:ascii="Corbel" w:hAnsi="Corbel"/>
-          <w:b/>
-        </w:rPr>
-        <w:t>Subdomain Takeover Vulnerability</w:t>
-      </w:r>
-      <w:r>
-        <w:rPr>
-          <w:rFonts w:ascii="Corbel" w:hAnsi="Corbel"/>
-        </w:rPr>
-        <w:t xml:space="preserve"> - During testing, </w:t>
-      </w:r>
-      <w:proofErr w:type="spellStart"/>
-      <w:r>
-        <w:rPr>
-          <w:rFonts w:ascii="Corbel" w:hAnsi="Corbel"/>
-        </w:rPr>
-        <w:t>orbital fire</w:t>
-      </w:r>
-      <w:proofErr w:type="spellEnd"/>
-      <w:r>
-        <w:rPr>
-          <w:rFonts w:ascii="Corbel" w:hAnsi="Corbel"/>
-        </w:rPr>
-        <w:t xml:space="preserve"> identified a potential subdomain takeover vulnerability affecting one or more domains owned by orbital fire. This issue typically results from misconfigured DNS records that reference unclaimed or deprovisioned third-party services, allowing an attacker to register the external resource and gain control of the associated subdomain. If exploited, an attacker could host malicious content, impersonate the organization, conduct phishing campaigns, or collect user data, posing a significant risk to brand reputation, user trust, and overall security posture.</w:t>
-      </w:r>
-    </w:p>
-    <w:p>
-      <w:r>
-        <w:rPr>
-          <w:rFonts w:ascii="Corbel" w:hAnsi="Corbel"/>
-          <w:i/>
-        </w:rPr>
-        <w:t>Affected Nodes:</w:t>
-      </w:r>
-    </w:p>
-    <w:p>
-      <w:r>
-        <w:rPr>
-          <w:noProof/>
-        </w:rPr>
-        <w:drawing>
-          <wp:inline distT="0" distB="0" distL="0" distR="0" wp14:anchorId="733FBD03" wp14:editId="6F431CF7">
-            <wp:extent cx="5303520" cy="606845"/>
-            <wp:effectExtent l="0" t="0" r="0" b="0"/>
-            <wp:docPr id="2011428601" name="Picture 2011428601"/>
-            <wp:cNvGraphicFramePr>
-              <a:graphicFrameLocks xmlns:a="http://schemas.openxmlformats.org/drawingml/2006/main" noChangeAspect="1"/>
-            </wp:cNvGraphicFramePr>
-            <a:graphic xmlns:a="http://schemas.openxmlformats.org/drawingml/2006/main">
-              <a:graphicData uri="http://schemas.openxmlformats.org/drawingml/2006/picture">
-                <pic:pic xmlns:pic="http://schemas.openxmlformats.org/drawingml/2006/picture">
-                  <pic:nvPicPr>
-                    <pic:cNvPr id="0" name="Affected_Sample_1.png"/>
-                    <pic:cNvPicPr/>
-                  </pic:nvPicPr>
-                  <pic:blipFill>
-                    <a:blip r:embed="rId14"/>
-                    <a:stretch>
-                      <a:fillRect/>
-                    </a:stretch>
-                  </pic:blipFill>
-                  <pic:spPr>
-                    <a:xfrm>
-                      <a:off x="0" y="0"/>
-                      <a:ext cx="5303520" cy="606845"/>
-                    </a:xfrm>
-                    <a:prstGeom prst="rect">
-                      <a:avLst/>
-                    </a:prstGeom>
-                  </pic:spPr>
-                </pic:pic>
-              </a:graphicData>
-            </a:graphic>
-          </wp:inline>
-        </w:drawing>
-      </w:r>
-    </w:p>
-    <w:p>
-      <w:r>
-        <w:rPr>
-          <w:rFonts w:ascii="Corbel" w:hAnsi="Corbel"/>
-          <w:i/>
-        </w:rPr>
-        <w:t>Evidence:</w:t>
-      </w:r>
-    </w:p>
-    <w:p>
-      <w:r>
-        <w:rPr>
-          <w:noProof/>
-        </w:rPr>
-        <w:drawing>
-          <wp:inline distT="0" distB="0" distL="0" distR="0" wp14:anchorId="7CBB19C0" wp14:editId="30D7DBDA">
-            <wp:extent cx="5303520" cy="391160"/>
-            <wp:effectExtent l="0" t="0" r="0" b="0"/>
-            <wp:docPr id="2011428602" name="Picture 2011428602"/>
-            <wp:cNvGraphicFramePr>
-              <a:graphicFrameLocks xmlns:a="http://schemas.openxmlformats.org/drawingml/2006/main" noChangeAspect="1"/>
-            </wp:cNvGraphicFramePr>
-            <a:graphic xmlns:a="http://schemas.openxmlformats.org/drawingml/2006/main">
-              <a:graphicData uri="http://schemas.openxmlformats.org/drawingml/2006/picture">
-                <pic:pic xmlns:pic="http://schemas.openxmlformats.org/drawingml/2006/picture">
-                  <pic:nvPicPr>
-                    <pic:cNvPr id="0" name="Evidence_Sample_1.png"/>
-                    <pic:cNvPicPr/>
-                  </pic:nvPicPr>
-                  <pic:blipFill>
-                    <a:blip r:embed="rId15"/>
-                    <a:stretch>
-                      <a:fillRect/>
-                    </a:stretch>
-                  </pic:blipFill>
-                  <pic:spPr>
-                    <a:xfrm>
-                      <a:off x="0" y="0"/>
-                      <a:ext cx="5303520" cy="391160"/>
-                    </a:xfrm>
-                    <a:prstGeom prst="rect">
-                      <a:avLst/>
-                    </a:prstGeom>
-                  </pic:spPr>
-                </pic:pic>
-              </a:graphicData>
-            </a:graphic>
-          </wp:inline>
-        </w:drawing>
-      </w:r>
-    </w:p>
-    <w:p>
-      <w:pPr>
-        <w:keepNext/>
-        <w:keepLines/>
-        <w:spacing w:before="240" w:after="120" w:line="259" w:lineRule="auto"/>
-        <w:outlineLvl w:val="1"/>
-        <w:rPr>
-          <w:rFonts w:ascii="Handel Gothic D" w:eastAsia="DengXian Light" w:hAnsi="Handel Gothic D" w:cs="Times New Roman"/>
-          <w:b/>
-          <w:caps/>
-          <w:color w:val="FF6633"/>
-          <w:kern w:val="0"/>
-          <w:sz w:val="32"/>
-          <w:szCs w:val="26"/>
-          <w14:ligatures w14:val="none"/>
-        </w:rPr>
-      </w:pPr>
-      <w:r>
-        <w:rPr>
-          <w:rFonts w:ascii="Handel Gothic D" w:eastAsia="DengXian Light" w:hAnsi="Handel Gothic D" w:cs="Times New Roman"/>
-          <w:b/>
-          <w:caps/>
-          <w:color w:val="FF6633"/>
-          <w:kern w:val="0"/>
-          <w:sz w:val="32"/>
-          <w:szCs w:val="26"/>
-          <w14:ligatures w14:val="none"/>
-        </w:rPr>
-        <w:t>Medium</w:t>
-      </w:r>
-    </w:p>
-    <w:p>
-      <w:r>
-        <w:rPr>
-          <w:rFonts w:ascii="Corbel" w:hAnsi="Corbel"/>
-        </w:rPr>
-        <w:t xml:space="preserve">1.    </w:t>
-      </w:r>
-      <w:r>
-        <w:rPr>
-          <w:rFonts w:ascii="Corbel" w:hAnsi="Corbel"/>
-          <w:b/>
-        </w:rPr>
-        <w:t>Misconfigured DMARC Record</w:t>
-      </w:r>
-      <w:r>
-        <w:rPr>
-          <w:rFonts w:ascii="Corbel" w:hAnsi="Corbel"/>
-        </w:rPr>
-        <w:t xml:space="preserve"> - During testing, </w:t>
-      </w:r>
-      <w:proofErr w:type="spellStart"/>
-      <w:r>
-        <w:rPr>
-          <w:rFonts w:ascii="Corbel" w:hAnsi="Corbel"/>
-        </w:rPr>
-        <w:t>orbital fire</w:t>
-      </w:r>
-      <w:proofErr w:type="spellEnd"/>
-      <w:r>
-        <w:rPr>
-          <w:rFonts w:ascii="Corbel" w:hAnsi="Corbel"/>
-        </w:rPr>
-        <w:t xml:space="preserve"> identified that orbital fire has a misconfigured DMARC (Domain-based Message Authentication, Reporting, and Conformance) record for one or more of their domain(s). DMARC is critical for verifying the authenticity of emails sent from the organization, serving as a vital barrier against email spoofing and phishing attacks. Without proper configuration, DMARC fails to instruct receiving mail servers on how to treat email messages from the organization's domain, thereby increasing vulnerability to attack.</w:t>
-      </w:r>
-    </w:p>
-    <w:p>
-      <w:r>
-        <w:rPr>
-          <w:rFonts w:ascii="Corbel" w:hAnsi="Corbel"/>
-          <w:i/>
-        </w:rPr>
-        <w:t>Affected Nodes:</w:t>
-      </w:r>
-    </w:p>
-    <w:p>
-      <w:r>
-        <w:rPr>
-          <w:noProof/>
-        </w:rPr>
-        <w:drawing>
-          <wp:inline distT="0" distB="0" distL="0" distR="0" wp14:anchorId="641A12D5" wp14:editId="57517102">
-            <wp:extent cx="5303520" cy="606845"/>
-            <wp:effectExtent l="0" t="0" r="0" b="0"/>
-            <wp:docPr id="2011428603" name="Picture 2011428603"/>
-            <wp:cNvGraphicFramePr>
-              <a:graphicFrameLocks xmlns:a="http://schemas.openxmlformats.org/drawingml/2006/main" noChangeAspect="1"/>
-            </wp:cNvGraphicFramePr>
-            <a:graphic xmlns:a="http://schemas.openxmlformats.org/drawingml/2006/main">
-              <a:graphicData uri="http://schemas.openxmlformats.org/drawingml/2006/picture">
-                <pic:pic xmlns:pic="http://schemas.openxmlformats.org/drawingml/2006/picture">
-                  <pic:nvPicPr>
-                    <pic:cNvPr id="0" name="Affected_Sample_2.png"/>
-                    <pic:cNvPicPr/>
-                  </pic:nvPicPr>
-                  <pic:blipFill>
-                    <a:blip r:embed="rId16"/>
-                    <a:stretch>
-                      <a:fillRect/>
-                    </a:stretch>
-                  </pic:blipFill>
-                  <pic:spPr>
-                    <a:xfrm>
-                      <a:off x="0" y="0"/>
-                      <a:ext cx="5303520" cy="606845"/>
-                    </a:xfrm>
-                    <a:prstGeom prst="rect">
-                      <a:avLst/>
-                    </a:prstGeom>
-                  </pic:spPr>
-                </pic:pic>
-              </a:graphicData>
-            </a:graphic>
-          </wp:inline>
-        </w:drawing>
-      </w:r>
-    </w:p>
-    <w:p>
-      <w:r>
-        <w:rPr>
-          <w:rFonts w:ascii="Corbel" w:hAnsi="Corbel"/>
-          <w:i/>
-        </w:rPr>
-        <w:lastRenderedPageBreak/>
-        <w:t>Evidence:</w:t>
-      </w:r>
-    </w:p>
-    <w:p>
-      <w:r>
-        <w:rPr>
-          <w:noProof/>
-        </w:rPr>
-        <w:drawing>
-          <wp:inline distT="0" distB="0" distL="0" distR="0" wp14:anchorId="6A694EB0" wp14:editId="64FCA488">
-            <wp:extent cx="5303520" cy="289560"/>
-            <wp:effectExtent l="0" t="0" r="0" b="0"/>
-            <wp:docPr id="2011428604" name="Picture 2011428604"/>
-            <wp:cNvGraphicFramePr>
-              <a:graphicFrameLocks xmlns:a="http://schemas.openxmlformats.org/drawingml/2006/main" noChangeAspect="1"/>
-            </wp:cNvGraphicFramePr>
-            <a:graphic xmlns:a="http://schemas.openxmlformats.org/drawingml/2006/main">
-              <a:graphicData uri="http://schemas.openxmlformats.org/drawingml/2006/picture">
-                <pic:pic xmlns:pic="http://schemas.openxmlformats.org/drawingml/2006/picture">
-                  <pic:nvPicPr>
-                    <pic:cNvPr id="0" name="Evidence_Sample_2.png"/>
-                    <pic:cNvPicPr/>
-                  </pic:nvPicPr>
-                  <pic:blipFill>
-                    <a:blip r:embed="rId17"/>
-                    <a:stretch>
-                      <a:fillRect/>
-                    </a:stretch>
-                  </pic:blipFill>
-                  <pic:spPr>
-                    <a:xfrm>
-                      <a:off x="0" y="0"/>
-                      <a:ext cx="5303520" cy="289560"/>
-                    </a:xfrm>
-                    <a:prstGeom prst="rect">
-                      <a:avLst/>
-                    </a:prstGeom>
-                  </pic:spPr>
-                </pic:pic>
-              </a:graphicData>
-            </a:graphic>
-          </wp:inline>
-        </w:drawing>
-      </w:r>
-    </w:p>
-    <w:p>
-      <w:r>
-        <w:rPr>
-          <w:rFonts w:ascii="Corbel" w:hAnsi="Corbel"/>
-        </w:rPr>
-        <w:t xml:space="preserve">2.    </w:t>
-      </w:r>
-      <w:r>
-        <w:rPr>
-          <w:rFonts w:ascii="Corbel" w:hAnsi="Corbel"/>
-          <w:b/>
-        </w:rPr>
-        <w:t>Remote SSH Service Exposed to Public Internet</w:t>
-      </w:r>
-      <w:r>
-        <w:rPr>
-          <w:rFonts w:ascii="Corbel" w:hAnsi="Corbel"/>
-        </w:rPr>
-        <w:t xml:space="preserve"> - During testing, </w:t>
-      </w:r>
-      <w:proofErr w:type="spellStart"/>
-      <w:r>
-        <w:rPr>
-          <w:rFonts w:ascii="Corbel" w:hAnsi="Corbel"/>
-        </w:rPr>
-        <w:t>orbital fire</w:t>
-      </w:r>
-      <w:proofErr w:type="spellEnd"/>
-      <w:r>
-        <w:rPr>
-          <w:rFonts w:ascii="Corbel" w:hAnsi="Corbel"/>
-        </w:rPr>
-        <w:t xml:space="preserve"> identified that remote administration services, including SSH, were exposed to the public internet. This exposure is often the result of misconfiguration or insufficient access controls, which significantly increase the attack surface. Publicly accessible SSH services are susceptible to brute-force and password-guessing attacks, which may lead to unauthorized system access. Additionally, newly disclosed vulnerabilities, including zero-day exploits, could be leveraged by threat actors to further compromise exposed systems.</w:t>
-      </w:r>
-    </w:p>
-    <w:p>
-      <w:r>
-        <w:rPr>
-          <w:rFonts w:ascii="Corbel" w:hAnsi="Corbel"/>
-          <w:i/>
-        </w:rPr>
-        <w:t>Affected Nodes:</w:t>
-      </w:r>
-    </w:p>
-    <w:p>
-      <w:r>
-        <w:rPr>
-          <w:noProof/>
-        </w:rPr>
-        <w:drawing>
-          <wp:inline distT="0" distB="0" distL="0" distR="0" wp14:anchorId="4B40D324" wp14:editId="10F0EED6">
-            <wp:extent cx="5303520" cy="775129"/>
-            <wp:effectExtent l="0" t="0" r="0" b="0"/>
-            <wp:docPr id="2011428605" name="Picture 2011428605"/>
-            <wp:cNvGraphicFramePr>
-              <a:graphicFrameLocks xmlns:a="http://schemas.openxmlformats.org/drawingml/2006/main" noChangeAspect="1"/>
-            </wp:cNvGraphicFramePr>
-            <a:graphic xmlns:a="http://schemas.openxmlformats.org/drawingml/2006/main">
-              <a:graphicData uri="http://schemas.openxmlformats.org/drawingml/2006/picture">
-                <pic:pic xmlns:pic="http://schemas.openxmlformats.org/drawingml/2006/picture">
-                  <pic:nvPicPr>
-                    <pic:cNvPr id="0" name="Affected_Sample_3.png"/>
-                    <pic:cNvPicPr/>
-                  </pic:nvPicPr>
-                  <pic:blipFill>
-                    <a:blip r:embed="rId18"/>
-                    <a:stretch>
-                      <a:fillRect/>
-                    </a:stretch>
-                  </pic:blipFill>
-                  <pic:spPr>
-                    <a:xfrm>
-                      <a:off x="0" y="0"/>
-                      <a:ext cx="5303520" cy="775129"/>
-                    </a:xfrm>
-                    <a:prstGeom prst="rect">
-                      <a:avLst/>
-                    </a:prstGeom>
-                  </pic:spPr>
-                </pic:pic>
-              </a:graphicData>
-            </a:graphic>
-          </wp:inline>
-        </w:drawing>
-      </w:r>
-    </w:p>
-    <w:p>
-      <w:r>
-        <w:rPr>
-          <w:rFonts w:ascii="Corbel" w:hAnsi="Corbel"/>
-          <w:i/>
-        </w:rPr>
-        <w:t>Evidence:</w:t>
-      </w:r>
-    </w:p>
-    <w:p>
-      <w:r>
-        <w:rPr>
-          <w:noProof/>
-        </w:rPr>
-        <w:drawing>
-          <wp:inline distT="0" distB="0" distL="0" distR="0" wp14:anchorId="06074AA8" wp14:editId="60C7CA5F">
-            <wp:extent cx="5303520" cy="386080"/>
-            <wp:effectExtent l="0" t="0" r="0" b="0"/>
-            <wp:docPr id="2011428606" name="Picture 2011428606"/>
-            <wp:cNvGraphicFramePr>
-              <a:graphicFrameLocks xmlns:a="http://schemas.openxmlformats.org/drawingml/2006/main" noChangeAspect="1"/>
-            </wp:cNvGraphicFramePr>
-            <a:graphic xmlns:a="http://schemas.openxmlformats.org/drawingml/2006/main">
-              <a:graphicData uri="http://schemas.openxmlformats.org/drawingml/2006/picture">
-                <pic:pic xmlns:pic="http://schemas.openxmlformats.org/drawingml/2006/picture">
-                  <pic:nvPicPr>
-                    <pic:cNvPr id="0" name="Evidence_Sample_3.png"/>
-                    <pic:cNvPicPr/>
-                  </pic:nvPicPr>
-                  <pic:blipFill>
-                    <a:blip r:embed="rId19"/>
-                    <a:stretch>
-                      <a:fillRect/>
-                    </a:stretch>
-                  </pic:blipFill>
-                  <pic:spPr>
-                    <a:xfrm>
-                      <a:off x="0" y="0"/>
-                      <a:ext cx="5303520" cy="386080"/>
-                    </a:xfrm>
-                    <a:prstGeom prst="rect">
-                      <a:avLst/>
-                    </a:prstGeom>
-                  </pic:spPr>
-                </pic:pic>
-              </a:graphicData>
-            </a:graphic>
-          </wp:inline>
-        </w:drawing>
-      </w:r>
-    </w:p>
-    <w:p>
-      <w:pPr>
-        <w:keepNext/>
-        <w:keepLines/>
-        <w:spacing w:before="240" w:after="120" w:line="259" w:lineRule="auto"/>
-        <w:outlineLvl w:val="1"/>
-        <w:rPr>
-          <w:rFonts w:ascii="Handel Gothic D" w:eastAsia="DengXian Light" w:hAnsi="Handel Gothic D" w:cs="Times New Roman"/>
-          <w:b/>
-          <w:caps/>
-          <w:color w:val="FF6633"/>
-          <w:kern w:val="0"/>
-          <w:sz w:val="32"/>
-          <w:szCs w:val="26"/>
-          <w14:ligatures w14:val="none"/>
-        </w:rPr>
-      </w:pPr>
-      <w:r>
-        <w:rPr>
-          <w:rFonts w:ascii="Handel Gothic D" w:eastAsia="DengXian Light" w:hAnsi="Handel Gothic D" w:cs="Times New Roman"/>
-          <w:b/>
-          <w:caps/>
-          <w:color w:val="FF6633"/>
-          <w:kern w:val="0"/>
-          <w:sz w:val="32"/>
-          <w:szCs w:val="26"/>
-          <w14:ligatures w14:val="none"/>
-        </w:rPr>
-        <w:t>Low</w:t>
-      </w:r>
-    </w:p>
-    <w:p>
       <w:pPr>
         <w:numPr>
           <w:ilvl w:val="0"/>
@@ -5434,12 +4580,26 @@
           <w14:ligatures w14:val="none"/>
         </w:rPr>
       </w:pPr>
-    </w:p>
-    <w:p/>
-    <w:p/>
-    <w:p/>
-    <w:p>
-      <w:pPr>
+      <w:r>
+        <w:rPr>
+          <w:rFonts w:ascii="Handel Gothic D" w:eastAsia="DengXian Light" w:hAnsi="Handel Gothic D" w:cs="Times New Roman"/>
+          <w:b/>
+          <w:caps/>
+          <w:color w:val="FF6633"/>
+          <w:kern w:val="0"/>
+          <w:sz w:val="32"/>
+          <w:szCs w:val="26"/>
+          <w14:ligatures w14:val="none"/>
+        </w:rPr>
+        <w:t>Medium</w:t>
+      </w:r>
+    </w:p>
+    <w:p>
+      <w:pPr>
+        <w:numPr>
+          <w:ilvl w:val="0"/>
+          <w:numId w:val="11"/>
+        </w:numPr>
         <w:spacing w:line="259" w:lineRule="auto"/>
         <w:contextualSpacing/>
         <w:rPr>
@@ -5458,29 +4618,7 @@
           <w:szCs w:val="22"/>
           <w14:ligatures w14:val="none"/>
         </w:rPr>
-        <w:br/>
-      </w:r>
-    </w:p>
-    <w:p>
-      <w:pPr>
-        <w:spacing w:line="259" w:lineRule="auto"/>
-        <w:rPr>
-          <w:rFonts w:ascii="Corbel" w:eastAsia="Calibri" w:hAnsi="Corbel" w:cs="Arial"/>
-          <w:color w:val="404040"/>
-          <w:kern w:val="0"/>
-          <w:szCs w:val="22"/>
-          <w14:ligatures w14:val="none"/>
-        </w:rPr>
-      </w:pPr>
-      <w:r>
-        <w:rPr>
-          <w:rFonts w:ascii="Corbel" w:eastAsia="Calibri" w:hAnsi="Corbel" w:cs="Arial"/>
-          <w:color w:val="404040"/>
-          <w:kern w:val="0"/>
-          <w:szCs w:val="22"/>
-          <w14:ligatures w14:val="none"/>
-        </w:rPr>
-        <w:br w:type="page"/>
+        <w:t>None</w:t>
       </w:r>
     </w:p>
     <w:p>
@@ -5500,8 +4638,6 @@
           <w14:ligatures w14:val="none"/>
         </w:rPr>
       </w:pPr>
-      <w:bookmarkStart w:id="7" w:name="_Hlk190857538"/>
-      <w:bookmarkStart w:id="8" w:name="_Hlk190857520"/>
       <w:r>
         <w:rPr>
           <w:rFonts w:ascii="Handel Gothic D" w:eastAsia="DengXian Light" w:hAnsi="Handel Gothic D" w:cs="Times New Roman"/>
@@ -5511,6 +4647,132 @@
           <w:kern w:val="0"/>
           <w:sz w:val="32"/>
           <w:szCs w:val="26"/>
+          <w14:ligatures w14:val="none"/>
+        </w:rPr>
+        <w:t>Low</w:t>
+      </w:r>
+    </w:p>
+    <w:p>
+      <w:pPr>
+        <w:numPr>
+          <w:ilvl w:val="0"/>
+          <w:numId w:val="11"/>
+        </w:numPr>
+        <w:spacing w:line="259" w:lineRule="auto"/>
+        <w:contextualSpacing/>
+        <w:rPr>
+          <w:rFonts w:ascii="Corbel" w:eastAsia="Calibri" w:hAnsi="Corbel" w:cs="Arial"/>
+          <w:color w:val="404040"/>
+          <w:kern w:val="0"/>
+          <w:szCs w:val="22"/>
+          <w14:ligatures w14:val="none"/>
+        </w:rPr>
+      </w:pPr>
+      <w:r>
+        <w:rPr>
+          <w:rFonts w:ascii="Corbel" w:eastAsia="Calibri" w:hAnsi="Corbel" w:cs="Arial"/>
+          <w:color w:val="404040"/>
+          <w:kern w:val="0"/>
+          <w:szCs w:val="22"/>
+          <w14:ligatures w14:val="none"/>
+        </w:rPr>
+        <w:t>None</w:t>
+      </w:r>
+    </w:p>
+    <w:p>
+      <w:pPr>
+        <w:keepNext/>
+        <w:keepLines/>
+        <w:spacing w:before="240" w:after="120" w:line="259" w:lineRule="auto"/>
+        <w:outlineLvl w:val="1"/>
+        <w:rPr>
+          <w:rFonts w:ascii="Handel Gothic D" w:eastAsia="DengXian Light" w:hAnsi="Handel Gothic D" w:cs="Times New Roman"/>
+          <w:b/>
+          <w:caps/>
+          <w:color w:val="FF6633"/>
+          <w:kern w:val="0"/>
+          <w:sz w:val="32"/>
+          <w:szCs w:val="26"/>
+          <w14:ligatures w14:val="none"/>
+        </w:rPr>
+      </w:pPr>
+    </w:p>
+    <w:p/>
+    <w:p/>
+    <w:p/>
+    <w:p>
+      <w:pPr>
+        <w:spacing w:line="259" w:lineRule="auto"/>
+        <w:contextualSpacing/>
+        <w:rPr>
+          <w:rFonts w:ascii="Corbel" w:eastAsia="Calibri" w:hAnsi="Corbel" w:cs="Arial"/>
+          <w:color w:val="404040"/>
+          <w:kern w:val="0"/>
+          <w:szCs w:val="22"/>
+          <w14:ligatures w14:val="none"/>
+        </w:rPr>
+      </w:pPr>
+      <w:r>
+        <w:rPr>
+          <w:rFonts w:ascii="Corbel" w:eastAsia="Calibri" w:hAnsi="Corbel" w:cs="Arial"/>
+          <w:color w:val="404040"/>
+          <w:kern w:val="0"/>
+          <w:szCs w:val="22"/>
+          <w14:ligatures w14:val="none"/>
+        </w:rPr>
+        <w:br/>
+      </w:r>
+    </w:p>
+    <w:p>
+      <w:pPr>
+        <w:spacing w:line="259" w:lineRule="auto"/>
+        <w:rPr>
+          <w:rFonts w:ascii="Corbel" w:eastAsia="Calibri" w:hAnsi="Corbel" w:cs="Arial"/>
+          <w:color w:val="404040"/>
+          <w:kern w:val="0"/>
+          <w:szCs w:val="22"/>
+          <w14:ligatures w14:val="none"/>
+        </w:rPr>
+      </w:pPr>
+      <w:r>
+        <w:rPr>
+          <w:rFonts w:ascii="Corbel" w:eastAsia="Calibri" w:hAnsi="Corbel" w:cs="Arial"/>
+          <w:color w:val="404040"/>
+          <w:kern w:val="0"/>
+          <w:szCs w:val="22"/>
+          <w14:ligatures w14:val="none"/>
+        </w:rPr>
+        <w:br w:type="page"/>
+      </w:r>
+    </w:p>
+    <w:p>
+      <w:pPr>
+        <w:keepNext/>
+        <w:keepLines/>
+        <w:spacing w:before="240" w:after="120" w:line="259" w:lineRule="auto"/>
+        <w:outlineLvl w:val="1"/>
+        <w:rPr>
+          <w:rFonts w:ascii="Handel Gothic D" w:eastAsia="DengXian Light" w:hAnsi="Handel Gothic D" w:cs="Times New Roman"/>
+          <w:b/>
+          <w:caps/>
+          <w:color w:val="FF6633"/>
+          <w:kern w:val="0"/>
+          <w:sz w:val="32"/>
+          <w:szCs w:val="26"/>
+          <w14:ligatures w14:val="none"/>
+        </w:rPr>
+      </w:pPr>
+      <w:bookmarkStart w:id="7" w:name="_Hlk190857538"/>
+      <w:bookmarkStart w:id="8" w:name="_Hlk190857520"/>
+      <w:r>
+        <w:rPr>
+          <w:rFonts w:ascii="Handel Gothic D" w:eastAsia="DengXian Light" w:hAnsi="Handel Gothic D" w:cs="Times New Roman"/>
+          <w:b/>
+          <w:caps/>
+          <w:color w:val="FF6633"/>
+          <w:kern w:val="0"/>
+          <w:sz w:val="32"/>
+          <w:szCs w:val="26"/>
           <w:highlight w:val="yellow"/>
           <w14:ligatures w14:val="none"/>
         </w:rPr>
@@ -5521,13 +4783,42 @@
     </w:p>
     <w:p>
       <w:pPr>
-        <w:spacing w:before="120" w:after="160"/>
+        <w:numPr>
+          <w:ilvl w:val="0"/>
+          <w:numId w:val="13"/>
+        </w:numPr>
+        <w:spacing w:line="259" w:lineRule="auto"/>
+        <w:contextualSpacing/>
+        <w:rPr>
+          <w:rFonts w:ascii="Corbel" w:eastAsia="Calibri" w:hAnsi="Corbel" w:cs="Arial"/>
+          <w:color w:val="404040"/>
+          <w:kern w:val="0"/>
+          <w:szCs w:val="22"/>
+          <w14:ligatures w14:val="none"/>
+        </w:rPr>
+      </w:pPr>
+      <w:r>
+        <w:rPr>
+          <w:rFonts w:ascii="Corbel" w:hAnsi="Corbel"/>
+          <w:sz w:val="24"/>
+        </w:rPr>
+        <w:t>Doppelganger Domains – A Doppelganger domain is a registered domain that could</w:t>
+        <w:br/>
+        <w:t>potentially take advantage of common typing mistakes or browser assumptions. During testing against targeted domains, nine (9) doppelganger domains were discovered to be registered. CUSTOMER NAME’s network staff should review these results and determine the legitimacy of these domains.</w:t>
+        <w:br/>
+        <w:t>Reference:</w:t>
+      </w:r>
+    </w:p>
+    <w:p>
+      <w:pPr>
+        <w:spacing w:before="120" w:after="120"/>
+        <w:ind w:left="360" w:firstLine="0"/>
       </w:pPr>
       <w:r>
         <w:drawing>
           <wp:inline xmlns:a="http://schemas.openxmlformats.org/drawingml/2006/main" xmlns:pic="http://schemas.openxmlformats.org/drawingml/2006/picture">
-            <wp:extent cx="5760720" cy="1839367"/>
-            <wp:docPr id="2011428621" name="Picture 2011428621"/>
+            <wp:extent cx="5760720" cy="2110195"/>
+            <wp:docPr id="2011428597" name="Picture 2011428597"/>
             <wp:cNvGraphicFramePr>
               <a:graphicFrameLocks noChangeAspect="1"/>
             </wp:cNvGraphicFramePr>
@@ -5535,89 +4826,11 @@
               <a:graphicData uri="http://schemas.openxmlformats.org/drawingml/2006/picture">
                 <pic:pic>
                   <pic:nvPicPr>
-                    <pic:cNvPr id="0" name="image.png"/>
+                    <pic:cNvPr id="0" name="Doppelganger-Domains-Table-8.png"/>
                     <pic:cNvPicPr/>
                   </pic:nvPicPr>
                   <pic:blipFill>
-                    <a:blip r:embed="rId30"/>
-                    <a:stretch>
-                      <a:fillRect/>
-                    </a:stretch>
-                  </pic:blipFill>
-                  <pic:spPr>
-                    <a:xfrm>
-                      <a:off x="0" y="0"/>
-                      <a:ext cx="5760720" cy="1839367"/>
-                    </a:xfrm>
-                    <a:prstGeom prst="rect"/>
-                  </pic:spPr>
-                </pic:pic>
-              </a:graphicData>
-            </a:graphic>
-          </wp:inline>
-        </w:drawing>
-      </w:r>
-    </w:p>
-    <w:p>
-      <w:pPr>
-        <w:spacing w:before="120" w:after="160"/>
-      </w:pPr>
-      <w:r>
-        <w:drawing>
-          <wp:inline xmlns:a="http://schemas.openxmlformats.org/drawingml/2006/main" xmlns:pic="http://schemas.openxmlformats.org/drawingml/2006/picture">
-            <wp:extent cx="5760720" cy="1523402"/>
-            <wp:docPr id="2011428622" name="Picture 2011428622"/>
-            <wp:cNvGraphicFramePr>
-              <a:graphicFrameLocks noChangeAspect="1"/>
-            </wp:cNvGraphicFramePr>
-            <a:graphic>
-              <a:graphicData uri="http://schemas.openxmlformats.org/drawingml/2006/picture">
-                <pic:pic>
-                  <pic:nvPicPr>
-                    <pic:cNvPr id="0" name="image.png"/>
-                    <pic:cNvPicPr/>
-                  </pic:nvPicPr>
-                  <pic:blipFill>
-                    <a:blip r:embed="rId31"/>
-                    <a:stretch>
-                      <a:fillRect/>
-                    </a:stretch>
-                  </pic:blipFill>
-                  <pic:spPr>
-                    <a:xfrm>
-                      <a:off x="0" y="0"/>
-                      <a:ext cx="5760720" cy="1523402"/>
-                    </a:xfrm>
-                    <a:prstGeom prst="rect"/>
-                  </pic:spPr>
-                </pic:pic>
-              </a:graphicData>
-            </a:graphic>
-          </wp:inline>
-        </w:drawing>
-      </w:r>
-    </w:p>
-    <w:p>
-      <w:pPr>
-        <w:spacing w:before="120" w:after="160"/>
-      </w:pPr>
-      <w:r>
-        <w:drawing>
-          <wp:inline xmlns:a="http://schemas.openxmlformats.org/drawingml/2006/main" xmlns:pic="http://schemas.openxmlformats.org/drawingml/2006/picture">
-            <wp:extent cx="5760720" cy="2110195"/>
-            <wp:docPr id="2011428623" name="Picture 2011428623"/>
-            <wp:cNvGraphicFramePr>
-              <a:graphicFrameLocks noChangeAspect="1"/>
-            </wp:cNvGraphicFramePr>
-            <a:graphic>
-              <a:graphicData uri="http://schemas.openxmlformats.org/drawingml/2006/picture">
-                <pic:pic>
-                  <pic:nvPicPr>
-                    <pic:cNvPr id="0" name="image.png"/>
-                    <pic:cNvPicPr/>
-                  </pic:nvPicPr>
-                  <pic:blipFill>
-                    <a:blip r:embed="rId32"/>
+                    <a:blip r:embed="rId19"/>
                     <a:stretch>
                       <a:fillRect/>
                     </a:stretch>
@@ -5638,13 +4851,40 @@
     </w:p>
     <w:p>
       <w:pPr>
-        <w:spacing w:before="120" w:after="160"/>
+        <w:numPr>
+          <w:ilvl w:val="0"/>
+          <w:numId w:val="13"/>
+        </w:numPr>
+        <w:spacing w:line="259" w:lineRule="auto"/>
+        <w:contextualSpacing/>
+        <w:rPr>
+          <w:rFonts w:ascii="Corbel" w:eastAsia="Calibri" w:hAnsi="Corbel" w:cs="Arial"/>
+          <w:color w:val="404040"/>
+          <w:kern w:val="0"/>
+          <w:szCs w:val="22"/>
+          <w14:ligatures w14:val="none"/>
+        </w:rPr>
+      </w:pPr>
+      <w:r>
+        <w:rPr>
+          <w:rFonts w:ascii="Corbel" w:hAnsi="Corbel"/>
+          <w:sz w:val="24"/>
+        </w:rPr>
+        <w:t>Domain Information Gathering – One of the first steps from an attacker is to gather as much information as possible about the target via domain lookups, identifying subdomains and mail servers, etc. The objective of this process is to gather as much information as possible and map out the external environment of the organization, which can later be used in attacks such as social engineering. It should be noted that both the www. and non-www. versions of root domains were queried against DNS servers for information.</w:t>
+        <w:br/>
+        <w:t>Reference:</w:t>
+      </w:r>
+    </w:p>
+    <w:p>
+      <w:pPr>
+        <w:spacing w:before="120" w:after="120"/>
+        <w:ind w:left="360" w:firstLine="0"/>
       </w:pPr>
       <w:r>
         <w:drawing>
           <wp:inline xmlns:a="http://schemas.openxmlformats.org/drawingml/2006/main" xmlns:pic="http://schemas.openxmlformats.org/drawingml/2006/picture">
-            <wp:extent cx="5760720" cy="1839367"/>
-            <wp:docPr id="2011428618" name="Picture 2011428618"/>
+            <wp:extent cx="5760720" cy="1658816"/>
+            <wp:docPr id="2011428598" name="Picture 2011428598"/>
             <wp:cNvGraphicFramePr>
               <a:graphicFrameLocks noChangeAspect="1"/>
             </wp:cNvGraphicFramePr>
@@ -5652,11 +4892,11 @@
               <a:graphicData uri="http://schemas.openxmlformats.org/drawingml/2006/picture">
                 <pic:pic>
                   <pic:nvPicPr>
-                    <pic:cNvPr id="0" name="Informational6.png"/>
+                    <pic:cNvPr id="0" name="Sub-Domain-Table-6.png"/>
                     <pic:cNvPicPr/>
                   </pic:nvPicPr>
                   <pic:blipFill>
-                    <a:blip r:embed="rId30"/>
+                    <a:blip r:embed="rId20"/>
                     <a:stretch>
                       <a:fillRect/>
                     </a:stretch>
@@ -5664,7 +4904,7 @@
                   <pic:spPr>
                     <a:xfrm>
                       <a:off x="0" y="0"/>
-                      <a:ext cx="5760720" cy="1839367"/>
+                      <a:ext cx="5760720" cy="1658816"/>
                     </a:xfrm>
                     <a:prstGeom prst="rect"/>
                   </pic:spPr>
@@ -5677,13 +4917,29 @@
     </w:p>
     <w:p>
       <w:pPr>
-        <w:spacing w:before="120" w:after="160"/>
+        <w:spacing w:before="120"/>
+        <w:ind w:left="360" w:firstLine="0"/>
+      </w:pPr>
+      <w:r>
+        <w:rPr>
+          <w:rFonts w:ascii="Corbel" w:hAnsi="Corbel"/>
+          <w:sz w:val="24"/>
+        </w:rPr>
+        <w:t>Furthermore, the consultant reviewed the DNS records provided by the domains and subdomains discovered to attempt identifying if any valuable information could be obtained. No sensitive information has been discovered from this information.</w:t>
+        <w:br/>
+        <w:t>Reference:</w:t>
+      </w:r>
+    </w:p>
+    <w:p>
+      <w:pPr>
+        <w:spacing w:before="120" w:after="120"/>
+        <w:ind w:left="360" w:firstLine="0"/>
       </w:pPr>
       <w:r>
         <w:drawing>
           <wp:inline xmlns:a="http://schemas.openxmlformats.org/drawingml/2006/main" xmlns:pic="http://schemas.openxmlformats.org/drawingml/2006/picture">
-            <wp:extent cx="5760720" cy="1523402"/>
-            <wp:docPr id="2011428619" name="Picture 2011428619"/>
+            <wp:extent cx="5303520" cy="1049276"/>
+            <wp:docPr id="2011428599" name="Picture 2011428599"/>
             <wp:cNvGraphicFramePr>
               <a:graphicFrameLocks noChangeAspect="1"/>
             </wp:cNvGraphicFramePr>
@@ -5691,11 +4947,11 @@
               <a:graphicData uri="http://schemas.openxmlformats.org/drawingml/2006/picture">
                 <pic:pic>
                   <pic:nvPicPr>
-                    <pic:cNvPr id="0" name="Informational-second-6.png"/>
+                    <pic:cNvPr id="0" name="DNS-Record1.png"/>
                     <pic:cNvPicPr/>
                   </pic:nvPicPr>
                   <pic:blipFill>
-                    <a:blip r:embed="rId31"/>
+                    <a:blip r:embed="rId21"/>
                     <a:stretch>
                       <a:fillRect/>
                     </a:stretch>
@@ -5703,7 +4959,7 @@
                   <pic:spPr>
                     <a:xfrm>
                       <a:off x="0" y="0"/>
-                      <a:ext cx="5760720" cy="1523402"/>
+                      <a:ext cx="5303520" cy="1049276"/>
                     </a:xfrm>
                     <a:prstGeom prst="rect"/>
                   </pic:spPr>
@@ -5716,13 +4972,14 @@
     </w:p>
     <w:p>
       <w:pPr>
-        <w:spacing w:before="120" w:after="160"/>
+        <w:spacing w:before="120" w:after="120"/>
+        <w:ind w:left="360" w:firstLine="0"/>
       </w:pPr>
       <w:r>
         <w:drawing>
           <wp:inline xmlns:a="http://schemas.openxmlformats.org/drawingml/2006/main" xmlns:pic="http://schemas.openxmlformats.org/drawingml/2006/picture">
-            <wp:extent cx="5760720" cy="2110195"/>
-            <wp:docPr id="2011428620" name="Picture 2011428620"/>
+            <wp:extent cx="5760720" cy="2363960"/>
+            <wp:docPr id="2011428600" name="Picture 2011428600"/>
             <wp:cNvGraphicFramePr>
               <a:graphicFrameLocks noChangeAspect="1"/>
             </wp:cNvGraphicFramePr>
@@ -5730,11 +4987,11 @@
               <a:graphicData uri="http://schemas.openxmlformats.org/drawingml/2006/picture">
                 <pic:pic>
                   <pic:nvPicPr>
-                    <pic:cNvPr id="0" name="Informational8.png"/>
+                    <pic:cNvPr id="0" name="DNS-Record2.png"/>
                     <pic:cNvPicPr/>
                   </pic:nvPicPr>
                   <pic:blipFill>
-                    <a:blip r:embed="rId32"/>
+                    <a:blip r:embed="rId22"/>
                     <a:stretch>
                       <a:fillRect/>
                     </a:stretch>
@@ -5742,7 +4999,7 @@
                   <pic:spPr>
                     <a:xfrm>
                       <a:off x="0" y="0"/>
-                      <a:ext cx="5760720" cy="2110195"/>
+                      <a:ext cx="5760720" cy="2363960"/>
                     </a:xfrm>
                     <a:prstGeom prst="rect"/>
                   </pic:spPr>
@@ -5755,357 +5012,6 @@
     </w:p>
     <w:p>
       <w:pPr>
-        <w:numPr>
-          <w:ilvl w:val="0"/>
-          <w:numId w:val="13"/>
-        </w:numPr>
-        <w:spacing w:line="259" w:lineRule="auto"/>
-        <w:contextualSpacing/>
-        <w:rPr>
-          <w:rFonts w:ascii="Corbel" w:eastAsia="Calibri" w:hAnsi="Corbel" w:cs="Arial"/>
-          <w:color w:val="404040"/>
-          <w:kern w:val="0"/>
-          <w:szCs w:val="22"/>
-          <w14:ligatures w14:val="none"/>
-        </w:rPr>
-      </w:pPr>
-      <w:bookmarkStart w:id="9" w:name="_Hlk201240797"/>
-      <w:r>
-        <w:rPr>
-          <w:rFonts w:ascii="Corbel" w:eastAsia="Calibri" w:hAnsi="Corbel" w:cs="Arial"/>
-          <w:b/>
-          <w:bCs/>
-          <w:color w:val="404040"/>
-          <w:kern w:val="0"/>
-          <w:szCs w:val="22"/>
-          <w14:ligatures w14:val="none"/>
-        </w:rPr>
-        <w:t xml:space="preserve">Doppelganger Domains </w:t>
-      </w:r>
-      <w:bookmarkStart w:id="10" w:name="_Hlk207017175"/>
-      <w:r>
-        <w:rPr>
-          <w:rFonts w:ascii="Corbel" w:eastAsia="Calibri" w:hAnsi="Corbel" w:cs="Arial"/>
-          <w:b/>
-          <w:bCs/>
-          <w:color w:val="404040"/>
-          <w:kern w:val="0"/>
-          <w:szCs w:val="22"/>
-          <w14:ligatures w14:val="none"/>
-        </w:rPr>
-        <w:t>–</w:t>
-      </w:r>
-      <w:r>
-        <w:rPr>
-          <w:rFonts w:ascii="Corbel" w:eastAsia="Calibri" w:hAnsi="Corbel" w:cs="Arial"/>
-          <w:color w:val="404040"/>
-          <w:kern w:val="0"/>
-          <w:szCs w:val="22"/>
-          <w14:ligatures w14:val="none"/>
-        </w:rPr>
-        <w:t xml:space="preserve"> </w:t>
-      </w:r>
-      <w:bookmarkEnd w:id="10"/>
-      <w:r>
-        <w:rPr>
-          <w:rFonts w:ascii="Corbel" w:eastAsia="Calibri" w:hAnsi="Corbel" w:cs="Arial"/>
-          <w:color w:val="404040"/>
-          <w:kern w:val="0"/>
-          <w14:ligatures w14:val="none"/>
-        </w:rPr>
-        <w:t>A Doppelganger domain is a registered domain that could</w:t>
-      </w:r>
-      <w:r>
-        <w:rPr>
-          <w:rFonts w:ascii="Corbel" w:eastAsia="Calibri" w:hAnsi="Corbel" w:cs="Arial"/>
-          <w:color w:val="404040"/>
-          <w:kern w:val="0"/>
-          <w:szCs w:val="22"/>
-          <w14:ligatures w14:val="none"/>
-        </w:rPr>
-        <w:br/>
-      </w:r>
-      <w:r>
-        <w:rPr>
-          <w:rFonts w:ascii="Corbel" w:eastAsia="Calibri" w:hAnsi="Corbel" w:cs="Arial"/>
-          <w:color w:val="404040"/>
-          <w:kern w:val="0"/>
-          <w14:ligatures w14:val="none"/>
-        </w:rPr>
-        <w:t>potentially take advantage of common typing mistakes or browser assumptions.</w:t>
-      </w:r>
-      <w:r>
-        <w:rPr>
-          <w:rFonts w:ascii="Corbel" w:eastAsia="Calibri" w:hAnsi="Corbel" w:cs="Arial"/>
-          <w:color w:val="404040"/>
-          <w:kern w:val="0"/>
-          <w:szCs w:val="22"/>
-          <w14:ligatures w14:val="none"/>
-        </w:rPr>
-        <w:t xml:space="preserve"> During </w:t>
-      </w:r>
-      <w:bookmarkEnd w:id="9"/>
-      <w:r>
-        <w:rPr>
-          <w:rFonts w:ascii="Corbel" w:eastAsia="Calibri" w:hAnsi="Corbel" w:cs="Arial"/>
-          <w:color w:val="404040"/>
-          <w:kern w:val="0"/>
-          <w:szCs w:val="22"/>
-          <w14:ligatures w14:val="none"/>
-        </w:rPr>
-        <w:t xml:space="preserve">testing against targeted domains, </w:t>
-      </w:r>
-      <w:bookmarkStart w:id="11" w:name="_Hlk212473705"/>
-      <w:r>
-        <w:rPr>
-          <w:rFonts w:ascii="Corbel" w:eastAsia="Calibri" w:hAnsi="Corbel" w:cs="Arial"/>
-          <w:color w:val="404040"/>
-          <w:kern w:val="0"/>
-          <w:szCs w:val="22"/>
-          <w:highlight w:val="yellow"/>
-          <w14:ligatures w14:val="none"/>
-        </w:rPr>
-        <w:t>NUMBER (#)</w:t>
-      </w:r>
-      <w:r>
-        <w:rPr>
-          <w:rFonts w:ascii="Corbel" w:eastAsia="Calibri" w:hAnsi="Corbel" w:cs="Arial"/>
-          <w:color w:val="404040"/>
-          <w:kern w:val="0"/>
-          <w:szCs w:val="22"/>
-          <w14:ligatures w14:val="none"/>
-        </w:rPr>
-        <w:t xml:space="preserve"> </w:t>
-      </w:r>
-      <w:bookmarkEnd w:id="11"/>
-      <w:r>
-        <w:rPr>
-          <w:rFonts w:ascii="Corbel" w:eastAsia="Calibri" w:hAnsi="Corbel" w:cs="Arial"/>
-          <w:color w:val="404040"/>
-          <w:kern w:val="0"/>
-          <w:szCs w:val="22"/>
-          <w14:ligatures w14:val="none"/>
-        </w:rPr>
-        <w:t>doppelganger domains were discovered to be registered. CUSTOMER NAME’s network staff should review these results and determine the legitimacy of these domains.</w:t>
-      </w:r>
-      <w:r>
-        <w:rPr>
-          <w:rFonts w:ascii="Corbel" w:eastAsia="Calibri" w:hAnsi="Corbel" w:cs="Arial"/>
-          <w:color w:val="404040"/>
-          <w:kern w:val="0"/>
-          <w:szCs w:val="22"/>
-          <w14:ligatures w14:val="none"/>
-        </w:rPr>
-        <w:br/>
-      </w:r>
-      <w:r>
-        <w:rPr>
-          <w:rFonts w:ascii="Corbel" w:eastAsia="Calibri" w:hAnsi="Corbel" w:cs="Arial"/>
-          <w:i/>
-          <w:iCs/>
-          <w:color w:val="404040"/>
-          <w:kern w:val="0"/>
-          <w:szCs w:val="22"/>
-          <w14:ligatures w14:val="none"/>
-        </w:rPr>
-        <w:t>Reference:</w:t>
-      </w:r>
-      <w:r>
-        <w:rPr>
-          <w:rFonts w:ascii="Corbel" w:eastAsia="Calibri" w:hAnsi="Corbel" w:cs="Arial"/>
-          <w:noProof/>
-          <w:color w:val="404040"/>
-          <w:kern w:val="0"/>
-          <w:szCs w:val="22"/>
-          <w14:ligatures w14:val="none"/>
-        </w:rPr>
-        <w:t xml:space="preserve"> </w:t>
-      </w:r>
-      <w:r>
-        <w:rPr>
-          <w:rFonts w:ascii="Corbel" w:eastAsia="Calibri" w:hAnsi="Corbel" w:cs="Arial"/>
-          <w:color w:val="404040"/>
-          <w:kern w:val="0"/>
-          <w:szCs w:val="22"/>
-          <w14:ligatures w14:val="none"/>
-        </w:rPr>
-        <w:br/>
-      </w:r>
-      <w:r>
-        <w:rPr>
-          <w:rFonts w:ascii="Corbel" w:eastAsia="Calibri" w:hAnsi="Corbel" w:cs="Arial"/>
-          <w:noProof/>
-          <w:color w:val="404040"/>
-          <w:kern w:val="0"/>
-          <w:szCs w:val="22"/>
-          <w:highlight w:val="yellow"/>
-          <w14:ligatures w14:val="none"/>
-        </w:rPr>
-        <w:t>DOPPELGANGER DOMAINS TABLE</w:t>
-      </w:r>
-      <w:r>
-        <w:rPr>
-          <w:rFonts w:ascii="Corbel" w:eastAsia="Calibri" w:hAnsi="Corbel" w:cs="Arial"/>
-          <w:color w:val="404040"/>
-          <w:kern w:val="0"/>
-          <w:szCs w:val="22"/>
-          <w14:ligatures w14:val="none"/>
-        </w:rPr>
-        <w:br/>
-      </w:r>
-    </w:p>
-    <w:p>
-      <w:pPr>
-        <w:numPr>
-          <w:ilvl w:val="0"/>
-          <w:numId w:val="13"/>
-        </w:numPr>
-        <w:spacing w:line="259" w:lineRule="auto"/>
-        <w:contextualSpacing/>
-        <w:rPr>
-          <w:rFonts w:ascii="Corbel" w:eastAsia="Calibri" w:hAnsi="Corbel" w:cs="Arial"/>
-          <w:color w:val="404040"/>
-          <w:kern w:val="0"/>
-          <w:szCs w:val="22"/>
-          <w14:ligatures w14:val="none"/>
-        </w:rPr>
-      </w:pPr>
-      <w:r>
-        <w:rPr>
-          <w:rFonts w:ascii="Corbel" w:eastAsia="Calibri" w:hAnsi="Corbel" w:cs="Arial"/>
-          <w:b/>
-          <w:bCs/>
-          <w:color w:val="404040"/>
-          <w:kern w:val="0"/>
-          <w:szCs w:val="22"/>
-          <w14:ligatures w14:val="none"/>
-        </w:rPr>
-        <w:t>Domain Information Gathering –</w:t>
-      </w:r>
-      <w:r>
-        <w:rPr>
-          <w:rFonts w:ascii="Corbel" w:eastAsia="Calibri" w:hAnsi="Corbel" w:cs="Arial"/>
-          <w:color w:val="404040"/>
-          <w:kern w:val="0"/>
-          <w:szCs w:val="22"/>
-          <w14:ligatures w14:val="none"/>
-        </w:rPr>
-        <w:t xml:space="preserve"> One of the first steps from an attacker is to gather as much information as possible about the target via domain lookups, identifying subdomains and mail servers, etc. The objective of this process is to gather as much information as possible and map out the external environment of the organization, which can later be used in attacks such as social engineering. It should be noted that both the www. and non-www. versions of root domains were queried against DNS servers for information.</w:t>
-      </w:r>
-      <w:r>
-        <w:rPr>
-          <w:rFonts w:ascii="Corbel" w:eastAsia="Calibri" w:hAnsi="Corbel" w:cs="Arial"/>
-          <w:color w:val="404040"/>
-          <w:kern w:val="0"/>
-          <w:szCs w:val="22"/>
-          <w14:ligatures w14:val="none"/>
-        </w:rPr>
-        <w:br/>
-      </w:r>
-      <w:r>
-        <w:rPr>
-          <w:rFonts w:ascii="Corbel" w:eastAsia="Calibri" w:hAnsi="Corbel" w:cs="Arial"/>
-          <w:i/>
-          <w:iCs/>
-          <w:color w:val="404040"/>
-          <w:kern w:val="0"/>
-          <w:szCs w:val="22"/>
-          <w14:ligatures w14:val="none"/>
-        </w:rPr>
-        <w:t>Reference:</w:t>
-      </w:r>
-      <w:r>
-        <w:rPr>
-          <w:rFonts w:ascii="Corbel" w:eastAsia="Calibri" w:hAnsi="Corbel" w:cs="Arial"/>
-          <w:color w:val="404040"/>
-          <w:kern w:val="0"/>
-          <w:szCs w:val="22"/>
-          <w14:ligatures w14:val="none"/>
-        </w:rPr>
-        <w:br/>
-      </w:r>
-      <w:r>
-        <w:rPr>
-          <w:rFonts w:ascii="Corbel" w:eastAsia="Calibri" w:hAnsi="Corbel" w:cs="Arial"/>
-          <w:noProof/>
-          <w:color w:val="404040"/>
-          <w:kern w:val="0"/>
-          <w:szCs w:val="22"/>
-          <w:highlight w:val="yellow"/>
-          <w14:ligatures w14:val="none"/>
-        </w:rPr>
-        <w:t>SUB DOMAIN TABLE</w:t>
-      </w:r>
-      <w:r>
-        <w:rPr>
-          <w:rFonts w:ascii="Corbel" w:eastAsia="Calibri" w:hAnsi="Corbel" w:cs="Arial"/>
-          <w:color w:val="404040"/>
-          <w:kern w:val="0"/>
-          <w:szCs w:val="22"/>
-          <w14:ligatures w14:val="none"/>
-        </w:rPr>
-        <w:br/>
-        <w:t>Furthermore, the consultant reviewed the DNS records provided by the domains and subdomains discovered to attempt identifying if any valuable information could be obtained. No sensitive information has been discovered from this information.</w:t>
-      </w:r>
-      <w:r>
-        <w:rPr>
-          <w:rFonts w:ascii="Corbel" w:eastAsia="Calibri" w:hAnsi="Corbel" w:cs="Arial"/>
-          <w:color w:val="404040"/>
-          <w:kern w:val="0"/>
-          <w:szCs w:val="22"/>
-          <w14:ligatures w14:val="none"/>
-        </w:rPr>
-        <w:br/>
-      </w:r>
-      <w:bookmarkStart w:id="12" w:name="_Hlk212031658"/>
-      <w:r>
-        <w:rPr>
-          <w:rFonts w:ascii="Corbel" w:eastAsia="Calibri" w:hAnsi="Corbel" w:cs="Arial"/>
-          <w:i/>
-          <w:iCs/>
-          <w:color w:val="404040"/>
-          <w:kern w:val="0"/>
-          <w:szCs w:val="22"/>
-          <w14:ligatures w14:val="none"/>
-        </w:rPr>
-        <w:t>Reference:</w:t>
-      </w:r>
-      <w:r>
-        <w:rPr>
-          <w:rFonts w:ascii="Corbel" w:eastAsia="Calibri" w:hAnsi="Corbel" w:cs="Arial"/>
-          <w:color w:val="404040"/>
-          <w:kern w:val="0"/>
-          <w:szCs w:val="22"/>
-          <w14:ligatures w14:val="none"/>
-        </w:rPr>
-        <w:br/>
-      </w:r>
-      <w:r>
-        <w:rPr>
-          <w:rFonts w:ascii="Corbel" w:eastAsia="Calibri" w:hAnsi="Corbel" w:cs="Arial"/>
-          <w:noProof/>
-          <w:color w:val="404040"/>
-          <w:kern w:val="0"/>
-          <w:szCs w:val="22"/>
-          <w:highlight w:val="yellow"/>
-          <w14:ligatures w14:val="none"/>
-        </w:rPr>
-        <w:t>DNS RECORD(S) TABLE</w:t>
-      </w:r>
-      <w:bookmarkEnd w:id="12"/>
-      <w:r>
-        <w:rPr>
-          <w:rFonts w:ascii="Corbel" w:eastAsia="Calibri" w:hAnsi="Corbel" w:cs="Arial"/>
-          <w:color w:val="404040"/>
-          <w:kern w:val="0"/>
-          <w:szCs w:val="22"/>
-          <w14:ligatures w14:val="none"/>
-        </w:rPr>
-        <w:br/>
-      </w:r>
-    </w:p>
-    <w:p>
-      <w:pPr>
         <w:spacing w:line="259" w:lineRule="auto"/>
         <w:rPr>
           <w:rFonts w:ascii="Corbel" w:eastAsia="Calibri" w:hAnsi="Corbel" w:cs="Arial"/>
@@ -6164,869 +5070,6 @@
     </w:p>
     <w:p>
       <w:pPr>
-        <w:pStyle w:val="ActivityBullet"/>
-        <w:rPr>
-          <w:lang w:val="fr-FR"/>
-        </w:rPr>
-      </w:pPr>
-      <w:r>
-        <w:rPr>
-          <w:lang w:val="fr-FR"/>
-        </w:rPr>
-        <w:t>2026-01-29 13:52:47-0500PM ET exposurescout Initiating ExposureScout module.</w:t>
-      </w:r>
-    </w:p>
-    <w:p>
-      <w:pPr>
-        <w:pStyle w:val="ActivityBullet"/>
-      </w:pPr>
-      <w:r>
-        <w:t>2026-01-29 13:52:59-0500PM ET exposurescout Enumerating subdomains from one (1) domain.</w:t>
-      </w:r>
-    </w:p>
-    <w:p>
-      <w:pPr>
-        <w:pStyle w:val="ActivityBullet"/>
-        <w:rPr>
-          <w:lang w:val="fr-FR"/>
-        </w:rPr>
-      </w:pPr>
-      <w:r>
-        <w:rPr>
-          <w:lang w:val="fr-FR"/>
-        </w:rPr>
-        <w:t>2026-01-29 13:54:13-0500PM ET exposurescout Completed subdomain enumeration.</w:t>
-      </w:r>
-    </w:p>
-    <w:p>
-      <w:pPr>
-        <w:pStyle w:val="ActivityBullet"/>
-      </w:pPr>
-      <w:r>
-        <w:t>2026-01-29 13:54:13-0500PM ET exposurescout Beginning DNS enumeration.</w:t>
-      </w:r>
-    </w:p>
-    <w:p>
-      <w:pPr>
-        <w:pStyle w:val="ActivityBullet"/>
-        <w:rPr>
-          <w:lang w:val="fr-FR"/>
-        </w:rPr>
-      </w:pPr>
-      <w:r>
-        <w:rPr>
-          <w:lang w:val="fr-FR"/>
-        </w:rPr>
-        <w:t>2026-01-29 13:55:18-0500PM ET exposurescout Completed DNS enumeration.</w:t>
-      </w:r>
-    </w:p>
-    <w:p>
-      <w:pPr>
-        <w:pStyle w:val="ActivityBullet"/>
-      </w:pPr>
-      <w:r>
-        <w:t>2026-01-29 13:55:18-0500PM ET exposurescout Enumerating doppelganger domains for one (1) domain.</w:t>
-      </w:r>
-    </w:p>
-    <w:p>
-      <w:pPr>
-        <w:pStyle w:val="ActivityBullet"/>
-        <w:rPr>
-          <w:lang w:val="fr-FR"/>
-        </w:rPr>
-      </w:pPr>
-      <w:r>
-        <w:rPr>
-          <w:lang w:val="fr-FR"/>
-        </w:rPr>
-        <w:t>2026-01-29 13:56:28-0500PM ET exposurescout Ten (10) new doppelganger domains discovered.</w:t>
-      </w:r>
-    </w:p>
-    <w:p>
-      <w:pPr>
-        <w:pStyle w:val="ActivityBullet"/>
-        <w:rPr>
-          <w:lang w:val="fr-FR"/>
-        </w:rPr>
-      </w:pPr>
-      <w:r>
-        <w:rPr>
-          <w:lang w:val="fr-FR"/>
-        </w:rPr>
-        <w:t>2026-01-29 13:56:28-0500PM ET exposurescout Completed doppelganger domain enumeration.</w:t>
-      </w:r>
-    </w:p>
-    <w:p>
-      <w:pPr>
-        <w:pStyle w:val="ActivityBullet"/>
-      </w:pPr>
-      <w:r>
-        <w:t>2026-01-29 13:56:28-0500PM ET exposurescout Running WHOIS commands on eight (8) domains.</w:t>
-      </w:r>
-    </w:p>
-    <w:p>
-      <w:pPr>
-        <w:pStyle w:val="ActivityBullet"/>
-      </w:pPr>
-      <w:r>
-        <w:t>2026-01-29 13:57:33-0500PM ET exposurescout Importing eight (8) WHOIS results into the database.</w:t>
-      </w:r>
-    </w:p>
-    <w:p>
-      <w:pPr>
-        <w:pStyle w:val="ActivityBullet"/>
-      </w:pPr>
-      <w:r>
-        <w:t>2026-01-29 13:57:34-0500PM ET exposurescout Completed recursive WHOIS lookups</w:t>
-      </w:r>
-    </w:p>
-    <w:p>
-      <w:pPr>
-        <w:pStyle w:val="ActivityBullet"/>
-      </w:pPr>
-      <w:r>
-        <w:t>2026-01-29 13:57:34-0500PM ET exposurescout Email scraping module started.</w:t>
-      </w:r>
-    </w:p>
-    <w:p>
-      <w:pPr>
-        <w:pStyle w:val="ActivityBullet"/>
-      </w:pPr>
-      <w:r>
-        <w:t>2026-01-29 13:58:40-0500PM ET exposurescout Completed email scraping.</w:t>
-      </w:r>
-    </w:p>
-    <w:p>
-      <w:pPr>
-        <w:pStyle w:val="ActivityBullet"/>
-      </w:pPr>
-      <w:r>
-        <w:t>2026-01-29 13:58:40-0500PM ET exposurescout Scanning subdomains for subdomain takeover vulnerability.</w:t>
-      </w:r>
-    </w:p>
-    <w:p>
-      <w:pPr>
-        <w:pStyle w:val="ActivityBullet"/>
-      </w:pPr>
-      <w:r>
-        <w:t>2026-01-29 13:59:44-0500PM ET exposurescout Found 1 domain vulnerable to subdomain takeover.</w:t>
-      </w:r>
-    </w:p>
-    <w:p>
-      <w:pPr>
-        <w:pStyle w:val="ActivityBullet"/>
-      </w:pPr>
-      <w:r>
-        <w:t>2026-01-29 13:59:44-0500PM ET exposurescout Completed subdomain takeover checks.</w:t>
-      </w:r>
-    </w:p>
-    <w:p>
-      <w:pPr>
-        <w:pStyle w:val="ActivityBullet"/>
-        <w:rPr>
-          <w:lang w:val="fr-FR"/>
-        </w:rPr>
-      </w:pPr>
-      <w:r>
-        <w:rPr>
-          <w:lang w:val="fr-FR"/>
-        </w:rPr>
-        <w:t>2026-01-29 13:59:44-0500PM ET exposurescout ExposureScout module completed.</w:t>
-      </w:r>
-    </w:p>
-    <w:p>
-      <w:pPr>
-        <w:pStyle w:val="ActivityBullet"/>
-      </w:pPr>
-      <w:r>
-        <w:t>2026-01-29 13:59:44-0500PM ET host discovery Performing DNS resolution for 1 DNS name.</w:t>
-      </w:r>
-    </w:p>
-    <w:p>
-      <w:pPr>
-        <w:pStyle w:val="ActivityBullet"/>
-      </w:pPr>
-      <w:r>
-        <w:t>2026-01-29 14:00:50-0500PM ET host discovery DNS resolution complete.</w:t>
-      </w:r>
-    </w:p>
-    <w:p>
-      <w:pPr>
-        <w:pStyle w:val="ActivityBullet"/>
-      </w:pPr>
-      <w:r>
-        <w:t>2026-01-29 14:00:50-0500PM ET host discovery Port scan module initialized.</w:t>
-      </w:r>
-    </w:p>
-    <w:p>
-      <w:pPr>
-        <w:pStyle w:val="ActivityBullet"/>
-      </w:pPr>
-      <w:r>
-        <w:t>2026-01-29 14:00:53-0500PM ET host discovery Conducting port scan against in-scope systems.</w:t>
-      </w:r>
-    </w:p>
-    <w:p>
-      <w:pPr>
-        <w:pStyle w:val="ActivityBullet"/>
-      </w:pPr>
-      <w:r>
-        <w:t>2026-01-29 14:00:57-0500PM ET host discovery Running nmap port scans.</w:t>
-      </w:r>
-    </w:p>
-    <w:p>
-      <w:pPr>
-        <w:pStyle w:val="ActivityBullet"/>
-      </w:pPr>
-      <w:r>
-        <w:t>2026-01-29 14:02:01-0500PM ET host discovery Completed nmap port scans.</w:t>
-      </w:r>
-    </w:p>
-    <w:p>
-      <w:pPr>
-        <w:pStyle w:val="ActivityBullet"/>
-      </w:pPr>
-      <w:r>
-        <w:t>2026-01-29 14:02:01-0500PM ET host discovery Port scans completed successfully.</w:t>
-      </w:r>
-    </w:p>
-    <w:p>
-      <w:pPr>
-        <w:pStyle w:val="ActivityBullet"/>
-      </w:pPr>
-      <w:r>
-        <w:t>2026-01-29 14:02:02-0500PM ET host discovery Parsing results for alive systems.</w:t>
-      </w:r>
-    </w:p>
-    <w:p>
-      <w:pPr>
-        <w:pStyle w:val="ActivityBullet"/>
-      </w:pPr>
-      <w:r>
-        <w:t>2026-01-29 14:02:02-0500PM ET host discovery Completed parsing Nmap results. 1 new IP addresses discovered and imported into DB.</w:t>
-      </w:r>
-    </w:p>
-    <w:p>
-      <w:pPr>
-        <w:pStyle w:val="ActivityBullet"/>
-      </w:pPr>
-      <w:r>
-        <w:t>2026-01-29 14:02:02-0500PM ET host discovery Parsing nmap port scans.</w:t>
-      </w:r>
-    </w:p>
-    <w:p>
-      <w:pPr>
-        <w:pStyle w:val="ActivityBullet"/>
-      </w:pPr>
-      <w:r>
-        <w:t>2026-01-29 14:02:02-0500PM ET host discovery Completed parsing port scans. Imported 3 new ports.</w:t>
-      </w:r>
-    </w:p>
-    <w:p>
-      <w:pPr>
-        <w:pStyle w:val="ActivityBullet"/>
-      </w:pPr>
-      <w:r>
-        <w:t>2026-01-29 14:02:02-0500PM ET host discovery Port scan module completed.</w:t>
-      </w:r>
-    </w:p>
-    <w:p>
-      <w:pPr>
-        <w:pStyle w:val="ActivityBullet"/>
-      </w:pPr>
-      <w:r>
-        <w:t>2026-01-29 14:02:03-0500PM ET host discovery Discovery module completed.</w:t>
-      </w:r>
-    </w:p>
-    <w:p>
-      <w:pPr>
-        <w:pStyle w:val="ActivityBullet"/>
-      </w:pPr>
-      <w:r>
-        <w:t>2026-01-29 14:02:27-0500PM ET host discovery Running nmap port version scans.</w:t>
-      </w:r>
-    </w:p>
-    <w:p>
-      <w:pPr>
-        <w:pStyle w:val="ActivityBullet"/>
-      </w:pPr>
-      <w:r>
-        <w:t>2026-01-29 14:03:30-0500PM ET host discovery Completed nmap port version scans.</w:t>
-      </w:r>
-    </w:p>
-    <w:p>
-      <w:pPr>
-        <w:pStyle w:val="ActivityBullet"/>
-      </w:pPr>
-      <w:r>
-        <w:t>2026-01-29 14:03:35-0500PM ET enumeration Enumeration module initialized.</w:t>
-      </w:r>
-    </w:p>
-    <w:p>
-      <w:pPr>
-        <w:pStyle w:val="ActivityBullet"/>
-      </w:pPr>
-      <w:r>
-        <w:t>2026-01-29 14:04:43-0500PM ET enumeration Enumerating HTTP services.</w:t>
-      </w:r>
-    </w:p>
-    <w:p>
-      <w:pPr>
-        <w:pStyle w:val="ActivityBullet"/>
-      </w:pPr>
-      <w:r>
-        <w:t>2026-01-29 14:04:43-0500PM ET enumeration Enumerating HTTPS services.</w:t>
-      </w:r>
-    </w:p>
-    <w:p>
-      <w:pPr>
-        <w:pStyle w:val="ActivityBullet"/>
-      </w:pPr>
-      <w:r>
-        <w:t>2026-01-29 14:04:43-0500PM ET enumeration Enumerating SSH services.</w:t>
-      </w:r>
-    </w:p>
-    <w:p>
-      <w:pPr>
-        <w:pStyle w:val="ActivityBullet"/>
-      </w:pPr>
-      <w:r>
-        <w:t>2026-01-29 14:04:47-0500PM ET enumeration Running nmap script scan using script: http-headers.</w:t>
-      </w:r>
-    </w:p>
-    <w:p>
-      <w:pPr>
-        <w:pStyle w:val="ActivityBullet"/>
-      </w:pPr>
-      <w:r>
-        <w:t>2026-01-29 14:04:47-0500PM ET enumeration Running nmap script scan using script: http-methods.</w:t>
-      </w:r>
-    </w:p>
-    <w:p>
-      <w:pPr>
-        <w:pStyle w:val="ActivityBullet"/>
-      </w:pPr>
-      <w:r>
-        <w:t>2026-01-29 14:04:47-0500PM ET enumeration Running nmap script scan using script: http-headers.</w:t>
-      </w:r>
-    </w:p>
-    <w:p>
-      <w:pPr>
-        <w:pStyle w:val="ActivityBullet"/>
-      </w:pPr>
-      <w:r>
-        <w:t>2026-01-29 14:04:47-0500PM ET enumeration Running nmap script scan using script: http-robots.txt.</w:t>
-      </w:r>
-    </w:p>
-    <w:p>
-      <w:pPr>
-        <w:pStyle w:val="ActivityBullet"/>
-      </w:pPr>
-      <w:r>
-        <w:t>2026-01-29 14:04:47-0500PM ET enumeration Running nmap script scan using script: http-robots.txt.</w:t>
-      </w:r>
-    </w:p>
-    <w:p>
-      <w:pPr>
-        <w:pStyle w:val="ActivityBullet"/>
-      </w:pPr>
-      <w:r>
-        <w:t>2026-01-29 14:04:47-0500PM ET enumeration Running nmap script scan using script: http-put.</w:t>
-      </w:r>
-    </w:p>
-    <w:p>
-      <w:pPr>
-        <w:pStyle w:val="ActivityBullet"/>
-      </w:pPr>
-      <w:r>
-        <w:t>2026-01-29 14:04:47-0500PM ET enumeration Running nmap script scan using script: http-title.</w:t>
-      </w:r>
-    </w:p>
-    <w:p>
-      <w:pPr>
-        <w:pStyle w:val="ActivityBullet"/>
-      </w:pPr>
-      <w:r>
-        <w:t>2026-01-29 14:04:47-0500PM ET enumeration Running nmap script scan using script: http-shellshock.</w:t>
-      </w:r>
-    </w:p>
-    <w:p>
-      <w:pPr>
-        <w:pStyle w:val="ActivityBullet"/>
-      </w:pPr>
-      <w:r>
-        <w:t>2026-01-29 14:04:47-0500PM ET enumeration Running nmap script scan using script: http-methods.</w:t>
-      </w:r>
-    </w:p>
-    <w:p>
-      <w:pPr>
-        <w:pStyle w:val="ActivityBullet"/>
-      </w:pPr>
-      <w:r>
-        <w:t>2026-01-29 14:04:47-0500PM ET enumeration Running nmap script scan using script: sslv2.</w:t>
-      </w:r>
-    </w:p>
-    <w:p>
-      <w:pPr>
-        <w:pStyle w:val="ActivityBullet"/>
-      </w:pPr>
-      <w:r>
-        <w:t>2026-01-29 14:04:47-0500PM ET enumeration Running nmap script scan using script: ssl-cert.</w:t>
-      </w:r>
-    </w:p>
-    <w:p>
-      <w:pPr>
-        <w:pStyle w:val="ActivityBullet"/>
-      </w:pPr>
-      <w:r>
-        <w:t>2026-01-29 14:04:47-0500PM ET enumeration Running nmap script scan using script: ssl-enum-ciphers.</w:t>
-      </w:r>
-    </w:p>
-    <w:p>
-      <w:pPr>
-        <w:pStyle w:val="ActivityBullet"/>
-      </w:pPr>
-      <w:r>
-        <w:t>2026-01-29 14:04:47-0500PM ET enumeration Running nmap script scan using script: http-shellshock.</w:t>
-      </w:r>
-    </w:p>
-    <w:p>
-      <w:pPr>
-        <w:pStyle w:val="ActivityBullet"/>
-      </w:pPr>
-      <w:r>
-        <w:t>2026-01-29 14:04:47-0500PM ET enumeration Running nmap script scan using script: ssl-poodle.</w:t>
-      </w:r>
-    </w:p>
-    <w:p>
-      <w:pPr>
-        <w:pStyle w:val="ActivityBullet"/>
-      </w:pPr>
-      <w:r>
-        <w:t>2026-01-29 14:04:47-0500PM ET enumeration Running nmap script scan using script: http-put.</w:t>
-      </w:r>
-    </w:p>
-    <w:p>
-      <w:pPr>
-        <w:pStyle w:val="ActivityBullet"/>
-      </w:pPr>
-      <w:r>
-        <w:t>2026-01-29 14:04:47-0500PM ET enumeration Running nmap script scan using script: ssl-heartbleed.</w:t>
-      </w:r>
-    </w:p>
-    <w:p>
-      <w:pPr>
-        <w:pStyle w:val="ActivityBullet"/>
-      </w:pPr>
-      <w:r>
-        <w:t>2026-01-29 14:04:47-0500PM ET enumeration Running nmap script scan using script: http-title.</w:t>
-      </w:r>
-    </w:p>
-    <w:p>
-      <w:pPr>
-        <w:pStyle w:val="ActivityBullet"/>
-      </w:pPr>
-      <w:r>
-        <w:t>2026-01-29 14:04:47-0500PM ET enumeration Running nmap script scan using script: ssl-date.</w:t>
-      </w:r>
-    </w:p>
-    <w:p>
-      <w:pPr>
-        <w:pStyle w:val="ActivityBullet"/>
-      </w:pPr>
-      <w:r>
-        <w:t>2026-01-29 14:04:47-0500PM ET enumeration Queuing up MSF module: auxiliary/scanner/ssh/ssh_version.</w:t>
-      </w:r>
-    </w:p>
-    <w:p>
-      <w:pPr>
-        <w:pStyle w:val="ActivityBullet"/>
-      </w:pPr>
-      <w:r>
-        <w:t>2026-01-29 14:05:50-0500PM ET enumeration Completed MSF module: auxiliary/scanner/ssh/ssh_version.</w:t>
-      </w:r>
-    </w:p>
-    <w:p>
-      <w:pPr>
-        <w:pStyle w:val="ActivityBullet"/>
-      </w:pPr>
-      <w:r>
-        <w:lastRenderedPageBreak/>
-        <w:t>2026-01-29 14:05:50-0500PM ET enumeration Completed nmap script scan using script: http-methods.</w:t>
-      </w:r>
-    </w:p>
-    <w:p>
-      <w:pPr>
-        <w:pStyle w:val="ActivityBullet"/>
-      </w:pPr>
-      <w:r>
-        <w:t>2026-01-29 14:05:50-0500PM ET enumeration Completed nmap script scan using script: ssl-enum-ciphers.</w:t>
-      </w:r>
-    </w:p>
-    <w:p>
-      <w:pPr>
-        <w:pStyle w:val="ActivityBullet"/>
-      </w:pPr>
-      <w:r>
-        <w:t>2026-01-29 14:05:50-0500PM ET enumeration Completed nmap script scan using script: http-put.</w:t>
-      </w:r>
-    </w:p>
-    <w:p>
-      <w:pPr>
-        <w:pStyle w:val="ActivityBullet"/>
-      </w:pPr>
-      <w:r>
-        <w:t>2026-01-29 14:05:50-0500PM ET enumeration Completed nmap script scan using script: http-robots.txt.</w:t>
-      </w:r>
-    </w:p>
-    <w:p>
-      <w:pPr>
-        <w:pStyle w:val="ActivityBullet"/>
-      </w:pPr>
-      <w:r>
-        <w:t>2026-01-29 14:05:50-0500PM ET enumeration Completed nmap script scan using script: ssl-heartbleed.</w:t>
-      </w:r>
-    </w:p>
-    <w:p>
-      <w:pPr>
-        <w:pStyle w:val="ActivityBullet"/>
-      </w:pPr>
-      <w:r>
-        <w:t>2026-01-29 14:05:50-0500PM ET enumeration Completed nmap script scan using script: http-shellshock.</w:t>
-      </w:r>
-    </w:p>
-    <w:p>
-      <w:pPr>
-        <w:pStyle w:val="ActivityBullet"/>
-      </w:pPr>
-      <w:r>
-        <w:t>2026-01-29 14:05:50-0500PM ET enumeration Completed nmap script scan using script: http-robots.txt.</w:t>
-      </w:r>
-    </w:p>
-    <w:p>
-      <w:pPr>
-        <w:pStyle w:val="ActivityBullet"/>
-      </w:pPr>
-      <w:r>
-        <w:t>2026-01-29 14:05:51-0500PM ET enumeration Completed nmap script scan using script: http-put.</w:t>
-      </w:r>
-    </w:p>
-    <w:p>
-      <w:pPr>
-        <w:pStyle w:val="ActivityBullet"/>
-      </w:pPr>
-      <w:r>
-        <w:t>2026-01-29 14:05:51-0500PM ET enumeration Completed nmap script scan using script: http-headers.</w:t>
-      </w:r>
-    </w:p>
-    <w:p>
-      <w:pPr>
-        <w:pStyle w:val="ActivityBullet"/>
-      </w:pPr>
-      <w:r>
-        <w:t>2026-01-29 14:05:51-0500PM ET enumeration Completed nmap script scan using script: http-methods.</w:t>
-      </w:r>
-    </w:p>
-    <w:p>
-      <w:pPr>
-        <w:pStyle w:val="ActivityBullet"/>
-      </w:pPr>
-      <w:r>
-        <w:t>2026-01-29 14:05:51-0500PM ET enumeration Completed nmap script scan using script: ssl-date.</w:t>
-      </w:r>
-    </w:p>
-    <w:p>
-      <w:pPr>
-        <w:pStyle w:val="ActivityBullet"/>
-      </w:pPr>
-      <w:r>
-        <w:t>2026-01-29 14:05:51-0500PM ET enumeration Completed nmap script scan using script: http-title.</w:t>
-      </w:r>
-    </w:p>
-    <w:p>
-      <w:pPr>
-        <w:pStyle w:val="ActivityBullet"/>
-      </w:pPr>
-      <w:r>
-        <w:t>2026-01-29 14:05:51-0500PM ET enumeration Completed nmap script scan using script: http-shellshock.</w:t>
-      </w:r>
-    </w:p>
-    <w:p>
-      <w:pPr>
-        <w:pStyle w:val="ActivityBullet"/>
-      </w:pPr>
-      <w:r>
-        <w:t>2026-01-29 14:05:51-0500PM ET enumeration Completed nmap script scan using script: http-headers.</w:t>
-      </w:r>
-    </w:p>
-    <w:p>
-      <w:pPr>
-        <w:pStyle w:val="ActivityBullet"/>
-      </w:pPr>
-      <w:r>
-        <w:t>2026-01-29 14:05:51-0500PM ET enumeration Completed nmap script scan using script: ssl-poodle.</w:t>
-      </w:r>
-    </w:p>
-    <w:p>
-      <w:pPr>
-        <w:pStyle w:val="ActivityBullet"/>
-      </w:pPr>
-      <w:r>
-        <w:t>2026-01-29 14:05:51-0500PM ET enumeration Completed nmap script scan using script: ssl-cert.</w:t>
-      </w:r>
-    </w:p>
-    <w:p>
-      <w:pPr>
-        <w:pStyle w:val="ActivityBullet"/>
-      </w:pPr>
-      <w:r>
-        <w:t>2026-01-29 14:05:51-0500PM ET enumeration Completed nmap script scan using script: sslv2.</w:t>
-      </w:r>
-    </w:p>
-    <w:p>
-      <w:pPr>
-        <w:pStyle w:val="ActivityBullet"/>
-      </w:pPr>
-      <w:r>
-        <w:t>2026-01-29 14:05:51-0500PM ET enumeration Completed nmap script scan using script: http-title.</w:t>
-      </w:r>
-    </w:p>
-    <w:p>
-      <w:pPr>
-        <w:pStyle w:val="ActivityBullet"/>
-      </w:pPr>
-      <w:r>
-        <w:t>2026-01-29 14:05:51-0500PM ET enumeration Peforming a hidden directory enumeration attack on 80/tcp.</w:t>
-      </w:r>
-    </w:p>
-    <w:p>
-      <w:pPr>
-        <w:pStyle w:val="ActivityBullet"/>
-      </w:pPr>
-      <w:r>
-        <w:t>2026-01-29 14:05:54-0500PM ET enumeration Running nmap script scan using script: sshv1.</w:t>
-      </w:r>
-    </w:p>
-    <w:p>
-      <w:pPr>
-        <w:pStyle w:val="ActivityBullet"/>
-      </w:pPr>
-      <w:r>
-        <w:t>2026-01-29 14:05:54-0500PM ET enumeration Running nmap script scan using script: ssh2-enum-algos.</w:t>
-      </w:r>
-    </w:p>
-    <w:p>
-      <w:pPr>
-        <w:pStyle w:val="ActivityBullet"/>
-      </w:pPr>
-      <w:r>
-        <w:t>2026-01-29 14:05:54-0500PM ET enumeration Running nmap script scan using script: ssh-auth-methods.</w:t>
-      </w:r>
-    </w:p>
-    <w:p>
-      <w:pPr>
-        <w:pStyle w:val="ActivityBullet"/>
-        <w:rPr>
-          <w:lang w:val="fr-FR"/>
-        </w:rPr>
-      </w:pPr>
-      <w:r>
-        <w:rPr>
-          <w:lang w:val="fr-FR"/>
-        </w:rPr>
-        <w:t>2026-01-29 14:05:54-0500PM ET enumeration Analyzing SSL/TLS protocols on port 443/tcp.</w:t>
-      </w:r>
-    </w:p>
-    <w:p>
-      <w:pPr>
-        <w:pStyle w:val="ActivityBullet"/>
-      </w:pPr>
-      <w:r>
-        <w:t>2026-01-29 14:06:55-0500PM ET enumeration Completed SSL/TLS analysis on ports 443/tcp.</w:t>
-      </w:r>
-    </w:p>
-    <w:p>
-      <w:pPr>
-        <w:pStyle w:val="ActivityBullet"/>
-      </w:pPr>
-      <w:r>
-        <w:t>2026-01-29 14:06:55-0500PM ET enumeration Completed hidden directory enumeration scan.</w:t>
-      </w:r>
-    </w:p>
-    <w:p>
-      <w:pPr>
-        <w:pStyle w:val="ActivityBullet"/>
-      </w:pPr>
-      <w:r>
-        <w:t>2026-01-29 14:06:55-0500PM ET enumeration Peforming a hidden directory enumeration attack on 443/tcp.</w:t>
-      </w:r>
-    </w:p>
-    <w:p>
-      <w:pPr>
-        <w:pStyle w:val="ActivityBullet"/>
-      </w:pPr>
-      <w:r>
-        <w:t>2026-01-29 14:06:55-0500PM ET enumeration Completed nmap script scan using script: ssh2-enum-algos.</w:t>
-      </w:r>
-    </w:p>
-    <w:p>
-      <w:pPr>
-        <w:pStyle w:val="ActivityBullet"/>
-      </w:pPr>
-      <w:r>
-        <w:t>2026-01-29 14:06:55-0500PM ET enumeration Completed nmap script scan using script: ssh-auth-methods.</w:t>
-      </w:r>
-    </w:p>
-    <w:p>
-      <w:pPr>
-        <w:pStyle w:val="ActivityBullet"/>
-      </w:pPr>
-      <w:r>
-        <w:t>2026-01-29 14:06:55-0500PM ET enumeration Completed nmap script scan using script: sshv1.</w:t>
-      </w:r>
-    </w:p>
-    <w:p>
-      <w:pPr>
-        <w:pStyle w:val="ActivityBullet"/>
-      </w:pPr>
-      <w:r>
-        <w:t>2026-01-29 14:06:55-0500PM ET enumeration Completed enumerating SSH services.</w:t>
-      </w:r>
-    </w:p>
-    <w:p>
-      <w:pPr>
-        <w:pStyle w:val="ActivityBullet"/>
-      </w:pPr>
-      <w:r>
-        <w:t>2026-01-29 14:06:58-0500PM ET enumeration Analyzing web services running on port 80/tcp.</w:t>
-      </w:r>
-    </w:p>
-    <w:p>
-      <w:pPr>
-        <w:pStyle w:val="ActivityBullet"/>
-      </w:pPr>
-      <w:r>
-        <w:t>2026-01-29 14:08:10-0500PM ET enumeration Completed analyzing web services running on port 80/tcp.</w:t>
-      </w:r>
-    </w:p>
-    <w:p>
-      <w:pPr>
-        <w:pStyle w:val="ActivityBullet"/>
-      </w:pPr>
-      <w:r>
-        <w:t>2026-01-29 14:08:10-0500PM ET enumeration Completed hidden directory enumeration scan.</w:t>
-      </w:r>
-    </w:p>
-    <w:p>
-      <w:pPr>
-        <w:pStyle w:val="ActivityBullet"/>
-      </w:pPr>
-      <w:r>
-        <w:t>2026-01-29 14:08:10-0500PM ET enumeration Completed analyzing web services running on port 80/tcp.</w:t>
-      </w:r>
-    </w:p>
-    <w:p>
-      <w:pPr>
-        <w:pStyle w:val="ActivityBullet"/>
-      </w:pPr>
-      <w:r>
-        <w:t>2026-01-29 14:08:10-0500PM ET enumeration Completed enumerating HTTP services.</w:t>
-      </w:r>
-    </w:p>
-    <w:p>
-      <w:pPr>
-        <w:pStyle w:val="ActivityBullet"/>
-      </w:pPr>
-      <w:r>
-        <w:t>2026-01-29 14:08:13-0500PM ET enumeration Analyzing web services running on port 443/tcp.</w:t>
-      </w:r>
-    </w:p>
-    <w:p>
-      <w:pPr>
-        <w:pStyle w:val="ActivityBullet"/>
-      </w:pPr>
-      <w:r>
-        <w:t>2026-01-29 14:09:15-0500PM ET enumeration Completed analyzing web services running on port 443/tcp.</w:t>
-      </w:r>
-    </w:p>
-    <w:p>
-      <w:pPr>
-        <w:pStyle w:val="ActivityBullet"/>
-      </w:pPr>
-      <w:r>
-        <w:t>2026-01-29 14:09:15-0500PM ET enumeration Completed analyzing web services running on port 443/tcp.</w:t>
-      </w:r>
-    </w:p>
-    <w:p>
-      <w:pPr>
-        <w:pStyle w:val="ActivityBullet"/>
-      </w:pPr>
-      <w:r>
-        <w:t>2026-01-29 14:09:16-0500PM ET enumeration Completed enumerating HTTPS services.</w:t>
-      </w:r>
-    </w:p>
-    <w:p>
-      <w:pPr>
-        <w:pStyle w:val="ActivityBullet"/>
-      </w:pPr>
-      <w:r>
-        <w:t>2026-01-29 14:09:45-0500PM ET enumeration Enumeration module completed.</w:t>
-      </w:r>
-    </w:p>
-    <w:p>
-      <w:pPr>
-        <w:pStyle w:val="ActivityBullet"/>
-        <w:rPr>
-          <w:lang w:val="fr-FR"/>
-        </w:rPr>
-      </w:pPr>
-      <w:r>
-        <w:rPr>
-          <w:lang w:val="fr-FR"/>
-        </w:rPr>
-        <w:t>2026-01-29 14:10:06-0500PM ET exploit Launching exploit module.</w:t>
-      </w:r>
-    </w:p>
-    <w:p>
-      <w:pPr>
-        <w:pStyle w:val="ActivityBullet"/>
-      </w:pPr>
-      <w:r>
-        <w:t>2026-01-29 14:10:11-0500PM ET exploit Queuing up hydra attack: SSH password attack.</w:t>
-      </w:r>
-    </w:p>
-    <w:p>
-      <w:pPr>
-        <w:pStyle w:val="ActivityBullet"/>
-      </w:pPr>
-      <w:r>
-        <w:t>2026-01-29 14:11:16-0500PM ET exploit Completed hydra attack: SSH password attack.</w:t>
-      </w:r>
-    </w:p>
-    <w:p>
-      <w:pPr>
-        <w:pStyle w:val="ActivityBullet"/>
-      </w:pPr>
-      <w:r>
-        <w:t>2026-01-29 14:11:16-0500PM ET exploit Completed SSH password attack.</w:t>
-      </w:r>
-    </w:p>
-    <w:p>
-      <w:pPr>
-        <w:pStyle w:val="ActivityBullet"/>
-        <w:rPr>
-          <w:lang w:val="fr-FR"/>
-        </w:rPr>
-      </w:pPr>
-      <w:r>
-        <w:rPr>
-          <w:lang w:val="fr-FR"/>
-        </w:rPr>
-        <w:t>2026-01-29 14:11:49-0500PM ET exploit Completed exploit module.</w:t>
-      </w:r>
-    </w:p>
-    <w:p>
-      <w:pPr>
         <w:spacing w:line="259" w:lineRule="auto"/>
         <w:contextualSpacing/>
         <w:rPr>
@@ -7116,7 +5159,7 @@
           <w:szCs w:val="22"/>
           <w14:ligatures w14:val="none"/>
         </w:rPr>
-        <w:t>orbital fire’s</w:t>
+        <w:t>OrbitalFire’s</w:t>
       </w:r>
       <w:proofErr w:type="spellEnd"/>
       <w:r>
@@ -7171,7 +5214,7 @@
                     </pic:cNvPicPr>
                   </pic:nvPicPr>
                   <pic:blipFill>
-                    <a:blip r:embed="rId20" cstate="print">
+                    <a:blip r:embed="rId14" cstate="print">
                       <a:extLst>
                         <a:ext uri="{28A0092B-C50C-407E-A947-70E740481C1C}">
                           <a14:useLocalDpi xmlns:a14="http://schemas.microsoft.com/office/drawing/2010/main" val="0"/>
@@ -7221,7 +5264,7 @@
           <w:szCs w:val="22"/>
           <w14:ligatures w14:val="none"/>
         </w:rPr>
-        <w:t>orbital fire</w:t>
+        <w:t>OrbitalFire</w:t>
       </w:r>
       <w:proofErr w:type="spellEnd"/>
       <w:r>
@@ -7259,7 +5302,7 @@
           <w14:ligatures w14:val="none"/>
         </w:rPr>
         <w:drawing>
-          <wp:inline distT="0" distB="0" distL="0" distR="0" wp14:anchorId="03962334" wp14:editId="63B34A0F">
+          <wp:inline distT="0" distB="0" distL="0" distR="0" wp14:anchorId="03962334" wp14:editId="4DC07FE6">
             <wp:extent cx="152400" cy="152400"/>
             <wp:effectExtent l="0" t="0" r="0" b="0"/>
             <wp:docPr id="2011428596" name="Picture 2011428596" descr="Fire with solid fill"/>
@@ -7276,11 +5319,11 @@
                     </pic:cNvPicPr>
                   </pic:nvPicPr>
                   <pic:blipFill>
-                    <a:blip r:embed="rId21" cstate="print">
+                    <a:blip r:embed="rId15" cstate="print">
                       <a:extLst>
                         <a:ext uri="{BEBA8EAE-BF5A-486C-A8C5-ECC9F3942E4B}">
                           <a14:imgProps xmlns:a14="http://schemas.microsoft.com/office/drawing/2010/main">
-                            <a14:imgLayer r:embed="rId22">
+                            <a14:imgLayer r:embed="rId16">
                               <a14:imgEffect>
                                 <a14:saturation sat="0"/>
                               </a14:imgEffect>
@@ -7335,7 +5378,7 @@
           <w:szCs w:val="22"/>
           <w14:ligatures w14:val="none"/>
         </w:rPr>
-        <w:t>orbital fire</w:t>
+        <w:t>OrbitalFire</w:t>
       </w:r>
       <w:proofErr w:type="spellEnd"/>
       <w:r>
@@ -7380,216 +5423,6 @@
           <w14:ligatures w14:val="none"/>
         </w:rPr>
         <w:t>DISCRETIONARY Remediation</w:t>
-      </w:r>
-    </w:p>
-    <w:p>
-      <w:pPr>
-        <w:pStyle w:val="ListNumber2"/>
-      </w:pPr>
-      <w:r>
-        <w:rPr>
-          <w:noProof/>
-        </w:rPr>
-        <w:drawing>
-          <wp:inline distT="0" distB="0" distL="0" distR="0" wp14:anchorId="431DF5D4" wp14:editId="6F6CA493">
-            <wp:extent cx="152400" cy="152400"/>
-            <wp:effectExtent l="0" t="0" r="0" b="0"/>
-            <wp:docPr id="2011428607" name="Picture 2011428607"/>
-            <wp:cNvGraphicFramePr>
-              <a:graphicFrameLocks xmlns:a="http://schemas.openxmlformats.org/drawingml/2006/main" noChangeAspect="1"/>
-            </wp:cNvGraphicFramePr>
-            <a:graphic xmlns:a="http://schemas.openxmlformats.org/drawingml/2006/main">
-              <a:graphicData uri="http://schemas.openxmlformats.org/drawingml/2006/picture">
-                <pic:pic xmlns:pic="http://schemas.openxmlformats.org/drawingml/2006/picture">
-                  <pic:nvPicPr>
-                    <pic:cNvPr id="0" name="image.png"/>
-                    <pic:cNvPicPr/>
-                  </pic:nvPicPr>
-                  <pic:blipFill>
-                    <a:blip r:embed="rId21"/>
-                    <a:stretch>
-                      <a:fillRect/>
-                    </a:stretch>
-                  </pic:blipFill>
-                  <pic:spPr>
-                    <a:xfrm>
-                      <a:off x="0" y="0"/>
-                      <a:ext cx="152400" cy="152400"/>
-                    </a:xfrm>
-                    <a:prstGeom prst="rect">
-                      <a:avLst/>
-                    </a:prstGeom>
-                  </pic:spPr>
-                </pic:pic>
-              </a:graphicData>
-            </a:graphic>
-          </wp:inline>
-        </w:drawing>
-      </w:r>
-      <w:r>
-        <w:t xml:space="preserve"> </w:t>
-      </w:r>
-      <w:r>
-        <w:rPr>
-          <w:b/>
-        </w:rPr>
-        <w:t>Remediate Subdomain Takeover Exposure</w:t>
-      </w:r>
-      <w:r>
-        <w:t xml:space="preserve"> - Identify and remove misconfigured or stale DNS records that reference unclaimed or deprovisioned third-party services. Conduct a comprehensive review of all DNS entries to ensure they accurately map to active, authorized resources, and implement continuous monitoring to detect future misconfigurations. Where applicable, apply DNS security best practices such as DNSSEC and maintain proper lifecycle management of external service integrations to prevent unauthorized subdomain claims.</w:t>
-      </w:r>
-    </w:p>
-    <w:p>
-      <w:pPr>
-        <w:spacing w:after="120"/>
-        <w:ind w:left="720"/>
-      </w:pPr>
-      <w:r>
-        <w:rPr>
-          <w:rFonts w:ascii="Corbel" w:hAnsi="Corbel"/>
-          <w:u w:val="single"/>
-        </w:rPr>
-        <w:t>Refer to High Finding 1</w:t>
-      </w:r>
-    </w:p>
-    <w:p>
-      <w:pPr>
-        <w:pStyle w:val="ListNumber2"/>
-      </w:pPr>
-      <w:r>
-        <w:rPr>
-          <w:noProof/>
-        </w:rPr>
-        <w:drawing>
-          <wp:inline distT="0" distB="0" distL="0" distR="0" wp14:anchorId="35F27E15" wp14:editId="32DBCE03">
-            <wp:extent cx="152400" cy="152400"/>
-            <wp:effectExtent l="0" t="0" r="0" b="0"/>
-            <wp:docPr id="2011428608" name="Picture 2011428608"/>
-            <wp:cNvGraphicFramePr>
-              <a:graphicFrameLocks xmlns:a="http://schemas.openxmlformats.org/drawingml/2006/main" noChangeAspect="1"/>
-            </wp:cNvGraphicFramePr>
-            <a:graphic xmlns:a="http://schemas.openxmlformats.org/drawingml/2006/main">
-              <a:graphicData uri="http://schemas.openxmlformats.org/drawingml/2006/picture">
-                <pic:pic xmlns:pic="http://schemas.openxmlformats.org/drawingml/2006/picture">
-                  <pic:nvPicPr>
-                    <pic:cNvPr id="0" name="image.png"/>
-                    <pic:cNvPicPr/>
-                  </pic:nvPicPr>
-                  <pic:blipFill>
-                    <a:blip r:embed="rId21"/>
-                    <a:stretch>
-                      <a:fillRect/>
-                    </a:stretch>
-                  </pic:blipFill>
-                  <pic:spPr>
-                    <a:xfrm>
-                      <a:off x="0" y="0"/>
-                      <a:ext cx="152400" cy="152400"/>
-                    </a:xfrm>
-                    <a:prstGeom prst="rect">
-                      <a:avLst/>
-                    </a:prstGeom>
-                  </pic:spPr>
-                </pic:pic>
-              </a:graphicData>
-            </a:graphic>
-          </wp:inline>
-        </w:drawing>
-      </w:r>
-      <w:r>
-        <w:t xml:space="preserve"> </w:t>
-      </w:r>
-      <w:r>
-        <w:rPr>
-          <w:b/>
-        </w:rPr>
-        <w:t>Reconfigure DMARC Record</w:t>
-      </w:r>
-      <w:r>
-        <w:t xml:space="preserve"> - Review and rectify the current DMARC record configuration. The DMARC policy should be explicitly defined, ideally set to "quarantine" or "reject," which directs receiving mail servers on the proper handling of unauthenticated messages.</w:t>
-      </w:r>
-    </w:p>
-    <w:p>
-      <w:pPr>
-        <w:spacing w:after="120"/>
-        <w:ind w:left="720"/>
-      </w:pPr>
-      <w:r>
-        <w:rPr>
-          <w:rFonts w:ascii="Corbel" w:hAnsi="Corbel"/>
-          <w:u w:val="single"/>
-        </w:rPr>
-        <w:t>Refer to Medium Finding 1</w:t>
-      </w:r>
-    </w:p>
-    <w:p>
-      <w:pPr>
-        <w:pStyle w:val="ListNumber2"/>
-      </w:pPr>
-      <w:r>
-        <w:rPr>
-          <w:noProof/>
-        </w:rPr>
-        <w:drawing>
-          <wp:inline distT="0" distB="0" distL="0" distR="0" wp14:anchorId="357B0F86" wp14:editId="4D0F57A1">
-            <wp:extent cx="152400" cy="152400"/>
-            <wp:effectExtent l="0" t="0" r="0" b="0"/>
-            <wp:docPr id="2011428609" name="Picture 2011428609"/>
-            <wp:cNvGraphicFramePr>
-              <a:graphicFrameLocks xmlns:a="http://schemas.openxmlformats.org/drawingml/2006/main" noChangeAspect="1"/>
-            </wp:cNvGraphicFramePr>
-            <a:graphic xmlns:a="http://schemas.openxmlformats.org/drawingml/2006/main">
-              <a:graphicData uri="http://schemas.openxmlformats.org/drawingml/2006/picture">
-                <pic:pic xmlns:pic="http://schemas.openxmlformats.org/drawingml/2006/picture">
-                  <pic:nvPicPr>
-                    <pic:cNvPr id="0" name="image.png"/>
-                    <pic:cNvPicPr/>
-                  </pic:nvPicPr>
-                  <pic:blipFill>
-                    <a:blip r:embed="rId21"/>
-                    <a:stretch>
-                      <a:fillRect/>
-                    </a:stretch>
-                  </pic:blipFill>
-                  <pic:spPr>
-                    <a:xfrm>
-                      <a:off x="0" y="0"/>
-                      <a:ext cx="152400" cy="152400"/>
-                    </a:xfrm>
-                    <a:prstGeom prst="rect">
-                      <a:avLst/>
-                    </a:prstGeom>
-                  </pic:spPr>
-                </pic:pic>
-              </a:graphicData>
-            </a:graphic>
-          </wp:inline>
-        </w:drawing>
-      </w:r>
-      <w:r>
-        <w:t xml:space="preserve"> </w:t>
-      </w:r>
-      <w:r>
-        <w:rPr>
-          <w:b/>
-        </w:rPr>
-        <w:t>Restrict Access to Remote SSH</w:t>
-      </w:r>
-      <w:r>
-        <w:t xml:space="preserve"> - Restrict access from the public Internet. Ensure that the Remote SSH service is only reachable through secure environments, such as a Virtual Private Network (VPN) or specific authorized IP address configurations.</w:t>
-      </w:r>
-    </w:p>
-    <w:p>
-      <w:pPr>
-        <w:spacing w:after="120"/>
-        <w:ind w:left="720"/>
-      </w:pPr>
-      <w:r>
-        <w:rPr>
-          <w:rFonts w:ascii="Corbel" w:hAnsi="Corbel"/>
-          <w:u w:val="single"/>
-        </w:rPr>
-        <w:t>Refer to Medium Finding 2</w:t>
       </w:r>
     </w:p>
     <w:p>
@@ -7700,46 +5533,6 @@
       <w:pPr>
         <w:spacing w:after="120"/>
       </w:pPr>
-      <w:r>
-        <w:rPr>
-          <w:noProof/>
-        </w:rPr>
-        <w:drawing>
-          <wp:inline distT="0" distB="0" distL="0" distR="0" wp14:anchorId="4540B2E1" wp14:editId="5E1B2D31">
-            <wp:extent cx="5943600" cy="830317"/>
-            <wp:effectExtent l="0" t="0" r="0" b="0"/>
-            <wp:docPr id="2011428600" name="Picture 2011428600"/>
-            <wp:cNvGraphicFramePr>
-              <a:graphicFrameLocks xmlns:a="http://schemas.openxmlformats.org/drawingml/2006/main" noChangeAspect="1"/>
-            </wp:cNvGraphicFramePr>
-            <a:graphic xmlns:a="http://schemas.openxmlformats.org/drawingml/2006/main">
-              <a:graphicData uri="http://schemas.openxmlformats.org/drawingml/2006/picture">
-                <pic:pic xmlns:pic="http://schemas.openxmlformats.org/drawingml/2006/picture">
-                  <pic:nvPicPr>
-                    <pic:cNvPr id="0" name="OPEN_PORTS.PNG"/>
-                    <pic:cNvPicPr/>
-                  </pic:nvPicPr>
-                  <pic:blipFill>
-                    <a:blip r:embed="rId23"/>
-                    <a:stretch>
-                      <a:fillRect/>
-                    </a:stretch>
-                  </pic:blipFill>
-                  <pic:spPr>
-                    <a:xfrm>
-                      <a:off x="0" y="0"/>
-                      <a:ext cx="5943600" cy="830317"/>
-                    </a:xfrm>
-                    <a:prstGeom prst="rect">
-                      <a:avLst/>
-                    </a:prstGeom>
-                  </pic:spPr>
-                </pic:pic>
-              </a:graphicData>
-            </a:graphic>
-          </wp:inline>
-        </w:drawing>
-      </w:r>
     </w:p>
     <w:p>
       <w:pPr>
@@ -11899,7 +9692,7 @@
           </c:marker>
           <c:cat>
             <c:numRef>
-              <c:f>Sheet1!$A$2:$A$5</c:f>
+              <c:f>Sheet1!$A$2:$A$4</c:f>
               <c:numCache>
                 <c:formatCode>General</c:formatCode>
                 <c:ptCount val="3"/>
@@ -11917,7 +9710,7 @@
           </c:cat>
           <c:val>
             <c:numRef>
-              <c:f>Sheet1!$B$2:$B$5</c:f>
+              <c:f>Sheet1!$B$2:$B$4</c:f>
               <c:numCache>
                 <c:formatCode>General</c:formatCode>
                 <c:ptCount val="3"/>
@@ -11970,7 +9763,7 @@
           </c:marker>
           <c:cat>
             <c:numRef>
-              <c:f>Sheet1!$A$2:$A$5</c:f>
+              <c:f>Sheet1!$A$2:$A$4</c:f>
               <c:numCache>
                 <c:formatCode>General</c:formatCode>
                 <c:ptCount val="3"/>
@@ -11988,7 +9781,7 @@
           </c:cat>
           <c:val>
             <c:numRef>
-              <c:f>Sheet1!$C$2:$C$5</c:f>
+              <c:f>Sheet1!$C$2:$C$4</c:f>
               <c:numCache>
                 <c:formatCode>General</c:formatCode>
                 <c:ptCount val="3"/>
@@ -12039,7 +9832,7 @@
           </c:marker>
           <c:cat>
             <c:numRef>
-              <c:f>Sheet1!$A$2:$A$5</c:f>
+              <c:f>Sheet1!$A$2:$A$4</c:f>
               <c:numCache>
                 <c:formatCode>General</c:formatCode>
                 <c:ptCount val="3"/>
@@ -12057,7 +9850,7 @@
           </c:cat>
           <c:val>
             <c:numRef>
-              <c:f>Sheet1!$D$2:$D$5</c:f>
+              <c:f>Sheet1!$D$2:$D$4</c:f>
               <c:numCache>
                 <c:formatCode>General</c:formatCode>
                 <c:ptCount val="3"/>
@@ -12108,7 +9901,7 @@
           </c:marker>
           <c:cat>
             <c:numRef>
-              <c:f>Sheet1!$A$2:$A$5</c:f>
+              <c:f>Sheet1!$A$2:$A$4</c:f>
               <c:numCache>
                 <c:formatCode>General</c:formatCode>
                 <c:ptCount val="3"/>
@@ -12126,7 +9919,7 @@
           </c:cat>
           <c:val>
             <c:numRef>
-              <c:f>Sheet1!$E$2:$E$5</c:f>
+              <c:f>Sheet1!$E$2:$E$4</c:f>
               <c:numCache>
                 <c:formatCode>General</c:formatCode>
                 <c:ptCount val="3"/>
@@ -12177,7 +9970,7 @@
           </c:marker>
           <c:cat>
             <c:numRef>
-              <c:f>Sheet1!$A$2:$A$5</c:f>
+              <c:f>Sheet1!$A$2:$A$4</c:f>
               <c:numCache>
                 <c:formatCode>General</c:formatCode>
                 <c:ptCount val="3"/>
@@ -12195,7 +9988,7 @@
           </c:cat>
           <c:val>
             <c:numRef>
-              <c:f>Sheet1!$F$2:$F$5</c:f>
+              <c:f>Sheet1!$F$2:$F$4</c:f>
               <c:numCache>
                 <c:formatCode>General</c:formatCode>
                 <c:ptCount val="3"/>
@@ -13652,7 +11445,7 @@
               <a:ea typeface="Calibri" panose="020F0502020204030204" pitchFamily="34" charset="0"/>
               <a:cs typeface="Arial" panose="020B0604020202020204" pitchFamily="34" charset="0"/>
             </a:rPr>
-            <a:t>3</a:t>
+            <a:t>18</a:t>
           </a:r>
           <a:endParaRPr lang="en-US" sz="3000" b="1" i="0">
             <a:solidFill>

</xml_diff>

<commit_message>
Finalized code base as well with comments
</commit_message>
<xml_diff>
--- a/Source_Code/Reports/Sample499/FindingsReportTest.docx
+++ b/Source_Code/Reports/Sample499/FindingsReportTest.docx
@@ -531,30 +531,20 @@
       </w:pPr>
       <w:r>
         <w:rPr>
-          <w:rFonts w:ascii="Corbel" w:eastAsia="Calibri" w:hAnsi="Corbel" w:cs="Biome"/>
-          <w:caps/>
-          <w:color w:val="FF6633"/>
-          <w:spacing w:val="30"/>
-          <w:kern w:val="0"/>
+          <w:rFonts w:ascii="Corbel" w:hAnsi="Corbel"/>
+          <w:color w:val="F26522"/>
           <w:sz w:val="32"/>
-          <w:szCs w:val="32"/>
-          <w14:ligatures w14:val="none"/>
-        </w:rPr>
-        <w:t>[customer name]</w:t>
-      </w:r>
-      <w:r>
-        <w:rPr>
-          <w:rFonts w:ascii="Corbel" w:eastAsia="Calibri" w:hAnsi="Corbel" w:cs="Biome"/>
-          <w:caps/>
-          <w:color w:val="FF6633"/>
-          <w:spacing w:val="30"/>
-          <w:kern w:val="0"/>
+        </w:rPr>
+        <w:t>Rheinard Zadanowsky</w:t>
+      </w:r>
+      <w:r>
+        <w:rPr>
+          <w:rFonts w:ascii="Corbel" w:hAnsi="Corbel"/>
+          <w:color w:val="F26522"/>
           <w:sz w:val="32"/>
-          <w:szCs w:val="32"/>
-          <w14:ligatures w14:val="none"/>
         </w:rPr>
         <w:br/>
-        <w:t>2025</w:t>
+        <w:t>2026</w:t>
       </w:r>
     </w:p>
     <w:p>
@@ -600,7 +590,7 @@
           <w14:ligatures w14:val="none"/>
         </w:rPr>
         <w:drawing>
-          <wp:anchor distT="0" distB="0" distL="114300" distR="114300" simplePos="0" relativeHeight="251662336" behindDoc="0" locked="0" layoutInCell="1" allowOverlap="1" wp14:anchorId="56FF54E8" wp14:editId="386AAF3A">
+          <wp:anchor distT="0" distB="0" distL="114300" distR="114300" simplePos="0" relativeHeight="251662336" behindDoc="0" locked="0" layoutInCell="1" allowOverlap="1" wp14:anchorId="56FF54E8" wp14:editId="207F2646">
             <wp:simplePos x="0" y="0"/>
             <wp:positionH relativeFrom="margin">
               <wp:posOffset>1163955</wp:posOffset>
@@ -2812,6 +2802,18 @@
     </w:p>
     <w:p>
       <w:pPr>
+        <w:pStyle w:val="IP"/>
+      </w:pPr>
+      <w:r>
+        <w:rPr>
+          <w:rFonts w:ascii="Corbel" w:hAnsi="Corbel"/>
+          <w:color w:val="404040"/>
+        </w:rPr>
+        <w:t>107.180.245.182</w:t>
+      </w:r>
+    </w:p>
+    <w:p>
+      <w:pPr>
         <w:numPr>
           <w:ilvl w:val="0"/>
           <w:numId w:val="7"/>
@@ -3606,17 +3608,17 @@
           <w:szCs w:val="22"/>
           <w14:ligatures w14:val="none"/>
         </w:rPr>
-        <w:t xml:space="preserve">[NETWORK RANGE] </w:t>
-      </w:r>
-      <w:r>
-        <w:rPr>
-          <w:rFonts w:ascii="Corbel" w:eastAsia="Calibri" w:hAnsi="Corbel" w:cs="Arial"/>
-          <w:color w:val="404040"/>
-          <w:kern w:val="0"/>
-          <w:szCs w:val="22"/>
-          <w14:ligatures w14:val="none"/>
-        </w:rPr>
-        <w:t xml:space="preserve">[NETWORK RANGE WORD] </w:t>
+        <w:t xml:space="preserve">one (1) </w:t>
+      </w:r>
+      <w:r>
+        <w:rPr>
+          <w:rFonts w:ascii="Corbel" w:eastAsia="Calibri" w:hAnsi="Corbel" w:cs="Arial"/>
+          <w:color w:val="404040"/>
+          <w:kern w:val="0"/>
+          <w:szCs w:val="22"/>
+          <w14:ligatures w14:val="none"/>
+        </w:rPr>
+        <w:t xml:space="preserve">network range </w:t>
       </w:r>
       <w:r>
         <w:rPr>
@@ -3636,7 +3638,7 @@
           <w:szCs w:val="22"/>
           <w14:ligatures w14:val="none"/>
         </w:rPr>
-        <w:t xml:space="preserve">[NETWORK RANGE VERB] </w:t>
+        <w:t xml:space="preserve">was </w:t>
       </w:r>
       <w:r>
         <w:rPr>
@@ -3656,17 +3658,17 @@
           <w:szCs w:val="22"/>
           <w14:ligatures w14:val="none"/>
         </w:rPr>
-        <w:t xml:space="preserve">[SYSTEMS] </w:t>
-      </w:r>
-      <w:r>
-        <w:rPr>
-          <w:rFonts w:ascii="Corbel" w:eastAsia="Calibri" w:hAnsi="Corbel" w:cs="Arial"/>
-          <w:color w:val="404040"/>
-          <w:kern w:val="0"/>
-          <w:szCs w:val="22"/>
-          <w14:ligatures w14:val="none"/>
-        </w:rPr>
-        <w:t>[SYSTEM WORD]</w:t>
+        <w:t xml:space="preserve">one (1) </w:t>
+      </w:r>
+      <w:r>
+        <w:rPr>
+          <w:rFonts w:ascii="Corbel" w:eastAsia="Calibri" w:hAnsi="Corbel" w:cs="Arial"/>
+          <w:color w:val="404040"/>
+          <w:kern w:val="0"/>
+          <w:szCs w:val="22"/>
+          <w14:ligatures w14:val="none"/>
+        </w:rPr>
+        <w:t>system</w:t>
       </w:r>
       <w:r>
         <w:rPr>
@@ -3686,17 +3688,17 @@
           <w:szCs w:val="22"/>
           <w14:ligatures w14:val="none"/>
         </w:rPr>
-        <w:t xml:space="preserve">[ADDRESSES] </w:t>
-      </w:r>
-      <w:r>
-        <w:rPr>
-          <w:rFonts w:ascii="Corbel" w:eastAsia="Calibri" w:hAnsi="Corbel" w:cs="Arial"/>
-          <w:color w:val="404040"/>
-          <w:kern w:val="0"/>
-          <w:szCs w:val="22"/>
-          <w14:ligatures w14:val="none"/>
-        </w:rPr>
-        <w:t>[ADDRESS WORD]</w:t>
+        <w:t xml:space="preserve">one (1) </w:t>
+      </w:r>
+      <w:r>
+        <w:rPr>
+          <w:rFonts w:ascii="Corbel" w:eastAsia="Calibri" w:hAnsi="Corbel" w:cs="Arial"/>
+          <w:color w:val="404040"/>
+          <w:kern w:val="0"/>
+          <w:szCs w:val="22"/>
+          <w14:ligatures w14:val="none"/>
+        </w:rPr>
+        <w:t>address</w:t>
       </w:r>
       <w:r>
         <w:rPr>
@@ -3716,7 +3718,7 @@
           <w:szCs w:val="22"/>
           <w14:ligatures w14:val="none"/>
         </w:rPr>
-        <w:t>[ADDRESS VERB]</w:t>
+        <w:t>was</w:t>
       </w:r>
       <w:r>
         <w:rPr>
@@ -3736,17 +3738,17 @@
           <w:szCs w:val="22"/>
           <w14:ligatures w14:val="none"/>
         </w:rPr>
-        <w:t>[OPEN PORTS]</w:t>
-      </w:r>
-      <w:r>
-        <w:rPr>
-          <w:rFonts w:ascii="Corbel" w:eastAsia="Calibri" w:hAnsi="Corbel" w:cs="Arial"/>
-          <w:color w:val="404040"/>
-          <w:kern w:val="0"/>
-          <w:szCs w:val="22"/>
-          <w14:ligatures w14:val="none"/>
-        </w:rPr>
-        <w:t xml:space="preserve"> [OPEN PORT WORD]</w:t>
+        <w:t>three (3)</w:t>
+      </w:r>
+      <w:r>
+        <w:rPr>
+          <w:rFonts w:ascii="Corbel" w:eastAsia="Calibri" w:hAnsi="Corbel" w:cs="Arial"/>
+          <w:color w:val="404040"/>
+          <w:kern w:val="0"/>
+          <w:szCs w:val="22"/>
+          <w14:ligatures w14:val="none"/>
+        </w:rPr>
+        <w:t xml:space="preserve"> open ports</w:t>
       </w:r>
       <w:r>
         <w:rPr>
@@ -3865,7 +3867,7 @@
           <w:szCs w:val="22"/>
           <w14:ligatures w14:val="none"/>
         </w:rPr>
-        <w:t>[CUSTOMER]</w:t>
+        <w:t>Rheinard Zadanowsky's</w:t>
       </w:r>
       <w:r>
         <w:rPr>
@@ -4122,7 +4124,7 @@
           <w14:ligatures w14:val="none"/>
         </w:rPr>
         <w:drawing>
-          <wp:inline distT="0" distB="0" distL="0" distR="0" wp14:anchorId="2DA2DD83" wp14:editId="40052C24">
+          <wp:inline distT="0" distB="0" distL="0" distR="0" wp14:anchorId="2DA2DD83" wp14:editId="16C34EFF">
             <wp:extent cx="5486400" cy="3200400"/>
             <wp:effectExtent l="0" t="0" r="0" b="0"/>
             <wp:docPr id="1278438351" name="Chart 4"/>
@@ -4192,6 +4194,46 @@
       </w:r>
     </w:p>
     <w:p>
+      <w:r>
+        <w:rPr>
+          <w:rFonts w:ascii="Corbel" w:hAnsi="Corbel"/>
+          <w:b/>
+          <w:color w:val="404040"/>
+          <w:sz w:val="26"/>
+        </w:rPr>
+        <w:t>CONFIGURATION DEFICIENCIES</w:t>
+      </w:r>
+    </w:p>
+    <w:p>
+      <w:r>
+        <w:rPr>
+          <w:rFonts w:ascii="Corbel" w:hAnsi="Corbel"/>
+          <w:color w:val="404040"/>
+        </w:rPr>
+        <w:t>Configuration weaknesses were identified that could potentially lead to a successful compromise of systems and/or data within the tested environment. Although some of the configuration weaknesses may be exploitable in limited circumstances, the potential impact of a successful attack could be relatively high.</w:t>
+      </w:r>
+    </w:p>
+    <w:p>
+      <w:r>
+        <w:rPr>
+          <w:rFonts w:ascii="Corbel" w:hAnsi="Corbel"/>
+          <w:b/>
+          <w:color w:val="404040"/>
+          <w:sz w:val="26"/>
+        </w:rPr>
+        <w:t>INGRESS FILTERING DEFICIENCIES</w:t>
+      </w:r>
+    </w:p>
+    <w:p>
+      <w:r>
+        <w:rPr>
+          <w:rFonts w:ascii="Corbel" w:hAnsi="Corbel"/>
+          <w:color w:val="404040"/>
+        </w:rPr>
+        <w:t>The organization's network firewalls allow an excessive amount of access to services within the internal, trusted network environment. This excessive access could potentially expose the organization to attacks that are accessible due to unnecessary or misconfigured access. Services on the internal network should only be accessible to individuals and computer systems that are considered "trusted" such as through a Virtual Private Network (VPN) along with appropriate access controls.</w:t>
+      </w:r>
+    </w:p>
+    <w:p>
       <w:pPr>
         <w:spacing w:line="259" w:lineRule="auto"/>
         <w:rPr>
@@ -4349,6 +4391,482 @@
       </w:r>
     </w:p>
     <w:p>
+      <w:r>
+        <w:rPr>
+          <w:rFonts w:ascii="Corbel" w:hAnsi="Corbel"/>
+          <w:color w:val="404040"/>
+        </w:rPr>
+        <w:t xml:space="preserve">1.    </w:t>
+      </w:r>
+      <w:r>
+        <w:rPr>
+          <w:rFonts w:ascii="Corbel" w:hAnsi="Corbel"/>
+          <w:b/>
+          <w:color w:val="404040"/>
+        </w:rPr>
+        <w:t>Subdomain Takeover Vulnerability</w:t>
+      </w:r>
+      <w:r>
+        <w:rPr>
+          <w:rFonts w:ascii="Corbel" w:hAnsi="Corbel"/>
+          <w:color w:val="404040"/>
+        </w:rPr>
+        <w:t xml:space="preserve"> – </w:t>
+      </w:r>
+      <w:r>
+        <w:rPr>
+          <w:rFonts w:ascii="Corbel" w:hAnsi="Corbel"/>
+          <w:color w:val="404040"/>
+        </w:rPr>
+        <w:t xml:space="preserve">During testing, OrbitalFire identified a potential subdomain takeover vulnerability affecting one or more domains owned by Rheinard Zadanowsky. This issue typically results from misconfigured DNS records that reference unclaimed or deprovisioned third-party services, allowing an attacker to register the external resource and gain control of the associated subdomain. If exploited, an attacker could host malicious content, impersonate the organization, conduct phishing campaigns, or collect user data, posing </w:t>
+      </w:r>
+      <w:r>
+        <w:rPr>
+          <w:rFonts w:ascii="Corbel" w:hAnsi="Corbel"/>
+          <w:color w:val="404040"/>
+        </w:rPr>
+        <w:t>a significant risk to brand reputation, user trust, and overall security posture.</w:t>
+      </w:r>
+    </w:p>
+    <w:p>
+      <w:r>
+        <w:rPr>
+          <w:rFonts w:ascii="Corbel" w:hAnsi="Corbel"/>
+          <w:i/>
+          <w:color w:val="404040"/>
+        </w:rPr>
+        <w:t>Affected Nodes:</w:t>
+      </w:r>
+    </w:p>
+    <w:p>
+      <w:r>
+        <w:rPr>
+          <w:noProof/>
+        </w:rPr>
+        <w:drawing>
+          <wp:inline distT="0" distB="0" distL="0" distR="0" wp14:anchorId="2B4DFAB0" wp14:editId="6996F78B">
+            <wp:extent cx="5303520" cy="606845"/>
+            <wp:effectExtent l="0" t="0" r="0" b="0"/>
+            <wp:docPr id="2011428601" name="Picture 2011428601"/>
+            <wp:cNvGraphicFramePr>
+              <a:graphicFrameLocks xmlns:a="http://schemas.openxmlformats.org/drawingml/2006/main" noChangeAspect="1"/>
+            </wp:cNvGraphicFramePr>
+            <a:graphic xmlns:a="http://schemas.openxmlformats.org/drawingml/2006/main">
+              <a:graphicData uri="http://schemas.openxmlformats.org/drawingml/2006/picture">
+                <pic:pic xmlns:pic="http://schemas.openxmlformats.org/drawingml/2006/picture">
+                  <pic:nvPicPr>
+                    <pic:cNvPr id="0" name="Affected_Sample_1_part1.png"/>
+                    <pic:cNvPicPr/>
+                  </pic:nvPicPr>
+                  <pic:blipFill>
+                    <a:blip r:embed="rId14"/>
+                    <a:stretch>
+                      <a:fillRect/>
+                    </a:stretch>
+                  </pic:blipFill>
+                  <pic:spPr>
+                    <a:xfrm>
+                      <a:off x="0" y="0"/>
+                      <a:ext cx="5303520" cy="606845"/>
+                    </a:xfrm>
+                    <a:prstGeom prst="rect">
+                      <a:avLst/>
+                    </a:prstGeom>
+                  </pic:spPr>
+                </pic:pic>
+              </a:graphicData>
+            </a:graphic>
+          </wp:inline>
+        </w:drawing>
+      </w:r>
+    </w:p>
+    <w:p>
+      <w:r>
+        <w:rPr>
+          <w:rFonts w:ascii="Corbel" w:hAnsi="Corbel"/>
+          <w:i/>
+          <w:color w:val="404040"/>
+        </w:rPr>
+        <w:t>Evidence:</w:t>
+      </w:r>
+    </w:p>
+    <w:p>
+      <w:r>
+        <w:rPr>
+          <w:noProof/>
+        </w:rPr>
+        <w:drawing>
+          <wp:inline distT="0" distB="0" distL="0" distR="0" wp14:anchorId="5FA385E2" wp14:editId="1F5408A5">
+            <wp:extent cx="5303520" cy="356282"/>
+            <wp:effectExtent l="0" t="0" r="0" b="0"/>
+            <wp:docPr id="2011428602" name="Picture 2011428602"/>
+            <wp:cNvGraphicFramePr>
+              <a:graphicFrameLocks xmlns:a="http://schemas.openxmlformats.org/drawingml/2006/main" noChangeAspect="1"/>
+            </wp:cNvGraphicFramePr>
+            <a:graphic xmlns:a="http://schemas.openxmlformats.org/drawingml/2006/main">
+              <a:graphicData uri="http://schemas.openxmlformats.org/drawingml/2006/picture">
+                <pic:pic xmlns:pic="http://schemas.openxmlformats.org/drawingml/2006/picture">
+                  <pic:nvPicPr>
+                    <pic:cNvPr id="0" name="Evidence_Sample_1_part1.png"/>
+                    <pic:cNvPicPr/>
+                  </pic:nvPicPr>
+                  <pic:blipFill>
+                    <a:blip r:embed="rId15"/>
+                    <a:stretch>
+                      <a:fillRect/>
+                    </a:stretch>
+                  </pic:blipFill>
+                  <pic:spPr>
+                    <a:xfrm>
+                      <a:off x="0" y="0"/>
+                      <a:ext cx="5303520" cy="356282"/>
+                    </a:xfrm>
+                    <a:prstGeom prst="rect">
+                      <a:avLst/>
+                    </a:prstGeom>
+                  </pic:spPr>
+                </pic:pic>
+              </a:graphicData>
+            </a:graphic>
+          </wp:inline>
+        </w:drawing>
+      </w:r>
+    </w:p>
+    <w:p>
+      <w:pPr>
+        <w:keepNext/>
+        <w:keepLines/>
+        <w:pageBreakBefore/>
+        <w:spacing w:before="240" w:after="120" w:line="259" w:lineRule="auto"/>
+        <w:outlineLvl w:val="1"/>
+        <w:rPr>
+          <w:rFonts w:ascii="Handel Gothic D" w:eastAsia="DengXian Light" w:hAnsi="Handel Gothic D" w:cs="Times New Roman"/>
+          <w:b/>
+          <w:caps/>
+          <w:color w:val="FF6633"/>
+          <w:kern w:val="0"/>
+          <w:sz w:val="32"/>
+          <w:szCs w:val="26"/>
+          <w14:ligatures w14:val="none"/>
+        </w:rPr>
+      </w:pPr>
+      <w:r>
+        <w:rPr>
+          <w:rFonts w:ascii="Handel Gothic D" w:eastAsia="DengXian Light" w:hAnsi="Handel Gothic D" w:cs="Times New Roman"/>
+          <w:b/>
+          <w:caps/>
+          <w:color w:val="FF6633"/>
+          <w:kern w:val="0"/>
+          <w:sz w:val="32"/>
+          <w:szCs w:val="26"/>
+          <w14:ligatures w14:val="none"/>
+        </w:rPr>
+        <w:lastRenderedPageBreak/>
+        <w:t>Medium</w:t>
+      </w:r>
+    </w:p>
+    <w:p>
+      <w:r>
+        <w:rPr>
+          <w:rFonts w:ascii="Corbel" w:hAnsi="Corbel"/>
+          <w:color w:val="404040"/>
+        </w:rPr>
+        <w:t xml:space="preserve">1.    </w:t>
+      </w:r>
+      <w:r>
+        <w:rPr>
+          <w:rFonts w:ascii="Corbel" w:hAnsi="Corbel"/>
+          <w:b/>
+          <w:color w:val="404040"/>
+        </w:rPr>
+        <w:t>Misconfigured DMARC Record</w:t>
+      </w:r>
+      <w:r>
+        <w:rPr>
+          <w:rFonts w:ascii="Corbel" w:hAnsi="Corbel"/>
+          <w:color w:val="404040"/>
+        </w:rPr>
+        <w:t xml:space="preserve"> – During testing, OrbitalFire identified that Rheinard Zadanowsky has a misconfigured DMARC (Domain-based Message Authentication, Reporting, and Conformance) record for one or more of their domain(s). DMARC is critical for verifying the authenticity of emails sent from the organization, serving as a vital barrier against email spoofing and phishing attacks. Without proper configuration, DMARC fails to instruct receiving mail servers on how to treat email messages from the organiza</w:t>
+      </w:r>
+      <w:r>
+        <w:rPr>
+          <w:rFonts w:ascii="Corbel" w:hAnsi="Corbel"/>
+          <w:color w:val="404040"/>
+        </w:rPr>
+        <w:t>tion's domain, thereby increasing vulnerability to attack.</w:t>
+      </w:r>
+    </w:p>
+    <w:p>
+      <w:r>
+        <w:rPr>
+          <w:rFonts w:ascii="Corbel" w:hAnsi="Corbel"/>
+          <w:i/>
+          <w:color w:val="404040"/>
+        </w:rPr>
+        <w:t>Affected Nodes:</w:t>
+      </w:r>
+    </w:p>
+    <w:p>
+      <w:r>
+        <w:rPr>
+          <w:noProof/>
+        </w:rPr>
+        <w:drawing>
+          <wp:inline distT="0" distB="0" distL="0" distR="0" wp14:anchorId="75DC57BD" wp14:editId="211ED789">
+            <wp:extent cx="5303520" cy="606845"/>
+            <wp:effectExtent l="0" t="0" r="0" b="0"/>
+            <wp:docPr id="2011428603" name="Picture 2011428603"/>
+            <wp:cNvGraphicFramePr>
+              <a:graphicFrameLocks xmlns:a="http://schemas.openxmlformats.org/drawingml/2006/main" noChangeAspect="1"/>
+            </wp:cNvGraphicFramePr>
+            <a:graphic xmlns:a="http://schemas.openxmlformats.org/drawingml/2006/main">
+              <a:graphicData uri="http://schemas.openxmlformats.org/drawingml/2006/picture">
+                <pic:pic xmlns:pic="http://schemas.openxmlformats.org/drawingml/2006/picture">
+                  <pic:nvPicPr>
+                    <pic:cNvPr id="0" name="Affected_Sample_2_part1.png"/>
+                    <pic:cNvPicPr/>
+                  </pic:nvPicPr>
+                  <pic:blipFill>
+                    <a:blip r:embed="rId16"/>
+                    <a:stretch>
+                      <a:fillRect/>
+                    </a:stretch>
+                  </pic:blipFill>
+                  <pic:spPr>
+                    <a:xfrm>
+                      <a:off x="0" y="0"/>
+                      <a:ext cx="5303520" cy="606845"/>
+                    </a:xfrm>
+                    <a:prstGeom prst="rect">
+                      <a:avLst/>
+                    </a:prstGeom>
+                  </pic:spPr>
+                </pic:pic>
+              </a:graphicData>
+            </a:graphic>
+          </wp:inline>
+        </w:drawing>
+      </w:r>
+    </w:p>
+    <w:p>
+      <w:r>
+        <w:rPr>
+          <w:rFonts w:ascii="Corbel" w:hAnsi="Corbel"/>
+          <w:i/>
+          <w:color w:val="404040"/>
+        </w:rPr>
+        <w:t>Evidence:</w:t>
+      </w:r>
+    </w:p>
+    <w:p>
+      <w:r>
+        <w:rPr>
+          <w:noProof/>
+        </w:rPr>
+        <w:drawing>
+          <wp:inline distT="0" distB="0" distL="0" distR="0" wp14:anchorId="373F6F92" wp14:editId="17A814D9">
+            <wp:extent cx="5303520" cy="259577"/>
+            <wp:effectExtent l="0" t="0" r="0" b="0"/>
+            <wp:docPr id="2011428604" name="Picture 2011428604"/>
+            <wp:cNvGraphicFramePr>
+              <a:graphicFrameLocks xmlns:a="http://schemas.openxmlformats.org/drawingml/2006/main" noChangeAspect="1"/>
+            </wp:cNvGraphicFramePr>
+            <a:graphic xmlns:a="http://schemas.openxmlformats.org/drawingml/2006/main">
+              <a:graphicData uri="http://schemas.openxmlformats.org/drawingml/2006/picture">
+                <pic:pic xmlns:pic="http://schemas.openxmlformats.org/drawingml/2006/picture">
+                  <pic:nvPicPr>
+                    <pic:cNvPr id="0" name="Evidence_Sample_2_part1.png"/>
+                    <pic:cNvPicPr/>
+                  </pic:nvPicPr>
+                  <pic:blipFill>
+                    <a:blip r:embed="rId17"/>
+                    <a:stretch>
+                      <a:fillRect/>
+                    </a:stretch>
+                  </pic:blipFill>
+                  <pic:spPr>
+                    <a:xfrm>
+                      <a:off x="0" y="0"/>
+                      <a:ext cx="5303520" cy="259577"/>
+                    </a:xfrm>
+                    <a:prstGeom prst="rect">
+                      <a:avLst/>
+                    </a:prstGeom>
+                  </pic:spPr>
+                </pic:pic>
+              </a:graphicData>
+            </a:graphic>
+          </wp:inline>
+        </w:drawing>
+      </w:r>
+    </w:p>
+    <w:p>
+      <w:r>
+        <w:rPr>
+          <w:rFonts w:ascii="Corbel" w:hAnsi="Corbel"/>
+          <w:color w:val="404040"/>
+        </w:rPr>
+        <w:t xml:space="preserve">2.    </w:t>
+      </w:r>
+      <w:r>
+        <w:rPr>
+          <w:rFonts w:ascii="Corbel" w:hAnsi="Corbel"/>
+          <w:b/>
+          <w:color w:val="404040"/>
+        </w:rPr>
+        <w:t>Remote SSH Service Exposed to Public Internet</w:t>
+      </w:r>
+      <w:r>
+        <w:rPr>
+          <w:rFonts w:ascii="Corbel" w:hAnsi="Corbel"/>
+          <w:color w:val="404040"/>
+        </w:rPr>
+        <w:t xml:space="preserve"> – During testing, OrbitalFire identified that remote administration services, including SSH, were exposed to the public internet. This exposure is often the result of misconfiguration or insufficient access controls, which significantly increase the attack surface. Publicly accessible SSH services are susceptible to brute-force and password-guessing attacks, which may lead to unauthorized system access. Additionally, newly disclosed vulnerabilities, including ze</w:t>
+      </w:r>
+      <w:r>
+        <w:rPr>
+          <w:rFonts w:ascii="Corbel" w:hAnsi="Corbel"/>
+          <w:color w:val="404040"/>
+        </w:rPr>
+        <w:t>ro-day exploits, could be leveraged by threat actors to further compromise exposed systems.</w:t>
+      </w:r>
+    </w:p>
+    <w:p>
+      <w:r>
+        <w:rPr>
+          <w:rFonts w:ascii="Corbel" w:hAnsi="Corbel"/>
+          <w:i/>
+          <w:color w:val="404040"/>
+        </w:rPr>
+        <w:t>Affected Nodes:</w:t>
+      </w:r>
+    </w:p>
+    <w:p>
+      <w:r>
+        <w:rPr>
+          <w:noProof/>
+        </w:rPr>
+        <w:drawing>
+          <wp:inline distT="0" distB="0" distL="0" distR="0" wp14:anchorId="26349662" wp14:editId="4A7A075E">
+            <wp:extent cx="5303520" cy="673139"/>
+            <wp:effectExtent l="0" t="0" r="0" b="0"/>
+            <wp:docPr id="2011428605" name="Picture 2011428605"/>
+            <wp:cNvGraphicFramePr>
+              <a:graphicFrameLocks xmlns:a="http://schemas.openxmlformats.org/drawingml/2006/main" noChangeAspect="1"/>
+            </wp:cNvGraphicFramePr>
+            <a:graphic xmlns:a="http://schemas.openxmlformats.org/drawingml/2006/main">
+              <a:graphicData uri="http://schemas.openxmlformats.org/drawingml/2006/picture">
+                <pic:pic xmlns:pic="http://schemas.openxmlformats.org/drawingml/2006/picture">
+                  <pic:nvPicPr>
+                    <pic:cNvPr id="0" name="Affected_Sample_3_part1.png"/>
+                    <pic:cNvPicPr/>
+                  </pic:nvPicPr>
+                  <pic:blipFill>
+                    <a:blip r:embed="rId18"/>
+                    <a:stretch>
+                      <a:fillRect/>
+                    </a:stretch>
+                  </pic:blipFill>
+                  <pic:spPr>
+                    <a:xfrm>
+                      <a:off x="0" y="0"/>
+                      <a:ext cx="5303520" cy="673139"/>
+                    </a:xfrm>
+                    <a:prstGeom prst="rect">
+                      <a:avLst/>
+                    </a:prstGeom>
+                  </pic:spPr>
+                </pic:pic>
+              </a:graphicData>
+            </a:graphic>
+          </wp:inline>
+        </w:drawing>
+      </w:r>
+    </w:p>
+    <w:p>
+      <w:r>
+        <w:rPr>
+          <w:rFonts w:ascii="Corbel" w:hAnsi="Corbel"/>
+          <w:i/>
+          <w:color w:val="404040"/>
+        </w:rPr>
+        <w:t>Evidence:</w:t>
+      </w:r>
+    </w:p>
+    <w:p>
+      <w:r>
+        <w:rPr>
+          <w:noProof/>
+        </w:rPr>
+        <w:drawing>
+          <wp:inline distT="0" distB="0" distL="0" distR="0" wp14:anchorId="46796BDA" wp14:editId="3B2B67B5">
+            <wp:extent cx="5303520" cy="356282"/>
+            <wp:effectExtent l="0" t="0" r="0" b="0"/>
+            <wp:docPr id="2011428606" name="Picture 2011428606"/>
+            <wp:cNvGraphicFramePr>
+              <a:graphicFrameLocks xmlns:a="http://schemas.openxmlformats.org/drawingml/2006/main" noChangeAspect="1"/>
+            </wp:cNvGraphicFramePr>
+            <a:graphic xmlns:a="http://schemas.openxmlformats.org/drawingml/2006/main">
+              <a:graphicData uri="http://schemas.openxmlformats.org/drawingml/2006/picture">
+                <pic:pic xmlns:pic="http://schemas.openxmlformats.org/drawingml/2006/picture">
+                  <pic:nvPicPr>
+                    <pic:cNvPr id="0" name="Evidence_Sample_3_part1.png"/>
+                    <pic:cNvPicPr/>
+                  </pic:nvPicPr>
+                  <pic:blipFill>
+                    <a:blip r:embed="rId19"/>
+                    <a:stretch>
+                      <a:fillRect/>
+                    </a:stretch>
+                  </pic:blipFill>
+                  <pic:spPr>
+                    <a:xfrm>
+                      <a:off x="0" y="0"/>
+                      <a:ext cx="5303520" cy="356282"/>
+                    </a:xfrm>
+                    <a:prstGeom prst="rect">
+                      <a:avLst/>
+                    </a:prstGeom>
+                  </pic:spPr>
+                </pic:pic>
+              </a:graphicData>
+            </a:graphic>
+          </wp:inline>
+        </w:drawing>
+      </w:r>
+    </w:p>
+    <w:p>
+      <w:pPr>
+        <w:keepNext/>
+        <w:keepLines/>
+        <w:spacing w:before="240" w:after="120" w:line="259" w:lineRule="auto"/>
+        <w:outlineLvl w:val="1"/>
+        <w:rPr>
+          <w:rFonts w:ascii="Handel Gothic D" w:eastAsia="DengXian Light" w:hAnsi="Handel Gothic D" w:cs="Times New Roman"/>
+          <w:b/>
+          <w:caps/>
+          <w:color w:val="FF6633"/>
+          <w:kern w:val="0"/>
+          <w:sz w:val="32"/>
+          <w:szCs w:val="26"/>
+          <w14:ligatures w14:val="none"/>
+        </w:rPr>
+      </w:pPr>
+      <w:r>
+        <w:rPr>
+          <w:rFonts w:ascii="Handel Gothic D" w:eastAsia="DengXian Light" w:hAnsi="Handel Gothic D" w:cs="Times New Roman"/>
+          <w:b/>
+          <w:caps/>
+          <w:color w:val="FF6633"/>
+          <w:kern w:val="0"/>
+          <w:sz w:val="32"/>
+          <w:szCs w:val="26"/>
+          <w14:ligatures w14:val="none"/>
+        </w:rPr>
+        <w:t>Low</w:t>
+      </w:r>
+    </w:p>
+    <w:p>
       <w:pPr>
         <w:numPr>
           <w:ilvl w:val="0"/>
@@ -4392,122 +4910,6 @@
           <w14:ligatures w14:val="none"/>
         </w:rPr>
       </w:pPr>
-      <w:r>
-        <w:rPr>
-          <w:rFonts w:ascii="Handel Gothic D" w:eastAsia="DengXian Light" w:hAnsi="Handel Gothic D" w:cs="Times New Roman"/>
-          <w:b/>
-          <w:caps/>
-          <w:color w:val="FF6633"/>
-          <w:kern w:val="0"/>
-          <w:sz w:val="32"/>
-          <w:szCs w:val="26"/>
-          <w14:ligatures w14:val="none"/>
-        </w:rPr>
-        <w:t>Medium</w:t>
-      </w:r>
-    </w:p>
-    <w:p>
-      <w:pPr>
-        <w:numPr>
-          <w:ilvl w:val="0"/>
-          <w:numId w:val="11"/>
-        </w:numPr>
-        <w:spacing w:line="259" w:lineRule="auto"/>
-        <w:contextualSpacing/>
-        <w:rPr>
-          <w:rFonts w:ascii="Corbel" w:eastAsia="Calibri" w:hAnsi="Corbel" w:cs="Arial"/>
-          <w:color w:val="404040"/>
-          <w:kern w:val="0"/>
-          <w:szCs w:val="22"/>
-          <w14:ligatures w14:val="none"/>
-        </w:rPr>
-      </w:pPr>
-      <w:r>
-        <w:rPr>
-          <w:rFonts w:ascii="Corbel" w:eastAsia="Calibri" w:hAnsi="Corbel" w:cs="Arial"/>
-          <w:color w:val="404040"/>
-          <w:kern w:val="0"/>
-          <w:szCs w:val="22"/>
-          <w14:ligatures w14:val="none"/>
-        </w:rPr>
-        <w:t>None</w:t>
-      </w:r>
-    </w:p>
-    <w:p>
-      <w:pPr>
-        <w:keepNext/>
-        <w:keepLines/>
-        <w:spacing w:before="240" w:after="120" w:line="259" w:lineRule="auto"/>
-        <w:outlineLvl w:val="1"/>
-        <w:rPr>
-          <w:rFonts w:ascii="Handel Gothic D" w:eastAsia="DengXian Light" w:hAnsi="Handel Gothic D" w:cs="Times New Roman"/>
-          <w:b/>
-          <w:caps/>
-          <w:color w:val="FF6633"/>
-          <w:kern w:val="0"/>
-          <w:sz w:val="32"/>
-          <w:szCs w:val="26"/>
-          <w14:ligatures w14:val="none"/>
-        </w:rPr>
-      </w:pPr>
-      <w:r>
-        <w:rPr>
-          <w:rFonts w:ascii="Handel Gothic D" w:eastAsia="DengXian Light" w:hAnsi="Handel Gothic D" w:cs="Times New Roman"/>
-          <w:b/>
-          <w:caps/>
-          <w:color w:val="FF6633"/>
-          <w:kern w:val="0"/>
-          <w:sz w:val="32"/>
-          <w:szCs w:val="26"/>
-          <w14:ligatures w14:val="none"/>
-        </w:rPr>
-        <w:t>Low</w:t>
-      </w:r>
-    </w:p>
-    <w:p>
-      <w:pPr>
-        <w:numPr>
-          <w:ilvl w:val="0"/>
-          <w:numId w:val="11"/>
-        </w:numPr>
-        <w:spacing w:line="259" w:lineRule="auto"/>
-        <w:contextualSpacing/>
-        <w:rPr>
-          <w:rFonts w:ascii="Corbel" w:eastAsia="Calibri" w:hAnsi="Corbel" w:cs="Arial"/>
-          <w:color w:val="404040"/>
-          <w:kern w:val="0"/>
-          <w:szCs w:val="22"/>
-          <w14:ligatures w14:val="none"/>
-        </w:rPr>
-      </w:pPr>
-      <w:r>
-        <w:rPr>
-          <w:rFonts w:ascii="Corbel" w:eastAsia="Calibri" w:hAnsi="Corbel" w:cs="Arial"/>
-          <w:color w:val="404040"/>
-          <w:kern w:val="0"/>
-          <w:szCs w:val="22"/>
-          <w14:ligatures w14:val="none"/>
-        </w:rPr>
-        <w:t>None</w:t>
-      </w:r>
-    </w:p>
-    <w:p>
-      <w:pPr>
-        <w:keepNext/>
-        <w:keepLines/>
-        <w:spacing w:before="240" w:after="120" w:line="259" w:lineRule="auto"/>
-        <w:outlineLvl w:val="1"/>
-        <w:rPr>
-          <w:rFonts w:ascii="Handel Gothic D" w:eastAsia="DengXian Light" w:hAnsi="Handel Gothic D" w:cs="Times New Roman"/>
-          <w:b/>
-          <w:caps/>
-          <w:color w:val="FF6633"/>
-          <w:kern w:val="0"/>
-          <w:sz w:val="32"/>
-          <w:szCs w:val="26"/>
-          <w14:ligatures w14:val="none"/>
-        </w:rPr>
-      </w:pPr>
     </w:p>
     <w:p/>
     <w:p/>
@@ -4608,227 +5010,103 @@
           <w14:ligatures w14:val="none"/>
         </w:rPr>
       </w:pPr>
-      <w:bookmarkStart w:id="9" w:name="_Hlk201240797"/>
-      <w:r>
-        <w:rPr>
-          <w:rFonts w:ascii="Corbel" w:eastAsia="Calibri" w:hAnsi="Corbel" w:cs="Arial"/>
+      <w:r>
+        <w:rPr>
+          <w:rFonts w:ascii="Corbel" w:hAnsi="Corbel"/>
           <w:b/>
-          <w:bCs/>
-          <w:color w:val="404040"/>
-          <w:kern w:val="0"/>
-          <w:szCs w:val="22"/>
-          <w14:ligatures w14:val="none"/>
-        </w:rPr>
-        <w:t xml:space="preserve">Doppelganger Domains </w:t>
-      </w:r>
-      <w:bookmarkStart w:id="10" w:name="_Hlk207017175"/>
-      <w:r>
-        <w:rPr>
-          <w:rFonts w:ascii="Corbel" w:eastAsia="Calibri" w:hAnsi="Corbel" w:cs="Arial"/>
-          <w:b/>
-          <w:bCs/>
-          <w:color w:val="404040"/>
-          <w:kern w:val="0"/>
-          <w:szCs w:val="22"/>
-          <w14:ligatures w14:val="none"/>
-        </w:rPr>
-        <w:t>–</w:t>
-      </w:r>
-      <w:r>
-        <w:rPr>
-          <w:rFonts w:ascii="Corbel" w:eastAsia="Calibri" w:hAnsi="Corbel" w:cs="Arial"/>
-          <w:color w:val="404040"/>
-          <w:kern w:val="0"/>
-          <w:szCs w:val="22"/>
-          <w14:ligatures w14:val="none"/>
-        </w:rPr>
-        <w:t xml:space="preserve"> </w:t>
-      </w:r>
-      <w:bookmarkEnd w:id="10"/>
-      <w:r>
-        <w:rPr>
-          <w:rFonts w:ascii="Corbel" w:eastAsia="Calibri" w:hAnsi="Corbel" w:cs="Arial"/>
-          <w:color w:val="404040"/>
-          <w:kern w:val="0"/>
-          <w14:ligatures w14:val="none"/>
-        </w:rPr>
-        <w:t>A Doppelganger domain is a registered domain that could</w:t>
-      </w:r>
-      <w:r>
-        <w:rPr>
-          <w:rFonts w:ascii="Corbel" w:eastAsia="Calibri" w:hAnsi="Corbel" w:cs="Arial"/>
-          <w:color w:val="404040"/>
-          <w:kern w:val="0"/>
-          <w:szCs w:val="22"/>
-          <w14:ligatures w14:val="none"/>
+          <w:color w:val="404040"/>
+        </w:rPr>
+        <w:t>Doppelganger Domains</w:t>
+      </w:r>
+      <w:r>
+        <w:rPr>
+          <w:rFonts w:ascii="Corbel" w:hAnsi="Corbel"/>
+          <w:color w:val="404040"/>
+        </w:rPr>
+        <w:t xml:space="preserve"> – A Doppelganger domain is a registered domain that could</w:t>
+      </w:r>
+      <w:r>
+        <w:rPr>
+          <w:rFonts w:ascii="Corbel" w:hAnsi="Corbel"/>
+          <w:color w:val="404040"/>
         </w:rPr>
         <w:br/>
-      </w:r>
-      <w:r>
-        <w:rPr>
-          <w:rFonts w:ascii="Corbel" w:eastAsia="Calibri" w:hAnsi="Corbel" w:cs="Arial"/>
-          <w:color w:val="404040"/>
-          <w:kern w:val="0"/>
-          <w14:ligatures w14:val="none"/>
-        </w:rPr>
-        <w:t>potentially take advantage of common typing mistakes or browser assumptions.</w:t>
-      </w:r>
-      <w:r>
-        <w:rPr>
-          <w:rFonts w:ascii="Corbel" w:eastAsia="Calibri" w:hAnsi="Corbel" w:cs="Arial"/>
-          <w:color w:val="404040"/>
-          <w:kern w:val="0"/>
-          <w:szCs w:val="22"/>
-          <w14:ligatures w14:val="none"/>
-        </w:rPr>
-        <w:t xml:space="preserve"> During </w:t>
-      </w:r>
-      <w:bookmarkEnd w:id="9"/>
-      <w:r>
-        <w:rPr>
-          <w:rFonts w:ascii="Corbel" w:eastAsia="Calibri" w:hAnsi="Corbel" w:cs="Arial"/>
-          <w:color w:val="404040"/>
-          <w:kern w:val="0"/>
-          <w:szCs w:val="22"/>
-          <w14:ligatures w14:val="none"/>
-        </w:rPr>
-        <w:t xml:space="preserve">testing against targeted domains, </w:t>
-      </w:r>
-      <w:bookmarkStart w:id="11" w:name="_Hlk212473705"/>
-      <w:r>
-        <w:rPr>
-          <w:rFonts w:ascii="Corbel" w:eastAsia="Calibri" w:hAnsi="Corbel" w:cs="Arial"/>
-          <w:color w:val="404040"/>
-          <w:kern w:val="0"/>
-          <w:szCs w:val="22"/>
-          <w14:ligatures w14:val="none"/>
-        </w:rPr>
-        <w:t>NUMBER (#)</w:t>
-      </w:r>
-      <w:r>
-        <w:rPr>
-          <w:rFonts w:ascii="Corbel" w:eastAsia="Calibri" w:hAnsi="Corbel" w:cs="Arial"/>
-          <w:color w:val="404040"/>
-          <w:kern w:val="0"/>
-          <w:szCs w:val="22"/>
-          <w14:ligatures w14:val="none"/>
-        </w:rPr>
-        <w:t xml:space="preserve"> </w:t>
-      </w:r>
-      <w:bookmarkEnd w:id="11"/>
-      <w:r>
-        <w:rPr>
-          <w:rFonts w:ascii="Corbel" w:eastAsia="Calibri" w:hAnsi="Corbel" w:cs="Arial"/>
-          <w:color w:val="404040"/>
-          <w:kern w:val="0"/>
-          <w:szCs w:val="22"/>
-          <w14:ligatures w14:val="none"/>
-        </w:rPr>
-        <w:t>doppelganger domains were discovered to be registered.</w:t>
-      </w:r>
-      <w:r>
-        <w:rPr>
-          <w:rFonts w:ascii="Corbel" w:eastAsia="Calibri" w:hAnsi="Corbel" w:cs="Arial"/>
-          <w:color w:val="404040"/>
-          <w:kern w:val="0"/>
-          <w:szCs w:val="22"/>
-          <w14:ligatures w14:val="none"/>
-        </w:rPr>
-        <w:t xml:space="preserve"> [</w:t>
-      </w:r>
-      <w:r>
-        <w:rPr>
-          <w:rFonts w:ascii="Corbel" w:eastAsia="Calibri" w:hAnsi="Corbel" w:cs="Arial"/>
-          <w:color w:val="404040"/>
-          <w:kern w:val="0"/>
-          <w:szCs w:val="22"/>
-          <w14:ligatures w14:val="none"/>
-        </w:rPr>
-        <w:t>CUSTOMER NAME</w:t>
-      </w:r>
-      <w:r>
-        <w:rPr>
-          <w:rFonts w:ascii="Corbel" w:eastAsia="Calibri" w:hAnsi="Corbel" w:cs="Arial"/>
-          <w:color w:val="404040"/>
-          <w:kern w:val="0"/>
-          <w:szCs w:val="22"/>
-          <w14:ligatures w14:val="none"/>
-        </w:rPr>
-        <w:t>]’s</w:t>
-      </w:r>
-      <w:r>
-        <w:rPr>
-          <w:rFonts w:ascii="Corbel" w:eastAsia="Calibri" w:hAnsi="Corbel" w:cs="Arial"/>
-          <w:color w:val="404040"/>
-          <w:kern w:val="0"/>
-          <w:szCs w:val="22"/>
-          <w14:ligatures w14:val="none"/>
-        </w:rPr>
-        <w:t xml:space="preserve"> network staff should review these results and determine the legitimacy of these domains.</w:t>
-      </w:r>
-      <w:r>
-        <w:rPr>
-          <w:rFonts w:ascii="Corbel" w:eastAsia="Calibri" w:hAnsi="Corbel" w:cs="Arial"/>
-          <w:color w:val="404040"/>
-          <w:kern w:val="0"/>
-          <w:szCs w:val="22"/>
-          <w14:ligatures w14:val="none"/>
+        <w:t>potentially take advantage of common typing mistakes or browser assumptions. During testing against targeted domains, nine (9) doppelganger domains were discovered to be registered. Rheinard Zadanowsky’s network staff should review these results and determine the legitimacy of these domains.</w:t>
+      </w:r>
+      <w:r>
+        <w:rPr>
+          <w:rFonts w:ascii="Corbel" w:hAnsi="Corbel"/>
+          <w:color w:val="404040"/>
         </w:rPr>
         <w:br/>
       </w:r>
-      <w:r>
-        <w:rPr>
-          <w:rFonts w:ascii="Corbel" w:eastAsia="Calibri" w:hAnsi="Corbel" w:cs="Arial"/>
+    </w:p>
+    <w:p>
+      <w:pPr>
+        <w:spacing w:after="0" w:line="259" w:lineRule="auto"/>
+        <w:ind w:left="360"/>
+        <w:contextualSpacing/>
+        <w:rPr>
+          <w:rFonts w:ascii="Corbel" w:eastAsia="Calibri" w:hAnsi="Corbel" w:cs="Arial"/>
+          <w:color w:val="404040"/>
+          <w:kern w:val="0"/>
+          <w:szCs w:val="22"/>
+          <w14:ligatures w14:val="none"/>
+        </w:rPr>
+      </w:pPr>
+      <w:r>
+        <w:rPr>
+          <w:rFonts w:ascii="Corbel" w:hAnsi="Corbel"/>
           <w:i/>
-          <w:iCs/>
-          <w:color w:val="404040"/>
-          <w:kern w:val="0"/>
-          <w:szCs w:val="22"/>
-          <w14:ligatures w14:val="none"/>
+          <w:color w:val="404040"/>
         </w:rPr>
         <w:t>Reference:</w:t>
       </w:r>
-      <w:r>
-        <w:rPr>
-          <w:rFonts w:ascii="Corbel" w:eastAsia="Calibri" w:hAnsi="Corbel" w:cs="Arial"/>
+    </w:p>
+    <w:p>
+      <w:pPr>
+        <w:spacing w:after="120"/>
+        <w:ind w:left="360"/>
+      </w:pPr>
+      <w:r>
+        <w:rPr>
           <w:noProof/>
-          <w:color w:val="404040"/>
-          <w:kern w:val="0"/>
-          <w:szCs w:val="22"/>
-          <w14:ligatures w14:val="none"/>
-        </w:rPr>
-        <w:t xml:space="preserve"> </w:t>
-      </w:r>
-      <w:r>
-        <w:rPr>
-          <w:rFonts w:ascii="Corbel" w:eastAsia="Calibri" w:hAnsi="Corbel" w:cs="Arial"/>
-          <w:color w:val="404040"/>
-          <w:kern w:val="0"/>
-          <w:szCs w:val="22"/>
-          <w14:ligatures w14:val="none"/>
-        </w:rPr>
-        <w:br/>
-      </w:r>
-      <w:r>
-        <w:rPr>
-          <w:rFonts w:ascii="Corbel" w:eastAsia="Calibri" w:hAnsi="Corbel" w:cs="Arial"/>
-          <w:noProof/>
-          <w:color w:val="404040"/>
-          <w:kern w:val="0"/>
-          <w:szCs w:val="22"/>
-          <w14:ligatures w14:val="none"/>
-        </w:rPr>
-        <w:t>DOPPELGANGER DOMAINS TABLE</w:t>
-      </w:r>
-      <w:r>
-        <w:rPr>
-          <w:rFonts w:ascii="Corbel" w:eastAsia="Calibri" w:hAnsi="Corbel" w:cs="Arial"/>
-          <w:color w:val="404040"/>
-          <w:kern w:val="0"/>
-          <w:szCs w:val="22"/>
-          <w14:ligatures w14:val="none"/>
-        </w:rPr>
-        <w:br/>
+        </w:rPr>
+        <w:drawing>
+          <wp:inline distT="0" distB="0" distL="0" distR="0" wp14:anchorId="0B36589C" wp14:editId="3EF20195">
+            <wp:extent cx="5760720" cy="2110195"/>
+            <wp:effectExtent l="0" t="0" r="0" b="0"/>
+            <wp:docPr id="2011428607" name="Picture 2011428607"/>
+            <wp:cNvGraphicFramePr>
+              <a:graphicFrameLocks xmlns:a="http://schemas.openxmlformats.org/drawingml/2006/main" noChangeAspect="1"/>
+            </wp:cNvGraphicFramePr>
+            <a:graphic xmlns:a="http://schemas.openxmlformats.org/drawingml/2006/main">
+              <a:graphicData uri="http://schemas.openxmlformats.org/drawingml/2006/picture">
+                <pic:pic xmlns:pic="http://schemas.openxmlformats.org/drawingml/2006/picture">
+                  <pic:nvPicPr>
+                    <pic:cNvPr id="0" name="Doppelganger-Domains-Table-8.png"/>
+                    <pic:cNvPicPr/>
+                  </pic:nvPicPr>
+                  <pic:blipFill>
+                    <a:blip r:embed="rId20"/>
+                    <a:stretch>
+                      <a:fillRect/>
+                    </a:stretch>
+                  </pic:blipFill>
+                  <pic:spPr>
+                    <a:xfrm>
+                      <a:off x="0" y="0"/>
+                      <a:ext cx="5760720" cy="2110195"/>
+                    </a:xfrm>
+                    <a:prstGeom prst="rect">
+                      <a:avLst/>
+                    </a:prstGeom>
+                  </pic:spPr>
+                </pic:pic>
+              </a:graphicData>
+            </a:graphic>
+          </wp:inline>
+        </w:drawing>
       </w:r>
     </w:p>
     <w:p>
@@ -4849,37 +5127,101 @@
       </w:pPr>
       <w:r>
         <w:rPr>
-          <w:rFonts w:ascii="Corbel" w:eastAsia="Calibri" w:hAnsi="Corbel" w:cs="Arial"/>
+          <w:rFonts w:ascii="Corbel" w:hAnsi="Corbel"/>
           <w:b/>
-          <w:bCs/>
-          <w:color w:val="404040"/>
-          <w:kern w:val="0"/>
-          <w:szCs w:val="22"/>
-          <w14:ligatures w14:val="none"/>
-        </w:rPr>
-        <w:t>Domain Information Gathering –</w:t>
-      </w:r>
-      <w:r>
-        <w:rPr>
-          <w:rFonts w:ascii="Corbel" w:eastAsia="Calibri" w:hAnsi="Corbel" w:cs="Arial"/>
-          <w:color w:val="404040"/>
-          <w:kern w:val="0"/>
-          <w:szCs w:val="22"/>
-          <w14:ligatures w14:val="none"/>
-        </w:rPr>
-        <w:t xml:space="preserve"> One of the first steps from an attacker is to gather as much information as possible about the target via domain lookups, identifying subdomains and mail servers, etc. The objective of this process is to gather as much information as possible and map out the external environment of the organization, which can later be used in attacks such as social engineering. It should be noted that both the www. and non-www. versions of root domains were queried against DNS servers for information.</w:t>
-      </w:r>
-      <w:r>
-        <w:rPr>
-          <w:rFonts w:ascii="Corbel" w:eastAsia="Calibri" w:hAnsi="Corbel" w:cs="Arial"/>
-          <w:color w:val="404040"/>
-          <w:kern w:val="0"/>
-          <w:szCs w:val="22"/>
-          <w14:ligatures w14:val="none"/>
+          <w:color w:val="404040"/>
+        </w:rPr>
+        <w:t>Domain Information Gathering</w:t>
+      </w:r>
+      <w:r>
+        <w:rPr>
+          <w:rFonts w:ascii="Corbel" w:hAnsi="Corbel"/>
+          <w:color w:val="404040"/>
+        </w:rPr>
+        <w:t xml:space="preserve"> – One of the first steps from an attacker is to gather as much information as possible about the target via domain lookups, identifying subdomains and mail servers, etc. The objective of this process is to gather as much information as possible and map out the external environment of the organization, which can later be used in attacks such as social engineering. It should be noted that both the www. and non-www. versions of root domains were queried against DNS servers for information.</w:t>
+      </w:r>
+      <w:r>
+        <w:rPr>
+          <w:rFonts w:ascii="Corbel" w:hAnsi="Corbel"/>
+          <w:color w:val="404040"/>
         </w:rPr>
         <w:br/>
       </w:r>
-      <w:r>
+    </w:p>
+    <w:p>
+      <w:pPr>
+        <w:spacing w:after="0" w:line="259" w:lineRule="auto"/>
+        <w:ind w:left="360"/>
+        <w:contextualSpacing/>
+        <w:rPr>
+          <w:rFonts w:ascii="Corbel" w:eastAsia="Calibri" w:hAnsi="Corbel" w:cs="Arial"/>
+          <w:noProof/>
+          <w:color w:val="404040"/>
+          <w:kern w:val="0"/>
+          <w:szCs w:val="22"/>
+          <w14:ligatures w14:val="none"/>
+        </w:rPr>
+      </w:pPr>
+      <w:r>
+        <w:rPr>
+          <w:rFonts w:ascii="Corbel" w:hAnsi="Corbel"/>
+          <w:i/>
+          <w:color w:val="404040"/>
+        </w:rPr>
+        <w:t>Reference:</w:t>
+      </w:r>
+    </w:p>
+    <w:p>
+      <w:pPr>
+        <w:spacing w:after="120"/>
+        <w:ind w:left="360"/>
+      </w:pPr>
+      <w:r>
+        <w:rPr>
+          <w:noProof/>
+        </w:rPr>
+        <w:drawing>
+          <wp:inline distT="0" distB="0" distL="0" distR="0" wp14:anchorId="653391B6" wp14:editId="0669D221">
+            <wp:extent cx="5760720" cy="1630605"/>
+            <wp:effectExtent l="0" t="0" r="0" b="0"/>
+            <wp:docPr id="2011428608" name="Picture 2011428608"/>
+            <wp:cNvGraphicFramePr>
+              <a:graphicFrameLocks xmlns:a="http://schemas.openxmlformats.org/drawingml/2006/main" noChangeAspect="1"/>
+            </wp:cNvGraphicFramePr>
+            <a:graphic xmlns:a="http://schemas.openxmlformats.org/drawingml/2006/main">
+              <a:graphicData uri="http://schemas.openxmlformats.org/drawingml/2006/picture">
+                <pic:pic xmlns:pic="http://schemas.openxmlformats.org/drawingml/2006/picture">
+                  <pic:nvPicPr>
+                    <pic:cNvPr id="0" name="Sub-Domain-Table-6.png"/>
+                    <pic:cNvPicPr/>
+                  </pic:nvPicPr>
+                  <pic:blipFill>
+                    <a:blip r:embed="rId21"/>
+                    <a:stretch>
+                      <a:fillRect/>
+                    </a:stretch>
+                  </pic:blipFill>
+                  <pic:spPr>
+                    <a:xfrm>
+                      <a:off x="0" y="0"/>
+                      <a:ext cx="5760720" cy="1630605"/>
+                    </a:xfrm>
+                    <a:prstGeom prst="rect">
+                      <a:avLst/>
+                    </a:prstGeom>
+                  </pic:spPr>
+                </pic:pic>
+              </a:graphicData>
+            </a:graphic>
+          </wp:inline>
+        </w:drawing>
+      </w:r>
+    </w:p>
+    <w:p>
+      <w:pPr>
+        <w:spacing w:line="259" w:lineRule="auto"/>
+        <w:ind w:left="360"/>
+        <w:contextualSpacing/>
         <w:rPr>
           <w:rFonts w:ascii="Corbel" w:eastAsia="Calibri" w:hAnsi="Corbel" w:cs="Arial"/>
           <w:i/>
@@ -4889,94 +5231,152 @@
           <w:szCs w:val="22"/>
           <w14:ligatures w14:val="none"/>
         </w:rPr>
+      </w:pPr>
+      <w:r>
+        <w:rPr>
+          <w:rFonts w:ascii="Corbel" w:eastAsia="Calibri" w:hAnsi="Corbel" w:cs="Arial"/>
+          <w:color w:val="404040"/>
+          <w:kern w:val="0"/>
+          <w:szCs w:val="22"/>
+          <w14:ligatures w14:val="none"/>
+        </w:rPr>
+        <w:br/>
+        <w:t xml:space="preserve">Furthermore, the consultant reviewed the DNS records provided by the domains and </w:t>
+      </w:r>
+      <w:r>
+        <w:rPr>
+          <w:rFonts w:ascii="Corbel" w:eastAsia="Calibri" w:hAnsi="Corbel" w:cs="Arial"/>
+          <w:color w:val="404040"/>
+          <w:kern w:val="0"/>
+          <w:szCs w:val="22"/>
+          <w14:ligatures w14:val="none"/>
+        </w:rPr>
+        <w:lastRenderedPageBreak/>
+        <w:t>subdomains discovered to attempt identifying if any valuable information could be obtained. No sensitive information has been discovered from this information.</w:t>
+      </w:r>
+      <w:r>
+        <w:rPr>
+          <w:rFonts w:ascii="Corbel" w:eastAsia="Calibri" w:hAnsi="Corbel" w:cs="Arial"/>
+          <w:color w:val="404040"/>
+          <w:kern w:val="0"/>
+          <w:szCs w:val="22"/>
+          <w14:ligatures w14:val="none"/>
+        </w:rPr>
+        <w:br/>
+      </w:r>
+    </w:p>
+    <w:p>
+      <w:pPr>
+        <w:spacing w:after="0" w:line="259" w:lineRule="auto"/>
+        <w:ind w:left="360"/>
+        <w:contextualSpacing/>
+        <w:rPr>
+          <w:rFonts w:ascii="Corbel" w:eastAsia="Calibri" w:hAnsi="Corbel" w:cs="Arial"/>
+          <w:color w:val="404040"/>
+          <w:kern w:val="0"/>
+          <w:szCs w:val="22"/>
+          <w14:ligatures w14:val="none"/>
+        </w:rPr>
+      </w:pPr>
+      <w:r>
+        <w:rPr>
+          <w:rFonts w:ascii="Corbel" w:hAnsi="Corbel"/>
+          <w:i/>
+          <w:color w:val="404040"/>
+        </w:rPr>
         <w:t>Reference:</w:t>
       </w:r>
-      <w:r>
-        <w:rPr>
-          <w:rFonts w:ascii="Corbel" w:eastAsia="Calibri" w:hAnsi="Corbel" w:cs="Arial"/>
-          <w:color w:val="404040"/>
-          <w:kern w:val="0"/>
-          <w:szCs w:val="22"/>
-          <w14:ligatures w14:val="none"/>
-        </w:rPr>
-        <w:br/>
-      </w:r>
-      <w:r>
-        <w:rPr>
-          <w:rFonts w:ascii="Corbel" w:eastAsia="Calibri" w:hAnsi="Corbel" w:cs="Arial"/>
+    </w:p>
+    <w:p>
+      <w:pPr>
+        <w:spacing w:after="120"/>
+        <w:ind w:left="360"/>
+      </w:pPr>
+      <w:r>
+        <w:rPr>
           <w:noProof/>
-          <w:color w:val="404040"/>
-          <w:kern w:val="0"/>
-          <w:szCs w:val="22"/>
-          <w14:ligatures w14:val="none"/>
-        </w:rPr>
-        <w:t>SUB DOMAIN TABLE</w:t>
-      </w:r>
-      <w:r>
-        <w:rPr>
-          <w:rFonts w:ascii="Corbel" w:eastAsia="Calibri" w:hAnsi="Corbel" w:cs="Arial"/>
-          <w:color w:val="404040"/>
-          <w:kern w:val="0"/>
-          <w:szCs w:val="22"/>
-          <w14:ligatures w14:val="none"/>
-        </w:rPr>
-        <w:br/>
-        <w:t>Furthermore, the consultant reviewed the DNS records provided by the domains and subdomains discovered to attempt identifying if any valuable information could be obtained. No sensitive information has been discovered from this information.</w:t>
-      </w:r>
-      <w:r>
-        <w:rPr>
-          <w:rFonts w:ascii="Corbel" w:eastAsia="Calibri" w:hAnsi="Corbel" w:cs="Arial"/>
-          <w:color w:val="404040"/>
-          <w:kern w:val="0"/>
-          <w:szCs w:val="22"/>
-          <w14:ligatures w14:val="none"/>
-        </w:rPr>
-        <w:br/>
-      </w:r>
-      <w:bookmarkStart w:id="12" w:name="_Hlk212031658"/>
-      <w:r>
-        <w:rPr>
-          <w:rFonts w:ascii="Corbel" w:eastAsia="Calibri" w:hAnsi="Corbel" w:cs="Arial"/>
-          <w:i/>
-          <w:iCs/>
-          <w:color w:val="404040"/>
-          <w:kern w:val="0"/>
-          <w:szCs w:val="22"/>
-          <w14:ligatures w14:val="none"/>
-        </w:rPr>
-        <w:t>Reference:</w:t>
-      </w:r>
-      <w:r>
-        <w:rPr>
-          <w:rFonts w:ascii="Corbel" w:eastAsia="Calibri" w:hAnsi="Corbel" w:cs="Arial"/>
-          <w:color w:val="404040"/>
-          <w:kern w:val="0"/>
-          <w:szCs w:val="22"/>
-          <w14:ligatures w14:val="none"/>
-        </w:rPr>
-        <w:br/>
-      </w:r>
-      <w:r>
-        <w:rPr>
-          <w:rFonts w:ascii="Corbel" w:eastAsia="Calibri" w:hAnsi="Corbel" w:cs="Arial"/>
+        </w:rPr>
+        <w:drawing>
+          <wp:inline distT="0" distB="0" distL="0" distR="0" wp14:anchorId="24AEFBC1" wp14:editId="67FCE4B1">
+            <wp:extent cx="5303520" cy="867470"/>
+            <wp:effectExtent l="0" t="0" r="0" b="0"/>
+            <wp:docPr id="2011428609" name="Picture 2011428609"/>
+            <wp:cNvGraphicFramePr>
+              <a:graphicFrameLocks xmlns:a="http://schemas.openxmlformats.org/drawingml/2006/main" noChangeAspect="1"/>
+            </wp:cNvGraphicFramePr>
+            <a:graphic xmlns:a="http://schemas.openxmlformats.org/drawingml/2006/main">
+              <a:graphicData uri="http://schemas.openxmlformats.org/drawingml/2006/picture">
+                <pic:pic xmlns:pic="http://schemas.openxmlformats.org/drawingml/2006/picture">
+                  <pic:nvPicPr>
+                    <pic:cNvPr id="0" name="DNS-Record1.png"/>
+                    <pic:cNvPicPr/>
+                  </pic:nvPicPr>
+                  <pic:blipFill>
+                    <a:blip r:embed="rId22"/>
+                    <a:stretch>
+                      <a:fillRect/>
+                    </a:stretch>
+                  </pic:blipFill>
+                  <pic:spPr>
+                    <a:xfrm>
+                      <a:off x="0" y="0"/>
+                      <a:ext cx="5303520" cy="867470"/>
+                    </a:xfrm>
+                    <a:prstGeom prst="rect">
+                      <a:avLst/>
+                    </a:prstGeom>
+                  </pic:spPr>
+                </pic:pic>
+              </a:graphicData>
+            </a:graphic>
+          </wp:inline>
+        </w:drawing>
+      </w:r>
+    </w:p>
+    <w:p>
+      <w:pPr>
+        <w:spacing w:after="120"/>
+        <w:ind w:left="360"/>
+      </w:pPr>
+      <w:r>
+        <w:rPr>
           <w:noProof/>
-          <w:color w:val="404040"/>
-          <w:kern w:val="0"/>
-          <w:szCs w:val="22"/>
-          <w14:ligatures w14:val="none"/>
-        </w:rPr>
-        <w:t>DNS RECORD(S) TABLE</w:t>
-      </w:r>
-      <w:bookmarkEnd w:id="12"/>
-      <w:r>
-        <w:rPr>
-          <w:rFonts w:ascii="Corbel" w:eastAsia="Calibri" w:hAnsi="Corbel" w:cs="Arial"/>
-          <w:color w:val="404040"/>
-          <w:kern w:val="0"/>
-          <w:szCs w:val="22"/>
-          <w14:ligatures w14:val="none"/>
-        </w:rPr>
-        <w:br/>
+        </w:rPr>
+        <w:drawing>
+          <wp:inline distT="0" distB="0" distL="0" distR="0" wp14:anchorId="6BDE4260" wp14:editId="48A5422E">
+            <wp:extent cx="5303520" cy="1394038"/>
+            <wp:effectExtent l="0" t="0" r="0" b="0"/>
+            <wp:docPr id="2011428610" name="Picture 2011428610"/>
+            <wp:cNvGraphicFramePr>
+              <a:graphicFrameLocks xmlns:a="http://schemas.openxmlformats.org/drawingml/2006/main" noChangeAspect="1"/>
+            </wp:cNvGraphicFramePr>
+            <a:graphic xmlns:a="http://schemas.openxmlformats.org/drawingml/2006/main">
+              <a:graphicData uri="http://schemas.openxmlformats.org/drawingml/2006/picture">
+                <pic:pic xmlns:pic="http://schemas.openxmlformats.org/drawingml/2006/picture">
+                  <pic:nvPicPr>
+                    <pic:cNvPr id="0" name="DNS-Record1_part2.png"/>
+                    <pic:cNvPicPr/>
+                  </pic:nvPicPr>
+                  <pic:blipFill>
+                    <a:blip r:embed="rId23"/>
+                    <a:stretch>
+                      <a:fillRect/>
+                    </a:stretch>
+                  </pic:blipFill>
+                  <pic:spPr>
+                    <a:xfrm>
+                      <a:off x="0" y="0"/>
+                      <a:ext cx="5303520" cy="1394038"/>
+                    </a:xfrm>
+                    <a:prstGeom prst="rect">
+                      <a:avLst/>
+                    </a:prstGeom>
+                  </pic:spPr>
+                </pic:pic>
+              </a:graphicData>
+            </a:graphic>
+          </wp:inline>
+        </w:drawing>
       </w:r>
     </w:p>
     <w:p>
@@ -5038,6 +5438,824 @@
       <w:bookmarkEnd w:id="8"/>
     </w:p>
     <w:p>
+      <w:r>
+        <w:rPr>
+          <w:rFonts w:ascii="Corbel" w:hAnsi="Corbel"/>
+          <w:color w:val="F26522"/>
+        </w:rPr>
+        <w:t>External</w:t>
+      </w:r>
+    </w:p>
+    <w:p>
+      <w:pPr>
+        <w:pStyle w:val="ActivityBullet"/>
+      </w:pPr>
+      <w:r>
+        <w:t>2026-01-29 13:52:47-0500PM ET exposurescout Initiating ExposureScout module.</w:t>
+      </w:r>
+    </w:p>
+    <w:p>
+      <w:pPr>
+        <w:pStyle w:val="ActivityBullet"/>
+      </w:pPr>
+      <w:r>
+        <w:t>2026-01-29 13:52:59-0500PM ET exposurescout Enumerating subdomains from one (1) domain.</w:t>
+      </w:r>
+    </w:p>
+    <w:p>
+      <w:pPr>
+        <w:pStyle w:val="ActivityBullet"/>
+      </w:pPr>
+      <w:r>
+        <w:t>2026-01-29 13:54:13-0500PM ET exposurescout Completed subdomain enumeration.</w:t>
+      </w:r>
+    </w:p>
+    <w:p>
+      <w:pPr>
+        <w:pStyle w:val="ActivityBullet"/>
+      </w:pPr>
+      <w:r>
+        <w:t>2026-01-29 13:54:13-0500PM ET exposurescout Beginning DNS enumeration.</w:t>
+      </w:r>
+    </w:p>
+    <w:p>
+      <w:pPr>
+        <w:pStyle w:val="ActivityBullet"/>
+      </w:pPr>
+      <w:r>
+        <w:t>2026-01-29 13:55:18-0500PM ET exposurescout Completed DNS enumeration.</w:t>
+      </w:r>
+    </w:p>
+    <w:p>
+      <w:pPr>
+        <w:pStyle w:val="ActivityBullet"/>
+      </w:pPr>
+      <w:r>
+        <w:t>2026-01-29 13:55:18-0500PM ET exposurescout Enumerating doppelganger domains for one (1) domain.</w:t>
+      </w:r>
+    </w:p>
+    <w:p>
+      <w:pPr>
+        <w:pStyle w:val="ActivityBullet"/>
+      </w:pPr>
+      <w:r>
+        <w:t>2026-01-29 13:56:28-0500PM ET exposurescout Ten (10) new doppelganger domains discovered.</w:t>
+      </w:r>
+    </w:p>
+    <w:p>
+      <w:pPr>
+        <w:pStyle w:val="ActivityBullet"/>
+      </w:pPr>
+      <w:r>
+        <w:t>2026-01-29 13:56:28-0500PM ET exposurescout Completed doppelganger domain enumeration.</w:t>
+      </w:r>
+    </w:p>
+    <w:p>
+      <w:pPr>
+        <w:pStyle w:val="ActivityBullet"/>
+      </w:pPr>
+      <w:r>
+        <w:t>2026-01-29 13:56:28-0500PM ET exposurescout Running WHOIS commands on eight (8) domains.</w:t>
+      </w:r>
+    </w:p>
+    <w:p>
+      <w:pPr>
+        <w:pStyle w:val="ActivityBullet"/>
+      </w:pPr>
+      <w:r>
+        <w:t>2026-01-29 13:57:33-0500PM ET exposurescout Importing eight (8) WHOIS results into the database.</w:t>
+      </w:r>
+    </w:p>
+    <w:p>
+      <w:pPr>
+        <w:pStyle w:val="ActivityBullet"/>
+      </w:pPr>
+      <w:r>
+        <w:t>2026-01-29 13:57:34-0500PM ET exposurescout Completed recursive WHOIS lookups</w:t>
+      </w:r>
+    </w:p>
+    <w:p>
+      <w:pPr>
+        <w:pStyle w:val="ActivityBullet"/>
+      </w:pPr>
+      <w:r>
+        <w:t>2026-01-29 13:57:34-0500PM ET exposurescout Email scraping module started.</w:t>
+      </w:r>
+    </w:p>
+    <w:p>
+      <w:pPr>
+        <w:pStyle w:val="ActivityBullet"/>
+      </w:pPr>
+      <w:r>
+        <w:t>2026-01-29 13:58:40-0500PM ET exposurescout Completed email scraping.</w:t>
+      </w:r>
+    </w:p>
+    <w:p>
+      <w:pPr>
+        <w:pStyle w:val="ActivityBullet"/>
+      </w:pPr>
+      <w:r>
+        <w:t>2026-01-29 13:58:40-0500PM ET exposurescout Scanning subdomains for subdomain takeover vulnerability.</w:t>
+      </w:r>
+    </w:p>
+    <w:p>
+      <w:pPr>
+        <w:pStyle w:val="ActivityBullet"/>
+      </w:pPr>
+      <w:r>
+        <w:t>2026-01-29 13:59:44-0500PM ET exposurescout Found 1 domain vulnerable to subdomain takeover.</w:t>
+      </w:r>
+    </w:p>
+    <w:p>
+      <w:pPr>
+        <w:pStyle w:val="ActivityBullet"/>
+      </w:pPr>
+      <w:r>
+        <w:t>2026-01-29 13:59:44-0500PM ET exposurescout Completed subdomain takeover checks.</w:t>
+      </w:r>
+    </w:p>
+    <w:p>
+      <w:pPr>
+        <w:pStyle w:val="ActivityBullet"/>
+      </w:pPr>
+      <w:r>
+        <w:t>2026-01-29 13:59:44-0500PM ET exposurescout ExposureScout module completed.</w:t>
+      </w:r>
+    </w:p>
+    <w:p>
+      <w:pPr>
+        <w:pStyle w:val="ActivityBullet"/>
+      </w:pPr>
+      <w:r>
+        <w:t>2026-01-29 13:59:44-0500PM ET host discovery Performing DNS resolution for 1 DNS name.</w:t>
+      </w:r>
+    </w:p>
+    <w:p>
+      <w:pPr>
+        <w:pStyle w:val="ActivityBullet"/>
+      </w:pPr>
+      <w:r>
+        <w:t>2026-01-29 14:00:50-0500PM ET host discovery DNS resolution complete.</w:t>
+      </w:r>
+    </w:p>
+    <w:p>
+      <w:pPr>
+        <w:pStyle w:val="ActivityBullet"/>
+      </w:pPr>
+      <w:r>
+        <w:t>2026-01-29 14:00:50-0500PM ET host discovery Port scan module initialized.</w:t>
+      </w:r>
+    </w:p>
+    <w:p>
+      <w:pPr>
+        <w:pStyle w:val="ActivityBullet"/>
+      </w:pPr>
+      <w:r>
+        <w:t>2026-01-29 14:00:53-0500PM ET host discovery Conducting port scan against in-scope systems.</w:t>
+      </w:r>
+    </w:p>
+    <w:p>
+      <w:pPr>
+        <w:pStyle w:val="ActivityBullet"/>
+      </w:pPr>
+      <w:r>
+        <w:t>2026-01-29 14:00:57-0500PM ET host discovery Running nmap port scans.</w:t>
+      </w:r>
+    </w:p>
+    <w:p>
+      <w:pPr>
+        <w:pStyle w:val="ActivityBullet"/>
+      </w:pPr>
+      <w:r>
+        <w:t>2026-01-29 14:02:01-0500PM ET host discovery Completed nmap port scans.</w:t>
+      </w:r>
+    </w:p>
+    <w:p>
+      <w:pPr>
+        <w:pStyle w:val="ActivityBullet"/>
+      </w:pPr>
+      <w:r>
+        <w:t>2026-01-29 14:02:01-0500PM ET host discovery Port scans completed successfully.</w:t>
+      </w:r>
+    </w:p>
+    <w:p>
+      <w:pPr>
+        <w:pStyle w:val="ActivityBullet"/>
+      </w:pPr>
+      <w:r>
+        <w:t>2026-01-29 14:02:02-0500PM ET host discovery Parsing results for alive systems.</w:t>
+      </w:r>
+    </w:p>
+    <w:p>
+      <w:pPr>
+        <w:pStyle w:val="ActivityBullet"/>
+      </w:pPr>
+      <w:r>
+        <w:t>2026-01-29 14:02:02-0500PM ET host discovery Completed parsing Nmap results. 1 new IP addresses discovered and imported into DB.</w:t>
+      </w:r>
+    </w:p>
+    <w:p>
+      <w:pPr>
+        <w:pStyle w:val="ActivityBullet"/>
+      </w:pPr>
+      <w:r>
+        <w:t>2026-01-29 14:02:02-0500PM ET host discovery Parsing nmap port scans.</w:t>
+      </w:r>
+    </w:p>
+    <w:p>
+      <w:pPr>
+        <w:pStyle w:val="ActivityBullet"/>
+      </w:pPr>
+      <w:r>
+        <w:t>2026-01-29 14:02:02-0500PM ET host discovery Completed parsing port scans. Imported 3 new ports.</w:t>
+      </w:r>
+    </w:p>
+    <w:p>
+      <w:pPr>
+        <w:pStyle w:val="ActivityBullet"/>
+      </w:pPr>
+      <w:r>
+        <w:t>2026-01-29 14:02:02-0500PM ET host discovery Port scan module completed.</w:t>
+      </w:r>
+    </w:p>
+    <w:p>
+      <w:pPr>
+        <w:pStyle w:val="ActivityBullet"/>
+      </w:pPr>
+      <w:r>
+        <w:t>2026-01-29 14:02:03-0500PM ET host discovery Discovery module completed.</w:t>
+      </w:r>
+    </w:p>
+    <w:p>
+      <w:pPr>
+        <w:pStyle w:val="ActivityBullet"/>
+      </w:pPr>
+      <w:r>
+        <w:t>2026-01-29 14:02:27-0500PM ET host discovery Running nmap port version scans.</w:t>
+      </w:r>
+    </w:p>
+    <w:p>
+      <w:pPr>
+        <w:pStyle w:val="ActivityBullet"/>
+      </w:pPr>
+      <w:r>
+        <w:t>2026-01-29 14:03:30-0500PM ET host discovery Completed nmap port version scans.</w:t>
+      </w:r>
+    </w:p>
+    <w:p>
+      <w:pPr>
+        <w:pStyle w:val="ActivityBullet"/>
+      </w:pPr>
+      <w:r>
+        <w:t>2026-01-29 14:03:35-0500PM ET enumeration Enumeration module initialized.</w:t>
+      </w:r>
+    </w:p>
+    <w:p>
+      <w:pPr>
+        <w:pStyle w:val="ActivityBullet"/>
+      </w:pPr>
+      <w:r>
+        <w:t>2026-01-29 14:04:43-0500PM ET enumeration Enumerating HTTP services.</w:t>
+      </w:r>
+    </w:p>
+    <w:p>
+      <w:pPr>
+        <w:pStyle w:val="ActivityBullet"/>
+      </w:pPr>
+      <w:r>
+        <w:t>2026-01-29 14:04:43-0500PM ET enumeration Enumerating HTTPS services.</w:t>
+      </w:r>
+    </w:p>
+    <w:p>
+      <w:pPr>
+        <w:pStyle w:val="ActivityBullet"/>
+      </w:pPr>
+      <w:r>
+        <w:t>2026-01-29 14:04:43-0500PM ET enumeration Enumerating SSH services.</w:t>
+      </w:r>
+    </w:p>
+    <w:p>
+      <w:pPr>
+        <w:pStyle w:val="ActivityBullet"/>
+      </w:pPr>
+      <w:r>
+        <w:t>2026-01-29 14:04:47-0500PM ET enumeration Running nmap script scan using script: http-headers.</w:t>
+      </w:r>
+    </w:p>
+    <w:p>
+      <w:pPr>
+        <w:pStyle w:val="ActivityBullet"/>
+      </w:pPr>
+      <w:r>
+        <w:t>2026-01-29 14:04:47-0500PM ET enumeration Running nmap script scan using script: http-methods.</w:t>
+      </w:r>
+    </w:p>
+    <w:p>
+      <w:pPr>
+        <w:pStyle w:val="ActivityBullet"/>
+      </w:pPr>
+      <w:r>
+        <w:t>2026-01-29 14:04:47-0500PM ET enumeration Running nmap script scan using script: http-headers.</w:t>
+      </w:r>
+    </w:p>
+    <w:p>
+      <w:pPr>
+        <w:pStyle w:val="ActivityBullet"/>
+      </w:pPr>
+      <w:r>
+        <w:t>2026-01-29 14:04:47-0500PM ET enumeration Running nmap script scan using script: http-robots.txt.</w:t>
+      </w:r>
+    </w:p>
+    <w:p>
+      <w:pPr>
+        <w:pStyle w:val="ActivityBullet"/>
+      </w:pPr>
+      <w:r>
+        <w:t>2026-01-29 14:04:47-0500PM ET enumeration Running nmap script scan using script: http-robots.txt.</w:t>
+      </w:r>
+    </w:p>
+    <w:p>
+      <w:pPr>
+        <w:pStyle w:val="ActivityBullet"/>
+      </w:pPr>
+      <w:r>
+        <w:t>2026-01-29 14:04:47-0500PM ET enumeration Running nmap script scan using script: http-put.</w:t>
+      </w:r>
+    </w:p>
+    <w:p>
+      <w:pPr>
+        <w:pStyle w:val="ActivityBullet"/>
+      </w:pPr>
+      <w:r>
+        <w:t>2026-01-29 14:04:47-0500PM ET enumeration Running nmap script scan using script: http-title.</w:t>
+      </w:r>
+    </w:p>
+    <w:p>
+      <w:pPr>
+        <w:pStyle w:val="ActivityBullet"/>
+      </w:pPr>
+      <w:r>
+        <w:t>2026-01-29 14:04:47-0500PM ET enumeration Running nmap script scan using script: http-shellshock.</w:t>
+      </w:r>
+    </w:p>
+    <w:p>
+      <w:pPr>
+        <w:pStyle w:val="ActivityBullet"/>
+      </w:pPr>
+      <w:r>
+        <w:t>2026-01-29 14:04:47-0500PM ET enumeration Running nmap script scan using script: http-methods.</w:t>
+      </w:r>
+    </w:p>
+    <w:p>
+      <w:pPr>
+        <w:pStyle w:val="ActivityBullet"/>
+      </w:pPr>
+      <w:r>
+        <w:t>2026-01-29 14:04:47-0500PM ET enumeration Running nmap script scan using script: sslv2.</w:t>
+      </w:r>
+    </w:p>
+    <w:p>
+      <w:pPr>
+        <w:pStyle w:val="ActivityBullet"/>
+      </w:pPr>
+      <w:r>
+        <w:t>2026-01-29 14:04:47-0500PM ET enumeration Running nmap script scan using script: ssl-cert.</w:t>
+      </w:r>
+    </w:p>
+    <w:p>
+      <w:pPr>
+        <w:pStyle w:val="ActivityBullet"/>
+      </w:pPr>
+      <w:r>
+        <w:t>2026-01-29 14:04:47-0500PM ET enumeration Running nmap script scan using script: ssl-enum-ciphers.</w:t>
+      </w:r>
+    </w:p>
+    <w:p>
+      <w:pPr>
+        <w:pStyle w:val="ActivityBullet"/>
+      </w:pPr>
+      <w:r>
+        <w:t>2026-01-29 14:04:47-0500PM ET enumeration Running nmap script scan using script: http-shellshock.</w:t>
+      </w:r>
+    </w:p>
+    <w:p>
+      <w:pPr>
+        <w:pStyle w:val="ActivityBullet"/>
+      </w:pPr>
+      <w:r>
+        <w:t>2026-01-29 14:04:47-0500PM ET enumeration Running nmap script scan using script: ssl-poodle.</w:t>
+      </w:r>
+    </w:p>
+    <w:p>
+      <w:pPr>
+        <w:pStyle w:val="ActivityBullet"/>
+      </w:pPr>
+      <w:r>
+        <w:t>2026-01-29 14:04:47-0500PM ET enumeration Running nmap script scan using script: http-put.</w:t>
+      </w:r>
+    </w:p>
+    <w:p>
+      <w:pPr>
+        <w:pStyle w:val="ActivityBullet"/>
+      </w:pPr>
+      <w:r>
+        <w:t>2026-01-29 14:04:47-0500PM ET enumeration Running nmap script scan using script: ssl-heartbleed.</w:t>
+      </w:r>
+    </w:p>
+    <w:p>
+      <w:pPr>
+        <w:pStyle w:val="ActivityBullet"/>
+      </w:pPr>
+      <w:r>
+        <w:t>2026-01-29 14:04:47-0500PM ET enumeration Running nmap script scan using script: http-title.</w:t>
+      </w:r>
+    </w:p>
+    <w:p>
+      <w:pPr>
+        <w:pStyle w:val="ActivityBullet"/>
+      </w:pPr>
+      <w:r>
+        <w:lastRenderedPageBreak/>
+        <w:t>2026-01-29 14:04:47-0500PM ET enumeration Running nmap script scan using script: ssl-date.</w:t>
+      </w:r>
+    </w:p>
+    <w:p>
+      <w:pPr>
+        <w:pStyle w:val="ActivityBullet"/>
+      </w:pPr>
+      <w:r>
+        <w:t>2026-01-29 14:04:47-0500PM ET enumeration Queuing up MSF module: auxiliary/scanner/ssh/ssh_version.</w:t>
+      </w:r>
+    </w:p>
+    <w:p>
+      <w:pPr>
+        <w:pStyle w:val="ActivityBullet"/>
+      </w:pPr>
+      <w:r>
+        <w:t>2026-01-29 14:05:50-0500PM ET enumeration Completed MSF module: auxiliary/scanner/ssh/ssh_version.</w:t>
+      </w:r>
+    </w:p>
+    <w:p>
+      <w:pPr>
+        <w:pStyle w:val="ActivityBullet"/>
+      </w:pPr>
+      <w:r>
+        <w:t>2026-01-29 14:05:50-0500PM ET enumeration Completed nmap script scan using script: http-methods.</w:t>
+      </w:r>
+    </w:p>
+    <w:p>
+      <w:pPr>
+        <w:pStyle w:val="ActivityBullet"/>
+      </w:pPr>
+      <w:r>
+        <w:t>2026-01-29 14:05:50-0500PM ET enumeration Completed nmap script scan using script: ssl-enum-ciphers.</w:t>
+      </w:r>
+    </w:p>
+    <w:p>
+      <w:pPr>
+        <w:pStyle w:val="ActivityBullet"/>
+      </w:pPr>
+      <w:r>
+        <w:t>2026-01-29 14:05:50-0500PM ET enumeration Completed nmap script scan using script: http-put.</w:t>
+      </w:r>
+    </w:p>
+    <w:p>
+      <w:pPr>
+        <w:pStyle w:val="ActivityBullet"/>
+      </w:pPr>
+      <w:r>
+        <w:t>2026-01-29 14:05:50-0500PM ET enumeration Completed nmap script scan using script: http-robots.txt.</w:t>
+      </w:r>
+    </w:p>
+    <w:p>
+      <w:pPr>
+        <w:pStyle w:val="ActivityBullet"/>
+      </w:pPr>
+      <w:r>
+        <w:t>2026-01-29 14:05:50-0500PM ET enumeration Completed nmap script scan using script: ssl-heartbleed.</w:t>
+      </w:r>
+    </w:p>
+    <w:p>
+      <w:pPr>
+        <w:pStyle w:val="ActivityBullet"/>
+      </w:pPr>
+      <w:r>
+        <w:t>2026-01-29 14:05:50-0500PM ET enumeration Completed nmap script scan using script: http-shellshock.</w:t>
+      </w:r>
+    </w:p>
+    <w:p>
+      <w:pPr>
+        <w:pStyle w:val="ActivityBullet"/>
+      </w:pPr>
+      <w:r>
+        <w:t>2026-01-29 14:05:50-0500PM ET enumeration Completed nmap script scan using script: http-robots.txt.</w:t>
+      </w:r>
+    </w:p>
+    <w:p>
+      <w:pPr>
+        <w:pStyle w:val="ActivityBullet"/>
+      </w:pPr>
+      <w:r>
+        <w:t>2026-01-29 14:05:51-0500PM ET enumeration Completed nmap script scan using script: http-put.</w:t>
+      </w:r>
+    </w:p>
+    <w:p>
+      <w:pPr>
+        <w:pStyle w:val="ActivityBullet"/>
+      </w:pPr>
+      <w:r>
+        <w:t>2026-01-29 14:05:51-0500PM ET enumeration Completed nmap script scan using script: http-headers.</w:t>
+      </w:r>
+    </w:p>
+    <w:p>
+      <w:pPr>
+        <w:pStyle w:val="ActivityBullet"/>
+      </w:pPr>
+      <w:r>
+        <w:t>2026-01-29 14:05:51-0500PM ET enumeration Completed nmap script scan using script: http-methods.</w:t>
+      </w:r>
+    </w:p>
+    <w:p>
+      <w:pPr>
+        <w:pStyle w:val="ActivityBullet"/>
+      </w:pPr>
+      <w:r>
+        <w:t>2026-01-29 14:05:51-0500PM ET enumeration Completed nmap script scan using script: ssl-date.</w:t>
+      </w:r>
+    </w:p>
+    <w:p>
+      <w:pPr>
+        <w:pStyle w:val="ActivityBullet"/>
+      </w:pPr>
+      <w:r>
+        <w:t>2026-01-29 14:05:51-0500PM ET enumeration Completed nmap script scan using script: http-title.</w:t>
+      </w:r>
+    </w:p>
+    <w:p>
+      <w:pPr>
+        <w:pStyle w:val="ActivityBullet"/>
+      </w:pPr>
+      <w:r>
+        <w:t>2026-01-29 14:05:51-0500PM ET enumeration Completed nmap script scan using script: http-shellshock.</w:t>
+      </w:r>
+    </w:p>
+    <w:p>
+      <w:pPr>
+        <w:pStyle w:val="ActivityBullet"/>
+      </w:pPr>
+      <w:r>
+        <w:t>2026-01-29 14:05:51-0500PM ET enumeration Completed nmap script scan using script: http-headers.</w:t>
+      </w:r>
+    </w:p>
+    <w:p>
+      <w:pPr>
+        <w:pStyle w:val="ActivityBullet"/>
+      </w:pPr>
+      <w:r>
+        <w:t>2026-01-29 14:05:51-0500PM ET enumeration Completed nmap script scan using script: ssl-poodle.</w:t>
+      </w:r>
+    </w:p>
+    <w:p>
+      <w:pPr>
+        <w:pStyle w:val="ActivityBullet"/>
+      </w:pPr>
+      <w:r>
+        <w:t>2026-01-29 14:05:51-0500PM ET enumeration Completed nmap script scan using script: ssl-cert.</w:t>
+      </w:r>
+    </w:p>
+    <w:p>
+      <w:pPr>
+        <w:pStyle w:val="ActivityBullet"/>
+      </w:pPr>
+      <w:r>
+        <w:t>2026-01-29 14:05:51-0500PM ET enumeration Completed nmap script scan using script: sslv2.</w:t>
+      </w:r>
+    </w:p>
+    <w:p>
+      <w:pPr>
+        <w:pStyle w:val="ActivityBullet"/>
+      </w:pPr>
+      <w:r>
+        <w:t>2026-01-29 14:05:51-0500PM ET enumeration Completed nmap script scan using script: http-title.</w:t>
+      </w:r>
+    </w:p>
+    <w:p>
+      <w:pPr>
+        <w:pStyle w:val="ActivityBullet"/>
+      </w:pPr>
+      <w:r>
+        <w:t>2026-01-29 14:05:51-0500PM ET enumeration Peforming a hidden directory enumeration attack on 80/tcp.</w:t>
+      </w:r>
+    </w:p>
+    <w:p>
+      <w:pPr>
+        <w:pStyle w:val="ActivityBullet"/>
+      </w:pPr>
+      <w:r>
+        <w:t>2026-01-29 14:05:54-0500PM ET enumeration Running nmap script scan using script: sshv1.</w:t>
+      </w:r>
+    </w:p>
+    <w:p>
+      <w:pPr>
+        <w:pStyle w:val="ActivityBullet"/>
+      </w:pPr>
+      <w:r>
+        <w:t>2026-01-29 14:05:54-0500PM ET enumeration Running nmap script scan using script: ssh2-enum-algos.</w:t>
+      </w:r>
+    </w:p>
+    <w:p>
+      <w:pPr>
+        <w:pStyle w:val="ActivityBullet"/>
+      </w:pPr>
+      <w:r>
+        <w:t>2026-01-29 14:05:54-0500PM ET enumeration Running nmap script scan using script: ssh-auth-methods.</w:t>
+      </w:r>
+    </w:p>
+    <w:p>
+      <w:pPr>
+        <w:pStyle w:val="ActivityBullet"/>
+      </w:pPr>
+      <w:r>
+        <w:t>2026-01-29 14:05:54-0500PM ET enumeration Analyzing SSL/TLS protocols on port 443/tcp.</w:t>
+      </w:r>
+    </w:p>
+    <w:p>
+      <w:pPr>
+        <w:pStyle w:val="ActivityBullet"/>
+      </w:pPr>
+      <w:r>
+        <w:t>2026-01-29 14:06:55-0500PM ET enumeration Completed SSL/TLS analysis on ports 443/tcp.</w:t>
+      </w:r>
+    </w:p>
+    <w:p>
+      <w:pPr>
+        <w:pStyle w:val="ActivityBullet"/>
+      </w:pPr>
+      <w:r>
+        <w:t>2026-01-29 14:06:55-0500PM ET enumeration Completed hidden directory enumeration scan.</w:t>
+      </w:r>
+    </w:p>
+    <w:p>
+      <w:pPr>
+        <w:pStyle w:val="ActivityBullet"/>
+      </w:pPr>
+      <w:r>
+        <w:t>2026-01-29 14:06:55-0500PM ET enumeration Peforming a hidden directory enumeration attack on 443/tcp.</w:t>
+      </w:r>
+    </w:p>
+    <w:p>
+      <w:pPr>
+        <w:pStyle w:val="ActivityBullet"/>
+      </w:pPr>
+      <w:r>
+        <w:t>2026-01-29 14:06:55-0500PM ET enumeration Completed nmap script scan using script: ssh2-enum-algos.</w:t>
+      </w:r>
+    </w:p>
+    <w:p>
+      <w:pPr>
+        <w:pStyle w:val="ActivityBullet"/>
+      </w:pPr>
+      <w:r>
+        <w:t>2026-01-29 14:06:55-0500PM ET enumeration Completed nmap script scan using script: ssh-auth-methods.</w:t>
+      </w:r>
+    </w:p>
+    <w:p>
+      <w:pPr>
+        <w:pStyle w:val="ActivityBullet"/>
+      </w:pPr>
+      <w:r>
+        <w:t>2026-01-29 14:06:55-0500PM ET enumeration Completed nmap script scan using script: sshv1.</w:t>
+      </w:r>
+    </w:p>
+    <w:p>
+      <w:pPr>
+        <w:pStyle w:val="ActivityBullet"/>
+      </w:pPr>
+      <w:r>
+        <w:t>2026-01-29 14:06:55-0500PM ET enumeration Completed enumerating SSH services.</w:t>
+      </w:r>
+    </w:p>
+    <w:p>
+      <w:pPr>
+        <w:pStyle w:val="ActivityBullet"/>
+      </w:pPr>
+      <w:r>
+        <w:t>2026-01-29 14:06:58-0500PM ET enumeration Analyzing web services running on port 80/tcp.</w:t>
+      </w:r>
+    </w:p>
+    <w:p>
+      <w:pPr>
+        <w:pStyle w:val="ActivityBullet"/>
+      </w:pPr>
+      <w:r>
+        <w:t>2026-01-29 14:08:10-0500PM ET enumeration Completed analyzing web services running on port 80/tcp.</w:t>
+      </w:r>
+    </w:p>
+    <w:p>
+      <w:pPr>
+        <w:pStyle w:val="ActivityBullet"/>
+      </w:pPr>
+      <w:r>
+        <w:t>2026-01-29 14:08:10-0500PM ET enumeration Completed hidden directory enumeration scan.</w:t>
+      </w:r>
+    </w:p>
+    <w:p>
+      <w:pPr>
+        <w:pStyle w:val="ActivityBullet"/>
+      </w:pPr>
+      <w:r>
+        <w:t>2026-01-29 14:08:10-0500PM ET enumeration Completed analyzing web services running on port 80/tcp.</w:t>
+      </w:r>
+    </w:p>
+    <w:p>
+      <w:pPr>
+        <w:pStyle w:val="ActivityBullet"/>
+      </w:pPr>
+      <w:r>
+        <w:t>2026-01-29 14:08:10-0500PM ET enumeration Completed enumerating HTTP services.</w:t>
+      </w:r>
+    </w:p>
+    <w:p>
+      <w:pPr>
+        <w:pStyle w:val="ActivityBullet"/>
+      </w:pPr>
+      <w:r>
+        <w:t>2026-01-29 14:08:13-0500PM ET enumeration Analyzing web services running on port 443/tcp.</w:t>
+      </w:r>
+    </w:p>
+    <w:p>
+      <w:pPr>
+        <w:pStyle w:val="ActivityBullet"/>
+      </w:pPr>
+      <w:r>
+        <w:t>2026-01-29 14:09:15-0500PM ET enumeration Completed analyzing web services running on port 443/tcp.</w:t>
+      </w:r>
+    </w:p>
+    <w:p>
+      <w:pPr>
+        <w:pStyle w:val="ActivityBullet"/>
+      </w:pPr>
+      <w:r>
+        <w:t>2026-01-29 14:09:15-0500PM ET enumeration Completed analyzing web services running on port 443/tcp.</w:t>
+      </w:r>
+    </w:p>
+    <w:p>
+      <w:pPr>
+        <w:pStyle w:val="ActivityBullet"/>
+      </w:pPr>
+      <w:r>
+        <w:t>2026-01-29 14:09:16-0500PM ET enumeration Completed enumerating HTTPS services.</w:t>
+      </w:r>
+    </w:p>
+    <w:p>
+      <w:pPr>
+        <w:pStyle w:val="ActivityBullet"/>
+      </w:pPr>
+      <w:r>
+        <w:t>2026-01-29 14:09:45-0500PM ET enumeration Enumeration module completed.</w:t>
+      </w:r>
+    </w:p>
+    <w:p>
+      <w:pPr>
+        <w:pStyle w:val="ActivityBullet"/>
+      </w:pPr>
+      <w:r>
+        <w:t>2026-01-29 14:10:06-0500PM ET exploit Launching exploit module.</w:t>
+      </w:r>
+    </w:p>
+    <w:p>
+      <w:pPr>
+        <w:pStyle w:val="ActivityBullet"/>
+      </w:pPr>
+      <w:r>
+        <w:t>2026-01-29 14:10:11-0500PM ET exploit Queuing up hydra attack: SSH password attack.</w:t>
+      </w:r>
+    </w:p>
+    <w:p>
+      <w:pPr>
+        <w:pStyle w:val="ActivityBullet"/>
+      </w:pPr>
+      <w:r>
+        <w:t>2026-01-29 14:11:16-0500PM ET exploit Completed hydra attack: SSH password attack.</w:t>
+      </w:r>
+    </w:p>
+    <w:p>
+      <w:pPr>
+        <w:pStyle w:val="ActivityBullet"/>
+      </w:pPr>
+      <w:r>
+        <w:t>2026-01-29 14:11:16-0500PM ET exploit Completed SSH password attack.</w:t>
+      </w:r>
+    </w:p>
+    <w:p>
+      <w:pPr>
+        <w:pStyle w:val="ActivityBullet"/>
+      </w:pPr>
+      <w:r>
+        <w:t>2026-01-29 14:11:49-0500PM ET exploit Completed exploit module.</w:t>
+      </w:r>
+    </w:p>
+    <w:p>
       <w:pPr>
         <w:spacing w:line="259" w:lineRule="auto"/>
         <w:contextualSpacing/>
@@ -5078,7 +6296,7 @@
           <w14:ligatures w14:val="none"/>
         </w:rPr>
       </w:pPr>
-      <w:bookmarkStart w:id="13" w:name="_Toc190866256"/>
+      <w:bookmarkStart w:id="9" w:name="_Toc190866256"/>
       <w:r>
         <w:rPr>
           <w:rFonts w:ascii="Handel Gothic D" w:eastAsia="DengXian Light" w:hAnsi="Handel Gothic D" w:cs="Times New Roman"/>
@@ -5093,7 +6311,7 @@
         <w:lastRenderedPageBreak/>
         <w:t>Recommendations</w:t>
       </w:r>
-      <w:bookmarkEnd w:id="13"/>
+      <w:bookmarkEnd w:id="9"/>
     </w:p>
     <w:p>
       <w:pPr>
@@ -5159,7 +6377,7 @@
                     </pic:cNvPicPr>
                   </pic:nvPicPr>
                   <pic:blipFill>
-                    <a:blip r:embed="rId14" cstate="print">
+                    <a:blip r:embed="rId24" cstate="print">
                       <a:extLst>
                         <a:ext uri="{28A0092B-C50C-407E-A947-70E740481C1C}">
                           <a14:useLocalDpi xmlns:a14="http://schemas.microsoft.com/office/drawing/2010/main" val="0"/>
@@ -5225,7 +6443,7 @@
           <w14:ligatures w14:val="none"/>
         </w:rPr>
         <w:drawing>
-          <wp:inline distT="0" distB="0" distL="0" distR="0" wp14:anchorId="03962334" wp14:editId="4813BDF1">
+          <wp:inline distT="0" distB="0" distL="0" distR="0" wp14:anchorId="03962334" wp14:editId="7DBEEC60">
             <wp:extent cx="152400" cy="152400"/>
             <wp:effectExtent l="0" t="0" r="0" b="0"/>
             <wp:docPr id="2011428596" name="Picture 2011428596" descr="Fire with solid fill"/>
@@ -5242,11 +6460,11 @@
                     </pic:cNvPicPr>
                   </pic:nvPicPr>
                   <pic:blipFill>
-                    <a:blip r:embed="rId15" cstate="print">
+                    <a:blip r:embed="rId25" cstate="print">
                       <a:extLst>
                         <a:ext uri="{BEBA8EAE-BF5A-486C-A8C5-ECC9F3942E4B}">
                           <a14:imgProps xmlns:a14="http://schemas.microsoft.com/office/drawing/2010/main">
-                            <a14:imgLayer r:embed="rId16">
+                            <a14:imgLayer r:embed="rId26">
                               <a14:imgEffect>
                                 <a14:saturation sat="0"/>
                               </a14:imgEffect>
@@ -5292,9 +6510,9 @@
         </w:rPr>
         <w:t xml:space="preserve"> – OrbitalFire can assist with remediation</w:t>
       </w:r>
-      <w:bookmarkStart w:id="14" w:name="_Hlk194407007"/>
-    </w:p>
-    <w:bookmarkEnd w:id="14"/>
+      <w:bookmarkStart w:id="10" w:name="_Hlk194407007"/>
+    </w:p>
+    <w:bookmarkEnd w:id="10"/>
     <w:p>
       <w:pPr>
         <w:keepNext/>
@@ -5324,6 +6542,231 @@
           <w14:ligatures w14:val="none"/>
         </w:rPr>
         <w:t>DISCRETIONARY Remediation</w:t>
+      </w:r>
+    </w:p>
+    <w:p>
+      <w:pPr>
+        <w:pStyle w:val="ListNumber2"/>
+      </w:pPr>
+      <w:r>
+        <w:rPr>
+          <w:noProof/>
+        </w:rPr>
+        <w:drawing>
+          <wp:inline distT="0" distB="0" distL="0" distR="0" wp14:anchorId="06E8A85F" wp14:editId="268FE6D5">
+            <wp:extent cx="152400" cy="152400"/>
+            <wp:effectExtent l="0" t="0" r="0" b="0"/>
+            <wp:docPr id="2011428597" name="Picture 2011428597"/>
+            <wp:cNvGraphicFramePr>
+              <a:graphicFrameLocks xmlns:a="http://schemas.openxmlformats.org/drawingml/2006/main" noChangeAspect="1"/>
+            </wp:cNvGraphicFramePr>
+            <a:graphic xmlns:a="http://schemas.openxmlformats.org/drawingml/2006/main">
+              <a:graphicData uri="http://schemas.openxmlformats.org/drawingml/2006/picture">
+                <pic:pic xmlns:pic="http://schemas.openxmlformats.org/drawingml/2006/picture">
+                  <pic:nvPicPr>
+                    <pic:cNvPr id="0" name="image.png"/>
+                    <pic:cNvPicPr/>
+                  </pic:nvPicPr>
+                  <pic:blipFill>
+                    <a:blip r:embed="rId25"/>
+                    <a:stretch>
+                      <a:fillRect/>
+                    </a:stretch>
+                  </pic:blipFill>
+                  <pic:spPr>
+                    <a:xfrm>
+                      <a:off x="0" y="0"/>
+                      <a:ext cx="152400" cy="152400"/>
+                    </a:xfrm>
+                    <a:prstGeom prst="rect">
+                      <a:avLst/>
+                    </a:prstGeom>
+                  </pic:spPr>
+                </pic:pic>
+              </a:graphicData>
+            </a:graphic>
+          </wp:inline>
+        </w:drawing>
+      </w:r>
+      <w:r>
+        <w:t xml:space="preserve"> </w:t>
+      </w:r>
+      <w:r>
+        <w:rPr>
+          <w:b/>
+          <w:color w:val="404040"/>
+        </w:rPr>
+        <w:t>Remediate Subdomain Takeover Exposure</w:t>
+      </w:r>
+      <w:r>
+        <w:rPr>
+          <w:color w:val="404040"/>
+        </w:rPr>
+        <w:t xml:space="preserve"> – Identify and remove misconfigured or stale DNS records that reference unclaimed or deprovisioned third-party services. Conduct a comprehensive review of all DNS entries to ensure they accurately map to active, authorized resources, and implement continuous monitoring to detect future misconfigurations. Where applicable, apply DNS security best practices such as DNSSEC and maintain proper lifecycle management of external service integrations to prevent unauthorized subdomain claims.</w:t>
+      </w:r>
+    </w:p>
+    <w:p>
+      <w:pPr>
+        <w:spacing w:after="120"/>
+        <w:ind w:left="720"/>
+      </w:pPr>
+      <w:r>
+        <w:rPr>
+          <w:rFonts w:ascii="Corbel" w:hAnsi="Corbel"/>
+          <w:color w:val="404040"/>
+          <w:u w:val="single"/>
+        </w:rPr>
+        <w:t>Refer to High Finding 1</w:t>
+      </w:r>
+    </w:p>
+    <w:p>
+      <w:pPr>
+        <w:pStyle w:val="ListNumber2"/>
+      </w:pPr>
+      <w:r>
+        <w:rPr>
+          <w:noProof/>
+        </w:rPr>
+        <w:drawing>
+          <wp:inline distT="0" distB="0" distL="0" distR="0" wp14:anchorId="79973432" wp14:editId="38BA528F">
+            <wp:extent cx="152400" cy="152400"/>
+            <wp:effectExtent l="0" t="0" r="0" b="0"/>
+            <wp:docPr id="2011428598" name="Picture 2011428598"/>
+            <wp:cNvGraphicFramePr>
+              <a:graphicFrameLocks xmlns:a="http://schemas.openxmlformats.org/drawingml/2006/main" noChangeAspect="1"/>
+            </wp:cNvGraphicFramePr>
+            <a:graphic xmlns:a="http://schemas.openxmlformats.org/drawingml/2006/main">
+              <a:graphicData uri="http://schemas.openxmlformats.org/drawingml/2006/picture">
+                <pic:pic xmlns:pic="http://schemas.openxmlformats.org/drawingml/2006/picture">
+                  <pic:nvPicPr>
+                    <pic:cNvPr id="0" name="image.png"/>
+                    <pic:cNvPicPr/>
+                  </pic:nvPicPr>
+                  <pic:blipFill>
+                    <a:blip r:embed="rId25"/>
+                    <a:stretch>
+                      <a:fillRect/>
+                    </a:stretch>
+                  </pic:blipFill>
+                  <pic:spPr>
+                    <a:xfrm>
+                      <a:off x="0" y="0"/>
+                      <a:ext cx="152400" cy="152400"/>
+                    </a:xfrm>
+                    <a:prstGeom prst="rect">
+                      <a:avLst/>
+                    </a:prstGeom>
+                  </pic:spPr>
+                </pic:pic>
+              </a:graphicData>
+            </a:graphic>
+          </wp:inline>
+        </w:drawing>
+      </w:r>
+      <w:r>
+        <w:t xml:space="preserve"> </w:t>
+      </w:r>
+      <w:r>
+        <w:rPr>
+          <w:b/>
+          <w:color w:val="404040"/>
+        </w:rPr>
+        <w:t>Reconfigure DMARC Record</w:t>
+      </w:r>
+      <w:r>
+        <w:rPr>
+          <w:color w:val="404040"/>
+        </w:rPr>
+        <w:t xml:space="preserve"> – Review and rectify the current DMARC record configuration. The DMARC policy should be explicitly defined, ideally set to "quarantine" or "reject," which directs receiving mail servers on the proper handling of unauthenticated messages.</w:t>
+      </w:r>
+    </w:p>
+    <w:p>
+      <w:pPr>
+        <w:spacing w:after="120"/>
+        <w:ind w:left="720"/>
+      </w:pPr>
+      <w:r>
+        <w:rPr>
+          <w:rFonts w:ascii="Corbel" w:hAnsi="Corbel"/>
+          <w:color w:val="404040"/>
+          <w:u w:val="single"/>
+        </w:rPr>
+        <w:t>Refer to Medium Finding 1</w:t>
+      </w:r>
+    </w:p>
+    <w:p>
+      <w:pPr>
+        <w:pStyle w:val="ListNumber2"/>
+      </w:pPr>
+      <w:r>
+        <w:rPr>
+          <w:noProof/>
+        </w:rPr>
+        <w:drawing>
+          <wp:inline distT="0" distB="0" distL="0" distR="0" wp14:anchorId="5EFDFD1B" wp14:editId="50E3E7BF">
+            <wp:extent cx="152400" cy="152400"/>
+            <wp:effectExtent l="0" t="0" r="0" b="0"/>
+            <wp:docPr id="2011428599" name="Picture 2011428599"/>
+            <wp:cNvGraphicFramePr>
+              <a:graphicFrameLocks xmlns:a="http://schemas.openxmlformats.org/drawingml/2006/main" noChangeAspect="1"/>
+            </wp:cNvGraphicFramePr>
+            <a:graphic xmlns:a="http://schemas.openxmlformats.org/drawingml/2006/main">
+              <a:graphicData uri="http://schemas.openxmlformats.org/drawingml/2006/picture">
+                <pic:pic xmlns:pic="http://schemas.openxmlformats.org/drawingml/2006/picture">
+                  <pic:nvPicPr>
+                    <pic:cNvPr id="0" name="image.png"/>
+                    <pic:cNvPicPr/>
+                  </pic:nvPicPr>
+                  <pic:blipFill>
+                    <a:blip r:embed="rId25"/>
+                    <a:stretch>
+                      <a:fillRect/>
+                    </a:stretch>
+                  </pic:blipFill>
+                  <pic:spPr>
+                    <a:xfrm>
+                      <a:off x="0" y="0"/>
+                      <a:ext cx="152400" cy="152400"/>
+                    </a:xfrm>
+                    <a:prstGeom prst="rect">
+                      <a:avLst/>
+                    </a:prstGeom>
+                  </pic:spPr>
+                </pic:pic>
+              </a:graphicData>
+            </a:graphic>
+          </wp:inline>
+        </w:drawing>
+      </w:r>
+      <w:r>
+        <w:t xml:space="preserve"> </w:t>
+      </w:r>
+      <w:r>
+        <w:rPr>
+          <w:b/>
+          <w:color w:val="404040"/>
+        </w:rPr>
+        <w:t>Restrict Access to Remote SSH</w:t>
+      </w:r>
+      <w:r>
+        <w:rPr>
+          <w:color w:val="404040"/>
+        </w:rPr>
+        <w:t xml:space="preserve"> – Restrict access from the public Internet. Ensure that the Remote SSH service is only reachable through secure environments, such as a Virtual Private Network (VPN) or specific authorized IP address configurations.</w:t>
+      </w:r>
+    </w:p>
+    <w:p>
+      <w:pPr>
+        <w:spacing w:after="120"/>
+        <w:ind w:left="720"/>
+      </w:pPr>
+      <w:r>
+        <w:rPr>
+          <w:rFonts w:ascii="Corbel" w:hAnsi="Corbel"/>
+          <w:color w:val="404040"/>
+          <w:u w:val="single"/>
+        </w:rPr>
+        <w:t>Refer to Medium Finding 2</w:t>
       </w:r>
     </w:p>
     <w:p>
@@ -5355,7 +6798,7 @@
           <w14:ligatures w14:val="none"/>
         </w:rPr>
       </w:pPr>
-      <w:bookmarkStart w:id="15" w:name="_Toc190866257"/>
+      <w:bookmarkStart w:id="11" w:name="_Toc190866257"/>
       <w:r>
         <w:rPr>
           <w:rFonts w:ascii="Handel Gothic D" w:eastAsia="DengXian Light" w:hAnsi="Handel Gothic D" w:cs="Times New Roman"/>
@@ -5370,7 +6813,7 @@
         <w:lastRenderedPageBreak/>
         <w:t>appendix</w:t>
       </w:r>
-      <w:bookmarkEnd w:id="15"/>
+      <w:bookmarkEnd w:id="11"/>
     </w:p>
     <w:p>
       <w:pPr>
@@ -5401,6 +6844,51 @@
           <w14:ligatures w14:val="none"/>
         </w:rPr>
         <w:t>Open Ports | External Network TestinG</w:t>
+      </w:r>
+    </w:p>
+    <w:p>
+      <w:pPr>
+        <w:spacing w:after="120"/>
+      </w:pPr>
+      <w:r>
+        <w:rPr>
+          <w:noProof/>
+        </w:rPr>
+        <w:drawing>
+          <wp:inline distT="0" distB="0" distL="0" distR="0" wp14:anchorId="523E7CA7" wp14:editId="4240EC95">
+            <wp:extent cx="5943600" cy="830317"/>
+            <wp:effectExtent l="0" t="0" r="0" b="0"/>
+            <wp:docPr id="2011428600" name="Picture 2011428600"/>
+            <wp:cNvGraphicFramePr>
+              <a:graphicFrameLocks xmlns:a="http://schemas.openxmlformats.org/drawingml/2006/main" noChangeAspect="1"/>
+            </wp:cNvGraphicFramePr>
+            <a:graphic xmlns:a="http://schemas.openxmlformats.org/drawingml/2006/main">
+              <a:graphicData uri="http://schemas.openxmlformats.org/drawingml/2006/picture">
+                <pic:pic xmlns:pic="http://schemas.openxmlformats.org/drawingml/2006/picture">
+                  <pic:nvPicPr>
+                    <pic:cNvPr id="0" name="OPEN_PORTS.PNG"/>
+                    <pic:cNvPicPr/>
+                  </pic:nvPicPr>
+                  <pic:blipFill>
+                    <a:blip r:embed="rId27"/>
+                    <a:stretch>
+                      <a:fillRect/>
+                    </a:stretch>
+                  </pic:blipFill>
+                  <pic:spPr>
+                    <a:xfrm>
+                      <a:off x="0" y="0"/>
+                      <a:ext cx="5943600" cy="830317"/>
+                    </a:xfrm>
+                    <a:prstGeom prst="rect">
+                      <a:avLst/>
+                    </a:prstGeom>
+                  </pic:spPr>
+                </pic:pic>
+              </a:graphicData>
+            </a:graphic>
+          </wp:inline>
+        </w:drawing>
       </w:r>
     </w:p>
     <w:p>
@@ -5711,6 +7199,7 @@
           <w:docPartUnique/>
         </w:docPartObj>
       </w:sdtPr>
+      <w:sdtEndPr/>
       <w:sdtContent>
         <w:r>
           <w:rPr>
@@ -9318,10 +10807,10 @@
                   <c:v>0</c:v>
                 </c:pt>
                 <c:pt idx="2">
-                  <c:v>0</c:v>
+                  <c:v>2</c:v>
                 </c:pt>
                 <c:pt idx="3">
-                  <c:v>0</c:v>
+                  <c:v>1</c:v>
                 </c:pt>
                 <c:pt idx="4">
                   <c:v>0</c:v>
@@ -9571,6 +11060,9 @@
               <c:numCache>
                 <c:formatCode>General</c:formatCode>
                 <c:ptCount val="1"/>
+                <c:pt idx="0">
+                  <c:v>2026</c:v>
+                </c:pt>
               </c:numCache>
             </c:numRef>
           </c:cat>
@@ -9580,6 +11072,9 @@
               <c:numCache>
                 <c:formatCode>General</c:formatCode>
                 <c:ptCount val="1"/>
+                <c:pt idx="0">
+                  <c:v>0</c:v>
+                </c:pt>
               </c:numCache>
             </c:numRef>
           </c:val>
@@ -9624,6 +11119,9 @@
               <c:numCache>
                 <c:formatCode>General</c:formatCode>
                 <c:ptCount val="1"/>
+                <c:pt idx="0">
+                  <c:v>2026</c:v>
+                </c:pt>
               </c:numCache>
             </c:numRef>
           </c:cat>
@@ -9633,6 +11131,9 @@
               <c:numCache>
                 <c:formatCode>General</c:formatCode>
                 <c:ptCount val="1"/>
+                <c:pt idx="0">
+                  <c:v>0</c:v>
+                </c:pt>
               </c:numCache>
             </c:numRef>
           </c:val>
@@ -9675,6 +11176,9 @@
               <c:numCache>
                 <c:formatCode>General</c:formatCode>
                 <c:ptCount val="1"/>
+                <c:pt idx="0">
+                  <c:v>2026</c:v>
+                </c:pt>
               </c:numCache>
             </c:numRef>
           </c:cat>
@@ -9684,6 +11188,9 @@
               <c:numCache>
                 <c:formatCode>General</c:formatCode>
                 <c:ptCount val="1"/>
+                <c:pt idx="0">
+                  <c:v>2</c:v>
+                </c:pt>
               </c:numCache>
             </c:numRef>
           </c:val>
@@ -9726,6 +11233,9 @@
               <c:numCache>
                 <c:formatCode>General</c:formatCode>
                 <c:ptCount val="1"/>
+                <c:pt idx="0">
+                  <c:v>2026</c:v>
+                </c:pt>
               </c:numCache>
             </c:numRef>
           </c:cat>
@@ -9735,6 +11245,9 @@
               <c:numCache>
                 <c:formatCode>General</c:formatCode>
                 <c:ptCount val="1"/>
+                <c:pt idx="0">
+                  <c:v>1</c:v>
+                </c:pt>
               </c:numCache>
             </c:numRef>
           </c:val>
@@ -9777,6 +11290,9 @@
               <c:numCache>
                 <c:formatCode>General</c:formatCode>
                 <c:ptCount val="1"/>
+                <c:pt idx="0">
+                  <c:v>2026</c:v>
+                </c:pt>
               </c:numCache>
             </c:numRef>
           </c:cat>
@@ -9786,6 +11302,9 @@
               <c:numCache>
                 <c:formatCode>General</c:formatCode>
                 <c:ptCount val="1"/>
+                <c:pt idx="0">
+                  <c:v>0</c:v>
+                </c:pt>
               </c:numCache>
             </c:numRef>
           </c:val>
@@ -11230,7 +12749,7 @@
               <a:ea typeface="Calibri" panose="020F0502020204030204" pitchFamily="34" charset="0"/>
               <a:cs typeface="Arial" panose="020B0604020202020204" pitchFamily="34" charset="0"/>
             </a:rPr>
-            <a:t>0</a:t>
+            <a:t>3</a:t>
           </a:r>
           <a:endParaRPr lang="en-US" sz="3000" b="1" i="0">
             <a:solidFill>

</xml_diff>